<commit_message>
Docs - Updated db schema, updated SAD
</commit_message>
<xml_diff>
--- a/Dev docs/Software_Architecture_Document.docx
+++ b/Dev docs/Software_Architecture_Document.docx
@@ -128,18 +128,8 @@
           <w:sz w:val="22"/>
           <w:szCs w:val="22"/>
         </w:rPr>
-        <w:t>routing, Proxy/</w:t>
-      </w:r>
-      <w:proofErr w:type="spellStart"/>
-      <w:r>
-        <w:rPr>
-          <w:rFonts w:ascii="Lexend Light" w:hAnsi="Lexend Light"/>
-          <w:sz w:val="22"/>
-          <w:szCs w:val="22"/>
-        </w:rPr>
-        <w:t>BackendForFrontend</w:t>
-      </w:r>
-      <w:proofErr w:type="spellEnd"/>
+        <w:t>routing, Proxy/BackendForFrontend</w:t>
+      </w:r>
     </w:p>
     <w:p>
       <w:pPr>
@@ -154,7 +144,6 @@
           <w:szCs w:val="22"/>
         </w:rPr>
       </w:pPr>
-      <w:proofErr w:type="spellStart"/>
       <w:r>
         <w:rPr>
           <w:rFonts w:ascii="Lexend" w:hAnsi="Lexend"/>
@@ -163,7 +152,6 @@
         </w:rPr>
         <w:t>TailwindCSS</w:t>
       </w:r>
-      <w:proofErr w:type="spellEnd"/>
     </w:p>
     <w:p>
       <w:pPr>
@@ -208,23 +196,13 @@
           <w:szCs w:val="22"/>
         </w:rPr>
       </w:pPr>
-      <w:proofErr w:type="spellStart"/>
-      <w:r>
-        <w:rPr>
-          <w:rFonts w:ascii="Lexend" w:hAnsi="Lexend"/>
-          <w:sz w:val="22"/>
-          <w:szCs w:val="22"/>
-        </w:rPr>
-        <w:t>ShadCN</w:t>
-      </w:r>
-      <w:proofErr w:type="spellEnd"/>
-      <w:r>
-        <w:rPr>
-          <w:rFonts w:ascii="Lexend" w:hAnsi="Lexend"/>
-          <w:sz w:val="22"/>
-          <w:szCs w:val="22"/>
-        </w:rPr>
-        <w:t xml:space="preserve"> (UI library)</w:t>
+      <w:r>
+        <w:rPr>
+          <w:rFonts w:ascii="Lexend" w:hAnsi="Lexend"/>
+          <w:sz w:val="22"/>
+          <w:szCs w:val="22"/>
+        </w:rPr>
+        <w:t>ShadCN (UI library)</w:t>
       </w:r>
     </w:p>
     <w:p>
@@ -612,31 +590,7 @@
           <w:sz w:val="22"/>
           <w:szCs w:val="22"/>
         </w:rPr>
-        <w:t xml:space="preserve"> </w:t>
-      </w:r>
-      <w:r>
-        <w:rPr>
-          <w:rFonts w:ascii="Lexend" w:hAnsi="Lexend"/>
-          <w:sz w:val="22"/>
-          <w:szCs w:val="22"/>
-        </w:rPr>
-        <w:t>Delivers content to users,</w:t>
-      </w:r>
-      <w:r>
-        <w:rPr>
-          <w:rFonts w:ascii="Lexend" w:hAnsi="Lexend"/>
-          <w:sz w:val="22"/>
-          <w:szCs w:val="22"/>
-        </w:rPr>
-        <w:t xml:space="preserve"> </w:t>
-      </w:r>
-      <w:r>
-        <w:rPr>
-          <w:rFonts w:ascii="Lexend" w:hAnsi="Lexend"/>
-          <w:sz w:val="22"/>
-          <w:szCs w:val="22"/>
-        </w:rPr>
-        <w:t>via role-based routing. The backend acts as a proxy to the ASP.NET backend.</w:t>
+        <w:t xml:space="preserve"> Delivers content to users, via role-based routing. The backend acts as a proxy to the ASP.NET backend.</w:t>
       </w:r>
     </w:p>
     <w:p>
@@ -671,31 +625,7 @@
           <w:sz w:val="22"/>
           <w:szCs w:val="22"/>
         </w:rPr>
-        <w:t xml:space="preserve"> </w:t>
-      </w:r>
-      <w:r>
-        <w:rPr>
-          <w:rFonts w:ascii="Lexend" w:hAnsi="Lexend"/>
-          <w:sz w:val="22"/>
-          <w:szCs w:val="22"/>
-        </w:rPr>
-        <w:t xml:space="preserve">A modular monolith backend service, that handles API calls from the users, and serves based on </w:t>
-      </w:r>
-      <w:r>
-        <w:rPr>
-          <w:rFonts w:ascii="Lexend" w:hAnsi="Lexend"/>
-          <w:sz w:val="22"/>
-          <w:szCs w:val="22"/>
-        </w:rPr>
-        <w:t>authorization</w:t>
-      </w:r>
-      <w:r>
-        <w:rPr>
-          <w:rFonts w:ascii="Lexend" w:hAnsi="Lexend"/>
-          <w:sz w:val="22"/>
-          <w:szCs w:val="22"/>
-        </w:rPr>
-        <w:t>.</w:t>
+        <w:t xml:space="preserve"> A modular monolith backend service, that handles API calls from the users, and serves based on authorization.</w:t>
       </w:r>
     </w:p>
     <w:p>
@@ -730,15 +660,7 @@
           <w:sz w:val="22"/>
           <w:szCs w:val="22"/>
         </w:rPr>
-        <w:t xml:space="preserve"> </w:t>
-      </w:r>
-      <w:r>
-        <w:rPr>
-          <w:rFonts w:ascii="Lexend" w:hAnsi="Lexend"/>
-          <w:sz w:val="22"/>
-          <w:szCs w:val="22"/>
-        </w:rPr>
-        <w:t>Stores the uploaded files from the users, communicates through the API.</w:t>
+        <w:t xml:space="preserve"> Stores the uploaded files from the users, communicates through the API.</w:t>
       </w:r>
     </w:p>
     <w:p>
@@ -773,23 +695,7 @@
           <w:sz w:val="22"/>
           <w:szCs w:val="22"/>
         </w:rPr>
-        <w:t xml:space="preserve"> </w:t>
-      </w:r>
-      <w:r>
-        <w:rPr>
-          <w:rFonts w:ascii="Lexend" w:hAnsi="Lexend"/>
-          <w:sz w:val="22"/>
-          <w:szCs w:val="22"/>
-        </w:rPr>
-        <w:t>The main</w:t>
-      </w:r>
-      <w:r>
-        <w:rPr>
-          <w:rFonts w:ascii="Lexend" w:hAnsi="Lexend"/>
-          <w:sz w:val="22"/>
-          <w:szCs w:val="22"/>
-        </w:rPr>
-        <w:t xml:space="preserve"> </w:t>
+        <w:t xml:space="preserve"> The main </w:t>
       </w:r>
       <w:r>
         <w:rPr>
@@ -937,15 +843,7 @@
           <w:sz w:val="22"/>
           <w:szCs w:val="22"/>
         </w:rPr>
-        <w:t xml:space="preserve"> </w:t>
-      </w:r>
-      <w:r>
-        <w:rPr>
-          <w:rFonts w:ascii="Lexend" w:hAnsi="Lexend"/>
-          <w:sz w:val="22"/>
-          <w:szCs w:val="22"/>
-        </w:rPr>
-        <w:t>For future expansion. A platform that handles online payment for the lessons.</w:t>
+        <w:t xml:space="preserve"> For future expansion. A platform that handles online payment for the lessons.</w:t>
       </w:r>
     </w:p>
     <w:p>
@@ -1090,31 +988,7 @@
           <w:sz w:val="22"/>
           <w:szCs w:val="22"/>
         </w:rPr>
-        <w:t xml:space="preserve"> </w:t>
-      </w:r>
-      <w:r>
-        <w:rPr>
-          <w:rFonts w:ascii="Lexend" w:hAnsi="Lexend"/>
-          <w:sz w:val="22"/>
-          <w:szCs w:val="22"/>
-        </w:rPr>
-        <w:t>This modul</w:t>
-      </w:r>
-      <w:r>
-        <w:rPr>
-          <w:rFonts w:ascii="Lexend" w:hAnsi="Lexend"/>
-          <w:sz w:val="22"/>
-          <w:szCs w:val="22"/>
-        </w:rPr>
-        <w:t>e</w:t>
-      </w:r>
-      <w:r>
-        <w:rPr>
-          <w:rFonts w:ascii="Lexend" w:hAnsi="Lexend"/>
-          <w:sz w:val="22"/>
-          <w:szCs w:val="22"/>
-        </w:rPr>
-        <w:t xml:space="preserve"> serves the cities and postal codes for the registration form on the frontend.</w:t>
+        <w:t xml:space="preserve"> This module serves the cities and postal codes for the registration form on the frontend.</w:t>
       </w:r>
     </w:p>
     <w:p>
@@ -1146,15 +1020,7 @@
           <w:sz w:val="22"/>
           <w:szCs w:val="22"/>
         </w:rPr>
-        <w:t xml:space="preserve"> </w:t>
-      </w:r>
-      <w:r>
-        <w:rPr>
-          <w:rFonts w:ascii="Lexend" w:hAnsi="Lexend"/>
-          <w:sz w:val="22"/>
-          <w:szCs w:val="22"/>
-        </w:rPr>
-        <w:t>Handles the file manager logic, uploading and serving.</w:t>
+        <w:t xml:space="preserve"> Handles the file manager logic, uploading and serving.</w:t>
       </w:r>
     </w:p>
     <w:p>
@@ -1186,15 +1052,7 @@
           <w:sz w:val="22"/>
           <w:szCs w:val="22"/>
         </w:rPr>
-        <w:t xml:space="preserve"> </w:t>
-      </w:r>
-      <w:r>
-        <w:rPr>
-          <w:rFonts w:ascii="Lexend" w:hAnsi="Lexend"/>
-          <w:sz w:val="22"/>
-          <w:szCs w:val="22"/>
-        </w:rPr>
-        <w:t>Handles the calendar functions, booking lessons, community events, webinars, syncs with calendar.</w:t>
+        <w:t xml:space="preserve"> Handles the calendar functions, booking lessons, community events, webinars, syncs with calendar.</w:t>
       </w:r>
     </w:p>
     <w:p>
@@ -1258,31 +1116,7 @@
           <w:sz w:val="22"/>
           <w:szCs w:val="22"/>
         </w:rPr>
-        <w:t xml:space="preserve"> </w:t>
-      </w:r>
-      <w:r>
-        <w:rPr>
-          <w:rFonts w:ascii="Lexend" w:hAnsi="Lexend"/>
-          <w:sz w:val="22"/>
-          <w:szCs w:val="22"/>
-        </w:rPr>
-        <w:t xml:space="preserve">Serves all the data needed for the </w:t>
-      </w:r>
-      <w:r>
-        <w:rPr>
-          <w:rFonts w:ascii="Lexend" w:hAnsi="Lexend"/>
-          <w:sz w:val="22"/>
-          <w:szCs w:val="22"/>
-        </w:rPr>
-        <w:t>homepages</w:t>
-      </w:r>
-      <w:r>
-        <w:rPr>
-          <w:rFonts w:ascii="Lexend" w:hAnsi="Lexend"/>
-          <w:sz w:val="22"/>
-          <w:szCs w:val="22"/>
-        </w:rPr>
-        <w:t xml:space="preserve"> based on roles.</w:t>
+        <w:t xml:space="preserve"> Serves all the data needed for the homepages based on roles.</w:t>
       </w:r>
     </w:p>
     <w:p>
@@ -1314,15 +1148,7 @@
           <w:sz w:val="22"/>
           <w:szCs w:val="22"/>
         </w:rPr>
-        <w:t xml:space="preserve"> </w:t>
-      </w:r>
-      <w:r>
-        <w:rPr>
-          <w:rFonts w:ascii="Lexend" w:hAnsi="Lexend"/>
-          <w:sz w:val="22"/>
-          <w:szCs w:val="22"/>
-        </w:rPr>
-        <w:t>Handles all the functions for the learning path type of courses, their content, paths, creation, reading.</w:t>
+        <w:t xml:space="preserve"> Handles all the functions for the learning path type of courses, their content, paths, creation, reading.</w:t>
       </w:r>
     </w:p>
     <w:p>
@@ -1355,15 +1181,7 @@
           <w:sz w:val="22"/>
           <w:szCs w:val="22"/>
         </w:rPr>
-        <w:t xml:space="preserve"> </w:t>
-      </w:r>
-      <w:r>
-        <w:rPr>
-          <w:rFonts w:ascii="Lexend" w:hAnsi="Lexend"/>
-          <w:sz w:val="22"/>
-          <w:szCs w:val="22"/>
-        </w:rPr>
-        <w:t>Handles all the functions for attending the courses that are learning paths, per enrolled student, per course.</w:t>
+        <w:t xml:space="preserve"> Handles all the functions for attending the courses that are learning paths, per enrolled student, per course.</w:t>
       </w:r>
     </w:p>
     <w:p>
@@ -1395,15 +1213,7 @@
           <w:sz w:val="22"/>
           <w:szCs w:val="22"/>
         </w:rPr>
-        <w:t xml:space="preserve"> </w:t>
-      </w:r>
-      <w:r>
-        <w:rPr>
-          <w:rFonts w:ascii="Lexend" w:hAnsi="Lexend"/>
-          <w:sz w:val="22"/>
-          <w:szCs w:val="22"/>
-        </w:rPr>
-        <w:t>Handles all the functions for the tutoring/one-on-one type of courses, their content, paths, creation, reading, for both teacher side and student side.</w:t>
+        <w:t xml:space="preserve"> Handles all the functions for the tutoring/one-on-one type of courses, their content, paths, creation, reading, for both teacher side and student side.</w:t>
       </w:r>
     </w:p>
     <w:p>
@@ -1467,15 +1277,7 @@
           <w:sz w:val="22"/>
           <w:szCs w:val="22"/>
         </w:rPr>
-        <w:t xml:space="preserve"> </w:t>
-      </w:r>
-      <w:r>
-        <w:rPr>
-          <w:rFonts w:ascii="Lexend" w:hAnsi="Lexend"/>
-          <w:sz w:val="22"/>
-          <w:szCs w:val="22"/>
-        </w:rPr>
-        <w:t>Handles logic for chats, notifications, community threads.</w:t>
+        <w:t xml:space="preserve"> Handles logic for chats, notifications, community threads.</w:t>
       </w:r>
     </w:p>
     <w:p>
@@ -1507,31 +1309,7 @@
           <w:sz w:val="22"/>
           <w:szCs w:val="22"/>
         </w:rPr>
-        <w:t xml:space="preserve"> </w:t>
-      </w:r>
-      <w:r>
-        <w:rPr>
-          <w:rFonts w:ascii="Lexend" w:hAnsi="Lexend"/>
-          <w:sz w:val="22"/>
-          <w:szCs w:val="22"/>
-        </w:rPr>
-        <w:t>Handles all the functions required for the payment page l</w:t>
-      </w:r>
-      <w:r>
-        <w:rPr>
-          <w:rFonts w:ascii="Lexend" w:hAnsi="Lexend"/>
-          <w:sz w:val="22"/>
-          <w:szCs w:val="22"/>
-        </w:rPr>
-        <w:t>ik</w:t>
-      </w:r>
-      <w:r>
-        <w:rPr>
-          <w:rFonts w:ascii="Lexend" w:hAnsi="Lexend"/>
-          <w:sz w:val="22"/>
-          <w:szCs w:val="22"/>
-        </w:rPr>
-        <w:t>e showing previous payments, due payments, and overviews.</w:t>
+        <w:t xml:space="preserve"> Handles all the functions required for the payment page like showing previous payments, due payments, and overviews.</w:t>
       </w:r>
     </w:p>
     <w:p>
@@ -1784,15 +1562,7 @@
           <w:sz w:val="22"/>
           <w:szCs w:val="22"/>
         </w:rPr>
-        <w:t xml:space="preserve">One user -&gt; </w:t>
-      </w:r>
-      <w:r>
-        <w:rPr>
-          <w:rFonts w:ascii="Lexend" w:hAnsi="Lexend"/>
-          <w:sz w:val="22"/>
-          <w:szCs w:val="22"/>
-        </w:rPr>
-        <w:t xml:space="preserve">many </w:t>
+        <w:t xml:space="preserve">One user -&gt; many </w:t>
       </w:r>
       <w:r>
         <w:rPr>
@@ -2474,15 +2244,15 @@
           <w:sz w:val="22"/>
           <w:szCs w:val="22"/>
         </w:rPr>
-        <w:t xml:space="preserve">Tutoring Room: </w:t>
-      </w:r>
-      <w:r>
-        <w:rPr>
-          <w:rFonts w:ascii="Lexend" w:hAnsi="Lexend"/>
-          <w:sz w:val="22"/>
-          <w:szCs w:val="22"/>
-        </w:rPr>
-        <w:t>The link between a student and a teacher</w:t>
+        <w:t>Personal Wall:</w:t>
+      </w:r>
+      <w:r>
+        <w:rPr>
+          <w:rFonts w:ascii="Lexend" w:hAnsi="Lexend"/>
+          <w:sz w:val="22"/>
+          <w:szCs w:val="22"/>
+        </w:rPr>
+        <w:t xml:space="preserve"> A stream of items sent in the room</w:t>
       </w:r>
     </w:p>
     <w:p>
@@ -2509,15 +2279,58 @@
           <w:sz w:val="22"/>
           <w:szCs w:val="22"/>
         </w:rPr>
-        <w:t>Personal Wall:</w:t>
-      </w:r>
-      <w:r>
-        <w:rPr>
-          <w:rFonts w:ascii="Lexend" w:hAnsi="Lexend"/>
-          <w:sz w:val="22"/>
-          <w:szCs w:val="22"/>
-        </w:rPr>
-        <w:t xml:space="preserve"> A stream of items sent in the room</w:t>
+        <w:t>Wall Item:</w:t>
+      </w:r>
+      <w:r>
+        <w:rPr>
+          <w:rFonts w:ascii="Lexend" w:hAnsi="Lexend"/>
+          <w:sz w:val="22"/>
+          <w:szCs w:val="22"/>
+        </w:rPr>
+        <w:t xml:space="preserve"> A polymorphic</w:t>
+      </w:r>
+      <w:r>
+        <w:rPr>
+          <w:rFonts w:ascii="Lexend" w:hAnsi="Lexend"/>
+          <w:sz w:val="22"/>
+          <w:szCs w:val="22"/>
+        </w:rPr>
+        <w:t xml:space="preserve"> content</w:t>
+      </w:r>
+      <w:r>
+        <w:rPr>
+          <w:rFonts w:ascii="Lexend" w:hAnsi="Lexend"/>
+          <w:sz w:val="22"/>
+          <w:szCs w:val="22"/>
+        </w:rPr>
+        <w:t xml:space="preserve"> entity</w:t>
+      </w:r>
+    </w:p>
+    <w:p>
+      <w:pPr>
+        <w:pStyle w:val="Listaszerbekezds"/>
+        <w:numPr>
+          <w:ilvl w:val="2"/>
+          <w:numId w:val="9"/>
+        </w:numPr>
+        <w:spacing w:before="480" w:after="240"/>
+        <w:rPr>
+          <w:rFonts w:ascii="Lexend" w:hAnsi="Lexend"/>
+          <w:b/>
+          <w:bCs/>
+          <w:sz w:val="22"/>
+          <w:szCs w:val="22"/>
+        </w:rPr>
+      </w:pPr>
+      <w:r>
+        <w:rPr>
+          <w:rFonts w:ascii="Lexend" w:hAnsi="Lexend"/>
+          <w:b/>
+          <w:bCs/>
+          <w:sz w:val="22"/>
+          <w:szCs w:val="22"/>
+        </w:rPr>
+        <w:t>Relationships:</w:t>
       </w:r>
     </w:p>
     <w:p>
@@ -2539,36 +2352,95 @@
       <w:r>
         <w:rPr>
           <w:rFonts w:ascii="Lexend" w:hAnsi="Lexend"/>
-          <w:b/>
-          <w:bCs/>
-          <w:sz w:val="22"/>
-          <w:szCs w:val="22"/>
-        </w:rPr>
-        <w:t>Wall Item:</w:t>
-      </w:r>
-      <w:r>
-        <w:rPr>
-          <w:rFonts w:ascii="Lexend" w:hAnsi="Lexend"/>
-          <w:sz w:val="22"/>
-          <w:szCs w:val="22"/>
-        </w:rPr>
-        <w:t xml:space="preserve"> A polymorphic</w:t>
-      </w:r>
-      <w:r>
-        <w:rPr>
-          <w:rFonts w:ascii="Lexend" w:hAnsi="Lexend"/>
-          <w:sz w:val="22"/>
-          <w:szCs w:val="22"/>
-        </w:rPr>
-        <w:t xml:space="preserve"> content</w:t>
-      </w:r>
-      <w:r>
-        <w:rPr>
-          <w:rFonts w:ascii="Lexend" w:hAnsi="Lexend"/>
-          <w:sz w:val="22"/>
-          <w:szCs w:val="22"/>
-        </w:rPr>
-        <w:t xml:space="preserve"> entity</w:t>
+          <w:sz w:val="22"/>
+          <w:szCs w:val="22"/>
+        </w:rPr>
+        <w:t xml:space="preserve">One base course (tutoring type) </w:t>
+      </w:r>
+      <w:r>
+        <w:rPr>
+          <w:rFonts w:ascii="Lexend" w:hAnsi="Lexend"/>
+          <w:sz w:val="22"/>
+          <w:szCs w:val="22"/>
+        </w:rPr>
+        <w:t>-&gt; one personal wall</w:t>
+      </w:r>
+    </w:p>
+    <w:p>
+      <w:pPr>
+        <w:pStyle w:val="Listaszerbekezds"/>
+        <w:numPr>
+          <w:ilvl w:val="3"/>
+          <w:numId w:val="9"/>
+        </w:numPr>
+        <w:spacing w:before="480" w:after="240"/>
+        <w:rPr>
+          <w:rFonts w:ascii="Lexend" w:hAnsi="Lexend"/>
+          <w:b/>
+          <w:bCs/>
+          <w:sz w:val="22"/>
+          <w:szCs w:val="22"/>
+        </w:rPr>
+      </w:pPr>
+      <w:r>
+        <w:rPr>
+          <w:rFonts w:ascii="Lexend" w:hAnsi="Lexend"/>
+          <w:sz w:val="22"/>
+          <w:szCs w:val="22"/>
+        </w:rPr>
+        <w:t>One personal wall -&gt; multiple items (content)</w:t>
+      </w:r>
+    </w:p>
+    <w:p>
+      <w:pPr>
+        <w:pStyle w:val="Listaszerbekezds"/>
+        <w:numPr>
+          <w:ilvl w:val="3"/>
+          <w:numId w:val="9"/>
+        </w:numPr>
+        <w:spacing w:before="480" w:after="240"/>
+        <w:rPr>
+          <w:rFonts w:ascii="Lexend" w:hAnsi="Lexend"/>
+          <w:b/>
+          <w:bCs/>
+          <w:sz w:val="22"/>
+          <w:szCs w:val="22"/>
+        </w:rPr>
+      </w:pPr>
+      <w:r>
+        <w:rPr>
+          <w:rFonts w:ascii="Lexend" w:hAnsi="Lexend"/>
+          <w:sz w:val="22"/>
+          <w:szCs w:val="22"/>
+        </w:rPr>
+        <w:t>One student -&gt; multiple tutoring rooms (by teachers)</w:t>
+      </w:r>
+    </w:p>
+    <w:p>
+      <w:pPr>
+        <w:pStyle w:val="Listaszerbekezds"/>
+        <w:numPr>
+          <w:ilvl w:val="1"/>
+          <w:numId w:val="9"/>
+        </w:numPr>
+        <w:spacing w:before="480" w:after="240"/>
+        <w:rPr>
+          <w:rFonts w:ascii="Lexend" w:hAnsi="Lexend"/>
+          <w:b/>
+          <w:bCs/>
+          <w:sz w:val="22"/>
+          <w:szCs w:val="22"/>
+        </w:rPr>
+      </w:pPr>
+      <w:r>
+        <w:rPr>
+          <w:rFonts w:ascii="Lexend" w:hAnsi="Lexend"/>
+          <w:b/>
+          <w:bCs/>
+          <w:sz w:val="22"/>
+          <w:szCs w:val="22"/>
+        </w:rPr>
+        <w:t>Content Domain:</w:t>
       </w:r>
     </w:p>
     <w:p>
@@ -2595,6 +2467,467 @@
           <w:sz w:val="22"/>
           <w:szCs w:val="22"/>
         </w:rPr>
+        <w:t>Entit</w:t>
+      </w:r>
+      <w:r>
+        <w:rPr>
+          <w:rFonts w:ascii="Lexend" w:hAnsi="Lexend"/>
+          <w:b/>
+          <w:bCs/>
+          <w:sz w:val="22"/>
+          <w:szCs w:val="22"/>
+        </w:rPr>
+        <w:t>ies</w:t>
+      </w:r>
+      <w:r>
+        <w:rPr>
+          <w:rFonts w:ascii="Lexend" w:hAnsi="Lexend"/>
+          <w:b/>
+          <w:bCs/>
+          <w:sz w:val="22"/>
+          <w:szCs w:val="22"/>
+        </w:rPr>
+        <w:t xml:space="preserve">: </w:t>
+      </w:r>
+    </w:p>
+    <w:p>
+      <w:pPr>
+        <w:pStyle w:val="Listaszerbekezds"/>
+        <w:numPr>
+          <w:ilvl w:val="3"/>
+          <w:numId w:val="9"/>
+        </w:numPr>
+        <w:spacing w:before="480" w:after="240"/>
+        <w:rPr>
+          <w:rFonts w:ascii="Lexend" w:hAnsi="Lexend"/>
+          <w:b/>
+          <w:bCs/>
+          <w:sz w:val="22"/>
+          <w:szCs w:val="22"/>
+        </w:rPr>
+      </w:pPr>
+      <w:r>
+        <w:rPr>
+          <w:rFonts w:ascii="Lexend" w:hAnsi="Lexend"/>
+          <w:b/>
+          <w:bCs/>
+          <w:sz w:val="22"/>
+          <w:szCs w:val="22"/>
+        </w:rPr>
+        <w:t>Content</w:t>
+      </w:r>
+      <w:r>
+        <w:rPr>
+          <w:rFonts w:ascii="Lexend" w:hAnsi="Lexend"/>
+          <w:b/>
+          <w:bCs/>
+          <w:sz w:val="22"/>
+          <w:szCs w:val="22"/>
+        </w:rPr>
+        <w:t xml:space="preserve"> </w:t>
+      </w:r>
+      <w:r>
+        <w:rPr>
+          <w:rFonts w:ascii="Lexend" w:hAnsi="Lexend"/>
+          <w:b/>
+          <w:bCs/>
+          <w:sz w:val="22"/>
+          <w:szCs w:val="22"/>
+        </w:rPr>
+        <w:t>Item</w:t>
+      </w:r>
+      <w:r>
+        <w:rPr>
+          <w:rFonts w:ascii="Lexend" w:hAnsi="Lexend"/>
+          <w:b/>
+          <w:bCs/>
+          <w:sz w:val="22"/>
+          <w:szCs w:val="22"/>
+        </w:rPr>
+        <w:t>:</w:t>
+      </w:r>
+    </w:p>
+    <w:p>
+      <w:pPr>
+        <w:pStyle w:val="Listaszerbekezds"/>
+        <w:numPr>
+          <w:ilvl w:val="4"/>
+          <w:numId w:val="9"/>
+        </w:numPr>
+        <w:spacing w:before="480" w:after="240"/>
+        <w:rPr>
+          <w:rFonts w:ascii="Lexend" w:hAnsi="Lexend"/>
+          <w:b/>
+          <w:bCs/>
+          <w:sz w:val="22"/>
+          <w:szCs w:val="22"/>
+        </w:rPr>
+      </w:pPr>
+      <w:r>
+        <w:rPr>
+          <w:rFonts w:ascii="Lexend" w:hAnsi="Lexend"/>
+          <w:b/>
+          <w:bCs/>
+          <w:sz w:val="22"/>
+          <w:szCs w:val="22"/>
+        </w:rPr>
+        <w:t xml:space="preserve">File: </w:t>
+      </w:r>
+      <w:r>
+        <w:rPr>
+          <w:rFonts w:ascii="Lexend" w:hAnsi="Lexend"/>
+          <w:sz w:val="22"/>
+          <w:szCs w:val="22"/>
+        </w:rPr>
+        <w:t>Any uploaded file (e.g. PDF, Word, PPT, TXT, Video, Audio, Image)</w:t>
+      </w:r>
+      <w:r>
+        <w:rPr>
+          <w:rFonts w:ascii="Lexend" w:hAnsi="Lexend"/>
+          <w:sz w:val="22"/>
+          <w:szCs w:val="22"/>
+        </w:rPr>
+        <w:t xml:space="preserve"> – stored as binary</w:t>
+      </w:r>
+    </w:p>
+    <w:p>
+      <w:pPr>
+        <w:pStyle w:val="Listaszerbekezds"/>
+        <w:numPr>
+          <w:ilvl w:val="4"/>
+          <w:numId w:val="9"/>
+        </w:numPr>
+        <w:spacing w:before="480" w:after="240"/>
+        <w:rPr>
+          <w:rFonts w:ascii="Lexend" w:hAnsi="Lexend"/>
+          <w:b/>
+          <w:bCs/>
+          <w:sz w:val="22"/>
+          <w:szCs w:val="22"/>
+        </w:rPr>
+      </w:pPr>
+      <w:r>
+        <w:rPr>
+          <w:rFonts w:ascii="Lexend" w:hAnsi="Lexend"/>
+          <w:b/>
+          <w:bCs/>
+          <w:sz w:val="22"/>
+          <w:szCs w:val="22"/>
+        </w:rPr>
+        <w:t>Test:</w:t>
+      </w:r>
+      <w:r>
+        <w:rPr>
+          <w:rFonts w:ascii="Lexend" w:hAnsi="Lexend"/>
+          <w:sz w:val="22"/>
+          <w:szCs w:val="22"/>
+        </w:rPr>
+        <w:t xml:space="preserve"> A series of sub-</w:t>
+      </w:r>
+      <w:r>
+        <w:rPr>
+          <w:rFonts w:ascii="Lexend" w:hAnsi="Lexend"/>
+          <w:sz w:val="22"/>
+          <w:szCs w:val="22"/>
+        </w:rPr>
+        <w:t>modules</w:t>
+      </w:r>
+      <w:r>
+        <w:rPr>
+          <w:rFonts w:ascii="Lexend" w:hAnsi="Lexend"/>
+          <w:sz w:val="22"/>
+          <w:szCs w:val="22"/>
+        </w:rPr>
+        <w:t xml:space="preserve"> made in the test editor, the student has to fill out</w:t>
+      </w:r>
+      <w:r>
+        <w:rPr>
+          <w:rFonts w:ascii="Lexend" w:hAnsi="Lexend"/>
+          <w:sz w:val="22"/>
+          <w:szCs w:val="22"/>
+        </w:rPr>
+        <w:t xml:space="preserve">, can have </w:t>
+      </w:r>
+      <w:r>
+        <w:rPr>
+          <w:rFonts w:ascii="Lexend" w:hAnsi="Lexend"/>
+          <w:sz w:val="22"/>
+          <w:szCs w:val="22"/>
+        </w:rPr>
+        <w:t>t</w:t>
+      </w:r>
+      <w:r>
+        <w:rPr>
+          <w:rFonts w:ascii="Lexend" w:hAnsi="Lexend"/>
+          <w:sz w:val="22"/>
+          <w:szCs w:val="22"/>
+        </w:rPr>
+        <w:t>imer</w:t>
+      </w:r>
+      <w:r>
+        <w:rPr>
+          <w:rFonts w:ascii="Lexend" w:hAnsi="Lexend"/>
+          <w:sz w:val="22"/>
+          <w:szCs w:val="22"/>
+        </w:rPr>
+        <w:t>, and be graded</w:t>
+      </w:r>
+    </w:p>
+    <w:p>
+      <w:pPr>
+        <w:pStyle w:val="Listaszerbekezds"/>
+        <w:numPr>
+          <w:ilvl w:val="4"/>
+          <w:numId w:val="9"/>
+        </w:numPr>
+        <w:spacing w:before="480" w:after="240"/>
+        <w:rPr>
+          <w:rFonts w:ascii="Lexend" w:hAnsi="Lexend"/>
+          <w:b/>
+          <w:bCs/>
+          <w:sz w:val="22"/>
+          <w:szCs w:val="22"/>
+        </w:rPr>
+      </w:pPr>
+      <w:r>
+        <w:rPr>
+          <w:rFonts w:ascii="Lexend" w:hAnsi="Lexend"/>
+          <w:b/>
+          <w:bCs/>
+          <w:sz w:val="22"/>
+          <w:szCs w:val="22"/>
+        </w:rPr>
+        <w:t xml:space="preserve">Hand-in: </w:t>
+      </w:r>
+      <w:r>
+        <w:rPr>
+          <w:rFonts w:ascii="Lexend" w:hAnsi="Lexend"/>
+          <w:sz w:val="22"/>
+          <w:szCs w:val="22"/>
+        </w:rPr>
+        <w:t>A text which describes what the student should submit by the due date, type can be selected, and if one or multiple types (e.g. image, word, pdf, ppt, text)</w:t>
+      </w:r>
+    </w:p>
+    <w:p>
+      <w:pPr>
+        <w:pStyle w:val="Listaszerbekezds"/>
+        <w:numPr>
+          <w:ilvl w:val="4"/>
+          <w:numId w:val="9"/>
+        </w:numPr>
+        <w:spacing w:before="480" w:after="240"/>
+        <w:rPr>
+          <w:rFonts w:ascii="Lexend" w:hAnsi="Lexend"/>
+          <w:b/>
+          <w:bCs/>
+          <w:sz w:val="22"/>
+          <w:szCs w:val="22"/>
+        </w:rPr>
+      </w:pPr>
+      <w:r>
+        <w:rPr>
+          <w:rFonts w:ascii="Lexend" w:hAnsi="Lexend"/>
+          <w:b/>
+          <w:bCs/>
+          <w:sz w:val="22"/>
+          <w:szCs w:val="22"/>
+        </w:rPr>
+        <w:t>Text:</w:t>
+      </w:r>
+      <w:r>
+        <w:rPr>
+          <w:rFonts w:ascii="Lexend" w:hAnsi="Lexend"/>
+          <w:sz w:val="22"/>
+          <w:szCs w:val="22"/>
+        </w:rPr>
+        <w:t xml:space="preserve"> Simple</w:t>
+      </w:r>
+      <w:r>
+        <w:rPr>
+          <w:rFonts w:ascii="Lexend" w:hAnsi="Lexend"/>
+          <w:sz w:val="22"/>
+          <w:szCs w:val="22"/>
+        </w:rPr>
+        <w:t>, formatted</w:t>
+      </w:r>
+      <w:r>
+        <w:rPr>
+          <w:rFonts w:ascii="Lexend" w:hAnsi="Lexend"/>
+          <w:sz w:val="22"/>
+          <w:szCs w:val="22"/>
+        </w:rPr>
+        <w:t xml:space="preserve"> text can be sent</w:t>
+      </w:r>
+      <w:r>
+        <w:rPr>
+          <w:rFonts w:ascii="Lexend" w:hAnsi="Lexend"/>
+          <w:sz w:val="22"/>
+          <w:szCs w:val="22"/>
+        </w:rPr>
+        <w:t xml:space="preserve"> or stored</w:t>
+      </w:r>
+    </w:p>
+    <w:p>
+      <w:pPr>
+        <w:pStyle w:val="Listaszerbekezds"/>
+        <w:numPr>
+          <w:ilvl w:val="4"/>
+          <w:numId w:val="9"/>
+        </w:numPr>
+        <w:spacing w:before="480" w:after="240"/>
+        <w:rPr>
+          <w:rFonts w:ascii="Lexend" w:hAnsi="Lexend"/>
+          <w:b/>
+          <w:bCs/>
+          <w:sz w:val="22"/>
+          <w:szCs w:val="22"/>
+        </w:rPr>
+      </w:pPr>
+      <w:r>
+        <w:rPr>
+          <w:rFonts w:ascii="Lexend" w:hAnsi="Lexend"/>
+          <w:b/>
+          <w:bCs/>
+          <w:sz w:val="22"/>
+          <w:szCs w:val="22"/>
+        </w:rPr>
+        <w:t xml:space="preserve">Test module: </w:t>
+      </w:r>
+      <w:r>
+        <w:rPr>
+          <w:rFonts w:ascii="Lexend" w:hAnsi="Lexend"/>
+          <w:sz w:val="22"/>
+          <w:szCs w:val="22"/>
+        </w:rPr>
+        <w:t>Blocks a test can be built out of</w:t>
+      </w:r>
+      <w:r>
+        <w:rPr>
+          <w:rFonts w:ascii="Lexend" w:hAnsi="Lexend"/>
+          <w:sz w:val="22"/>
+          <w:szCs w:val="22"/>
+        </w:rPr>
+        <w:t>, can be graded</w:t>
+      </w:r>
+      <w:r>
+        <w:rPr>
+          <w:rFonts w:ascii="Lexend" w:hAnsi="Lexend"/>
+          <w:sz w:val="22"/>
+          <w:szCs w:val="22"/>
+        </w:rPr>
+        <w:t xml:space="preserve"> (e.g. short-long answer, select one-multiple, </w:t>
+      </w:r>
+      <w:r>
+        <w:rPr>
+          <w:rFonts w:ascii="Lexend" w:hAnsi="Lexend"/>
+          <w:sz w:val="22"/>
+          <w:szCs w:val="22"/>
+        </w:rPr>
+        <w:t>sort</w:t>
+      </w:r>
+      <w:r>
+        <w:rPr>
+          <w:rFonts w:ascii="Lexend" w:hAnsi="Lexend"/>
+          <w:sz w:val="22"/>
+          <w:szCs w:val="22"/>
+        </w:rPr>
+        <w:t>)</w:t>
+      </w:r>
+    </w:p>
+    <w:p>
+      <w:pPr>
+        <w:pStyle w:val="Listaszerbekezds"/>
+        <w:numPr>
+          <w:ilvl w:val="3"/>
+          <w:numId w:val="9"/>
+        </w:numPr>
+        <w:spacing w:before="480" w:after="240"/>
+        <w:rPr>
+          <w:rFonts w:ascii="Lexend" w:hAnsi="Lexend"/>
+          <w:b/>
+          <w:bCs/>
+          <w:sz w:val="22"/>
+          <w:szCs w:val="22"/>
+        </w:rPr>
+      </w:pPr>
+      <w:r>
+        <w:rPr>
+          <w:rFonts w:ascii="Lexend" w:hAnsi="Lexend"/>
+          <w:b/>
+          <w:bCs/>
+          <w:sz w:val="22"/>
+          <w:szCs w:val="22"/>
+        </w:rPr>
+        <w:t xml:space="preserve">Submission: </w:t>
+      </w:r>
+      <w:r>
+        <w:rPr>
+          <w:rFonts w:ascii="Lexend" w:hAnsi="Lexend"/>
+          <w:sz w:val="22"/>
+          <w:szCs w:val="22"/>
+        </w:rPr>
+        <w:t>Stores the content item the student hands in</w:t>
+      </w:r>
+    </w:p>
+    <w:p>
+      <w:pPr>
+        <w:pStyle w:val="Listaszerbekezds"/>
+        <w:numPr>
+          <w:ilvl w:val="3"/>
+          <w:numId w:val="9"/>
+        </w:numPr>
+        <w:spacing w:before="480" w:after="240"/>
+        <w:rPr>
+          <w:rFonts w:ascii="Lexend" w:hAnsi="Lexend"/>
+          <w:b/>
+          <w:bCs/>
+          <w:sz w:val="22"/>
+          <w:szCs w:val="22"/>
+        </w:rPr>
+      </w:pPr>
+      <w:r>
+        <w:rPr>
+          <w:rFonts w:ascii="Lexend" w:hAnsi="Lexend"/>
+          <w:b/>
+          <w:bCs/>
+          <w:sz w:val="22"/>
+          <w:szCs w:val="22"/>
+        </w:rPr>
+        <w:t xml:space="preserve">Feedback: </w:t>
+      </w:r>
+      <w:r>
+        <w:rPr>
+          <w:rFonts w:ascii="Lexend" w:hAnsi="Lexend"/>
+          <w:sz w:val="22"/>
+          <w:szCs w:val="22"/>
+        </w:rPr>
+        <w:t>The grading and/or the comment the teacher gives to the test/hand-ins</w:t>
+      </w:r>
+    </w:p>
+    <w:p>
+      <w:pPr>
+        <w:pStyle w:val="Listaszerbekezds"/>
+        <w:numPr>
+          <w:ilvl w:val="2"/>
+          <w:numId w:val="9"/>
+        </w:numPr>
+        <w:spacing w:before="480" w:after="240"/>
+        <w:rPr>
+          <w:rFonts w:ascii="Lexend" w:hAnsi="Lexend"/>
+          <w:b/>
+          <w:bCs/>
+          <w:sz w:val="22"/>
+          <w:szCs w:val="22"/>
+        </w:rPr>
+      </w:pPr>
+      <w:r>
+        <w:rPr>
+          <w:rFonts w:ascii="Lexend" w:hAnsi="Lexend"/>
+          <w:b/>
+          <w:bCs/>
+          <w:sz w:val="22"/>
+          <w:szCs w:val="22"/>
+        </w:rPr>
         <w:t>Relationships:</w:t>
       </w:r>
     </w:p>
@@ -2620,7 +2953,7 @@
           <w:sz w:val="22"/>
           <w:szCs w:val="22"/>
         </w:rPr>
-        <w:t>One base course (tutoring type) -&gt; multiple tutoring room (one per student)</w:t>
+        <w:t>Test -&gt; many modules</w:t>
       </w:r>
     </w:p>
     <w:p>
@@ -2645,7 +2978,7 @@
           <w:sz w:val="22"/>
           <w:szCs w:val="22"/>
         </w:rPr>
-        <w:t>One room -&gt; one personal wall</w:t>
+        <w:t>One content item -&gt; one type</w:t>
       </w:r>
     </w:p>
     <w:p>
@@ -2670,7 +3003,7 @@
           <w:sz w:val="22"/>
           <w:szCs w:val="22"/>
         </w:rPr>
-        <w:t>One personal wall -&gt; multiple items (content)</w:t>
+        <w:t>One hand-in -&gt; one submission</w:t>
       </w:r>
     </w:p>
     <w:p>
@@ -2695,7 +3028,106 @@
           <w:sz w:val="22"/>
           <w:szCs w:val="22"/>
         </w:rPr>
-        <w:t>One student -&gt; multiple tutoring rooms (by teachers)</w:t>
+        <w:t>One content item can belong: Lesson, Wall, Sub</w:t>
+      </w:r>
+      <w:r>
+        <w:rPr>
+          <w:rFonts w:ascii="Lexend" w:hAnsi="Lexend"/>
+          <w:sz w:val="22"/>
+          <w:szCs w:val="22"/>
+        </w:rPr>
+        <w:t>m</w:t>
+      </w:r>
+      <w:r>
+        <w:rPr>
+          <w:rFonts w:ascii="Lexend" w:hAnsi="Lexend"/>
+          <w:sz w:val="22"/>
+          <w:szCs w:val="22"/>
+        </w:rPr>
+        <w:t>ission, Thread</w:t>
+      </w:r>
+      <w:r>
+        <w:rPr>
+          <w:rFonts w:ascii="Lexend" w:hAnsi="Lexend"/>
+          <w:sz w:val="22"/>
+          <w:szCs w:val="22"/>
+        </w:rPr>
+        <w:t>, and can be reused across multiple places</w:t>
+      </w:r>
+    </w:p>
+    <w:p>
+      <w:pPr>
+        <w:pStyle w:val="Listaszerbekezds"/>
+        <w:numPr>
+          <w:ilvl w:val="3"/>
+          <w:numId w:val="9"/>
+        </w:numPr>
+        <w:spacing w:before="480" w:after="240"/>
+        <w:rPr>
+          <w:rFonts w:ascii="Lexend" w:hAnsi="Lexend"/>
+          <w:b/>
+          <w:bCs/>
+          <w:sz w:val="22"/>
+          <w:szCs w:val="22"/>
+        </w:rPr>
+      </w:pPr>
+      <w:r>
+        <w:rPr>
+          <w:rFonts w:ascii="Lexend" w:hAnsi="Lexend"/>
+          <w:sz w:val="22"/>
+          <w:szCs w:val="22"/>
+        </w:rPr>
+        <w:t>One hand-in -&gt; one submission</w:t>
+      </w:r>
+    </w:p>
+    <w:p>
+      <w:pPr>
+        <w:pStyle w:val="Listaszerbekezds"/>
+        <w:numPr>
+          <w:ilvl w:val="3"/>
+          <w:numId w:val="9"/>
+        </w:numPr>
+        <w:spacing w:before="480" w:after="240"/>
+        <w:rPr>
+          <w:rFonts w:ascii="Lexend" w:hAnsi="Lexend"/>
+          <w:b/>
+          <w:bCs/>
+          <w:sz w:val="22"/>
+          <w:szCs w:val="22"/>
+        </w:rPr>
+      </w:pPr>
+      <w:r>
+        <w:rPr>
+          <w:rFonts w:ascii="Lexend" w:hAnsi="Lexend"/>
+          <w:sz w:val="22"/>
+          <w:szCs w:val="22"/>
+        </w:rPr>
+        <w:t>One submission -&gt; multiple content items (multi file submission)</w:t>
+      </w:r>
+    </w:p>
+    <w:p>
+      <w:pPr>
+        <w:pStyle w:val="Listaszerbekezds"/>
+        <w:numPr>
+          <w:ilvl w:val="3"/>
+          <w:numId w:val="9"/>
+        </w:numPr>
+        <w:spacing w:before="480" w:after="240"/>
+        <w:rPr>
+          <w:rFonts w:ascii="Lexend" w:hAnsi="Lexend"/>
+          <w:b/>
+          <w:bCs/>
+          <w:sz w:val="22"/>
+          <w:szCs w:val="22"/>
+        </w:rPr>
+      </w:pPr>
+      <w:r>
+        <w:rPr>
+          <w:rFonts w:ascii="Lexend" w:hAnsi="Lexend"/>
+          <w:sz w:val="22"/>
+          <w:szCs w:val="22"/>
+        </w:rPr>
+        <w:t>One submission -&gt; one feedback</w:t>
       </w:r>
     </w:p>
     <w:p>
@@ -2722,7 +3154,16 @@
           <w:sz w:val="22"/>
           <w:szCs w:val="22"/>
         </w:rPr>
-        <w:t>Content Domain:</w:t>
+        <w:lastRenderedPageBreak/>
+        <w:t>Scheduling Domain:</w:t>
+      </w:r>
+      <w:r>
+        <w:rPr>
+          <w:rFonts w:ascii="Lexend" w:hAnsi="Lexend"/>
+          <w:sz w:val="22"/>
+          <w:szCs w:val="22"/>
+        </w:rPr>
+        <w:t xml:space="preserve"> </w:t>
       </w:r>
     </w:p>
     <w:p>
@@ -2749,47 +3190,877 @@
           <w:sz w:val="22"/>
           <w:szCs w:val="22"/>
         </w:rPr>
-        <w:t>Entit</w:t>
-      </w:r>
-      <w:r>
-        <w:rPr>
-          <w:rFonts w:ascii="Lexend" w:hAnsi="Lexend"/>
-          <w:b/>
-          <w:bCs/>
-          <w:sz w:val="22"/>
-          <w:szCs w:val="22"/>
-        </w:rPr>
-        <w:t>y: Content</w:t>
-      </w:r>
-      <w:r>
-        <w:rPr>
-          <w:rFonts w:ascii="Lexend" w:hAnsi="Lexend"/>
-          <w:b/>
-          <w:bCs/>
+        <w:t>Entities:</w:t>
+      </w:r>
+    </w:p>
+    <w:p>
+      <w:pPr>
+        <w:pStyle w:val="Listaszerbekezds"/>
+        <w:numPr>
+          <w:ilvl w:val="3"/>
+          <w:numId w:val="9"/>
+        </w:numPr>
+        <w:spacing w:before="480" w:after="240"/>
+        <w:rPr>
+          <w:rFonts w:ascii="Lexend" w:hAnsi="Lexend"/>
+          <w:b/>
+          <w:bCs/>
+          <w:sz w:val="22"/>
+          <w:szCs w:val="22"/>
+        </w:rPr>
+      </w:pPr>
+      <w:r>
+        <w:rPr>
+          <w:rFonts w:ascii="Lexend" w:hAnsi="Lexend"/>
+          <w:b/>
+          <w:bCs/>
+          <w:sz w:val="22"/>
+          <w:szCs w:val="22"/>
+        </w:rPr>
+        <w:t xml:space="preserve">Event: </w:t>
+      </w:r>
+      <w:r>
+        <w:rPr>
+          <w:rFonts w:ascii="Lexend" w:hAnsi="Lexend"/>
+          <w:sz w:val="22"/>
+          <w:szCs w:val="22"/>
+        </w:rPr>
+        <w:t>Any scheduled real time activity, can be a tutoring lesson, a consultation on a learning path, a consultation with a parent, a community event or webinar</w:t>
+      </w:r>
+    </w:p>
+    <w:p>
+      <w:pPr>
+        <w:pStyle w:val="Listaszerbekezds"/>
+        <w:numPr>
+          <w:ilvl w:val="2"/>
+          <w:numId w:val="9"/>
+        </w:numPr>
+        <w:spacing w:before="480" w:after="240"/>
+        <w:rPr>
+          <w:rFonts w:ascii="Lexend" w:hAnsi="Lexend"/>
+          <w:b/>
+          <w:bCs/>
+          <w:sz w:val="22"/>
+          <w:szCs w:val="22"/>
+        </w:rPr>
+      </w:pPr>
+      <w:r>
+        <w:rPr>
+          <w:rFonts w:ascii="Lexend" w:hAnsi="Lexend"/>
+          <w:b/>
+          <w:bCs/>
+          <w:sz w:val="22"/>
+          <w:szCs w:val="22"/>
+        </w:rPr>
+        <w:t>Relationships:</w:t>
+      </w:r>
+    </w:p>
+    <w:p>
+      <w:pPr>
+        <w:pStyle w:val="Listaszerbekezds"/>
+        <w:numPr>
+          <w:ilvl w:val="3"/>
+          <w:numId w:val="9"/>
+        </w:numPr>
+        <w:spacing w:before="480" w:after="240"/>
+        <w:rPr>
+          <w:rFonts w:ascii="Lexend" w:hAnsi="Lexend"/>
+          <w:b/>
+          <w:bCs/>
+          <w:sz w:val="22"/>
+          <w:szCs w:val="22"/>
+        </w:rPr>
+      </w:pPr>
+      <w:r>
+        <w:rPr>
+          <w:rFonts w:ascii="Lexend" w:hAnsi="Lexend"/>
+          <w:sz w:val="22"/>
+          <w:szCs w:val="22"/>
+        </w:rPr>
+        <w:t>One tutoring room -&gt; multiple events (lessons)</w:t>
+      </w:r>
+    </w:p>
+    <w:p>
+      <w:pPr>
+        <w:pStyle w:val="Listaszerbekezds"/>
+        <w:numPr>
+          <w:ilvl w:val="3"/>
+          <w:numId w:val="9"/>
+        </w:numPr>
+        <w:spacing w:before="480" w:after="240"/>
+        <w:rPr>
+          <w:rFonts w:ascii="Lexend" w:hAnsi="Lexend"/>
+          <w:b/>
+          <w:bCs/>
+          <w:sz w:val="22"/>
+          <w:szCs w:val="22"/>
+        </w:rPr>
+      </w:pPr>
+      <w:r>
+        <w:rPr>
+          <w:rFonts w:ascii="Lexend" w:hAnsi="Lexend"/>
+          <w:sz w:val="22"/>
+          <w:szCs w:val="22"/>
+        </w:rPr>
+        <w:t>One learning path enrollment -&gt; multiple events (consultations)</w:t>
+      </w:r>
+    </w:p>
+    <w:p>
+      <w:pPr>
+        <w:pStyle w:val="Listaszerbekezds"/>
+        <w:numPr>
+          <w:ilvl w:val="3"/>
+          <w:numId w:val="9"/>
+        </w:numPr>
+        <w:spacing w:before="480" w:after="240"/>
+        <w:rPr>
+          <w:rFonts w:ascii="Lexend" w:hAnsi="Lexend"/>
+          <w:b/>
+          <w:bCs/>
+          <w:sz w:val="22"/>
+          <w:szCs w:val="22"/>
+        </w:rPr>
+      </w:pPr>
+      <w:r>
+        <w:rPr>
+          <w:rFonts w:ascii="Lexend" w:hAnsi="Lexend"/>
+          <w:sz w:val="22"/>
+          <w:szCs w:val="22"/>
+        </w:rPr>
+        <w:t xml:space="preserve">One </w:t>
+      </w:r>
+      <w:r>
+        <w:rPr>
+          <w:rFonts w:ascii="Lexend" w:hAnsi="Lexend"/>
+          <w:sz w:val="22"/>
+          <w:szCs w:val="22"/>
+        </w:rPr>
+        <w:t>learning path</w:t>
+      </w:r>
+      <w:r>
+        <w:rPr>
+          <w:rFonts w:ascii="Lexend" w:hAnsi="Lexend"/>
+          <w:sz w:val="22"/>
+          <w:szCs w:val="22"/>
+        </w:rPr>
+        <w:t xml:space="preserve"> -&gt; multiple events (webinars</w:t>
+      </w:r>
+      <w:r>
+        <w:rPr>
+          <w:rFonts w:ascii="Lexend" w:hAnsi="Lexend"/>
+          <w:sz w:val="22"/>
+          <w:szCs w:val="22"/>
+        </w:rPr>
+        <w:t xml:space="preserve"> tied to one path</w:t>
+      </w:r>
+      <w:r>
+        <w:rPr>
+          <w:rFonts w:ascii="Lexend" w:hAnsi="Lexend"/>
+          <w:sz w:val="22"/>
+          <w:szCs w:val="22"/>
+        </w:rPr>
+        <w:t>)</w:t>
+      </w:r>
+    </w:p>
+    <w:p>
+      <w:pPr>
+        <w:pStyle w:val="Listaszerbekezds"/>
+        <w:numPr>
+          <w:ilvl w:val="1"/>
+          <w:numId w:val="9"/>
+        </w:numPr>
+        <w:spacing w:before="480" w:after="240"/>
+        <w:rPr>
+          <w:rFonts w:ascii="Lexend" w:hAnsi="Lexend"/>
+          <w:b/>
+          <w:bCs/>
+          <w:sz w:val="22"/>
+          <w:szCs w:val="22"/>
+        </w:rPr>
+      </w:pPr>
+      <w:r>
+        <w:rPr>
+          <w:rFonts w:ascii="Lexend" w:hAnsi="Lexend"/>
+          <w:b/>
+          <w:bCs/>
+          <w:sz w:val="22"/>
+          <w:szCs w:val="22"/>
+        </w:rPr>
+        <w:t>Engagement Domain:</w:t>
+      </w:r>
+    </w:p>
+    <w:p>
+      <w:pPr>
+        <w:pStyle w:val="Listaszerbekezds"/>
+        <w:numPr>
+          <w:ilvl w:val="2"/>
+          <w:numId w:val="9"/>
+        </w:numPr>
+        <w:spacing w:before="480" w:after="240"/>
+        <w:rPr>
+          <w:rFonts w:ascii="Lexend" w:hAnsi="Lexend"/>
+          <w:b/>
+          <w:bCs/>
+          <w:sz w:val="22"/>
+          <w:szCs w:val="22"/>
+        </w:rPr>
+      </w:pPr>
+      <w:r>
+        <w:rPr>
+          <w:rFonts w:ascii="Lexend" w:hAnsi="Lexend"/>
+          <w:b/>
+          <w:bCs/>
+          <w:sz w:val="22"/>
+          <w:szCs w:val="22"/>
+        </w:rPr>
+        <w:t>Entities:</w:t>
+      </w:r>
+    </w:p>
+    <w:p>
+      <w:pPr>
+        <w:pStyle w:val="Listaszerbekezds"/>
+        <w:numPr>
+          <w:ilvl w:val="3"/>
+          <w:numId w:val="9"/>
+        </w:numPr>
+        <w:spacing w:before="480" w:after="240"/>
+        <w:rPr>
+          <w:rFonts w:ascii="Lexend" w:hAnsi="Lexend"/>
+          <w:b/>
+          <w:bCs/>
+          <w:sz w:val="22"/>
+          <w:szCs w:val="22"/>
+        </w:rPr>
+      </w:pPr>
+      <w:r>
+        <w:rPr>
+          <w:rFonts w:ascii="Lexend" w:hAnsi="Lexend"/>
+          <w:b/>
+          <w:bCs/>
+          <w:sz w:val="22"/>
+          <w:szCs w:val="22"/>
+        </w:rPr>
+        <w:t xml:space="preserve">Message: </w:t>
+      </w:r>
+      <w:r>
+        <w:rPr>
+          <w:rFonts w:ascii="Lexend" w:hAnsi="Lexend"/>
+          <w:sz w:val="22"/>
+          <w:szCs w:val="22"/>
+        </w:rPr>
+        <w:t>Any text sent to another user or thread</w:t>
+      </w:r>
+    </w:p>
+    <w:p>
+      <w:pPr>
+        <w:pStyle w:val="Listaszerbekezds"/>
+        <w:numPr>
+          <w:ilvl w:val="3"/>
+          <w:numId w:val="9"/>
+        </w:numPr>
+        <w:spacing w:before="480" w:after="240"/>
+        <w:rPr>
+          <w:rFonts w:ascii="Lexend" w:hAnsi="Lexend"/>
+          <w:b/>
+          <w:bCs/>
+          <w:sz w:val="22"/>
+          <w:szCs w:val="22"/>
+        </w:rPr>
+      </w:pPr>
+      <w:r>
+        <w:rPr>
+          <w:rFonts w:ascii="Lexend" w:hAnsi="Lexend"/>
+          <w:b/>
+          <w:bCs/>
+          <w:sz w:val="22"/>
+          <w:szCs w:val="22"/>
+        </w:rPr>
+        <w:t>Thread:</w:t>
+      </w:r>
+      <w:r>
+        <w:rPr>
+          <w:rFonts w:ascii="Lexend" w:hAnsi="Lexend"/>
+          <w:sz w:val="22"/>
+          <w:szCs w:val="22"/>
+        </w:rPr>
+        <w:t xml:space="preserve"> A room for community texts, content and events</w:t>
+      </w:r>
+    </w:p>
+    <w:p>
+      <w:pPr>
+        <w:pStyle w:val="Listaszerbekezds"/>
+        <w:numPr>
+          <w:ilvl w:val="3"/>
+          <w:numId w:val="9"/>
+        </w:numPr>
+        <w:spacing w:before="480" w:after="240"/>
+        <w:rPr>
+          <w:rFonts w:ascii="Lexend" w:hAnsi="Lexend"/>
+          <w:b/>
+          <w:bCs/>
+          <w:sz w:val="22"/>
+          <w:szCs w:val="22"/>
+        </w:rPr>
+      </w:pPr>
+      <w:r>
+        <w:rPr>
+          <w:rFonts w:ascii="Lexend" w:hAnsi="Lexend"/>
+          <w:b/>
+          <w:bCs/>
+          <w:sz w:val="22"/>
+          <w:szCs w:val="22"/>
+        </w:rPr>
+        <w:t>Chat Room:</w:t>
+      </w:r>
+      <w:r>
+        <w:rPr>
+          <w:rFonts w:ascii="Lexend" w:hAnsi="Lexend"/>
+          <w:sz w:val="22"/>
+          <w:szCs w:val="22"/>
+        </w:rPr>
+        <w:t xml:space="preserve"> A communicational channel between two users for messages</w:t>
+      </w:r>
+    </w:p>
+    <w:p>
+      <w:pPr>
+        <w:pStyle w:val="Listaszerbekezds"/>
+        <w:numPr>
+          <w:ilvl w:val="3"/>
+          <w:numId w:val="9"/>
+        </w:numPr>
+        <w:spacing w:before="480" w:after="240"/>
+        <w:rPr>
+          <w:rFonts w:ascii="Lexend" w:hAnsi="Lexend"/>
+          <w:b/>
+          <w:bCs/>
+          <w:sz w:val="22"/>
+          <w:szCs w:val="22"/>
+        </w:rPr>
+      </w:pPr>
+      <w:r>
+        <w:rPr>
+          <w:rFonts w:ascii="Lexend" w:hAnsi="Lexend"/>
+          <w:b/>
+          <w:bCs/>
+          <w:sz w:val="22"/>
+          <w:szCs w:val="22"/>
+        </w:rPr>
+        <w:t xml:space="preserve">Course Review: </w:t>
+      </w:r>
+      <w:r>
+        <w:rPr>
+          <w:rFonts w:ascii="Lexend" w:hAnsi="Lexend"/>
+          <w:sz w:val="22"/>
+          <w:szCs w:val="22"/>
+        </w:rPr>
+        <w:t>Reviews and recommendations of the course written by the attenders.</w:t>
+      </w:r>
+    </w:p>
+    <w:p>
+      <w:pPr>
+        <w:pStyle w:val="Listaszerbekezds"/>
+        <w:numPr>
+          <w:ilvl w:val="2"/>
+          <w:numId w:val="9"/>
+        </w:numPr>
+        <w:spacing w:before="480" w:after="240"/>
+        <w:rPr>
+          <w:rFonts w:ascii="Lexend" w:hAnsi="Lexend"/>
+          <w:b/>
+          <w:bCs/>
+          <w:sz w:val="22"/>
+          <w:szCs w:val="22"/>
+        </w:rPr>
+      </w:pPr>
+      <w:r>
+        <w:rPr>
+          <w:rFonts w:ascii="Lexend" w:hAnsi="Lexend"/>
+          <w:b/>
+          <w:bCs/>
+          <w:sz w:val="22"/>
+          <w:szCs w:val="22"/>
+        </w:rPr>
+        <w:t>Relationships:</w:t>
+      </w:r>
+    </w:p>
+    <w:p>
+      <w:pPr>
+        <w:pStyle w:val="Listaszerbekezds"/>
+        <w:numPr>
+          <w:ilvl w:val="3"/>
+          <w:numId w:val="9"/>
+        </w:numPr>
+        <w:spacing w:before="480" w:after="240"/>
+        <w:rPr>
+          <w:rFonts w:ascii="Lexend" w:hAnsi="Lexend"/>
+          <w:b/>
+          <w:bCs/>
+          <w:sz w:val="22"/>
+          <w:szCs w:val="22"/>
+        </w:rPr>
+      </w:pPr>
+      <w:r>
+        <w:rPr>
+          <w:rFonts w:ascii="Lexend" w:hAnsi="Lexend"/>
+          <w:sz w:val="22"/>
+          <w:szCs w:val="22"/>
+        </w:rPr>
+        <w:t>One chat room/thread -&gt; multiple messages</w:t>
+      </w:r>
+    </w:p>
+    <w:p>
+      <w:pPr>
+        <w:pStyle w:val="Listaszerbekezds"/>
+        <w:numPr>
+          <w:ilvl w:val="3"/>
+          <w:numId w:val="9"/>
+        </w:numPr>
+        <w:spacing w:before="480" w:after="240"/>
+        <w:rPr>
+          <w:rFonts w:ascii="Lexend" w:hAnsi="Lexend"/>
+          <w:b/>
+          <w:bCs/>
+          <w:sz w:val="22"/>
+          <w:szCs w:val="22"/>
+        </w:rPr>
+      </w:pPr>
+      <w:r>
+        <w:rPr>
+          <w:rFonts w:ascii="Lexend" w:hAnsi="Lexend"/>
+          <w:sz w:val="22"/>
+          <w:szCs w:val="22"/>
+        </w:rPr>
+        <w:t>One tutoring room -&gt; one chat room</w:t>
+      </w:r>
+      <w:r>
+        <w:rPr>
+          <w:rFonts w:ascii="Lexend" w:hAnsi="Lexend"/>
+          <w:sz w:val="22"/>
+          <w:szCs w:val="22"/>
+        </w:rPr>
+        <w:t xml:space="preserve"> (optional)</w:t>
+      </w:r>
+    </w:p>
+    <w:p>
+      <w:pPr>
+        <w:pStyle w:val="Listaszerbekezds"/>
+        <w:numPr>
+          <w:ilvl w:val="3"/>
+          <w:numId w:val="9"/>
+        </w:numPr>
+        <w:spacing w:before="480" w:after="240"/>
+        <w:rPr>
+          <w:rFonts w:ascii="Lexend" w:hAnsi="Lexend"/>
+          <w:b/>
+          <w:bCs/>
+          <w:sz w:val="22"/>
+          <w:szCs w:val="22"/>
+        </w:rPr>
+      </w:pPr>
+      <w:r>
+        <w:rPr>
+          <w:rFonts w:ascii="Lexend" w:hAnsi="Lexend"/>
+          <w:sz w:val="22"/>
+          <w:szCs w:val="22"/>
+        </w:rPr>
+        <w:t>One learning path -&gt; one thread</w:t>
+      </w:r>
+      <w:r>
+        <w:rPr>
+          <w:rFonts w:ascii="Lexend" w:hAnsi="Lexend"/>
+          <w:sz w:val="22"/>
+          <w:szCs w:val="22"/>
+        </w:rPr>
+        <w:t xml:space="preserve"> (optional)</w:t>
+      </w:r>
+    </w:p>
+    <w:p>
+      <w:pPr>
+        <w:pStyle w:val="Listaszerbekezds"/>
+        <w:numPr>
+          <w:ilvl w:val="3"/>
+          <w:numId w:val="9"/>
+        </w:numPr>
+        <w:spacing w:before="480" w:after="240"/>
+        <w:rPr>
+          <w:rFonts w:ascii="Lexend" w:hAnsi="Lexend"/>
+          <w:b/>
+          <w:bCs/>
+          <w:sz w:val="22"/>
+          <w:szCs w:val="22"/>
+        </w:rPr>
+      </w:pPr>
+      <w:r>
+        <w:rPr>
+          <w:rFonts w:ascii="Lexend" w:hAnsi="Lexend"/>
+          <w:sz w:val="22"/>
+          <w:szCs w:val="22"/>
+        </w:rPr>
+        <w:t>One learning path enrollment -&gt; one chat room</w:t>
+      </w:r>
+      <w:r>
+        <w:rPr>
+          <w:rFonts w:ascii="Lexend" w:hAnsi="Lexend"/>
+          <w:sz w:val="22"/>
+          <w:szCs w:val="22"/>
+        </w:rPr>
+        <w:t xml:space="preserve"> (optional</w:t>
+      </w:r>
+      <w:r>
+        <w:rPr>
+          <w:rFonts w:ascii="Lexend" w:hAnsi="Lexend"/>
+          <w:sz w:val="22"/>
+          <w:szCs w:val="22"/>
+        </w:rPr>
+        <w:t>, student – teacher support</w:t>
+      </w:r>
+      <w:r>
+        <w:rPr>
+          <w:rFonts w:ascii="Lexend" w:hAnsi="Lexend"/>
+          <w:sz w:val="22"/>
+          <w:szCs w:val="22"/>
+        </w:rPr>
+        <w:t>)</w:t>
+      </w:r>
+    </w:p>
+    <w:p>
+      <w:pPr>
+        <w:pStyle w:val="Listaszerbekezds"/>
+        <w:numPr>
+          <w:ilvl w:val="3"/>
+          <w:numId w:val="9"/>
+        </w:numPr>
+        <w:spacing w:before="480" w:after="240"/>
+        <w:rPr>
+          <w:rFonts w:ascii="Lexend" w:hAnsi="Lexend"/>
+          <w:b/>
+          <w:bCs/>
+          <w:sz w:val="22"/>
+          <w:szCs w:val="22"/>
+        </w:rPr>
+      </w:pPr>
+      <w:r>
+        <w:rPr>
+          <w:rFonts w:ascii="Lexend" w:hAnsi="Lexend"/>
+          <w:sz w:val="22"/>
+          <w:szCs w:val="22"/>
+        </w:rPr>
+        <w:t>One base course -&gt; multiple course reviews</w:t>
+      </w:r>
+    </w:p>
+    <w:p>
+      <w:pPr>
+        <w:pStyle w:val="Listaszerbekezds"/>
+        <w:numPr>
+          <w:ilvl w:val="3"/>
+          <w:numId w:val="9"/>
+        </w:numPr>
+        <w:spacing w:before="480" w:after="240"/>
+        <w:rPr>
+          <w:rFonts w:ascii="Lexend" w:hAnsi="Lexend"/>
+          <w:b/>
+          <w:bCs/>
+          <w:sz w:val="22"/>
+          <w:szCs w:val="22"/>
+        </w:rPr>
+      </w:pPr>
+      <w:r>
+        <w:rPr>
+          <w:rFonts w:ascii="Lexend" w:hAnsi="Lexend"/>
+          <w:sz w:val="22"/>
+          <w:szCs w:val="22"/>
+        </w:rPr>
+        <w:t>One student -&gt; one review per course</w:t>
+      </w:r>
+    </w:p>
+    <w:p>
+      <w:pPr>
+        <w:pStyle w:val="Listaszerbekezds"/>
+        <w:numPr>
+          <w:ilvl w:val="1"/>
+          <w:numId w:val="9"/>
+        </w:numPr>
+        <w:spacing w:before="480" w:after="240"/>
+        <w:rPr>
+          <w:rFonts w:ascii="Lexend" w:hAnsi="Lexend"/>
+          <w:b/>
+          <w:bCs/>
+          <w:sz w:val="22"/>
+          <w:szCs w:val="22"/>
+        </w:rPr>
+      </w:pPr>
+      <w:r>
+        <w:rPr>
+          <w:rFonts w:ascii="Lexend" w:hAnsi="Lexend"/>
+          <w:b/>
+          <w:bCs/>
+          <w:sz w:val="22"/>
+          <w:szCs w:val="22"/>
+        </w:rPr>
+        <w:t>Progression Domain:</w:t>
+      </w:r>
+    </w:p>
+    <w:p>
+      <w:pPr>
+        <w:pStyle w:val="Listaszerbekezds"/>
+        <w:numPr>
+          <w:ilvl w:val="2"/>
+          <w:numId w:val="9"/>
+        </w:numPr>
+        <w:spacing w:before="480" w:after="240"/>
+        <w:rPr>
+          <w:rFonts w:ascii="Lexend" w:hAnsi="Lexend"/>
+          <w:b/>
+          <w:bCs/>
+          <w:sz w:val="22"/>
+          <w:szCs w:val="22"/>
+        </w:rPr>
+      </w:pPr>
+      <w:r>
+        <w:rPr>
+          <w:rFonts w:ascii="Lexend" w:hAnsi="Lexend"/>
+          <w:b/>
+          <w:bCs/>
+          <w:sz w:val="22"/>
+          <w:szCs w:val="22"/>
+        </w:rPr>
+        <w:t>Entities:</w:t>
+      </w:r>
+    </w:p>
+    <w:p>
+      <w:pPr>
+        <w:pStyle w:val="Listaszerbekezds"/>
+        <w:numPr>
+          <w:ilvl w:val="3"/>
+          <w:numId w:val="9"/>
+        </w:numPr>
+        <w:spacing w:before="480" w:after="240"/>
+        <w:rPr>
+          <w:rFonts w:ascii="Lexend" w:hAnsi="Lexend"/>
+          <w:b/>
+          <w:bCs/>
+          <w:sz w:val="22"/>
+          <w:szCs w:val="22"/>
+        </w:rPr>
+      </w:pPr>
+      <w:r>
+        <w:rPr>
+          <w:rFonts w:ascii="Lexend" w:hAnsi="Lexend"/>
+          <w:b/>
+          <w:bCs/>
+          <w:sz w:val="22"/>
+          <w:szCs w:val="22"/>
+        </w:rPr>
+        <w:t xml:space="preserve">Enrollment: </w:t>
+      </w:r>
+      <w:r>
+        <w:rPr>
+          <w:rFonts w:ascii="Lexend" w:hAnsi="Lexend"/>
+          <w:sz w:val="22"/>
+          <w:szCs w:val="22"/>
+        </w:rPr>
+        <w:t>Stores data about the progress the student makes when enters a learning path</w:t>
+      </w:r>
+    </w:p>
+    <w:p>
+      <w:pPr>
+        <w:pStyle w:val="Listaszerbekezds"/>
+        <w:numPr>
+          <w:ilvl w:val="2"/>
+          <w:numId w:val="9"/>
+        </w:numPr>
+        <w:spacing w:before="480" w:after="240"/>
+        <w:rPr>
+          <w:rFonts w:ascii="Lexend" w:hAnsi="Lexend"/>
+          <w:b/>
+          <w:bCs/>
+          <w:sz w:val="22"/>
+          <w:szCs w:val="22"/>
+        </w:rPr>
+      </w:pPr>
+      <w:r>
+        <w:rPr>
+          <w:rFonts w:ascii="Lexend" w:hAnsi="Lexend"/>
+          <w:b/>
+          <w:bCs/>
+          <w:sz w:val="22"/>
+          <w:szCs w:val="22"/>
+        </w:rPr>
+        <w:t>Relationships:</w:t>
+      </w:r>
+    </w:p>
+    <w:p>
+      <w:pPr>
+        <w:pStyle w:val="Listaszerbekezds"/>
+        <w:numPr>
+          <w:ilvl w:val="3"/>
+          <w:numId w:val="9"/>
+        </w:numPr>
+        <w:spacing w:before="480" w:after="240"/>
+        <w:rPr>
+          <w:rFonts w:ascii="Lexend" w:hAnsi="Lexend"/>
+          <w:b/>
+          <w:bCs/>
+          <w:sz w:val="22"/>
+          <w:szCs w:val="22"/>
+        </w:rPr>
+      </w:pPr>
+      <w:r>
+        <w:rPr>
+          <w:rFonts w:ascii="Lexend" w:hAnsi="Lexend"/>
+          <w:sz w:val="22"/>
+          <w:szCs w:val="22"/>
+        </w:rPr>
+        <w:t>One learning path -&gt; multiple enrollments (per student)</w:t>
+      </w:r>
+    </w:p>
+    <w:p>
+      <w:pPr>
+        <w:pStyle w:val="Listaszerbekezds"/>
+        <w:numPr>
+          <w:ilvl w:val="3"/>
+          <w:numId w:val="9"/>
+        </w:numPr>
+        <w:spacing w:before="480" w:after="240"/>
+        <w:rPr>
+          <w:rFonts w:ascii="Lexend" w:hAnsi="Lexend"/>
+          <w:b/>
+          <w:bCs/>
+          <w:sz w:val="22"/>
+          <w:szCs w:val="22"/>
+        </w:rPr>
+      </w:pPr>
+      <w:r>
+        <w:rPr>
+          <w:rFonts w:ascii="Lexend" w:hAnsi="Lexend"/>
+          <w:sz w:val="22"/>
+          <w:szCs w:val="22"/>
+        </w:rPr>
+        <w:t>One enrollment -&gt; one chat room (student - teacher)</w:t>
+      </w:r>
+    </w:p>
+    <w:p>
+      <w:pPr>
+        <w:pStyle w:val="Listaszerbekezds"/>
+        <w:numPr>
+          <w:ilvl w:val="1"/>
+          <w:numId w:val="9"/>
+        </w:numPr>
+        <w:spacing w:before="480" w:after="240"/>
+        <w:rPr>
+          <w:rFonts w:ascii="Lexend" w:hAnsi="Lexend"/>
+          <w:b/>
+          <w:bCs/>
+          <w:sz w:val="22"/>
+          <w:szCs w:val="22"/>
+        </w:rPr>
+      </w:pPr>
+      <w:r>
+        <w:rPr>
+          <w:rFonts w:ascii="Lexend" w:hAnsi="Lexend"/>
+          <w:b/>
+          <w:bCs/>
+          <w:sz w:val="22"/>
+          <w:szCs w:val="22"/>
+        </w:rPr>
+        <w:t>Cities Domain:</w:t>
+      </w:r>
+      <w:r>
+        <w:rPr>
+          <w:rFonts w:ascii="Lexend" w:hAnsi="Lexend"/>
           <w:sz w:val="22"/>
           <w:szCs w:val="22"/>
         </w:rPr>
         <w:t xml:space="preserve"> </w:t>
       </w:r>
-      <w:r>
-        <w:rPr>
-          <w:rFonts w:ascii="Lexend" w:hAnsi="Lexend"/>
-          <w:b/>
-          <w:bCs/>
-          <w:sz w:val="22"/>
-          <w:szCs w:val="22"/>
-        </w:rPr>
-        <w:t>Item</w:t>
-      </w:r>
-      <w:r>
-        <w:rPr>
-          <w:rFonts w:ascii="Lexend" w:hAnsi="Lexend"/>
-          <w:b/>
-          <w:bCs/>
-          <w:sz w:val="22"/>
-          <w:szCs w:val="22"/>
-        </w:rPr>
-        <w:t>:</w:t>
+    </w:p>
+    <w:p>
+      <w:pPr>
+        <w:pStyle w:val="Listaszerbekezds"/>
+        <w:numPr>
+          <w:ilvl w:val="2"/>
+          <w:numId w:val="9"/>
+        </w:numPr>
+        <w:spacing w:before="480" w:after="240"/>
+        <w:rPr>
+          <w:rFonts w:ascii="Lexend" w:hAnsi="Lexend"/>
+          <w:b/>
+          <w:bCs/>
+          <w:sz w:val="22"/>
+          <w:szCs w:val="22"/>
+        </w:rPr>
+      </w:pPr>
+      <w:r>
+        <w:rPr>
+          <w:rFonts w:ascii="Lexend" w:hAnsi="Lexend"/>
+          <w:b/>
+          <w:bCs/>
+          <w:sz w:val="22"/>
+          <w:szCs w:val="22"/>
+        </w:rPr>
+        <w:t xml:space="preserve">City: </w:t>
+      </w:r>
+      <w:r>
+        <w:rPr>
+          <w:rFonts w:ascii="Lexend" w:hAnsi="Lexend"/>
+          <w:sz w:val="22"/>
+          <w:szCs w:val="22"/>
+        </w:rPr>
+        <w:t>A city or town with its postal code</w:t>
+      </w:r>
+    </w:p>
+    <w:p>
+      <w:pPr>
+        <w:pStyle w:val="Listaszerbekezds"/>
+        <w:numPr>
+          <w:ilvl w:val="1"/>
+          <w:numId w:val="9"/>
+        </w:numPr>
+        <w:spacing w:before="480" w:after="240"/>
+        <w:rPr>
+          <w:rFonts w:ascii="Lexend" w:hAnsi="Lexend"/>
+          <w:b/>
+          <w:bCs/>
+          <w:sz w:val="22"/>
+          <w:szCs w:val="22"/>
+        </w:rPr>
+      </w:pPr>
+      <w:r>
+        <w:rPr>
+          <w:rFonts w:ascii="Lexend" w:hAnsi="Lexend"/>
+          <w:b/>
+          <w:bCs/>
+          <w:sz w:val="22"/>
+          <w:szCs w:val="22"/>
+        </w:rPr>
+        <w:t>Payment Module:</w:t>
+      </w:r>
+    </w:p>
+    <w:p>
+      <w:pPr>
+        <w:pStyle w:val="Listaszerbekezds"/>
+        <w:numPr>
+          <w:ilvl w:val="2"/>
+          <w:numId w:val="9"/>
+        </w:numPr>
+        <w:spacing w:before="480" w:after="240"/>
+        <w:rPr>
+          <w:rFonts w:ascii="Lexend" w:hAnsi="Lexend"/>
+          <w:b/>
+          <w:bCs/>
+          <w:sz w:val="22"/>
+          <w:szCs w:val="22"/>
+        </w:rPr>
+      </w:pPr>
+      <w:r>
+        <w:rPr>
+          <w:rFonts w:ascii="Lexend" w:hAnsi="Lexend"/>
+          <w:b/>
+          <w:bCs/>
+          <w:sz w:val="22"/>
+          <w:szCs w:val="22"/>
+        </w:rPr>
+        <w:t>Entities:</w:t>
       </w:r>
     </w:p>
     <w:p>
@@ -2816,23 +4087,42 @@
           <w:sz w:val="22"/>
           <w:szCs w:val="22"/>
         </w:rPr>
-        <w:t xml:space="preserve">File: </w:t>
-      </w:r>
-      <w:r>
-        <w:rPr>
-          <w:rFonts w:ascii="Lexend" w:hAnsi="Lexend"/>
-          <w:sz w:val="22"/>
-          <w:szCs w:val="22"/>
-        </w:rPr>
-        <w:t>Any uploaded file (e.g. PDF, Word, PPT, TXT, Video, Audio, Image)</w:t>
-      </w:r>
-      <w:r>
-        <w:rPr>
-          <w:rFonts w:ascii="Lexend" w:hAnsi="Lexend"/>
-          <w:sz w:val="22"/>
-          <w:szCs w:val="22"/>
-        </w:rPr>
-        <w:t xml:space="preserve"> – stored as binary</w:t>
+        <w:t xml:space="preserve">Payment: </w:t>
+      </w:r>
+      <w:r>
+        <w:rPr>
+          <w:rFonts w:ascii="Lexend" w:hAnsi="Lexend"/>
+          <w:sz w:val="22"/>
+          <w:szCs w:val="22"/>
+        </w:rPr>
+        <w:t>Stores the price, the deadline for the payment, the user who made the purchase, and whether it was already paid</w:t>
+      </w:r>
+    </w:p>
+    <w:p>
+      <w:pPr>
+        <w:pStyle w:val="Listaszerbekezds"/>
+        <w:numPr>
+          <w:ilvl w:val="2"/>
+          <w:numId w:val="9"/>
+        </w:numPr>
+        <w:spacing w:before="480" w:after="240"/>
+        <w:rPr>
+          <w:rFonts w:ascii="Lexend" w:hAnsi="Lexend"/>
+          <w:b/>
+          <w:bCs/>
+          <w:sz w:val="22"/>
+          <w:szCs w:val="22"/>
+        </w:rPr>
+      </w:pPr>
+      <w:r>
+        <w:rPr>
+          <w:rFonts w:ascii="Lexend" w:hAnsi="Lexend"/>
+          <w:b/>
+          <w:bCs/>
+          <w:sz w:val="22"/>
+          <w:szCs w:val="22"/>
+        </w:rPr>
+        <w:t>Relationships:</w:t>
       </w:r>
     </w:p>
     <w:p>
@@ -2854,68 +4144,26 @@
       <w:r>
         <w:rPr>
           <w:rFonts w:ascii="Lexend" w:hAnsi="Lexend"/>
-          <w:b/>
-          <w:bCs/>
-          <w:sz w:val="22"/>
-          <w:szCs w:val="22"/>
-        </w:rPr>
-        <w:t>Test:</w:t>
-      </w:r>
-      <w:r>
-        <w:rPr>
-          <w:rFonts w:ascii="Lexend" w:hAnsi="Lexend"/>
-          <w:sz w:val="22"/>
-          <w:szCs w:val="22"/>
-        </w:rPr>
-        <w:t xml:space="preserve"> A series of sub-</w:t>
-      </w:r>
-      <w:r>
-        <w:rPr>
-          <w:rFonts w:ascii="Lexend" w:hAnsi="Lexend"/>
-          <w:sz w:val="22"/>
-          <w:szCs w:val="22"/>
-        </w:rPr>
-        <w:t>modules</w:t>
-      </w:r>
-      <w:r>
-        <w:rPr>
-          <w:rFonts w:ascii="Lexend" w:hAnsi="Lexend"/>
-          <w:sz w:val="22"/>
-          <w:szCs w:val="22"/>
-        </w:rPr>
-        <w:t xml:space="preserve"> made in the test editor, the student has to fill out</w:t>
-      </w:r>
-      <w:r>
-        <w:rPr>
-          <w:rFonts w:ascii="Lexend" w:hAnsi="Lexend"/>
-          <w:sz w:val="22"/>
-          <w:szCs w:val="22"/>
-        </w:rPr>
-        <w:t xml:space="preserve">, can have </w:t>
-      </w:r>
-      <w:r>
-        <w:rPr>
-          <w:rFonts w:ascii="Lexend" w:hAnsi="Lexend"/>
-          <w:sz w:val="22"/>
-          <w:szCs w:val="22"/>
-        </w:rPr>
-        <w:t>t</w:t>
-      </w:r>
-      <w:r>
-        <w:rPr>
-          <w:rFonts w:ascii="Lexend" w:hAnsi="Lexend"/>
-          <w:sz w:val="22"/>
-          <w:szCs w:val="22"/>
-        </w:rPr>
-        <w:t>imer</w:t>
-      </w:r>
-      <w:r>
-        <w:rPr>
-          <w:rFonts w:ascii="Lexend" w:hAnsi="Lexend"/>
-          <w:sz w:val="22"/>
-          <w:szCs w:val="22"/>
-        </w:rPr>
-        <w:t>, and be graded</w:t>
+          <w:sz w:val="22"/>
+          <w:szCs w:val="22"/>
+        </w:rPr>
+        <w:t>One enrollment</w:t>
+      </w:r>
+      <w:r>
+        <w:rPr>
+          <w:rFonts w:ascii="Lexend" w:hAnsi="Lexend"/>
+          <w:sz w:val="22"/>
+          <w:szCs w:val="22"/>
+        </w:rPr>
+        <w:t xml:space="preserve"> </w:t>
+      </w:r>
+      <w:r>
+        <w:rPr>
+          <w:rFonts w:ascii="Lexend" w:hAnsi="Lexend"/>
+          <w:sz w:val="22"/>
+          <w:szCs w:val="22"/>
+        </w:rPr>
+        <w:t>-&gt; multiple payments</w:t>
       </w:r>
     </w:p>
     <w:p>
@@ -2937,20 +4185,10 @@
       <w:r>
         <w:rPr>
           <w:rFonts w:ascii="Lexend" w:hAnsi="Lexend"/>
-          <w:b/>
-          <w:bCs/>
-          <w:sz w:val="22"/>
-          <w:szCs w:val="22"/>
-        </w:rPr>
-        <w:t xml:space="preserve">Hand-in: </w:t>
-      </w:r>
-      <w:r>
-        <w:rPr>
-          <w:rFonts w:ascii="Lexend" w:hAnsi="Lexend"/>
-          <w:sz w:val="22"/>
-          <w:szCs w:val="22"/>
-        </w:rPr>
-        <w:t>A text which describes what the student should submit by the due date, type can be selected, and if one or multiple types (e.g. image, word, pdf, ppt, text)</w:t>
+          <w:sz w:val="22"/>
+          <w:szCs w:val="22"/>
+        </w:rPr>
+        <w:t>One tutoring room -&gt; multiple payments</w:t>
       </w:r>
     </w:p>
     <w:p>
@@ -2972,44 +4210,123 @@
       <w:r>
         <w:rPr>
           <w:rFonts w:ascii="Lexend" w:hAnsi="Lexend"/>
-          <w:b/>
-          <w:bCs/>
-          <w:sz w:val="22"/>
-          <w:szCs w:val="22"/>
-        </w:rPr>
-        <w:t>Text:</w:t>
-      </w:r>
-      <w:r>
-        <w:rPr>
-          <w:rFonts w:ascii="Lexend" w:hAnsi="Lexend"/>
-          <w:sz w:val="22"/>
-          <w:szCs w:val="22"/>
-        </w:rPr>
-        <w:t xml:space="preserve"> Simple</w:t>
-      </w:r>
-      <w:r>
-        <w:rPr>
-          <w:rFonts w:ascii="Lexend" w:hAnsi="Lexend"/>
-          <w:sz w:val="22"/>
-          <w:szCs w:val="22"/>
-        </w:rPr>
-        <w:t>, formatted</w:t>
-      </w:r>
-      <w:r>
-        <w:rPr>
-          <w:rFonts w:ascii="Lexend" w:hAnsi="Lexend"/>
-          <w:sz w:val="22"/>
-          <w:szCs w:val="22"/>
-        </w:rPr>
-        <w:t xml:space="preserve"> text can be sent</w:t>
-      </w:r>
-      <w:r>
-        <w:rPr>
-          <w:rFonts w:ascii="Lexend" w:hAnsi="Lexend"/>
-          <w:sz w:val="22"/>
-          <w:szCs w:val="22"/>
-        </w:rPr>
-        <w:t xml:space="preserve"> or stored</w:t>
+          <w:sz w:val="22"/>
+          <w:szCs w:val="22"/>
+        </w:rPr>
+        <w:lastRenderedPageBreak/>
+        <w:t>One payment -&gt; one type of course (per enrollment/tutoring room)</w:t>
+      </w:r>
+    </w:p>
+    <w:p>
+      <w:pPr>
+        <w:pBdr>
+          <w:bottom w:val="single" w:sz="4" w:space="1" w:color="auto"/>
+        </w:pBdr>
+        <w:rPr>
+          <w:rFonts w:ascii="Lexend" w:hAnsi="Lexend"/>
+        </w:rPr>
+      </w:pPr>
+    </w:p>
+    <w:p>
+      <w:pPr>
+        <w:pStyle w:val="Listaszerbekezds"/>
+        <w:numPr>
+          <w:ilvl w:val="0"/>
+          <w:numId w:val="1"/>
+        </w:numPr>
+        <w:spacing w:before="480" w:after="240"/>
+        <w:ind w:left="714" w:hanging="357"/>
+        <w:contextualSpacing w:val="0"/>
+        <w:rPr>
+          <w:rFonts w:ascii="Lexend" w:hAnsi="Lexend"/>
+          <w:b/>
+          <w:bCs/>
+          <w:sz w:val="32"/>
+          <w:szCs w:val="32"/>
+        </w:rPr>
+      </w:pPr>
+      <w:r>
+        <w:rPr>
+          <w:rFonts w:ascii="Lexend" w:hAnsi="Lexend"/>
+          <w:b/>
+          <w:bCs/>
+          <w:sz w:val="32"/>
+          <w:szCs w:val="32"/>
+        </w:rPr>
+        <w:t>Page Contracts</w:t>
+      </w:r>
+    </w:p>
+    <w:p>
+      <w:pPr>
+        <w:pStyle w:val="Listaszerbekezds"/>
+        <w:numPr>
+          <w:ilvl w:val="0"/>
+          <w:numId w:val="10"/>
+        </w:numPr>
+        <w:spacing w:before="480" w:after="240"/>
+        <w:rPr>
+          <w:rFonts w:ascii="Lexend" w:hAnsi="Lexend"/>
+          <w:sz w:val="22"/>
+          <w:szCs w:val="22"/>
+        </w:rPr>
+      </w:pPr>
+      <w:r>
+        <w:rPr>
+          <w:rFonts w:ascii="Lexend" w:hAnsi="Lexend"/>
+          <w:b/>
+          <w:bCs/>
+          <w:sz w:val="28"/>
+          <w:szCs w:val="28"/>
+        </w:rPr>
+        <w:t xml:space="preserve">Student </w:t>
+      </w:r>
+    </w:p>
+    <w:p>
+      <w:pPr>
+        <w:pStyle w:val="Listaszerbekezds"/>
+        <w:numPr>
+          <w:ilvl w:val="1"/>
+          <w:numId w:val="10"/>
+        </w:numPr>
+        <w:spacing w:before="480" w:after="240"/>
+        <w:rPr>
+          <w:rFonts w:ascii="Lexend" w:hAnsi="Lexend"/>
+          <w:sz w:val="22"/>
+          <w:szCs w:val="22"/>
+        </w:rPr>
+      </w:pPr>
+      <w:r>
+        <w:rPr>
+          <w:rFonts w:ascii="Lexend" w:hAnsi="Lexend"/>
+          <w:b/>
+          <w:bCs/>
+          <w:sz w:val="28"/>
+          <w:szCs w:val="28"/>
+        </w:rPr>
+        <w:t>Home:</w:t>
+      </w:r>
+    </w:p>
+    <w:p>
+      <w:pPr>
+        <w:pStyle w:val="Listaszerbekezds"/>
+        <w:numPr>
+          <w:ilvl w:val="2"/>
+          <w:numId w:val="10"/>
+        </w:numPr>
+        <w:spacing w:before="480" w:after="240"/>
+        <w:rPr>
+          <w:rFonts w:ascii="Lexend" w:hAnsi="Lexend"/>
+          <w:sz w:val="22"/>
+          <w:szCs w:val="22"/>
+        </w:rPr>
+      </w:pPr>
+      <w:r>
+        <w:rPr>
+          <w:rFonts w:ascii="Lexend" w:hAnsi="Lexend"/>
+          <w:sz w:val="22"/>
+          <w:szCs w:val="22"/>
+        </w:rPr>
+        <w:t xml:space="preserve">Data it needs: </w:t>
       </w:r>
     </w:p>
     <w:p>
@@ -3017,93 +4334,299 @@
         <w:pStyle w:val="Listaszerbekezds"/>
         <w:numPr>
           <w:ilvl w:val="3"/>
-          <w:numId w:val="9"/>
-        </w:numPr>
-        <w:spacing w:before="480" w:after="240"/>
-        <w:rPr>
-          <w:rFonts w:ascii="Lexend" w:hAnsi="Lexend"/>
-          <w:b/>
-          <w:bCs/>
-          <w:sz w:val="22"/>
-          <w:szCs w:val="22"/>
-        </w:rPr>
-      </w:pPr>
-      <w:r>
-        <w:rPr>
-          <w:rFonts w:ascii="Lexend" w:hAnsi="Lexend"/>
-          <w:b/>
-          <w:bCs/>
-          <w:sz w:val="22"/>
-          <w:szCs w:val="22"/>
-        </w:rPr>
-        <w:t xml:space="preserve">Test module: </w:t>
-      </w:r>
-      <w:r>
-        <w:rPr>
-          <w:rFonts w:ascii="Lexend" w:hAnsi="Lexend"/>
-          <w:sz w:val="22"/>
-          <w:szCs w:val="22"/>
-        </w:rPr>
-        <w:t>Blocks a test can be built out of</w:t>
-      </w:r>
-      <w:r>
-        <w:rPr>
-          <w:rFonts w:ascii="Lexend" w:hAnsi="Lexend"/>
-          <w:sz w:val="22"/>
-          <w:szCs w:val="22"/>
-        </w:rPr>
-        <w:t>, can be graded</w:t>
-      </w:r>
-      <w:r>
-        <w:rPr>
-          <w:rFonts w:ascii="Lexend" w:hAnsi="Lexend"/>
-          <w:sz w:val="22"/>
-          <w:szCs w:val="22"/>
-        </w:rPr>
-        <w:t xml:space="preserve"> (e.g. short-long answer, select one-multiple, </w:t>
-      </w:r>
-      <w:r>
-        <w:rPr>
-          <w:rFonts w:ascii="Lexend" w:hAnsi="Lexend"/>
-          <w:sz w:val="22"/>
-          <w:szCs w:val="22"/>
-        </w:rPr>
-        <w:t>sort</w:t>
-      </w:r>
-      <w:r>
-        <w:rPr>
-          <w:rFonts w:ascii="Lexend" w:hAnsi="Lexend"/>
-          <w:sz w:val="22"/>
-          <w:szCs w:val="22"/>
-        </w:rPr>
-        <w:t>)</w:t>
-      </w:r>
-    </w:p>
+          <w:numId w:val="10"/>
+        </w:numPr>
+        <w:spacing w:before="480" w:after="240"/>
+        <w:rPr>
+          <w:rFonts w:ascii="Lexend" w:hAnsi="Lexend"/>
+          <w:sz w:val="22"/>
+          <w:szCs w:val="22"/>
+        </w:rPr>
+      </w:pPr>
+      <w:r>
+        <w:rPr>
+          <w:rFonts w:ascii="Lexend" w:hAnsi="Lexend"/>
+          <w:sz w:val="22"/>
+          <w:szCs w:val="22"/>
+        </w:rPr>
+        <w:t>Attended courses (active, completed)</w:t>
+      </w:r>
+    </w:p>
+    <w:p>
+      <w:pPr>
+        <w:pStyle w:val="Listaszerbekezds"/>
+        <w:numPr>
+          <w:ilvl w:val="4"/>
+          <w:numId w:val="10"/>
+        </w:numPr>
+        <w:spacing w:before="480" w:after="240"/>
+        <w:rPr>
+          <w:rFonts w:ascii="Lexend" w:hAnsi="Lexend"/>
+          <w:sz w:val="22"/>
+          <w:szCs w:val="22"/>
+        </w:rPr>
+      </w:pPr>
+      <w:r>
+        <w:rPr>
+          <w:rFonts w:ascii="Lexend" w:hAnsi="Lexend"/>
+          <w:sz w:val="22"/>
+          <w:szCs w:val="22"/>
+        </w:rPr>
+        <w:t>progression, next upcoming event/deadline, link to the wall/path if active</w:t>
+      </w:r>
+    </w:p>
+    <w:p>
+      <w:pPr>
+        <w:pStyle w:val="Listaszerbekezds"/>
+        <w:numPr>
+          <w:ilvl w:val="3"/>
+          <w:numId w:val="10"/>
+        </w:numPr>
+        <w:spacing w:before="480" w:after="240"/>
+        <w:rPr>
+          <w:rFonts w:ascii="Lexend" w:hAnsi="Lexend"/>
+          <w:sz w:val="22"/>
+          <w:szCs w:val="22"/>
+        </w:rPr>
+      </w:pPr>
+      <w:r>
+        <w:rPr>
+          <w:rFonts w:ascii="Lexend" w:hAnsi="Lexend"/>
+          <w:sz w:val="22"/>
+          <w:szCs w:val="22"/>
+        </w:rPr>
+        <w:t>Upcoming events (5)</w:t>
+      </w:r>
+    </w:p>
+    <w:p>
+      <w:pPr>
+        <w:pStyle w:val="Listaszerbekezds"/>
+        <w:numPr>
+          <w:ilvl w:val="3"/>
+          <w:numId w:val="10"/>
+        </w:numPr>
+        <w:spacing w:before="480" w:after="240"/>
+        <w:rPr>
+          <w:rFonts w:ascii="Lexend" w:hAnsi="Lexend"/>
+          <w:sz w:val="22"/>
+          <w:szCs w:val="22"/>
+        </w:rPr>
+      </w:pPr>
+      <w:r>
+        <w:rPr>
+          <w:rFonts w:ascii="Lexend" w:hAnsi="Lexend"/>
+          <w:sz w:val="22"/>
+          <w:szCs w:val="22"/>
+        </w:rPr>
+        <w:t>Popular Courses (paths, tutors)</w:t>
+      </w:r>
+    </w:p>
+    <w:p>
+      <w:pPr>
+        <w:pStyle w:val="Listaszerbekezds"/>
+        <w:numPr>
+          <w:ilvl w:val="3"/>
+          <w:numId w:val="10"/>
+        </w:numPr>
+        <w:spacing w:before="480" w:after="240"/>
+        <w:rPr>
+          <w:rFonts w:ascii="Lexend" w:hAnsi="Lexend"/>
+          <w:sz w:val="22"/>
+          <w:szCs w:val="22"/>
+        </w:rPr>
+      </w:pPr>
+      <w:r>
+        <w:rPr>
+          <w:rFonts w:ascii="Lexend" w:hAnsi="Lexend"/>
+          <w:sz w:val="22"/>
+          <w:szCs w:val="22"/>
+        </w:rPr>
+        <w:t>Notifications</w:t>
+      </w:r>
+    </w:p>
+    <w:p>
+      <w:pPr>
+        <w:pStyle w:val="Listaszerbekezds"/>
+        <w:numPr>
+          <w:ilvl w:val="1"/>
+          <w:numId w:val="10"/>
+        </w:numPr>
+        <w:spacing w:before="480" w:after="240"/>
+        <w:rPr>
+          <w:rFonts w:ascii="Lexend" w:hAnsi="Lexend"/>
+          <w:sz w:val="22"/>
+          <w:szCs w:val="22"/>
+        </w:rPr>
+      </w:pPr>
+      <w:r>
+        <w:rPr>
+          <w:rFonts w:ascii="Lexend" w:hAnsi="Lexend"/>
+          <w:b/>
+          <w:bCs/>
+          <w:sz w:val="28"/>
+          <w:szCs w:val="28"/>
+        </w:rPr>
+        <w:t>My courses</w:t>
+      </w:r>
+    </w:p>
+    <w:p>
+      <w:pPr>
+        <w:pStyle w:val="Listaszerbekezds"/>
+        <w:numPr>
+          <w:ilvl w:val="1"/>
+          <w:numId w:val="10"/>
+        </w:numPr>
+        <w:spacing w:before="480" w:after="240"/>
+        <w:rPr>
+          <w:rFonts w:ascii="Lexend" w:hAnsi="Lexend"/>
+          <w:sz w:val="22"/>
+          <w:szCs w:val="22"/>
+        </w:rPr>
+      </w:pPr>
+      <w:r>
+        <w:rPr>
+          <w:rFonts w:ascii="Lexend" w:hAnsi="Lexend"/>
+          <w:b/>
+          <w:bCs/>
+          <w:sz w:val="28"/>
+          <w:szCs w:val="28"/>
+        </w:rPr>
+        <w:t>Calendar</w:t>
+      </w:r>
+    </w:p>
+    <w:p>
+      <w:pPr>
+        <w:pStyle w:val="Listaszerbekezds"/>
+        <w:numPr>
+          <w:ilvl w:val="1"/>
+          <w:numId w:val="10"/>
+        </w:numPr>
+        <w:spacing w:before="480" w:after="240"/>
+        <w:rPr>
+          <w:rFonts w:ascii="Lexend" w:hAnsi="Lexend"/>
+          <w:sz w:val="22"/>
+          <w:szCs w:val="22"/>
+        </w:rPr>
+      </w:pPr>
+      <w:r>
+        <w:rPr>
+          <w:rFonts w:ascii="Lexend" w:hAnsi="Lexend"/>
+          <w:b/>
+          <w:bCs/>
+          <w:sz w:val="28"/>
+          <w:szCs w:val="28"/>
+        </w:rPr>
+        <w:t>C</w:t>
+      </w:r>
+      <w:r>
+        <w:rPr>
+          <w:rFonts w:ascii="Lexend" w:hAnsi="Lexend"/>
+          <w:b/>
+          <w:bCs/>
+          <w:sz w:val="28"/>
+          <w:szCs w:val="28"/>
+        </w:rPr>
+        <w:t>ommunity</w:t>
+      </w:r>
+    </w:p>
+    <w:p>
+      <w:pPr>
+        <w:pStyle w:val="Listaszerbekezds"/>
+        <w:numPr>
+          <w:ilvl w:val="1"/>
+          <w:numId w:val="10"/>
+        </w:numPr>
+        <w:spacing w:before="480" w:after="240"/>
+        <w:rPr>
+          <w:rFonts w:ascii="Lexend" w:hAnsi="Lexend"/>
+          <w:sz w:val="22"/>
+          <w:szCs w:val="22"/>
+        </w:rPr>
+      </w:pPr>
+      <w:r>
+        <w:rPr>
+          <w:rFonts w:ascii="Lexend" w:hAnsi="Lexend"/>
+          <w:b/>
+          <w:bCs/>
+          <w:sz w:val="28"/>
+          <w:szCs w:val="28"/>
+        </w:rPr>
+        <w:t>Finances</w:t>
+      </w:r>
+    </w:p>
+    <w:p>
+      <w:pPr>
+        <w:pStyle w:val="Listaszerbekezds"/>
+        <w:numPr>
+          <w:ilvl w:val="0"/>
+          <w:numId w:val="10"/>
+        </w:numPr>
+        <w:spacing w:before="480" w:after="240"/>
+        <w:rPr>
+          <w:rFonts w:ascii="Lexend" w:hAnsi="Lexend"/>
+          <w:sz w:val="22"/>
+          <w:szCs w:val="22"/>
+        </w:rPr>
+      </w:pPr>
+      <w:r>
+        <w:rPr>
+          <w:rFonts w:ascii="Lexend" w:hAnsi="Lexend"/>
+          <w:b/>
+          <w:bCs/>
+          <w:sz w:val="28"/>
+          <w:szCs w:val="28"/>
+        </w:rPr>
+        <w:t xml:space="preserve">Teacher </w:t>
+      </w:r>
+    </w:p>
+    <w:p>
+      <w:pPr>
+        <w:pStyle w:val="Listaszerbekezds"/>
+        <w:numPr>
+          <w:ilvl w:val="1"/>
+          <w:numId w:val="10"/>
+        </w:numPr>
+        <w:spacing w:before="480" w:after="240"/>
+        <w:rPr>
+          <w:rFonts w:ascii="Lexend" w:hAnsi="Lexend"/>
+          <w:sz w:val="22"/>
+          <w:szCs w:val="22"/>
+        </w:rPr>
+      </w:pPr>
+      <w:bookmarkStart w:id="0" w:name="_Hlk222830692"/>
+      <w:r>
+        <w:rPr>
+          <w:rFonts w:ascii="Lexend" w:hAnsi="Lexend"/>
+          <w:b/>
+          <w:bCs/>
+          <w:sz w:val="28"/>
+          <w:szCs w:val="28"/>
+        </w:rPr>
+        <w:t>Home</w:t>
+      </w:r>
+    </w:p>
+    <w:bookmarkEnd w:id="0"/>
     <w:p>
       <w:pPr>
         <w:pStyle w:val="Listaszerbekezds"/>
         <w:numPr>
           <w:ilvl w:val="2"/>
-          <w:numId w:val="9"/>
-        </w:numPr>
-        <w:spacing w:before="480" w:after="240"/>
-        <w:rPr>
-          <w:rFonts w:ascii="Lexend" w:hAnsi="Lexend"/>
-          <w:b/>
-          <w:bCs/>
-          <w:sz w:val="22"/>
-          <w:szCs w:val="22"/>
-        </w:rPr>
-      </w:pPr>
-      <w:r>
-        <w:rPr>
-          <w:rFonts w:ascii="Lexend" w:hAnsi="Lexend"/>
-          <w:b/>
-          <w:bCs/>
-          <w:sz w:val="22"/>
-          <w:szCs w:val="22"/>
-        </w:rPr>
-        <w:t>Relationships:</w:t>
+          <w:numId w:val="10"/>
+        </w:numPr>
+        <w:spacing w:before="480" w:after="240"/>
+        <w:rPr>
+          <w:rFonts w:ascii="Lexend" w:hAnsi="Lexend"/>
+          <w:sz w:val="22"/>
+          <w:szCs w:val="22"/>
+        </w:rPr>
+      </w:pPr>
+      <w:r>
+        <w:rPr>
+          <w:rFonts w:ascii="Lexend" w:hAnsi="Lexend"/>
+          <w:sz w:val="22"/>
+          <w:szCs w:val="22"/>
+        </w:rPr>
+        <w:t>Data it needs:</w:t>
       </w:r>
     </w:p>
     <w:p>
@@ -3111,24 +4634,45 @@
         <w:pStyle w:val="Listaszerbekezds"/>
         <w:numPr>
           <w:ilvl w:val="3"/>
-          <w:numId w:val="9"/>
-        </w:numPr>
-        <w:spacing w:before="480" w:after="240"/>
-        <w:rPr>
-          <w:rFonts w:ascii="Lexend" w:hAnsi="Lexend"/>
-          <w:b/>
-          <w:bCs/>
-          <w:sz w:val="22"/>
-          <w:szCs w:val="22"/>
-        </w:rPr>
-      </w:pPr>
-      <w:r>
-        <w:rPr>
-          <w:rFonts w:ascii="Lexend" w:hAnsi="Lexend"/>
-          <w:sz w:val="22"/>
-          <w:szCs w:val="22"/>
-        </w:rPr>
-        <w:t>Test -&gt; many modules</w:t>
+          <w:numId w:val="10"/>
+        </w:numPr>
+        <w:spacing w:before="480" w:after="240"/>
+        <w:rPr>
+          <w:rFonts w:ascii="Lexend" w:hAnsi="Lexend"/>
+          <w:sz w:val="22"/>
+          <w:szCs w:val="22"/>
+        </w:rPr>
+      </w:pPr>
+      <w:r>
+        <w:rPr>
+          <w:rFonts w:ascii="Lexend" w:hAnsi="Lexend"/>
+          <w:sz w:val="22"/>
+          <w:szCs w:val="22"/>
+        </w:rPr>
+        <w:t>Active courses (tutoring and path)</w:t>
+      </w:r>
+    </w:p>
+    <w:p>
+      <w:pPr>
+        <w:pStyle w:val="Listaszerbekezds"/>
+        <w:numPr>
+          <w:ilvl w:val="4"/>
+          <w:numId w:val="10"/>
+        </w:numPr>
+        <w:spacing w:before="480" w:after="240"/>
+        <w:rPr>
+          <w:rFonts w:ascii="Lexend" w:hAnsi="Lexend"/>
+          <w:sz w:val="22"/>
+          <w:szCs w:val="22"/>
+        </w:rPr>
+      </w:pPr>
+      <w:r>
+        <w:rPr>
+          <w:rFonts w:ascii="Lexend" w:hAnsi="Lexend"/>
+          <w:sz w:val="22"/>
+          <w:szCs w:val="22"/>
+        </w:rPr>
+        <w:t>no. of students, link to the course teacher’s overview</w:t>
       </w:r>
     </w:p>
     <w:p>
@@ -3136,24 +4680,22 @@
         <w:pStyle w:val="Listaszerbekezds"/>
         <w:numPr>
           <w:ilvl w:val="3"/>
-          <w:numId w:val="9"/>
-        </w:numPr>
-        <w:spacing w:before="480" w:after="240"/>
-        <w:rPr>
-          <w:rFonts w:ascii="Lexend" w:hAnsi="Lexend"/>
-          <w:b/>
-          <w:bCs/>
-          <w:sz w:val="22"/>
-          <w:szCs w:val="22"/>
-        </w:rPr>
-      </w:pPr>
-      <w:r>
-        <w:rPr>
-          <w:rFonts w:ascii="Lexend" w:hAnsi="Lexend"/>
-          <w:sz w:val="22"/>
-          <w:szCs w:val="22"/>
-        </w:rPr>
-        <w:t>One content item -&gt; one type</w:t>
+          <w:numId w:val="10"/>
+        </w:numPr>
+        <w:spacing w:before="480" w:after="240"/>
+        <w:rPr>
+          <w:rFonts w:ascii="Lexend" w:hAnsi="Lexend"/>
+          <w:sz w:val="22"/>
+          <w:szCs w:val="22"/>
+        </w:rPr>
+      </w:pPr>
+      <w:r>
+        <w:rPr>
+          <w:rFonts w:ascii="Lexend" w:hAnsi="Lexend"/>
+          <w:sz w:val="22"/>
+          <w:szCs w:val="22"/>
+        </w:rPr>
+        <w:t>Upcoming events (5)</w:t>
       </w:r>
     </w:p>
     <w:p>
@@ -3161,24 +4703,22 @@
         <w:pStyle w:val="Listaszerbekezds"/>
         <w:numPr>
           <w:ilvl w:val="3"/>
-          <w:numId w:val="9"/>
-        </w:numPr>
-        <w:spacing w:before="480" w:after="240"/>
-        <w:rPr>
-          <w:rFonts w:ascii="Lexend" w:hAnsi="Lexend"/>
-          <w:b/>
-          <w:bCs/>
-          <w:sz w:val="22"/>
-          <w:szCs w:val="22"/>
-        </w:rPr>
-      </w:pPr>
-      <w:r>
-        <w:rPr>
-          <w:rFonts w:ascii="Lexend" w:hAnsi="Lexend"/>
-          <w:sz w:val="22"/>
-          <w:szCs w:val="22"/>
-        </w:rPr>
-        <w:t>One hand-in -&gt; one submission</w:t>
+          <w:numId w:val="10"/>
+        </w:numPr>
+        <w:spacing w:before="480" w:after="240"/>
+        <w:rPr>
+          <w:rFonts w:ascii="Lexend" w:hAnsi="Lexend"/>
+          <w:sz w:val="22"/>
+          <w:szCs w:val="22"/>
+        </w:rPr>
+      </w:pPr>
+      <w:r>
+        <w:rPr>
+          <w:rFonts w:ascii="Lexend" w:hAnsi="Lexend"/>
+          <w:sz w:val="22"/>
+          <w:szCs w:val="22"/>
+        </w:rPr>
+        <w:t>The first few students (3)</w:t>
       </w:r>
     </w:p>
     <w:p>
@@ -3186,48 +4726,22 @@
         <w:pStyle w:val="Listaszerbekezds"/>
         <w:numPr>
           <w:ilvl w:val="3"/>
-          <w:numId w:val="9"/>
-        </w:numPr>
-        <w:spacing w:before="480" w:after="240"/>
-        <w:rPr>
-          <w:rFonts w:ascii="Lexend" w:hAnsi="Lexend"/>
-          <w:b/>
-          <w:bCs/>
-          <w:sz w:val="22"/>
-          <w:szCs w:val="22"/>
-        </w:rPr>
-      </w:pPr>
-      <w:r>
-        <w:rPr>
-          <w:rFonts w:ascii="Lexend" w:hAnsi="Lexend"/>
-          <w:sz w:val="22"/>
-          <w:szCs w:val="22"/>
-        </w:rPr>
-        <w:t>One content item can belong: Lesson, Wall, Sub</w:t>
-      </w:r>
-      <w:r>
-        <w:rPr>
-          <w:rFonts w:ascii="Lexend" w:hAnsi="Lexend"/>
-          <w:sz w:val="22"/>
-          <w:szCs w:val="22"/>
-        </w:rPr>
-        <w:t>m</w:t>
-      </w:r>
-      <w:r>
-        <w:rPr>
-          <w:rFonts w:ascii="Lexend" w:hAnsi="Lexend"/>
-          <w:sz w:val="22"/>
-          <w:szCs w:val="22"/>
-        </w:rPr>
-        <w:t>ission, Thread</w:t>
-      </w:r>
-      <w:r>
-        <w:rPr>
-          <w:rFonts w:ascii="Lexend" w:hAnsi="Lexend"/>
-          <w:sz w:val="22"/>
-          <w:szCs w:val="22"/>
-        </w:rPr>
-        <w:t>, and can be reused across multiple places</w:t>
+          <w:numId w:val="10"/>
+        </w:numPr>
+        <w:spacing w:before="480" w:after="240"/>
+        <w:rPr>
+          <w:rFonts w:ascii="Lexend" w:hAnsi="Lexend"/>
+          <w:sz w:val="22"/>
+          <w:szCs w:val="22"/>
+        </w:rPr>
+      </w:pPr>
+      <w:r>
+        <w:rPr>
+          <w:rFonts w:ascii="Lexend" w:hAnsi="Lexend"/>
+          <w:sz w:val="22"/>
+          <w:szCs w:val="22"/>
+        </w:rPr>
+        <w:t>Notifications</w:t>
       </w:r>
     </w:p>
     <w:p>
@@ -3235,231 +4749,24 @@
         <w:pStyle w:val="Listaszerbekezds"/>
         <w:numPr>
           <w:ilvl w:val="1"/>
-          <w:numId w:val="9"/>
-        </w:numPr>
-        <w:spacing w:before="480" w:after="240"/>
-        <w:rPr>
-          <w:rFonts w:ascii="Lexend" w:hAnsi="Lexend"/>
-          <w:b/>
-          <w:bCs/>
-          <w:sz w:val="22"/>
-          <w:szCs w:val="22"/>
-        </w:rPr>
-      </w:pPr>
-      <w:r>
-        <w:rPr>
-          <w:rFonts w:ascii="Lexend" w:hAnsi="Lexend"/>
-          <w:b/>
-          <w:bCs/>
-          <w:sz w:val="22"/>
-          <w:szCs w:val="22"/>
-        </w:rPr>
-        <w:t>Scheduling Domain:</w:t>
-      </w:r>
-      <w:r>
-        <w:rPr>
-          <w:rFonts w:ascii="Lexend" w:hAnsi="Lexend"/>
-          <w:sz w:val="22"/>
-          <w:szCs w:val="22"/>
-        </w:rPr>
-        <w:t xml:space="preserve"> </w:t>
-      </w:r>
-    </w:p>
-    <w:p>
-      <w:pPr>
-        <w:pStyle w:val="Listaszerbekezds"/>
-        <w:numPr>
-          <w:ilvl w:val="2"/>
-          <w:numId w:val="9"/>
-        </w:numPr>
-        <w:spacing w:before="480" w:after="240"/>
-        <w:rPr>
-          <w:rFonts w:ascii="Lexend" w:hAnsi="Lexend"/>
-          <w:b/>
-          <w:bCs/>
-          <w:sz w:val="22"/>
-          <w:szCs w:val="22"/>
-        </w:rPr>
-      </w:pPr>
-      <w:r>
-        <w:rPr>
-          <w:rFonts w:ascii="Lexend" w:hAnsi="Lexend"/>
-          <w:b/>
-          <w:bCs/>
-          <w:sz w:val="22"/>
-          <w:szCs w:val="22"/>
-        </w:rPr>
-        <w:t>Entities:</w:t>
-      </w:r>
-    </w:p>
-    <w:p>
-      <w:pPr>
-        <w:pStyle w:val="Listaszerbekezds"/>
-        <w:numPr>
-          <w:ilvl w:val="3"/>
-          <w:numId w:val="9"/>
-        </w:numPr>
-        <w:spacing w:before="480" w:after="240"/>
-        <w:rPr>
-          <w:rFonts w:ascii="Lexend" w:hAnsi="Lexend"/>
-          <w:b/>
-          <w:bCs/>
-          <w:sz w:val="22"/>
-          <w:szCs w:val="22"/>
-        </w:rPr>
-      </w:pPr>
-      <w:r>
-        <w:rPr>
-          <w:rFonts w:ascii="Lexend" w:hAnsi="Lexend"/>
-          <w:b/>
-          <w:bCs/>
-          <w:sz w:val="22"/>
-          <w:szCs w:val="22"/>
-        </w:rPr>
-        <w:t xml:space="preserve">Event: </w:t>
-      </w:r>
-      <w:r>
-        <w:rPr>
-          <w:rFonts w:ascii="Lexend" w:hAnsi="Lexend"/>
-          <w:sz w:val="22"/>
-          <w:szCs w:val="22"/>
-        </w:rPr>
-        <w:t>Any scheduled real time activity, can be a tutoring lesson, a consultation on a learning path, a consultation with a parent, a community event or webinar</w:t>
-      </w:r>
-    </w:p>
-    <w:p>
-      <w:pPr>
-        <w:pStyle w:val="Listaszerbekezds"/>
-        <w:numPr>
-          <w:ilvl w:val="2"/>
-          <w:numId w:val="9"/>
-        </w:numPr>
-        <w:spacing w:before="480" w:after="240"/>
-        <w:rPr>
-          <w:rFonts w:ascii="Lexend" w:hAnsi="Lexend"/>
-          <w:b/>
-          <w:bCs/>
-          <w:sz w:val="22"/>
-          <w:szCs w:val="22"/>
-        </w:rPr>
-      </w:pPr>
-      <w:r>
-        <w:rPr>
-          <w:rFonts w:ascii="Lexend" w:hAnsi="Lexend"/>
-          <w:b/>
-          <w:bCs/>
-          <w:sz w:val="22"/>
-          <w:szCs w:val="22"/>
-        </w:rPr>
-        <w:t>Relationships:</w:t>
-      </w:r>
-    </w:p>
-    <w:p>
-      <w:pPr>
-        <w:pStyle w:val="Listaszerbekezds"/>
-        <w:numPr>
-          <w:ilvl w:val="3"/>
-          <w:numId w:val="9"/>
-        </w:numPr>
-        <w:spacing w:before="480" w:after="240"/>
-        <w:rPr>
-          <w:rFonts w:ascii="Lexend" w:hAnsi="Lexend"/>
-          <w:b/>
-          <w:bCs/>
-          <w:sz w:val="22"/>
-          <w:szCs w:val="22"/>
-        </w:rPr>
-      </w:pPr>
-      <w:r>
-        <w:rPr>
-          <w:rFonts w:ascii="Lexend" w:hAnsi="Lexend"/>
-          <w:sz w:val="22"/>
-          <w:szCs w:val="22"/>
-        </w:rPr>
-        <w:t>One tutoring room -&gt; multiple events (lessons)</w:t>
-      </w:r>
-    </w:p>
-    <w:p>
-      <w:pPr>
-        <w:pStyle w:val="Listaszerbekezds"/>
-        <w:numPr>
-          <w:ilvl w:val="3"/>
-          <w:numId w:val="9"/>
-        </w:numPr>
-        <w:spacing w:before="480" w:after="240"/>
-        <w:rPr>
-          <w:rFonts w:ascii="Lexend" w:hAnsi="Lexend"/>
-          <w:b/>
-          <w:bCs/>
-          <w:sz w:val="22"/>
-          <w:szCs w:val="22"/>
-        </w:rPr>
-      </w:pPr>
-      <w:r>
-        <w:rPr>
-          <w:rFonts w:ascii="Lexend" w:hAnsi="Lexend"/>
-          <w:sz w:val="22"/>
-          <w:szCs w:val="22"/>
-        </w:rPr>
-        <w:lastRenderedPageBreak/>
-        <w:t>One learning path enrollment -&gt; multiple events (consultations)</w:t>
-      </w:r>
-    </w:p>
-    <w:p>
-      <w:pPr>
-        <w:pStyle w:val="Listaszerbekezds"/>
-        <w:numPr>
-          <w:ilvl w:val="3"/>
-          <w:numId w:val="9"/>
-        </w:numPr>
-        <w:spacing w:before="480" w:after="240"/>
-        <w:rPr>
-          <w:rFonts w:ascii="Lexend" w:hAnsi="Lexend"/>
-          <w:b/>
-          <w:bCs/>
-          <w:sz w:val="22"/>
-          <w:szCs w:val="22"/>
-        </w:rPr>
-      </w:pPr>
-      <w:r>
-        <w:rPr>
-          <w:rFonts w:ascii="Lexend" w:hAnsi="Lexend"/>
-          <w:sz w:val="22"/>
-          <w:szCs w:val="22"/>
-        </w:rPr>
-        <w:t xml:space="preserve">One </w:t>
-      </w:r>
-      <w:r>
-        <w:rPr>
-          <w:rFonts w:ascii="Lexend" w:hAnsi="Lexend"/>
-          <w:sz w:val="22"/>
-          <w:szCs w:val="22"/>
-        </w:rPr>
-        <w:t>learning path</w:t>
-      </w:r>
-      <w:r>
-        <w:rPr>
-          <w:rFonts w:ascii="Lexend" w:hAnsi="Lexend"/>
-          <w:sz w:val="22"/>
-          <w:szCs w:val="22"/>
-        </w:rPr>
-        <w:t xml:space="preserve"> -&gt; multiple events (webinars</w:t>
-      </w:r>
-      <w:r>
-        <w:rPr>
-          <w:rFonts w:ascii="Lexend" w:hAnsi="Lexend"/>
-          <w:sz w:val="22"/>
-          <w:szCs w:val="22"/>
-        </w:rPr>
-        <w:t xml:space="preserve"> tied to one path</w:t>
-      </w:r>
-      <w:r>
-        <w:rPr>
-          <w:rFonts w:ascii="Lexend" w:hAnsi="Lexend"/>
-          <w:sz w:val="22"/>
-          <w:szCs w:val="22"/>
-        </w:rPr>
-        <w:t>)</w:t>
+          <w:numId w:val="10"/>
+        </w:numPr>
+        <w:spacing w:before="480" w:after="240"/>
+        <w:rPr>
+          <w:rFonts w:ascii="Lexend" w:hAnsi="Lexend"/>
+          <w:sz w:val="22"/>
+          <w:szCs w:val="22"/>
+        </w:rPr>
+      </w:pPr>
+      <w:r>
+        <w:rPr>
+          <w:rFonts w:ascii="Lexend" w:hAnsi="Lexend"/>
+          <w:b/>
+          <w:bCs/>
+          <w:sz w:val="28"/>
+          <w:szCs w:val="28"/>
+        </w:rPr>
+        <w:t>My courses</w:t>
       </w:r>
     </w:p>
     <w:p>
@@ -3467,341 +4774,24 @@
         <w:pStyle w:val="Listaszerbekezds"/>
         <w:numPr>
           <w:ilvl w:val="1"/>
-          <w:numId w:val="9"/>
-        </w:numPr>
-        <w:spacing w:before="480" w:after="240"/>
-        <w:rPr>
-          <w:rFonts w:ascii="Lexend" w:hAnsi="Lexend"/>
-          <w:b/>
-          <w:bCs/>
-          <w:sz w:val="22"/>
-          <w:szCs w:val="22"/>
-        </w:rPr>
-      </w:pPr>
-      <w:r>
-        <w:rPr>
-          <w:rFonts w:ascii="Lexend" w:hAnsi="Lexend"/>
-          <w:b/>
-          <w:bCs/>
-          <w:sz w:val="22"/>
-          <w:szCs w:val="22"/>
-        </w:rPr>
-        <w:t>Engagement Domain:</w:t>
-      </w:r>
-    </w:p>
-    <w:p>
-      <w:pPr>
-        <w:pStyle w:val="Listaszerbekezds"/>
-        <w:numPr>
-          <w:ilvl w:val="2"/>
-          <w:numId w:val="9"/>
-        </w:numPr>
-        <w:spacing w:before="480" w:after="240"/>
-        <w:rPr>
-          <w:rFonts w:ascii="Lexend" w:hAnsi="Lexend"/>
-          <w:b/>
-          <w:bCs/>
-          <w:sz w:val="22"/>
-          <w:szCs w:val="22"/>
-        </w:rPr>
-      </w:pPr>
-      <w:r>
-        <w:rPr>
-          <w:rFonts w:ascii="Lexend" w:hAnsi="Lexend"/>
-          <w:b/>
-          <w:bCs/>
-          <w:sz w:val="22"/>
-          <w:szCs w:val="22"/>
-        </w:rPr>
-        <w:t>Entities:</w:t>
-      </w:r>
-    </w:p>
-    <w:p>
-      <w:pPr>
-        <w:pStyle w:val="Listaszerbekezds"/>
-        <w:numPr>
-          <w:ilvl w:val="3"/>
-          <w:numId w:val="9"/>
-        </w:numPr>
-        <w:spacing w:before="480" w:after="240"/>
-        <w:rPr>
-          <w:rFonts w:ascii="Lexend" w:hAnsi="Lexend"/>
-          <w:b/>
-          <w:bCs/>
-          <w:sz w:val="22"/>
-          <w:szCs w:val="22"/>
-        </w:rPr>
-      </w:pPr>
-      <w:r>
-        <w:rPr>
-          <w:rFonts w:ascii="Lexend" w:hAnsi="Lexend"/>
-          <w:b/>
-          <w:bCs/>
-          <w:sz w:val="22"/>
-          <w:szCs w:val="22"/>
-        </w:rPr>
-        <w:t xml:space="preserve">Message: </w:t>
-      </w:r>
-      <w:r>
-        <w:rPr>
-          <w:rFonts w:ascii="Lexend" w:hAnsi="Lexend"/>
-          <w:sz w:val="22"/>
-          <w:szCs w:val="22"/>
-        </w:rPr>
-        <w:t>Any text sent to another user or thread</w:t>
-      </w:r>
-    </w:p>
-    <w:p>
-      <w:pPr>
-        <w:pStyle w:val="Listaszerbekezds"/>
-        <w:numPr>
-          <w:ilvl w:val="3"/>
-          <w:numId w:val="9"/>
-        </w:numPr>
-        <w:spacing w:before="480" w:after="240"/>
-        <w:rPr>
-          <w:rFonts w:ascii="Lexend" w:hAnsi="Lexend"/>
-          <w:b/>
-          <w:bCs/>
-          <w:sz w:val="22"/>
-          <w:szCs w:val="22"/>
-        </w:rPr>
-      </w:pPr>
-      <w:r>
-        <w:rPr>
-          <w:rFonts w:ascii="Lexend" w:hAnsi="Lexend"/>
-          <w:b/>
-          <w:bCs/>
-          <w:sz w:val="22"/>
-          <w:szCs w:val="22"/>
-        </w:rPr>
-        <w:t>Thread:</w:t>
-      </w:r>
-      <w:r>
-        <w:rPr>
-          <w:rFonts w:ascii="Lexend" w:hAnsi="Lexend"/>
-          <w:sz w:val="22"/>
-          <w:szCs w:val="22"/>
-        </w:rPr>
-        <w:t xml:space="preserve"> A room for community texts, content and events</w:t>
-      </w:r>
-    </w:p>
-    <w:p>
-      <w:pPr>
-        <w:pStyle w:val="Listaszerbekezds"/>
-        <w:numPr>
-          <w:ilvl w:val="3"/>
-          <w:numId w:val="9"/>
-        </w:numPr>
-        <w:spacing w:before="480" w:after="240"/>
-        <w:rPr>
-          <w:rFonts w:ascii="Lexend" w:hAnsi="Lexend"/>
-          <w:b/>
-          <w:bCs/>
-          <w:sz w:val="22"/>
-          <w:szCs w:val="22"/>
-        </w:rPr>
-      </w:pPr>
-      <w:r>
-        <w:rPr>
-          <w:rFonts w:ascii="Lexend" w:hAnsi="Lexend"/>
-          <w:b/>
-          <w:bCs/>
-          <w:sz w:val="22"/>
-          <w:szCs w:val="22"/>
-        </w:rPr>
-        <w:t>Chat Room:</w:t>
-      </w:r>
-      <w:r>
-        <w:rPr>
-          <w:rFonts w:ascii="Lexend" w:hAnsi="Lexend"/>
-          <w:sz w:val="22"/>
-          <w:szCs w:val="22"/>
-        </w:rPr>
-        <w:t xml:space="preserve"> A communicational channel between two users for messages</w:t>
-      </w:r>
-    </w:p>
-    <w:p>
-      <w:pPr>
-        <w:pStyle w:val="Listaszerbekezds"/>
-        <w:numPr>
-          <w:ilvl w:val="2"/>
-          <w:numId w:val="9"/>
-        </w:numPr>
-        <w:spacing w:before="480" w:after="240"/>
-        <w:rPr>
-          <w:rFonts w:ascii="Lexend" w:hAnsi="Lexend"/>
-          <w:b/>
-          <w:bCs/>
-          <w:sz w:val="22"/>
-          <w:szCs w:val="22"/>
-        </w:rPr>
-      </w:pPr>
-      <w:r>
-        <w:rPr>
-          <w:rFonts w:ascii="Lexend" w:hAnsi="Lexend"/>
-          <w:b/>
-          <w:bCs/>
-          <w:sz w:val="22"/>
-          <w:szCs w:val="22"/>
-        </w:rPr>
-        <w:t>Relationships:</w:t>
-      </w:r>
-    </w:p>
-    <w:p>
-      <w:pPr>
-        <w:pStyle w:val="Listaszerbekezds"/>
-        <w:numPr>
-          <w:ilvl w:val="3"/>
-          <w:numId w:val="9"/>
-        </w:numPr>
-        <w:spacing w:before="480" w:after="240"/>
-        <w:rPr>
-          <w:rFonts w:ascii="Lexend" w:hAnsi="Lexend"/>
-          <w:b/>
-          <w:bCs/>
-          <w:sz w:val="22"/>
-          <w:szCs w:val="22"/>
-        </w:rPr>
-      </w:pPr>
-      <w:r>
-        <w:rPr>
-          <w:rFonts w:ascii="Lexend" w:hAnsi="Lexend"/>
-          <w:sz w:val="22"/>
-          <w:szCs w:val="22"/>
-        </w:rPr>
-        <w:t>One chat room/thread -&gt; multiple messages</w:t>
-      </w:r>
-    </w:p>
-    <w:p>
-      <w:pPr>
-        <w:pStyle w:val="Listaszerbekezds"/>
-        <w:numPr>
-          <w:ilvl w:val="3"/>
-          <w:numId w:val="9"/>
-        </w:numPr>
-        <w:spacing w:before="480" w:after="240"/>
-        <w:rPr>
-          <w:rFonts w:ascii="Lexend" w:hAnsi="Lexend"/>
-          <w:b/>
-          <w:bCs/>
-          <w:sz w:val="22"/>
-          <w:szCs w:val="22"/>
-        </w:rPr>
-      </w:pPr>
-      <w:r>
-        <w:rPr>
-          <w:rFonts w:ascii="Lexend" w:hAnsi="Lexend"/>
-          <w:sz w:val="22"/>
-          <w:szCs w:val="22"/>
-        </w:rPr>
-        <w:t>One tutoring room -&gt; one chat room</w:t>
-      </w:r>
-      <w:r>
-        <w:rPr>
-          <w:rFonts w:ascii="Lexend" w:hAnsi="Lexend"/>
-          <w:sz w:val="22"/>
-          <w:szCs w:val="22"/>
-        </w:rPr>
-        <w:t xml:space="preserve"> </w:t>
-      </w:r>
-      <w:r>
-        <w:rPr>
-          <w:rFonts w:ascii="Lexend" w:hAnsi="Lexend"/>
-          <w:sz w:val="22"/>
-          <w:szCs w:val="22"/>
-        </w:rPr>
-        <w:t>(optional)</w:t>
-      </w:r>
-    </w:p>
-    <w:p>
-      <w:pPr>
-        <w:pStyle w:val="Listaszerbekezds"/>
-        <w:numPr>
-          <w:ilvl w:val="3"/>
-          <w:numId w:val="9"/>
-        </w:numPr>
-        <w:spacing w:before="480" w:after="240"/>
-        <w:rPr>
-          <w:rFonts w:ascii="Lexend" w:hAnsi="Lexend"/>
-          <w:b/>
-          <w:bCs/>
-          <w:sz w:val="22"/>
-          <w:szCs w:val="22"/>
-        </w:rPr>
-      </w:pPr>
-      <w:r>
-        <w:rPr>
-          <w:rFonts w:ascii="Lexend" w:hAnsi="Lexend"/>
-          <w:sz w:val="22"/>
-          <w:szCs w:val="22"/>
-        </w:rPr>
-        <w:t>One learning path -&gt; one thread</w:t>
-      </w:r>
-      <w:r>
-        <w:rPr>
-          <w:rFonts w:ascii="Lexend" w:hAnsi="Lexend"/>
-          <w:sz w:val="22"/>
-          <w:szCs w:val="22"/>
-        </w:rPr>
-        <w:t xml:space="preserve"> (optional)</w:t>
-      </w:r>
-    </w:p>
-    <w:p>
-      <w:pPr>
-        <w:pStyle w:val="Listaszerbekezds"/>
-        <w:numPr>
-          <w:ilvl w:val="3"/>
-          <w:numId w:val="9"/>
-        </w:numPr>
-        <w:spacing w:before="480" w:after="240"/>
-        <w:rPr>
-          <w:rFonts w:ascii="Lexend" w:hAnsi="Lexend"/>
-          <w:b/>
-          <w:bCs/>
-          <w:sz w:val="22"/>
-          <w:szCs w:val="22"/>
-        </w:rPr>
-      </w:pPr>
-      <w:r>
-        <w:rPr>
-          <w:rFonts w:ascii="Lexend" w:hAnsi="Lexend"/>
-          <w:sz w:val="22"/>
-          <w:szCs w:val="22"/>
-        </w:rPr>
-        <w:t>One learning path enrollment -&gt; one chat room</w:t>
-      </w:r>
-      <w:r>
-        <w:rPr>
-          <w:rFonts w:ascii="Lexend" w:hAnsi="Lexend"/>
-          <w:sz w:val="22"/>
-          <w:szCs w:val="22"/>
-        </w:rPr>
-        <w:t xml:space="preserve"> </w:t>
-      </w:r>
-      <w:r>
-        <w:rPr>
-          <w:rFonts w:ascii="Lexend" w:hAnsi="Lexend"/>
-          <w:sz w:val="22"/>
-          <w:szCs w:val="22"/>
-        </w:rPr>
-        <w:t>(optional</w:t>
-      </w:r>
-      <w:r>
-        <w:rPr>
-          <w:rFonts w:ascii="Lexend" w:hAnsi="Lexend"/>
-          <w:sz w:val="22"/>
-          <w:szCs w:val="22"/>
-        </w:rPr>
-        <w:t>, student – teacher support</w:t>
-      </w:r>
-      <w:r>
-        <w:rPr>
-          <w:rFonts w:ascii="Lexend" w:hAnsi="Lexend"/>
-          <w:sz w:val="22"/>
-          <w:szCs w:val="22"/>
-        </w:rPr>
-        <w:t>)</w:t>
+          <w:numId w:val="10"/>
+        </w:numPr>
+        <w:spacing w:before="480" w:after="240"/>
+        <w:rPr>
+          <w:rFonts w:ascii="Lexend" w:hAnsi="Lexend"/>
+          <w:sz w:val="22"/>
+          <w:szCs w:val="22"/>
+        </w:rPr>
+      </w:pPr>
+      <w:r>
+        <w:rPr>
+          <w:rFonts w:ascii="Lexend" w:hAnsi="Lexend"/>
+          <w:b/>
+          <w:bCs/>
+          <w:sz w:val="28"/>
+          <w:szCs w:val="28"/>
+        </w:rPr>
+        <w:t>Calendar</w:t>
       </w:r>
     </w:p>
     <w:p>
@@ -3809,326 +4799,24 @@
         <w:pStyle w:val="Listaszerbekezds"/>
         <w:numPr>
           <w:ilvl w:val="1"/>
-          <w:numId w:val="9"/>
-        </w:numPr>
-        <w:spacing w:before="480" w:after="240"/>
-        <w:rPr>
-          <w:rFonts w:ascii="Lexend" w:hAnsi="Lexend"/>
-          <w:b/>
-          <w:bCs/>
-          <w:sz w:val="22"/>
-          <w:szCs w:val="22"/>
-        </w:rPr>
-      </w:pPr>
-      <w:r>
-        <w:rPr>
-          <w:rFonts w:ascii="Lexend" w:hAnsi="Lexend"/>
-          <w:b/>
-          <w:bCs/>
-          <w:sz w:val="22"/>
-          <w:szCs w:val="22"/>
-        </w:rPr>
-        <w:t>Progression Domain:</w:t>
-      </w:r>
-    </w:p>
-    <w:p>
-      <w:pPr>
-        <w:pStyle w:val="Listaszerbekezds"/>
-        <w:numPr>
-          <w:ilvl w:val="2"/>
-          <w:numId w:val="9"/>
-        </w:numPr>
-        <w:spacing w:before="480" w:after="240"/>
-        <w:rPr>
-          <w:rFonts w:ascii="Lexend" w:hAnsi="Lexend"/>
-          <w:b/>
-          <w:bCs/>
-          <w:sz w:val="22"/>
-          <w:szCs w:val="22"/>
-        </w:rPr>
-      </w:pPr>
-      <w:r>
-        <w:rPr>
-          <w:rFonts w:ascii="Lexend" w:hAnsi="Lexend"/>
-          <w:b/>
-          <w:bCs/>
-          <w:sz w:val="22"/>
-          <w:szCs w:val="22"/>
-        </w:rPr>
-        <w:t>Entities:</w:t>
-      </w:r>
-    </w:p>
-    <w:p>
-      <w:pPr>
-        <w:pStyle w:val="Listaszerbekezds"/>
-        <w:numPr>
-          <w:ilvl w:val="3"/>
-          <w:numId w:val="9"/>
-        </w:numPr>
-        <w:spacing w:before="480" w:after="240"/>
-        <w:rPr>
-          <w:rFonts w:ascii="Lexend" w:hAnsi="Lexend"/>
-          <w:b/>
-          <w:bCs/>
-          <w:sz w:val="22"/>
-          <w:szCs w:val="22"/>
-        </w:rPr>
-      </w:pPr>
-      <w:r>
-        <w:rPr>
-          <w:rFonts w:ascii="Lexend" w:hAnsi="Lexend"/>
-          <w:b/>
-          <w:bCs/>
-          <w:sz w:val="22"/>
-          <w:szCs w:val="22"/>
-        </w:rPr>
-        <w:t xml:space="preserve">Enrollment: </w:t>
-      </w:r>
-      <w:r>
-        <w:rPr>
-          <w:rFonts w:ascii="Lexend" w:hAnsi="Lexend"/>
-          <w:sz w:val="22"/>
-          <w:szCs w:val="22"/>
-        </w:rPr>
-        <w:t>Stores data about the progress the student makes when enters a learning path</w:t>
-      </w:r>
-    </w:p>
-    <w:p>
-      <w:pPr>
-        <w:pStyle w:val="Listaszerbekezds"/>
-        <w:numPr>
-          <w:ilvl w:val="3"/>
-          <w:numId w:val="9"/>
-        </w:numPr>
-        <w:spacing w:before="480" w:after="240"/>
-        <w:rPr>
-          <w:rFonts w:ascii="Lexend" w:hAnsi="Lexend"/>
-          <w:b/>
-          <w:bCs/>
-          <w:sz w:val="22"/>
-          <w:szCs w:val="22"/>
-        </w:rPr>
-      </w:pPr>
-      <w:r>
-        <w:rPr>
-          <w:rFonts w:ascii="Lexend" w:hAnsi="Lexend"/>
-          <w:b/>
-          <w:bCs/>
-          <w:sz w:val="22"/>
-          <w:szCs w:val="22"/>
-        </w:rPr>
-        <w:t xml:space="preserve">Submission: </w:t>
-      </w:r>
-      <w:r>
-        <w:rPr>
-          <w:rFonts w:ascii="Lexend" w:hAnsi="Lexend"/>
-          <w:sz w:val="22"/>
-          <w:szCs w:val="22"/>
-        </w:rPr>
-        <w:t>Stores the content item the student hands in</w:t>
-      </w:r>
-    </w:p>
-    <w:p>
-      <w:pPr>
-        <w:pStyle w:val="Listaszerbekezds"/>
-        <w:numPr>
-          <w:ilvl w:val="3"/>
-          <w:numId w:val="9"/>
-        </w:numPr>
-        <w:spacing w:before="480" w:after="240"/>
-        <w:rPr>
-          <w:rFonts w:ascii="Lexend" w:hAnsi="Lexend"/>
-          <w:b/>
-          <w:bCs/>
-          <w:sz w:val="22"/>
-          <w:szCs w:val="22"/>
-        </w:rPr>
-      </w:pPr>
-      <w:r>
-        <w:rPr>
-          <w:rFonts w:ascii="Lexend" w:hAnsi="Lexend"/>
-          <w:b/>
-          <w:bCs/>
-          <w:sz w:val="22"/>
-          <w:szCs w:val="22"/>
-        </w:rPr>
-        <w:t xml:space="preserve">Feedback: </w:t>
-      </w:r>
-      <w:r>
-        <w:rPr>
-          <w:rFonts w:ascii="Lexend" w:hAnsi="Lexend"/>
-          <w:sz w:val="22"/>
-          <w:szCs w:val="22"/>
-        </w:rPr>
-        <w:t>The grading and/or the comment the teacher gives to the test/hand-ins</w:t>
-      </w:r>
-    </w:p>
-    <w:p>
-      <w:pPr>
-        <w:pStyle w:val="Listaszerbekezds"/>
-        <w:numPr>
-          <w:ilvl w:val="2"/>
-          <w:numId w:val="9"/>
-        </w:numPr>
-        <w:spacing w:before="480" w:after="240"/>
-        <w:rPr>
-          <w:rFonts w:ascii="Lexend" w:hAnsi="Lexend"/>
-          <w:b/>
-          <w:bCs/>
-          <w:sz w:val="22"/>
-          <w:szCs w:val="22"/>
-        </w:rPr>
-      </w:pPr>
-      <w:r>
-        <w:rPr>
-          <w:rFonts w:ascii="Lexend" w:hAnsi="Lexend"/>
-          <w:b/>
-          <w:bCs/>
-          <w:sz w:val="22"/>
-          <w:szCs w:val="22"/>
-        </w:rPr>
-        <w:t>Relationships:</w:t>
-      </w:r>
-    </w:p>
-    <w:p>
-      <w:pPr>
-        <w:pStyle w:val="Listaszerbekezds"/>
-        <w:numPr>
-          <w:ilvl w:val="3"/>
-          <w:numId w:val="9"/>
-        </w:numPr>
-        <w:spacing w:before="480" w:after="240"/>
-        <w:rPr>
-          <w:rFonts w:ascii="Lexend" w:hAnsi="Lexend"/>
-          <w:b/>
-          <w:bCs/>
-          <w:sz w:val="22"/>
-          <w:szCs w:val="22"/>
-        </w:rPr>
-      </w:pPr>
-      <w:r>
-        <w:rPr>
-          <w:rFonts w:ascii="Lexend" w:hAnsi="Lexend"/>
-          <w:sz w:val="22"/>
-          <w:szCs w:val="22"/>
-        </w:rPr>
-        <w:t>One learning path -&gt; multiple enrollments (per student)</w:t>
-      </w:r>
-    </w:p>
-    <w:p>
-      <w:pPr>
-        <w:pStyle w:val="Listaszerbekezds"/>
-        <w:numPr>
-          <w:ilvl w:val="3"/>
-          <w:numId w:val="9"/>
-        </w:numPr>
-        <w:spacing w:before="480" w:after="240"/>
-        <w:rPr>
-          <w:rFonts w:ascii="Lexend" w:hAnsi="Lexend"/>
-          <w:b/>
-          <w:bCs/>
-          <w:sz w:val="22"/>
-          <w:szCs w:val="22"/>
-        </w:rPr>
-      </w:pPr>
-      <w:r>
-        <w:rPr>
-          <w:rFonts w:ascii="Lexend" w:hAnsi="Lexend"/>
-          <w:sz w:val="22"/>
-          <w:szCs w:val="22"/>
-        </w:rPr>
-        <w:t>One enrollment -&gt; one chat room (student - teacher)</w:t>
-      </w:r>
-    </w:p>
-    <w:p>
-      <w:pPr>
-        <w:pStyle w:val="Listaszerbekezds"/>
-        <w:numPr>
-          <w:ilvl w:val="3"/>
-          <w:numId w:val="9"/>
-        </w:numPr>
-        <w:spacing w:before="480" w:after="240"/>
-        <w:rPr>
-          <w:rFonts w:ascii="Lexend" w:hAnsi="Lexend"/>
-          <w:b/>
-          <w:bCs/>
-          <w:sz w:val="22"/>
-          <w:szCs w:val="22"/>
-        </w:rPr>
-      </w:pPr>
-      <w:r>
-        <w:rPr>
-          <w:rFonts w:ascii="Lexend" w:hAnsi="Lexend"/>
-          <w:sz w:val="22"/>
-          <w:szCs w:val="22"/>
-        </w:rPr>
-        <w:t>One hand-in -&gt; one submission</w:t>
-      </w:r>
-    </w:p>
-    <w:p>
-      <w:pPr>
-        <w:pStyle w:val="Listaszerbekezds"/>
-        <w:numPr>
-          <w:ilvl w:val="3"/>
-          <w:numId w:val="9"/>
-        </w:numPr>
-        <w:spacing w:before="480" w:after="240"/>
-        <w:rPr>
-          <w:rFonts w:ascii="Lexend" w:hAnsi="Lexend"/>
-          <w:b/>
-          <w:bCs/>
-          <w:sz w:val="22"/>
-          <w:szCs w:val="22"/>
-        </w:rPr>
-      </w:pPr>
-      <w:r>
-        <w:rPr>
-          <w:rFonts w:ascii="Lexend" w:hAnsi="Lexend"/>
-          <w:sz w:val="22"/>
-          <w:szCs w:val="22"/>
-        </w:rPr>
-        <w:t>One submission -&gt; multiple content</w:t>
-      </w:r>
-      <w:r>
-        <w:rPr>
-          <w:rFonts w:ascii="Lexend" w:hAnsi="Lexend"/>
-          <w:sz w:val="22"/>
-          <w:szCs w:val="22"/>
-        </w:rPr>
-        <w:t xml:space="preserve"> items</w:t>
-      </w:r>
-      <w:r>
-        <w:rPr>
-          <w:rFonts w:ascii="Lexend" w:hAnsi="Lexend"/>
-          <w:sz w:val="22"/>
-          <w:szCs w:val="22"/>
-        </w:rPr>
-        <w:t xml:space="preserve"> (multi file submission)</w:t>
-      </w:r>
-    </w:p>
-    <w:p>
-      <w:pPr>
-        <w:pStyle w:val="Listaszerbekezds"/>
-        <w:numPr>
-          <w:ilvl w:val="3"/>
-          <w:numId w:val="9"/>
-        </w:numPr>
-        <w:spacing w:before="480" w:after="240"/>
-        <w:rPr>
-          <w:rFonts w:ascii="Lexend" w:hAnsi="Lexend"/>
-          <w:b/>
-          <w:bCs/>
-          <w:sz w:val="22"/>
-          <w:szCs w:val="22"/>
-        </w:rPr>
-      </w:pPr>
-      <w:r>
-        <w:rPr>
-          <w:rFonts w:ascii="Lexend" w:hAnsi="Lexend"/>
-          <w:sz w:val="22"/>
-          <w:szCs w:val="22"/>
-        </w:rPr>
-        <w:t>One submission -&gt; one feedback</w:t>
+          <w:numId w:val="10"/>
+        </w:numPr>
+        <w:spacing w:before="480" w:after="240"/>
+        <w:rPr>
+          <w:rFonts w:ascii="Lexend" w:hAnsi="Lexend"/>
+          <w:sz w:val="22"/>
+          <w:szCs w:val="22"/>
+        </w:rPr>
+      </w:pPr>
+      <w:r>
+        <w:rPr>
+          <w:rFonts w:ascii="Lexend" w:hAnsi="Lexend"/>
+          <w:b/>
+          <w:bCs/>
+          <w:sz w:val="28"/>
+          <w:szCs w:val="28"/>
+        </w:rPr>
+        <w:t>Students</w:t>
       </w:r>
     </w:p>
     <w:p>
@@ -4136,69 +4824,24 @@
         <w:pStyle w:val="Listaszerbekezds"/>
         <w:numPr>
           <w:ilvl w:val="1"/>
-          <w:numId w:val="9"/>
-        </w:numPr>
-        <w:spacing w:before="480" w:after="240"/>
-        <w:rPr>
-          <w:rFonts w:ascii="Lexend" w:hAnsi="Lexend"/>
-          <w:b/>
-          <w:bCs/>
-          <w:sz w:val="22"/>
-          <w:szCs w:val="22"/>
-        </w:rPr>
-      </w:pPr>
-      <w:r>
-        <w:rPr>
-          <w:rFonts w:ascii="Lexend" w:hAnsi="Lexend"/>
-          <w:b/>
-          <w:bCs/>
-          <w:sz w:val="22"/>
-          <w:szCs w:val="22"/>
-        </w:rPr>
-        <w:t>Cities Domain:</w:t>
-      </w:r>
-      <w:r>
-        <w:rPr>
-          <w:rFonts w:ascii="Lexend" w:hAnsi="Lexend"/>
-          <w:sz w:val="22"/>
-          <w:szCs w:val="22"/>
-        </w:rPr>
-        <w:t xml:space="preserve"> </w:t>
-      </w:r>
-    </w:p>
-    <w:p>
-      <w:pPr>
-        <w:pStyle w:val="Listaszerbekezds"/>
-        <w:numPr>
-          <w:ilvl w:val="2"/>
-          <w:numId w:val="9"/>
-        </w:numPr>
-        <w:spacing w:before="480" w:after="240"/>
-        <w:rPr>
-          <w:rFonts w:ascii="Lexend" w:hAnsi="Lexend"/>
-          <w:b/>
-          <w:bCs/>
-          <w:sz w:val="22"/>
-          <w:szCs w:val="22"/>
-        </w:rPr>
-      </w:pPr>
-      <w:r>
-        <w:rPr>
-          <w:rFonts w:ascii="Lexend" w:hAnsi="Lexend"/>
-          <w:b/>
-          <w:bCs/>
-          <w:sz w:val="22"/>
-          <w:szCs w:val="22"/>
-        </w:rPr>
-        <w:t xml:space="preserve">City: </w:t>
-      </w:r>
-      <w:r>
-        <w:rPr>
-          <w:rFonts w:ascii="Lexend" w:hAnsi="Lexend"/>
-          <w:sz w:val="22"/>
-          <w:szCs w:val="22"/>
-        </w:rPr>
-        <w:t>A city or town with its postal code</w:t>
+          <w:numId w:val="10"/>
+        </w:numPr>
+        <w:spacing w:before="480" w:after="240"/>
+        <w:rPr>
+          <w:rFonts w:ascii="Lexend" w:hAnsi="Lexend"/>
+          <w:sz w:val="22"/>
+          <w:szCs w:val="22"/>
+        </w:rPr>
+      </w:pPr>
+      <w:r>
+        <w:rPr>
+          <w:rFonts w:ascii="Lexend" w:hAnsi="Lexend"/>
+          <w:b/>
+          <w:bCs/>
+          <w:sz w:val="28"/>
+          <w:szCs w:val="28"/>
+        </w:rPr>
+        <w:t>Finances</w:t>
       </w:r>
     </w:p>
     <w:p>
@@ -4206,214 +4849,99 @@
         <w:pStyle w:val="Listaszerbekezds"/>
         <w:numPr>
           <w:ilvl w:val="1"/>
-          <w:numId w:val="9"/>
-        </w:numPr>
-        <w:spacing w:before="480" w:after="240"/>
-        <w:rPr>
-          <w:rFonts w:ascii="Lexend" w:hAnsi="Lexend"/>
-          <w:b/>
-          <w:bCs/>
-          <w:sz w:val="22"/>
-          <w:szCs w:val="22"/>
-        </w:rPr>
-      </w:pPr>
-      <w:r>
-        <w:rPr>
-          <w:rFonts w:ascii="Lexend" w:hAnsi="Lexend"/>
-          <w:b/>
-          <w:bCs/>
-          <w:sz w:val="22"/>
-          <w:szCs w:val="22"/>
-        </w:rPr>
-        <w:t>Payment Module:</w:t>
-      </w:r>
-    </w:p>
-    <w:p>
-      <w:pPr>
-        <w:pStyle w:val="Listaszerbekezds"/>
-        <w:numPr>
-          <w:ilvl w:val="2"/>
-          <w:numId w:val="9"/>
-        </w:numPr>
-        <w:spacing w:before="480" w:after="240"/>
-        <w:rPr>
-          <w:rFonts w:ascii="Lexend" w:hAnsi="Lexend"/>
-          <w:b/>
-          <w:bCs/>
-          <w:sz w:val="22"/>
-          <w:szCs w:val="22"/>
-        </w:rPr>
-      </w:pPr>
-      <w:r>
-        <w:rPr>
-          <w:rFonts w:ascii="Lexend" w:hAnsi="Lexend"/>
-          <w:b/>
-          <w:bCs/>
-          <w:sz w:val="22"/>
-          <w:szCs w:val="22"/>
-        </w:rPr>
-        <w:t>Entities:</w:t>
-      </w:r>
-    </w:p>
-    <w:p>
-      <w:pPr>
-        <w:pStyle w:val="Listaszerbekezds"/>
-        <w:numPr>
-          <w:ilvl w:val="3"/>
-          <w:numId w:val="9"/>
-        </w:numPr>
-        <w:spacing w:before="480" w:after="240"/>
-        <w:rPr>
-          <w:rFonts w:ascii="Lexend" w:hAnsi="Lexend"/>
-          <w:b/>
-          <w:bCs/>
-          <w:sz w:val="22"/>
-          <w:szCs w:val="22"/>
-        </w:rPr>
-      </w:pPr>
-      <w:r>
-        <w:rPr>
-          <w:rFonts w:ascii="Lexend" w:hAnsi="Lexend"/>
-          <w:b/>
-          <w:bCs/>
-          <w:sz w:val="22"/>
-          <w:szCs w:val="22"/>
-        </w:rPr>
-        <w:t xml:space="preserve">Payment: </w:t>
-      </w:r>
-      <w:r>
-        <w:rPr>
-          <w:rFonts w:ascii="Lexend" w:hAnsi="Lexend"/>
-          <w:sz w:val="22"/>
-          <w:szCs w:val="22"/>
-        </w:rPr>
-        <w:t>Stores the price, the deadline for the payment, the user who made the purchase, and whether it was already paid</w:t>
-      </w:r>
-    </w:p>
-    <w:p>
-      <w:pPr>
-        <w:pStyle w:val="Listaszerbekezds"/>
-        <w:numPr>
-          <w:ilvl w:val="2"/>
-          <w:numId w:val="9"/>
-        </w:numPr>
-        <w:spacing w:before="480" w:after="240"/>
-        <w:rPr>
-          <w:rFonts w:ascii="Lexend" w:hAnsi="Lexend"/>
-          <w:b/>
-          <w:bCs/>
-          <w:sz w:val="22"/>
-          <w:szCs w:val="22"/>
-        </w:rPr>
-      </w:pPr>
-      <w:r>
-        <w:rPr>
-          <w:rFonts w:ascii="Lexend" w:hAnsi="Lexend"/>
-          <w:b/>
-          <w:bCs/>
-          <w:sz w:val="22"/>
-          <w:szCs w:val="22"/>
-        </w:rPr>
-        <w:t>Relationships:</w:t>
-      </w:r>
-    </w:p>
-    <w:p>
-      <w:pPr>
-        <w:pStyle w:val="Listaszerbekezds"/>
-        <w:numPr>
-          <w:ilvl w:val="3"/>
-          <w:numId w:val="9"/>
-        </w:numPr>
-        <w:spacing w:before="480" w:after="240"/>
-        <w:rPr>
-          <w:rFonts w:ascii="Lexend" w:hAnsi="Lexend"/>
-          <w:b/>
-          <w:bCs/>
-          <w:sz w:val="22"/>
-          <w:szCs w:val="22"/>
-        </w:rPr>
-      </w:pPr>
-      <w:r>
-        <w:rPr>
-          <w:rFonts w:ascii="Lexend" w:hAnsi="Lexend"/>
-          <w:sz w:val="22"/>
-          <w:szCs w:val="22"/>
-        </w:rPr>
-        <w:t>One enrollment</w:t>
-      </w:r>
-      <w:r>
-        <w:rPr>
-          <w:rFonts w:ascii="Lexend" w:hAnsi="Lexend"/>
-          <w:sz w:val="22"/>
-          <w:szCs w:val="22"/>
-        </w:rPr>
-        <w:t xml:space="preserve"> </w:t>
-      </w:r>
-      <w:r>
-        <w:rPr>
-          <w:rFonts w:ascii="Lexend" w:hAnsi="Lexend"/>
-          <w:sz w:val="22"/>
-          <w:szCs w:val="22"/>
-        </w:rPr>
-        <w:t>-&gt; multiple payments</w:t>
-      </w:r>
-    </w:p>
-    <w:p>
-      <w:pPr>
-        <w:pStyle w:val="Listaszerbekezds"/>
-        <w:numPr>
-          <w:ilvl w:val="3"/>
-          <w:numId w:val="9"/>
-        </w:numPr>
-        <w:spacing w:before="480" w:after="240"/>
-        <w:rPr>
-          <w:rFonts w:ascii="Lexend" w:hAnsi="Lexend"/>
-          <w:b/>
-          <w:bCs/>
-          <w:sz w:val="22"/>
-          <w:szCs w:val="22"/>
-        </w:rPr>
-      </w:pPr>
-      <w:r>
-        <w:rPr>
-          <w:rFonts w:ascii="Lexend" w:hAnsi="Lexend"/>
-          <w:sz w:val="22"/>
-          <w:szCs w:val="22"/>
-        </w:rPr>
-        <w:t xml:space="preserve">One </w:t>
-      </w:r>
-      <w:r>
-        <w:rPr>
-          <w:rFonts w:ascii="Lexend" w:hAnsi="Lexend"/>
-          <w:sz w:val="22"/>
-          <w:szCs w:val="22"/>
-        </w:rPr>
-        <w:t>tutoring room -&gt; multiple payments</w:t>
-      </w:r>
-    </w:p>
-    <w:p>
-      <w:pPr>
-        <w:pStyle w:val="Listaszerbekezds"/>
-        <w:numPr>
-          <w:ilvl w:val="3"/>
-          <w:numId w:val="9"/>
-        </w:numPr>
-        <w:spacing w:before="480" w:after="240"/>
-        <w:rPr>
-          <w:rFonts w:ascii="Lexend" w:hAnsi="Lexend"/>
-          <w:b/>
-          <w:bCs/>
-          <w:sz w:val="22"/>
-          <w:szCs w:val="22"/>
-        </w:rPr>
-      </w:pPr>
-      <w:r>
-        <w:rPr>
-          <w:rFonts w:ascii="Lexend" w:hAnsi="Lexend"/>
-          <w:sz w:val="22"/>
-          <w:szCs w:val="22"/>
-        </w:rPr>
-        <w:t>One payment -&gt; one type of course (per enrollment/tutoring room)</w:t>
+          <w:numId w:val="10"/>
+        </w:numPr>
+        <w:spacing w:before="480" w:after="240"/>
+        <w:rPr>
+          <w:rFonts w:ascii="Lexend" w:hAnsi="Lexend"/>
+          <w:sz w:val="22"/>
+          <w:szCs w:val="22"/>
+        </w:rPr>
+      </w:pPr>
+      <w:r>
+        <w:rPr>
+          <w:rFonts w:ascii="Lexend" w:hAnsi="Lexend"/>
+          <w:b/>
+          <w:bCs/>
+          <w:sz w:val="28"/>
+          <w:szCs w:val="28"/>
+        </w:rPr>
+        <w:t>File manager</w:t>
+      </w:r>
+    </w:p>
+    <w:p>
+      <w:pPr>
+        <w:pStyle w:val="Listaszerbekezds"/>
+        <w:numPr>
+          <w:ilvl w:val="0"/>
+          <w:numId w:val="10"/>
+        </w:numPr>
+        <w:spacing w:before="480" w:after="240"/>
+        <w:rPr>
+          <w:rFonts w:ascii="Lexend" w:hAnsi="Lexend"/>
+          <w:sz w:val="22"/>
+          <w:szCs w:val="22"/>
+        </w:rPr>
+      </w:pPr>
+      <w:r>
+        <w:rPr>
+          <w:rFonts w:ascii="Lexend" w:hAnsi="Lexend"/>
+          <w:b/>
+          <w:bCs/>
+          <w:sz w:val="28"/>
+          <w:szCs w:val="28"/>
+        </w:rPr>
+        <w:t>Shared</w:t>
+      </w:r>
+    </w:p>
+    <w:p>
+      <w:pPr>
+        <w:pStyle w:val="Listaszerbekezds"/>
+        <w:numPr>
+          <w:ilvl w:val="1"/>
+          <w:numId w:val="10"/>
+        </w:numPr>
+        <w:spacing w:before="480" w:after="240"/>
+        <w:rPr>
+          <w:rFonts w:ascii="Lexend" w:hAnsi="Lexend"/>
+          <w:sz w:val="22"/>
+          <w:szCs w:val="22"/>
+        </w:rPr>
+      </w:pPr>
+      <w:r>
+        <w:rPr>
+          <w:rFonts w:ascii="Lexend" w:hAnsi="Lexend"/>
+          <w:b/>
+          <w:bCs/>
+          <w:sz w:val="28"/>
+          <w:szCs w:val="28"/>
+        </w:rPr>
+        <w:t>Course explorer</w:t>
+      </w:r>
+    </w:p>
+    <w:p>
+      <w:pPr>
+        <w:pStyle w:val="Listaszerbekezds"/>
+        <w:numPr>
+          <w:ilvl w:val="1"/>
+          <w:numId w:val="10"/>
+        </w:numPr>
+        <w:spacing w:before="480" w:after="240"/>
+        <w:rPr>
+          <w:rFonts w:ascii="Lexend" w:hAnsi="Lexend"/>
+          <w:sz w:val="22"/>
+          <w:szCs w:val="22"/>
+        </w:rPr>
+      </w:pPr>
+      <w:r>
+        <w:rPr>
+          <w:rFonts w:ascii="Lexend" w:hAnsi="Lexend"/>
+          <w:b/>
+          <w:bCs/>
+          <w:sz w:val="28"/>
+          <w:szCs w:val="28"/>
+        </w:rPr>
+        <w:t>Account settings</w:t>
       </w:r>
     </w:p>
     <w:sectPr>
@@ -4706,7 +5234,7 @@
         <w:rFonts w:ascii="Symbol" w:hAnsi="Symbol" w:hint="default"/>
       </w:rPr>
     </w:lvl>
-    <w:lvl w:ilvl="4" w:tplc="040E0003" w:tentative="1">
+    <w:lvl w:ilvl="4" w:tplc="040E0003">
       <w:start w:val="1"/>
       <w:numFmt w:val="bullet"/>
       <w:lvlText w:val="o"/>
@@ -5308,6 +5836,119 @@
     </w:lvl>
   </w:abstractNum>
   <w:abstractNum w:abstractNumId="8" w15:restartNumberingAfterBreak="0">
+    <w:nsid w:val="43F30B99"/>
+    <w:multiLevelType w:val="hybridMultilevel"/>
+    <w:tmpl w:val="4C968CF6"/>
+    <w:lvl w:ilvl="0" w:tplc="040E0001">
+      <w:start w:val="1"/>
+      <w:numFmt w:val="bullet"/>
+      <w:lvlText w:val=""/>
+      <w:lvlJc w:val="left"/>
+      <w:pPr>
+        <w:ind w:left="720" w:hanging="360"/>
+      </w:pPr>
+      <w:rPr>
+        <w:rFonts w:ascii="Symbol" w:hAnsi="Symbol" w:hint="default"/>
+      </w:rPr>
+    </w:lvl>
+    <w:lvl w:ilvl="1" w:tplc="040E0003">
+      <w:start w:val="1"/>
+      <w:numFmt w:val="bullet"/>
+      <w:lvlText w:val="o"/>
+      <w:lvlJc w:val="left"/>
+      <w:pPr>
+        <w:ind w:left="1440" w:hanging="360"/>
+      </w:pPr>
+      <w:rPr>
+        <w:rFonts w:ascii="Courier New" w:hAnsi="Courier New" w:cs="Courier New" w:hint="default"/>
+      </w:rPr>
+    </w:lvl>
+    <w:lvl w:ilvl="2" w:tplc="040E0005">
+      <w:start w:val="1"/>
+      <w:numFmt w:val="bullet"/>
+      <w:lvlText w:val=""/>
+      <w:lvlJc w:val="left"/>
+      <w:pPr>
+        <w:ind w:left="2160" w:hanging="360"/>
+      </w:pPr>
+      <w:rPr>
+        <w:rFonts w:ascii="Wingdings" w:hAnsi="Wingdings" w:hint="default"/>
+      </w:rPr>
+    </w:lvl>
+    <w:lvl w:ilvl="3" w:tplc="040E0001">
+      <w:start w:val="1"/>
+      <w:numFmt w:val="bullet"/>
+      <w:lvlText w:val=""/>
+      <w:lvlJc w:val="left"/>
+      <w:pPr>
+        <w:ind w:left="2880" w:hanging="360"/>
+      </w:pPr>
+      <w:rPr>
+        <w:rFonts w:ascii="Symbol" w:hAnsi="Symbol" w:hint="default"/>
+      </w:rPr>
+    </w:lvl>
+    <w:lvl w:ilvl="4" w:tplc="040E0003">
+      <w:start w:val="1"/>
+      <w:numFmt w:val="bullet"/>
+      <w:lvlText w:val="o"/>
+      <w:lvlJc w:val="left"/>
+      <w:pPr>
+        <w:ind w:left="3600" w:hanging="360"/>
+      </w:pPr>
+      <w:rPr>
+        <w:rFonts w:ascii="Courier New" w:hAnsi="Courier New" w:cs="Courier New" w:hint="default"/>
+      </w:rPr>
+    </w:lvl>
+    <w:lvl w:ilvl="5" w:tplc="040E0005" w:tentative="1">
+      <w:start w:val="1"/>
+      <w:numFmt w:val="bullet"/>
+      <w:lvlText w:val=""/>
+      <w:lvlJc w:val="left"/>
+      <w:pPr>
+        <w:ind w:left="4320" w:hanging="360"/>
+      </w:pPr>
+      <w:rPr>
+        <w:rFonts w:ascii="Wingdings" w:hAnsi="Wingdings" w:hint="default"/>
+      </w:rPr>
+    </w:lvl>
+    <w:lvl w:ilvl="6" w:tplc="040E0001" w:tentative="1">
+      <w:start w:val="1"/>
+      <w:numFmt w:val="bullet"/>
+      <w:lvlText w:val=""/>
+      <w:lvlJc w:val="left"/>
+      <w:pPr>
+        <w:ind w:left="5040" w:hanging="360"/>
+      </w:pPr>
+      <w:rPr>
+        <w:rFonts w:ascii="Symbol" w:hAnsi="Symbol" w:hint="default"/>
+      </w:rPr>
+    </w:lvl>
+    <w:lvl w:ilvl="7" w:tplc="040E0003" w:tentative="1">
+      <w:start w:val="1"/>
+      <w:numFmt w:val="bullet"/>
+      <w:lvlText w:val="o"/>
+      <w:lvlJc w:val="left"/>
+      <w:pPr>
+        <w:ind w:left="5760" w:hanging="360"/>
+      </w:pPr>
+      <w:rPr>
+        <w:rFonts w:ascii="Courier New" w:hAnsi="Courier New" w:cs="Courier New" w:hint="default"/>
+      </w:rPr>
+    </w:lvl>
+    <w:lvl w:ilvl="8" w:tplc="040E0005" w:tentative="1">
+      <w:start w:val="1"/>
+      <w:numFmt w:val="bullet"/>
+      <w:lvlText w:val=""/>
+      <w:lvlJc w:val="left"/>
+      <w:pPr>
+        <w:ind w:left="6480" w:hanging="360"/>
+      </w:pPr>
+      <w:rPr>
+        <w:rFonts w:ascii="Wingdings" w:hAnsi="Wingdings" w:hint="default"/>
+      </w:rPr>
+    </w:lvl>
+  </w:abstractNum>
+  <w:abstractNum w:abstractNumId="9" w15:restartNumberingAfterBreak="0">
     <w:nsid w:val="554D282F"/>
     <w:multiLevelType w:val="hybridMultilevel"/>
     <w:tmpl w:val="9F760762"/>
@@ -5430,7 +6071,7 @@
     <w:abstractNumId w:val="1"/>
   </w:num>
   <w:num w:numId="4" w16cid:durableId="716129479">
-    <w:abstractNumId w:val="8"/>
+    <w:abstractNumId w:val="9"/>
   </w:num>
   <w:num w:numId="5" w16cid:durableId="1570651145">
     <w:abstractNumId w:val="4"/>
@@ -5446,6 +6087,9 @@
   </w:num>
   <w:num w:numId="9" w16cid:durableId="87846265">
     <w:abstractNumId w:val="2"/>
+  </w:num>
+  <w:num w:numId="10" w16cid:durableId="1890073628">
+    <w:abstractNumId w:val="8"/>
   </w:num>
 </w:numbering>
 </file>

</xml_diff>

<commit_message>
Docs - updated sitemap in SAD
</commit_message>
<xml_diff>
--- a/Dev docs/Software_Architecture_Document.docx
+++ b/Dev docs/Software_Architecture_Document.docx
@@ -128,8 +128,18 @@
           <w:sz w:val="22"/>
           <w:szCs w:val="22"/>
         </w:rPr>
-        <w:t>routing, Proxy/BackendForFrontend</w:t>
-      </w:r>
+        <w:t>routing, Proxy/</w:t>
+      </w:r>
+      <w:proofErr w:type="spellStart"/>
+      <w:r>
+        <w:rPr>
+          <w:rFonts w:ascii="Lexend Light" w:hAnsi="Lexend Light"/>
+          <w:sz w:val="22"/>
+          <w:szCs w:val="22"/>
+        </w:rPr>
+        <w:t>BackendForFrontend</w:t>
+      </w:r>
+      <w:proofErr w:type="spellEnd"/>
     </w:p>
     <w:p>
       <w:pPr>
@@ -144,6 +154,7 @@
           <w:szCs w:val="22"/>
         </w:rPr>
       </w:pPr>
+      <w:proofErr w:type="spellStart"/>
       <w:r>
         <w:rPr>
           <w:rFonts w:ascii="Lexend" w:hAnsi="Lexend"/>
@@ -152,6 +163,7 @@
         </w:rPr>
         <w:t>TailwindCSS</w:t>
       </w:r>
+      <w:proofErr w:type="spellEnd"/>
     </w:p>
     <w:p>
       <w:pPr>
@@ -196,13 +208,23 @@
           <w:szCs w:val="22"/>
         </w:rPr>
       </w:pPr>
-      <w:r>
-        <w:rPr>
-          <w:rFonts w:ascii="Lexend" w:hAnsi="Lexend"/>
-          <w:sz w:val="22"/>
-          <w:szCs w:val="22"/>
-        </w:rPr>
-        <w:t>ShadCN (UI library)</w:t>
+      <w:proofErr w:type="spellStart"/>
+      <w:r>
+        <w:rPr>
+          <w:rFonts w:ascii="Lexend" w:hAnsi="Lexend"/>
+          <w:sz w:val="22"/>
+          <w:szCs w:val="22"/>
+        </w:rPr>
+        <w:t>ShadCN</w:t>
+      </w:r>
+      <w:proofErr w:type="spellEnd"/>
+      <w:r>
+        <w:rPr>
+          <w:rFonts w:ascii="Lexend" w:hAnsi="Lexend"/>
+          <w:sz w:val="22"/>
+          <w:szCs w:val="22"/>
+        </w:rPr>
+        <w:t xml:space="preserve"> (UI library)</w:t>
       </w:r>
     </w:p>
     <w:p>
@@ -4253,6 +4275,1807 @@
           <w:sz w:val="32"/>
           <w:szCs w:val="32"/>
         </w:rPr>
+        <w:t>Sitemap</w:t>
+      </w:r>
+    </w:p>
+    <w:p>
+      <w:pPr>
+        <w:pStyle w:val="Listaszerbekezds"/>
+        <w:numPr>
+          <w:ilvl w:val="0"/>
+          <w:numId w:val="13"/>
+        </w:numPr>
+        <w:spacing w:before="480" w:after="240"/>
+        <w:rPr>
+          <w:rFonts w:ascii="Lexend" w:hAnsi="Lexend"/>
+          <w:b/>
+          <w:bCs/>
+          <w:sz w:val="22"/>
+          <w:szCs w:val="22"/>
+        </w:rPr>
+      </w:pPr>
+      <w:r>
+        <w:rPr>
+          <w:rFonts w:ascii="Lexend" w:hAnsi="Lexend"/>
+          <w:b/>
+          <w:bCs/>
+          <w:sz w:val="22"/>
+          <w:szCs w:val="22"/>
+        </w:rPr>
+        <w:t>Landing Page</w:t>
+      </w:r>
+    </w:p>
+    <w:p>
+      <w:pPr>
+        <w:pStyle w:val="Listaszerbekezds"/>
+        <w:numPr>
+          <w:ilvl w:val="0"/>
+          <w:numId w:val="13"/>
+        </w:numPr>
+        <w:spacing w:before="480" w:after="240"/>
+        <w:rPr>
+          <w:rFonts w:ascii="Lexend" w:hAnsi="Lexend"/>
+          <w:b/>
+          <w:bCs/>
+          <w:sz w:val="22"/>
+          <w:szCs w:val="22"/>
+        </w:rPr>
+      </w:pPr>
+      <w:r>
+        <w:rPr>
+          <w:rFonts w:ascii="Lexend" w:hAnsi="Lexend"/>
+          <w:b/>
+          <w:bCs/>
+          <w:sz w:val="22"/>
+          <w:szCs w:val="22"/>
+        </w:rPr>
+        <w:t>Login</w:t>
+      </w:r>
+    </w:p>
+    <w:p>
+      <w:pPr>
+        <w:pStyle w:val="Listaszerbekezds"/>
+        <w:numPr>
+          <w:ilvl w:val="0"/>
+          <w:numId w:val="13"/>
+        </w:numPr>
+        <w:spacing w:before="480" w:after="240"/>
+        <w:rPr>
+          <w:rFonts w:ascii="Lexend" w:hAnsi="Lexend"/>
+          <w:b/>
+          <w:bCs/>
+          <w:sz w:val="22"/>
+          <w:szCs w:val="22"/>
+        </w:rPr>
+      </w:pPr>
+      <w:r>
+        <w:rPr>
+          <w:rFonts w:ascii="Lexend" w:hAnsi="Lexend"/>
+          <w:b/>
+          <w:bCs/>
+          <w:sz w:val="22"/>
+          <w:szCs w:val="22"/>
+        </w:rPr>
+        <w:t>Register</w:t>
+      </w:r>
+    </w:p>
+    <w:p>
+      <w:pPr>
+        <w:pStyle w:val="Listaszerbekezds"/>
+        <w:numPr>
+          <w:ilvl w:val="1"/>
+          <w:numId w:val="13"/>
+        </w:numPr>
+        <w:spacing w:before="480" w:after="240"/>
+        <w:rPr>
+          <w:rFonts w:ascii="Lexend" w:hAnsi="Lexend"/>
+          <w:b/>
+          <w:bCs/>
+          <w:sz w:val="22"/>
+          <w:szCs w:val="22"/>
+        </w:rPr>
+      </w:pPr>
+      <w:r>
+        <w:rPr>
+          <w:rFonts w:ascii="Lexend" w:hAnsi="Lexend"/>
+          <w:sz w:val="22"/>
+          <w:szCs w:val="22"/>
+        </w:rPr>
+        <w:t>Profile setup</w:t>
+      </w:r>
+    </w:p>
+    <w:p>
+      <w:pPr>
+        <w:pStyle w:val="Listaszerbekezds"/>
+        <w:numPr>
+          <w:ilvl w:val="0"/>
+          <w:numId w:val="13"/>
+        </w:numPr>
+        <w:spacing w:before="480" w:after="240"/>
+        <w:rPr>
+          <w:rFonts w:ascii="Lexend" w:hAnsi="Lexend"/>
+          <w:b/>
+          <w:bCs/>
+          <w:sz w:val="22"/>
+          <w:szCs w:val="22"/>
+        </w:rPr>
+      </w:pPr>
+      <w:r>
+        <w:rPr>
+          <w:rFonts w:ascii="Lexend" w:hAnsi="Lexend"/>
+          <w:b/>
+          <w:bCs/>
+          <w:sz w:val="22"/>
+          <w:szCs w:val="22"/>
+        </w:rPr>
+        <w:t>Forgot Password</w:t>
+      </w:r>
+    </w:p>
+    <w:p>
+      <w:pPr>
+        <w:pStyle w:val="Listaszerbekezds"/>
+        <w:numPr>
+          <w:ilvl w:val="1"/>
+          <w:numId w:val="13"/>
+        </w:numPr>
+        <w:spacing w:before="480" w:after="240"/>
+        <w:rPr>
+          <w:rFonts w:ascii="Lexend" w:hAnsi="Lexend"/>
+          <w:sz w:val="22"/>
+          <w:szCs w:val="22"/>
+        </w:rPr>
+      </w:pPr>
+      <w:r>
+        <w:rPr>
+          <w:rFonts w:ascii="Lexend" w:hAnsi="Lexend"/>
+          <w:sz w:val="22"/>
+          <w:szCs w:val="22"/>
+        </w:rPr>
+        <w:t>Password Recovery page</w:t>
+      </w:r>
+    </w:p>
+    <w:p>
+      <w:pPr>
+        <w:pStyle w:val="Listaszerbekezds"/>
+        <w:numPr>
+          <w:ilvl w:val="0"/>
+          <w:numId w:val="13"/>
+        </w:numPr>
+        <w:spacing w:before="480" w:after="240"/>
+        <w:rPr>
+          <w:rFonts w:ascii="Lexend" w:hAnsi="Lexend"/>
+          <w:b/>
+          <w:bCs/>
+          <w:sz w:val="22"/>
+          <w:szCs w:val="22"/>
+        </w:rPr>
+      </w:pPr>
+      <w:r>
+        <w:rPr>
+          <w:rFonts w:ascii="Lexend" w:hAnsi="Lexend"/>
+          <w:b/>
+          <w:bCs/>
+          <w:sz w:val="22"/>
+          <w:szCs w:val="22"/>
+        </w:rPr>
+        <w:t>Help/FAQ</w:t>
+      </w:r>
+    </w:p>
+    <w:p>
+      <w:pPr>
+        <w:pStyle w:val="Listaszerbekezds"/>
+        <w:numPr>
+          <w:ilvl w:val="0"/>
+          <w:numId w:val="13"/>
+        </w:numPr>
+        <w:spacing w:before="480" w:after="240"/>
+        <w:rPr>
+          <w:rFonts w:ascii="Lexend" w:hAnsi="Lexend"/>
+          <w:b/>
+          <w:bCs/>
+          <w:sz w:val="22"/>
+          <w:szCs w:val="22"/>
+        </w:rPr>
+      </w:pPr>
+      <w:r>
+        <w:rPr>
+          <w:rFonts w:ascii="Lexend" w:hAnsi="Lexend"/>
+          <w:b/>
+          <w:bCs/>
+          <w:sz w:val="22"/>
+          <w:szCs w:val="22"/>
+        </w:rPr>
+        <w:t>Contact Support</w:t>
+      </w:r>
+    </w:p>
+    <w:p>
+      <w:pPr>
+        <w:pStyle w:val="Listaszerbekezds"/>
+        <w:numPr>
+          <w:ilvl w:val="0"/>
+          <w:numId w:val="13"/>
+        </w:numPr>
+        <w:spacing w:before="480" w:after="240"/>
+        <w:rPr>
+          <w:rFonts w:ascii="Lexend" w:hAnsi="Lexend"/>
+          <w:b/>
+          <w:bCs/>
+          <w:sz w:val="22"/>
+          <w:szCs w:val="22"/>
+        </w:rPr>
+      </w:pPr>
+      <w:r>
+        <w:rPr>
+          <w:rFonts w:ascii="Lexend" w:hAnsi="Lexend"/>
+          <w:b/>
+          <w:bCs/>
+          <w:sz w:val="22"/>
+          <w:szCs w:val="22"/>
+        </w:rPr>
+        <w:t>Privacy Policy</w:t>
+      </w:r>
+    </w:p>
+    <w:p>
+      <w:pPr>
+        <w:pStyle w:val="Listaszerbekezds"/>
+        <w:numPr>
+          <w:ilvl w:val="0"/>
+          <w:numId w:val="13"/>
+        </w:numPr>
+        <w:spacing w:before="480" w:after="240"/>
+        <w:rPr>
+          <w:rFonts w:ascii="Lexend" w:hAnsi="Lexend"/>
+          <w:b/>
+          <w:bCs/>
+          <w:sz w:val="22"/>
+          <w:szCs w:val="22"/>
+        </w:rPr>
+      </w:pPr>
+      <w:r>
+        <w:rPr>
+          <w:rFonts w:ascii="Lexend" w:hAnsi="Lexend"/>
+          <w:b/>
+          <w:bCs/>
+          <w:sz w:val="22"/>
+          <w:szCs w:val="22"/>
+        </w:rPr>
+        <w:t>About Us</w:t>
+      </w:r>
+    </w:p>
+    <w:p>
+      <w:pPr>
+        <w:pStyle w:val="Listaszerbekezds"/>
+        <w:numPr>
+          <w:ilvl w:val="0"/>
+          <w:numId w:val="13"/>
+        </w:numPr>
+        <w:spacing w:before="480" w:after="240"/>
+        <w:rPr>
+          <w:rFonts w:ascii="Lexend" w:hAnsi="Lexend"/>
+          <w:b/>
+          <w:bCs/>
+          <w:sz w:val="22"/>
+          <w:szCs w:val="22"/>
+        </w:rPr>
+      </w:pPr>
+      <w:r>
+        <w:rPr>
+          <w:rFonts w:ascii="Lexend" w:hAnsi="Lexend"/>
+          <w:b/>
+          <w:bCs/>
+          <w:sz w:val="22"/>
+          <w:szCs w:val="22"/>
+        </w:rPr>
+        <w:t>Error pages</w:t>
+      </w:r>
+    </w:p>
+    <w:p>
+      <w:pPr>
+        <w:pStyle w:val="Listaszerbekezds"/>
+        <w:numPr>
+          <w:ilvl w:val="1"/>
+          <w:numId w:val="13"/>
+        </w:numPr>
+        <w:spacing w:before="480" w:after="240"/>
+        <w:rPr>
+          <w:rFonts w:ascii="Lexend" w:hAnsi="Lexend"/>
+          <w:b/>
+          <w:bCs/>
+          <w:sz w:val="22"/>
+          <w:szCs w:val="22"/>
+        </w:rPr>
+      </w:pPr>
+      <w:r>
+        <w:rPr>
+          <w:rFonts w:ascii="Lexend" w:hAnsi="Lexend"/>
+          <w:sz w:val="22"/>
+          <w:szCs w:val="22"/>
+        </w:rPr>
+        <w:t>404 Not found</w:t>
+      </w:r>
+    </w:p>
+    <w:p>
+      <w:pPr>
+        <w:pStyle w:val="Listaszerbekezds"/>
+        <w:numPr>
+          <w:ilvl w:val="1"/>
+          <w:numId w:val="13"/>
+        </w:numPr>
+        <w:spacing w:before="480" w:after="240"/>
+        <w:rPr>
+          <w:rFonts w:ascii="Lexend" w:hAnsi="Lexend"/>
+          <w:b/>
+          <w:bCs/>
+          <w:sz w:val="22"/>
+          <w:szCs w:val="22"/>
+        </w:rPr>
+      </w:pPr>
+      <w:r>
+        <w:rPr>
+          <w:rFonts w:ascii="Lexend" w:hAnsi="Lexend"/>
+          <w:sz w:val="22"/>
+          <w:szCs w:val="22"/>
+        </w:rPr>
+        <w:t>403 Forbidden</w:t>
+      </w:r>
+    </w:p>
+    <w:p>
+      <w:pPr>
+        <w:pStyle w:val="Listaszerbekezds"/>
+        <w:numPr>
+          <w:ilvl w:val="1"/>
+          <w:numId w:val="13"/>
+        </w:numPr>
+        <w:spacing w:before="480" w:after="240"/>
+        <w:rPr>
+          <w:rFonts w:ascii="Lexend" w:hAnsi="Lexend"/>
+          <w:b/>
+          <w:bCs/>
+          <w:sz w:val="22"/>
+          <w:szCs w:val="22"/>
+        </w:rPr>
+      </w:pPr>
+      <w:r>
+        <w:rPr>
+          <w:rFonts w:ascii="Lexend" w:hAnsi="Lexend"/>
+          <w:sz w:val="22"/>
+          <w:szCs w:val="22"/>
+        </w:rPr>
+        <w:t>500 Server Error</w:t>
+      </w:r>
+    </w:p>
+    <w:p>
+      <w:pPr>
+        <w:pStyle w:val="Listaszerbekezds"/>
+        <w:numPr>
+          <w:ilvl w:val="0"/>
+          <w:numId w:val="13"/>
+        </w:numPr>
+        <w:spacing w:before="480" w:after="240"/>
+        <w:rPr>
+          <w:rFonts w:ascii="Lexend" w:hAnsi="Lexend"/>
+          <w:b/>
+          <w:bCs/>
+          <w:sz w:val="22"/>
+          <w:szCs w:val="22"/>
+        </w:rPr>
+      </w:pPr>
+      <w:r>
+        <w:rPr>
+          <w:rFonts w:ascii="Lexend" w:hAnsi="Lexend"/>
+          <w:b/>
+          <w:bCs/>
+          <w:sz w:val="22"/>
+          <w:szCs w:val="22"/>
+        </w:rPr>
+        <w:t>Student</w:t>
+      </w:r>
+    </w:p>
+    <w:p>
+      <w:pPr>
+        <w:pStyle w:val="Listaszerbekezds"/>
+        <w:numPr>
+          <w:ilvl w:val="1"/>
+          <w:numId w:val="13"/>
+        </w:numPr>
+        <w:spacing w:before="480" w:after="240"/>
+        <w:rPr>
+          <w:rFonts w:ascii="Lexend" w:hAnsi="Lexend"/>
+          <w:b/>
+          <w:bCs/>
+          <w:sz w:val="22"/>
+          <w:szCs w:val="22"/>
+        </w:rPr>
+      </w:pPr>
+      <w:r>
+        <w:rPr>
+          <w:rFonts w:ascii="Lexend" w:hAnsi="Lexend"/>
+          <w:b/>
+          <w:bCs/>
+          <w:sz w:val="22"/>
+          <w:szCs w:val="22"/>
+        </w:rPr>
+        <w:t>Home</w:t>
+      </w:r>
+    </w:p>
+    <w:p>
+      <w:pPr>
+        <w:pStyle w:val="Listaszerbekezds"/>
+        <w:numPr>
+          <w:ilvl w:val="1"/>
+          <w:numId w:val="13"/>
+        </w:numPr>
+        <w:spacing w:before="480" w:after="240"/>
+        <w:rPr>
+          <w:rFonts w:ascii="Lexend" w:hAnsi="Lexend"/>
+          <w:b/>
+          <w:bCs/>
+          <w:sz w:val="22"/>
+          <w:szCs w:val="22"/>
+        </w:rPr>
+      </w:pPr>
+      <w:r>
+        <w:rPr>
+          <w:rFonts w:ascii="Lexend" w:hAnsi="Lexend"/>
+          <w:b/>
+          <w:bCs/>
+          <w:sz w:val="22"/>
+          <w:szCs w:val="22"/>
+        </w:rPr>
+        <w:t>My courses</w:t>
+      </w:r>
+    </w:p>
+    <w:p>
+      <w:pPr>
+        <w:pStyle w:val="Listaszerbekezds"/>
+        <w:numPr>
+          <w:ilvl w:val="2"/>
+          <w:numId w:val="13"/>
+        </w:numPr>
+        <w:spacing w:before="480" w:after="240"/>
+        <w:rPr>
+          <w:rFonts w:ascii="Lexend" w:hAnsi="Lexend"/>
+          <w:b/>
+          <w:bCs/>
+          <w:sz w:val="22"/>
+          <w:szCs w:val="22"/>
+        </w:rPr>
+      </w:pPr>
+      <w:r>
+        <w:rPr>
+          <w:rFonts w:ascii="Lexend" w:hAnsi="Lexend"/>
+          <w:sz w:val="22"/>
+          <w:szCs w:val="22"/>
+        </w:rPr>
+        <w:t>Tutoring courses</w:t>
+      </w:r>
+    </w:p>
+    <w:p>
+      <w:pPr>
+        <w:pStyle w:val="Listaszerbekezds"/>
+        <w:numPr>
+          <w:ilvl w:val="3"/>
+          <w:numId w:val="13"/>
+        </w:numPr>
+        <w:spacing w:before="480" w:after="240"/>
+        <w:rPr>
+          <w:rFonts w:ascii="Lexend" w:hAnsi="Lexend"/>
+          <w:b/>
+          <w:bCs/>
+          <w:sz w:val="22"/>
+          <w:szCs w:val="22"/>
+        </w:rPr>
+      </w:pPr>
+      <w:r>
+        <w:rPr>
+          <w:rFonts w:ascii="Lexend" w:hAnsi="Lexend"/>
+          <w:sz w:val="22"/>
+          <w:szCs w:val="22"/>
+        </w:rPr>
+        <w:t>Course overview</w:t>
+      </w:r>
+    </w:p>
+    <w:p>
+      <w:pPr>
+        <w:pStyle w:val="Listaszerbekezds"/>
+        <w:numPr>
+          <w:ilvl w:val="3"/>
+          <w:numId w:val="13"/>
+        </w:numPr>
+        <w:spacing w:before="480" w:after="240"/>
+        <w:rPr>
+          <w:rFonts w:ascii="Lexend" w:hAnsi="Lexend"/>
+          <w:b/>
+          <w:bCs/>
+          <w:sz w:val="22"/>
+          <w:szCs w:val="22"/>
+        </w:rPr>
+      </w:pPr>
+      <w:r>
+        <w:rPr>
+          <w:rFonts w:ascii="Lexend" w:hAnsi="Lexend"/>
+          <w:sz w:val="22"/>
+          <w:szCs w:val="22"/>
+        </w:rPr>
+        <w:t>Tutoring</w:t>
+      </w:r>
+      <w:r>
+        <w:rPr>
+          <w:rFonts w:ascii="Lexend" w:hAnsi="Lexend"/>
+          <w:sz w:val="22"/>
+          <w:szCs w:val="22"/>
+        </w:rPr>
+        <w:t xml:space="preserve"> wall</w:t>
+      </w:r>
+    </w:p>
+    <w:p>
+      <w:pPr>
+        <w:pStyle w:val="Listaszerbekezds"/>
+        <w:numPr>
+          <w:ilvl w:val="4"/>
+          <w:numId w:val="13"/>
+        </w:numPr>
+        <w:spacing w:before="480" w:after="240"/>
+        <w:rPr>
+          <w:rFonts w:ascii="Lexend" w:hAnsi="Lexend"/>
+          <w:b/>
+          <w:bCs/>
+          <w:sz w:val="22"/>
+          <w:szCs w:val="22"/>
+        </w:rPr>
+      </w:pPr>
+      <w:r>
+        <w:rPr>
+          <w:rFonts w:ascii="Lexend" w:hAnsi="Lexend"/>
+          <w:sz w:val="22"/>
+          <w:szCs w:val="22"/>
+        </w:rPr>
+        <w:t>Submissions page</w:t>
+      </w:r>
+    </w:p>
+    <w:p>
+      <w:pPr>
+        <w:pStyle w:val="Listaszerbekezds"/>
+        <w:numPr>
+          <w:ilvl w:val="4"/>
+          <w:numId w:val="13"/>
+        </w:numPr>
+        <w:spacing w:before="480" w:after="240"/>
+        <w:rPr>
+          <w:rFonts w:ascii="Lexend" w:hAnsi="Lexend"/>
+          <w:b/>
+          <w:bCs/>
+          <w:sz w:val="22"/>
+          <w:szCs w:val="22"/>
+        </w:rPr>
+      </w:pPr>
+      <w:r>
+        <w:rPr>
+          <w:rFonts w:ascii="Lexend" w:hAnsi="Lexend"/>
+          <w:sz w:val="22"/>
+          <w:szCs w:val="22"/>
+        </w:rPr>
+        <w:t xml:space="preserve">Wall item </w:t>
+      </w:r>
+      <w:r>
+        <w:rPr>
+          <w:rFonts w:ascii="Lexend" w:hAnsi="Lexend"/>
+          <w:sz w:val="22"/>
+          <w:szCs w:val="22"/>
+        </w:rPr>
+        <w:t>page</w:t>
+      </w:r>
+    </w:p>
+    <w:p>
+      <w:pPr>
+        <w:pStyle w:val="Listaszerbekezds"/>
+        <w:numPr>
+          <w:ilvl w:val="2"/>
+          <w:numId w:val="13"/>
+        </w:numPr>
+        <w:spacing w:before="480" w:after="240"/>
+        <w:rPr>
+          <w:rFonts w:ascii="Lexend" w:hAnsi="Lexend"/>
+          <w:b/>
+          <w:bCs/>
+          <w:sz w:val="22"/>
+          <w:szCs w:val="22"/>
+        </w:rPr>
+      </w:pPr>
+      <w:r>
+        <w:rPr>
+          <w:rFonts w:ascii="Lexend" w:hAnsi="Lexend"/>
+          <w:sz w:val="22"/>
+          <w:szCs w:val="22"/>
+        </w:rPr>
+        <w:t>Learning path</w:t>
+      </w:r>
+      <w:r>
+        <w:rPr>
+          <w:rFonts w:ascii="Lexend" w:hAnsi="Lexend"/>
+          <w:sz w:val="22"/>
+          <w:szCs w:val="22"/>
+        </w:rPr>
+        <w:t>s</w:t>
+      </w:r>
+    </w:p>
+    <w:p>
+      <w:pPr>
+        <w:pStyle w:val="Listaszerbekezds"/>
+        <w:numPr>
+          <w:ilvl w:val="3"/>
+          <w:numId w:val="13"/>
+        </w:numPr>
+        <w:spacing w:before="480" w:after="240"/>
+        <w:rPr>
+          <w:rFonts w:ascii="Lexend" w:hAnsi="Lexend"/>
+          <w:b/>
+          <w:bCs/>
+          <w:sz w:val="22"/>
+          <w:szCs w:val="22"/>
+        </w:rPr>
+      </w:pPr>
+      <w:r>
+        <w:rPr>
+          <w:rFonts w:ascii="Lexend" w:hAnsi="Lexend"/>
+          <w:sz w:val="22"/>
+          <w:szCs w:val="22"/>
+        </w:rPr>
+        <w:t>Course overview</w:t>
+      </w:r>
+    </w:p>
+    <w:p>
+      <w:pPr>
+        <w:pStyle w:val="Listaszerbekezds"/>
+        <w:numPr>
+          <w:ilvl w:val="3"/>
+          <w:numId w:val="13"/>
+        </w:numPr>
+        <w:spacing w:before="480" w:after="240"/>
+        <w:rPr>
+          <w:rFonts w:ascii="Lexend" w:hAnsi="Lexend"/>
+          <w:b/>
+          <w:bCs/>
+          <w:sz w:val="22"/>
+          <w:szCs w:val="22"/>
+        </w:rPr>
+      </w:pPr>
+      <w:r>
+        <w:rPr>
+          <w:rFonts w:ascii="Lexend" w:hAnsi="Lexend"/>
+          <w:sz w:val="22"/>
+          <w:szCs w:val="22"/>
+        </w:rPr>
+        <w:t>Learning path</w:t>
+      </w:r>
+    </w:p>
+    <w:p>
+      <w:pPr>
+        <w:pStyle w:val="Listaszerbekezds"/>
+        <w:numPr>
+          <w:ilvl w:val="4"/>
+          <w:numId w:val="13"/>
+        </w:numPr>
+        <w:spacing w:before="480" w:after="240"/>
+        <w:rPr>
+          <w:rFonts w:ascii="Lexend" w:hAnsi="Lexend"/>
+          <w:b/>
+          <w:bCs/>
+          <w:sz w:val="22"/>
+          <w:szCs w:val="22"/>
+        </w:rPr>
+      </w:pPr>
+      <w:r>
+        <w:rPr>
+          <w:rFonts w:ascii="Lexend" w:hAnsi="Lexend"/>
+          <w:sz w:val="22"/>
+          <w:szCs w:val="22"/>
+        </w:rPr>
+        <w:t>Submissions page</w:t>
+      </w:r>
+    </w:p>
+    <w:p>
+      <w:pPr>
+        <w:pStyle w:val="Listaszerbekezds"/>
+        <w:numPr>
+          <w:ilvl w:val="4"/>
+          <w:numId w:val="13"/>
+        </w:numPr>
+        <w:spacing w:before="480" w:after="240"/>
+        <w:rPr>
+          <w:rFonts w:ascii="Lexend" w:hAnsi="Lexend"/>
+          <w:b/>
+          <w:bCs/>
+          <w:sz w:val="22"/>
+          <w:szCs w:val="22"/>
+        </w:rPr>
+      </w:pPr>
+      <w:r>
+        <w:rPr>
+          <w:rFonts w:ascii="Lexend" w:hAnsi="Lexend"/>
+          <w:sz w:val="22"/>
+          <w:szCs w:val="22"/>
+        </w:rPr>
+        <w:t xml:space="preserve">Lesson </w:t>
+      </w:r>
+      <w:r>
+        <w:rPr>
+          <w:rFonts w:ascii="Lexend" w:hAnsi="Lexend"/>
+          <w:sz w:val="22"/>
+          <w:szCs w:val="22"/>
+        </w:rPr>
+        <w:t>page</w:t>
+      </w:r>
+    </w:p>
+    <w:p>
+      <w:pPr>
+        <w:pStyle w:val="Listaszerbekezds"/>
+        <w:numPr>
+          <w:ilvl w:val="1"/>
+          <w:numId w:val="13"/>
+        </w:numPr>
+        <w:spacing w:before="480" w:after="240"/>
+        <w:rPr>
+          <w:rFonts w:ascii="Lexend" w:hAnsi="Lexend"/>
+          <w:b/>
+          <w:bCs/>
+          <w:sz w:val="22"/>
+          <w:szCs w:val="22"/>
+        </w:rPr>
+      </w:pPr>
+      <w:r>
+        <w:rPr>
+          <w:rFonts w:ascii="Lexend" w:hAnsi="Lexend"/>
+          <w:b/>
+          <w:bCs/>
+          <w:sz w:val="22"/>
+          <w:szCs w:val="22"/>
+        </w:rPr>
+        <w:t>Calendar</w:t>
+      </w:r>
+    </w:p>
+    <w:p>
+      <w:pPr>
+        <w:pStyle w:val="Listaszerbekezds"/>
+        <w:numPr>
+          <w:ilvl w:val="2"/>
+          <w:numId w:val="13"/>
+        </w:numPr>
+        <w:spacing w:before="480" w:after="240"/>
+        <w:rPr>
+          <w:rFonts w:ascii="Lexend" w:hAnsi="Lexend"/>
+          <w:b/>
+          <w:bCs/>
+          <w:sz w:val="22"/>
+          <w:szCs w:val="22"/>
+        </w:rPr>
+      </w:pPr>
+      <w:r>
+        <w:rPr>
+          <w:rFonts w:ascii="Lexend" w:hAnsi="Lexend"/>
+          <w:sz w:val="22"/>
+          <w:szCs w:val="22"/>
+        </w:rPr>
+        <w:t>Event details</w:t>
+      </w:r>
+    </w:p>
+    <w:p>
+      <w:pPr>
+        <w:pStyle w:val="Listaszerbekezds"/>
+        <w:numPr>
+          <w:ilvl w:val="1"/>
+          <w:numId w:val="13"/>
+        </w:numPr>
+        <w:spacing w:before="480" w:after="240"/>
+        <w:rPr>
+          <w:rFonts w:ascii="Lexend" w:hAnsi="Lexend"/>
+          <w:b/>
+          <w:bCs/>
+          <w:sz w:val="22"/>
+          <w:szCs w:val="22"/>
+        </w:rPr>
+      </w:pPr>
+      <w:r>
+        <w:rPr>
+          <w:rFonts w:ascii="Lexend" w:hAnsi="Lexend"/>
+          <w:b/>
+          <w:bCs/>
+          <w:sz w:val="22"/>
+          <w:szCs w:val="22"/>
+        </w:rPr>
+        <w:t>Community</w:t>
+      </w:r>
+    </w:p>
+    <w:p>
+      <w:pPr>
+        <w:pStyle w:val="Listaszerbekezds"/>
+        <w:numPr>
+          <w:ilvl w:val="2"/>
+          <w:numId w:val="13"/>
+        </w:numPr>
+        <w:spacing w:before="480" w:after="240"/>
+        <w:rPr>
+          <w:rFonts w:ascii="Lexend" w:hAnsi="Lexend"/>
+          <w:b/>
+          <w:bCs/>
+          <w:sz w:val="22"/>
+          <w:szCs w:val="22"/>
+        </w:rPr>
+      </w:pPr>
+      <w:r>
+        <w:rPr>
+          <w:rFonts w:ascii="Lexend" w:hAnsi="Lexend"/>
+          <w:sz w:val="22"/>
+          <w:szCs w:val="22"/>
+        </w:rPr>
+        <w:t>Messages (student-teacher)</w:t>
+      </w:r>
+    </w:p>
+    <w:p>
+      <w:pPr>
+        <w:pStyle w:val="Listaszerbekezds"/>
+        <w:numPr>
+          <w:ilvl w:val="3"/>
+          <w:numId w:val="13"/>
+        </w:numPr>
+        <w:spacing w:before="480" w:after="240"/>
+        <w:rPr>
+          <w:rFonts w:ascii="Lexend" w:hAnsi="Lexend"/>
+          <w:b/>
+          <w:bCs/>
+          <w:sz w:val="22"/>
+          <w:szCs w:val="22"/>
+        </w:rPr>
+      </w:pPr>
+      <w:r>
+        <w:rPr>
+          <w:rFonts w:ascii="Lexend" w:hAnsi="Lexend"/>
+          <w:sz w:val="22"/>
+          <w:szCs w:val="22"/>
+        </w:rPr>
+        <w:t xml:space="preserve">Chat room </w:t>
+      </w:r>
+      <w:r>
+        <w:rPr>
+          <w:rFonts w:ascii="Lexend" w:hAnsi="Lexend"/>
+          <w:sz w:val="22"/>
+          <w:szCs w:val="22"/>
+        </w:rPr>
+        <w:t>page</w:t>
+      </w:r>
+    </w:p>
+    <w:p>
+      <w:pPr>
+        <w:pStyle w:val="Listaszerbekezds"/>
+        <w:numPr>
+          <w:ilvl w:val="2"/>
+          <w:numId w:val="13"/>
+        </w:numPr>
+        <w:spacing w:before="480" w:after="240"/>
+        <w:rPr>
+          <w:rFonts w:ascii="Lexend" w:hAnsi="Lexend"/>
+          <w:b/>
+          <w:bCs/>
+          <w:sz w:val="22"/>
+          <w:szCs w:val="22"/>
+        </w:rPr>
+      </w:pPr>
+      <w:r>
+        <w:rPr>
+          <w:rFonts w:ascii="Lexend" w:hAnsi="Lexend"/>
+          <w:sz w:val="22"/>
+          <w:szCs w:val="22"/>
+        </w:rPr>
+        <w:t>Community threads</w:t>
+      </w:r>
+    </w:p>
+    <w:p>
+      <w:pPr>
+        <w:pStyle w:val="Listaszerbekezds"/>
+        <w:numPr>
+          <w:ilvl w:val="3"/>
+          <w:numId w:val="13"/>
+        </w:numPr>
+        <w:spacing w:before="480" w:after="240"/>
+        <w:rPr>
+          <w:rFonts w:ascii="Lexend" w:hAnsi="Lexend"/>
+          <w:b/>
+          <w:bCs/>
+          <w:sz w:val="22"/>
+          <w:szCs w:val="22"/>
+        </w:rPr>
+      </w:pPr>
+      <w:r>
+        <w:rPr>
+          <w:rFonts w:ascii="Lexend" w:hAnsi="Lexend"/>
+          <w:sz w:val="22"/>
+          <w:szCs w:val="22"/>
+        </w:rPr>
+        <w:t xml:space="preserve">Thread </w:t>
+      </w:r>
+      <w:r>
+        <w:rPr>
+          <w:rFonts w:ascii="Lexend" w:hAnsi="Lexend"/>
+          <w:sz w:val="22"/>
+          <w:szCs w:val="22"/>
+        </w:rPr>
+        <w:t>page</w:t>
+      </w:r>
+    </w:p>
+    <w:p>
+      <w:pPr>
+        <w:pStyle w:val="Listaszerbekezds"/>
+        <w:numPr>
+          <w:ilvl w:val="1"/>
+          <w:numId w:val="13"/>
+        </w:numPr>
+        <w:spacing w:before="480" w:after="240"/>
+        <w:rPr>
+          <w:rFonts w:ascii="Lexend" w:hAnsi="Lexend"/>
+          <w:b/>
+          <w:bCs/>
+          <w:sz w:val="22"/>
+          <w:szCs w:val="22"/>
+        </w:rPr>
+      </w:pPr>
+      <w:r>
+        <w:rPr>
+          <w:rFonts w:ascii="Lexend" w:hAnsi="Lexend"/>
+          <w:b/>
+          <w:bCs/>
+          <w:sz w:val="22"/>
+          <w:szCs w:val="22"/>
+        </w:rPr>
+        <w:t>Finances</w:t>
+      </w:r>
+    </w:p>
+    <w:p>
+      <w:pPr>
+        <w:pStyle w:val="Listaszerbekezds"/>
+        <w:numPr>
+          <w:ilvl w:val="2"/>
+          <w:numId w:val="13"/>
+        </w:numPr>
+        <w:spacing w:before="480" w:after="240"/>
+        <w:rPr>
+          <w:rFonts w:ascii="Lexend" w:hAnsi="Lexend"/>
+          <w:b/>
+          <w:bCs/>
+          <w:sz w:val="22"/>
+          <w:szCs w:val="22"/>
+        </w:rPr>
+      </w:pPr>
+      <w:r>
+        <w:rPr>
+          <w:rFonts w:ascii="Lexend" w:hAnsi="Lexend"/>
+          <w:sz w:val="22"/>
+          <w:szCs w:val="22"/>
+        </w:rPr>
+        <w:t>Invoice details</w:t>
+      </w:r>
+    </w:p>
+    <w:p>
+      <w:pPr>
+        <w:pStyle w:val="Listaszerbekezds"/>
+        <w:numPr>
+          <w:ilvl w:val="1"/>
+          <w:numId w:val="13"/>
+        </w:numPr>
+        <w:spacing w:before="480" w:after="240"/>
+        <w:rPr>
+          <w:rFonts w:ascii="Lexend" w:hAnsi="Lexend"/>
+          <w:b/>
+          <w:bCs/>
+          <w:sz w:val="22"/>
+          <w:szCs w:val="22"/>
+        </w:rPr>
+      </w:pPr>
+      <w:r>
+        <w:rPr>
+          <w:rFonts w:ascii="Lexend" w:hAnsi="Lexend"/>
+          <w:b/>
+          <w:bCs/>
+          <w:sz w:val="22"/>
+          <w:szCs w:val="22"/>
+        </w:rPr>
+        <w:lastRenderedPageBreak/>
+        <w:t>Account settings</w:t>
+      </w:r>
+    </w:p>
+    <w:p>
+      <w:pPr>
+        <w:pStyle w:val="Listaszerbekezds"/>
+        <w:numPr>
+          <w:ilvl w:val="0"/>
+          <w:numId w:val="13"/>
+        </w:numPr>
+        <w:spacing w:before="480" w:after="240"/>
+        <w:rPr>
+          <w:rFonts w:ascii="Lexend" w:hAnsi="Lexend"/>
+          <w:b/>
+          <w:bCs/>
+          <w:sz w:val="22"/>
+          <w:szCs w:val="22"/>
+        </w:rPr>
+      </w:pPr>
+      <w:r>
+        <w:rPr>
+          <w:rFonts w:ascii="Lexend" w:hAnsi="Lexend"/>
+          <w:b/>
+          <w:bCs/>
+          <w:sz w:val="22"/>
+          <w:szCs w:val="22"/>
+        </w:rPr>
+        <w:t>Teacher</w:t>
+      </w:r>
+    </w:p>
+    <w:p>
+      <w:pPr>
+        <w:pStyle w:val="Listaszerbekezds"/>
+        <w:numPr>
+          <w:ilvl w:val="1"/>
+          <w:numId w:val="13"/>
+        </w:numPr>
+        <w:spacing w:before="480" w:after="240"/>
+        <w:rPr>
+          <w:rFonts w:ascii="Lexend" w:hAnsi="Lexend"/>
+          <w:b/>
+          <w:bCs/>
+          <w:sz w:val="22"/>
+          <w:szCs w:val="22"/>
+        </w:rPr>
+      </w:pPr>
+      <w:r>
+        <w:rPr>
+          <w:rFonts w:ascii="Lexend" w:hAnsi="Lexend"/>
+          <w:b/>
+          <w:bCs/>
+          <w:sz w:val="22"/>
+          <w:szCs w:val="22"/>
+        </w:rPr>
+        <w:t>Home</w:t>
+      </w:r>
+    </w:p>
+    <w:p>
+      <w:pPr>
+        <w:pStyle w:val="Listaszerbekezds"/>
+        <w:numPr>
+          <w:ilvl w:val="2"/>
+          <w:numId w:val="13"/>
+        </w:numPr>
+        <w:spacing w:before="480" w:after="240"/>
+        <w:rPr>
+          <w:rFonts w:ascii="Lexend" w:hAnsi="Lexend"/>
+          <w:b/>
+          <w:bCs/>
+          <w:sz w:val="22"/>
+          <w:szCs w:val="22"/>
+        </w:rPr>
+      </w:pPr>
+      <w:r>
+        <w:rPr>
+          <w:rFonts w:ascii="Lexend" w:hAnsi="Lexend"/>
+          <w:sz w:val="22"/>
+          <w:szCs w:val="22"/>
+        </w:rPr>
+        <w:t>Grading queue</w:t>
+      </w:r>
+    </w:p>
+    <w:p>
+      <w:pPr>
+        <w:pStyle w:val="Listaszerbekezds"/>
+        <w:numPr>
+          <w:ilvl w:val="1"/>
+          <w:numId w:val="13"/>
+        </w:numPr>
+        <w:spacing w:before="480" w:after="240"/>
+        <w:rPr>
+          <w:rFonts w:ascii="Lexend" w:hAnsi="Lexend"/>
+          <w:b/>
+          <w:bCs/>
+          <w:sz w:val="22"/>
+          <w:szCs w:val="22"/>
+        </w:rPr>
+      </w:pPr>
+      <w:r>
+        <w:rPr>
+          <w:rFonts w:ascii="Lexend" w:hAnsi="Lexend"/>
+          <w:b/>
+          <w:bCs/>
+          <w:sz w:val="22"/>
+          <w:szCs w:val="22"/>
+        </w:rPr>
+        <w:t>My courses</w:t>
+      </w:r>
+      <w:r>
+        <w:rPr>
+          <w:rFonts w:ascii="Lexend" w:hAnsi="Lexend"/>
+          <w:b/>
+          <w:bCs/>
+          <w:sz w:val="22"/>
+          <w:szCs w:val="22"/>
+        </w:rPr>
+        <w:t xml:space="preserve"> (dashboard)</w:t>
+      </w:r>
+    </w:p>
+    <w:p>
+      <w:pPr>
+        <w:pStyle w:val="Listaszerbekezds"/>
+        <w:numPr>
+          <w:ilvl w:val="2"/>
+          <w:numId w:val="13"/>
+        </w:numPr>
+        <w:spacing w:before="480" w:after="240"/>
+        <w:rPr>
+          <w:rFonts w:ascii="Lexend" w:hAnsi="Lexend"/>
+          <w:b/>
+          <w:bCs/>
+          <w:sz w:val="22"/>
+          <w:szCs w:val="22"/>
+        </w:rPr>
+      </w:pPr>
+      <w:r>
+        <w:rPr>
+          <w:rFonts w:ascii="Lexend" w:hAnsi="Lexend"/>
+          <w:sz w:val="22"/>
+          <w:szCs w:val="22"/>
+        </w:rPr>
+        <w:t>Course overview - editor</w:t>
+      </w:r>
+    </w:p>
+    <w:p>
+      <w:pPr>
+        <w:pStyle w:val="Listaszerbekezds"/>
+        <w:numPr>
+          <w:ilvl w:val="2"/>
+          <w:numId w:val="13"/>
+        </w:numPr>
+        <w:spacing w:before="480" w:after="240"/>
+        <w:rPr>
+          <w:rFonts w:ascii="Lexend" w:hAnsi="Lexend"/>
+          <w:b/>
+          <w:bCs/>
+          <w:sz w:val="22"/>
+          <w:szCs w:val="22"/>
+        </w:rPr>
+      </w:pPr>
+      <w:r>
+        <w:rPr>
+          <w:rFonts w:ascii="Lexend" w:hAnsi="Lexend"/>
+          <w:sz w:val="22"/>
+          <w:szCs w:val="22"/>
+        </w:rPr>
+        <w:t>Learning path</w:t>
+      </w:r>
+    </w:p>
+    <w:p>
+      <w:pPr>
+        <w:pStyle w:val="Listaszerbekezds"/>
+        <w:numPr>
+          <w:ilvl w:val="3"/>
+          <w:numId w:val="13"/>
+        </w:numPr>
+        <w:spacing w:before="480" w:after="240"/>
+        <w:rPr>
+          <w:rFonts w:ascii="Lexend" w:hAnsi="Lexend"/>
+          <w:b/>
+          <w:bCs/>
+          <w:sz w:val="22"/>
+          <w:szCs w:val="22"/>
+        </w:rPr>
+      </w:pPr>
+      <w:r>
+        <w:rPr>
+          <w:rFonts w:ascii="Lexend" w:hAnsi="Lexend"/>
+          <w:sz w:val="22"/>
+          <w:szCs w:val="22"/>
+        </w:rPr>
+        <w:t>Community Thread page</w:t>
+      </w:r>
+    </w:p>
+    <w:p>
+      <w:pPr>
+        <w:pStyle w:val="Listaszerbekezds"/>
+        <w:numPr>
+          <w:ilvl w:val="3"/>
+          <w:numId w:val="13"/>
+        </w:numPr>
+        <w:spacing w:before="480" w:after="240"/>
+        <w:rPr>
+          <w:rFonts w:ascii="Lexend" w:hAnsi="Lexend"/>
+          <w:b/>
+          <w:bCs/>
+          <w:sz w:val="22"/>
+          <w:szCs w:val="22"/>
+        </w:rPr>
+      </w:pPr>
+      <w:r>
+        <w:rPr>
+          <w:rFonts w:ascii="Lexend" w:hAnsi="Lexend"/>
+          <w:sz w:val="22"/>
+          <w:szCs w:val="22"/>
+        </w:rPr>
+        <w:t>Unit editor</w:t>
+      </w:r>
+    </w:p>
+    <w:p>
+      <w:pPr>
+        <w:pStyle w:val="Listaszerbekezds"/>
+        <w:numPr>
+          <w:ilvl w:val="4"/>
+          <w:numId w:val="13"/>
+        </w:numPr>
+        <w:spacing w:before="480" w:after="240"/>
+        <w:rPr>
+          <w:rFonts w:ascii="Lexend" w:hAnsi="Lexend"/>
+          <w:b/>
+          <w:bCs/>
+          <w:sz w:val="22"/>
+          <w:szCs w:val="22"/>
+        </w:rPr>
+      </w:pPr>
+      <w:r>
+        <w:rPr>
+          <w:rFonts w:ascii="Lexend" w:hAnsi="Lexend"/>
+          <w:sz w:val="22"/>
+          <w:szCs w:val="22"/>
+        </w:rPr>
+        <w:t>Lesson editor</w:t>
+      </w:r>
+    </w:p>
+    <w:p>
+      <w:pPr>
+        <w:pStyle w:val="Listaszerbekezds"/>
+        <w:numPr>
+          <w:ilvl w:val="1"/>
+          <w:numId w:val="13"/>
+        </w:numPr>
+        <w:spacing w:before="480" w:after="240"/>
+        <w:rPr>
+          <w:rFonts w:ascii="Lexend" w:hAnsi="Lexend"/>
+          <w:b/>
+          <w:bCs/>
+          <w:sz w:val="22"/>
+          <w:szCs w:val="22"/>
+        </w:rPr>
+      </w:pPr>
+      <w:r>
+        <w:rPr>
+          <w:rFonts w:ascii="Lexend" w:hAnsi="Lexend"/>
+          <w:b/>
+          <w:bCs/>
+          <w:sz w:val="22"/>
+          <w:szCs w:val="22"/>
+        </w:rPr>
+        <w:t>Calendar</w:t>
+      </w:r>
+    </w:p>
+    <w:p>
+      <w:pPr>
+        <w:pStyle w:val="Listaszerbekezds"/>
+        <w:numPr>
+          <w:ilvl w:val="2"/>
+          <w:numId w:val="13"/>
+        </w:numPr>
+        <w:spacing w:before="480" w:after="240"/>
+        <w:rPr>
+          <w:rFonts w:ascii="Lexend" w:hAnsi="Lexend"/>
+          <w:b/>
+          <w:bCs/>
+          <w:sz w:val="22"/>
+          <w:szCs w:val="22"/>
+        </w:rPr>
+      </w:pPr>
+      <w:r>
+        <w:rPr>
+          <w:rFonts w:ascii="Lexend" w:hAnsi="Lexend"/>
+          <w:sz w:val="22"/>
+          <w:szCs w:val="22"/>
+        </w:rPr>
+        <w:t>Event details</w:t>
+      </w:r>
+    </w:p>
+    <w:p>
+      <w:pPr>
+        <w:pStyle w:val="Listaszerbekezds"/>
+        <w:numPr>
+          <w:ilvl w:val="1"/>
+          <w:numId w:val="13"/>
+        </w:numPr>
+        <w:spacing w:before="480" w:after="240"/>
+        <w:rPr>
+          <w:rFonts w:ascii="Lexend" w:hAnsi="Lexend"/>
+          <w:b/>
+          <w:bCs/>
+          <w:sz w:val="22"/>
+          <w:szCs w:val="22"/>
+        </w:rPr>
+      </w:pPr>
+      <w:r>
+        <w:rPr>
+          <w:rFonts w:ascii="Lexend" w:hAnsi="Lexend"/>
+          <w:b/>
+          <w:bCs/>
+          <w:sz w:val="22"/>
+          <w:szCs w:val="22"/>
+        </w:rPr>
+        <w:t>Students</w:t>
+      </w:r>
+    </w:p>
+    <w:p>
+      <w:pPr>
+        <w:pStyle w:val="Listaszerbekezds"/>
+        <w:numPr>
+          <w:ilvl w:val="2"/>
+          <w:numId w:val="13"/>
+        </w:numPr>
+        <w:spacing w:before="480" w:after="240"/>
+        <w:rPr>
+          <w:rFonts w:ascii="Lexend" w:hAnsi="Lexend"/>
+          <w:b/>
+          <w:bCs/>
+          <w:sz w:val="22"/>
+          <w:szCs w:val="22"/>
+        </w:rPr>
+      </w:pPr>
+      <w:r>
+        <w:rPr>
+          <w:rFonts w:ascii="Lexend" w:hAnsi="Lexend"/>
+          <w:sz w:val="22"/>
+          <w:szCs w:val="22"/>
+        </w:rPr>
+        <w:t>Student profile</w:t>
+      </w:r>
+    </w:p>
+    <w:p>
+      <w:pPr>
+        <w:pStyle w:val="Listaszerbekezds"/>
+        <w:numPr>
+          <w:ilvl w:val="2"/>
+          <w:numId w:val="13"/>
+        </w:numPr>
+        <w:spacing w:before="480" w:after="240"/>
+        <w:rPr>
+          <w:rFonts w:ascii="Lexend" w:hAnsi="Lexend"/>
+          <w:b/>
+          <w:bCs/>
+          <w:sz w:val="22"/>
+          <w:szCs w:val="22"/>
+        </w:rPr>
+      </w:pPr>
+      <w:r>
+        <w:rPr>
+          <w:rFonts w:ascii="Lexend" w:hAnsi="Lexend"/>
+          <w:sz w:val="22"/>
+          <w:szCs w:val="22"/>
+        </w:rPr>
+        <w:t>Tutoring wall</w:t>
+      </w:r>
+    </w:p>
+    <w:p>
+      <w:pPr>
+        <w:pStyle w:val="Listaszerbekezds"/>
+        <w:numPr>
+          <w:ilvl w:val="3"/>
+          <w:numId w:val="13"/>
+        </w:numPr>
+        <w:spacing w:before="480" w:after="240"/>
+        <w:rPr>
+          <w:rFonts w:ascii="Lexend" w:hAnsi="Lexend"/>
+          <w:b/>
+          <w:bCs/>
+          <w:sz w:val="22"/>
+          <w:szCs w:val="22"/>
+        </w:rPr>
+      </w:pPr>
+      <w:r>
+        <w:rPr>
+          <w:rFonts w:ascii="Lexend" w:hAnsi="Lexend"/>
+          <w:sz w:val="22"/>
+          <w:szCs w:val="22"/>
+        </w:rPr>
+        <w:t xml:space="preserve">Wall item </w:t>
+      </w:r>
+      <w:r>
+        <w:rPr>
+          <w:rFonts w:ascii="Lexend" w:hAnsi="Lexend"/>
+          <w:sz w:val="22"/>
+          <w:szCs w:val="22"/>
+        </w:rPr>
+        <w:t>page</w:t>
+      </w:r>
+    </w:p>
+    <w:p>
+      <w:pPr>
+        <w:pStyle w:val="Listaszerbekezds"/>
+        <w:numPr>
+          <w:ilvl w:val="1"/>
+          <w:numId w:val="13"/>
+        </w:numPr>
+        <w:spacing w:before="480" w:after="240"/>
+        <w:rPr>
+          <w:rFonts w:ascii="Lexend" w:hAnsi="Lexend"/>
+          <w:b/>
+          <w:bCs/>
+          <w:sz w:val="22"/>
+          <w:szCs w:val="22"/>
+        </w:rPr>
+      </w:pPr>
+      <w:r>
+        <w:rPr>
+          <w:rFonts w:ascii="Lexend" w:hAnsi="Lexend"/>
+          <w:b/>
+          <w:bCs/>
+          <w:sz w:val="22"/>
+          <w:szCs w:val="22"/>
+        </w:rPr>
+        <w:t>Finances</w:t>
+      </w:r>
+    </w:p>
+    <w:p>
+      <w:pPr>
+        <w:pStyle w:val="Listaszerbekezds"/>
+        <w:numPr>
+          <w:ilvl w:val="2"/>
+          <w:numId w:val="13"/>
+        </w:numPr>
+        <w:spacing w:before="480" w:after="240"/>
+        <w:rPr>
+          <w:rFonts w:ascii="Lexend" w:hAnsi="Lexend"/>
+          <w:b/>
+          <w:bCs/>
+          <w:sz w:val="22"/>
+          <w:szCs w:val="22"/>
+        </w:rPr>
+      </w:pPr>
+      <w:r>
+        <w:rPr>
+          <w:rFonts w:ascii="Lexend" w:hAnsi="Lexend"/>
+          <w:sz w:val="22"/>
+          <w:szCs w:val="22"/>
+        </w:rPr>
+        <w:t>Invoice details</w:t>
+      </w:r>
+    </w:p>
+    <w:p>
+      <w:pPr>
+        <w:pStyle w:val="Listaszerbekezds"/>
+        <w:numPr>
+          <w:ilvl w:val="1"/>
+          <w:numId w:val="13"/>
+        </w:numPr>
+        <w:spacing w:before="480" w:after="240"/>
+        <w:rPr>
+          <w:rFonts w:ascii="Lexend" w:hAnsi="Lexend"/>
+          <w:b/>
+          <w:bCs/>
+          <w:sz w:val="22"/>
+          <w:szCs w:val="22"/>
+        </w:rPr>
+      </w:pPr>
+      <w:r>
+        <w:rPr>
+          <w:rFonts w:ascii="Lexend" w:hAnsi="Lexend"/>
+          <w:b/>
+          <w:bCs/>
+          <w:sz w:val="22"/>
+          <w:szCs w:val="22"/>
+        </w:rPr>
+        <w:t>File</w:t>
+      </w:r>
+      <w:r>
+        <w:rPr>
+          <w:rFonts w:ascii="Lexend" w:hAnsi="Lexend"/>
+          <w:b/>
+          <w:bCs/>
+          <w:sz w:val="22"/>
+          <w:szCs w:val="22"/>
+        </w:rPr>
+        <w:t xml:space="preserve"> manager</w:t>
+      </w:r>
+    </w:p>
+    <w:p>
+      <w:pPr>
+        <w:pStyle w:val="Listaszerbekezds"/>
+        <w:numPr>
+          <w:ilvl w:val="2"/>
+          <w:numId w:val="13"/>
+        </w:numPr>
+        <w:spacing w:before="480" w:after="240"/>
+        <w:rPr>
+          <w:rFonts w:ascii="Lexend" w:hAnsi="Lexend"/>
+          <w:b/>
+          <w:bCs/>
+          <w:sz w:val="22"/>
+          <w:szCs w:val="22"/>
+        </w:rPr>
+      </w:pPr>
+      <w:r>
+        <w:rPr>
+          <w:rFonts w:ascii="Lexend" w:hAnsi="Lexend"/>
+          <w:sz w:val="22"/>
+          <w:szCs w:val="22"/>
+        </w:rPr>
+        <w:t>Content Item details</w:t>
+      </w:r>
+    </w:p>
+    <w:p>
+      <w:pPr>
+        <w:pStyle w:val="Listaszerbekezds"/>
+        <w:numPr>
+          <w:ilvl w:val="2"/>
+          <w:numId w:val="13"/>
+        </w:numPr>
+        <w:spacing w:before="480" w:after="240"/>
+        <w:rPr>
+          <w:rFonts w:ascii="Lexend" w:hAnsi="Lexend"/>
+          <w:b/>
+          <w:bCs/>
+          <w:sz w:val="22"/>
+          <w:szCs w:val="22"/>
+        </w:rPr>
+      </w:pPr>
+      <w:r>
+        <w:rPr>
+          <w:rFonts w:ascii="Lexend" w:hAnsi="Lexend"/>
+          <w:sz w:val="22"/>
+          <w:szCs w:val="22"/>
+        </w:rPr>
+        <w:t xml:space="preserve">Test </w:t>
+      </w:r>
+      <w:r>
+        <w:rPr>
+          <w:rFonts w:ascii="Lexend" w:hAnsi="Lexend"/>
+          <w:sz w:val="22"/>
+          <w:szCs w:val="22"/>
+        </w:rPr>
+        <w:t>editor</w:t>
+      </w:r>
+    </w:p>
+    <w:p>
+      <w:pPr>
+        <w:pStyle w:val="Listaszerbekezds"/>
+        <w:numPr>
+          <w:ilvl w:val="1"/>
+          <w:numId w:val="13"/>
+        </w:numPr>
+        <w:spacing w:before="480" w:after="240"/>
+        <w:rPr>
+          <w:rFonts w:ascii="Lexend" w:hAnsi="Lexend"/>
+          <w:b/>
+          <w:bCs/>
+          <w:sz w:val="22"/>
+          <w:szCs w:val="22"/>
+        </w:rPr>
+      </w:pPr>
+      <w:r>
+        <w:rPr>
+          <w:rFonts w:ascii="Lexend" w:hAnsi="Lexend"/>
+          <w:b/>
+          <w:bCs/>
+          <w:sz w:val="22"/>
+          <w:szCs w:val="22"/>
+        </w:rPr>
+        <w:t>Account settings</w:t>
+      </w:r>
+    </w:p>
+    <w:p>
+      <w:pPr>
+        <w:pStyle w:val="Listaszerbekezds"/>
+        <w:numPr>
+          <w:ilvl w:val="0"/>
+          <w:numId w:val="13"/>
+        </w:numPr>
+        <w:spacing w:before="480" w:after="240"/>
+        <w:rPr>
+          <w:rFonts w:ascii="Lexend" w:hAnsi="Lexend"/>
+          <w:b/>
+          <w:bCs/>
+          <w:sz w:val="22"/>
+          <w:szCs w:val="22"/>
+        </w:rPr>
+      </w:pPr>
+      <w:r>
+        <w:rPr>
+          <w:rFonts w:ascii="Lexend" w:hAnsi="Lexend"/>
+          <w:b/>
+          <w:bCs/>
+          <w:sz w:val="22"/>
+          <w:szCs w:val="22"/>
+        </w:rPr>
+        <w:t>Shared</w:t>
+      </w:r>
+    </w:p>
+    <w:p>
+      <w:pPr>
+        <w:pStyle w:val="Listaszerbekezds"/>
+        <w:numPr>
+          <w:ilvl w:val="1"/>
+          <w:numId w:val="13"/>
+        </w:numPr>
+        <w:spacing w:before="480" w:after="240"/>
+        <w:rPr>
+          <w:rFonts w:ascii="Lexend" w:hAnsi="Lexend"/>
+          <w:b/>
+          <w:bCs/>
+          <w:sz w:val="22"/>
+          <w:szCs w:val="22"/>
+        </w:rPr>
+      </w:pPr>
+      <w:r>
+        <w:rPr>
+          <w:rFonts w:ascii="Lexend" w:hAnsi="Lexend"/>
+          <w:b/>
+          <w:bCs/>
+          <w:sz w:val="22"/>
+          <w:szCs w:val="22"/>
+        </w:rPr>
+        <w:t>Course discovery (public too)</w:t>
+      </w:r>
+    </w:p>
+    <w:p>
+      <w:pPr>
+        <w:pStyle w:val="Listaszerbekezds"/>
+        <w:numPr>
+          <w:ilvl w:val="2"/>
+          <w:numId w:val="13"/>
+        </w:numPr>
+        <w:spacing w:before="480" w:after="240"/>
+        <w:rPr>
+          <w:rFonts w:ascii="Lexend" w:hAnsi="Lexend"/>
+          <w:b/>
+          <w:bCs/>
+          <w:sz w:val="22"/>
+          <w:szCs w:val="22"/>
+        </w:rPr>
+      </w:pPr>
+      <w:r>
+        <w:rPr>
+          <w:rFonts w:ascii="Lexend" w:hAnsi="Lexend"/>
+          <w:sz w:val="22"/>
+          <w:szCs w:val="22"/>
+        </w:rPr>
+        <w:t>Search Results</w:t>
+      </w:r>
+    </w:p>
+    <w:p>
+      <w:pPr>
+        <w:pStyle w:val="Listaszerbekezds"/>
+        <w:numPr>
+          <w:ilvl w:val="3"/>
+          <w:numId w:val="13"/>
+        </w:numPr>
+        <w:spacing w:before="480" w:after="240"/>
+        <w:rPr>
+          <w:rFonts w:ascii="Lexend" w:hAnsi="Lexend"/>
+          <w:b/>
+          <w:bCs/>
+          <w:sz w:val="22"/>
+          <w:szCs w:val="22"/>
+        </w:rPr>
+      </w:pPr>
+      <w:r>
+        <w:rPr>
+          <w:rFonts w:ascii="Lexend" w:hAnsi="Lexend"/>
+          <w:sz w:val="22"/>
+          <w:szCs w:val="22"/>
+        </w:rPr>
+        <w:t>Course overview page</w:t>
+      </w:r>
+    </w:p>
+    <w:p>
+      <w:pPr>
+        <w:pStyle w:val="Listaszerbekezds"/>
+        <w:numPr>
+          <w:ilvl w:val="3"/>
+          <w:numId w:val="13"/>
+        </w:numPr>
+        <w:spacing w:before="480" w:after="240"/>
+        <w:rPr>
+          <w:rFonts w:ascii="Lexend" w:hAnsi="Lexend"/>
+          <w:b/>
+          <w:bCs/>
+          <w:sz w:val="22"/>
+          <w:szCs w:val="22"/>
+        </w:rPr>
+      </w:pPr>
+      <w:r>
+        <w:rPr>
+          <w:rFonts w:ascii="Lexend" w:hAnsi="Lexend"/>
+          <w:sz w:val="22"/>
+          <w:szCs w:val="22"/>
+        </w:rPr>
+        <w:t>Teacher profile</w:t>
+      </w:r>
+    </w:p>
+    <w:p>
+      <w:pPr>
+        <w:pStyle w:val="Listaszerbekezds"/>
+        <w:numPr>
+          <w:ilvl w:val="1"/>
+          <w:numId w:val="13"/>
+        </w:numPr>
+        <w:spacing w:before="480" w:after="240"/>
+        <w:rPr>
+          <w:rFonts w:ascii="Lexend" w:hAnsi="Lexend"/>
+          <w:b/>
+          <w:bCs/>
+          <w:sz w:val="22"/>
+          <w:szCs w:val="22"/>
+        </w:rPr>
+      </w:pPr>
+      <w:r>
+        <w:rPr>
+          <w:rFonts w:ascii="Lexend" w:hAnsi="Lexend"/>
+          <w:b/>
+          <w:bCs/>
+          <w:sz w:val="22"/>
+          <w:szCs w:val="22"/>
+        </w:rPr>
+        <w:t>Notification center</w:t>
+      </w:r>
+    </w:p>
+    <w:p>
+      <w:pPr>
+        <w:pStyle w:val="Listaszerbekezds"/>
+        <w:numPr>
+          <w:ilvl w:val="2"/>
+          <w:numId w:val="13"/>
+        </w:numPr>
+        <w:spacing w:before="480" w:after="240"/>
+        <w:rPr>
+          <w:rFonts w:ascii="Lexend" w:hAnsi="Lexend"/>
+          <w:b/>
+          <w:bCs/>
+          <w:sz w:val="22"/>
+          <w:szCs w:val="22"/>
+        </w:rPr>
+      </w:pPr>
+      <w:r>
+        <w:rPr>
+          <w:rFonts w:ascii="Lexend" w:hAnsi="Lexend"/>
+          <w:sz w:val="22"/>
+          <w:szCs w:val="22"/>
+        </w:rPr>
+        <w:t>Notification details page</w:t>
+      </w:r>
+    </w:p>
+    <w:p>
+      <w:pPr>
+        <w:pBdr>
+          <w:bottom w:val="single" w:sz="4" w:space="1" w:color="auto"/>
+        </w:pBdr>
+        <w:rPr>
+          <w:rFonts w:ascii="Lexend" w:hAnsi="Lexend"/>
+        </w:rPr>
+      </w:pPr>
+    </w:p>
+    <w:p>
+      <w:pPr>
+        <w:pStyle w:val="Listaszerbekezds"/>
+        <w:numPr>
+          <w:ilvl w:val="0"/>
+          <w:numId w:val="1"/>
+        </w:numPr>
+        <w:spacing w:before="480" w:after="240"/>
+        <w:ind w:left="714" w:hanging="357"/>
+        <w:contextualSpacing w:val="0"/>
+        <w:rPr>
+          <w:rFonts w:ascii="Lexend" w:hAnsi="Lexend"/>
+          <w:b/>
+          <w:bCs/>
+          <w:sz w:val="32"/>
+          <w:szCs w:val="32"/>
+        </w:rPr>
+      </w:pPr>
+      <w:r>
+        <w:rPr>
+          <w:rFonts w:ascii="Lexend" w:hAnsi="Lexend"/>
+          <w:b/>
+          <w:bCs/>
+          <w:sz w:val="32"/>
+          <w:szCs w:val="32"/>
+        </w:rPr>
         <w:t>Page Contracts</w:t>
       </w:r>
     </w:p>
@@ -4441,6 +6264,7 @@
           <w:sz w:val="22"/>
           <w:szCs w:val="22"/>
         </w:rPr>
+        <w:lastRenderedPageBreak/>
         <w:t>Notifications</w:t>
       </w:r>
     </w:p>
@@ -5409,6 +7233,119 @@
     </w:lvl>
   </w:abstractNum>
   <w:abstractNum w:abstractNumId="4" w15:restartNumberingAfterBreak="0">
+    <w:nsid w:val="28D22FF3"/>
+    <w:multiLevelType w:val="hybridMultilevel"/>
+    <w:tmpl w:val="5B926338"/>
+    <w:lvl w:ilvl="0" w:tplc="040E0001">
+      <w:start w:val="1"/>
+      <w:numFmt w:val="bullet"/>
+      <w:lvlText w:val=""/>
+      <w:lvlJc w:val="left"/>
+      <w:pPr>
+        <w:ind w:left="720" w:hanging="360"/>
+      </w:pPr>
+      <w:rPr>
+        <w:rFonts w:ascii="Symbol" w:hAnsi="Symbol" w:hint="default"/>
+      </w:rPr>
+    </w:lvl>
+    <w:lvl w:ilvl="1" w:tplc="040E0003">
+      <w:start w:val="1"/>
+      <w:numFmt w:val="bullet"/>
+      <w:lvlText w:val="o"/>
+      <w:lvlJc w:val="left"/>
+      <w:pPr>
+        <w:ind w:left="1440" w:hanging="360"/>
+      </w:pPr>
+      <w:rPr>
+        <w:rFonts w:ascii="Courier New" w:hAnsi="Courier New" w:cs="Courier New" w:hint="default"/>
+      </w:rPr>
+    </w:lvl>
+    <w:lvl w:ilvl="2" w:tplc="040E0005">
+      <w:start w:val="1"/>
+      <w:numFmt w:val="bullet"/>
+      <w:lvlText w:val=""/>
+      <w:lvlJc w:val="left"/>
+      <w:pPr>
+        <w:ind w:left="2160" w:hanging="360"/>
+      </w:pPr>
+      <w:rPr>
+        <w:rFonts w:ascii="Wingdings" w:hAnsi="Wingdings" w:hint="default"/>
+      </w:rPr>
+    </w:lvl>
+    <w:lvl w:ilvl="3" w:tplc="040E0001">
+      <w:start w:val="1"/>
+      <w:numFmt w:val="bullet"/>
+      <w:lvlText w:val=""/>
+      <w:lvlJc w:val="left"/>
+      <w:pPr>
+        <w:ind w:left="2880" w:hanging="360"/>
+      </w:pPr>
+      <w:rPr>
+        <w:rFonts w:ascii="Symbol" w:hAnsi="Symbol" w:hint="default"/>
+      </w:rPr>
+    </w:lvl>
+    <w:lvl w:ilvl="4" w:tplc="040E0003">
+      <w:start w:val="1"/>
+      <w:numFmt w:val="bullet"/>
+      <w:lvlText w:val="o"/>
+      <w:lvlJc w:val="left"/>
+      <w:pPr>
+        <w:ind w:left="3600" w:hanging="360"/>
+      </w:pPr>
+      <w:rPr>
+        <w:rFonts w:ascii="Courier New" w:hAnsi="Courier New" w:cs="Courier New" w:hint="default"/>
+      </w:rPr>
+    </w:lvl>
+    <w:lvl w:ilvl="5" w:tplc="040E0005" w:tentative="1">
+      <w:start w:val="1"/>
+      <w:numFmt w:val="bullet"/>
+      <w:lvlText w:val=""/>
+      <w:lvlJc w:val="left"/>
+      <w:pPr>
+        <w:ind w:left="4320" w:hanging="360"/>
+      </w:pPr>
+      <w:rPr>
+        <w:rFonts w:ascii="Wingdings" w:hAnsi="Wingdings" w:hint="default"/>
+      </w:rPr>
+    </w:lvl>
+    <w:lvl w:ilvl="6" w:tplc="040E0001" w:tentative="1">
+      <w:start w:val="1"/>
+      <w:numFmt w:val="bullet"/>
+      <w:lvlText w:val=""/>
+      <w:lvlJc w:val="left"/>
+      <w:pPr>
+        <w:ind w:left="5040" w:hanging="360"/>
+      </w:pPr>
+      <w:rPr>
+        <w:rFonts w:ascii="Symbol" w:hAnsi="Symbol" w:hint="default"/>
+      </w:rPr>
+    </w:lvl>
+    <w:lvl w:ilvl="7" w:tplc="040E0003" w:tentative="1">
+      <w:start w:val="1"/>
+      <w:numFmt w:val="bullet"/>
+      <w:lvlText w:val="o"/>
+      <w:lvlJc w:val="left"/>
+      <w:pPr>
+        <w:ind w:left="5760" w:hanging="360"/>
+      </w:pPr>
+      <w:rPr>
+        <w:rFonts w:ascii="Courier New" w:hAnsi="Courier New" w:cs="Courier New" w:hint="default"/>
+      </w:rPr>
+    </w:lvl>
+    <w:lvl w:ilvl="8" w:tplc="040E0005" w:tentative="1">
+      <w:start w:val="1"/>
+      <w:numFmt w:val="bullet"/>
+      <w:lvlText w:val=""/>
+      <w:lvlJc w:val="left"/>
+      <w:pPr>
+        <w:ind w:left="6480" w:hanging="360"/>
+      </w:pPr>
+      <w:rPr>
+        <w:rFonts w:ascii="Wingdings" w:hAnsi="Wingdings" w:hint="default"/>
+      </w:rPr>
+    </w:lvl>
+  </w:abstractNum>
+  <w:abstractNum w:abstractNumId="5" w15:restartNumberingAfterBreak="0">
     <w:nsid w:val="28DC3C73"/>
     <w:multiLevelType w:val="hybridMultilevel"/>
     <w:tmpl w:val="E5684A8A"/>
@@ -5520,7 +7457,7 @@
       </w:rPr>
     </w:lvl>
   </w:abstractNum>
-  <w:abstractNum w:abstractNumId="5" w15:restartNumberingAfterBreak="0">
+  <w:abstractNum w:abstractNumId="6" w15:restartNumberingAfterBreak="0">
     <w:nsid w:val="30DE5EC7"/>
     <w:multiLevelType w:val="hybridMultilevel"/>
     <w:tmpl w:val="612434B2"/>
@@ -5633,7 +7570,7 @@
       </w:rPr>
     </w:lvl>
   </w:abstractNum>
-  <w:abstractNum w:abstractNumId="6" w15:restartNumberingAfterBreak="0">
+  <w:abstractNum w:abstractNumId="7" w15:restartNumberingAfterBreak="0">
     <w:nsid w:val="33591C4B"/>
     <w:multiLevelType w:val="hybridMultilevel"/>
     <w:tmpl w:val="26DAF10E"/>
@@ -5746,7 +7683,7 @@
       </w:rPr>
     </w:lvl>
   </w:abstractNum>
-  <w:abstractNum w:abstractNumId="7" w15:restartNumberingAfterBreak="0">
+  <w:abstractNum w:abstractNumId="8" w15:restartNumberingAfterBreak="0">
     <w:nsid w:val="395819B0"/>
     <w:multiLevelType w:val="multilevel"/>
     <w:tmpl w:val="040E001F"/>
@@ -5835,7 +7772,7 @@
       </w:pPr>
     </w:lvl>
   </w:abstractNum>
-  <w:abstractNum w:abstractNumId="8" w15:restartNumberingAfterBreak="0">
+  <w:abstractNum w:abstractNumId="9" w15:restartNumberingAfterBreak="0">
     <w:nsid w:val="43F30B99"/>
     <w:multiLevelType w:val="hybridMultilevel"/>
     <w:tmpl w:val="4C968CF6"/>
@@ -5948,7 +7885,120 @@
       </w:rPr>
     </w:lvl>
   </w:abstractNum>
-  <w:abstractNum w:abstractNumId="9" w15:restartNumberingAfterBreak="0">
+  <w:abstractNum w:abstractNumId="10" w15:restartNumberingAfterBreak="0">
+    <w:nsid w:val="461C5FD4"/>
+    <w:multiLevelType w:val="hybridMultilevel"/>
+    <w:tmpl w:val="328C8114"/>
+    <w:lvl w:ilvl="0" w:tplc="040E0001">
+      <w:start w:val="1"/>
+      <w:numFmt w:val="bullet"/>
+      <w:lvlText w:val=""/>
+      <w:lvlJc w:val="left"/>
+      <w:pPr>
+        <w:ind w:left="720" w:hanging="360"/>
+      </w:pPr>
+      <w:rPr>
+        <w:rFonts w:ascii="Symbol" w:hAnsi="Symbol" w:hint="default"/>
+      </w:rPr>
+    </w:lvl>
+    <w:lvl w:ilvl="1" w:tplc="040E0003" w:tentative="1">
+      <w:start w:val="1"/>
+      <w:numFmt w:val="bullet"/>
+      <w:lvlText w:val="o"/>
+      <w:lvlJc w:val="left"/>
+      <w:pPr>
+        <w:ind w:left="1440" w:hanging="360"/>
+      </w:pPr>
+      <w:rPr>
+        <w:rFonts w:ascii="Courier New" w:hAnsi="Courier New" w:cs="Courier New" w:hint="default"/>
+      </w:rPr>
+    </w:lvl>
+    <w:lvl w:ilvl="2" w:tplc="040E0005" w:tentative="1">
+      <w:start w:val="1"/>
+      <w:numFmt w:val="bullet"/>
+      <w:lvlText w:val=""/>
+      <w:lvlJc w:val="left"/>
+      <w:pPr>
+        <w:ind w:left="2160" w:hanging="360"/>
+      </w:pPr>
+      <w:rPr>
+        <w:rFonts w:ascii="Wingdings" w:hAnsi="Wingdings" w:hint="default"/>
+      </w:rPr>
+    </w:lvl>
+    <w:lvl w:ilvl="3" w:tplc="040E0001" w:tentative="1">
+      <w:start w:val="1"/>
+      <w:numFmt w:val="bullet"/>
+      <w:lvlText w:val=""/>
+      <w:lvlJc w:val="left"/>
+      <w:pPr>
+        <w:ind w:left="2880" w:hanging="360"/>
+      </w:pPr>
+      <w:rPr>
+        <w:rFonts w:ascii="Symbol" w:hAnsi="Symbol" w:hint="default"/>
+      </w:rPr>
+    </w:lvl>
+    <w:lvl w:ilvl="4" w:tplc="040E0003" w:tentative="1">
+      <w:start w:val="1"/>
+      <w:numFmt w:val="bullet"/>
+      <w:lvlText w:val="o"/>
+      <w:lvlJc w:val="left"/>
+      <w:pPr>
+        <w:ind w:left="3600" w:hanging="360"/>
+      </w:pPr>
+      <w:rPr>
+        <w:rFonts w:ascii="Courier New" w:hAnsi="Courier New" w:cs="Courier New" w:hint="default"/>
+      </w:rPr>
+    </w:lvl>
+    <w:lvl w:ilvl="5" w:tplc="040E0005" w:tentative="1">
+      <w:start w:val="1"/>
+      <w:numFmt w:val="bullet"/>
+      <w:lvlText w:val=""/>
+      <w:lvlJc w:val="left"/>
+      <w:pPr>
+        <w:ind w:left="4320" w:hanging="360"/>
+      </w:pPr>
+      <w:rPr>
+        <w:rFonts w:ascii="Wingdings" w:hAnsi="Wingdings" w:hint="default"/>
+      </w:rPr>
+    </w:lvl>
+    <w:lvl w:ilvl="6" w:tplc="040E0001" w:tentative="1">
+      <w:start w:val="1"/>
+      <w:numFmt w:val="bullet"/>
+      <w:lvlText w:val=""/>
+      <w:lvlJc w:val="left"/>
+      <w:pPr>
+        <w:ind w:left="5040" w:hanging="360"/>
+      </w:pPr>
+      <w:rPr>
+        <w:rFonts w:ascii="Symbol" w:hAnsi="Symbol" w:hint="default"/>
+      </w:rPr>
+    </w:lvl>
+    <w:lvl w:ilvl="7" w:tplc="040E0003" w:tentative="1">
+      <w:start w:val="1"/>
+      <w:numFmt w:val="bullet"/>
+      <w:lvlText w:val="o"/>
+      <w:lvlJc w:val="left"/>
+      <w:pPr>
+        <w:ind w:left="5760" w:hanging="360"/>
+      </w:pPr>
+      <w:rPr>
+        <w:rFonts w:ascii="Courier New" w:hAnsi="Courier New" w:cs="Courier New" w:hint="default"/>
+      </w:rPr>
+    </w:lvl>
+    <w:lvl w:ilvl="8" w:tplc="040E0005" w:tentative="1">
+      <w:start w:val="1"/>
+      <w:numFmt w:val="bullet"/>
+      <w:lvlText w:val=""/>
+      <w:lvlJc w:val="left"/>
+      <w:pPr>
+        <w:ind w:left="6480" w:hanging="360"/>
+      </w:pPr>
+      <w:rPr>
+        <w:rFonts w:ascii="Wingdings" w:hAnsi="Wingdings" w:hint="default"/>
+      </w:rPr>
+    </w:lvl>
+  </w:abstractNum>
+  <w:abstractNum w:abstractNumId="11" w15:restartNumberingAfterBreak="0">
     <w:nsid w:val="554D282F"/>
     <w:multiLevelType w:val="hybridMultilevel"/>
     <w:tmpl w:val="9F760762"/>
@@ -6061,23 +8111,136 @@
       </w:rPr>
     </w:lvl>
   </w:abstractNum>
+  <w:abstractNum w:abstractNumId="12" w15:restartNumberingAfterBreak="0">
+    <w:nsid w:val="65717CAF"/>
+    <w:multiLevelType w:val="hybridMultilevel"/>
+    <w:tmpl w:val="10328C0E"/>
+    <w:lvl w:ilvl="0" w:tplc="040E0001">
+      <w:start w:val="1"/>
+      <w:numFmt w:val="bullet"/>
+      <w:lvlText w:val=""/>
+      <w:lvlJc w:val="left"/>
+      <w:pPr>
+        <w:ind w:left="1440" w:hanging="360"/>
+      </w:pPr>
+      <w:rPr>
+        <w:rFonts w:ascii="Symbol" w:hAnsi="Symbol" w:hint="default"/>
+      </w:rPr>
+    </w:lvl>
+    <w:lvl w:ilvl="1" w:tplc="040E0003" w:tentative="1">
+      <w:start w:val="1"/>
+      <w:numFmt w:val="bullet"/>
+      <w:lvlText w:val="o"/>
+      <w:lvlJc w:val="left"/>
+      <w:pPr>
+        <w:ind w:left="2160" w:hanging="360"/>
+      </w:pPr>
+      <w:rPr>
+        <w:rFonts w:ascii="Courier New" w:hAnsi="Courier New" w:cs="Courier New" w:hint="default"/>
+      </w:rPr>
+    </w:lvl>
+    <w:lvl w:ilvl="2" w:tplc="040E0005" w:tentative="1">
+      <w:start w:val="1"/>
+      <w:numFmt w:val="bullet"/>
+      <w:lvlText w:val=""/>
+      <w:lvlJc w:val="left"/>
+      <w:pPr>
+        <w:ind w:left="2880" w:hanging="360"/>
+      </w:pPr>
+      <w:rPr>
+        <w:rFonts w:ascii="Wingdings" w:hAnsi="Wingdings" w:hint="default"/>
+      </w:rPr>
+    </w:lvl>
+    <w:lvl w:ilvl="3" w:tplc="040E0001" w:tentative="1">
+      <w:start w:val="1"/>
+      <w:numFmt w:val="bullet"/>
+      <w:lvlText w:val=""/>
+      <w:lvlJc w:val="left"/>
+      <w:pPr>
+        <w:ind w:left="3600" w:hanging="360"/>
+      </w:pPr>
+      <w:rPr>
+        <w:rFonts w:ascii="Symbol" w:hAnsi="Symbol" w:hint="default"/>
+      </w:rPr>
+    </w:lvl>
+    <w:lvl w:ilvl="4" w:tplc="040E0003" w:tentative="1">
+      <w:start w:val="1"/>
+      <w:numFmt w:val="bullet"/>
+      <w:lvlText w:val="o"/>
+      <w:lvlJc w:val="left"/>
+      <w:pPr>
+        <w:ind w:left="4320" w:hanging="360"/>
+      </w:pPr>
+      <w:rPr>
+        <w:rFonts w:ascii="Courier New" w:hAnsi="Courier New" w:cs="Courier New" w:hint="default"/>
+      </w:rPr>
+    </w:lvl>
+    <w:lvl w:ilvl="5" w:tplc="040E0005" w:tentative="1">
+      <w:start w:val="1"/>
+      <w:numFmt w:val="bullet"/>
+      <w:lvlText w:val=""/>
+      <w:lvlJc w:val="left"/>
+      <w:pPr>
+        <w:ind w:left="5040" w:hanging="360"/>
+      </w:pPr>
+      <w:rPr>
+        <w:rFonts w:ascii="Wingdings" w:hAnsi="Wingdings" w:hint="default"/>
+      </w:rPr>
+    </w:lvl>
+    <w:lvl w:ilvl="6" w:tplc="040E0001" w:tentative="1">
+      <w:start w:val="1"/>
+      <w:numFmt w:val="bullet"/>
+      <w:lvlText w:val=""/>
+      <w:lvlJc w:val="left"/>
+      <w:pPr>
+        <w:ind w:left="5760" w:hanging="360"/>
+      </w:pPr>
+      <w:rPr>
+        <w:rFonts w:ascii="Symbol" w:hAnsi="Symbol" w:hint="default"/>
+      </w:rPr>
+    </w:lvl>
+    <w:lvl w:ilvl="7" w:tplc="040E0003" w:tentative="1">
+      <w:start w:val="1"/>
+      <w:numFmt w:val="bullet"/>
+      <w:lvlText w:val="o"/>
+      <w:lvlJc w:val="left"/>
+      <w:pPr>
+        <w:ind w:left="6480" w:hanging="360"/>
+      </w:pPr>
+      <w:rPr>
+        <w:rFonts w:ascii="Courier New" w:hAnsi="Courier New" w:cs="Courier New" w:hint="default"/>
+      </w:rPr>
+    </w:lvl>
+    <w:lvl w:ilvl="8" w:tplc="040E0005" w:tentative="1">
+      <w:start w:val="1"/>
+      <w:numFmt w:val="bullet"/>
+      <w:lvlText w:val=""/>
+      <w:lvlJc w:val="left"/>
+      <w:pPr>
+        <w:ind w:left="7200" w:hanging="360"/>
+      </w:pPr>
+      <w:rPr>
+        <w:rFonts w:ascii="Wingdings" w:hAnsi="Wingdings" w:hint="default"/>
+      </w:rPr>
+    </w:lvl>
+  </w:abstractNum>
   <w:num w:numId="1" w16cid:durableId="1218712015">
-    <w:abstractNumId w:val="7"/>
+    <w:abstractNumId w:val="8"/>
   </w:num>
   <w:num w:numId="2" w16cid:durableId="1028340223">
-    <w:abstractNumId w:val="5"/>
+    <w:abstractNumId w:val="6"/>
   </w:num>
   <w:num w:numId="3" w16cid:durableId="932205223">
     <w:abstractNumId w:val="1"/>
   </w:num>
   <w:num w:numId="4" w16cid:durableId="716129479">
-    <w:abstractNumId w:val="9"/>
+    <w:abstractNumId w:val="11"/>
   </w:num>
   <w:num w:numId="5" w16cid:durableId="1570651145">
-    <w:abstractNumId w:val="4"/>
+    <w:abstractNumId w:val="5"/>
   </w:num>
   <w:num w:numId="6" w16cid:durableId="182941848">
-    <w:abstractNumId w:val="6"/>
+    <w:abstractNumId w:val="7"/>
   </w:num>
   <w:num w:numId="7" w16cid:durableId="2049796914">
     <w:abstractNumId w:val="3"/>
@@ -6089,7 +8252,16 @@
     <w:abstractNumId w:val="2"/>
   </w:num>
   <w:num w:numId="10" w16cid:durableId="1890073628">
-    <w:abstractNumId w:val="8"/>
+    <w:abstractNumId w:val="9"/>
+  </w:num>
+  <w:num w:numId="11" w16cid:durableId="1445732595">
+    <w:abstractNumId w:val="10"/>
+  </w:num>
+  <w:num w:numId="12" w16cid:durableId="1504971705">
+    <w:abstractNumId w:val="12"/>
+  </w:num>
+  <w:num w:numId="13" w16cid:durableId="709308896">
+    <w:abstractNumId w:val="4"/>
   </w:num>
 </w:numbering>
 </file>

</xml_diff>

<commit_message>
Docs - refining sitemap in SAD
</commit_message>
<xml_diff>
--- a/Dev docs/Software_Architecture_Document.docx
+++ b/Dev docs/Software_Architecture_Document.docx
@@ -128,18 +128,8 @@
           <w:sz w:val="22"/>
           <w:szCs w:val="22"/>
         </w:rPr>
-        <w:t>routing, Proxy/</w:t>
-      </w:r>
-      <w:proofErr w:type="spellStart"/>
-      <w:r>
-        <w:rPr>
-          <w:rFonts w:ascii="Lexend Light" w:hAnsi="Lexend Light"/>
-          <w:sz w:val="22"/>
-          <w:szCs w:val="22"/>
-        </w:rPr>
-        <w:t>BackendForFrontend</w:t>
-      </w:r>
-      <w:proofErr w:type="spellEnd"/>
+        <w:t>routing, Proxy/BackendForFrontend</w:t>
+      </w:r>
     </w:p>
     <w:p>
       <w:pPr>
@@ -154,7 +144,6 @@
           <w:szCs w:val="22"/>
         </w:rPr>
       </w:pPr>
-      <w:proofErr w:type="spellStart"/>
       <w:r>
         <w:rPr>
           <w:rFonts w:ascii="Lexend" w:hAnsi="Lexend"/>
@@ -163,7 +152,6 @@
         </w:rPr>
         <w:t>TailwindCSS</w:t>
       </w:r>
-      <w:proofErr w:type="spellEnd"/>
     </w:p>
     <w:p>
       <w:pPr>
@@ -208,23 +196,13 @@
           <w:szCs w:val="22"/>
         </w:rPr>
       </w:pPr>
-      <w:proofErr w:type="spellStart"/>
-      <w:r>
-        <w:rPr>
-          <w:rFonts w:ascii="Lexend" w:hAnsi="Lexend"/>
-          <w:sz w:val="22"/>
-          <w:szCs w:val="22"/>
-        </w:rPr>
-        <w:t>ShadCN</w:t>
-      </w:r>
-      <w:proofErr w:type="spellEnd"/>
-      <w:r>
-        <w:rPr>
-          <w:rFonts w:ascii="Lexend" w:hAnsi="Lexend"/>
-          <w:sz w:val="22"/>
-          <w:szCs w:val="22"/>
-        </w:rPr>
-        <w:t xml:space="preserve"> (UI library)</w:t>
+      <w:r>
+        <w:rPr>
+          <w:rFonts w:ascii="Lexend" w:hAnsi="Lexend"/>
+          <w:sz w:val="22"/>
+          <w:szCs w:val="22"/>
+        </w:rPr>
+        <w:t>ShadCN (UI library)</w:t>
       </w:r>
     </w:p>
     <w:p>
@@ -4837,6 +4815,31 @@
       <w:pPr>
         <w:pStyle w:val="Listaszerbekezds"/>
         <w:numPr>
+          <w:ilvl w:val="5"/>
+          <w:numId w:val="13"/>
+        </w:numPr>
+        <w:spacing w:before="480" w:after="240"/>
+        <w:rPr>
+          <w:rFonts w:ascii="Lexend" w:hAnsi="Lexend"/>
+          <w:b/>
+          <w:bCs/>
+          <w:sz w:val="22"/>
+          <w:szCs w:val="22"/>
+        </w:rPr>
+      </w:pPr>
+      <w:r>
+        <w:rPr>
+          <w:rFonts w:ascii="Lexend" w:hAnsi="Lexend"/>
+          <w:sz w:val="22"/>
+          <w:szCs w:val="22"/>
+        </w:rPr>
+        <w:t>Submission details page</w:t>
+      </w:r>
+    </w:p>
+    <w:p>
+      <w:pPr>
+        <w:pStyle w:val="Listaszerbekezds"/>
+        <w:numPr>
           <w:ilvl w:val="4"/>
           <w:numId w:val="13"/>
         </w:numPr>
@@ -4978,6 +4981,31 @@
       <w:pPr>
         <w:pStyle w:val="Listaszerbekezds"/>
         <w:numPr>
+          <w:ilvl w:val="5"/>
+          <w:numId w:val="13"/>
+        </w:numPr>
+        <w:spacing w:before="480" w:after="240"/>
+        <w:rPr>
+          <w:rFonts w:ascii="Lexend" w:hAnsi="Lexend"/>
+          <w:b/>
+          <w:bCs/>
+          <w:sz w:val="22"/>
+          <w:szCs w:val="22"/>
+        </w:rPr>
+      </w:pPr>
+      <w:r>
+        <w:rPr>
+          <w:rFonts w:ascii="Lexend" w:hAnsi="Lexend"/>
+          <w:sz w:val="22"/>
+          <w:szCs w:val="22"/>
+        </w:rPr>
+        <w:t>Submission details page</w:t>
+      </w:r>
+    </w:p>
+    <w:p>
+      <w:pPr>
+        <w:pStyle w:val="Listaszerbekezds"/>
+        <w:numPr>
           <w:ilvl w:val="4"/>
           <w:numId w:val="13"/>
         </w:numPr>
@@ -5226,6 +5254,7 @@
           <w:sz w:val="22"/>
           <w:szCs w:val="22"/>
         </w:rPr>
+        <w:lastRenderedPageBreak/>
         <w:t>Finances</w:t>
       </w:r>
     </w:p>
@@ -5278,7 +5307,6 @@
           <w:sz w:val="22"/>
           <w:szCs w:val="22"/>
         </w:rPr>
-        <w:lastRenderedPageBreak/>
         <w:t>Account settings</w:t>
       </w:r>
     </w:p>
@@ -5360,6 +5388,14 @@
         </w:rPr>
         <w:t>Grading queue</w:t>
       </w:r>
+      <w:r>
+        <w:rPr>
+          <w:rFonts w:ascii="Lexend" w:hAnsi="Lexend"/>
+          <w:sz w:val="22"/>
+          <w:szCs w:val="22"/>
+        </w:rPr>
+        <w:t xml:space="preserve"> page</w:t>
+      </w:r>
     </w:p>
     <w:p>
       <w:pPr>
@@ -5527,6 +5563,81 @@
       <w:pPr>
         <w:pStyle w:val="Listaszerbekezds"/>
         <w:numPr>
+          <w:ilvl w:val="3"/>
+          <w:numId w:val="13"/>
+        </w:numPr>
+        <w:spacing w:before="480" w:after="240"/>
+        <w:rPr>
+          <w:rFonts w:ascii="Lexend" w:hAnsi="Lexend"/>
+          <w:b/>
+          <w:bCs/>
+          <w:sz w:val="22"/>
+          <w:szCs w:val="22"/>
+        </w:rPr>
+      </w:pPr>
+      <w:r>
+        <w:rPr>
+          <w:rFonts w:ascii="Lexend" w:hAnsi="Lexend"/>
+          <w:sz w:val="22"/>
+          <w:szCs w:val="22"/>
+        </w:rPr>
+        <w:t>Enrollments page</w:t>
+      </w:r>
+    </w:p>
+    <w:p>
+      <w:pPr>
+        <w:pStyle w:val="Listaszerbekezds"/>
+        <w:numPr>
+          <w:ilvl w:val="4"/>
+          <w:numId w:val="13"/>
+        </w:numPr>
+        <w:spacing w:before="480" w:after="240"/>
+        <w:rPr>
+          <w:rFonts w:ascii="Lexend" w:hAnsi="Lexend"/>
+          <w:b/>
+          <w:bCs/>
+          <w:sz w:val="22"/>
+          <w:szCs w:val="22"/>
+        </w:rPr>
+      </w:pPr>
+      <w:r>
+        <w:rPr>
+          <w:rFonts w:ascii="Lexend" w:hAnsi="Lexend"/>
+          <w:sz w:val="22"/>
+          <w:szCs w:val="22"/>
+        </w:rPr>
+        <w:t>Student profile</w:t>
+      </w:r>
+    </w:p>
+    <w:p>
+      <w:pPr>
+        <w:pStyle w:val="Listaszerbekezds"/>
+        <w:numPr>
+          <w:ilvl w:val="4"/>
+          <w:numId w:val="13"/>
+        </w:numPr>
+        <w:spacing w:before="480" w:after="240"/>
+        <w:rPr>
+          <w:rFonts w:ascii="Lexend" w:hAnsi="Lexend"/>
+          <w:b/>
+          <w:bCs/>
+          <w:sz w:val="22"/>
+          <w:szCs w:val="22"/>
+        </w:rPr>
+      </w:pPr>
+      <w:r>
+        <w:rPr>
+          <w:rFonts w:ascii="Lexend" w:hAnsi="Lexend"/>
+          <w:sz w:val="22"/>
+          <w:szCs w:val="22"/>
+        </w:rPr>
+        <w:t>Submission grader page</w:t>
+      </w:r>
+    </w:p>
+    <w:p>
+      <w:pPr>
+        <w:pStyle w:val="Listaszerbekezds"/>
+        <w:numPr>
           <w:ilvl w:val="1"/>
           <w:numId w:val="13"/>
         </w:numPr>
@@ -5683,6 +5794,31 @@
           <w:szCs w:val="22"/>
         </w:rPr>
         <w:t>page</w:t>
+      </w:r>
+    </w:p>
+    <w:p>
+      <w:pPr>
+        <w:pStyle w:val="Listaszerbekezds"/>
+        <w:numPr>
+          <w:ilvl w:val="4"/>
+          <w:numId w:val="13"/>
+        </w:numPr>
+        <w:spacing w:before="480" w:after="240"/>
+        <w:rPr>
+          <w:rFonts w:ascii="Lexend" w:hAnsi="Lexend"/>
+          <w:b/>
+          <w:bCs/>
+          <w:sz w:val="22"/>
+          <w:szCs w:val="22"/>
+        </w:rPr>
+      </w:pPr>
+      <w:r>
+        <w:rPr>
+          <w:rFonts w:ascii="Lexend" w:hAnsi="Lexend"/>
+          <w:sz w:val="22"/>
+          <w:szCs w:val="22"/>
+        </w:rPr>
+        <w:t>Submission grader page</w:t>
       </w:r>
     </w:p>
     <w:p>
@@ -6149,6 +6285,7 @@
           <w:sz w:val="22"/>
           <w:szCs w:val="22"/>
         </w:rPr>
+        <w:lastRenderedPageBreak/>
         <w:t xml:space="preserve">Data it needs: </w:t>
       </w:r>
     </w:p>
@@ -6264,7 +6401,6 @@
           <w:sz w:val="22"/>
           <w:szCs w:val="22"/>
         </w:rPr>
-        <w:lastRenderedPageBreak/>
         <w:t>Notifications</w:t>
       </w:r>
     </w:p>
@@ -7296,7 +7432,7 @@
         <w:rFonts w:ascii="Courier New" w:hAnsi="Courier New" w:cs="Courier New" w:hint="default"/>
       </w:rPr>
     </w:lvl>
-    <w:lvl w:ilvl="5" w:tplc="040E0005" w:tentative="1">
+    <w:lvl w:ilvl="5" w:tplc="040E0005">
       <w:start w:val="1"/>
       <w:numFmt w:val="bullet"/>
       <w:lvlText w:val=""/>
@@ -8873,6 +9009,7 @@
   <w:style w:type="character" w:default="1" w:styleId="Bekezdsalapbettpusa">
     <w:name w:val="Default Paragraph Font"/>
     <w:uiPriority w:val="1"/>
+    <w:semiHidden/>
     <w:unhideWhenUsed/>
   </w:style>
   <w:style w:type="table" w:default="1" w:styleId="Normltblzat">

</xml_diff>

<commit_message>
Docs - started page contracts, with json schemas
</commit_message>
<xml_diff>
--- a/Dev docs/Software_Architecture_Document.docx
+++ b/Dev docs/Software_Architecture_Document.docx
@@ -128,8 +128,18 @@
           <w:sz w:val="22"/>
           <w:szCs w:val="22"/>
         </w:rPr>
-        <w:t>routing, Proxy/BackendForFrontend</w:t>
-      </w:r>
+        <w:t>routing, Proxy/</w:t>
+      </w:r>
+      <w:proofErr w:type="spellStart"/>
+      <w:r>
+        <w:rPr>
+          <w:rFonts w:ascii="Lexend Light" w:hAnsi="Lexend Light"/>
+          <w:sz w:val="22"/>
+          <w:szCs w:val="22"/>
+        </w:rPr>
+        <w:t>BackendForFrontend</w:t>
+      </w:r>
+      <w:proofErr w:type="spellEnd"/>
     </w:p>
     <w:p>
       <w:pPr>
@@ -144,6 +154,7 @@
           <w:szCs w:val="22"/>
         </w:rPr>
       </w:pPr>
+      <w:proofErr w:type="spellStart"/>
       <w:r>
         <w:rPr>
           <w:rFonts w:ascii="Lexend" w:hAnsi="Lexend"/>
@@ -152,6 +163,7 @@
         </w:rPr>
         <w:t>TailwindCSS</w:t>
       </w:r>
+      <w:proofErr w:type="spellEnd"/>
     </w:p>
     <w:p>
       <w:pPr>
@@ -196,13 +208,23 @@
           <w:szCs w:val="22"/>
         </w:rPr>
       </w:pPr>
-      <w:r>
-        <w:rPr>
-          <w:rFonts w:ascii="Lexend" w:hAnsi="Lexend"/>
-          <w:sz w:val="22"/>
-          <w:szCs w:val="22"/>
-        </w:rPr>
-        <w:t>ShadCN (UI library)</w:t>
+      <w:proofErr w:type="spellStart"/>
+      <w:r>
+        <w:rPr>
+          <w:rFonts w:ascii="Lexend" w:hAnsi="Lexend"/>
+          <w:sz w:val="22"/>
+          <w:szCs w:val="22"/>
+        </w:rPr>
+        <w:t>ShadCN</w:t>
+      </w:r>
+      <w:proofErr w:type="spellEnd"/>
+      <w:r>
+        <w:rPr>
+          <w:rFonts w:ascii="Lexend" w:hAnsi="Lexend"/>
+          <w:sz w:val="22"/>
+          <w:szCs w:val="22"/>
+        </w:rPr>
+        <w:t xml:space="preserve"> (UI library)</w:t>
       </w:r>
     </w:p>
     <w:p>
@@ -4808,32 +4830,7 @@
           <w:sz w:val="22"/>
           <w:szCs w:val="22"/>
         </w:rPr>
-        <w:t>Submissions page</w:t>
-      </w:r>
-    </w:p>
-    <w:p>
-      <w:pPr>
-        <w:pStyle w:val="Listaszerbekezds"/>
-        <w:numPr>
-          <w:ilvl w:val="5"/>
-          <w:numId w:val="13"/>
-        </w:numPr>
-        <w:spacing w:before="480" w:after="240"/>
-        <w:rPr>
-          <w:rFonts w:ascii="Lexend" w:hAnsi="Lexend"/>
-          <w:b/>
-          <w:bCs/>
-          <w:sz w:val="22"/>
-          <w:szCs w:val="22"/>
-        </w:rPr>
-      </w:pPr>
-      <w:r>
-        <w:rPr>
-          <w:rFonts w:ascii="Lexend" w:hAnsi="Lexend"/>
-          <w:sz w:val="22"/>
-          <w:szCs w:val="22"/>
-        </w:rPr>
-        <w:t>Submission details page</w:t>
+        <w:t>Lesson booking page</w:t>
       </w:r>
     </w:p>
     <w:p>
@@ -4858,6 +4855,31 @@
           <w:sz w:val="22"/>
           <w:szCs w:val="22"/>
         </w:rPr>
+        <w:t>Submissions page</w:t>
+      </w:r>
+    </w:p>
+    <w:p>
+      <w:pPr>
+        <w:pStyle w:val="Listaszerbekezds"/>
+        <w:numPr>
+          <w:ilvl w:val="4"/>
+          <w:numId w:val="13"/>
+        </w:numPr>
+        <w:spacing w:before="480" w:after="240"/>
+        <w:rPr>
+          <w:rFonts w:ascii="Lexend" w:hAnsi="Lexend"/>
+          <w:b/>
+          <w:bCs/>
+          <w:sz w:val="22"/>
+          <w:szCs w:val="22"/>
+        </w:rPr>
+      </w:pPr>
+      <w:r>
+        <w:rPr>
+          <w:rFonts w:ascii="Lexend" w:hAnsi="Lexend"/>
+          <w:sz w:val="22"/>
+          <w:szCs w:val="22"/>
+        </w:rPr>
         <w:t xml:space="preserve">Wall item </w:t>
       </w:r>
       <w:r>
@@ -4974,32 +4996,7 @@
           <w:sz w:val="22"/>
           <w:szCs w:val="22"/>
         </w:rPr>
-        <w:t>Submissions page</w:t>
-      </w:r>
-    </w:p>
-    <w:p>
-      <w:pPr>
-        <w:pStyle w:val="Listaszerbekezds"/>
-        <w:numPr>
-          <w:ilvl w:val="5"/>
-          <w:numId w:val="13"/>
-        </w:numPr>
-        <w:spacing w:before="480" w:after="240"/>
-        <w:rPr>
-          <w:rFonts w:ascii="Lexend" w:hAnsi="Lexend"/>
-          <w:b/>
-          <w:bCs/>
-          <w:sz w:val="22"/>
-          <w:szCs w:val="22"/>
-        </w:rPr>
-      </w:pPr>
-      <w:r>
-        <w:rPr>
-          <w:rFonts w:ascii="Lexend" w:hAnsi="Lexend"/>
-          <w:sz w:val="22"/>
-          <w:szCs w:val="22"/>
-        </w:rPr>
-        <w:t>Submission details page</w:t>
+        <w:t>Consultation booking page</w:t>
       </w:r>
     </w:p>
     <w:p>
@@ -5254,7 +5251,6 @@
           <w:sz w:val="22"/>
           <w:szCs w:val="22"/>
         </w:rPr>
-        <w:lastRenderedPageBreak/>
         <w:t>Finances</w:t>
       </w:r>
     </w:p>
@@ -5280,6 +5276,7 @@
           <w:sz w:val="22"/>
           <w:szCs w:val="22"/>
         </w:rPr>
+        <w:lastRenderedPageBreak/>
         <w:t>Invoice details</w:t>
       </w:r>
     </w:p>
@@ -5401,6 +5398,31 @@
       <w:pPr>
         <w:pStyle w:val="Listaszerbekezds"/>
         <w:numPr>
+          <w:ilvl w:val="2"/>
+          <w:numId w:val="13"/>
+        </w:numPr>
+        <w:spacing w:before="480" w:after="240"/>
+        <w:rPr>
+          <w:rFonts w:ascii="Lexend" w:hAnsi="Lexend"/>
+          <w:b/>
+          <w:bCs/>
+          <w:sz w:val="22"/>
+          <w:szCs w:val="22"/>
+        </w:rPr>
+      </w:pPr>
+      <w:r>
+        <w:rPr>
+          <w:rFonts w:ascii="Lexend" w:hAnsi="Lexend"/>
+          <w:sz w:val="22"/>
+          <w:szCs w:val="22"/>
+        </w:rPr>
+        <w:t>Pending invoices</w:t>
+      </w:r>
+    </w:p>
+    <w:p>
+      <w:pPr>
+        <w:pStyle w:val="Listaszerbekezds"/>
+        <w:numPr>
           <w:ilvl w:val="1"/>
           <w:numId w:val="13"/>
         </w:numPr>
@@ -6174,6 +6196,99 @@
           <w:szCs w:val="22"/>
         </w:rPr>
         <w:t>Notification details page</w:t>
+      </w:r>
+    </w:p>
+    <w:p>
+      <w:pPr>
+        <w:pStyle w:val="Listaszerbekezds"/>
+        <w:numPr>
+          <w:ilvl w:val="1"/>
+          <w:numId w:val="13"/>
+        </w:numPr>
+        <w:spacing w:before="480" w:after="240"/>
+        <w:rPr>
+          <w:rFonts w:ascii="Lexend" w:hAnsi="Lexend"/>
+          <w:b/>
+          <w:bCs/>
+          <w:sz w:val="22"/>
+          <w:szCs w:val="22"/>
+        </w:rPr>
+      </w:pPr>
+      <w:r>
+        <w:rPr>
+          <w:rFonts w:ascii="Lexend" w:hAnsi="Lexend"/>
+          <w:b/>
+          <w:bCs/>
+          <w:sz w:val="22"/>
+          <w:szCs w:val="22"/>
+        </w:rPr>
+        <w:t>Checkout</w:t>
+      </w:r>
+    </w:p>
+    <w:p>
+      <w:pPr>
+        <w:pStyle w:val="Listaszerbekezds"/>
+        <w:numPr>
+          <w:ilvl w:val="2"/>
+          <w:numId w:val="13"/>
+        </w:numPr>
+        <w:spacing w:before="480" w:after="240"/>
+        <w:rPr>
+          <w:rFonts w:ascii="Lexend" w:hAnsi="Lexend"/>
+          <w:b/>
+          <w:bCs/>
+          <w:sz w:val="22"/>
+          <w:szCs w:val="22"/>
+        </w:rPr>
+      </w:pPr>
+      <w:r>
+        <w:rPr>
+          <w:rFonts w:ascii="Lexend" w:hAnsi="Lexend"/>
+          <w:sz w:val="22"/>
+          <w:szCs w:val="22"/>
+        </w:rPr>
+        <w:t>Payment page</w:t>
+      </w:r>
+    </w:p>
+    <w:p>
+      <w:pPr>
+        <w:pStyle w:val="Listaszerbekezds"/>
+        <w:numPr>
+          <w:ilvl w:val="1"/>
+          <w:numId w:val="13"/>
+        </w:numPr>
+        <w:spacing w:before="480" w:after="240"/>
+        <w:rPr>
+          <w:b/>
+          <w:bCs/>
+        </w:rPr>
+      </w:pPr>
+      <w:r>
+        <w:rPr>
+          <w:b/>
+          <w:bCs/>
+        </w:rPr>
+        <w:t>Submissions page</w:t>
+      </w:r>
+    </w:p>
+    <w:p>
+      <w:pPr>
+        <w:pStyle w:val="Listaszerbekezds"/>
+        <w:numPr>
+          <w:ilvl w:val="2"/>
+          <w:numId w:val="13"/>
+        </w:numPr>
+        <w:spacing w:before="480" w:after="240"/>
+        <w:rPr>
+          <w:rFonts w:ascii="Lexend" w:hAnsi="Lexend"/>
+          <w:b/>
+          <w:bCs/>
+          <w:sz w:val="22"/>
+          <w:szCs w:val="22"/>
+        </w:rPr>
+      </w:pPr>
+      <w:r>
+        <w:t>Submission details page</w:t>
       </w:r>
     </w:p>
     <w:p>
@@ -6237,7 +6352,18 @@
           <w:sz w:val="28"/>
           <w:szCs w:val="28"/>
         </w:rPr>
-        <w:t xml:space="preserve">Student </w:t>
+        <w:lastRenderedPageBreak/>
+        <w:t>Stud</w:t>
+      </w:r>
+      <w:r>
+        <w:rPr>
+          <w:rFonts w:ascii="Lexend" w:hAnsi="Lexend"/>
+          <w:b/>
+          <w:bCs/>
+          <w:sz w:val="28"/>
+          <w:szCs w:val="28"/>
+        </w:rPr>
+        <w:t>ent Home:</w:t>
       </w:r>
     </w:p>
     <w:p>
@@ -6259,10 +6385,10 @@
           <w:rFonts w:ascii="Lexend" w:hAnsi="Lexend"/>
           <w:b/>
           <w:bCs/>
-          <w:sz w:val="28"/>
-          <w:szCs w:val="28"/>
-        </w:rPr>
-        <w:t>Home:</w:t>
+          <w:sz w:val="22"/>
+          <w:szCs w:val="22"/>
+        </w:rPr>
+        <w:t>Data needed:</w:t>
       </w:r>
     </w:p>
     <w:p>
@@ -6285,15 +6411,14 @@
           <w:sz w:val="22"/>
           <w:szCs w:val="22"/>
         </w:rPr>
-        <w:lastRenderedPageBreak/>
-        <w:t xml:space="preserve">Data it needs: </w:t>
-      </w:r>
-    </w:p>
-    <w:p>
-      <w:pPr>
-        <w:pStyle w:val="Listaszerbekezds"/>
-        <w:numPr>
-          <w:ilvl w:val="3"/>
+        <w:t>Active and completed courses (5-5)</w:t>
+      </w:r>
+    </w:p>
+    <w:p>
+      <w:pPr>
+        <w:pStyle w:val="Listaszerbekezds"/>
+        <w:numPr>
+          <w:ilvl w:val="2"/>
           <w:numId w:val="10"/>
         </w:numPr>
         <w:spacing w:before="480" w:after="240"/>
@@ -6309,14 +6434,14 @@
           <w:sz w:val="22"/>
           <w:szCs w:val="22"/>
         </w:rPr>
-        <w:t>Attended courses (active, completed)</w:t>
-      </w:r>
-    </w:p>
-    <w:p>
-      <w:pPr>
-        <w:pStyle w:val="Listaszerbekezds"/>
-        <w:numPr>
-          <w:ilvl w:val="4"/>
+        <w:t>Next 5 events</w:t>
+      </w:r>
+    </w:p>
+    <w:p>
+      <w:pPr>
+        <w:pStyle w:val="Listaszerbekezds"/>
+        <w:numPr>
+          <w:ilvl w:val="2"/>
           <w:numId w:val="10"/>
         </w:numPr>
         <w:spacing w:before="480" w:after="240"/>
@@ -6332,60 +6457,14 @@
           <w:sz w:val="22"/>
           <w:szCs w:val="22"/>
         </w:rPr>
-        <w:t>progression, next upcoming event/deadline, link to the wall/path if active</w:t>
-      </w:r>
-    </w:p>
-    <w:p>
-      <w:pPr>
-        <w:pStyle w:val="Listaszerbekezds"/>
-        <w:numPr>
-          <w:ilvl w:val="3"/>
-          <w:numId w:val="10"/>
-        </w:numPr>
-        <w:spacing w:before="480" w:after="240"/>
-        <w:rPr>
-          <w:rFonts w:ascii="Lexend" w:hAnsi="Lexend"/>
-          <w:sz w:val="22"/>
-          <w:szCs w:val="22"/>
-        </w:rPr>
-      </w:pPr>
-      <w:r>
-        <w:rPr>
-          <w:rFonts w:ascii="Lexend" w:hAnsi="Lexend"/>
-          <w:sz w:val="22"/>
-          <w:szCs w:val="22"/>
-        </w:rPr>
-        <w:t>Upcoming events (5)</w:t>
-      </w:r>
-    </w:p>
-    <w:p>
-      <w:pPr>
-        <w:pStyle w:val="Listaszerbekezds"/>
-        <w:numPr>
-          <w:ilvl w:val="3"/>
-          <w:numId w:val="10"/>
-        </w:numPr>
-        <w:spacing w:before="480" w:after="240"/>
-        <w:rPr>
-          <w:rFonts w:ascii="Lexend" w:hAnsi="Lexend"/>
-          <w:sz w:val="22"/>
-          <w:szCs w:val="22"/>
-        </w:rPr>
-      </w:pPr>
-      <w:r>
-        <w:rPr>
-          <w:rFonts w:ascii="Lexend" w:hAnsi="Lexend"/>
-          <w:sz w:val="22"/>
-          <w:szCs w:val="22"/>
-        </w:rPr>
-        <w:t>Popular Courses (paths, tutors)</w:t>
-      </w:r>
-    </w:p>
-    <w:p>
-      <w:pPr>
-        <w:pStyle w:val="Listaszerbekezds"/>
-        <w:numPr>
-          <w:ilvl w:val="3"/>
+        <w:t>Recommended Paths and Teachers (8-8)</w:t>
+      </w:r>
+    </w:p>
+    <w:p>
+      <w:pPr>
+        <w:pStyle w:val="Listaszerbekezds"/>
+        <w:numPr>
+          <w:ilvl w:val="2"/>
           <w:numId w:val="10"/>
         </w:numPr>
         <w:spacing w:before="480" w:after="240"/>
@@ -6421,12 +6500,28 @@
       <w:r>
         <w:rPr>
           <w:rFonts w:ascii="Lexend" w:hAnsi="Lexend"/>
-          <w:b/>
-          <w:bCs/>
-          <w:sz w:val="28"/>
-          <w:szCs w:val="28"/>
-        </w:rPr>
-        <w:t>My courses</w:t>
+          <w:sz w:val="22"/>
+          <w:szCs w:val="22"/>
+        </w:rPr>
+        <w:t xml:space="preserve">Endpoint: GET </w:t>
+      </w:r>
+      <w:proofErr w:type="spellStart"/>
+      <w:r>
+        <w:rPr>
+          <w:rFonts w:ascii="Lexend" w:hAnsi="Lexend"/>
+          <w:sz w:val="22"/>
+          <w:szCs w:val="22"/>
+        </w:rPr>
+        <w:t>api</w:t>
+      </w:r>
+      <w:proofErr w:type="spellEnd"/>
+      <w:r>
+        <w:rPr>
+          <w:rFonts w:ascii="Lexend" w:hAnsi="Lexend"/>
+          <w:sz w:val="22"/>
+          <w:szCs w:val="22"/>
+        </w:rPr>
+        <w:t>/student/home</w:t>
       </w:r>
     </w:p>
     <w:p>
@@ -6446,468 +6541,2851 @@
       <w:r>
         <w:rPr>
           <w:rFonts w:ascii="Lexend" w:hAnsi="Lexend"/>
-          <w:b/>
-          <w:bCs/>
-          <w:sz w:val="28"/>
-          <w:szCs w:val="28"/>
-        </w:rPr>
-        <w:t>Calendar</w:t>
-      </w:r>
-    </w:p>
-    <w:p>
-      <w:pPr>
-        <w:pStyle w:val="Listaszerbekezds"/>
-        <w:numPr>
-          <w:ilvl w:val="1"/>
-          <w:numId w:val="10"/>
-        </w:numPr>
-        <w:spacing w:before="480" w:after="240"/>
-        <w:rPr>
-          <w:rFonts w:ascii="Lexend" w:hAnsi="Lexend"/>
-          <w:sz w:val="22"/>
-          <w:szCs w:val="22"/>
-        </w:rPr>
-      </w:pPr>
-      <w:r>
-        <w:rPr>
-          <w:rFonts w:ascii="Lexend" w:hAnsi="Lexend"/>
-          <w:b/>
-          <w:bCs/>
-          <w:sz w:val="28"/>
-          <w:szCs w:val="28"/>
-        </w:rPr>
-        <w:t>C</w:t>
-      </w:r>
-      <w:r>
-        <w:rPr>
-          <w:rFonts w:ascii="Lexend" w:hAnsi="Lexend"/>
-          <w:b/>
-          <w:bCs/>
-          <w:sz w:val="28"/>
-          <w:szCs w:val="28"/>
-        </w:rPr>
-        <w:t>ommunity</w:t>
-      </w:r>
-    </w:p>
-    <w:p>
-      <w:pPr>
-        <w:pStyle w:val="Listaszerbekezds"/>
-        <w:numPr>
-          <w:ilvl w:val="1"/>
-          <w:numId w:val="10"/>
-        </w:numPr>
-        <w:spacing w:before="480" w:after="240"/>
-        <w:rPr>
-          <w:rFonts w:ascii="Lexend" w:hAnsi="Lexend"/>
-          <w:sz w:val="22"/>
-          <w:szCs w:val="22"/>
-        </w:rPr>
-      </w:pPr>
-      <w:r>
-        <w:rPr>
-          <w:rFonts w:ascii="Lexend" w:hAnsi="Lexend"/>
-          <w:b/>
-          <w:bCs/>
-          <w:sz w:val="28"/>
-          <w:szCs w:val="28"/>
-        </w:rPr>
-        <w:t>Finances</w:t>
-      </w:r>
-    </w:p>
-    <w:p>
-      <w:pPr>
-        <w:pStyle w:val="Listaszerbekezds"/>
-        <w:numPr>
-          <w:ilvl w:val="0"/>
-          <w:numId w:val="10"/>
-        </w:numPr>
-        <w:spacing w:before="480" w:after="240"/>
-        <w:rPr>
-          <w:rFonts w:ascii="Lexend" w:hAnsi="Lexend"/>
-          <w:sz w:val="22"/>
-          <w:szCs w:val="22"/>
-        </w:rPr>
-      </w:pPr>
-      <w:r>
-        <w:rPr>
-          <w:rFonts w:ascii="Lexend" w:hAnsi="Lexend"/>
-          <w:b/>
-          <w:bCs/>
-          <w:sz w:val="28"/>
-          <w:szCs w:val="28"/>
-        </w:rPr>
-        <w:t xml:space="preserve">Teacher </w:t>
-      </w:r>
-    </w:p>
-    <w:p>
-      <w:pPr>
-        <w:pStyle w:val="Listaszerbekezds"/>
-        <w:numPr>
-          <w:ilvl w:val="1"/>
-          <w:numId w:val="10"/>
-        </w:numPr>
-        <w:spacing w:before="480" w:after="240"/>
-        <w:rPr>
-          <w:rFonts w:ascii="Lexend" w:hAnsi="Lexend"/>
-          <w:sz w:val="22"/>
-          <w:szCs w:val="22"/>
-        </w:rPr>
-      </w:pPr>
-      <w:bookmarkStart w:id="0" w:name="_Hlk222830692"/>
-      <w:r>
-        <w:rPr>
-          <w:rFonts w:ascii="Lexend" w:hAnsi="Lexend"/>
-          <w:b/>
-          <w:bCs/>
-          <w:sz w:val="28"/>
-          <w:szCs w:val="28"/>
-        </w:rPr>
-        <w:t>Home</w:t>
-      </w:r>
-    </w:p>
-    <w:bookmarkEnd w:id="0"/>
-    <w:p>
-      <w:pPr>
-        <w:pStyle w:val="Listaszerbekezds"/>
-        <w:numPr>
-          <w:ilvl w:val="2"/>
-          <w:numId w:val="10"/>
-        </w:numPr>
-        <w:spacing w:before="480" w:after="240"/>
-        <w:rPr>
-          <w:rFonts w:ascii="Lexend" w:hAnsi="Lexend"/>
-          <w:sz w:val="22"/>
-          <w:szCs w:val="22"/>
-        </w:rPr>
-      </w:pPr>
-      <w:r>
-        <w:rPr>
-          <w:rFonts w:ascii="Lexend" w:hAnsi="Lexend"/>
-          <w:sz w:val="22"/>
-          <w:szCs w:val="22"/>
-        </w:rPr>
-        <w:t>Data it needs:</w:t>
-      </w:r>
-    </w:p>
-    <w:p>
-      <w:pPr>
-        <w:pStyle w:val="Listaszerbekezds"/>
-        <w:numPr>
-          <w:ilvl w:val="3"/>
-          <w:numId w:val="10"/>
-        </w:numPr>
-        <w:spacing w:before="480" w:after="240"/>
-        <w:rPr>
-          <w:rFonts w:ascii="Lexend" w:hAnsi="Lexend"/>
-          <w:sz w:val="22"/>
-          <w:szCs w:val="22"/>
-        </w:rPr>
-      </w:pPr>
-      <w:r>
-        <w:rPr>
-          <w:rFonts w:ascii="Lexend" w:hAnsi="Lexend"/>
-          <w:sz w:val="22"/>
-          <w:szCs w:val="22"/>
-        </w:rPr>
-        <w:t>Active courses (tutoring and path)</w:t>
-      </w:r>
-    </w:p>
-    <w:p>
-      <w:pPr>
-        <w:pStyle w:val="Listaszerbekezds"/>
-        <w:numPr>
-          <w:ilvl w:val="4"/>
-          <w:numId w:val="10"/>
-        </w:numPr>
-        <w:spacing w:before="480" w:after="240"/>
-        <w:rPr>
-          <w:rFonts w:ascii="Lexend" w:hAnsi="Lexend"/>
-          <w:sz w:val="22"/>
-          <w:szCs w:val="22"/>
-        </w:rPr>
-      </w:pPr>
-      <w:r>
-        <w:rPr>
-          <w:rFonts w:ascii="Lexend" w:hAnsi="Lexend"/>
-          <w:sz w:val="22"/>
-          <w:szCs w:val="22"/>
-        </w:rPr>
-        <w:t>no. of students, link to the course teacher’s overview</w:t>
-      </w:r>
-    </w:p>
-    <w:p>
-      <w:pPr>
-        <w:pStyle w:val="Listaszerbekezds"/>
-        <w:numPr>
-          <w:ilvl w:val="3"/>
-          <w:numId w:val="10"/>
-        </w:numPr>
-        <w:spacing w:before="480" w:after="240"/>
-        <w:rPr>
-          <w:rFonts w:ascii="Lexend" w:hAnsi="Lexend"/>
-          <w:sz w:val="22"/>
-          <w:szCs w:val="22"/>
-        </w:rPr>
-      </w:pPr>
-      <w:r>
-        <w:rPr>
-          <w:rFonts w:ascii="Lexend" w:hAnsi="Lexend"/>
-          <w:sz w:val="22"/>
-          <w:szCs w:val="22"/>
-        </w:rPr>
-        <w:t>Upcoming events (5)</w:t>
-      </w:r>
-    </w:p>
-    <w:p>
-      <w:pPr>
-        <w:pStyle w:val="Listaszerbekezds"/>
-        <w:numPr>
-          <w:ilvl w:val="3"/>
-          <w:numId w:val="10"/>
-        </w:numPr>
-        <w:spacing w:before="480" w:after="240"/>
-        <w:rPr>
-          <w:rFonts w:ascii="Lexend" w:hAnsi="Lexend"/>
-          <w:sz w:val="22"/>
-          <w:szCs w:val="22"/>
-        </w:rPr>
-      </w:pPr>
-      <w:r>
-        <w:rPr>
-          <w:rFonts w:ascii="Lexend" w:hAnsi="Lexend"/>
-          <w:sz w:val="22"/>
-          <w:szCs w:val="22"/>
-        </w:rPr>
-        <w:t>The first few students (3)</w:t>
-      </w:r>
-    </w:p>
-    <w:p>
-      <w:pPr>
-        <w:pStyle w:val="Listaszerbekezds"/>
-        <w:numPr>
-          <w:ilvl w:val="3"/>
-          <w:numId w:val="10"/>
-        </w:numPr>
-        <w:spacing w:before="480" w:after="240"/>
-        <w:rPr>
-          <w:rFonts w:ascii="Lexend" w:hAnsi="Lexend"/>
-          <w:sz w:val="22"/>
-          <w:szCs w:val="22"/>
-        </w:rPr>
-      </w:pPr>
-      <w:r>
-        <w:rPr>
-          <w:rFonts w:ascii="Lexend" w:hAnsi="Lexend"/>
-          <w:sz w:val="22"/>
-          <w:szCs w:val="22"/>
-        </w:rPr>
-        <w:t>Notifications</w:t>
-      </w:r>
-    </w:p>
-    <w:p>
-      <w:pPr>
-        <w:pStyle w:val="Listaszerbekezds"/>
-        <w:numPr>
-          <w:ilvl w:val="1"/>
-          <w:numId w:val="10"/>
-        </w:numPr>
-        <w:spacing w:before="480" w:after="240"/>
-        <w:rPr>
-          <w:rFonts w:ascii="Lexend" w:hAnsi="Lexend"/>
-          <w:sz w:val="22"/>
-          <w:szCs w:val="22"/>
-        </w:rPr>
-      </w:pPr>
-      <w:r>
-        <w:rPr>
-          <w:rFonts w:ascii="Lexend" w:hAnsi="Lexend"/>
-          <w:b/>
-          <w:bCs/>
-          <w:sz w:val="28"/>
-          <w:szCs w:val="28"/>
-        </w:rPr>
-        <w:t>My courses</w:t>
-      </w:r>
-    </w:p>
-    <w:p>
-      <w:pPr>
-        <w:pStyle w:val="Listaszerbekezds"/>
-        <w:numPr>
-          <w:ilvl w:val="1"/>
-          <w:numId w:val="10"/>
-        </w:numPr>
-        <w:spacing w:before="480" w:after="240"/>
-        <w:rPr>
-          <w:rFonts w:ascii="Lexend" w:hAnsi="Lexend"/>
-          <w:sz w:val="22"/>
-          <w:szCs w:val="22"/>
-        </w:rPr>
-      </w:pPr>
-      <w:r>
-        <w:rPr>
-          <w:rFonts w:ascii="Lexend" w:hAnsi="Lexend"/>
-          <w:b/>
-          <w:bCs/>
-          <w:sz w:val="28"/>
-          <w:szCs w:val="28"/>
-        </w:rPr>
-        <w:t>Calendar</w:t>
-      </w:r>
-    </w:p>
-    <w:p>
-      <w:pPr>
-        <w:pStyle w:val="Listaszerbekezds"/>
-        <w:numPr>
-          <w:ilvl w:val="1"/>
-          <w:numId w:val="10"/>
-        </w:numPr>
-        <w:spacing w:before="480" w:after="240"/>
-        <w:rPr>
-          <w:rFonts w:ascii="Lexend" w:hAnsi="Lexend"/>
-          <w:sz w:val="22"/>
-          <w:szCs w:val="22"/>
-        </w:rPr>
-      </w:pPr>
-      <w:r>
-        <w:rPr>
-          <w:rFonts w:ascii="Lexend" w:hAnsi="Lexend"/>
-          <w:b/>
-          <w:bCs/>
-          <w:sz w:val="28"/>
-          <w:szCs w:val="28"/>
-        </w:rPr>
-        <w:t>Students</w:t>
-      </w:r>
-    </w:p>
-    <w:p>
-      <w:pPr>
-        <w:pStyle w:val="Listaszerbekezds"/>
-        <w:numPr>
-          <w:ilvl w:val="1"/>
-          <w:numId w:val="10"/>
-        </w:numPr>
-        <w:spacing w:before="480" w:after="240"/>
-        <w:rPr>
-          <w:rFonts w:ascii="Lexend" w:hAnsi="Lexend"/>
-          <w:sz w:val="22"/>
-          <w:szCs w:val="22"/>
-        </w:rPr>
-      </w:pPr>
-      <w:r>
-        <w:rPr>
-          <w:rFonts w:ascii="Lexend" w:hAnsi="Lexend"/>
-          <w:b/>
-          <w:bCs/>
-          <w:sz w:val="28"/>
-          <w:szCs w:val="28"/>
-        </w:rPr>
-        <w:t>Finances</w:t>
-      </w:r>
-    </w:p>
-    <w:p>
-      <w:pPr>
-        <w:pStyle w:val="Listaszerbekezds"/>
-        <w:numPr>
-          <w:ilvl w:val="1"/>
-          <w:numId w:val="10"/>
-        </w:numPr>
-        <w:spacing w:before="480" w:after="240"/>
-        <w:rPr>
-          <w:rFonts w:ascii="Lexend" w:hAnsi="Lexend"/>
-          <w:sz w:val="22"/>
-          <w:szCs w:val="22"/>
-        </w:rPr>
-      </w:pPr>
-      <w:r>
-        <w:rPr>
-          <w:rFonts w:ascii="Lexend" w:hAnsi="Lexend"/>
-          <w:b/>
-          <w:bCs/>
-          <w:sz w:val="28"/>
-          <w:szCs w:val="28"/>
-        </w:rPr>
-        <w:t>File manager</w:t>
-      </w:r>
-    </w:p>
-    <w:p>
-      <w:pPr>
-        <w:pStyle w:val="Listaszerbekezds"/>
-        <w:numPr>
-          <w:ilvl w:val="0"/>
-          <w:numId w:val="10"/>
-        </w:numPr>
-        <w:spacing w:before="480" w:after="240"/>
-        <w:rPr>
-          <w:rFonts w:ascii="Lexend" w:hAnsi="Lexend"/>
-          <w:sz w:val="22"/>
-          <w:szCs w:val="22"/>
-        </w:rPr>
-      </w:pPr>
-      <w:r>
-        <w:rPr>
-          <w:rFonts w:ascii="Lexend" w:hAnsi="Lexend"/>
-          <w:b/>
-          <w:bCs/>
-          <w:sz w:val="28"/>
-          <w:szCs w:val="28"/>
-        </w:rPr>
-        <w:t>Shared</w:t>
-      </w:r>
-    </w:p>
-    <w:p>
-      <w:pPr>
-        <w:pStyle w:val="Listaszerbekezds"/>
-        <w:numPr>
-          <w:ilvl w:val="1"/>
-          <w:numId w:val="10"/>
-        </w:numPr>
-        <w:spacing w:before="480" w:after="240"/>
-        <w:rPr>
-          <w:rFonts w:ascii="Lexend" w:hAnsi="Lexend"/>
-          <w:sz w:val="22"/>
-          <w:szCs w:val="22"/>
-        </w:rPr>
-      </w:pPr>
-      <w:r>
-        <w:rPr>
-          <w:rFonts w:ascii="Lexend" w:hAnsi="Lexend"/>
-          <w:b/>
-          <w:bCs/>
-          <w:sz w:val="28"/>
-          <w:szCs w:val="28"/>
-        </w:rPr>
-        <w:t>Course explorer</w:t>
-      </w:r>
-    </w:p>
-    <w:p>
-      <w:pPr>
-        <w:pStyle w:val="Listaszerbekezds"/>
-        <w:numPr>
-          <w:ilvl w:val="1"/>
-          <w:numId w:val="10"/>
-        </w:numPr>
-        <w:spacing w:before="480" w:after="240"/>
-        <w:rPr>
-          <w:rFonts w:ascii="Lexend" w:hAnsi="Lexend"/>
-          <w:sz w:val="22"/>
-          <w:szCs w:val="22"/>
-        </w:rPr>
-      </w:pPr>
-      <w:r>
-        <w:rPr>
-          <w:rFonts w:ascii="Lexend" w:hAnsi="Lexend"/>
-          <w:b/>
-          <w:bCs/>
-          <w:sz w:val="28"/>
-          <w:szCs w:val="28"/>
-        </w:rPr>
-        <w:t>Account settings</w:t>
-      </w:r>
+          <w:sz w:val="22"/>
+          <w:szCs w:val="22"/>
+        </w:rPr>
+        <w:t>Schema:</w:t>
+      </w:r>
+    </w:p>
+    <w:p>
+      <w:pPr>
+        <w:spacing w:after="0"/>
+        <w:rPr>
+          <w:rFonts w:ascii="JetBrains Mono" w:hAnsi="JetBrains Mono" w:cs="JetBrains Mono"/>
+          <w:sz w:val="16"/>
+          <w:szCs w:val="16"/>
+        </w:rPr>
+        <w:sectPr>
+          <w:pgSz w:w="11906" w:h="16838"/>
+          <w:pgMar w:top="1417" w:right="1417" w:bottom="1417" w:left="1417" w:header="708" w:footer="708" w:gutter="0"/>
+          <w:cols w:space="708"/>
+          <w:docGrid w:linePitch="360"/>
+        </w:sectPr>
+      </w:pPr>
+    </w:p>
+    <w:p>
+      <w:pPr>
+        <w:spacing w:after="0"/>
+        <w:rPr>
+          <w:rFonts w:ascii="JetBrains Mono" w:hAnsi="JetBrains Mono" w:cs="JetBrains Mono"/>
+          <w:sz w:val="16"/>
+          <w:szCs w:val="16"/>
+          <w:lang w:val="hu-HU"/>
+        </w:rPr>
+      </w:pPr>
+      <w:r>
+        <w:rPr>
+          <w:rFonts w:ascii="JetBrains Mono" w:hAnsi="JetBrains Mono" w:cs="JetBrains Mono"/>
+          <w:sz w:val="16"/>
+          <w:szCs w:val="16"/>
+          <w:lang w:val="hu-HU"/>
+        </w:rPr>
+        <w:t>{</w:t>
+      </w:r>
+    </w:p>
+    <w:p>
+      <w:pPr>
+        <w:spacing w:after="0"/>
+        <w:rPr>
+          <w:rFonts w:ascii="JetBrains Mono" w:hAnsi="JetBrains Mono" w:cs="JetBrains Mono"/>
+          <w:sz w:val="16"/>
+          <w:szCs w:val="16"/>
+          <w:lang w:val="hu-HU"/>
+        </w:rPr>
+      </w:pPr>
+      <w:r>
+        <w:rPr>
+          <w:rFonts w:ascii="JetBrains Mono" w:hAnsi="JetBrains Mono" w:cs="JetBrains Mono"/>
+          <w:sz w:val="16"/>
+          <w:szCs w:val="16"/>
+          <w:lang w:val="hu-HU"/>
+        </w:rPr>
+        <w:t>    "</w:t>
+      </w:r>
+      <w:proofErr w:type="spellStart"/>
+      <w:r>
+        <w:rPr>
+          <w:rFonts w:ascii="JetBrains Mono" w:hAnsi="JetBrains Mono" w:cs="JetBrains Mono"/>
+          <w:sz w:val="16"/>
+          <w:szCs w:val="16"/>
+          <w:lang w:val="hu-HU"/>
+        </w:rPr>
+        <w:t>attendedCourses</w:t>
+      </w:r>
+      <w:proofErr w:type="spellEnd"/>
+      <w:r>
+        <w:rPr>
+          <w:rFonts w:ascii="JetBrains Mono" w:hAnsi="JetBrains Mono" w:cs="JetBrains Mono"/>
+          <w:sz w:val="16"/>
+          <w:szCs w:val="16"/>
+          <w:lang w:val="hu-HU"/>
+        </w:rPr>
+        <w:t>": {</w:t>
+      </w:r>
+    </w:p>
+    <w:p>
+      <w:pPr>
+        <w:spacing w:after="0"/>
+        <w:rPr>
+          <w:rFonts w:ascii="JetBrains Mono" w:hAnsi="JetBrains Mono" w:cs="JetBrains Mono"/>
+          <w:sz w:val="16"/>
+          <w:szCs w:val="16"/>
+          <w:lang w:val="hu-HU"/>
+        </w:rPr>
+      </w:pPr>
+      <w:r>
+        <w:rPr>
+          <w:rFonts w:ascii="JetBrains Mono" w:hAnsi="JetBrains Mono" w:cs="JetBrains Mono"/>
+          <w:sz w:val="16"/>
+          <w:szCs w:val="16"/>
+          <w:lang w:val="hu-HU"/>
+        </w:rPr>
+        <w:t>        "</w:t>
+      </w:r>
+      <w:proofErr w:type="spellStart"/>
+      <w:r>
+        <w:rPr>
+          <w:rFonts w:ascii="JetBrains Mono" w:hAnsi="JetBrains Mono" w:cs="JetBrains Mono"/>
+          <w:sz w:val="16"/>
+          <w:szCs w:val="16"/>
+          <w:lang w:val="hu-HU"/>
+        </w:rPr>
+        <w:t>active</w:t>
+      </w:r>
+      <w:proofErr w:type="spellEnd"/>
+      <w:proofErr w:type="gramStart"/>
+      <w:r>
+        <w:rPr>
+          <w:rFonts w:ascii="JetBrains Mono" w:hAnsi="JetBrains Mono" w:cs="JetBrains Mono"/>
+          <w:sz w:val="16"/>
+          <w:szCs w:val="16"/>
+          <w:lang w:val="hu-HU"/>
+        </w:rPr>
+        <w:t>":[</w:t>
+      </w:r>
+      <w:proofErr w:type="gramEnd"/>
+    </w:p>
+    <w:p>
+      <w:pPr>
+        <w:spacing w:after="0"/>
+        <w:rPr>
+          <w:rFonts w:ascii="JetBrains Mono" w:hAnsi="JetBrains Mono" w:cs="JetBrains Mono"/>
+          <w:sz w:val="16"/>
+          <w:szCs w:val="16"/>
+          <w:lang w:val="hu-HU"/>
+        </w:rPr>
+      </w:pPr>
+      <w:r>
+        <w:rPr>
+          <w:rFonts w:ascii="JetBrains Mono" w:hAnsi="JetBrains Mono" w:cs="JetBrains Mono"/>
+          <w:sz w:val="16"/>
+          <w:szCs w:val="16"/>
+          <w:lang w:val="hu-HU"/>
+        </w:rPr>
+        <w:t>            {</w:t>
+      </w:r>
+    </w:p>
+    <w:p>
+      <w:pPr>
+        <w:spacing w:after="0"/>
+        <w:rPr>
+          <w:rFonts w:ascii="JetBrains Mono" w:hAnsi="JetBrains Mono" w:cs="JetBrains Mono"/>
+          <w:sz w:val="16"/>
+          <w:szCs w:val="16"/>
+          <w:lang w:val="hu-HU"/>
+        </w:rPr>
+      </w:pPr>
+      <w:r>
+        <w:rPr>
+          <w:rFonts w:ascii="JetBrains Mono" w:hAnsi="JetBrains Mono" w:cs="JetBrains Mono"/>
+          <w:sz w:val="16"/>
+          <w:szCs w:val="16"/>
+          <w:lang w:val="hu-HU"/>
+        </w:rPr>
+        <w:t>                "</w:t>
+      </w:r>
+      <w:proofErr w:type="spellStart"/>
+      <w:r>
+        <w:rPr>
+          <w:rFonts w:ascii="JetBrains Mono" w:hAnsi="JetBrains Mono" w:cs="JetBrains Mono"/>
+          <w:sz w:val="16"/>
+          <w:szCs w:val="16"/>
+          <w:lang w:val="hu-HU"/>
+        </w:rPr>
+        <w:t>id</w:t>
+      </w:r>
+      <w:proofErr w:type="spellEnd"/>
+      <w:r>
+        <w:rPr>
+          <w:rFonts w:ascii="JetBrains Mono" w:hAnsi="JetBrains Mono" w:cs="JetBrains Mono"/>
+          <w:sz w:val="16"/>
+          <w:szCs w:val="16"/>
+          <w:lang w:val="hu-HU"/>
+        </w:rPr>
+        <w:t>":"</w:t>
+      </w:r>
+      <w:proofErr w:type="spellStart"/>
+      <w:r>
+        <w:rPr>
+          <w:rFonts w:ascii="JetBrains Mono" w:hAnsi="JetBrains Mono" w:cs="JetBrains Mono"/>
+          <w:sz w:val="16"/>
+          <w:szCs w:val="16"/>
+          <w:lang w:val="hu-HU"/>
+        </w:rPr>
+        <w:t>uuid</w:t>
+      </w:r>
+      <w:proofErr w:type="spellEnd"/>
+      <w:r>
+        <w:rPr>
+          <w:rFonts w:ascii="JetBrains Mono" w:hAnsi="JetBrains Mono" w:cs="JetBrains Mono"/>
+          <w:sz w:val="16"/>
+          <w:szCs w:val="16"/>
+          <w:lang w:val="hu-HU"/>
+        </w:rPr>
+        <w:t>",</w:t>
+      </w:r>
+    </w:p>
+    <w:p>
+      <w:pPr>
+        <w:spacing w:after="0"/>
+        <w:rPr>
+          <w:rFonts w:ascii="JetBrains Mono" w:hAnsi="JetBrains Mono" w:cs="JetBrains Mono"/>
+          <w:sz w:val="16"/>
+          <w:szCs w:val="16"/>
+          <w:lang w:val="hu-HU"/>
+        </w:rPr>
+      </w:pPr>
+      <w:r>
+        <w:rPr>
+          <w:rFonts w:ascii="JetBrains Mono" w:hAnsi="JetBrains Mono" w:cs="JetBrains Mono"/>
+          <w:sz w:val="16"/>
+          <w:szCs w:val="16"/>
+          <w:lang w:val="hu-HU"/>
+        </w:rPr>
+        <w:t>                "</w:t>
+      </w:r>
+      <w:proofErr w:type="spellStart"/>
+      <w:r>
+        <w:rPr>
+          <w:rFonts w:ascii="JetBrains Mono" w:hAnsi="JetBrains Mono" w:cs="JetBrains Mono"/>
+          <w:sz w:val="16"/>
+          <w:szCs w:val="16"/>
+          <w:lang w:val="hu-HU"/>
+        </w:rPr>
+        <w:t>courseName</w:t>
+      </w:r>
+      <w:proofErr w:type="spellEnd"/>
+      <w:r>
+        <w:rPr>
+          <w:rFonts w:ascii="JetBrains Mono" w:hAnsi="JetBrains Mono" w:cs="JetBrains Mono"/>
+          <w:sz w:val="16"/>
+          <w:szCs w:val="16"/>
+          <w:lang w:val="hu-HU"/>
+        </w:rPr>
+        <w:t>": "</w:t>
+      </w:r>
+      <w:proofErr w:type="spellStart"/>
+      <w:r>
+        <w:rPr>
+          <w:rFonts w:ascii="JetBrains Mono" w:hAnsi="JetBrains Mono" w:cs="JetBrains Mono"/>
+          <w:sz w:val="16"/>
+          <w:szCs w:val="16"/>
+          <w:lang w:val="hu-HU"/>
+        </w:rPr>
+        <w:t>string</w:t>
+      </w:r>
+      <w:proofErr w:type="spellEnd"/>
+      <w:r>
+        <w:rPr>
+          <w:rFonts w:ascii="JetBrains Mono" w:hAnsi="JetBrains Mono" w:cs="JetBrains Mono"/>
+          <w:sz w:val="16"/>
+          <w:szCs w:val="16"/>
+          <w:lang w:val="hu-HU"/>
+        </w:rPr>
+        <w:t>",</w:t>
+      </w:r>
+    </w:p>
+    <w:p>
+      <w:pPr>
+        <w:spacing w:after="0"/>
+        <w:rPr>
+          <w:rFonts w:ascii="JetBrains Mono" w:hAnsi="JetBrains Mono" w:cs="JetBrains Mono"/>
+          <w:sz w:val="16"/>
+          <w:szCs w:val="16"/>
+          <w:lang w:val="hu-HU"/>
+        </w:rPr>
+      </w:pPr>
+      <w:r>
+        <w:rPr>
+          <w:rFonts w:ascii="JetBrains Mono" w:hAnsi="JetBrains Mono" w:cs="JetBrains Mono"/>
+          <w:sz w:val="16"/>
+          <w:szCs w:val="16"/>
+          <w:lang w:val="hu-HU"/>
+        </w:rPr>
+        <w:t>                "</w:t>
+      </w:r>
+      <w:proofErr w:type="spellStart"/>
+      <w:r>
+        <w:rPr>
+          <w:rFonts w:ascii="JetBrains Mono" w:hAnsi="JetBrains Mono" w:cs="JetBrains Mono"/>
+          <w:sz w:val="16"/>
+          <w:szCs w:val="16"/>
+          <w:lang w:val="hu-HU"/>
+        </w:rPr>
+        <w:t>imageUrl</w:t>
+      </w:r>
+      <w:proofErr w:type="spellEnd"/>
+      <w:r>
+        <w:rPr>
+          <w:rFonts w:ascii="JetBrains Mono" w:hAnsi="JetBrains Mono" w:cs="JetBrains Mono"/>
+          <w:sz w:val="16"/>
+          <w:szCs w:val="16"/>
+          <w:lang w:val="hu-HU"/>
+        </w:rPr>
+        <w:t>": "</w:t>
+      </w:r>
+      <w:proofErr w:type="spellStart"/>
+      <w:r>
+        <w:rPr>
+          <w:rFonts w:ascii="JetBrains Mono" w:hAnsi="JetBrains Mono" w:cs="JetBrains Mono"/>
+          <w:sz w:val="16"/>
+          <w:szCs w:val="16"/>
+          <w:lang w:val="hu-HU"/>
+        </w:rPr>
+        <w:t>string</w:t>
+      </w:r>
+      <w:proofErr w:type="spellEnd"/>
+      <w:r>
+        <w:rPr>
+          <w:rFonts w:ascii="JetBrains Mono" w:hAnsi="JetBrains Mono" w:cs="JetBrains Mono"/>
+          <w:sz w:val="16"/>
+          <w:szCs w:val="16"/>
+          <w:lang w:val="hu-HU"/>
+        </w:rPr>
+        <w:t>",</w:t>
+      </w:r>
+    </w:p>
+    <w:p>
+      <w:pPr>
+        <w:spacing w:after="0"/>
+        <w:rPr>
+          <w:rFonts w:ascii="JetBrains Mono" w:hAnsi="JetBrains Mono" w:cs="JetBrains Mono"/>
+          <w:sz w:val="16"/>
+          <w:szCs w:val="16"/>
+          <w:lang w:val="hu-HU"/>
+        </w:rPr>
+      </w:pPr>
+      <w:r>
+        <w:rPr>
+          <w:rFonts w:ascii="JetBrains Mono" w:hAnsi="JetBrains Mono" w:cs="JetBrains Mono"/>
+          <w:sz w:val="16"/>
+          <w:szCs w:val="16"/>
+          <w:lang w:val="hu-HU"/>
+        </w:rPr>
+        <w:t>                "</w:t>
+      </w:r>
+      <w:proofErr w:type="spellStart"/>
+      <w:r>
+        <w:rPr>
+          <w:rFonts w:ascii="JetBrains Mono" w:hAnsi="JetBrains Mono" w:cs="JetBrains Mono"/>
+          <w:sz w:val="16"/>
+          <w:szCs w:val="16"/>
+          <w:lang w:val="hu-HU"/>
+        </w:rPr>
+        <w:t>teacherName</w:t>
+      </w:r>
+      <w:proofErr w:type="spellEnd"/>
+      <w:r>
+        <w:rPr>
+          <w:rFonts w:ascii="JetBrains Mono" w:hAnsi="JetBrains Mono" w:cs="JetBrains Mono"/>
+          <w:sz w:val="16"/>
+          <w:szCs w:val="16"/>
+          <w:lang w:val="hu-HU"/>
+        </w:rPr>
+        <w:t>": "</w:t>
+      </w:r>
+      <w:proofErr w:type="spellStart"/>
+      <w:r>
+        <w:rPr>
+          <w:rFonts w:ascii="JetBrains Mono" w:hAnsi="JetBrains Mono" w:cs="JetBrains Mono"/>
+          <w:sz w:val="16"/>
+          <w:szCs w:val="16"/>
+          <w:lang w:val="hu-HU"/>
+        </w:rPr>
+        <w:t>string</w:t>
+      </w:r>
+      <w:proofErr w:type="spellEnd"/>
+      <w:r>
+        <w:rPr>
+          <w:rFonts w:ascii="JetBrains Mono" w:hAnsi="JetBrains Mono" w:cs="JetBrains Mono"/>
+          <w:sz w:val="16"/>
+          <w:szCs w:val="16"/>
+          <w:lang w:val="hu-HU"/>
+        </w:rPr>
+        <w:t>",</w:t>
+      </w:r>
+    </w:p>
+    <w:p>
+      <w:pPr>
+        <w:spacing w:after="0"/>
+        <w:rPr>
+          <w:rFonts w:ascii="JetBrains Mono" w:hAnsi="JetBrains Mono" w:cs="JetBrains Mono"/>
+          <w:sz w:val="16"/>
+          <w:szCs w:val="16"/>
+          <w:lang w:val="hu-HU"/>
+        </w:rPr>
+      </w:pPr>
+      <w:r>
+        <w:rPr>
+          <w:rFonts w:ascii="JetBrains Mono" w:hAnsi="JetBrains Mono" w:cs="JetBrains Mono"/>
+          <w:sz w:val="16"/>
+          <w:szCs w:val="16"/>
+          <w:lang w:val="hu-HU"/>
+        </w:rPr>
+        <w:t>                "</w:t>
+      </w:r>
+      <w:proofErr w:type="spellStart"/>
+      <w:r>
+        <w:rPr>
+          <w:rFonts w:ascii="JetBrains Mono" w:hAnsi="JetBrains Mono" w:cs="JetBrains Mono"/>
+          <w:sz w:val="16"/>
+          <w:szCs w:val="16"/>
+          <w:lang w:val="hu-HU"/>
+        </w:rPr>
+        <w:t>courseType</w:t>
+      </w:r>
+      <w:proofErr w:type="spellEnd"/>
+      <w:r>
+        <w:rPr>
+          <w:rFonts w:ascii="JetBrains Mono" w:hAnsi="JetBrains Mono" w:cs="JetBrains Mono"/>
+          <w:sz w:val="16"/>
+          <w:szCs w:val="16"/>
+          <w:lang w:val="hu-HU"/>
+        </w:rPr>
+        <w:t>": "</w:t>
+      </w:r>
+      <w:proofErr w:type="spellStart"/>
+      <w:r>
+        <w:rPr>
+          <w:rFonts w:ascii="JetBrains Mono" w:hAnsi="JetBrains Mono" w:cs="JetBrains Mono"/>
+          <w:sz w:val="16"/>
+          <w:szCs w:val="16"/>
+          <w:lang w:val="hu-HU"/>
+        </w:rPr>
+        <w:t>tutoring</w:t>
+      </w:r>
+      <w:proofErr w:type="spellEnd"/>
+      <w:r>
+        <w:rPr>
+          <w:rFonts w:ascii="JetBrains Mono" w:hAnsi="JetBrains Mono" w:cs="JetBrains Mono"/>
+          <w:sz w:val="16"/>
+          <w:szCs w:val="16"/>
+          <w:lang w:val="hu-HU"/>
+        </w:rPr>
+        <w:t xml:space="preserve"> | </w:t>
+      </w:r>
+      <w:proofErr w:type="spellStart"/>
+      <w:r>
+        <w:rPr>
+          <w:rFonts w:ascii="JetBrains Mono" w:hAnsi="JetBrains Mono" w:cs="JetBrains Mono"/>
+          <w:sz w:val="16"/>
+          <w:szCs w:val="16"/>
+          <w:lang w:val="hu-HU"/>
+        </w:rPr>
+        <w:t>learningPath</w:t>
+      </w:r>
+      <w:proofErr w:type="spellEnd"/>
+      <w:proofErr w:type="gramStart"/>
+      <w:r>
+        <w:rPr>
+          <w:rFonts w:ascii="JetBrains Mono" w:hAnsi="JetBrains Mono" w:cs="JetBrains Mono"/>
+          <w:sz w:val="16"/>
+          <w:szCs w:val="16"/>
+          <w:lang w:val="hu-HU"/>
+        </w:rPr>
+        <w:t>" ,</w:t>
+      </w:r>
+      <w:proofErr w:type="gramEnd"/>
+    </w:p>
+    <w:p>
+      <w:pPr>
+        <w:spacing w:after="0"/>
+        <w:rPr>
+          <w:rFonts w:ascii="JetBrains Mono" w:hAnsi="JetBrains Mono" w:cs="JetBrains Mono"/>
+          <w:sz w:val="16"/>
+          <w:szCs w:val="16"/>
+          <w:lang w:val="hu-HU"/>
+        </w:rPr>
+      </w:pPr>
+      <w:r>
+        <w:rPr>
+          <w:rFonts w:ascii="JetBrains Mono" w:hAnsi="JetBrains Mono" w:cs="JetBrains Mono"/>
+          <w:sz w:val="16"/>
+          <w:szCs w:val="16"/>
+          <w:lang w:val="hu-HU"/>
+        </w:rPr>
+        <w:t>                "</w:t>
+      </w:r>
+      <w:proofErr w:type="spellStart"/>
+      <w:r>
+        <w:rPr>
+          <w:rFonts w:ascii="JetBrains Mono" w:hAnsi="JetBrains Mono" w:cs="JetBrains Mono"/>
+          <w:sz w:val="16"/>
+          <w:szCs w:val="16"/>
+          <w:lang w:val="hu-HU"/>
+        </w:rPr>
+        <w:t>progress</w:t>
+      </w:r>
+      <w:proofErr w:type="spellEnd"/>
+      <w:r>
+        <w:rPr>
+          <w:rFonts w:ascii="JetBrains Mono" w:hAnsi="JetBrains Mono" w:cs="JetBrains Mono"/>
+          <w:sz w:val="16"/>
+          <w:szCs w:val="16"/>
+          <w:lang w:val="hu-HU"/>
+        </w:rPr>
+        <w:t>": 0,</w:t>
+      </w:r>
+    </w:p>
+    <w:p>
+      <w:pPr>
+        <w:spacing w:after="0"/>
+        <w:rPr>
+          <w:rFonts w:ascii="JetBrains Mono" w:hAnsi="JetBrains Mono" w:cs="JetBrains Mono"/>
+          <w:sz w:val="16"/>
+          <w:szCs w:val="16"/>
+          <w:lang w:val="hu-HU"/>
+        </w:rPr>
+      </w:pPr>
+      <w:r>
+        <w:rPr>
+          <w:rFonts w:ascii="JetBrains Mono" w:hAnsi="JetBrains Mono" w:cs="JetBrains Mono"/>
+          <w:sz w:val="16"/>
+          <w:szCs w:val="16"/>
+          <w:lang w:val="hu-HU"/>
+        </w:rPr>
+        <w:t>                "</w:t>
+      </w:r>
+      <w:proofErr w:type="spellStart"/>
+      <w:r>
+        <w:rPr>
+          <w:rFonts w:ascii="JetBrains Mono" w:hAnsi="JetBrains Mono" w:cs="JetBrains Mono"/>
+          <w:sz w:val="16"/>
+          <w:szCs w:val="16"/>
+          <w:lang w:val="hu-HU"/>
+        </w:rPr>
+        <w:t>upcomingEvents</w:t>
+      </w:r>
+      <w:proofErr w:type="spellEnd"/>
+      <w:proofErr w:type="gramStart"/>
+      <w:r>
+        <w:rPr>
+          <w:rFonts w:ascii="JetBrains Mono" w:hAnsi="JetBrains Mono" w:cs="JetBrains Mono"/>
+          <w:sz w:val="16"/>
+          <w:szCs w:val="16"/>
+          <w:lang w:val="hu-HU"/>
+        </w:rPr>
+        <w:t>":[</w:t>
+      </w:r>
+      <w:proofErr w:type="gramEnd"/>
+    </w:p>
+    <w:p>
+      <w:pPr>
+        <w:spacing w:after="0"/>
+        <w:rPr>
+          <w:rFonts w:ascii="JetBrains Mono" w:hAnsi="JetBrains Mono" w:cs="JetBrains Mono"/>
+          <w:sz w:val="16"/>
+          <w:szCs w:val="16"/>
+          <w:lang w:val="hu-HU"/>
+        </w:rPr>
+      </w:pPr>
+      <w:r>
+        <w:rPr>
+          <w:rFonts w:ascii="JetBrains Mono" w:hAnsi="JetBrains Mono" w:cs="JetBrains Mono"/>
+          <w:sz w:val="16"/>
+          <w:szCs w:val="16"/>
+          <w:lang w:val="hu-HU"/>
+        </w:rPr>
+        <w:t>                    {</w:t>
+      </w:r>
+    </w:p>
+    <w:p>
+      <w:pPr>
+        <w:spacing w:after="0"/>
+        <w:rPr>
+          <w:rFonts w:ascii="JetBrains Mono" w:hAnsi="JetBrains Mono" w:cs="JetBrains Mono"/>
+          <w:sz w:val="16"/>
+          <w:szCs w:val="16"/>
+          <w:lang w:val="hu-HU"/>
+        </w:rPr>
+      </w:pPr>
+      <w:r>
+        <w:rPr>
+          <w:rFonts w:ascii="JetBrains Mono" w:hAnsi="JetBrains Mono" w:cs="JetBrains Mono"/>
+          <w:sz w:val="16"/>
+          <w:szCs w:val="16"/>
+          <w:lang w:val="hu-HU"/>
+        </w:rPr>
+        <w:t>                        "</w:t>
+      </w:r>
+      <w:proofErr w:type="spellStart"/>
+      <w:r>
+        <w:rPr>
+          <w:rFonts w:ascii="JetBrains Mono" w:hAnsi="JetBrains Mono" w:cs="JetBrains Mono"/>
+          <w:sz w:val="16"/>
+          <w:szCs w:val="16"/>
+          <w:lang w:val="hu-HU"/>
+        </w:rPr>
+        <w:t>title</w:t>
+      </w:r>
+      <w:proofErr w:type="spellEnd"/>
+      <w:r>
+        <w:rPr>
+          <w:rFonts w:ascii="JetBrains Mono" w:hAnsi="JetBrains Mono" w:cs="JetBrains Mono"/>
+          <w:sz w:val="16"/>
+          <w:szCs w:val="16"/>
+          <w:lang w:val="hu-HU"/>
+        </w:rPr>
+        <w:t>": "</w:t>
+      </w:r>
+      <w:proofErr w:type="spellStart"/>
+      <w:r>
+        <w:rPr>
+          <w:rFonts w:ascii="JetBrains Mono" w:hAnsi="JetBrains Mono" w:cs="JetBrains Mono"/>
+          <w:sz w:val="16"/>
+          <w:szCs w:val="16"/>
+          <w:lang w:val="hu-HU"/>
+        </w:rPr>
+        <w:t>string</w:t>
+      </w:r>
+      <w:proofErr w:type="spellEnd"/>
+      <w:r>
+        <w:rPr>
+          <w:rFonts w:ascii="JetBrains Mono" w:hAnsi="JetBrains Mono" w:cs="JetBrains Mono"/>
+          <w:sz w:val="16"/>
+          <w:szCs w:val="16"/>
+          <w:lang w:val="hu-HU"/>
+        </w:rPr>
+        <w:t>",</w:t>
+      </w:r>
+    </w:p>
+    <w:p>
+      <w:pPr>
+        <w:spacing w:after="0"/>
+        <w:rPr>
+          <w:rFonts w:ascii="JetBrains Mono" w:hAnsi="JetBrains Mono" w:cs="JetBrains Mono"/>
+          <w:sz w:val="16"/>
+          <w:szCs w:val="16"/>
+          <w:lang w:val="hu-HU"/>
+        </w:rPr>
+      </w:pPr>
+      <w:r>
+        <w:rPr>
+          <w:rFonts w:ascii="JetBrains Mono" w:hAnsi="JetBrains Mono" w:cs="JetBrains Mono"/>
+          <w:sz w:val="16"/>
+          <w:szCs w:val="16"/>
+          <w:lang w:val="hu-HU"/>
+        </w:rPr>
+        <w:t>                        "</w:t>
+      </w:r>
+      <w:proofErr w:type="spellStart"/>
+      <w:r>
+        <w:rPr>
+          <w:rFonts w:ascii="JetBrains Mono" w:hAnsi="JetBrains Mono" w:cs="JetBrains Mono"/>
+          <w:sz w:val="16"/>
+          <w:szCs w:val="16"/>
+          <w:lang w:val="hu-HU"/>
+        </w:rPr>
+        <w:t>startDate</w:t>
+      </w:r>
+      <w:proofErr w:type="spellEnd"/>
+      <w:r>
+        <w:rPr>
+          <w:rFonts w:ascii="JetBrains Mono" w:hAnsi="JetBrains Mono" w:cs="JetBrains Mono"/>
+          <w:sz w:val="16"/>
+          <w:szCs w:val="16"/>
+          <w:lang w:val="hu-HU"/>
+        </w:rPr>
+        <w:t>": "2000-01-01T00:00:00.000",</w:t>
+      </w:r>
+    </w:p>
+    <w:p>
+      <w:pPr>
+        <w:spacing w:after="0"/>
+        <w:rPr>
+          <w:rFonts w:ascii="JetBrains Mono" w:hAnsi="JetBrains Mono" w:cs="JetBrains Mono"/>
+          <w:sz w:val="16"/>
+          <w:szCs w:val="16"/>
+          <w:lang w:val="hu-HU"/>
+        </w:rPr>
+      </w:pPr>
+      <w:r>
+        <w:rPr>
+          <w:rFonts w:ascii="JetBrains Mono" w:hAnsi="JetBrains Mono" w:cs="JetBrains Mono"/>
+          <w:sz w:val="16"/>
+          <w:szCs w:val="16"/>
+          <w:lang w:val="hu-HU"/>
+        </w:rPr>
+        <w:t>                        "</w:t>
+      </w:r>
+      <w:proofErr w:type="spellStart"/>
+      <w:r>
+        <w:rPr>
+          <w:rFonts w:ascii="JetBrains Mono" w:hAnsi="JetBrains Mono" w:cs="JetBrains Mono"/>
+          <w:sz w:val="16"/>
+          <w:szCs w:val="16"/>
+          <w:lang w:val="hu-HU"/>
+        </w:rPr>
+        <w:t>endDate</w:t>
+      </w:r>
+      <w:proofErr w:type="spellEnd"/>
+      <w:r>
+        <w:rPr>
+          <w:rFonts w:ascii="JetBrains Mono" w:hAnsi="JetBrains Mono" w:cs="JetBrains Mono"/>
+          <w:sz w:val="16"/>
+          <w:szCs w:val="16"/>
+          <w:lang w:val="hu-HU"/>
+        </w:rPr>
+        <w:t>": "2000-01-01T00:00:00.000",</w:t>
+      </w:r>
+    </w:p>
+    <w:p>
+      <w:pPr>
+        <w:spacing w:after="0"/>
+        <w:rPr>
+          <w:rFonts w:ascii="JetBrains Mono" w:hAnsi="JetBrains Mono" w:cs="JetBrains Mono"/>
+          <w:sz w:val="16"/>
+          <w:szCs w:val="16"/>
+          <w:lang w:val="hu-HU"/>
+        </w:rPr>
+      </w:pPr>
+      <w:r>
+        <w:rPr>
+          <w:rFonts w:ascii="JetBrains Mono" w:hAnsi="JetBrains Mono" w:cs="JetBrains Mono"/>
+          <w:sz w:val="16"/>
+          <w:szCs w:val="16"/>
+          <w:lang w:val="hu-HU"/>
+        </w:rPr>
+        <w:t>                        "</w:t>
+      </w:r>
+      <w:proofErr w:type="spellStart"/>
+      <w:r>
+        <w:rPr>
+          <w:rFonts w:ascii="JetBrains Mono" w:hAnsi="JetBrains Mono" w:cs="JetBrains Mono"/>
+          <w:sz w:val="16"/>
+          <w:szCs w:val="16"/>
+          <w:lang w:val="hu-HU"/>
+        </w:rPr>
+        <w:t>courseName</w:t>
+      </w:r>
+      <w:proofErr w:type="spellEnd"/>
+      <w:r>
+        <w:rPr>
+          <w:rFonts w:ascii="JetBrains Mono" w:hAnsi="JetBrains Mono" w:cs="JetBrains Mono"/>
+          <w:sz w:val="16"/>
+          <w:szCs w:val="16"/>
+          <w:lang w:val="hu-HU"/>
+        </w:rPr>
+        <w:t>": "</w:t>
+      </w:r>
+      <w:proofErr w:type="spellStart"/>
+      <w:r>
+        <w:rPr>
+          <w:rFonts w:ascii="JetBrains Mono" w:hAnsi="JetBrains Mono" w:cs="JetBrains Mono"/>
+          <w:sz w:val="16"/>
+          <w:szCs w:val="16"/>
+          <w:lang w:val="hu-HU"/>
+        </w:rPr>
+        <w:t>string</w:t>
+      </w:r>
+      <w:proofErr w:type="spellEnd"/>
+      <w:r>
+        <w:rPr>
+          <w:rFonts w:ascii="JetBrains Mono" w:hAnsi="JetBrains Mono" w:cs="JetBrains Mono"/>
+          <w:sz w:val="16"/>
+          <w:szCs w:val="16"/>
+          <w:lang w:val="hu-HU"/>
+        </w:rPr>
+        <w:t>",</w:t>
+      </w:r>
+    </w:p>
+    <w:p>
+      <w:pPr>
+        <w:spacing w:after="0"/>
+        <w:rPr>
+          <w:rFonts w:ascii="JetBrains Mono" w:hAnsi="JetBrains Mono" w:cs="JetBrains Mono"/>
+          <w:sz w:val="16"/>
+          <w:szCs w:val="16"/>
+          <w:lang w:val="hu-HU"/>
+        </w:rPr>
+      </w:pPr>
+      <w:r>
+        <w:rPr>
+          <w:rFonts w:ascii="JetBrains Mono" w:hAnsi="JetBrains Mono" w:cs="JetBrains Mono"/>
+          <w:sz w:val="16"/>
+          <w:szCs w:val="16"/>
+          <w:lang w:val="hu-HU"/>
+        </w:rPr>
+        <w:t>                        "</w:t>
+      </w:r>
+      <w:proofErr w:type="spellStart"/>
+      <w:r>
+        <w:rPr>
+          <w:rFonts w:ascii="JetBrains Mono" w:hAnsi="JetBrains Mono" w:cs="JetBrains Mono"/>
+          <w:sz w:val="16"/>
+          <w:szCs w:val="16"/>
+          <w:lang w:val="hu-HU"/>
+        </w:rPr>
+        <w:t>teacherName</w:t>
+      </w:r>
+      <w:proofErr w:type="spellEnd"/>
+      <w:r>
+        <w:rPr>
+          <w:rFonts w:ascii="JetBrains Mono" w:hAnsi="JetBrains Mono" w:cs="JetBrains Mono"/>
+          <w:sz w:val="16"/>
+          <w:szCs w:val="16"/>
+          <w:lang w:val="hu-HU"/>
+        </w:rPr>
+        <w:t>": "</w:t>
+      </w:r>
+      <w:proofErr w:type="spellStart"/>
+      <w:r>
+        <w:rPr>
+          <w:rFonts w:ascii="JetBrains Mono" w:hAnsi="JetBrains Mono" w:cs="JetBrains Mono"/>
+          <w:sz w:val="16"/>
+          <w:szCs w:val="16"/>
+          <w:lang w:val="hu-HU"/>
+        </w:rPr>
+        <w:t>string</w:t>
+      </w:r>
+      <w:proofErr w:type="spellEnd"/>
+      <w:r>
+        <w:rPr>
+          <w:rFonts w:ascii="JetBrains Mono" w:hAnsi="JetBrains Mono" w:cs="JetBrains Mono"/>
+          <w:sz w:val="16"/>
+          <w:szCs w:val="16"/>
+          <w:lang w:val="hu-HU"/>
+        </w:rPr>
+        <w:t>",</w:t>
+      </w:r>
+    </w:p>
+    <w:p>
+      <w:pPr>
+        <w:spacing w:after="0"/>
+        <w:rPr>
+          <w:rFonts w:ascii="JetBrains Mono" w:hAnsi="JetBrains Mono" w:cs="JetBrains Mono"/>
+          <w:sz w:val="16"/>
+          <w:szCs w:val="16"/>
+          <w:lang w:val="hu-HU"/>
+        </w:rPr>
+      </w:pPr>
+      <w:r>
+        <w:rPr>
+          <w:rFonts w:ascii="JetBrains Mono" w:hAnsi="JetBrains Mono" w:cs="JetBrains Mono"/>
+          <w:sz w:val="16"/>
+          <w:szCs w:val="16"/>
+          <w:lang w:val="hu-HU"/>
+        </w:rPr>
+        <w:t>                        "</w:t>
+      </w:r>
+      <w:proofErr w:type="spellStart"/>
+      <w:r>
+        <w:rPr>
+          <w:rFonts w:ascii="JetBrains Mono" w:hAnsi="JetBrains Mono" w:cs="JetBrains Mono"/>
+          <w:sz w:val="16"/>
+          <w:szCs w:val="16"/>
+          <w:lang w:val="hu-HU"/>
+        </w:rPr>
+        <w:t>eventType</w:t>
+      </w:r>
+      <w:proofErr w:type="spellEnd"/>
+      <w:r>
+        <w:rPr>
+          <w:rFonts w:ascii="JetBrains Mono" w:hAnsi="JetBrains Mono" w:cs="JetBrains Mono"/>
+          <w:sz w:val="16"/>
+          <w:szCs w:val="16"/>
+          <w:lang w:val="hu-HU"/>
+        </w:rPr>
+        <w:t>": "</w:t>
+      </w:r>
+      <w:proofErr w:type="spellStart"/>
+      <w:r>
+        <w:rPr>
+          <w:rFonts w:ascii="JetBrains Mono" w:hAnsi="JetBrains Mono" w:cs="JetBrains Mono"/>
+          <w:sz w:val="16"/>
+          <w:szCs w:val="16"/>
+          <w:lang w:val="hu-HU"/>
+        </w:rPr>
+        <w:t>lesson</w:t>
+      </w:r>
+      <w:proofErr w:type="spellEnd"/>
+      <w:r>
+        <w:rPr>
+          <w:rFonts w:ascii="JetBrains Mono" w:hAnsi="JetBrains Mono" w:cs="JetBrains Mono"/>
+          <w:sz w:val="16"/>
+          <w:szCs w:val="16"/>
+          <w:lang w:val="hu-HU"/>
+        </w:rPr>
+        <w:t xml:space="preserve"> | </w:t>
+      </w:r>
+      <w:proofErr w:type="spellStart"/>
+      <w:r>
+        <w:rPr>
+          <w:rFonts w:ascii="JetBrains Mono" w:hAnsi="JetBrains Mono" w:cs="JetBrains Mono"/>
+          <w:sz w:val="16"/>
+          <w:szCs w:val="16"/>
+          <w:lang w:val="hu-HU"/>
+        </w:rPr>
+        <w:t>deadline</w:t>
+      </w:r>
+      <w:proofErr w:type="spellEnd"/>
+      <w:r>
+        <w:rPr>
+          <w:rFonts w:ascii="JetBrains Mono" w:hAnsi="JetBrains Mono" w:cs="JetBrains Mono"/>
+          <w:sz w:val="16"/>
+          <w:szCs w:val="16"/>
+          <w:lang w:val="hu-HU"/>
+        </w:rPr>
+        <w:t>",</w:t>
+      </w:r>
+    </w:p>
+    <w:p>
+      <w:pPr>
+        <w:spacing w:after="0"/>
+        <w:rPr>
+          <w:rFonts w:ascii="JetBrains Mono" w:hAnsi="JetBrains Mono" w:cs="JetBrains Mono"/>
+          <w:sz w:val="16"/>
+          <w:szCs w:val="16"/>
+          <w:lang w:val="hu-HU"/>
+        </w:rPr>
+      </w:pPr>
+      <w:r>
+        <w:rPr>
+          <w:rFonts w:ascii="JetBrains Mono" w:hAnsi="JetBrains Mono" w:cs="JetBrains Mono"/>
+          <w:sz w:val="16"/>
+          <w:szCs w:val="16"/>
+          <w:lang w:val="hu-HU"/>
+        </w:rPr>
+        <w:t>                        "</w:t>
+      </w:r>
+      <w:proofErr w:type="spellStart"/>
+      <w:r>
+        <w:rPr>
+          <w:rFonts w:ascii="JetBrains Mono" w:hAnsi="JetBrains Mono" w:cs="JetBrains Mono"/>
+          <w:sz w:val="16"/>
+          <w:szCs w:val="16"/>
+          <w:lang w:val="hu-HU"/>
+        </w:rPr>
+        <w:t>description</w:t>
+      </w:r>
+      <w:proofErr w:type="spellEnd"/>
+      <w:r>
+        <w:rPr>
+          <w:rFonts w:ascii="JetBrains Mono" w:hAnsi="JetBrains Mono" w:cs="JetBrains Mono"/>
+          <w:sz w:val="16"/>
+          <w:szCs w:val="16"/>
+          <w:lang w:val="hu-HU"/>
+        </w:rPr>
+        <w:t>": "</w:t>
+      </w:r>
+      <w:proofErr w:type="spellStart"/>
+      <w:r>
+        <w:rPr>
+          <w:rFonts w:ascii="JetBrains Mono" w:hAnsi="JetBrains Mono" w:cs="JetBrains Mono"/>
+          <w:sz w:val="16"/>
+          <w:szCs w:val="16"/>
+          <w:lang w:val="hu-HU"/>
+        </w:rPr>
+        <w:t>string</w:t>
+      </w:r>
+      <w:proofErr w:type="spellEnd"/>
+      <w:r>
+        <w:rPr>
+          <w:rFonts w:ascii="JetBrains Mono" w:hAnsi="JetBrains Mono" w:cs="JetBrains Mono"/>
+          <w:sz w:val="16"/>
+          <w:szCs w:val="16"/>
+          <w:lang w:val="hu-HU"/>
+        </w:rPr>
+        <w:t>"</w:t>
+      </w:r>
+    </w:p>
+    <w:p>
+      <w:pPr>
+        <w:spacing w:after="0"/>
+        <w:rPr>
+          <w:rFonts w:ascii="JetBrains Mono" w:hAnsi="JetBrains Mono" w:cs="JetBrains Mono"/>
+          <w:sz w:val="16"/>
+          <w:szCs w:val="16"/>
+          <w:lang w:val="hu-HU"/>
+        </w:rPr>
+      </w:pPr>
+      <w:r>
+        <w:rPr>
+          <w:rFonts w:ascii="JetBrains Mono" w:hAnsi="JetBrains Mono" w:cs="JetBrains Mono"/>
+          <w:sz w:val="16"/>
+          <w:szCs w:val="16"/>
+          <w:lang w:val="hu-HU"/>
+        </w:rPr>
+        <w:t>                    }</w:t>
+      </w:r>
+    </w:p>
+    <w:p>
+      <w:pPr>
+        <w:spacing w:after="0"/>
+        <w:rPr>
+          <w:rFonts w:ascii="JetBrains Mono" w:hAnsi="JetBrains Mono" w:cs="JetBrains Mono"/>
+          <w:sz w:val="16"/>
+          <w:szCs w:val="16"/>
+          <w:lang w:val="hu-HU"/>
+        </w:rPr>
+      </w:pPr>
+      <w:r>
+        <w:rPr>
+          <w:rFonts w:ascii="JetBrains Mono" w:hAnsi="JetBrains Mono" w:cs="JetBrains Mono"/>
+          <w:sz w:val="16"/>
+          <w:szCs w:val="16"/>
+          <w:lang w:val="hu-HU"/>
+        </w:rPr>
+        <w:t>            ]</w:t>
+      </w:r>
+    </w:p>
+    <w:p>
+      <w:pPr>
+        <w:spacing w:after="0"/>
+        <w:rPr>
+          <w:rFonts w:ascii="JetBrains Mono" w:hAnsi="JetBrains Mono" w:cs="JetBrains Mono"/>
+          <w:sz w:val="16"/>
+          <w:szCs w:val="16"/>
+          <w:lang w:val="hu-HU"/>
+        </w:rPr>
+      </w:pPr>
+      <w:r>
+        <w:rPr>
+          <w:rFonts w:ascii="JetBrains Mono" w:hAnsi="JetBrains Mono" w:cs="JetBrains Mono"/>
+          <w:sz w:val="16"/>
+          <w:szCs w:val="16"/>
+          <w:lang w:val="hu-HU"/>
+        </w:rPr>
+        <w:t>            }</w:t>
+      </w:r>
+    </w:p>
+    <w:p>
+      <w:pPr>
+        <w:spacing w:after="0"/>
+        <w:rPr>
+          <w:rFonts w:ascii="JetBrains Mono" w:hAnsi="JetBrains Mono" w:cs="JetBrains Mono"/>
+          <w:sz w:val="16"/>
+          <w:szCs w:val="16"/>
+          <w:lang w:val="hu-HU"/>
+        </w:rPr>
+      </w:pPr>
+      <w:r>
+        <w:rPr>
+          <w:rFonts w:ascii="JetBrains Mono" w:hAnsi="JetBrains Mono" w:cs="JetBrains Mono"/>
+          <w:sz w:val="16"/>
+          <w:szCs w:val="16"/>
+          <w:lang w:val="hu-HU"/>
+        </w:rPr>
+        <w:t>        ],</w:t>
+      </w:r>
+    </w:p>
+    <w:p>
+      <w:pPr>
+        <w:spacing w:after="0"/>
+        <w:rPr>
+          <w:rFonts w:ascii="JetBrains Mono" w:hAnsi="JetBrains Mono" w:cs="JetBrains Mono"/>
+          <w:sz w:val="16"/>
+          <w:szCs w:val="16"/>
+          <w:lang w:val="hu-HU"/>
+        </w:rPr>
+      </w:pPr>
+      <w:r>
+        <w:rPr>
+          <w:rFonts w:ascii="JetBrains Mono" w:hAnsi="JetBrains Mono" w:cs="JetBrains Mono"/>
+          <w:sz w:val="16"/>
+          <w:szCs w:val="16"/>
+          <w:lang w:val="hu-HU"/>
+        </w:rPr>
+        <w:t>        "</w:t>
+      </w:r>
+      <w:proofErr w:type="spellStart"/>
+      <w:r>
+        <w:rPr>
+          <w:rFonts w:ascii="JetBrains Mono" w:hAnsi="JetBrains Mono" w:cs="JetBrains Mono"/>
+          <w:sz w:val="16"/>
+          <w:szCs w:val="16"/>
+          <w:lang w:val="hu-HU"/>
+        </w:rPr>
+        <w:t>inactive</w:t>
+      </w:r>
+      <w:proofErr w:type="spellEnd"/>
+      <w:proofErr w:type="gramStart"/>
+      <w:r>
+        <w:rPr>
+          <w:rFonts w:ascii="JetBrains Mono" w:hAnsi="JetBrains Mono" w:cs="JetBrains Mono"/>
+          <w:sz w:val="16"/>
+          <w:szCs w:val="16"/>
+          <w:lang w:val="hu-HU"/>
+        </w:rPr>
+        <w:t>":[</w:t>
+      </w:r>
+      <w:proofErr w:type="gramEnd"/>
+    </w:p>
+    <w:p>
+      <w:pPr>
+        <w:spacing w:after="0"/>
+        <w:rPr>
+          <w:rFonts w:ascii="JetBrains Mono" w:hAnsi="JetBrains Mono" w:cs="JetBrains Mono"/>
+          <w:sz w:val="16"/>
+          <w:szCs w:val="16"/>
+          <w:lang w:val="hu-HU"/>
+        </w:rPr>
+      </w:pPr>
+      <w:r>
+        <w:rPr>
+          <w:rFonts w:ascii="JetBrains Mono" w:hAnsi="JetBrains Mono" w:cs="JetBrains Mono"/>
+          <w:sz w:val="16"/>
+          <w:szCs w:val="16"/>
+          <w:lang w:val="hu-HU"/>
+        </w:rPr>
+        <w:t>             {</w:t>
+      </w:r>
+    </w:p>
+    <w:p>
+      <w:pPr>
+        <w:spacing w:after="0"/>
+        <w:rPr>
+          <w:rFonts w:ascii="JetBrains Mono" w:hAnsi="JetBrains Mono" w:cs="JetBrains Mono"/>
+          <w:sz w:val="16"/>
+          <w:szCs w:val="16"/>
+          <w:lang w:val="hu-HU"/>
+        </w:rPr>
+      </w:pPr>
+      <w:r>
+        <w:rPr>
+          <w:rFonts w:ascii="JetBrains Mono" w:hAnsi="JetBrains Mono" w:cs="JetBrains Mono"/>
+          <w:sz w:val="16"/>
+          <w:szCs w:val="16"/>
+          <w:lang w:val="hu-HU"/>
+        </w:rPr>
+        <w:t>                "</w:t>
+      </w:r>
+      <w:proofErr w:type="spellStart"/>
+      <w:r>
+        <w:rPr>
+          <w:rFonts w:ascii="JetBrains Mono" w:hAnsi="JetBrains Mono" w:cs="JetBrains Mono"/>
+          <w:sz w:val="16"/>
+          <w:szCs w:val="16"/>
+          <w:lang w:val="hu-HU"/>
+        </w:rPr>
+        <w:t>id</w:t>
+      </w:r>
+      <w:proofErr w:type="spellEnd"/>
+      <w:r>
+        <w:rPr>
+          <w:rFonts w:ascii="JetBrains Mono" w:hAnsi="JetBrains Mono" w:cs="JetBrains Mono"/>
+          <w:sz w:val="16"/>
+          <w:szCs w:val="16"/>
+          <w:lang w:val="hu-HU"/>
+        </w:rPr>
+        <w:t>":"</w:t>
+      </w:r>
+      <w:proofErr w:type="spellStart"/>
+      <w:r>
+        <w:rPr>
+          <w:rFonts w:ascii="JetBrains Mono" w:hAnsi="JetBrains Mono" w:cs="JetBrains Mono"/>
+          <w:sz w:val="16"/>
+          <w:szCs w:val="16"/>
+          <w:lang w:val="hu-HU"/>
+        </w:rPr>
+        <w:t>uuid</w:t>
+      </w:r>
+      <w:proofErr w:type="spellEnd"/>
+      <w:r>
+        <w:rPr>
+          <w:rFonts w:ascii="JetBrains Mono" w:hAnsi="JetBrains Mono" w:cs="JetBrains Mono"/>
+          <w:sz w:val="16"/>
+          <w:szCs w:val="16"/>
+          <w:lang w:val="hu-HU"/>
+        </w:rPr>
+        <w:t>",</w:t>
+      </w:r>
+    </w:p>
+    <w:p>
+      <w:pPr>
+        <w:spacing w:after="0"/>
+        <w:rPr>
+          <w:rFonts w:ascii="JetBrains Mono" w:hAnsi="JetBrains Mono" w:cs="JetBrains Mono"/>
+          <w:sz w:val="16"/>
+          <w:szCs w:val="16"/>
+          <w:lang w:val="hu-HU"/>
+        </w:rPr>
+      </w:pPr>
+      <w:r>
+        <w:rPr>
+          <w:rFonts w:ascii="JetBrains Mono" w:hAnsi="JetBrains Mono" w:cs="JetBrains Mono"/>
+          <w:sz w:val="16"/>
+          <w:szCs w:val="16"/>
+          <w:lang w:val="hu-HU"/>
+        </w:rPr>
+        <w:t>                "</w:t>
+      </w:r>
+      <w:proofErr w:type="spellStart"/>
+      <w:r>
+        <w:rPr>
+          <w:rFonts w:ascii="JetBrains Mono" w:hAnsi="JetBrains Mono" w:cs="JetBrains Mono"/>
+          <w:sz w:val="16"/>
+          <w:szCs w:val="16"/>
+          <w:lang w:val="hu-HU"/>
+        </w:rPr>
+        <w:t>courseName</w:t>
+      </w:r>
+      <w:proofErr w:type="spellEnd"/>
+      <w:r>
+        <w:rPr>
+          <w:rFonts w:ascii="JetBrains Mono" w:hAnsi="JetBrains Mono" w:cs="JetBrains Mono"/>
+          <w:sz w:val="16"/>
+          <w:szCs w:val="16"/>
+          <w:lang w:val="hu-HU"/>
+        </w:rPr>
+        <w:t>": "</w:t>
+      </w:r>
+      <w:proofErr w:type="spellStart"/>
+      <w:r>
+        <w:rPr>
+          <w:rFonts w:ascii="JetBrains Mono" w:hAnsi="JetBrains Mono" w:cs="JetBrains Mono"/>
+          <w:sz w:val="16"/>
+          <w:szCs w:val="16"/>
+          <w:lang w:val="hu-HU"/>
+        </w:rPr>
+        <w:t>string</w:t>
+      </w:r>
+      <w:proofErr w:type="spellEnd"/>
+      <w:r>
+        <w:rPr>
+          <w:rFonts w:ascii="JetBrains Mono" w:hAnsi="JetBrains Mono" w:cs="JetBrains Mono"/>
+          <w:sz w:val="16"/>
+          <w:szCs w:val="16"/>
+          <w:lang w:val="hu-HU"/>
+        </w:rPr>
+        <w:t>",</w:t>
+      </w:r>
+    </w:p>
+    <w:p>
+      <w:pPr>
+        <w:spacing w:after="0"/>
+        <w:rPr>
+          <w:rFonts w:ascii="JetBrains Mono" w:hAnsi="JetBrains Mono" w:cs="JetBrains Mono"/>
+          <w:sz w:val="16"/>
+          <w:szCs w:val="16"/>
+          <w:lang w:val="hu-HU"/>
+        </w:rPr>
+      </w:pPr>
+      <w:r>
+        <w:rPr>
+          <w:rFonts w:ascii="JetBrains Mono" w:hAnsi="JetBrains Mono" w:cs="JetBrains Mono"/>
+          <w:sz w:val="16"/>
+          <w:szCs w:val="16"/>
+          <w:lang w:val="hu-HU"/>
+        </w:rPr>
+        <w:t>                "</w:t>
+      </w:r>
+      <w:proofErr w:type="spellStart"/>
+      <w:r>
+        <w:rPr>
+          <w:rFonts w:ascii="JetBrains Mono" w:hAnsi="JetBrains Mono" w:cs="JetBrains Mono"/>
+          <w:sz w:val="16"/>
+          <w:szCs w:val="16"/>
+          <w:lang w:val="hu-HU"/>
+        </w:rPr>
+        <w:t>imageUrl</w:t>
+      </w:r>
+      <w:proofErr w:type="spellEnd"/>
+      <w:r>
+        <w:rPr>
+          <w:rFonts w:ascii="JetBrains Mono" w:hAnsi="JetBrains Mono" w:cs="JetBrains Mono"/>
+          <w:sz w:val="16"/>
+          <w:szCs w:val="16"/>
+          <w:lang w:val="hu-HU"/>
+        </w:rPr>
+        <w:t>": "</w:t>
+      </w:r>
+      <w:proofErr w:type="spellStart"/>
+      <w:r>
+        <w:rPr>
+          <w:rFonts w:ascii="JetBrains Mono" w:hAnsi="JetBrains Mono" w:cs="JetBrains Mono"/>
+          <w:sz w:val="16"/>
+          <w:szCs w:val="16"/>
+          <w:lang w:val="hu-HU"/>
+        </w:rPr>
+        <w:t>string</w:t>
+      </w:r>
+      <w:proofErr w:type="spellEnd"/>
+      <w:r>
+        <w:rPr>
+          <w:rFonts w:ascii="JetBrains Mono" w:hAnsi="JetBrains Mono" w:cs="JetBrains Mono"/>
+          <w:sz w:val="16"/>
+          <w:szCs w:val="16"/>
+          <w:lang w:val="hu-HU"/>
+        </w:rPr>
+        <w:t>",</w:t>
+      </w:r>
+    </w:p>
+    <w:p>
+      <w:pPr>
+        <w:spacing w:after="0"/>
+        <w:rPr>
+          <w:rFonts w:ascii="JetBrains Mono" w:hAnsi="JetBrains Mono" w:cs="JetBrains Mono"/>
+          <w:sz w:val="16"/>
+          <w:szCs w:val="16"/>
+          <w:lang w:val="hu-HU"/>
+        </w:rPr>
+      </w:pPr>
+      <w:r>
+        <w:rPr>
+          <w:rFonts w:ascii="JetBrains Mono" w:hAnsi="JetBrains Mono" w:cs="JetBrains Mono"/>
+          <w:sz w:val="16"/>
+          <w:szCs w:val="16"/>
+          <w:lang w:val="hu-HU"/>
+        </w:rPr>
+        <w:t>                "</w:t>
+      </w:r>
+      <w:proofErr w:type="spellStart"/>
+      <w:r>
+        <w:rPr>
+          <w:rFonts w:ascii="JetBrains Mono" w:hAnsi="JetBrains Mono" w:cs="JetBrains Mono"/>
+          <w:sz w:val="16"/>
+          <w:szCs w:val="16"/>
+          <w:lang w:val="hu-HU"/>
+        </w:rPr>
+        <w:t>teacherName</w:t>
+      </w:r>
+      <w:proofErr w:type="spellEnd"/>
+      <w:r>
+        <w:rPr>
+          <w:rFonts w:ascii="JetBrains Mono" w:hAnsi="JetBrains Mono" w:cs="JetBrains Mono"/>
+          <w:sz w:val="16"/>
+          <w:szCs w:val="16"/>
+          <w:lang w:val="hu-HU"/>
+        </w:rPr>
+        <w:t>": "</w:t>
+      </w:r>
+      <w:proofErr w:type="spellStart"/>
+      <w:r>
+        <w:rPr>
+          <w:rFonts w:ascii="JetBrains Mono" w:hAnsi="JetBrains Mono" w:cs="JetBrains Mono"/>
+          <w:sz w:val="16"/>
+          <w:szCs w:val="16"/>
+          <w:lang w:val="hu-HU"/>
+        </w:rPr>
+        <w:t>string</w:t>
+      </w:r>
+      <w:proofErr w:type="spellEnd"/>
+      <w:r>
+        <w:rPr>
+          <w:rFonts w:ascii="JetBrains Mono" w:hAnsi="JetBrains Mono" w:cs="JetBrains Mono"/>
+          <w:sz w:val="16"/>
+          <w:szCs w:val="16"/>
+          <w:lang w:val="hu-HU"/>
+        </w:rPr>
+        <w:t>",</w:t>
+      </w:r>
+    </w:p>
+    <w:p>
+      <w:pPr>
+        <w:spacing w:after="0"/>
+        <w:rPr>
+          <w:rFonts w:ascii="JetBrains Mono" w:hAnsi="JetBrains Mono" w:cs="JetBrains Mono"/>
+          <w:sz w:val="16"/>
+          <w:szCs w:val="16"/>
+          <w:lang w:val="hu-HU"/>
+        </w:rPr>
+      </w:pPr>
+      <w:r>
+        <w:rPr>
+          <w:rFonts w:ascii="JetBrains Mono" w:hAnsi="JetBrains Mono" w:cs="JetBrains Mono"/>
+          <w:sz w:val="16"/>
+          <w:szCs w:val="16"/>
+          <w:lang w:val="hu-HU"/>
+        </w:rPr>
+        <w:t>                "</w:t>
+      </w:r>
+      <w:proofErr w:type="spellStart"/>
+      <w:r>
+        <w:rPr>
+          <w:rFonts w:ascii="JetBrains Mono" w:hAnsi="JetBrains Mono" w:cs="JetBrains Mono"/>
+          <w:sz w:val="16"/>
+          <w:szCs w:val="16"/>
+          <w:lang w:val="hu-HU"/>
+        </w:rPr>
+        <w:t>courseType</w:t>
+      </w:r>
+      <w:proofErr w:type="spellEnd"/>
+      <w:r>
+        <w:rPr>
+          <w:rFonts w:ascii="JetBrains Mono" w:hAnsi="JetBrains Mono" w:cs="JetBrains Mono"/>
+          <w:sz w:val="16"/>
+          <w:szCs w:val="16"/>
+          <w:lang w:val="hu-HU"/>
+        </w:rPr>
+        <w:t>": "</w:t>
+      </w:r>
+      <w:proofErr w:type="spellStart"/>
+      <w:r>
+        <w:rPr>
+          <w:rFonts w:ascii="JetBrains Mono" w:hAnsi="JetBrains Mono" w:cs="JetBrains Mono"/>
+          <w:sz w:val="16"/>
+          <w:szCs w:val="16"/>
+          <w:lang w:val="hu-HU"/>
+        </w:rPr>
+        <w:t>tutoring</w:t>
+      </w:r>
+      <w:proofErr w:type="spellEnd"/>
+      <w:r>
+        <w:rPr>
+          <w:rFonts w:ascii="JetBrains Mono" w:hAnsi="JetBrains Mono" w:cs="JetBrains Mono"/>
+          <w:sz w:val="16"/>
+          <w:szCs w:val="16"/>
+          <w:lang w:val="hu-HU"/>
+        </w:rPr>
+        <w:t xml:space="preserve"> | </w:t>
+      </w:r>
+      <w:proofErr w:type="spellStart"/>
+      <w:r>
+        <w:rPr>
+          <w:rFonts w:ascii="JetBrains Mono" w:hAnsi="JetBrains Mono" w:cs="JetBrains Mono"/>
+          <w:sz w:val="16"/>
+          <w:szCs w:val="16"/>
+          <w:lang w:val="hu-HU"/>
+        </w:rPr>
+        <w:t>learningPath</w:t>
+      </w:r>
+      <w:proofErr w:type="spellEnd"/>
+      <w:r>
+        <w:rPr>
+          <w:rFonts w:ascii="JetBrains Mono" w:hAnsi="JetBrains Mono" w:cs="JetBrains Mono"/>
+          <w:sz w:val="16"/>
+          <w:szCs w:val="16"/>
+          <w:lang w:val="hu-HU"/>
+        </w:rPr>
+        <w:t>",</w:t>
+      </w:r>
+    </w:p>
+    <w:p>
+      <w:pPr>
+        <w:spacing w:after="0"/>
+        <w:rPr>
+          <w:rFonts w:ascii="JetBrains Mono" w:hAnsi="JetBrains Mono" w:cs="JetBrains Mono"/>
+          <w:sz w:val="16"/>
+          <w:szCs w:val="16"/>
+          <w:lang w:val="hu-HU"/>
+        </w:rPr>
+      </w:pPr>
+      <w:r>
+        <w:rPr>
+          <w:rFonts w:ascii="JetBrains Mono" w:hAnsi="JetBrains Mono" w:cs="JetBrains Mono"/>
+          <w:sz w:val="16"/>
+          <w:szCs w:val="16"/>
+          <w:lang w:val="hu-HU"/>
+        </w:rPr>
+        <w:t>                "</w:t>
+      </w:r>
+      <w:proofErr w:type="spellStart"/>
+      <w:r>
+        <w:rPr>
+          <w:rFonts w:ascii="JetBrains Mono" w:hAnsi="JetBrains Mono" w:cs="JetBrains Mono"/>
+          <w:sz w:val="16"/>
+          <w:szCs w:val="16"/>
+          <w:lang w:val="hu-HU"/>
+        </w:rPr>
+        <w:t>progress</w:t>
+      </w:r>
+      <w:proofErr w:type="spellEnd"/>
+      <w:r>
+        <w:rPr>
+          <w:rFonts w:ascii="JetBrains Mono" w:hAnsi="JetBrains Mono" w:cs="JetBrains Mono"/>
+          <w:sz w:val="16"/>
+          <w:szCs w:val="16"/>
+          <w:lang w:val="hu-HU"/>
+        </w:rPr>
+        <w:t>": 0</w:t>
+      </w:r>
+    </w:p>
+    <w:p>
+      <w:pPr>
+        <w:spacing w:after="0"/>
+        <w:rPr>
+          <w:rFonts w:ascii="JetBrains Mono" w:hAnsi="JetBrains Mono" w:cs="JetBrains Mono"/>
+          <w:sz w:val="16"/>
+          <w:szCs w:val="16"/>
+          <w:lang w:val="hu-HU"/>
+        </w:rPr>
+      </w:pPr>
+      <w:r>
+        <w:rPr>
+          <w:rFonts w:ascii="JetBrains Mono" w:hAnsi="JetBrains Mono" w:cs="JetBrains Mono"/>
+          <w:sz w:val="16"/>
+          <w:szCs w:val="16"/>
+          <w:lang w:val="hu-HU"/>
+        </w:rPr>
+        <w:t>            }</w:t>
+      </w:r>
+    </w:p>
+    <w:p>
+      <w:pPr>
+        <w:spacing w:after="0"/>
+        <w:rPr>
+          <w:rFonts w:ascii="JetBrains Mono" w:hAnsi="JetBrains Mono" w:cs="JetBrains Mono"/>
+          <w:sz w:val="16"/>
+          <w:szCs w:val="16"/>
+          <w:lang w:val="hu-HU"/>
+        </w:rPr>
+      </w:pPr>
+      <w:r>
+        <w:rPr>
+          <w:rFonts w:ascii="JetBrains Mono" w:hAnsi="JetBrains Mono" w:cs="JetBrains Mono"/>
+          <w:sz w:val="16"/>
+          <w:szCs w:val="16"/>
+          <w:lang w:val="hu-HU"/>
+        </w:rPr>
+        <w:t>        ]</w:t>
+      </w:r>
+    </w:p>
+    <w:p>
+      <w:pPr>
+        <w:spacing w:after="0"/>
+        <w:rPr>
+          <w:rFonts w:ascii="JetBrains Mono" w:hAnsi="JetBrains Mono" w:cs="JetBrains Mono"/>
+          <w:sz w:val="16"/>
+          <w:szCs w:val="16"/>
+          <w:lang w:val="hu-HU"/>
+        </w:rPr>
+      </w:pPr>
+      <w:r>
+        <w:rPr>
+          <w:rFonts w:ascii="JetBrains Mono" w:hAnsi="JetBrains Mono" w:cs="JetBrains Mono"/>
+          <w:sz w:val="16"/>
+          <w:szCs w:val="16"/>
+          <w:lang w:val="hu-HU"/>
+        </w:rPr>
+        <w:t>    },</w:t>
+      </w:r>
+    </w:p>
+    <w:p>
+      <w:pPr>
+        <w:spacing w:after="0"/>
+        <w:rPr>
+          <w:rFonts w:ascii="JetBrains Mono" w:hAnsi="JetBrains Mono" w:cs="JetBrains Mono"/>
+          <w:sz w:val="16"/>
+          <w:szCs w:val="16"/>
+          <w:lang w:val="hu-HU"/>
+        </w:rPr>
+      </w:pPr>
+      <w:r>
+        <w:rPr>
+          <w:rFonts w:ascii="JetBrains Mono" w:hAnsi="JetBrains Mono" w:cs="JetBrains Mono"/>
+          <w:sz w:val="16"/>
+          <w:szCs w:val="16"/>
+          <w:lang w:val="hu-HU"/>
+        </w:rPr>
+        <w:t>    "</w:t>
+      </w:r>
+      <w:proofErr w:type="spellStart"/>
+      <w:r>
+        <w:rPr>
+          <w:rFonts w:ascii="JetBrains Mono" w:hAnsi="JetBrains Mono" w:cs="JetBrains Mono"/>
+          <w:sz w:val="16"/>
+          <w:szCs w:val="16"/>
+          <w:lang w:val="hu-HU"/>
+        </w:rPr>
+        <w:t>upcomingEvents</w:t>
+      </w:r>
+      <w:proofErr w:type="spellEnd"/>
+      <w:r>
+        <w:rPr>
+          <w:rFonts w:ascii="JetBrains Mono" w:hAnsi="JetBrains Mono" w:cs="JetBrains Mono"/>
+          <w:sz w:val="16"/>
+          <w:szCs w:val="16"/>
+          <w:lang w:val="hu-HU"/>
+        </w:rPr>
+        <w:t>": [</w:t>
+      </w:r>
+    </w:p>
+    <w:p>
+      <w:pPr>
+        <w:spacing w:after="0"/>
+        <w:rPr>
+          <w:rFonts w:ascii="JetBrains Mono" w:hAnsi="JetBrains Mono" w:cs="JetBrains Mono"/>
+          <w:sz w:val="16"/>
+          <w:szCs w:val="16"/>
+          <w:lang w:val="hu-HU"/>
+        </w:rPr>
+      </w:pPr>
+      <w:r>
+        <w:rPr>
+          <w:rFonts w:ascii="JetBrains Mono" w:hAnsi="JetBrains Mono" w:cs="JetBrains Mono"/>
+          <w:sz w:val="16"/>
+          <w:szCs w:val="16"/>
+          <w:lang w:val="hu-HU"/>
+        </w:rPr>
+        <w:t>        {</w:t>
+      </w:r>
+    </w:p>
+    <w:p>
+      <w:pPr>
+        <w:spacing w:after="0"/>
+        <w:rPr>
+          <w:rFonts w:ascii="JetBrains Mono" w:hAnsi="JetBrains Mono" w:cs="JetBrains Mono"/>
+          <w:sz w:val="16"/>
+          <w:szCs w:val="16"/>
+          <w:lang w:val="hu-HU"/>
+        </w:rPr>
+      </w:pPr>
+      <w:r>
+        <w:rPr>
+          <w:rFonts w:ascii="JetBrains Mono" w:hAnsi="JetBrains Mono" w:cs="JetBrains Mono"/>
+          <w:sz w:val="16"/>
+          <w:szCs w:val="16"/>
+          <w:lang w:val="hu-HU"/>
+        </w:rPr>
+        <w:t>            "</w:t>
+      </w:r>
+      <w:proofErr w:type="spellStart"/>
+      <w:r>
+        <w:rPr>
+          <w:rFonts w:ascii="JetBrains Mono" w:hAnsi="JetBrains Mono" w:cs="JetBrains Mono"/>
+          <w:sz w:val="16"/>
+          <w:szCs w:val="16"/>
+          <w:lang w:val="hu-HU"/>
+        </w:rPr>
+        <w:t>id</w:t>
+      </w:r>
+      <w:proofErr w:type="spellEnd"/>
+      <w:r>
+        <w:rPr>
+          <w:rFonts w:ascii="JetBrains Mono" w:hAnsi="JetBrains Mono" w:cs="JetBrains Mono"/>
+          <w:sz w:val="16"/>
+          <w:szCs w:val="16"/>
+          <w:lang w:val="hu-HU"/>
+        </w:rPr>
+        <w:t>":"</w:t>
+      </w:r>
+      <w:proofErr w:type="spellStart"/>
+      <w:r>
+        <w:rPr>
+          <w:rFonts w:ascii="JetBrains Mono" w:hAnsi="JetBrains Mono" w:cs="JetBrains Mono"/>
+          <w:sz w:val="16"/>
+          <w:szCs w:val="16"/>
+          <w:lang w:val="hu-HU"/>
+        </w:rPr>
+        <w:t>uuid</w:t>
+      </w:r>
+      <w:proofErr w:type="spellEnd"/>
+      <w:r>
+        <w:rPr>
+          <w:rFonts w:ascii="JetBrains Mono" w:hAnsi="JetBrains Mono" w:cs="JetBrains Mono"/>
+          <w:sz w:val="16"/>
+          <w:szCs w:val="16"/>
+          <w:lang w:val="hu-HU"/>
+        </w:rPr>
+        <w:t>",</w:t>
+      </w:r>
+    </w:p>
+    <w:p>
+      <w:pPr>
+        <w:spacing w:after="0"/>
+        <w:rPr>
+          <w:rFonts w:ascii="JetBrains Mono" w:hAnsi="JetBrains Mono" w:cs="JetBrains Mono"/>
+          <w:sz w:val="16"/>
+          <w:szCs w:val="16"/>
+          <w:lang w:val="hu-HU"/>
+        </w:rPr>
+      </w:pPr>
+      <w:r>
+        <w:rPr>
+          <w:rFonts w:ascii="JetBrains Mono" w:hAnsi="JetBrains Mono" w:cs="JetBrains Mono"/>
+          <w:sz w:val="16"/>
+          <w:szCs w:val="16"/>
+          <w:lang w:val="hu-HU"/>
+        </w:rPr>
+        <w:t>            "</w:t>
+      </w:r>
+      <w:proofErr w:type="spellStart"/>
+      <w:r>
+        <w:rPr>
+          <w:rFonts w:ascii="JetBrains Mono" w:hAnsi="JetBrains Mono" w:cs="JetBrains Mono"/>
+          <w:sz w:val="16"/>
+          <w:szCs w:val="16"/>
+          <w:lang w:val="hu-HU"/>
+        </w:rPr>
+        <w:t>title</w:t>
+      </w:r>
+      <w:proofErr w:type="spellEnd"/>
+      <w:r>
+        <w:rPr>
+          <w:rFonts w:ascii="JetBrains Mono" w:hAnsi="JetBrains Mono" w:cs="JetBrains Mono"/>
+          <w:sz w:val="16"/>
+          <w:szCs w:val="16"/>
+          <w:lang w:val="hu-HU"/>
+        </w:rPr>
+        <w:t>": "</w:t>
+      </w:r>
+      <w:proofErr w:type="spellStart"/>
+      <w:r>
+        <w:rPr>
+          <w:rFonts w:ascii="JetBrains Mono" w:hAnsi="JetBrains Mono" w:cs="JetBrains Mono"/>
+          <w:sz w:val="16"/>
+          <w:szCs w:val="16"/>
+          <w:lang w:val="hu-HU"/>
+        </w:rPr>
+        <w:t>string</w:t>
+      </w:r>
+      <w:proofErr w:type="spellEnd"/>
+      <w:r>
+        <w:rPr>
+          <w:rFonts w:ascii="JetBrains Mono" w:hAnsi="JetBrains Mono" w:cs="JetBrains Mono"/>
+          <w:sz w:val="16"/>
+          <w:szCs w:val="16"/>
+          <w:lang w:val="hu-HU"/>
+        </w:rPr>
+        <w:t>",</w:t>
+      </w:r>
+    </w:p>
+    <w:p>
+      <w:pPr>
+        <w:spacing w:after="0"/>
+        <w:rPr>
+          <w:rFonts w:ascii="JetBrains Mono" w:hAnsi="JetBrains Mono" w:cs="JetBrains Mono"/>
+          <w:sz w:val="16"/>
+          <w:szCs w:val="16"/>
+          <w:lang w:val="hu-HU"/>
+        </w:rPr>
+      </w:pPr>
+      <w:r>
+        <w:rPr>
+          <w:rFonts w:ascii="JetBrains Mono" w:hAnsi="JetBrains Mono" w:cs="JetBrains Mono"/>
+          <w:sz w:val="16"/>
+          <w:szCs w:val="16"/>
+          <w:lang w:val="hu-HU"/>
+        </w:rPr>
+        <w:t>            "</w:t>
+      </w:r>
+      <w:proofErr w:type="spellStart"/>
+      <w:r>
+        <w:rPr>
+          <w:rFonts w:ascii="JetBrains Mono" w:hAnsi="JetBrains Mono" w:cs="JetBrains Mono"/>
+          <w:sz w:val="16"/>
+          <w:szCs w:val="16"/>
+          <w:lang w:val="hu-HU"/>
+        </w:rPr>
+        <w:t>startDate</w:t>
+      </w:r>
+      <w:proofErr w:type="spellEnd"/>
+      <w:r>
+        <w:rPr>
+          <w:rFonts w:ascii="JetBrains Mono" w:hAnsi="JetBrains Mono" w:cs="JetBrains Mono"/>
+          <w:sz w:val="16"/>
+          <w:szCs w:val="16"/>
+          <w:lang w:val="hu-HU"/>
+        </w:rPr>
+        <w:t>": "2000-01-01T00:00:00.000",</w:t>
+      </w:r>
+    </w:p>
+    <w:p>
+      <w:pPr>
+        <w:spacing w:after="0"/>
+        <w:rPr>
+          <w:rFonts w:ascii="JetBrains Mono" w:hAnsi="JetBrains Mono" w:cs="JetBrains Mono"/>
+          <w:sz w:val="16"/>
+          <w:szCs w:val="16"/>
+          <w:lang w:val="hu-HU"/>
+        </w:rPr>
+      </w:pPr>
+      <w:r>
+        <w:rPr>
+          <w:rFonts w:ascii="JetBrains Mono" w:hAnsi="JetBrains Mono" w:cs="JetBrains Mono"/>
+          <w:sz w:val="16"/>
+          <w:szCs w:val="16"/>
+          <w:lang w:val="hu-HU"/>
+        </w:rPr>
+        <w:t>            "</w:t>
+      </w:r>
+      <w:proofErr w:type="spellStart"/>
+      <w:r>
+        <w:rPr>
+          <w:rFonts w:ascii="JetBrains Mono" w:hAnsi="JetBrains Mono" w:cs="JetBrains Mono"/>
+          <w:sz w:val="16"/>
+          <w:szCs w:val="16"/>
+          <w:lang w:val="hu-HU"/>
+        </w:rPr>
+        <w:t>endDate</w:t>
+      </w:r>
+      <w:proofErr w:type="spellEnd"/>
+      <w:r>
+        <w:rPr>
+          <w:rFonts w:ascii="JetBrains Mono" w:hAnsi="JetBrains Mono" w:cs="JetBrains Mono"/>
+          <w:sz w:val="16"/>
+          <w:szCs w:val="16"/>
+          <w:lang w:val="hu-HU"/>
+        </w:rPr>
+        <w:t>": "2000-01-01T00:00:00.000",</w:t>
+      </w:r>
+    </w:p>
+    <w:p>
+      <w:pPr>
+        <w:spacing w:after="0"/>
+        <w:rPr>
+          <w:rFonts w:ascii="JetBrains Mono" w:hAnsi="JetBrains Mono" w:cs="JetBrains Mono"/>
+          <w:sz w:val="16"/>
+          <w:szCs w:val="16"/>
+          <w:lang w:val="hu-HU"/>
+        </w:rPr>
+      </w:pPr>
+      <w:r>
+        <w:rPr>
+          <w:rFonts w:ascii="JetBrains Mono" w:hAnsi="JetBrains Mono" w:cs="JetBrains Mono"/>
+          <w:sz w:val="16"/>
+          <w:szCs w:val="16"/>
+          <w:lang w:val="hu-HU"/>
+        </w:rPr>
+        <w:t>            "</w:t>
+      </w:r>
+      <w:proofErr w:type="spellStart"/>
+      <w:r>
+        <w:rPr>
+          <w:rFonts w:ascii="JetBrains Mono" w:hAnsi="JetBrains Mono" w:cs="JetBrains Mono"/>
+          <w:sz w:val="16"/>
+          <w:szCs w:val="16"/>
+          <w:lang w:val="hu-HU"/>
+        </w:rPr>
+        <w:t>courseName</w:t>
+      </w:r>
+      <w:proofErr w:type="spellEnd"/>
+      <w:r>
+        <w:rPr>
+          <w:rFonts w:ascii="JetBrains Mono" w:hAnsi="JetBrains Mono" w:cs="JetBrains Mono"/>
+          <w:sz w:val="16"/>
+          <w:szCs w:val="16"/>
+          <w:lang w:val="hu-HU"/>
+        </w:rPr>
+        <w:t>": "</w:t>
+      </w:r>
+      <w:proofErr w:type="spellStart"/>
+      <w:r>
+        <w:rPr>
+          <w:rFonts w:ascii="JetBrains Mono" w:hAnsi="JetBrains Mono" w:cs="JetBrains Mono"/>
+          <w:sz w:val="16"/>
+          <w:szCs w:val="16"/>
+          <w:lang w:val="hu-HU"/>
+        </w:rPr>
+        <w:t>string</w:t>
+      </w:r>
+      <w:proofErr w:type="spellEnd"/>
+      <w:r>
+        <w:rPr>
+          <w:rFonts w:ascii="JetBrains Mono" w:hAnsi="JetBrains Mono" w:cs="JetBrains Mono"/>
+          <w:sz w:val="16"/>
+          <w:szCs w:val="16"/>
+          <w:lang w:val="hu-HU"/>
+        </w:rPr>
+        <w:t>",</w:t>
+      </w:r>
+    </w:p>
+    <w:p>
+      <w:pPr>
+        <w:spacing w:after="0"/>
+        <w:rPr>
+          <w:rFonts w:ascii="JetBrains Mono" w:hAnsi="JetBrains Mono" w:cs="JetBrains Mono"/>
+          <w:sz w:val="16"/>
+          <w:szCs w:val="16"/>
+          <w:lang w:val="hu-HU"/>
+        </w:rPr>
+      </w:pPr>
+      <w:r>
+        <w:rPr>
+          <w:rFonts w:ascii="JetBrains Mono" w:hAnsi="JetBrains Mono" w:cs="JetBrains Mono"/>
+          <w:sz w:val="16"/>
+          <w:szCs w:val="16"/>
+          <w:lang w:val="hu-HU"/>
+        </w:rPr>
+        <w:t>            "</w:t>
+      </w:r>
+      <w:proofErr w:type="spellStart"/>
+      <w:r>
+        <w:rPr>
+          <w:rFonts w:ascii="JetBrains Mono" w:hAnsi="JetBrains Mono" w:cs="JetBrains Mono"/>
+          <w:sz w:val="16"/>
+          <w:szCs w:val="16"/>
+          <w:lang w:val="hu-HU"/>
+        </w:rPr>
+        <w:t>teacherName</w:t>
+      </w:r>
+      <w:proofErr w:type="spellEnd"/>
+      <w:r>
+        <w:rPr>
+          <w:rFonts w:ascii="JetBrains Mono" w:hAnsi="JetBrains Mono" w:cs="JetBrains Mono"/>
+          <w:sz w:val="16"/>
+          <w:szCs w:val="16"/>
+          <w:lang w:val="hu-HU"/>
+        </w:rPr>
+        <w:t>": "</w:t>
+      </w:r>
+      <w:proofErr w:type="spellStart"/>
+      <w:r>
+        <w:rPr>
+          <w:rFonts w:ascii="JetBrains Mono" w:hAnsi="JetBrains Mono" w:cs="JetBrains Mono"/>
+          <w:sz w:val="16"/>
+          <w:szCs w:val="16"/>
+          <w:lang w:val="hu-HU"/>
+        </w:rPr>
+        <w:t>string</w:t>
+      </w:r>
+      <w:proofErr w:type="spellEnd"/>
+      <w:r>
+        <w:rPr>
+          <w:rFonts w:ascii="JetBrains Mono" w:hAnsi="JetBrains Mono" w:cs="JetBrains Mono"/>
+          <w:sz w:val="16"/>
+          <w:szCs w:val="16"/>
+          <w:lang w:val="hu-HU"/>
+        </w:rPr>
+        <w:t>",</w:t>
+      </w:r>
+    </w:p>
+    <w:p>
+      <w:pPr>
+        <w:spacing w:after="0"/>
+        <w:rPr>
+          <w:rFonts w:ascii="JetBrains Mono" w:hAnsi="JetBrains Mono" w:cs="JetBrains Mono"/>
+          <w:sz w:val="16"/>
+          <w:szCs w:val="16"/>
+          <w:lang w:val="hu-HU"/>
+        </w:rPr>
+      </w:pPr>
+      <w:r>
+        <w:rPr>
+          <w:rFonts w:ascii="JetBrains Mono" w:hAnsi="JetBrains Mono" w:cs="JetBrains Mono"/>
+          <w:sz w:val="16"/>
+          <w:szCs w:val="16"/>
+          <w:lang w:val="hu-HU"/>
+        </w:rPr>
+        <w:t>            "</w:t>
+      </w:r>
+      <w:proofErr w:type="spellStart"/>
+      <w:r>
+        <w:rPr>
+          <w:rFonts w:ascii="JetBrains Mono" w:hAnsi="JetBrains Mono" w:cs="JetBrains Mono"/>
+          <w:sz w:val="16"/>
+          <w:szCs w:val="16"/>
+          <w:lang w:val="hu-HU"/>
+        </w:rPr>
+        <w:t>eventType</w:t>
+      </w:r>
+      <w:proofErr w:type="spellEnd"/>
+      <w:r>
+        <w:rPr>
+          <w:rFonts w:ascii="JetBrains Mono" w:hAnsi="JetBrains Mono" w:cs="JetBrains Mono"/>
+          <w:sz w:val="16"/>
+          <w:szCs w:val="16"/>
+          <w:lang w:val="hu-HU"/>
+        </w:rPr>
+        <w:t>": "</w:t>
+      </w:r>
+      <w:proofErr w:type="spellStart"/>
+      <w:r>
+        <w:rPr>
+          <w:rFonts w:ascii="JetBrains Mono" w:hAnsi="JetBrains Mono" w:cs="JetBrains Mono"/>
+          <w:sz w:val="16"/>
+          <w:szCs w:val="16"/>
+          <w:lang w:val="hu-HU"/>
+        </w:rPr>
+        <w:t>lesson</w:t>
+      </w:r>
+      <w:proofErr w:type="spellEnd"/>
+      <w:r>
+        <w:rPr>
+          <w:rFonts w:ascii="JetBrains Mono" w:hAnsi="JetBrains Mono" w:cs="JetBrains Mono"/>
+          <w:sz w:val="16"/>
+          <w:szCs w:val="16"/>
+          <w:lang w:val="hu-HU"/>
+        </w:rPr>
+        <w:t xml:space="preserve"> | </w:t>
+      </w:r>
+      <w:proofErr w:type="spellStart"/>
+      <w:r>
+        <w:rPr>
+          <w:rFonts w:ascii="JetBrains Mono" w:hAnsi="JetBrains Mono" w:cs="JetBrains Mono"/>
+          <w:sz w:val="16"/>
+          <w:szCs w:val="16"/>
+          <w:lang w:val="hu-HU"/>
+        </w:rPr>
+        <w:t>deadline</w:t>
+      </w:r>
+      <w:proofErr w:type="spellEnd"/>
+      <w:r>
+        <w:rPr>
+          <w:rFonts w:ascii="JetBrains Mono" w:hAnsi="JetBrains Mono" w:cs="JetBrains Mono"/>
+          <w:sz w:val="16"/>
+          <w:szCs w:val="16"/>
+          <w:lang w:val="hu-HU"/>
+        </w:rPr>
+        <w:t>",</w:t>
+      </w:r>
+    </w:p>
+    <w:p>
+      <w:pPr>
+        <w:spacing w:after="0"/>
+        <w:rPr>
+          <w:rFonts w:ascii="JetBrains Mono" w:hAnsi="JetBrains Mono" w:cs="JetBrains Mono"/>
+          <w:sz w:val="16"/>
+          <w:szCs w:val="16"/>
+          <w:lang w:val="hu-HU"/>
+        </w:rPr>
+      </w:pPr>
+      <w:r>
+        <w:rPr>
+          <w:rFonts w:ascii="JetBrains Mono" w:hAnsi="JetBrains Mono" w:cs="JetBrains Mono"/>
+          <w:sz w:val="16"/>
+          <w:szCs w:val="16"/>
+          <w:lang w:val="hu-HU"/>
+        </w:rPr>
+        <w:t>            "</w:t>
+      </w:r>
+      <w:proofErr w:type="spellStart"/>
+      <w:r>
+        <w:rPr>
+          <w:rFonts w:ascii="JetBrains Mono" w:hAnsi="JetBrains Mono" w:cs="JetBrains Mono"/>
+          <w:sz w:val="16"/>
+          <w:szCs w:val="16"/>
+          <w:lang w:val="hu-HU"/>
+        </w:rPr>
+        <w:t>description</w:t>
+      </w:r>
+      <w:proofErr w:type="spellEnd"/>
+      <w:r>
+        <w:rPr>
+          <w:rFonts w:ascii="JetBrains Mono" w:hAnsi="JetBrains Mono" w:cs="JetBrains Mono"/>
+          <w:sz w:val="16"/>
+          <w:szCs w:val="16"/>
+          <w:lang w:val="hu-HU"/>
+        </w:rPr>
+        <w:t>": "</w:t>
+      </w:r>
+      <w:proofErr w:type="spellStart"/>
+      <w:r>
+        <w:rPr>
+          <w:rFonts w:ascii="JetBrains Mono" w:hAnsi="JetBrains Mono" w:cs="JetBrains Mono"/>
+          <w:sz w:val="16"/>
+          <w:szCs w:val="16"/>
+          <w:lang w:val="hu-HU"/>
+        </w:rPr>
+        <w:t>string</w:t>
+      </w:r>
+      <w:proofErr w:type="spellEnd"/>
+      <w:r>
+        <w:rPr>
+          <w:rFonts w:ascii="JetBrains Mono" w:hAnsi="JetBrains Mono" w:cs="JetBrains Mono"/>
+          <w:sz w:val="16"/>
+          <w:szCs w:val="16"/>
+          <w:lang w:val="hu-HU"/>
+        </w:rPr>
+        <w:t>"</w:t>
+      </w:r>
+    </w:p>
+    <w:p>
+      <w:pPr>
+        <w:spacing w:after="0"/>
+        <w:rPr>
+          <w:rFonts w:ascii="JetBrains Mono" w:hAnsi="JetBrains Mono" w:cs="JetBrains Mono"/>
+          <w:sz w:val="16"/>
+          <w:szCs w:val="16"/>
+          <w:lang w:val="hu-HU"/>
+        </w:rPr>
+      </w:pPr>
+      <w:r>
+        <w:rPr>
+          <w:rFonts w:ascii="JetBrains Mono" w:hAnsi="JetBrains Mono" w:cs="JetBrains Mono"/>
+          <w:sz w:val="16"/>
+          <w:szCs w:val="16"/>
+          <w:lang w:val="hu-HU"/>
+        </w:rPr>
+        <w:t>        }</w:t>
+      </w:r>
+    </w:p>
+    <w:p>
+      <w:pPr>
+        <w:spacing w:after="0"/>
+        <w:rPr>
+          <w:rFonts w:ascii="JetBrains Mono" w:hAnsi="JetBrains Mono" w:cs="JetBrains Mono"/>
+          <w:sz w:val="16"/>
+          <w:szCs w:val="16"/>
+          <w:lang w:val="hu-HU"/>
+        </w:rPr>
+      </w:pPr>
+      <w:r>
+        <w:rPr>
+          <w:rFonts w:ascii="JetBrains Mono" w:hAnsi="JetBrains Mono" w:cs="JetBrains Mono"/>
+          <w:sz w:val="16"/>
+          <w:szCs w:val="16"/>
+          <w:lang w:val="hu-HU"/>
+        </w:rPr>
+        <w:t>    ],</w:t>
+      </w:r>
+    </w:p>
+    <w:p>
+      <w:pPr>
+        <w:spacing w:after="0"/>
+        <w:rPr>
+          <w:rFonts w:ascii="JetBrains Mono" w:hAnsi="JetBrains Mono" w:cs="JetBrains Mono"/>
+          <w:sz w:val="16"/>
+          <w:szCs w:val="16"/>
+          <w:lang w:val="hu-HU"/>
+        </w:rPr>
+      </w:pPr>
+      <w:r>
+        <w:rPr>
+          <w:rFonts w:ascii="JetBrains Mono" w:hAnsi="JetBrains Mono" w:cs="JetBrains Mono"/>
+          <w:sz w:val="16"/>
+          <w:szCs w:val="16"/>
+          <w:lang w:val="hu-HU"/>
+        </w:rPr>
+        <w:t>    "</w:t>
+      </w:r>
+      <w:proofErr w:type="spellStart"/>
+      <w:r>
+        <w:rPr>
+          <w:rFonts w:ascii="JetBrains Mono" w:hAnsi="JetBrains Mono" w:cs="JetBrains Mono"/>
+          <w:sz w:val="16"/>
+          <w:szCs w:val="16"/>
+          <w:lang w:val="hu-HU"/>
+        </w:rPr>
+        <w:t>popularCourses</w:t>
+      </w:r>
+      <w:proofErr w:type="spellEnd"/>
+      <w:r>
+        <w:rPr>
+          <w:rFonts w:ascii="JetBrains Mono" w:hAnsi="JetBrains Mono" w:cs="JetBrains Mono"/>
+          <w:sz w:val="16"/>
+          <w:szCs w:val="16"/>
+          <w:lang w:val="hu-HU"/>
+        </w:rPr>
+        <w:t>": [</w:t>
+      </w:r>
+    </w:p>
+    <w:p>
+      <w:pPr>
+        <w:spacing w:after="0"/>
+        <w:rPr>
+          <w:rFonts w:ascii="JetBrains Mono" w:hAnsi="JetBrains Mono" w:cs="JetBrains Mono"/>
+          <w:sz w:val="16"/>
+          <w:szCs w:val="16"/>
+          <w:lang w:val="hu-HU"/>
+        </w:rPr>
+      </w:pPr>
+      <w:r>
+        <w:rPr>
+          <w:rFonts w:ascii="JetBrains Mono" w:hAnsi="JetBrains Mono" w:cs="JetBrains Mono"/>
+          <w:sz w:val="16"/>
+          <w:szCs w:val="16"/>
+          <w:lang w:val="hu-HU"/>
+        </w:rPr>
+        <w:t>        {</w:t>
+      </w:r>
+    </w:p>
+    <w:p>
+      <w:pPr>
+        <w:spacing w:after="0"/>
+        <w:rPr>
+          <w:rFonts w:ascii="JetBrains Mono" w:hAnsi="JetBrains Mono" w:cs="JetBrains Mono"/>
+          <w:sz w:val="16"/>
+          <w:szCs w:val="16"/>
+          <w:lang w:val="hu-HU"/>
+        </w:rPr>
+      </w:pPr>
+      <w:r>
+        <w:rPr>
+          <w:rFonts w:ascii="JetBrains Mono" w:hAnsi="JetBrains Mono" w:cs="JetBrains Mono"/>
+          <w:sz w:val="16"/>
+          <w:szCs w:val="16"/>
+          <w:lang w:val="hu-HU"/>
+        </w:rPr>
+        <w:t>            "</w:t>
+      </w:r>
+      <w:proofErr w:type="spellStart"/>
+      <w:r>
+        <w:rPr>
+          <w:rFonts w:ascii="JetBrains Mono" w:hAnsi="JetBrains Mono" w:cs="JetBrains Mono"/>
+          <w:sz w:val="16"/>
+          <w:szCs w:val="16"/>
+          <w:lang w:val="hu-HU"/>
+        </w:rPr>
+        <w:t>id</w:t>
+      </w:r>
+      <w:proofErr w:type="spellEnd"/>
+      <w:r>
+        <w:rPr>
+          <w:rFonts w:ascii="JetBrains Mono" w:hAnsi="JetBrains Mono" w:cs="JetBrains Mono"/>
+          <w:sz w:val="16"/>
+          <w:szCs w:val="16"/>
+          <w:lang w:val="hu-HU"/>
+        </w:rPr>
+        <w:t>":"</w:t>
+      </w:r>
+      <w:proofErr w:type="spellStart"/>
+      <w:r>
+        <w:rPr>
+          <w:rFonts w:ascii="JetBrains Mono" w:hAnsi="JetBrains Mono" w:cs="JetBrains Mono"/>
+          <w:sz w:val="16"/>
+          <w:szCs w:val="16"/>
+          <w:lang w:val="hu-HU"/>
+        </w:rPr>
+        <w:t>uuid</w:t>
+      </w:r>
+      <w:proofErr w:type="spellEnd"/>
+      <w:r>
+        <w:rPr>
+          <w:rFonts w:ascii="JetBrains Mono" w:hAnsi="JetBrains Mono" w:cs="JetBrains Mono"/>
+          <w:sz w:val="16"/>
+          <w:szCs w:val="16"/>
+          <w:lang w:val="hu-HU"/>
+        </w:rPr>
+        <w:t>",</w:t>
+      </w:r>
+    </w:p>
+    <w:p>
+      <w:pPr>
+        <w:spacing w:after="0"/>
+        <w:rPr>
+          <w:rFonts w:ascii="JetBrains Mono" w:hAnsi="JetBrains Mono" w:cs="JetBrains Mono"/>
+          <w:sz w:val="16"/>
+          <w:szCs w:val="16"/>
+          <w:lang w:val="hu-HU"/>
+        </w:rPr>
+      </w:pPr>
+      <w:r>
+        <w:rPr>
+          <w:rFonts w:ascii="JetBrains Mono" w:hAnsi="JetBrains Mono" w:cs="JetBrains Mono"/>
+          <w:sz w:val="16"/>
+          <w:szCs w:val="16"/>
+          <w:lang w:val="hu-HU"/>
+        </w:rPr>
+        <w:t>            "</w:t>
+      </w:r>
+      <w:proofErr w:type="spellStart"/>
+      <w:r>
+        <w:rPr>
+          <w:rFonts w:ascii="JetBrains Mono" w:hAnsi="JetBrains Mono" w:cs="JetBrains Mono"/>
+          <w:sz w:val="16"/>
+          <w:szCs w:val="16"/>
+          <w:lang w:val="hu-HU"/>
+        </w:rPr>
+        <w:t>title</w:t>
+      </w:r>
+      <w:proofErr w:type="spellEnd"/>
+      <w:r>
+        <w:rPr>
+          <w:rFonts w:ascii="JetBrains Mono" w:hAnsi="JetBrains Mono" w:cs="JetBrains Mono"/>
+          <w:sz w:val="16"/>
+          <w:szCs w:val="16"/>
+          <w:lang w:val="hu-HU"/>
+        </w:rPr>
+        <w:t>": "",</w:t>
+      </w:r>
+    </w:p>
+    <w:p>
+      <w:pPr>
+        <w:spacing w:after="0"/>
+        <w:rPr>
+          <w:rFonts w:ascii="JetBrains Mono" w:hAnsi="JetBrains Mono" w:cs="JetBrains Mono"/>
+          <w:sz w:val="16"/>
+          <w:szCs w:val="16"/>
+          <w:lang w:val="hu-HU"/>
+        </w:rPr>
+      </w:pPr>
+      <w:r>
+        <w:rPr>
+          <w:rFonts w:ascii="JetBrains Mono" w:hAnsi="JetBrains Mono" w:cs="JetBrains Mono"/>
+          <w:sz w:val="16"/>
+          <w:szCs w:val="16"/>
+          <w:lang w:val="hu-HU"/>
+        </w:rPr>
+        <w:t>            "</w:t>
+      </w:r>
+      <w:proofErr w:type="spellStart"/>
+      <w:r>
+        <w:rPr>
+          <w:rFonts w:ascii="JetBrains Mono" w:hAnsi="JetBrains Mono" w:cs="JetBrains Mono"/>
+          <w:sz w:val="16"/>
+          <w:szCs w:val="16"/>
+          <w:lang w:val="hu-HU"/>
+        </w:rPr>
+        <w:t>imageUrl</w:t>
+      </w:r>
+      <w:proofErr w:type="spellEnd"/>
+      <w:r>
+        <w:rPr>
+          <w:rFonts w:ascii="JetBrains Mono" w:hAnsi="JetBrains Mono" w:cs="JetBrains Mono"/>
+          <w:sz w:val="16"/>
+          <w:szCs w:val="16"/>
+          <w:lang w:val="hu-HU"/>
+        </w:rPr>
+        <w:t>": "",</w:t>
+      </w:r>
+    </w:p>
+    <w:p>
+      <w:pPr>
+        <w:spacing w:after="0"/>
+        <w:rPr>
+          <w:rFonts w:ascii="JetBrains Mono" w:hAnsi="JetBrains Mono" w:cs="JetBrains Mono"/>
+          <w:sz w:val="16"/>
+          <w:szCs w:val="16"/>
+          <w:lang w:val="hu-HU"/>
+        </w:rPr>
+      </w:pPr>
+      <w:r>
+        <w:rPr>
+          <w:rFonts w:ascii="JetBrains Mono" w:hAnsi="JetBrains Mono" w:cs="JetBrains Mono"/>
+          <w:sz w:val="16"/>
+          <w:szCs w:val="16"/>
+          <w:lang w:val="hu-HU"/>
+        </w:rPr>
+        <w:t>            "</w:t>
+      </w:r>
+      <w:proofErr w:type="spellStart"/>
+      <w:r>
+        <w:rPr>
+          <w:rFonts w:ascii="JetBrains Mono" w:hAnsi="JetBrains Mono" w:cs="JetBrains Mono"/>
+          <w:sz w:val="16"/>
+          <w:szCs w:val="16"/>
+          <w:lang w:val="hu-HU"/>
+        </w:rPr>
+        <w:t>teacherName</w:t>
+      </w:r>
+      <w:proofErr w:type="spellEnd"/>
+      <w:r>
+        <w:rPr>
+          <w:rFonts w:ascii="JetBrains Mono" w:hAnsi="JetBrains Mono" w:cs="JetBrains Mono"/>
+          <w:sz w:val="16"/>
+          <w:szCs w:val="16"/>
+          <w:lang w:val="hu-HU"/>
+        </w:rPr>
+        <w:t>": "",</w:t>
+      </w:r>
+    </w:p>
+    <w:p>
+      <w:pPr>
+        <w:spacing w:after="0"/>
+        <w:rPr>
+          <w:rFonts w:ascii="JetBrains Mono" w:hAnsi="JetBrains Mono" w:cs="JetBrains Mono"/>
+          <w:sz w:val="16"/>
+          <w:szCs w:val="16"/>
+          <w:lang w:val="hu-HU"/>
+        </w:rPr>
+      </w:pPr>
+      <w:r>
+        <w:rPr>
+          <w:rFonts w:ascii="JetBrains Mono" w:hAnsi="JetBrains Mono" w:cs="JetBrains Mono"/>
+          <w:sz w:val="16"/>
+          <w:szCs w:val="16"/>
+          <w:lang w:val="hu-HU"/>
+        </w:rPr>
+        <w:t>            "</w:t>
+      </w:r>
+      <w:proofErr w:type="spellStart"/>
+      <w:r>
+        <w:rPr>
+          <w:rFonts w:ascii="JetBrains Mono" w:hAnsi="JetBrains Mono" w:cs="JetBrains Mono"/>
+          <w:sz w:val="16"/>
+          <w:szCs w:val="16"/>
+          <w:lang w:val="hu-HU"/>
+        </w:rPr>
+        <w:t>lessonPrice</w:t>
+      </w:r>
+      <w:proofErr w:type="spellEnd"/>
+      <w:r>
+        <w:rPr>
+          <w:rFonts w:ascii="JetBrains Mono" w:hAnsi="JetBrains Mono" w:cs="JetBrains Mono"/>
+          <w:sz w:val="16"/>
+          <w:szCs w:val="16"/>
+          <w:lang w:val="hu-HU"/>
+        </w:rPr>
+        <w:t>": "",</w:t>
+      </w:r>
+    </w:p>
+    <w:p>
+      <w:pPr>
+        <w:spacing w:after="0"/>
+        <w:rPr>
+          <w:rFonts w:ascii="JetBrains Mono" w:hAnsi="JetBrains Mono" w:cs="JetBrains Mono"/>
+          <w:sz w:val="16"/>
+          <w:szCs w:val="16"/>
+          <w:lang w:val="hu-HU"/>
+        </w:rPr>
+      </w:pPr>
+      <w:r>
+        <w:rPr>
+          <w:rFonts w:ascii="JetBrains Mono" w:hAnsi="JetBrains Mono" w:cs="JetBrains Mono"/>
+          <w:sz w:val="16"/>
+          <w:szCs w:val="16"/>
+          <w:lang w:val="hu-HU"/>
+        </w:rPr>
+        <w:t>            "</w:t>
+      </w:r>
+      <w:proofErr w:type="spellStart"/>
+      <w:r>
+        <w:rPr>
+          <w:rFonts w:ascii="JetBrains Mono" w:hAnsi="JetBrains Mono" w:cs="JetBrains Mono"/>
+          <w:sz w:val="16"/>
+          <w:szCs w:val="16"/>
+          <w:lang w:val="hu-HU"/>
+        </w:rPr>
+        <w:t>description</w:t>
+      </w:r>
+      <w:proofErr w:type="spellEnd"/>
+      <w:r>
+        <w:rPr>
+          <w:rFonts w:ascii="JetBrains Mono" w:hAnsi="JetBrains Mono" w:cs="JetBrains Mono"/>
+          <w:sz w:val="16"/>
+          <w:szCs w:val="16"/>
+          <w:lang w:val="hu-HU"/>
+        </w:rPr>
+        <w:t>": "",</w:t>
+      </w:r>
+    </w:p>
+    <w:p>
+      <w:pPr>
+        <w:spacing w:after="0"/>
+        <w:rPr>
+          <w:rFonts w:ascii="JetBrains Mono" w:hAnsi="JetBrains Mono" w:cs="JetBrains Mono"/>
+          <w:sz w:val="16"/>
+          <w:szCs w:val="16"/>
+          <w:lang w:val="hu-HU"/>
+        </w:rPr>
+      </w:pPr>
+      <w:r>
+        <w:rPr>
+          <w:rFonts w:ascii="JetBrains Mono" w:hAnsi="JetBrains Mono" w:cs="JetBrains Mono"/>
+          <w:sz w:val="16"/>
+          <w:szCs w:val="16"/>
+          <w:lang w:val="hu-HU"/>
+        </w:rPr>
+        <w:t>            "</w:t>
+      </w:r>
+      <w:proofErr w:type="spellStart"/>
+      <w:r>
+        <w:rPr>
+          <w:rFonts w:ascii="JetBrains Mono" w:hAnsi="JetBrains Mono" w:cs="JetBrains Mono"/>
+          <w:sz w:val="16"/>
+          <w:szCs w:val="16"/>
+          <w:lang w:val="hu-HU"/>
+        </w:rPr>
+        <w:t>courseType</w:t>
+      </w:r>
+      <w:proofErr w:type="spellEnd"/>
+      <w:r>
+        <w:rPr>
+          <w:rFonts w:ascii="JetBrains Mono" w:hAnsi="JetBrains Mono" w:cs="JetBrains Mono"/>
+          <w:sz w:val="16"/>
+          <w:szCs w:val="16"/>
+          <w:lang w:val="hu-HU"/>
+        </w:rPr>
+        <w:t>": "</w:t>
+      </w:r>
+      <w:proofErr w:type="spellStart"/>
+      <w:r>
+        <w:rPr>
+          <w:rFonts w:ascii="JetBrains Mono" w:hAnsi="JetBrains Mono" w:cs="JetBrains Mono"/>
+          <w:sz w:val="16"/>
+          <w:szCs w:val="16"/>
+          <w:lang w:val="hu-HU"/>
+        </w:rPr>
+        <w:t>tutoring</w:t>
+      </w:r>
+      <w:proofErr w:type="spellEnd"/>
+      <w:r>
+        <w:rPr>
+          <w:rFonts w:ascii="JetBrains Mono" w:hAnsi="JetBrains Mono" w:cs="JetBrains Mono"/>
+          <w:sz w:val="16"/>
+          <w:szCs w:val="16"/>
+          <w:lang w:val="hu-HU"/>
+        </w:rPr>
+        <w:t xml:space="preserve"> | </w:t>
+      </w:r>
+      <w:proofErr w:type="spellStart"/>
+      <w:r>
+        <w:rPr>
+          <w:rFonts w:ascii="JetBrains Mono" w:hAnsi="JetBrains Mono" w:cs="JetBrains Mono"/>
+          <w:sz w:val="16"/>
+          <w:szCs w:val="16"/>
+          <w:lang w:val="hu-HU"/>
+        </w:rPr>
+        <w:t>learningPath</w:t>
+      </w:r>
+      <w:proofErr w:type="spellEnd"/>
+      <w:r>
+        <w:rPr>
+          <w:rFonts w:ascii="JetBrains Mono" w:hAnsi="JetBrains Mono" w:cs="JetBrains Mono"/>
+          <w:sz w:val="16"/>
+          <w:szCs w:val="16"/>
+          <w:lang w:val="hu-HU"/>
+        </w:rPr>
+        <w:t>"</w:t>
+      </w:r>
+    </w:p>
+    <w:p>
+      <w:pPr>
+        <w:spacing w:after="0"/>
+        <w:rPr>
+          <w:rFonts w:ascii="JetBrains Mono" w:hAnsi="JetBrains Mono" w:cs="JetBrains Mono"/>
+          <w:sz w:val="16"/>
+          <w:szCs w:val="16"/>
+          <w:lang w:val="hu-HU"/>
+        </w:rPr>
+      </w:pPr>
+      <w:r>
+        <w:rPr>
+          <w:rFonts w:ascii="JetBrains Mono" w:hAnsi="JetBrains Mono" w:cs="JetBrains Mono"/>
+          <w:sz w:val="16"/>
+          <w:szCs w:val="16"/>
+          <w:lang w:val="hu-HU"/>
+        </w:rPr>
+        <w:t>        }</w:t>
+      </w:r>
+    </w:p>
+    <w:p>
+      <w:pPr>
+        <w:spacing w:after="0"/>
+        <w:rPr>
+          <w:rFonts w:ascii="JetBrains Mono" w:hAnsi="JetBrains Mono" w:cs="JetBrains Mono"/>
+          <w:sz w:val="16"/>
+          <w:szCs w:val="16"/>
+          <w:lang w:val="hu-HU"/>
+        </w:rPr>
+      </w:pPr>
+      <w:r>
+        <w:rPr>
+          <w:rFonts w:ascii="JetBrains Mono" w:hAnsi="JetBrains Mono" w:cs="JetBrains Mono"/>
+          <w:sz w:val="16"/>
+          <w:szCs w:val="16"/>
+          <w:lang w:val="hu-HU"/>
+        </w:rPr>
+        <w:t>    ],</w:t>
+      </w:r>
+    </w:p>
+    <w:p>
+      <w:pPr>
+        <w:spacing w:after="0"/>
+        <w:rPr>
+          <w:rFonts w:ascii="JetBrains Mono" w:hAnsi="JetBrains Mono" w:cs="JetBrains Mono"/>
+          <w:sz w:val="16"/>
+          <w:szCs w:val="16"/>
+          <w:lang w:val="hu-HU"/>
+        </w:rPr>
+      </w:pPr>
+      <w:r>
+        <w:rPr>
+          <w:rFonts w:ascii="JetBrains Mono" w:hAnsi="JetBrains Mono" w:cs="JetBrains Mono"/>
+          <w:sz w:val="16"/>
+          <w:szCs w:val="16"/>
+          <w:lang w:val="hu-HU"/>
+        </w:rPr>
+        <w:t>    "</w:t>
+      </w:r>
+      <w:proofErr w:type="spellStart"/>
+      <w:r>
+        <w:rPr>
+          <w:rFonts w:ascii="JetBrains Mono" w:hAnsi="JetBrains Mono" w:cs="JetBrains Mono"/>
+          <w:sz w:val="16"/>
+          <w:szCs w:val="16"/>
+          <w:lang w:val="hu-HU"/>
+        </w:rPr>
+        <w:t>notifications</w:t>
+      </w:r>
+      <w:proofErr w:type="spellEnd"/>
+      <w:r>
+        <w:rPr>
+          <w:rFonts w:ascii="JetBrains Mono" w:hAnsi="JetBrains Mono" w:cs="JetBrains Mono"/>
+          <w:sz w:val="16"/>
+          <w:szCs w:val="16"/>
+          <w:lang w:val="hu-HU"/>
+        </w:rPr>
+        <w:t>": {</w:t>
+      </w:r>
+    </w:p>
+    <w:p>
+      <w:pPr>
+        <w:spacing w:after="0"/>
+        <w:rPr>
+          <w:rFonts w:ascii="JetBrains Mono" w:hAnsi="JetBrains Mono" w:cs="JetBrains Mono"/>
+          <w:sz w:val="16"/>
+          <w:szCs w:val="16"/>
+          <w:lang w:val="hu-HU"/>
+        </w:rPr>
+      </w:pPr>
+      <w:r>
+        <w:rPr>
+          <w:rFonts w:ascii="JetBrains Mono" w:hAnsi="JetBrains Mono" w:cs="JetBrains Mono"/>
+          <w:sz w:val="16"/>
+          <w:szCs w:val="16"/>
+          <w:lang w:val="hu-HU"/>
+        </w:rPr>
+        <w:t>        "</w:t>
+      </w:r>
+      <w:proofErr w:type="spellStart"/>
+      <w:r>
+        <w:rPr>
+          <w:rFonts w:ascii="JetBrains Mono" w:hAnsi="JetBrains Mono" w:cs="JetBrains Mono"/>
+          <w:sz w:val="16"/>
+          <w:szCs w:val="16"/>
+          <w:lang w:val="hu-HU"/>
+        </w:rPr>
+        <w:t>unreadNotificationNumber</w:t>
+      </w:r>
+      <w:proofErr w:type="spellEnd"/>
+      <w:r>
+        <w:rPr>
+          <w:rFonts w:ascii="JetBrains Mono" w:hAnsi="JetBrains Mono" w:cs="JetBrains Mono"/>
+          <w:sz w:val="16"/>
+          <w:szCs w:val="16"/>
+          <w:lang w:val="hu-HU"/>
+        </w:rPr>
+        <w:t>": 0,</w:t>
+      </w:r>
+    </w:p>
+    <w:p>
+      <w:pPr>
+        <w:spacing w:after="0"/>
+        <w:rPr>
+          <w:rFonts w:ascii="JetBrains Mono" w:hAnsi="JetBrains Mono" w:cs="JetBrains Mono"/>
+          <w:sz w:val="16"/>
+          <w:szCs w:val="16"/>
+          <w:lang w:val="hu-HU"/>
+        </w:rPr>
+      </w:pPr>
+      <w:r>
+        <w:rPr>
+          <w:rFonts w:ascii="JetBrains Mono" w:hAnsi="JetBrains Mono" w:cs="JetBrains Mono"/>
+          <w:sz w:val="16"/>
+          <w:szCs w:val="16"/>
+          <w:lang w:val="hu-HU"/>
+        </w:rPr>
+        <w:t>        "</w:t>
+      </w:r>
+      <w:proofErr w:type="spellStart"/>
+      <w:r>
+        <w:rPr>
+          <w:rFonts w:ascii="JetBrains Mono" w:hAnsi="JetBrains Mono" w:cs="JetBrains Mono"/>
+          <w:sz w:val="16"/>
+          <w:szCs w:val="16"/>
+          <w:lang w:val="hu-HU"/>
+        </w:rPr>
+        <w:t>lastUnread</w:t>
+      </w:r>
+      <w:proofErr w:type="spellEnd"/>
+      <w:r>
+        <w:rPr>
+          <w:rFonts w:ascii="JetBrains Mono" w:hAnsi="JetBrains Mono" w:cs="JetBrains Mono"/>
+          <w:sz w:val="16"/>
+          <w:szCs w:val="16"/>
+          <w:lang w:val="hu-HU"/>
+        </w:rPr>
+        <w:t>": {</w:t>
+      </w:r>
+    </w:p>
+    <w:p>
+      <w:pPr>
+        <w:spacing w:after="0"/>
+        <w:rPr>
+          <w:rFonts w:ascii="JetBrains Mono" w:hAnsi="JetBrains Mono" w:cs="JetBrains Mono"/>
+          <w:sz w:val="16"/>
+          <w:szCs w:val="16"/>
+          <w:lang w:val="hu-HU"/>
+        </w:rPr>
+      </w:pPr>
+      <w:r>
+        <w:rPr>
+          <w:rFonts w:ascii="JetBrains Mono" w:hAnsi="JetBrains Mono" w:cs="JetBrains Mono"/>
+          <w:sz w:val="16"/>
+          <w:szCs w:val="16"/>
+          <w:lang w:val="hu-HU"/>
+        </w:rPr>
+        <w:t>            "</w:t>
+      </w:r>
+      <w:proofErr w:type="spellStart"/>
+      <w:r>
+        <w:rPr>
+          <w:rFonts w:ascii="JetBrains Mono" w:hAnsi="JetBrains Mono" w:cs="JetBrains Mono"/>
+          <w:sz w:val="16"/>
+          <w:szCs w:val="16"/>
+          <w:lang w:val="hu-HU"/>
+        </w:rPr>
+        <w:t>id</w:t>
+      </w:r>
+      <w:proofErr w:type="spellEnd"/>
+      <w:r>
+        <w:rPr>
+          <w:rFonts w:ascii="JetBrains Mono" w:hAnsi="JetBrains Mono" w:cs="JetBrains Mono"/>
+          <w:sz w:val="16"/>
+          <w:szCs w:val="16"/>
+          <w:lang w:val="hu-HU"/>
+        </w:rPr>
+        <w:t>":"</w:t>
+      </w:r>
+      <w:proofErr w:type="spellStart"/>
+      <w:r>
+        <w:rPr>
+          <w:rFonts w:ascii="JetBrains Mono" w:hAnsi="JetBrains Mono" w:cs="JetBrains Mono"/>
+          <w:sz w:val="16"/>
+          <w:szCs w:val="16"/>
+          <w:lang w:val="hu-HU"/>
+        </w:rPr>
+        <w:t>uuid</w:t>
+      </w:r>
+      <w:proofErr w:type="spellEnd"/>
+      <w:r>
+        <w:rPr>
+          <w:rFonts w:ascii="JetBrains Mono" w:hAnsi="JetBrains Mono" w:cs="JetBrains Mono"/>
+          <w:sz w:val="16"/>
+          <w:szCs w:val="16"/>
+          <w:lang w:val="hu-HU"/>
+        </w:rPr>
+        <w:t>",</w:t>
+      </w:r>
+    </w:p>
+    <w:p>
+      <w:pPr>
+        <w:spacing w:after="0"/>
+        <w:rPr>
+          <w:rFonts w:ascii="JetBrains Mono" w:hAnsi="JetBrains Mono" w:cs="JetBrains Mono"/>
+          <w:sz w:val="16"/>
+          <w:szCs w:val="16"/>
+          <w:lang w:val="hu-HU"/>
+        </w:rPr>
+      </w:pPr>
+      <w:r>
+        <w:rPr>
+          <w:rFonts w:ascii="JetBrains Mono" w:hAnsi="JetBrains Mono" w:cs="JetBrains Mono"/>
+          <w:sz w:val="16"/>
+          <w:szCs w:val="16"/>
+          <w:lang w:val="hu-HU"/>
+        </w:rPr>
+        <w:t>            "</w:t>
+      </w:r>
+      <w:proofErr w:type="spellStart"/>
+      <w:r>
+        <w:rPr>
+          <w:rFonts w:ascii="JetBrains Mono" w:hAnsi="JetBrains Mono" w:cs="JetBrains Mono"/>
+          <w:sz w:val="16"/>
+          <w:szCs w:val="16"/>
+          <w:lang w:val="hu-HU"/>
+        </w:rPr>
+        <w:t>courseName</w:t>
+      </w:r>
+      <w:proofErr w:type="spellEnd"/>
+      <w:r>
+        <w:rPr>
+          <w:rFonts w:ascii="JetBrains Mono" w:hAnsi="JetBrains Mono" w:cs="JetBrains Mono"/>
+          <w:sz w:val="16"/>
+          <w:szCs w:val="16"/>
+          <w:lang w:val="hu-HU"/>
+        </w:rPr>
+        <w:t>": "",</w:t>
+      </w:r>
+    </w:p>
+    <w:p>
+      <w:pPr>
+        <w:spacing w:after="0"/>
+        <w:rPr>
+          <w:rFonts w:ascii="JetBrains Mono" w:hAnsi="JetBrains Mono" w:cs="JetBrains Mono"/>
+          <w:sz w:val="16"/>
+          <w:szCs w:val="16"/>
+          <w:lang w:val="hu-HU"/>
+        </w:rPr>
+      </w:pPr>
+      <w:r>
+        <w:rPr>
+          <w:rFonts w:ascii="JetBrains Mono" w:hAnsi="JetBrains Mono" w:cs="JetBrains Mono"/>
+          <w:sz w:val="16"/>
+          <w:szCs w:val="16"/>
+          <w:lang w:val="hu-HU"/>
+        </w:rPr>
+        <w:t>            "text": ""</w:t>
+      </w:r>
+    </w:p>
+    <w:p>
+      <w:pPr>
+        <w:spacing w:after="0"/>
+        <w:rPr>
+          <w:rFonts w:ascii="JetBrains Mono" w:hAnsi="JetBrains Mono" w:cs="JetBrains Mono"/>
+          <w:sz w:val="16"/>
+          <w:szCs w:val="16"/>
+          <w:lang w:val="hu-HU"/>
+        </w:rPr>
+      </w:pPr>
+      <w:r>
+        <w:rPr>
+          <w:rFonts w:ascii="JetBrains Mono" w:hAnsi="JetBrains Mono" w:cs="JetBrains Mono"/>
+          <w:sz w:val="16"/>
+          <w:szCs w:val="16"/>
+          <w:lang w:val="hu-HU"/>
+        </w:rPr>
+        <w:t>        }</w:t>
+      </w:r>
+    </w:p>
+    <w:p>
+      <w:pPr>
+        <w:spacing w:after="0"/>
+        <w:rPr>
+          <w:rFonts w:ascii="JetBrains Mono" w:hAnsi="JetBrains Mono" w:cs="JetBrains Mono"/>
+          <w:sz w:val="16"/>
+          <w:szCs w:val="16"/>
+          <w:lang w:val="hu-HU"/>
+        </w:rPr>
+      </w:pPr>
+      <w:r>
+        <w:rPr>
+          <w:rFonts w:ascii="JetBrains Mono" w:hAnsi="JetBrains Mono" w:cs="JetBrains Mono"/>
+          <w:sz w:val="16"/>
+          <w:szCs w:val="16"/>
+          <w:lang w:val="hu-HU"/>
+        </w:rPr>
+        <w:t>    }</w:t>
+      </w:r>
+    </w:p>
+    <w:p>
+      <w:pPr>
+        <w:spacing w:after="0"/>
+        <w:rPr>
+          <w:rFonts w:ascii="JetBrains Mono" w:hAnsi="JetBrains Mono" w:cs="JetBrains Mono"/>
+          <w:sz w:val="16"/>
+          <w:szCs w:val="16"/>
+          <w:lang w:val="hu-HU"/>
+        </w:rPr>
+      </w:pPr>
+      <w:r>
+        <w:rPr>
+          <w:rFonts w:ascii="JetBrains Mono" w:hAnsi="JetBrains Mono" w:cs="JetBrains Mono"/>
+          <w:sz w:val="16"/>
+          <w:szCs w:val="16"/>
+          <w:lang w:val="hu-HU"/>
+        </w:rPr>
+        <w:t>}</w:t>
+      </w:r>
+    </w:p>
+    <w:p>
+      <w:pPr>
+        <w:spacing w:after="0"/>
+        <w:rPr>
+          <w:rFonts w:ascii="JetBrains Mono" w:hAnsi="JetBrains Mono" w:cs="JetBrains Mono"/>
+          <w:sz w:val="16"/>
+          <w:szCs w:val="16"/>
+        </w:rPr>
+      </w:pPr>
     </w:p>
     <w:sectPr>
+      <w:type w:val="continuous"/>
       <w:pgSz w:w="11906" w:h="16838"/>
       <w:pgMar w:top="1417" w:right="1417" w:bottom="1417" w:left="1417" w:header="708" w:footer="708" w:gutter="0"/>
-      <w:cols w:space="708"/>
+      <w:cols w:num="2" w:space="708"/>
       <w:docGrid w:linePitch="360"/>
     </w:sectPr>
   </w:body>
@@ -9009,7 +11487,6 @@
   <w:style w:type="character" w:default="1" w:styleId="Bekezdsalapbettpusa">
     <w:name w:val="Default Paragraph Font"/>
     <w:uiPriority w:val="1"/>
-    <w:semiHidden/>
     <w:unhideWhenUsed/>
   </w:style>
   <w:style w:type="table" w:default="1" w:styleId="Normltblzat">

</xml_diff>

<commit_message>
Docs - refined the sitemap in SAD
</commit_message>
<xml_diff>
--- a/Dev docs/Software_Architecture_Document.docx
+++ b/Dev docs/Software_Architecture_Document.docx
@@ -128,18 +128,8 @@
           <w:sz w:val="22"/>
           <w:szCs w:val="22"/>
         </w:rPr>
-        <w:t>routing, Proxy/</w:t>
-      </w:r>
-      <w:proofErr w:type="spellStart"/>
-      <w:r>
-        <w:rPr>
-          <w:rFonts w:ascii="Lexend Light" w:hAnsi="Lexend Light"/>
-          <w:sz w:val="22"/>
-          <w:szCs w:val="22"/>
-        </w:rPr>
-        <w:t>BackendForFrontend</w:t>
-      </w:r>
-      <w:proofErr w:type="spellEnd"/>
+        <w:t>routing, Proxy/BackendForFrontend</w:t>
+      </w:r>
     </w:p>
     <w:p>
       <w:pPr>
@@ -154,7 +144,6 @@
           <w:szCs w:val="22"/>
         </w:rPr>
       </w:pPr>
-      <w:proofErr w:type="spellStart"/>
       <w:r>
         <w:rPr>
           <w:rFonts w:ascii="Lexend" w:hAnsi="Lexend"/>
@@ -163,7 +152,6 @@
         </w:rPr>
         <w:t>TailwindCSS</w:t>
       </w:r>
-      <w:proofErr w:type="spellEnd"/>
     </w:p>
     <w:p>
       <w:pPr>
@@ -208,23 +196,13 @@
           <w:szCs w:val="22"/>
         </w:rPr>
       </w:pPr>
-      <w:proofErr w:type="spellStart"/>
-      <w:r>
-        <w:rPr>
-          <w:rFonts w:ascii="Lexend" w:hAnsi="Lexend"/>
-          <w:sz w:val="22"/>
-          <w:szCs w:val="22"/>
-        </w:rPr>
-        <w:t>ShadCN</w:t>
-      </w:r>
-      <w:proofErr w:type="spellEnd"/>
-      <w:r>
-        <w:rPr>
-          <w:rFonts w:ascii="Lexend" w:hAnsi="Lexend"/>
-          <w:sz w:val="22"/>
-          <w:szCs w:val="22"/>
-        </w:rPr>
-        <w:t xml:space="preserve"> (UI library)</w:t>
+      <w:r>
+        <w:rPr>
+          <w:rFonts w:ascii="Lexend" w:hAnsi="Lexend"/>
+          <w:sz w:val="22"/>
+          <w:szCs w:val="22"/>
+        </w:rPr>
+        <w:t>ShadCN (UI library)</w:t>
       </w:r>
     </w:p>
     <w:p>
@@ -5423,6 +5401,31 @@
       <w:pPr>
         <w:pStyle w:val="Listaszerbekezds"/>
         <w:numPr>
+          <w:ilvl w:val="2"/>
+          <w:numId w:val="13"/>
+        </w:numPr>
+        <w:spacing w:before="480" w:after="240"/>
+        <w:rPr>
+          <w:rFonts w:ascii="Lexend" w:hAnsi="Lexend"/>
+          <w:b/>
+          <w:bCs/>
+          <w:sz w:val="22"/>
+          <w:szCs w:val="22"/>
+        </w:rPr>
+      </w:pPr>
+      <w:r>
+        <w:rPr>
+          <w:rFonts w:ascii="Lexend" w:hAnsi="Lexend"/>
+          <w:sz w:val="22"/>
+          <w:szCs w:val="22"/>
+        </w:rPr>
+        <w:t>Pending enrollments</w:t>
+      </w:r>
+    </w:p>
+    <w:p>
+      <w:pPr>
+        <w:pStyle w:val="Listaszerbekezds"/>
+        <w:numPr>
           <w:ilvl w:val="1"/>
           <w:numId w:val="13"/>
         </w:numPr>
@@ -5628,7 +5631,7 @@
           <w:sz w:val="22"/>
           <w:szCs w:val="22"/>
         </w:rPr>
-        <w:t>Student profile</w:t>
+        <w:t>Pending enrollments</w:t>
       </w:r>
     </w:p>
     <w:p>
@@ -5653,6 +5656,31 @@
           <w:sz w:val="22"/>
           <w:szCs w:val="22"/>
         </w:rPr>
+        <w:t>Student profile</w:t>
+      </w:r>
+    </w:p>
+    <w:p>
+      <w:pPr>
+        <w:pStyle w:val="Listaszerbekezds"/>
+        <w:numPr>
+          <w:ilvl w:val="4"/>
+          <w:numId w:val="13"/>
+        </w:numPr>
+        <w:spacing w:before="480" w:after="240"/>
+        <w:rPr>
+          <w:rFonts w:ascii="Lexend" w:hAnsi="Lexend"/>
+          <w:b/>
+          <w:bCs/>
+          <w:sz w:val="22"/>
+          <w:szCs w:val="22"/>
+        </w:rPr>
+      </w:pPr>
+      <w:r>
+        <w:rPr>
+          <w:rFonts w:ascii="Lexend" w:hAnsi="Lexend"/>
+          <w:sz w:val="22"/>
+          <w:szCs w:val="22"/>
+        </w:rPr>
         <w:t>Submission grader page</w:t>
       </w:r>
     </w:p>
@@ -5816,6 +5844,31 @@
           <w:szCs w:val="22"/>
         </w:rPr>
         <w:t>page</w:t>
+      </w:r>
+    </w:p>
+    <w:p>
+      <w:pPr>
+        <w:pStyle w:val="Listaszerbekezds"/>
+        <w:numPr>
+          <w:ilvl w:val="3"/>
+          <w:numId w:val="13"/>
+        </w:numPr>
+        <w:spacing w:before="480" w:after="240"/>
+        <w:rPr>
+          <w:rFonts w:ascii="Lexend" w:hAnsi="Lexend"/>
+          <w:b/>
+          <w:bCs/>
+          <w:sz w:val="22"/>
+          <w:szCs w:val="22"/>
+        </w:rPr>
+      </w:pPr>
+      <w:r>
+        <w:rPr>
+          <w:rFonts w:ascii="Lexend" w:hAnsi="Lexend"/>
+          <w:sz w:val="22"/>
+          <w:szCs w:val="22"/>
+        </w:rPr>
+        <w:t>Hand-ins</w:t>
       </w:r>
     </w:p>
     <w:p>
@@ -6327,6 +6380,7 @@
           <w:sz w:val="32"/>
           <w:szCs w:val="32"/>
         </w:rPr>
+        <w:lastRenderedPageBreak/>
         <w:t>Page Contracts</w:t>
       </w:r>
     </w:p>
@@ -6353,7 +6407,6 @@
           <w:sz w:val="28"/>
           <w:szCs w:val="28"/>
         </w:rPr>
-        <w:lastRenderedPageBreak/>
         <w:t>Stud</w:t>
       </w:r>
       <w:r>
@@ -6532,25 +6585,7 @@
           <w:sz w:val="22"/>
           <w:szCs w:val="22"/>
         </w:rPr>
-        <w:t xml:space="preserve">GET </w:t>
-      </w:r>
-      <w:proofErr w:type="spellStart"/>
-      <w:r>
-        <w:rPr>
-          <w:rFonts w:ascii="JetBrains Mono" w:hAnsi="JetBrains Mono" w:cs="JetBrains Mono"/>
-          <w:sz w:val="22"/>
-          <w:szCs w:val="22"/>
-        </w:rPr>
-        <w:t>api</w:t>
-      </w:r>
-      <w:proofErr w:type="spellEnd"/>
-      <w:r>
-        <w:rPr>
-          <w:rFonts w:ascii="JetBrains Mono" w:hAnsi="JetBrains Mono" w:cs="JetBrains Mono"/>
-          <w:sz w:val="22"/>
-          <w:szCs w:val="22"/>
-        </w:rPr>
-        <w:t>/student/home</w:t>
+        <w:t>GET api/student/home</w:t>
       </w:r>
     </w:p>
     <w:p>
@@ -6629,27 +6664,7 @@
           <w:szCs w:val="14"/>
           <w:lang w:val="hu-HU"/>
         </w:rPr>
-        <w:t>    "</w:t>
-      </w:r>
-      <w:proofErr w:type="spellStart"/>
-      <w:r>
-        <w:rPr>
-          <w:rFonts w:ascii="JetBrains Mono" w:hAnsi="JetBrains Mono" w:cs="JetBrains Mono"/>
-          <w:sz w:val="14"/>
-          <w:szCs w:val="14"/>
-          <w:lang w:val="hu-HU"/>
-        </w:rPr>
-        <w:t>attendedCourses</w:t>
-      </w:r>
-      <w:proofErr w:type="spellEnd"/>
-      <w:r>
-        <w:rPr>
-          <w:rFonts w:ascii="JetBrains Mono" w:hAnsi="JetBrains Mono" w:cs="JetBrains Mono"/>
-          <w:sz w:val="14"/>
-          <w:szCs w:val="14"/>
-          <w:lang w:val="hu-HU"/>
-        </w:rPr>
-        <w:t>": {</w:t>
+        <w:t>    "attendedCourses": {</w:t>
       </w:r>
     </w:p>
     <w:p>
@@ -6669,27 +6684,7 @@
           <w:szCs w:val="14"/>
           <w:lang w:val="hu-HU"/>
         </w:rPr>
-        <w:t>      "</w:t>
-      </w:r>
-      <w:proofErr w:type="spellStart"/>
-      <w:r>
-        <w:rPr>
-          <w:rFonts w:ascii="JetBrains Mono" w:hAnsi="JetBrains Mono" w:cs="JetBrains Mono"/>
-          <w:sz w:val="14"/>
-          <w:szCs w:val="14"/>
-          <w:lang w:val="hu-HU"/>
-        </w:rPr>
-        <w:t>active</w:t>
-      </w:r>
-      <w:proofErr w:type="spellEnd"/>
-      <w:r>
-        <w:rPr>
-          <w:rFonts w:ascii="JetBrains Mono" w:hAnsi="JetBrains Mono" w:cs="JetBrains Mono"/>
-          <w:sz w:val="14"/>
-          <w:szCs w:val="14"/>
-          <w:lang w:val="hu-HU"/>
-        </w:rPr>
-        <w:t>": [</w:t>
+        <w:t>      "active": [</w:t>
       </w:r>
     </w:p>
     <w:p>
@@ -6729,47 +6724,7 @@
           <w:szCs w:val="14"/>
           <w:lang w:val="hu-HU"/>
         </w:rPr>
-        <w:t>          "</w:t>
-      </w:r>
-      <w:proofErr w:type="spellStart"/>
-      <w:r>
-        <w:rPr>
-          <w:rFonts w:ascii="JetBrains Mono" w:hAnsi="JetBrains Mono" w:cs="JetBrains Mono"/>
-          <w:sz w:val="14"/>
-          <w:szCs w:val="14"/>
-          <w:lang w:val="hu-HU"/>
-        </w:rPr>
-        <w:t>courseId</w:t>
-      </w:r>
-      <w:proofErr w:type="spellEnd"/>
-      <w:r>
-        <w:rPr>
-          <w:rFonts w:ascii="JetBrains Mono" w:hAnsi="JetBrains Mono" w:cs="JetBrains Mono"/>
-          <w:sz w:val="14"/>
-          <w:szCs w:val="14"/>
-          <w:lang w:val="hu-HU"/>
-        </w:rPr>
-        <w:t>": "</w:t>
-      </w:r>
-      <w:proofErr w:type="spellStart"/>
-      <w:r>
-        <w:rPr>
-          <w:rFonts w:ascii="JetBrains Mono" w:hAnsi="JetBrains Mono" w:cs="JetBrains Mono"/>
-          <w:sz w:val="14"/>
-          <w:szCs w:val="14"/>
-          <w:lang w:val="hu-HU"/>
-        </w:rPr>
-        <w:t>uuid</w:t>
-      </w:r>
-      <w:proofErr w:type="spellEnd"/>
-      <w:r>
-        <w:rPr>
-          <w:rFonts w:ascii="JetBrains Mono" w:hAnsi="JetBrains Mono" w:cs="JetBrains Mono"/>
-          <w:sz w:val="14"/>
-          <w:szCs w:val="14"/>
-          <w:lang w:val="hu-HU"/>
-        </w:rPr>
-        <w:t>",</w:t>
+        <w:t>          "courseId": "uuid",</w:t>
       </w:r>
     </w:p>
     <w:p>
@@ -6789,47 +6744,7 @@
           <w:szCs w:val="14"/>
           <w:lang w:val="hu-HU"/>
         </w:rPr>
-        <w:t>          "</w:t>
-      </w:r>
-      <w:proofErr w:type="spellStart"/>
-      <w:r>
-        <w:rPr>
-          <w:rFonts w:ascii="JetBrains Mono" w:hAnsi="JetBrains Mono" w:cs="JetBrains Mono"/>
-          <w:sz w:val="14"/>
-          <w:szCs w:val="14"/>
-          <w:lang w:val="hu-HU"/>
-        </w:rPr>
-        <w:t>instanceId</w:t>
-      </w:r>
-      <w:proofErr w:type="spellEnd"/>
-      <w:r>
-        <w:rPr>
-          <w:rFonts w:ascii="JetBrains Mono" w:hAnsi="JetBrains Mono" w:cs="JetBrains Mono"/>
-          <w:sz w:val="14"/>
-          <w:szCs w:val="14"/>
-          <w:lang w:val="hu-HU"/>
-        </w:rPr>
-        <w:t>": "</w:t>
-      </w:r>
-      <w:proofErr w:type="spellStart"/>
-      <w:r>
-        <w:rPr>
-          <w:rFonts w:ascii="JetBrains Mono" w:hAnsi="JetBrains Mono" w:cs="JetBrains Mono"/>
-          <w:sz w:val="14"/>
-          <w:szCs w:val="14"/>
-          <w:lang w:val="hu-HU"/>
-        </w:rPr>
-        <w:t>uuid</w:t>
-      </w:r>
-      <w:proofErr w:type="spellEnd"/>
-      <w:r>
-        <w:rPr>
-          <w:rFonts w:ascii="JetBrains Mono" w:hAnsi="JetBrains Mono" w:cs="JetBrains Mono"/>
-          <w:sz w:val="14"/>
-          <w:szCs w:val="14"/>
-          <w:lang w:val="hu-HU"/>
-        </w:rPr>
-        <w:t>",</w:t>
+        <w:t>          "instanceId": "uuid",</w:t>
       </w:r>
     </w:p>
     <w:p>
@@ -6849,47 +6764,7 @@
           <w:szCs w:val="14"/>
           <w:lang w:val="hu-HU"/>
         </w:rPr>
-        <w:t>          "</w:t>
-      </w:r>
-      <w:proofErr w:type="spellStart"/>
-      <w:r>
-        <w:rPr>
-          <w:rFonts w:ascii="JetBrains Mono" w:hAnsi="JetBrains Mono" w:cs="JetBrains Mono"/>
-          <w:sz w:val="14"/>
-          <w:szCs w:val="14"/>
-          <w:lang w:val="hu-HU"/>
-        </w:rPr>
-        <w:t>courseName</w:t>
-      </w:r>
-      <w:proofErr w:type="spellEnd"/>
-      <w:r>
-        <w:rPr>
-          <w:rFonts w:ascii="JetBrains Mono" w:hAnsi="JetBrains Mono" w:cs="JetBrains Mono"/>
-          <w:sz w:val="14"/>
-          <w:szCs w:val="14"/>
-          <w:lang w:val="hu-HU"/>
-        </w:rPr>
-        <w:t>": "</w:t>
-      </w:r>
-      <w:proofErr w:type="spellStart"/>
-      <w:r>
-        <w:rPr>
-          <w:rFonts w:ascii="JetBrains Mono" w:hAnsi="JetBrains Mono" w:cs="JetBrains Mono"/>
-          <w:sz w:val="14"/>
-          <w:szCs w:val="14"/>
-          <w:lang w:val="hu-HU"/>
-        </w:rPr>
-        <w:t>Calculus</w:t>
-      </w:r>
-      <w:proofErr w:type="spellEnd"/>
-      <w:r>
-        <w:rPr>
-          <w:rFonts w:ascii="JetBrains Mono" w:hAnsi="JetBrains Mono" w:cs="JetBrains Mono"/>
-          <w:sz w:val="14"/>
-          <w:szCs w:val="14"/>
-          <w:lang w:val="hu-HU"/>
-        </w:rPr>
-        <w:t>",</w:t>
+        <w:t>          "courseName": "Calculus",</w:t>
       </w:r>
     </w:p>
     <w:p>
@@ -6909,27 +6784,7 @@
           <w:szCs w:val="14"/>
           <w:lang w:val="hu-HU"/>
         </w:rPr>
-        <w:t>          "</w:t>
-      </w:r>
-      <w:proofErr w:type="spellStart"/>
-      <w:r>
-        <w:rPr>
-          <w:rFonts w:ascii="JetBrains Mono" w:hAnsi="JetBrains Mono" w:cs="JetBrains Mono"/>
-          <w:sz w:val="14"/>
-          <w:szCs w:val="14"/>
-          <w:lang w:val="hu-HU"/>
-        </w:rPr>
-        <w:t>imageUrl</w:t>
-      </w:r>
-      <w:proofErr w:type="spellEnd"/>
-      <w:r>
-        <w:rPr>
-          <w:rFonts w:ascii="JetBrains Mono" w:hAnsi="JetBrains Mono" w:cs="JetBrains Mono"/>
-          <w:sz w:val="14"/>
-          <w:szCs w:val="14"/>
-          <w:lang w:val="hu-HU"/>
-        </w:rPr>
-        <w:t>": "",</w:t>
+        <w:t>          "imageUrl": "",</w:t>
       </w:r>
     </w:p>
     <w:p>
@@ -6949,47 +6804,7 @@
           <w:szCs w:val="14"/>
           <w:lang w:val="hu-HU"/>
         </w:rPr>
-        <w:t>          "</w:t>
-      </w:r>
-      <w:proofErr w:type="spellStart"/>
-      <w:r>
-        <w:rPr>
-          <w:rFonts w:ascii="JetBrains Mono" w:hAnsi="JetBrains Mono" w:cs="JetBrains Mono"/>
-          <w:sz w:val="14"/>
-          <w:szCs w:val="14"/>
-          <w:lang w:val="hu-HU"/>
-        </w:rPr>
-        <w:t>teacherName</w:t>
-      </w:r>
-      <w:proofErr w:type="spellEnd"/>
-      <w:r>
-        <w:rPr>
-          <w:rFonts w:ascii="JetBrains Mono" w:hAnsi="JetBrains Mono" w:cs="JetBrains Mono"/>
-          <w:sz w:val="14"/>
-          <w:szCs w:val="14"/>
-          <w:lang w:val="hu-HU"/>
-        </w:rPr>
-        <w:t xml:space="preserve">": "Dr. John </w:t>
-      </w:r>
-      <w:proofErr w:type="spellStart"/>
-      <w:r>
-        <w:rPr>
-          <w:rFonts w:ascii="JetBrains Mono" w:hAnsi="JetBrains Mono" w:cs="JetBrains Mono"/>
-          <w:sz w:val="14"/>
-          <w:szCs w:val="14"/>
-          <w:lang w:val="hu-HU"/>
-        </w:rPr>
-        <w:t>Doe</w:t>
-      </w:r>
-      <w:proofErr w:type="spellEnd"/>
-      <w:r>
-        <w:rPr>
-          <w:rFonts w:ascii="JetBrains Mono" w:hAnsi="JetBrains Mono" w:cs="JetBrains Mono"/>
-          <w:sz w:val="14"/>
-          <w:szCs w:val="14"/>
-          <w:lang w:val="hu-HU"/>
-        </w:rPr>
-        <w:t>",</w:t>
+        <w:t>          "teacherName": "Dr. John Doe",</w:t>
       </w:r>
     </w:p>
     <w:p>
@@ -7009,47 +6824,7 @@
           <w:szCs w:val="14"/>
           <w:lang w:val="hu-HU"/>
         </w:rPr>
-        <w:t>          "</w:t>
-      </w:r>
-      <w:proofErr w:type="spellStart"/>
-      <w:r>
-        <w:rPr>
-          <w:rFonts w:ascii="JetBrains Mono" w:hAnsi="JetBrains Mono" w:cs="JetBrains Mono"/>
-          <w:sz w:val="14"/>
-          <w:szCs w:val="14"/>
-          <w:lang w:val="hu-HU"/>
-        </w:rPr>
-        <w:t>courseType</w:t>
-      </w:r>
-      <w:proofErr w:type="spellEnd"/>
-      <w:r>
-        <w:rPr>
-          <w:rFonts w:ascii="JetBrains Mono" w:hAnsi="JetBrains Mono" w:cs="JetBrains Mono"/>
-          <w:sz w:val="14"/>
-          <w:szCs w:val="14"/>
-          <w:lang w:val="hu-HU"/>
-        </w:rPr>
-        <w:t>": "</w:t>
-      </w:r>
-      <w:proofErr w:type="spellStart"/>
-      <w:r>
-        <w:rPr>
-          <w:rFonts w:ascii="JetBrains Mono" w:hAnsi="JetBrains Mono" w:cs="JetBrains Mono"/>
-          <w:sz w:val="14"/>
-          <w:szCs w:val="14"/>
-          <w:lang w:val="hu-HU"/>
-        </w:rPr>
-        <w:t>tutoring</w:t>
-      </w:r>
-      <w:proofErr w:type="spellEnd"/>
-      <w:r>
-        <w:rPr>
-          <w:rFonts w:ascii="JetBrains Mono" w:hAnsi="JetBrains Mono" w:cs="JetBrains Mono"/>
-          <w:sz w:val="14"/>
-          <w:szCs w:val="14"/>
-          <w:lang w:val="hu-HU"/>
-        </w:rPr>
-        <w:t>",</w:t>
+        <w:t>          "courseType": "tutoring",</w:t>
       </w:r>
     </w:p>
     <w:p>
@@ -7069,27 +6844,7 @@
           <w:szCs w:val="14"/>
           <w:lang w:val="hu-HU"/>
         </w:rPr>
-        <w:t>          "</w:t>
-      </w:r>
-      <w:proofErr w:type="spellStart"/>
-      <w:r>
-        <w:rPr>
-          <w:rFonts w:ascii="JetBrains Mono" w:hAnsi="JetBrains Mono" w:cs="JetBrains Mono"/>
-          <w:sz w:val="14"/>
-          <w:szCs w:val="14"/>
-          <w:lang w:val="hu-HU"/>
-        </w:rPr>
-        <w:t>progress</w:t>
-      </w:r>
-      <w:proofErr w:type="spellEnd"/>
-      <w:r>
-        <w:rPr>
-          <w:rFonts w:ascii="JetBrains Mono" w:hAnsi="JetBrains Mono" w:cs="JetBrains Mono"/>
-          <w:sz w:val="14"/>
-          <w:szCs w:val="14"/>
-          <w:lang w:val="hu-HU"/>
-        </w:rPr>
-        <w:t>": 15,</w:t>
+        <w:t>          "progress": 15,</w:t>
       </w:r>
     </w:p>
     <w:p>
@@ -7109,27 +6864,7 @@
           <w:szCs w:val="14"/>
           <w:lang w:val="hu-HU"/>
         </w:rPr>
-        <w:t>          "</w:t>
-      </w:r>
-      <w:proofErr w:type="spellStart"/>
-      <w:r>
-        <w:rPr>
-          <w:rFonts w:ascii="JetBrains Mono" w:hAnsi="JetBrains Mono" w:cs="JetBrains Mono"/>
-          <w:sz w:val="14"/>
-          <w:szCs w:val="14"/>
-          <w:lang w:val="hu-HU"/>
-        </w:rPr>
-        <w:t>upcomingEvents</w:t>
-      </w:r>
-      <w:proofErr w:type="spellEnd"/>
-      <w:r>
-        <w:rPr>
-          <w:rFonts w:ascii="JetBrains Mono" w:hAnsi="JetBrains Mono" w:cs="JetBrains Mono"/>
-          <w:sz w:val="14"/>
-          <w:szCs w:val="14"/>
-          <w:lang w:val="hu-HU"/>
-        </w:rPr>
-        <w:t>": [</w:t>
+        <w:t>          "upcomingEvents": [</w:t>
       </w:r>
     </w:p>
     <w:p>
@@ -7169,47 +6904,7 @@
           <w:szCs w:val="14"/>
           <w:lang w:val="hu-HU"/>
         </w:rPr>
-        <w:t>              "</w:t>
-      </w:r>
-      <w:proofErr w:type="spellStart"/>
-      <w:r>
-        <w:rPr>
-          <w:rFonts w:ascii="JetBrains Mono" w:hAnsi="JetBrains Mono" w:cs="JetBrains Mono"/>
-          <w:sz w:val="14"/>
-          <w:szCs w:val="14"/>
-          <w:lang w:val="hu-HU"/>
-        </w:rPr>
-        <w:t>eventId</w:t>
-      </w:r>
-      <w:proofErr w:type="spellEnd"/>
-      <w:r>
-        <w:rPr>
-          <w:rFonts w:ascii="JetBrains Mono" w:hAnsi="JetBrains Mono" w:cs="JetBrains Mono"/>
-          <w:sz w:val="14"/>
-          <w:szCs w:val="14"/>
-          <w:lang w:val="hu-HU"/>
-        </w:rPr>
-        <w:t>": "</w:t>
-      </w:r>
-      <w:proofErr w:type="spellStart"/>
-      <w:r>
-        <w:rPr>
-          <w:rFonts w:ascii="JetBrains Mono" w:hAnsi="JetBrains Mono" w:cs="JetBrains Mono"/>
-          <w:sz w:val="14"/>
-          <w:szCs w:val="14"/>
-          <w:lang w:val="hu-HU"/>
-        </w:rPr>
-        <w:t>uuid</w:t>
-      </w:r>
-      <w:proofErr w:type="spellEnd"/>
-      <w:r>
-        <w:rPr>
-          <w:rFonts w:ascii="JetBrains Mono" w:hAnsi="JetBrains Mono" w:cs="JetBrains Mono"/>
-          <w:sz w:val="14"/>
-          <w:szCs w:val="14"/>
-          <w:lang w:val="hu-HU"/>
-        </w:rPr>
-        <w:t>",</w:t>
+        <w:t>              "eventId": "uuid",</w:t>
       </w:r>
     </w:p>
     <w:p>
@@ -7229,27 +6924,7 @@
           <w:szCs w:val="14"/>
           <w:lang w:val="hu-HU"/>
         </w:rPr>
-        <w:t>              "</w:t>
-      </w:r>
-      <w:proofErr w:type="spellStart"/>
-      <w:r>
-        <w:rPr>
-          <w:rFonts w:ascii="JetBrains Mono" w:hAnsi="JetBrains Mono" w:cs="JetBrains Mono"/>
-          <w:sz w:val="14"/>
-          <w:szCs w:val="14"/>
-          <w:lang w:val="hu-HU"/>
-        </w:rPr>
-        <w:t>eventUrl</w:t>
-      </w:r>
-      <w:proofErr w:type="spellEnd"/>
-      <w:r>
-        <w:rPr>
-          <w:rFonts w:ascii="JetBrains Mono" w:hAnsi="JetBrains Mono" w:cs="JetBrains Mono"/>
-          <w:sz w:val="14"/>
-          <w:szCs w:val="14"/>
-          <w:lang w:val="hu-HU"/>
-        </w:rPr>
-        <w:t>": "#",</w:t>
+        <w:t>              "eventUrl": "#",</w:t>
       </w:r>
     </w:p>
     <w:p>
@@ -7269,67 +6944,7 @@
           <w:szCs w:val="14"/>
           <w:lang w:val="hu-HU"/>
         </w:rPr>
-        <w:t>              "</w:t>
-      </w:r>
-      <w:proofErr w:type="spellStart"/>
-      <w:r>
-        <w:rPr>
-          <w:rFonts w:ascii="JetBrains Mono" w:hAnsi="JetBrains Mono" w:cs="JetBrains Mono"/>
-          <w:sz w:val="14"/>
-          <w:szCs w:val="14"/>
-          <w:lang w:val="hu-HU"/>
-        </w:rPr>
-        <w:t>title</w:t>
-      </w:r>
-      <w:proofErr w:type="spellEnd"/>
-      <w:r>
-        <w:rPr>
-          <w:rFonts w:ascii="JetBrains Mono" w:hAnsi="JetBrains Mono" w:cs="JetBrains Mono"/>
-          <w:sz w:val="14"/>
-          <w:szCs w:val="14"/>
-          <w:lang w:val="hu-HU"/>
-        </w:rPr>
-        <w:t>": "</w:t>
-      </w:r>
-      <w:proofErr w:type="spellStart"/>
-      <w:r>
-        <w:rPr>
-          <w:rFonts w:ascii="JetBrains Mono" w:hAnsi="JetBrains Mono" w:cs="JetBrains Mono"/>
-          <w:sz w:val="14"/>
-          <w:szCs w:val="14"/>
-          <w:lang w:val="hu-HU"/>
-        </w:rPr>
-        <w:t>Calculus</w:t>
-      </w:r>
-      <w:proofErr w:type="spellEnd"/>
-      <w:r>
-        <w:rPr>
-          <w:rFonts w:ascii="JetBrains Mono" w:hAnsi="JetBrains Mono" w:cs="JetBrains Mono"/>
-          <w:sz w:val="14"/>
-          <w:szCs w:val="14"/>
-          <w:lang w:val="hu-HU"/>
-        </w:rPr>
-        <w:t xml:space="preserve"> </w:t>
-      </w:r>
-      <w:proofErr w:type="spellStart"/>
-      <w:r>
-        <w:rPr>
-          <w:rFonts w:ascii="JetBrains Mono" w:hAnsi="JetBrains Mono" w:cs="JetBrains Mono"/>
-          <w:sz w:val="14"/>
-          <w:szCs w:val="14"/>
-          <w:lang w:val="hu-HU"/>
-        </w:rPr>
-        <w:t>hand</w:t>
-      </w:r>
-      <w:proofErr w:type="spellEnd"/>
-      <w:r>
-        <w:rPr>
-          <w:rFonts w:ascii="JetBrains Mono" w:hAnsi="JetBrains Mono" w:cs="JetBrains Mono"/>
-          <w:sz w:val="14"/>
-          <w:szCs w:val="14"/>
-          <w:lang w:val="hu-HU"/>
-        </w:rPr>
-        <w:t>-in",</w:t>
+        <w:t>              "title": "Calculus hand-in",</w:t>
       </w:r>
     </w:p>
     <w:p>
@@ -7349,27 +6964,7 @@
           <w:szCs w:val="14"/>
           <w:lang w:val="hu-HU"/>
         </w:rPr>
-        <w:t>              "</w:t>
-      </w:r>
-      <w:proofErr w:type="spellStart"/>
-      <w:r>
-        <w:rPr>
-          <w:rFonts w:ascii="JetBrains Mono" w:hAnsi="JetBrains Mono" w:cs="JetBrains Mono"/>
-          <w:sz w:val="14"/>
-          <w:szCs w:val="14"/>
-          <w:lang w:val="hu-HU"/>
-        </w:rPr>
-        <w:t>startDate</w:t>
-      </w:r>
-      <w:proofErr w:type="spellEnd"/>
-      <w:r>
-        <w:rPr>
-          <w:rFonts w:ascii="JetBrains Mono" w:hAnsi="JetBrains Mono" w:cs="JetBrains Mono"/>
-          <w:sz w:val="14"/>
-          <w:szCs w:val="14"/>
-          <w:lang w:val="hu-HU"/>
-        </w:rPr>
-        <w:t>": "2000-01-01T00:00:00.000",</w:t>
+        <w:t>              "startDate": "01-12",</w:t>
       </w:r>
     </w:p>
     <w:p>
@@ -7389,27 +6984,7 @@
           <w:szCs w:val="14"/>
           <w:lang w:val="hu-HU"/>
         </w:rPr>
-        <w:t>              "</w:t>
-      </w:r>
-      <w:proofErr w:type="spellStart"/>
-      <w:r>
-        <w:rPr>
-          <w:rFonts w:ascii="JetBrains Mono" w:hAnsi="JetBrains Mono" w:cs="JetBrains Mono"/>
-          <w:sz w:val="14"/>
-          <w:szCs w:val="14"/>
-          <w:lang w:val="hu-HU"/>
-        </w:rPr>
-        <w:t>endDate</w:t>
-      </w:r>
-      <w:proofErr w:type="spellEnd"/>
-      <w:r>
-        <w:rPr>
-          <w:rFonts w:ascii="JetBrains Mono" w:hAnsi="JetBrains Mono" w:cs="JetBrains Mono"/>
-          <w:sz w:val="14"/>
-          <w:szCs w:val="14"/>
-          <w:lang w:val="hu-HU"/>
-        </w:rPr>
-        <w:t>": "2000-01-01T00:00:00.000",</w:t>
+        <w:t>              "startTime": "12:00",</w:t>
       </w:r>
     </w:p>
     <w:p>
@@ -7429,47 +7004,7 @@
           <w:szCs w:val="14"/>
           <w:lang w:val="hu-HU"/>
         </w:rPr>
-        <w:t>              "</w:t>
-      </w:r>
-      <w:proofErr w:type="spellStart"/>
-      <w:r>
-        <w:rPr>
-          <w:rFonts w:ascii="JetBrains Mono" w:hAnsi="JetBrains Mono" w:cs="JetBrains Mono"/>
-          <w:sz w:val="14"/>
-          <w:szCs w:val="14"/>
-          <w:lang w:val="hu-HU"/>
-        </w:rPr>
-        <w:t>eventType</w:t>
-      </w:r>
-      <w:proofErr w:type="spellEnd"/>
-      <w:r>
-        <w:rPr>
-          <w:rFonts w:ascii="JetBrains Mono" w:hAnsi="JetBrains Mono" w:cs="JetBrains Mono"/>
-          <w:sz w:val="14"/>
-          <w:szCs w:val="14"/>
-          <w:lang w:val="hu-HU"/>
-        </w:rPr>
-        <w:t>": "</w:t>
-      </w:r>
-      <w:proofErr w:type="spellStart"/>
-      <w:r>
-        <w:rPr>
-          <w:rFonts w:ascii="JetBrains Mono" w:hAnsi="JetBrains Mono" w:cs="JetBrains Mono"/>
-          <w:sz w:val="14"/>
-          <w:szCs w:val="14"/>
-          <w:lang w:val="hu-HU"/>
-        </w:rPr>
-        <w:t>deadline</w:t>
-      </w:r>
-      <w:proofErr w:type="spellEnd"/>
-      <w:r>
-        <w:rPr>
-          <w:rFonts w:ascii="JetBrains Mono" w:hAnsi="JetBrains Mono" w:cs="JetBrains Mono"/>
-          <w:sz w:val="14"/>
-          <w:szCs w:val="14"/>
-          <w:lang w:val="hu-HU"/>
-        </w:rPr>
-        <w:t>",</w:t>
+        <w:t>              "eventType": "deadline",</w:t>
       </w:r>
     </w:p>
     <w:p>
@@ -7489,67 +7024,7 @@
           <w:szCs w:val="14"/>
           <w:lang w:val="hu-HU"/>
         </w:rPr>
-        <w:t>              "</w:t>
-      </w:r>
-      <w:proofErr w:type="spellStart"/>
-      <w:r>
-        <w:rPr>
-          <w:rFonts w:ascii="JetBrains Mono" w:hAnsi="JetBrains Mono" w:cs="JetBrains Mono"/>
-          <w:sz w:val="14"/>
-          <w:szCs w:val="14"/>
-          <w:lang w:val="hu-HU"/>
-        </w:rPr>
-        <w:t>description</w:t>
-      </w:r>
-      <w:proofErr w:type="spellEnd"/>
-      <w:r>
-        <w:rPr>
-          <w:rFonts w:ascii="JetBrains Mono" w:hAnsi="JetBrains Mono" w:cs="JetBrains Mono"/>
-          <w:sz w:val="14"/>
-          <w:szCs w:val="14"/>
-          <w:lang w:val="hu-HU"/>
-        </w:rPr>
-        <w:t>": "</w:t>
-      </w:r>
-      <w:proofErr w:type="spellStart"/>
-      <w:r>
-        <w:rPr>
-          <w:rFonts w:ascii="JetBrains Mono" w:hAnsi="JetBrains Mono" w:cs="JetBrains Mono"/>
-          <w:sz w:val="14"/>
-          <w:szCs w:val="14"/>
-          <w:lang w:val="hu-HU"/>
-        </w:rPr>
-        <w:t>Hand</w:t>
-      </w:r>
-      <w:proofErr w:type="spellEnd"/>
-      <w:r>
-        <w:rPr>
-          <w:rFonts w:ascii="JetBrains Mono" w:hAnsi="JetBrains Mono" w:cs="JetBrains Mono"/>
-          <w:sz w:val="14"/>
-          <w:szCs w:val="14"/>
-          <w:lang w:val="hu-HU"/>
-        </w:rPr>
-        <w:t xml:space="preserve">-in </w:t>
-      </w:r>
-      <w:proofErr w:type="spellStart"/>
-      <w:r>
-        <w:rPr>
-          <w:rFonts w:ascii="JetBrains Mono" w:hAnsi="JetBrains Mono" w:cs="JetBrains Mono"/>
-          <w:sz w:val="14"/>
-          <w:szCs w:val="14"/>
-          <w:lang w:val="hu-HU"/>
-        </w:rPr>
-        <w:t>deadline</w:t>
-      </w:r>
-      <w:proofErr w:type="spellEnd"/>
-      <w:r>
-        <w:rPr>
-          <w:rFonts w:ascii="JetBrains Mono" w:hAnsi="JetBrains Mono" w:cs="JetBrains Mono"/>
-          <w:sz w:val="14"/>
-          <w:szCs w:val="14"/>
-          <w:lang w:val="hu-HU"/>
-        </w:rPr>
-        <w:t>"</w:t>
+        <w:t>              "description": "Hand-in deadline"</w:t>
       </w:r>
     </w:p>
     <w:p>
@@ -7649,27 +7124,7 @@
           <w:szCs w:val="14"/>
           <w:lang w:val="hu-HU"/>
         </w:rPr>
-        <w:t>      "</w:t>
-      </w:r>
-      <w:proofErr w:type="spellStart"/>
-      <w:r>
-        <w:rPr>
-          <w:rFonts w:ascii="JetBrains Mono" w:hAnsi="JetBrains Mono" w:cs="JetBrains Mono"/>
-          <w:sz w:val="14"/>
-          <w:szCs w:val="14"/>
-          <w:lang w:val="hu-HU"/>
-        </w:rPr>
-        <w:t>inactive</w:t>
-      </w:r>
-      <w:proofErr w:type="spellEnd"/>
-      <w:r>
-        <w:rPr>
-          <w:rFonts w:ascii="JetBrains Mono" w:hAnsi="JetBrains Mono" w:cs="JetBrains Mono"/>
-          <w:sz w:val="14"/>
-          <w:szCs w:val="14"/>
-          <w:lang w:val="hu-HU"/>
-        </w:rPr>
-        <w:t>": [</w:t>
+        <w:t>      "inactive": [</w:t>
       </w:r>
     </w:p>
     <w:p>
@@ -7709,47 +7164,7 @@
           <w:szCs w:val="14"/>
           <w:lang w:val="hu-HU"/>
         </w:rPr>
-        <w:t>          "</w:t>
-      </w:r>
-      <w:proofErr w:type="spellStart"/>
-      <w:r>
-        <w:rPr>
-          <w:rFonts w:ascii="JetBrains Mono" w:hAnsi="JetBrains Mono" w:cs="JetBrains Mono"/>
-          <w:sz w:val="14"/>
-          <w:szCs w:val="14"/>
-          <w:lang w:val="hu-HU"/>
-        </w:rPr>
-        <w:t>courseId</w:t>
-      </w:r>
-      <w:proofErr w:type="spellEnd"/>
-      <w:r>
-        <w:rPr>
-          <w:rFonts w:ascii="JetBrains Mono" w:hAnsi="JetBrains Mono" w:cs="JetBrains Mono"/>
-          <w:sz w:val="14"/>
-          <w:szCs w:val="14"/>
-          <w:lang w:val="hu-HU"/>
-        </w:rPr>
-        <w:t>": "</w:t>
-      </w:r>
-      <w:proofErr w:type="spellStart"/>
-      <w:r>
-        <w:rPr>
-          <w:rFonts w:ascii="JetBrains Mono" w:hAnsi="JetBrains Mono" w:cs="JetBrains Mono"/>
-          <w:sz w:val="14"/>
-          <w:szCs w:val="14"/>
-          <w:lang w:val="hu-HU"/>
-        </w:rPr>
-        <w:t>uuid</w:t>
-      </w:r>
-      <w:proofErr w:type="spellEnd"/>
-      <w:r>
-        <w:rPr>
-          <w:rFonts w:ascii="JetBrains Mono" w:hAnsi="JetBrains Mono" w:cs="JetBrains Mono"/>
-          <w:sz w:val="14"/>
-          <w:szCs w:val="14"/>
-          <w:lang w:val="hu-HU"/>
-        </w:rPr>
-        <w:t>",</w:t>
+        <w:t>          "courseId": "uuid",</w:t>
       </w:r>
     </w:p>
     <w:p>
@@ -7769,47 +7184,7 @@
           <w:szCs w:val="14"/>
           <w:lang w:val="hu-HU"/>
         </w:rPr>
-        <w:t>          "</w:t>
-      </w:r>
-      <w:proofErr w:type="spellStart"/>
-      <w:r>
-        <w:rPr>
-          <w:rFonts w:ascii="JetBrains Mono" w:hAnsi="JetBrains Mono" w:cs="JetBrains Mono"/>
-          <w:sz w:val="14"/>
-          <w:szCs w:val="14"/>
-          <w:lang w:val="hu-HU"/>
-        </w:rPr>
-        <w:t>instanceId</w:t>
-      </w:r>
-      <w:proofErr w:type="spellEnd"/>
-      <w:r>
-        <w:rPr>
-          <w:rFonts w:ascii="JetBrains Mono" w:hAnsi="JetBrains Mono" w:cs="JetBrains Mono"/>
-          <w:sz w:val="14"/>
-          <w:szCs w:val="14"/>
-          <w:lang w:val="hu-HU"/>
-        </w:rPr>
-        <w:t>": "</w:t>
-      </w:r>
-      <w:proofErr w:type="spellStart"/>
-      <w:r>
-        <w:rPr>
-          <w:rFonts w:ascii="JetBrains Mono" w:hAnsi="JetBrains Mono" w:cs="JetBrains Mono"/>
-          <w:sz w:val="14"/>
-          <w:szCs w:val="14"/>
-          <w:lang w:val="hu-HU"/>
-        </w:rPr>
-        <w:t>uuid</w:t>
-      </w:r>
-      <w:proofErr w:type="spellEnd"/>
-      <w:r>
-        <w:rPr>
-          <w:rFonts w:ascii="JetBrains Mono" w:hAnsi="JetBrains Mono" w:cs="JetBrains Mono"/>
-          <w:sz w:val="14"/>
-          <w:szCs w:val="14"/>
-          <w:lang w:val="hu-HU"/>
-        </w:rPr>
-        <w:t>",</w:t>
+        <w:t>          "instanceId": "uuid",</w:t>
       </w:r>
     </w:p>
     <w:p>
@@ -7829,47 +7204,7 @@
           <w:szCs w:val="14"/>
           <w:lang w:val="hu-HU"/>
         </w:rPr>
-        <w:t>          "</w:t>
-      </w:r>
-      <w:proofErr w:type="spellStart"/>
-      <w:r>
-        <w:rPr>
-          <w:rFonts w:ascii="JetBrains Mono" w:hAnsi="JetBrains Mono" w:cs="JetBrains Mono"/>
-          <w:sz w:val="14"/>
-          <w:szCs w:val="14"/>
-          <w:lang w:val="hu-HU"/>
-        </w:rPr>
-        <w:t>courseName</w:t>
-      </w:r>
-      <w:proofErr w:type="spellEnd"/>
-      <w:r>
-        <w:rPr>
-          <w:rFonts w:ascii="JetBrains Mono" w:hAnsi="JetBrains Mono" w:cs="JetBrains Mono"/>
-          <w:sz w:val="14"/>
-          <w:szCs w:val="14"/>
-          <w:lang w:val="hu-HU"/>
-        </w:rPr>
-        <w:t xml:space="preserve">": "HTML5 </w:t>
-      </w:r>
-      <w:proofErr w:type="spellStart"/>
-      <w:r>
-        <w:rPr>
-          <w:rFonts w:ascii="JetBrains Mono" w:hAnsi="JetBrains Mono" w:cs="JetBrains Mono"/>
-          <w:sz w:val="14"/>
-          <w:szCs w:val="14"/>
-          <w:lang w:val="hu-HU"/>
-        </w:rPr>
-        <w:t>Baics</w:t>
-      </w:r>
-      <w:proofErr w:type="spellEnd"/>
-      <w:r>
-        <w:rPr>
-          <w:rFonts w:ascii="JetBrains Mono" w:hAnsi="JetBrains Mono" w:cs="JetBrains Mono"/>
-          <w:sz w:val="14"/>
-          <w:szCs w:val="14"/>
-          <w:lang w:val="hu-HU"/>
-        </w:rPr>
-        <w:t>",</w:t>
+        <w:t>          "courseName": "HTML5 Baics",</w:t>
       </w:r>
     </w:p>
     <w:p>
@@ -7889,27 +7224,7 @@
           <w:szCs w:val="14"/>
           <w:lang w:val="hu-HU"/>
         </w:rPr>
-        <w:t>          "</w:t>
-      </w:r>
-      <w:proofErr w:type="spellStart"/>
-      <w:r>
-        <w:rPr>
-          <w:rFonts w:ascii="JetBrains Mono" w:hAnsi="JetBrains Mono" w:cs="JetBrains Mono"/>
-          <w:sz w:val="14"/>
-          <w:szCs w:val="14"/>
-          <w:lang w:val="hu-HU"/>
-        </w:rPr>
-        <w:t>imageUrl</w:t>
-      </w:r>
-      <w:proofErr w:type="spellEnd"/>
-      <w:r>
-        <w:rPr>
-          <w:rFonts w:ascii="JetBrains Mono" w:hAnsi="JetBrains Mono" w:cs="JetBrains Mono"/>
-          <w:sz w:val="14"/>
-          <w:szCs w:val="14"/>
-          <w:lang w:val="hu-HU"/>
-        </w:rPr>
-        <w:t>": "",</w:t>
+        <w:t>          "imageUrl": "",</w:t>
       </w:r>
     </w:p>
     <w:p>
@@ -7929,27 +7244,7 @@
           <w:szCs w:val="14"/>
           <w:lang w:val="hu-HU"/>
         </w:rPr>
-        <w:t>          "</w:t>
-      </w:r>
-      <w:proofErr w:type="spellStart"/>
-      <w:r>
-        <w:rPr>
-          <w:rFonts w:ascii="JetBrains Mono" w:hAnsi="JetBrains Mono" w:cs="JetBrains Mono"/>
-          <w:sz w:val="14"/>
-          <w:szCs w:val="14"/>
-          <w:lang w:val="hu-HU"/>
-        </w:rPr>
-        <w:t>teacherName</w:t>
-      </w:r>
-      <w:proofErr w:type="spellEnd"/>
-      <w:r>
-        <w:rPr>
-          <w:rFonts w:ascii="JetBrains Mono" w:hAnsi="JetBrains Mono" w:cs="JetBrains Mono"/>
-          <w:sz w:val="14"/>
-          <w:szCs w:val="14"/>
-          <w:lang w:val="hu-HU"/>
-        </w:rPr>
-        <w:t>": "Mr. John Smith",</w:t>
+        <w:t>          "teacherName": "Mr. John Smith",</w:t>
       </w:r>
     </w:p>
     <w:p>
@@ -7969,47 +7264,7 @@
           <w:szCs w:val="14"/>
           <w:lang w:val="hu-HU"/>
         </w:rPr>
-        <w:t>          "</w:t>
-      </w:r>
-      <w:proofErr w:type="spellStart"/>
-      <w:r>
-        <w:rPr>
-          <w:rFonts w:ascii="JetBrains Mono" w:hAnsi="JetBrains Mono" w:cs="JetBrains Mono"/>
-          <w:sz w:val="14"/>
-          <w:szCs w:val="14"/>
-          <w:lang w:val="hu-HU"/>
-        </w:rPr>
-        <w:t>courseType</w:t>
-      </w:r>
-      <w:proofErr w:type="spellEnd"/>
-      <w:r>
-        <w:rPr>
-          <w:rFonts w:ascii="JetBrains Mono" w:hAnsi="JetBrains Mono" w:cs="JetBrains Mono"/>
-          <w:sz w:val="14"/>
-          <w:szCs w:val="14"/>
-          <w:lang w:val="hu-HU"/>
-        </w:rPr>
-        <w:t>": "</w:t>
-      </w:r>
-      <w:proofErr w:type="spellStart"/>
-      <w:r>
-        <w:rPr>
-          <w:rFonts w:ascii="JetBrains Mono" w:hAnsi="JetBrains Mono" w:cs="JetBrains Mono"/>
-          <w:sz w:val="14"/>
-          <w:szCs w:val="14"/>
-          <w:lang w:val="hu-HU"/>
-        </w:rPr>
-        <w:t>learningPath</w:t>
-      </w:r>
-      <w:proofErr w:type="spellEnd"/>
-      <w:r>
-        <w:rPr>
-          <w:rFonts w:ascii="JetBrains Mono" w:hAnsi="JetBrains Mono" w:cs="JetBrains Mono"/>
-          <w:sz w:val="14"/>
-          <w:szCs w:val="14"/>
-          <w:lang w:val="hu-HU"/>
-        </w:rPr>
-        <w:t>",</w:t>
+        <w:t>          "courseType": "learningPath",</w:t>
       </w:r>
     </w:p>
     <w:p>
@@ -8029,27 +7284,7 @@
           <w:szCs w:val="14"/>
           <w:lang w:val="hu-HU"/>
         </w:rPr>
-        <w:t>          "</w:t>
-      </w:r>
-      <w:proofErr w:type="spellStart"/>
-      <w:r>
-        <w:rPr>
-          <w:rFonts w:ascii="JetBrains Mono" w:hAnsi="JetBrains Mono" w:cs="JetBrains Mono"/>
-          <w:sz w:val="14"/>
-          <w:szCs w:val="14"/>
-          <w:lang w:val="hu-HU"/>
-        </w:rPr>
-        <w:t>progress</w:t>
-      </w:r>
-      <w:proofErr w:type="spellEnd"/>
-      <w:r>
-        <w:rPr>
-          <w:rFonts w:ascii="JetBrains Mono" w:hAnsi="JetBrains Mono" w:cs="JetBrains Mono"/>
-          <w:sz w:val="14"/>
-          <w:szCs w:val="14"/>
-          <w:lang w:val="hu-HU"/>
-        </w:rPr>
-        <w:t>": 100</w:t>
+        <w:t>          "progress": 100</w:t>
       </w:r>
     </w:p>
     <w:p>
@@ -8129,27 +7364,7 @@
           <w:szCs w:val="14"/>
           <w:lang w:val="hu-HU"/>
         </w:rPr>
-        <w:t>    "</w:t>
-      </w:r>
-      <w:proofErr w:type="spellStart"/>
-      <w:r>
-        <w:rPr>
-          <w:rFonts w:ascii="JetBrains Mono" w:hAnsi="JetBrains Mono" w:cs="JetBrains Mono"/>
-          <w:sz w:val="14"/>
-          <w:szCs w:val="14"/>
-          <w:lang w:val="hu-HU"/>
-        </w:rPr>
-        <w:t>upcomingEvents</w:t>
-      </w:r>
-      <w:proofErr w:type="spellEnd"/>
-      <w:r>
-        <w:rPr>
-          <w:rFonts w:ascii="JetBrains Mono" w:hAnsi="JetBrains Mono" w:cs="JetBrains Mono"/>
-          <w:sz w:val="14"/>
-          <w:szCs w:val="14"/>
-          <w:lang w:val="hu-HU"/>
-        </w:rPr>
-        <w:t>": [</w:t>
+        <w:t>    "upcomingEvents": [</w:t>
       </w:r>
     </w:p>
     <w:p>
@@ -8189,47 +7404,7 @@
           <w:szCs w:val="14"/>
           <w:lang w:val="hu-HU"/>
         </w:rPr>
-        <w:t>        "</w:t>
-      </w:r>
-      <w:proofErr w:type="spellStart"/>
-      <w:r>
-        <w:rPr>
-          <w:rFonts w:ascii="JetBrains Mono" w:hAnsi="JetBrains Mono" w:cs="JetBrains Mono"/>
-          <w:sz w:val="14"/>
-          <w:szCs w:val="14"/>
-          <w:lang w:val="hu-HU"/>
-        </w:rPr>
-        <w:t>eventId</w:t>
-      </w:r>
-      <w:proofErr w:type="spellEnd"/>
-      <w:r>
-        <w:rPr>
-          <w:rFonts w:ascii="JetBrains Mono" w:hAnsi="JetBrains Mono" w:cs="JetBrains Mono"/>
-          <w:sz w:val="14"/>
-          <w:szCs w:val="14"/>
-          <w:lang w:val="hu-HU"/>
-        </w:rPr>
-        <w:t>": "</w:t>
-      </w:r>
-      <w:proofErr w:type="spellStart"/>
-      <w:r>
-        <w:rPr>
-          <w:rFonts w:ascii="JetBrains Mono" w:hAnsi="JetBrains Mono" w:cs="JetBrains Mono"/>
-          <w:sz w:val="14"/>
-          <w:szCs w:val="14"/>
-          <w:lang w:val="hu-HU"/>
-        </w:rPr>
-        <w:t>uuid</w:t>
-      </w:r>
-      <w:proofErr w:type="spellEnd"/>
-      <w:r>
-        <w:rPr>
-          <w:rFonts w:ascii="JetBrains Mono" w:hAnsi="JetBrains Mono" w:cs="JetBrains Mono"/>
-          <w:sz w:val="14"/>
-          <w:szCs w:val="14"/>
-          <w:lang w:val="hu-HU"/>
-        </w:rPr>
-        <w:t>",</w:t>
+        <w:t>        "eventId": "uuid",</w:t>
       </w:r>
     </w:p>
     <w:p>
@@ -8249,27 +7424,7 @@
           <w:szCs w:val="14"/>
           <w:lang w:val="hu-HU"/>
         </w:rPr>
-        <w:t>        "</w:t>
-      </w:r>
-      <w:proofErr w:type="spellStart"/>
-      <w:r>
-        <w:rPr>
-          <w:rFonts w:ascii="JetBrains Mono" w:hAnsi="JetBrains Mono" w:cs="JetBrains Mono"/>
-          <w:sz w:val="14"/>
-          <w:szCs w:val="14"/>
-          <w:lang w:val="hu-HU"/>
-        </w:rPr>
-        <w:t>eventUrl</w:t>
-      </w:r>
-      <w:proofErr w:type="spellEnd"/>
-      <w:r>
-        <w:rPr>
-          <w:rFonts w:ascii="JetBrains Mono" w:hAnsi="JetBrains Mono" w:cs="JetBrains Mono"/>
-          <w:sz w:val="14"/>
-          <w:szCs w:val="14"/>
-          <w:lang w:val="hu-HU"/>
-        </w:rPr>
-        <w:t>": "#",</w:t>
+        <w:t>        "eventUrl": "#",</w:t>
       </w:r>
     </w:p>
     <w:p>
@@ -8289,67 +7444,7 @@
           <w:szCs w:val="14"/>
           <w:lang w:val="hu-HU"/>
         </w:rPr>
-        <w:t>        "</w:t>
-      </w:r>
-      <w:proofErr w:type="spellStart"/>
-      <w:r>
-        <w:rPr>
-          <w:rFonts w:ascii="JetBrains Mono" w:hAnsi="JetBrains Mono" w:cs="JetBrains Mono"/>
-          <w:sz w:val="14"/>
-          <w:szCs w:val="14"/>
-          <w:lang w:val="hu-HU"/>
-        </w:rPr>
-        <w:t>title</w:t>
-      </w:r>
-      <w:proofErr w:type="spellEnd"/>
-      <w:r>
-        <w:rPr>
-          <w:rFonts w:ascii="JetBrains Mono" w:hAnsi="JetBrains Mono" w:cs="JetBrains Mono"/>
-          <w:sz w:val="14"/>
-          <w:szCs w:val="14"/>
-          <w:lang w:val="hu-HU"/>
-        </w:rPr>
-        <w:t>": "</w:t>
-      </w:r>
-      <w:proofErr w:type="spellStart"/>
-      <w:r>
-        <w:rPr>
-          <w:rFonts w:ascii="JetBrains Mono" w:hAnsi="JetBrains Mono" w:cs="JetBrains Mono"/>
-          <w:sz w:val="14"/>
-          <w:szCs w:val="14"/>
-          <w:lang w:val="hu-HU"/>
-        </w:rPr>
-        <w:t>Calculus</w:t>
-      </w:r>
-      <w:proofErr w:type="spellEnd"/>
-      <w:r>
-        <w:rPr>
-          <w:rFonts w:ascii="JetBrains Mono" w:hAnsi="JetBrains Mono" w:cs="JetBrains Mono"/>
-          <w:sz w:val="14"/>
-          <w:szCs w:val="14"/>
-          <w:lang w:val="hu-HU"/>
-        </w:rPr>
-        <w:t xml:space="preserve"> </w:t>
-      </w:r>
-      <w:proofErr w:type="spellStart"/>
-      <w:r>
-        <w:rPr>
-          <w:rFonts w:ascii="JetBrains Mono" w:hAnsi="JetBrains Mono" w:cs="JetBrains Mono"/>
-          <w:sz w:val="14"/>
-          <w:szCs w:val="14"/>
-          <w:lang w:val="hu-HU"/>
-        </w:rPr>
-        <w:t>lesson</w:t>
-      </w:r>
-      <w:proofErr w:type="spellEnd"/>
-      <w:r>
-        <w:rPr>
-          <w:rFonts w:ascii="JetBrains Mono" w:hAnsi="JetBrains Mono" w:cs="JetBrains Mono"/>
-          <w:sz w:val="14"/>
-          <w:szCs w:val="14"/>
-          <w:lang w:val="hu-HU"/>
-        </w:rPr>
-        <w:t>",</w:t>
+        <w:t>        "title": "Calculus lesson",</w:t>
       </w:r>
     </w:p>
     <w:p>
@@ -8369,27 +7464,7 @@
           <w:szCs w:val="14"/>
           <w:lang w:val="hu-HU"/>
         </w:rPr>
-        <w:t>        "</w:t>
-      </w:r>
-      <w:proofErr w:type="spellStart"/>
-      <w:r>
-        <w:rPr>
-          <w:rFonts w:ascii="JetBrains Mono" w:hAnsi="JetBrains Mono" w:cs="JetBrains Mono"/>
-          <w:sz w:val="14"/>
-          <w:szCs w:val="14"/>
-          <w:lang w:val="hu-HU"/>
-        </w:rPr>
-        <w:t>startDate</w:t>
-      </w:r>
-      <w:proofErr w:type="spellEnd"/>
-      <w:r>
-        <w:rPr>
-          <w:rFonts w:ascii="JetBrains Mono" w:hAnsi="JetBrains Mono" w:cs="JetBrains Mono"/>
-          <w:sz w:val="14"/>
-          <w:szCs w:val="14"/>
-          <w:lang w:val="hu-HU"/>
-        </w:rPr>
-        <w:t>": "2000-01-01T00:00:00.000",</w:t>
+        <w:t>        "startDate": "01-12",</w:t>
       </w:r>
     </w:p>
     <w:p>
@@ -8409,27 +7484,7 @@
           <w:szCs w:val="14"/>
           <w:lang w:val="hu-HU"/>
         </w:rPr>
-        <w:t>        "</w:t>
-      </w:r>
-      <w:proofErr w:type="spellStart"/>
-      <w:r>
-        <w:rPr>
-          <w:rFonts w:ascii="JetBrains Mono" w:hAnsi="JetBrains Mono" w:cs="JetBrains Mono"/>
-          <w:sz w:val="14"/>
-          <w:szCs w:val="14"/>
-          <w:lang w:val="hu-HU"/>
-        </w:rPr>
-        <w:t>endDate</w:t>
-      </w:r>
-      <w:proofErr w:type="spellEnd"/>
-      <w:r>
-        <w:rPr>
-          <w:rFonts w:ascii="JetBrains Mono" w:hAnsi="JetBrains Mono" w:cs="JetBrains Mono"/>
-          <w:sz w:val="14"/>
-          <w:szCs w:val="14"/>
-          <w:lang w:val="hu-HU"/>
-        </w:rPr>
-        <w:t>": "2000-01-01T00:00:00.000",</w:t>
+        <w:t>        "startTime": "12:00",</w:t>
       </w:r>
     </w:p>
     <w:p>
@@ -8449,47 +7504,7 @@
           <w:szCs w:val="14"/>
           <w:lang w:val="hu-HU"/>
         </w:rPr>
-        <w:t>        "</w:t>
-      </w:r>
-      <w:proofErr w:type="spellStart"/>
-      <w:r>
-        <w:rPr>
-          <w:rFonts w:ascii="JetBrains Mono" w:hAnsi="JetBrains Mono" w:cs="JetBrains Mono"/>
-          <w:sz w:val="14"/>
-          <w:szCs w:val="14"/>
-          <w:lang w:val="hu-HU"/>
-        </w:rPr>
-        <w:t>courseName</w:t>
-      </w:r>
-      <w:proofErr w:type="spellEnd"/>
-      <w:r>
-        <w:rPr>
-          <w:rFonts w:ascii="JetBrains Mono" w:hAnsi="JetBrains Mono" w:cs="JetBrains Mono"/>
-          <w:sz w:val="14"/>
-          <w:szCs w:val="14"/>
-          <w:lang w:val="hu-HU"/>
-        </w:rPr>
-        <w:t>": "</w:t>
-      </w:r>
-      <w:proofErr w:type="spellStart"/>
-      <w:r>
-        <w:rPr>
-          <w:rFonts w:ascii="JetBrains Mono" w:hAnsi="JetBrains Mono" w:cs="JetBrains Mono"/>
-          <w:sz w:val="14"/>
-          <w:szCs w:val="14"/>
-          <w:lang w:val="hu-HU"/>
-        </w:rPr>
-        <w:t>Calculus</w:t>
-      </w:r>
-      <w:proofErr w:type="spellEnd"/>
-      <w:r>
-        <w:rPr>
-          <w:rFonts w:ascii="JetBrains Mono" w:hAnsi="JetBrains Mono" w:cs="JetBrains Mono"/>
-          <w:sz w:val="14"/>
-          <w:szCs w:val="14"/>
-          <w:lang w:val="hu-HU"/>
-        </w:rPr>
-        <w:t>",</w:t>
+        <w:t>        "courseName": "Calculus",</w:t>
       </w:r>
     </w:p>
     <w:p>
@@ -8509,47 +7524,7 @@
           <w:szCs w:val="14"/>
           <w:lang w:val="hu-HU"/>
         </w:rPr>
-        <w:t>        "</w:t>
-      </w:r>
-      <w:proofErr w:type="spellStart"/>
-      <w:r>
-        <w:rPr>
-          <w:rFonts w:ascii="JetBrains Mono" w:hAnsi="JetBrains Mono" w:cs="JetBrains Mono"/>
-          <w:sz w:val="14"/>
-          <w:szCs w:val="14"/>
-          <w:lang w:val="hu-HU"/>
-        </w:rPr>
-        <w:t>teacherName</w:t>
-      </w:r>
-      <w:proofErr w:type="spellEnd"/>
-      <w:r>
-        <w:rPr>
-          <w:rFonts w:ascii="JetBrains Mono" w:hAnsi="JetBrains Mono" w:cs="JetBrains Mono"/>
-          <w:sz w:val="14"/>
-          <w:szCs w:val="14"/>
-          <w:lang w:val="hu-HU"/>
-        </w:rPr>
-        <w:t xml:space="preserve">": "Dr. John </w:t>
-      </w:r>
-      <w:proofErr w:type="spellStart"/>
-      <w:r>
-        <w:rPr>
-          <w:rFonts w:ascii="JetBrains Mono" w:hAnsi="JetBrains Mono" w:cs="JetBrains Mono"/>
-          <w:sz w:val="14"/>
-          <w:szCs w:val="14"/>
-          <w:lang w:val="hu-HU"/>
-        </w:rPr>
-        <w:t>Doe</w:t>
-      </w:r>
-      <w:proofErr w:type="spellEnd"/>
-      <w:r>
-        <w:rPr>
-          <w:rFonts w:ascii="JetBrains Mono" w:hAnsi="JetBrains Mono" w:cs="JetBrains Mono"/>
-          <w:sz w:val="14"/>
-          <w:szCs w:val="14"/>
-          <w:lang w:val="hu-HU"/>
-        </w:rPr>
-        <w:t>",</w:t>
+        <w:t>        "teacherName": "Dr. John Doe",</w:t>
       </w:r>
     </w:p>
     <w:p>
@@ -8569,47 +7544,7 @@
           <w:szCs w:val="14"/>
           <w:lang w:val="hu-HU"/>
         </w:rPr>
-        <w:t>        "</w:t>
-      </w:r>
-      <w:proofErr w:type="spellStart"/>
-      <w:r>
-        <w:rPr>
-          <w:rFonts w:ascii="JetBrains Mono" w:hAnsi="JetBrains Mono" w:cs="JetBrains Mono"/>
-          <w:sz w:val="14"/>
-          <w:szCs w:val="14"/>
-          <w:lang w:val="hu-HU"/>
-        </w:rPr>
-        <w:t>eventType</w:t>
-      </w:r>
-      <w:proofErr w:type="spellEnd"/>
-      <w:r>
-        <w:rPr>
-          <w:rFonts w:ascii="JetBrains Mono" w:hAnsi="JetBrains Mono" w:cs="JetBrains Mono"/>
-          <w:sz w:val="14"/>
-          <w:szCs w:val="14"/>
-          <w:lang w:val="hu-HU"/>
-        </w:rPr>
-        <w:t>": "</w:t>
-      </w:r>
-      <w:proofErr w:type="spellStart"/>
-      <w:r>
-        <w:rPr>
-          <w:rFonts w:ascii="JetBrains Mono" w:hAnsi="JetBrains Mono" w:cs="JetBrains Mono"/>
-          <w:sz w:val="14"/>
-          <w:szCs w:val="14"/>
-          <w:lang w:val="hu-HU"/>
-        </w:rPr>
-        <w:t>lesson</w:t>
-      </w:r>
-      <w:proofErr w:type="spellEnd"/>
-      <w:r>
-        <w:rPr>
-          <w:rFonts w:ascii="JetBrains Mono" w:hAnsi="JetBrains Mono" w:cs="JetBrains Mono"/>
-          <w:sz w:val="14"/>
-          <w:szCs w:val="14"/>
-          <w:lang w:val="hu-HU"/>
-        </w:rPr>
-        <w:t>",</w:t>
+        <w:t>        "eventType": "lesson",</w:t>
       </w:r>
     </w:p>
     <w:p>
@@ -8629,87 +7564,7 @@
           <w:szCs w:val="14"/>
           <w:lang w:val="hu-HU"/>
         </w:rPr>
-        <w:t>        "</w:t>
-      </w:r>
-      <w:proofErr w:type="spellStart"/>
-      <w:r>
-        <w:rPr>
-          <w:rFonts w:ascii="JetBrains Mono" w:hAnsi="JetBrains Mono" w:cs="JetBrains Mono"/>
-          <w:sz w:val="14"/>
-          <w:szCs w:val="14"/>
-          <w:lang w:val="hu-HU"/>
-        </w:rPr>
-        <w:t>description</w:t>
-      </w:r>
-      <w:proofErr w:type="spellEnd"/>
-      <w:r>
-        <w:rPr>
-          <w:rFonts w:ascii="JetBrains Mono" w:hAnsi="JetBrains Mono" w:cs="JetBrains Mono"/>
-          <w:sz w:val="14"/>
-          <w:szCs w:val="14"/>
-          <w:lang w:val="hu-HU"/>
-        </w:rPr>
-        <w:t xml:space="preserve">": "The </w:t>
-      </w:r>
-      <w:proofErr w:type="spellStart"/>
-      <w:r>
-        <w:rPr>
-          <w:rFonts w:ascii="JetBrains Mono" w:hAnsi="JetBrains Mono" w:cs="JetBrains Mono"/>
-          <w:sz w:val="14"/>
-          <w:szCs w:val="14"/>
-          <w:lang w:val="hu-HU"/>
-        </w:rPr>
-        <w:t>next</w:t>
-      </w:r>
-      <w:proofErr w:type="spellEnd"/>
-      <w:r>
-        <w:rPr>
-          <w:rFonts w:ascii="JetBrains Mono" w:hAnsi="JetBrains Mono" w:cs="JetBrains Mono"/>
-          <w:sz w:val="14"/>
-          <w:szCs w:val="14"/>
-          <w:lang w:val="hu-HU"/>
-        </w:rPr>
-        <w:t xml:space="preserve"> </w:t>
-      </w:r>
-      <w:proofErr w:type="spellStart"/>
-      <w:r>
-        <w:rPr>
-          <w:rFonts w:ascii="JetBrains Mono" w:hAnsi="JetBrains Mono" w:cs="JetBrains Mono"/>
-          <w:sz w:val="14"/>
-          <w:szCs w:val="14"/>
-          <w:lang w:val="hu-HU"/>
-        </w:rPr>
-        <w:t>lesson</w:t>
-      </w:r>
-      <w:proofErr w:type="spellEnd"/>
-      <w:r>
-        <w:rPr>
-          <w:rFonts w:ascii="JetBrains Mono" w:hAnsi="JetBrains Mono" w:cs="JetBrains Mono"/>
-          <w:sz w:val="14"/>
-          <w:szCs w:val="14"/>
-          <w:lang w:val="hu-HU"/>
-        </w:rPr>
-        <w:t xml:space="preserve"> of </w:t>
-      </w:r>
-      <w:proofErr w:type="spellStart"/>
-      <w:r>
-        <w:rPr>
-          <w:rFonts w:ascii="JetBrains Mono" w:hAnsi="JetBrains Mono" w:cs="JetBrains Mono"/>
-          <w:sz w:val="14"/>
-          <w:szCs w:val="14"/>
-          <w:lang w:val="hu-HU"/>
-        </w:rPr>
-        <w:t>Calculus</w:t>
-      </w:r>
-      <w:proofErr w:type="spellEnd"/>
-      <w:r>
-        <w:rPr>
-          <w:rFonts w:ascii="JetBrains Mono" w:hAnsi="JetBrains Mono" w:cs="JetBrains Mono"/>
-          <w:sz w:val="14"/>
-          <w:szCs w:val="14"/>
-          <w:lang w:val="hu-HU"/>
-        </w:rPr>
-        <w:t>"</w:t>
+        <w:t>        "description": "The next lesson of Calculus"</w:t>
       </w:r>
     </w:p>
     <w:p>
@@ -8769,27 +7624,7 @@
           <w:szCs w:val="14"/>
           <w:lang w:val="hu-HU"/>
         </w:rPr>
-        <w:t>    "</w:t>
-      </w:r>
-      <w:proofErr w:type="spellStart"/>
-      <w:r>
-        <w:rPr>
-          <w:rFonts w:ascii="JetBrains Mono" w:hAnsi="JetBrains Mono" w:cs="JetBrains Mono"/>
-          <w:sz w:val="14"/>
-          <w:szCs w:val="14"/>
-          <w:lang w:val="hu-HU"/>
-        </w:rPr>
-        <w:t>popularCourses</w:t>
-      </w:r>
-      <w:proofErr w:type="spellEnd"/>
-      <w:r>
-        <w:rPr>
-          <w:rFonts w:ascii="JetBrains Mono" w:hAnsi="JetBrains Mono" w:cs="JetBrains Mono"/>
-          <w:sz w:val="14"/>
-          <w:szCs w:val="14"/>
-          <w:lang w:val="hu-HU"/>
-        </w:rPr>
-        <w:t>": [</w:t>
+        <w:t>    "popularCourses": [</w:t>
       </w:r>
     </w:p>
     <w:p>
@@ -8829,47 +7664,7 @@
           <w:szCs w:val="14"/>
           <w:lang w:val="hu-HU"/>
         </w:rPr>
-        <w:t>        "</w:t>
-      </w:r>
-      <w:proofErr w:type="spellStart"/>
-      <w:r>
-        <w:rPr>
-          <w:rFonts w:ascii="JetBrains Mono" w:hAnsi="JetBrains Mono" w:cs="JetBrains Mono"/>
-          <w:sz w:val="14"/>
-          <w:szCs w:val="14"/>
-          <w:lang w:val="hu-HU"/>
-        </w:rPr>
-        <w:t>courseId</w:t>
-      </w:r>
-      <w:proofErr w:type="spellEnd"/>
-      <w:r>
-        <w:rPr>
-          <w:rFonts w:ascii="JetBrains Mono" w:hAnsi="JetBrains Mono" w:cs="JetBrains Mono"/>
-          <w:sz w:val="14"/>
-          <w:szCs w:val="14"/>
-          <w:lang w:val="hu-HU"/>
-        </w:rPr>
-        <w:t>": "</w:t>
-      </w:r>
-      <w:proofErr w:type="spellStart"/>
-      <w:r>
-        <w:rPr>
-          <w:rFonts w:ascii="JetBrains Mono" w:hAnsi="JetBrains Mono" w:cs="JetBrains Mono"/>
-          <w:sz w:val="14"/>
-          <w:szCs w:val="14"/>
-          <w:lang w:val="hu-HU"/>
-        </w:rPr>
-        <w:t>uuid</w:t>
-      </w:r>
-      <w:proofErr w:type="spellEnd"/>
-      <w:r>
-        <w:rPr>
-          <w:rFonts w:ascii="JetBrains Mono" w:hAnsi="JetBrains Mono" w:cs="JetBrains Mono"/>
-          <w:sz w:val="14"/>
-          <w:szCs w:val="14"/>
-          <w:lang w:val="hu-HU"/>
-        </w:rPr>
-        <w:t>",</w:t>
+        <w:t>        "courseId": "uuid",</w:t>
       </w:r>
     </w:p>
     <w:p>
@@ -8889,47 +7684,7 @@
           <w:szCs w:val="14"/>
           <w:lang w:val="hu-HU"/>
         </w:rPr>
-        <w:t>        "</w:t>
-      </w:r>
-      <w:proofErr w:type="spellStart"/>
-      <w:r>
-        <w:rPr>
-          <w:rFonts w:ascii="JetBrains Mono" w:hAnsi="JetBrains Mono" w:cs="JetBrains Mono"/>
-          <w:sz w:val="14"/>
-          <w:szCs w:val="14"/>
-          <w:lang w:val="hu-HU"/>
-        </w:rPr>
-        <w:t>instanceId</w:t>
-      </w:r>
-      <w:proofErr w:type="spellEnd"/>
-      <w:r>
-        <w:rPr>
-          <w:rFonts w:ascii="JetBrains Mono" w:hAnsi="JetBrains Mono" w:cs="JetBrains Mono"/>
-          <w:sz w:val="14"/>
-          <w:szCs w:val="14"/>
-          <w:lang w:val="hu-HU"/>
-        </w:rPr>
-        <w:t>": "</w:t>
-      </w:r>
-      <w:proofErr w:type="spellStart"/>
-      <w:r>
-        <w:rPr>
-          <w:rFonts w:ascii="JetBrains Mono" w:hAnsi="JetBrains Mono" w:cs="JetBrains Mono"/>
-          <w:sz w:val="14"/>
-          <w:szCs w:val="14"/>
-          <w:lang w:val="hu-HU"/>
-        </w:rPr>
-        <w:t>uuid</w:t>
-      </w:r>
-      <w:proofErr w:type="spellEnd"/>
-      <w:r>
-        <w:rPr>
-          <w:rFonts w:ascii="JetBrains Mono" w:hAnsi="JetBrains Mono" w:cs="JetBrains Mono"/>
-          <w:sz w:val="14"/>
-          <w:szCs w:val="14"/>
-          <w:lang w:val="hu-HU"/>
-        </w:rPr>
-        <w:t>",</w:t>
+        <w:t>        "instanceId": "uuid",</w:t>
       </w:r>
     </w:p>
     <w:p>
@@ -8949,87 +7704,7 @@
           <w:szCs w:val="14"/>
           <w:lang w:val="hu-HU"/>
         </w:rPr>
-        <w:t>        "</w:t>
-      </w:r>
-      <w:proofErr w:type="spellStart"/>
-      <w:r>
-        <w:rPr>
-          <w:rFonts w:ascii="JetBrains Mono" w:hAnsi="JetBrains Mono" w:cs="JetBrains Mono"/>
-          <w:sz w:val="14"/>
-          <w:szCs w:val="14"/>
-          <w:lang w:val="hu-HU"/>
-        </w:rPr>
-        <w:t>courseName</w:t>
-      </w:r>
-      <w:proofErr w:type="spellEnd"/>
-      <w:r>
-        <w:rPr>
-          <w:rFonts w:ascii="JetBrains Mono" w:hAnsi="JetBrains Mono" w:cs="JetBrains Mono"/>
-          <w:sz w:val="14"/>
-          <w:szCs w:val="14"/>
-          <w:lang w:val="hu-HU"/>
-        </w:rPr>
-        <w:t>": "</w:t>
-      </w:r>
-      <w:proofErr w:type="spellStart"/>
-      <w:r>
-        <w:rPr>
-          <w:rFonts w:ascii="JetBrains Mono" w:hAnsi="JetBrains Mono" w:cs="JetBrains Mono"/>
-          <w:sz w:val="14"/>
-          <w:szCs w:val="14"/>
-          <w:lang w:val="hu-HU"/>
-        </w:rPr>
-        <w:t>Unity</w:t>
-      </w:r>
-      <w:proofErr w:type="spellEnd"/>
-      <w:r>
-        <w:rPr>
-          <w:rFonts w:ascii="JetBrains Mono" w:hAnsi="JetBrains Mono" w:cs="JetBrains Mono"/>
-          <w:sz w:val="14"/>
-          <w:szCs w:val="14"/>
-          <w:lang w:val="hu-HU"/>
-        </w:rPr>
-        <w:t xml:space="preserve"> </w:t>
-      </w:r>
-      <w:proofErr w:type="spellStart"/>
-      <w:r>
-        <w:rPr>
-          <w:rFonts w:ascii="JetBrains Mono" w:hAnsi="JetBrains Mono" w:cs="JetBrains Mono"/>
-          <w:sz w:val="14"/>
-          <w:szCs w:val="14"/>
-          <w:lang w:val="hu-HU"/>
-        </w:rPr>
-        <w:t>Engine</w:t>
-      </w:r>
-      <w:proofErr w:type="spellEnd"/>
-      <w:r>
-        <w:rPr>
-          <w:rFonts w:ascii="JetBrains Mono" w:hAnsi="JetBrains Mono" w:cs="JetBrains Mono"/>
-          <w:sz w:val="14"/>
-          <w:szCs w:val="14"/>
-          <w:lang w:val="hu-HU"/>
-        </w:rPr>
-        <w:t xml:space="preserve"> </w:t>
-      </w:r>
-      <w:proofErr w:type="spellStart"/>
-      <w:r>
-        <w:rPr>
-          <w:rFonts w:ascii="JetBrains Mono" w:hAnsi="JetBrains Mono" w:cs="JetBrains Mono"/>
-          <w:sz w:val="14"/>
-          <w:szCs w:val="14"/>
-          <w:lang w:val="hu-HU"/>
-        </w:rPr>
-        <w:t>basics</w:t>
-      </w:r>
-      <w:proofErr w:type="spellEnd"/>
-      <w:r>
-        <w:rPr>
-          <w:rFonts w:ascii="JetBrains Mono" w:hAnsi="JetBrains Mono" w:cs="JetBrains Mono"/>
-          <w:sz w:val="14"/>
-          <w:szCs w:val="14"/>
-          <w:lang w:val="hu-HU"/>
-        </w:rPr>
-        <w:t>",</w:t>
+        <w:t>        "courseName": "Unity Engine basics",</w:t>
       </w:r>
     </w:p>
     <w:p>
@@ -9049,27 +7724,7 @@
           <w:szCs w:val="14"/>
           <w:lang w:val="hu-HU"/>
         </w:rPr>
-        <w:t>        "</w:t>
-      </w:r>
-      <w:proofErr w:type="spellStart"/>
-      <w:r>
-        <w:rPr>
-          <w:rFonts w:ascii="JetBrains Mono" w:hAnsi="JetBrains Mono" w:cs="JetBrains Mono"/>
-          <w:sz w:val="14"/>
-          <w:szCs w:val="14"/>
-          <w:lang w:val="hu-HU"/>
-        </w:rPr>
-        <w:t>imageUrl</w:t>
-      </w:r>
-      <w:proofErr w:type="spellEnd"/>
-      <w:r>
-        <w:rPr>
-          <w:rFonts w:ascii="JetBrains Mono" w:hAnsi="JetBrains Mono" w:cs="JetBrains Mono"/>
-          <w:sz w:val="14"/>
-          <w:szCs w:val="14"/>
-          <w:lang w:val="hu-HU"/>
-        </w:rPr>
-        <w:t>": "",</w:t>
+        <w:t>        "imageUrl": "",</w:t>
       </w:r>
     </w:p>
     <w:p>
@@ -9089,47 +7744,7 @@
           <w:szCs w:val="14"/>
           <w:lang w:val="hu-HU"/>
         </w:rPr>
-        <w:t>        "</w:t>
-      </w:r>
-      <w:proofErr w:type="spellStart"/>
-      <w:r>
-        <w:rPr>
-          <w:rFonts w:ascii="JetBrains Mono" w:hAnsi="JetBrains Mono" w:cs="JetBrains Mono"/>
-          <w:sz w:val="14"/>
-          <w:szCs w:val="14"/>
-          <w:lang w:val="hu-HU"/>
-        </w:rPr>
-        <w:t>teacherName</w:t>
-      </w:r>
-      <w:proofErr w:type="spellEnd"/>
-      <w:r>
-        <w:rPr>
-          <w:rFonts w:ascii="JetBrains Mono" w:hAnsi="JetBrains Mono" w:cs="JetBrains Mono"/>
-          <w:sz w:val="14"/>
-          <w:szCs w:val="14"/>
-          <w:lang w:val="hu-HU"/>
-        </w:rPr>
-        <w:t>": "</w:t>
-      </w:r>
-      <w:proofErr w:type="spellStart"/>
-      <w:r>
-        <w:rPr>
-          <w:rFonts w:ascii="JetBrains Mono" w:hAnsi="JetBrains Mono" w:cs="JetBrains Mono"/>
-          <w:sz w:val="14"/>
-          <w:szCs w:val="14"/>
-          <w:lang w:val="hu-HU"/>
-        </w:rPr>
-        <w:t>Huan</w:t>
-      </w:r>
-      <w:proofErr w:type="spellEnd"/>
-      <w:r>
-        <w:rPr>
-          <w:rFonts w:ascii="JetBrains Mono" w:hAnsi="JetBrains Mono" w:cs="JetBrains Mono"/>
-          <w:sz w:val="14"/>
-          <w:szCs w:val="14"/>
-          <w:lang w:val="hu-HU"/>
-        </w:rPr>
-        <w:t xml:space="preserve"> Antonio",</w:t>
+        <w:t>        "teacherName": "Huan Antonio",</w:t>
       </w:r>
     </w:p>
     <w:p>
@@ -9149,78 +7764,7 @@
           <w:szCs w:val="14"/>
           <w:lang w:val="hu-HU"/>
         </w:rPr>
-        <w:t>        "</w:t>
-      </w:r>
-      <w:proofErr w:type="spellStart"/>
-      <w:r>
-        <w:rPr>
-          <w:rFonts w:ascii="JetBrains Mono" w:hAnsi="JetBrains Mono" w:cs="JetBrains Mono"/>
-          <w:sz w:val="14"/>
-          <w:szCs w:val="14"/>
-          <w:lang w:val="hu-HU"/>
-        </w:rPr>
-        <w:t>lessonPrice</w:t>
-      </w:r>
-      <w:proofErr w:type="spellEnd"/>
-      <w:r>
-        <w:rPr>
-          <w:rFonts w:ascii="JetBrains Mono" w:hAnsi="JetBrains Mono" w:cs="JetBrains Mono"/>
-          <w:sz w:val="14"/>
-          <w:szCs w:val="14"/>
-          <w:lang w:val="hu-HU"/>
-        </w:rPr>
-        <w:t xml:space="preserve">": </w:t>
-      </w:r>
-      <w:proofErr w:type="gramStart"/>
-      <w:r>
-        <w:rPr>
-          <w:rFonts w:ascii="JetBrains Mono" w:hAnsi="JetBrains Mono" w:cs="JetBrains Mono"/>
-          <w:sz w:val="14"/>
-          <w:szCs w:val="14"/>
-          <w:lang w:val="hu-HU"/>
-        </w:rPr>
-        <w:t>{ "</w:t>
-      </w:r>
-      <w:proofErr w:type="spellStart"/>
-      <w:proofErr w:type="gramEnd"/>
-      <w:r>
-        <w:rPr>
-          <w:rFonts w:ascii="JetBrains Mono" w:hAnsi="JetBrains Mono" w:cs="JetBrains Mono"/>
-          <w:sz w:val="14"/>
-          <w:szCs w:val="14"/>
-          <w:lang w:val="hu-HU"/>
-        </w:rPr>
-        <w:t>amount</w:t>
-      </w:r>
-      <w:proofErr w:type="spellEnd"/>
-      <w:r>
-        <w:rPr>
-          <w:rFonts w:ascii="JetBrains Mono" w:hAnsi="JetBrains Mono" w:cs="JetBrains Mono"/>
-          <w:sz w:val="14"/>
-          <w:szCs w:val="14"/>
-          <w:lang w:val="hu-HU"/>
-        </w:rPr>
-        <w:t>": 0, "</w:t>
-      </w:r>
-      <w:proofErr w:type="spellStart"/>
-      <w:r>
-        <w:rPr>
-          <w:rFonts w:ascii="JetBrains Mono" w:hAnsi="JetBrains Mono" w:cs="JetBrains Mono"/>
-          <w:sz w:val="14"/>
-          <w:szCs w:val="14"/>
-          <w:lang w:val="hu-HU"/>
-        </w:rPr>
-        <w:t>currency</w:t>
-      </w:r>
-      <w:proofErr w:type="spellEnd"/>
-      <w:r>
-        <w:rPr>
-          <w:rFonts w:ascii="JetBrains Mono" w:hAnsi="JetBrains Mono" w:cs="JetBrains Mono"/>
-          <w:sz w:val="14"/>
-          <w:szCs w:val="14"/>
-          <w:lang w:val="hu-HU"/>
-        </w:rPr>
-        <w:t>": "HUF" },</w:t>
+        <w:t>        "lessonPrice": { "amount": 0, "currency": "HUF" },</w:t>
       </w:r>
     </w:p>
     <w:p>
@@ -9240,147 +7784,7 @@
           <w:szCs w:val="14"/>
           <w:lang w:val="hu-HU"/>
         </w:rPr>
-        <w:t>        "</w:t>
-      </w:r>
-      <w:proofErr w:type="spellStart"/>
-      <w:r>
-        <w:rPr>
-          <w:rFonts w:ascii="JetBrains Mono" w:hAnsi="JetBrains Mono" w:cs="JetBrains Mono"/>
-          <w:sz w:val="14"/>
-          <w:szCs w:val="14"/>
-          <w:lang w:val="hu-HU"/>
-        </w:rPr>
-        <w:t>description</w:t>
-      </w:r>
-      <w:proofErr w:type="spellEnd"/>
-      <w:r>
-        <w:rPr>
-          <w:rFonts w:ascii="JetBrains Mono" w:hAnsi="JetBrains Mono" w:cs="JetBrains Mono"/>
-          <w:sz w:val="14"/>
-          <w:szCs w:val="14"/>
-          <w:lang w:val="hu-HU"/>
-        </w:rPr>
-        <w:t>": "</w:t>
-      </w:r>
-      <w:proofErr w:type="spellStart"/>
-      <w:r>
-        <w:rPr>
-          <w:rFonts w:ascii="JetBrains Mono" w:hAnsi="JetBrains Mono" w:cs="JetBrains Mono"/>
-          <w:sz w:val="14"/>
-          <w:szCs w:val="14"/>
-          <w:lang w:val="hu-HU"/>
-        </w:rPr>
-        <w:t>Learn</w:t>
-      </w:r>
-      <w:proofErr w:type="spellEnd"/>
-      <w:r>
-        <w:rPr>
-          <w:rFonts w:ascii="JetBrains Mono" w:hAnsi="JetBrains Mono" w:cs="JetBrains Mono"/>
-          <w:sz w:val="14"/>
-          <w:szCs w:val="14"/>
-          <w:lang w:val="hu-HU"/>
-        </w:rPr>
-        <w:t xml:space="preserve"> </w:t>
-      </w:r>
-      <w:proofErr w:type="spellStart"/>
-      <w:r>
-        <w:rPr>
-          <w:rFonts w:ascii="JetBrains Mono" w:hAnsi="JetBrains Mono" w:cs="JetBrains Mono"/>
-          <w:sz w:val="14"/>
-          <w:szCs w:val="14"/>
-          <w:lang w:val="hu-HU"/>
-        </w:rPr>
-        <w:t>the</w:t>
-      </w:r>
-      <w:proofErr w:type="spellEnd"/>
-      <w:r>
-        <w:rPr>
-          <w:rFonts w:ascii="JetBrains Mono" w:hAnsi="JetBrains Mono" w:cs="JetBrains Mono"/>
-          <w:sz w:val="14"/>
-          <w:szCs w:val="14"/>
-          <w:lang w:val="hu-HU"/>
-        </w:rPr>
-        <w:t xml:space="preserve"> </w:t>
-      </w:r>
-      <w:proofErr w:type="spellStart"/>
-      <w:r>
-        <w:rPr>
-          <w:rFonts w:ascii="JetBrains Mono" w:hAnsi="JetBrains Mono" w:cs="JetBrains Mono"/>
-          <w:sz w:val="14"/>
-          <w:szCs w:val="14"/>
-          <w:lang w:val="hu-HU"/>
-        </w:rPr>
-        <w:t>basics</w:t>
-      </w:r>
-      <w:proofErr w:type="spellEnd"/>
-      <w:r>
-        <w:rPr>
-          <w:rFonts w:ascii="JetBrains Mono" w:hAnsi="JetBrains Mono" w:cs="JetBrains Mono"/>
-          <w:sz w:val="14"/>
-          <w:szCs w:val="14"/>
-          <w:lang w:val="hu-HU"/>
-        </w:rPr>
-        <w:t xml:space="preserve"> of </w:t>
-      </w:r>
-      <w:proofErr w:type="spellStart"/>
-      <w:r>
-        <w:rPr>
-          <w:rFonts w:ascii="JetBrains Mono" w:hAnsi="JetBrains Mono" w:cs="JetBrains Mono"/>
-          <w:sz w:val="14"/>
-          <w:szCs w:val="14"/>
-          <w:lang w:val="hu-HU"/>
-        </w:rPr>
-        <w:t>the</w:t>
-      </w:r>
-      <w:proofErr w:type="spellEnd"/>
-      <w:r>
-        <w:rPr>
-          <w:rFonts w:ascii="JetBrains Mono" w:hAnsi="JetBrains Mono" w:cs="JetBrains Mono"/>
-          <w:sz w:val="14"/>
-          <w:szCs w:val="14"/>
-          <w:lang w:val="hu-HU"/>
-        </w:rPr>
-        <w:t xml:space="preserve"> </w:t>
-      </w:r>
-      <w:proofErr w:type="spellStart"/>
-      <w:r>
-        <w:rPr>
-          <w:rFonts w:ascii="JetBrains Mono" w:hAnsi="JetBrains Mono" w:cs="JetBrains Mono"/>
-          <w:sz w:val="14"/>
-          <w:szCs w:val="14"/>
-          <w:lang w:val="hu-HU"/>
-        </w:rPr>
-        <w:t>Unity</w:t>
-      </w:r>
-      <w:proofErr w:type="spellEnd"/>
-      <w:r>
-        <w:rPr>
-          <w:rFonts w:ascii="JetBrains Mono" w:hAnsi="JetBrains Mono" w:cs="JetBrains Mono"/>
-          <w:sz w:val="14"/>
-          <w:szCs w:val="14"/>
-          <w:lang w:val="hu-HU"/>
-        </w:rPr>
-        <w:t xml:space="preserve"> </w:t>
-      </w:r>
-      <w:proofErr w:type="spellStart"/>
-      <w:r>
-        <w:rPr>
-          <w:rFonts w:ascii="JetBrains Mono" w:hAnsi="JetBrains Mono" w:cs="JetBrains Mono"/>
-          <w:sz w:val="14"/>
-          <w:szCs w:val="14"/>
-          <w:lang w:val="hu-HU"/>
-        </w:rPr>
-        <w:t>Engine</w:t>
-      </w:r>
-      <w:proofErr w:type="spellEnd"/>
-      <w:r>
-        <w:rPr>
-          <w:rFonts w:ascii="JetBrains Mono" w:hAnsi="JetBrains Mono" w:cs="JetBrains Mono"/>
-          <w:sz w:val="14"/>
-          <w:szCs w:val="14"/>
-          <w:lang w:val="hu-HU"/>
-        </w:rPr>
-        <w:t>",</w:t>
+        <w:t>        "description": "Learn the basics of the Unity Engine",</w:t>
       </w:r>
     </w:p>
     <w:p>
@@ -9400,47 +7804,7 @@
           <w:szCs w:val="14"/>
           <w:lang w:val="hu-HU"/>
         </w:rPr>
-        <w:t>        "</w:t>
-      </w:r>
-      <w:proofErr w:type="spellStart"/>
-      <w:r>
-        <w:rPr>
-          <w:rFonts w:ascii="JetBrains Mono" w:hAnsi="JetBrains Mono" w:cs="JetBrains Mono"/>
-          <w:sz w:val="14"/>
-          <w:szCs w:val="14"/>
-          <w:lang w:val="hu-HU"/>
-        </w:rPr>
-        <w:t>courseType</w:t>
-      </w:r>
-      <w:proofErr w:type="spellEnd"/>
-      <w:r>
-        <w:rPr>
-          <w:rFonts w:ascii="JetBrains Mono" w:hAnsi="JetBrains Mono" w:cs="JetBrains Mono"/>
-          <w:sz w:val="14"/>
-          <w:szCs w:val="14"/>
-          <w:lang w:val="hu-HU"/>
-        </w:rPr>
-        <w:t>": "</w:t>
-      </w:r>
-      <w:proofErr w:type="spellStart"/>
-      <w:r>
-        <w:rPr>
-          <w:rFonts w:ascii="JetBrains Mono" w:hAnsi="JetBrains Mono" w:cs="JetBrains Mono"/>
-          <w:sz w:val="14"/>
-          <w:szCs w:val="14"/>
-          <w:lang w:val="hu-HU"/>
-        </w:rPr>
-        <w:t>learningPath</w:t>
-      </w:r>
-      <w:proofErr w:type="spellEnd"/>
-      <w:r>
-        <w:rPr>
-          <w:rFonts w:ascii="JetBrains Mono" w:hAnsi="JetBrains Mono" w:cs="JetBrains Mono"/>
-          <w:sz w:val="14"/>
-          <w:szCs w:val="14"/>
-          <w:lang w:val="hu-HU"/>
-        </w:rPr>
-        <w:t>"</w:t>
+        <w:t>        "courseType": "learningPath"</w:t>
       </w:r>
     </w:p>
     <w:p>
@@ -9500,47 +7864,7 @@
           <w:szCs w:val="14"/>
           <w:lang w:val="hu-HU"/>
         </w:rPr>
-        <w:t>        "</w:t>
-      </w:r>
-      <w:proofErr w:type="spellStart"/>
-      <w:r>
-        <w:rPr>
-          <w:rFonts w:ascii="JetBrains Mono" w:hAnsi="JetBrains Mono" w:cs="JetBrains Mono"/>
-          <w:sz w:val="14"/>
-          <w:szCs w:val="14"/>
-          <w:lang w:val="hu-HU"/>
-        </w:rPr>
-        <w:t>courseId</w:t>
-      </w:r>
-      <w:proofErr w:type="spellEnd"/>
-      <w:r>
-        <w:rPr>
-          <w:rFonts w:ascii="JetBrains Mono" w:hAnsi="JetBrains Mono" w:cs="JetBrains Mono"/>
-          <w:sz w:val="14"/>
-          <w:szCs w:val="14"/>
-          <w:lang w:val="hu-HU"/>
-        </w:rPr>
-        <w:t>": "</w:t>
-      </w:r>
-      <w:proofErr w:type="spellStart"/>
-      <w:r>
-        <w:rPr>
-          <w:rFonts w:ascii="JetBrains Mono" w:hAnsi="JetBrains Mono" w:cs="JetBrains Mono"/>
-          <w:sz w:val="14"/>
-          <w:szCs w:val="14"/>
-          <w:lang w:val="hu-HU"/>
-        </w:rPr>
-        <w:t>uuid</w:t>
-      </w:r>
-      <w:proofErr w:type="spellEnd"/>
-      <w:r>
-        <w:rPr>
-          <w:rFonts w:ascii="JetBrains Mono" w:hAnsi="JetBrains Mono" w:cs="JetBrains Mono"/>
-          <w:sz w:val="14"/>
-          <w:szCs w:val="14"/>
-          <w:lang w:val="hu-HU"/>
-        </w:rPr>
-        <w:t>",</w:t>
+        <w:t>        "courseId": "uuid",</w:t>
       </w:r>
     </w:p>
     <w:p>
@@ -9560,47 +7884,7 @@
           <w:szCs w:val="14"/>
           <w:lang w:val="hu-HU"/>
         </w:rPr>
-        <w:t>        "</w:t>
-      </w:r>
-      <w:proofErr w:type="spellStart"/>
-      <w:r>
-        <w:rPr>
-          <w:rFonts w:ascii="JetBrains Mono" w:hAnsi="JetBrains Mono" w:cs="JetBrains Mono"/>
-          <w:sz w:val="14"/>
-          <w:szCs w:val="14"/>
-          <w:lang w:val="hu-HU"/>
-        </w:rPr>
-        <w:t>instanceId</w:t>
-      </w:r>
-      <w:proofErr w:type="spellEnd"/>
-      <w:r>
-        <w:rPr>
-          <w:rFonts w:ascii="JetBrains Mono" w:hAnsi="JetBrains Mono" w:cs="JetBrains Mono"/>
-          <w:sz w:val="14"/>
-          <w:szCs w:val="14"/>
-          <w:lang w:val="hu-HU"/>
-        </w:rPr>
-        <w:t>": "</w:t>
-      </w:r>
-      <w:proofErr w:type="spellStart"/>
-      <w:r>
-        <w:rPr>
-          <w:rFonts w:ascii="JetBrains Mono" w:hAnsi="JetBrains Mono" w:cs="JetBrains Mono"/>
-          <w:sz w:val="14"/>
-          <w:szCs w:val="14"/>
-          <w:lang w:val="hu-HU"/>
-        </w:rPr>
-        <w:t>uuid</w:t>
-      </w:r>
-      <w:proofErr w:type="spellEnd"/>
-      <w:r>
-        <w:rPr>
-          <w:rFonts w:ascii="JetBrains Mono" w:hAnsi="JetBrains Mono" w:cs="JetBrains Mono"/>
-          <w:sz w:val="14"/>
-          <w:szCs w:val="14"/>
-          <w:lang w:val="hu-HU"/>
-        </w:rPr>
-        <w:t>",</w:t>
+        <w:t>        "instanceId": "uuid",</w:t>
       </w:r>
     </w:p>
     <w:p>
@@ -9620,47 +7904,7 @@
           <w:szCs w:val="14"/>
           <w:lang w:val="hu-HU"/>
         </w:rPr>
-        <w:t>        "</w:t>
-      </w:r>
-      <w:proofErr w:type="spellStart"/>
-      <w:r>
-        <w:rPr>
-          <w:rFonts w:ascii="JetBrains Mono" w:hAnsi="JetBrains Mono" w:cs="JetBrains Mono"/>
-          <w:sz w:val="14"/>
-          <w:szCs w:val="14"/>
-          <w:lang w:val="hu-HU"/>
-        </w:rPr>
-        <w:t>courseName</w:t>
-      </w:r>
-      <w:proofErr w:type="spellEnd"/>
-      <w:r>
-        <w:rPr>
-          <w:rFonts w:ascii="JetBrains Mono" w:hAnsi="JetBrains Mono" w:cs="JetBrains Mono"/>
-          <w:sz w:val="14"/>
-          <w:szCs w:val="14"/>
-          <w:lang w:val="hu-HU"/>
-        </w:rPr>
-        <w:t xml:space="preserve">": "B2 </w:t>
-      </w:r>
-      <w:proofErr w:type="spellStart"/>
-      <w:r>
-        <w:rPr>
-          <w:rFonts w:ascii="JetBrains Mono" w:hAnsi="JetBrains Mono" w:cs="JetBrains Mono"/>
-          <w:sz w:val="14"/>
-          <w:szCs w:val="14"/>
-          <w:lang w:val="hu-HU"/>
-        </w:rPr>
-        <w:t>english</w:t>
-      </w:r>
-      <w:proofErr w:type="spellEnd"/>
-      <w:r>
-        <w:rPr>
-          <w:rFonts w:ascii="JetBrains Mono" w:hAnsi="JetBrains Mono" w:cs="JetBrains Mono"/>
-          <w:sz w:val="14"/>
-          <w:szCs w:val="14"/>
-          <w:lang w:val="hu-HU"/>
-        </w:rPr>
-        <w:t>",</w:t>
+        <w:t>        "courseName": "B2 english",</w:t>
       </w:r>
     </w:p>
     <w:p>
@@ -9680,27 +7924,7 @@
           <w:szCs w:val="14"/>
           <w:lang w:val="hu-HU"/>
         </w:rPr>
-        <w:t>        "</w:t>
-      </w:r>
-      <w:proofErr w:type="spellStart"/>
-      <w:r>
-        <w:rPr>
-          <w:rFonts w:ascii="JetBrains Mono" w:hAnsi="JetBrains Mono" w:cs="JetBrains Mono"/>
-          <w:sz w:val="14"/>
-          <w:szCs w:val="14"/>
-          <w:lang w:val="hu-HU"/>
-        </w:rPr>
-        <w:t>imageUrl</w:t>
-      </w:r>
-      <w:proofErr w:type="spellEnd"/>
-      <w:r>
-        <w:rPr>
-          <w:rFonts w:ascii="JetBrains Mono" w:hAnsi="JetBrains Mono" w:cs="JetBrains Mono"/>
-          <w:sz w:val="14"/>
-          <w:szCs w:val="14"/>
-          <w:lang w:val="hu-HU"/>
-        </w:rPr>
-        <w:t>": "",</w:t>
+        <w:t>        "imageUrl": "",</w:t>
       </w:r>
     </w:p>
     <w:p>
@@ -9720,47 +7944,7 @@
           <w:szCs w:val="14"/>
           <w:lang w:val="hu-HU"/>
         </w:rPr>
-        <w:t>        "</w:t>
-      </w:r>
-      <w:proofErr w:type="spellStart"/>
-      <w:r>
-        <w:rPr>
-          <w:rFonts w:ascii="JetBrains Mono" w:hAnsi="JetBrains Mono" w:cs="JetBrains Mono"/>
-          <w:sz w:val="14"/>
-          <w:szCs w:val="14"/>
-          <w:lang w:val="hu-HU"/>
-        </w:rPr>
-        <w:t>teacherName</w:t>
-      </w:r>
-      <w:proofErr w:type="spellEnd"/>
-      <w:r>
-        <w:rPr>
-          <w:rFonts w:ascii="JetBrains Mono" w:hAnsi="JetBrains Mono" w:cs="JetBrains Mono"/>
-          <w:sz w:val="14"/>
-          <w:szCs w:val="14"/>
-          <w:lang w:val="hu-HU"/>
-        </w:rPr>
-        <w:t>": "El-</w:t>
-      </w:r>
-      <w:proofErr w:type="spellStart"/>
-      <w:r>
-        <w:rPr>
-          <w:rFonts w:ascii="JetBrains Mono" w:hAnsi="JetBrains Mono" w:cs="JetBrains Mono"/>
-          <w:sz w:val="14"/>
-          <w:szCs w:val="14"/>
-          <w:lang w:val="hu-HU"/>
-        </w:rPr>
-        <w:t>Jahari</w:t>
-      </w:r>
-      <w:proofErr w:type="spellEnd"/>
-      <w:r>
-        <w:rPr>
-          <w:rFonts w:ascii="JetBrains Mono" w:hAnsi="JetBrains Mono" w:cs="JetBrains Mono"/>
-          <w:sz w:val="14"/>
-          <w:szCs w:val="14"/>
-          <w:lang w:val="hu-HU"/>
-        </w:rPr>
-        <w:t>",</w:t>
+        <w:t>        "teacherName": "El-Jahari",</w:t>
       </w:r>
     </w:p>
     <w:p>
@@ -9780,78 +7964,7 @@
           <w:szCs w:val="14"/>
           <w:lang w:val="hu-HU"/>
         </w:rPr>
-        <w:t>        "</w:t>
-      </w:r>
-      <w:proofErr w:type="spellStart"/>
-      <w:r>
-        <w:rPr>
-          <w:rFonts w:ascii="JetBrains Mono" w:hAnsi="JetBrains Mono" w:cs="JetBrains Mono"/>
-          <w:sz w:val="14"/>
-          <w:szCs w:val="14"/>
-          <w:lang w:val="hu-HU"/>
-        </w:rPr>
-        <w:t>lessonPrice</w:t>
-      </w:r>
-      <w:proofErr w:type="spellEnd"/>
-      <w:r>
-        <w:rPr>
-          <w:rFonts w:ascii="JetBrains Mono" w:hAnsi="JetBrains Mono" w:cs="JetBrains Mono"/>
-          <w:sz w:val="14"/>
-          <w:szCs w:val="14"/>
-          <w:lang w:val="hu-HU"/>
-        </w:rPr>
-        <w:t xml:space="preserve">": </w:t>
-      </w:r>
-      <w:proofErr w:type="gramStart"/>
-      <w:r>
-        <w:rPr>
-          <w:rFonts w:ascii="JetBrains Mono" w:hAnsi="JetBrains Mono" w:cs="JetBrains Mono"/>
-          <w:sz w:val="14"/>
-          <w:szCs w:val="14"/>
-          <w:lang w:val="hu-HU"/>
-        </w:rPr>
-        <w:t>{ "</w:t>
-      </w:r>
-      <w:proofErr w:type="spellStart"/>
-      <w:proofErr w:type="gramEnd"/>
-      <w:r>
-        <w:rPr>
-          <w:rFonts w:ascii="JetBrains Mono" w:hAnsi="JetBrains Mono" w:cs="JetBrains Mono"/>
-          <w:sz w:val="14"/>
-          <w:szCs w:val="14"/>
-          <w:lang w:val="hu-HU"/>
-        </w:rPr>
-        <w:t>amount</w:t>
-      </w:r>
-      <w:proofErr w:type="spellEnd"/>
-      <w:r>
-        <w:rPr>
-          <w:rFonts w:ascii="JetBrains Mono" w:hAnsi="JetBrains Mono" w:cs="JetBrains Mono"/>
-          <w:sz w:val="14"/>
-          <w:szCs w:val="14"/>
-          <w:lang w:val="hu-HU"/>
-        </w:rPr>
-        <w:t>": 0, "</w:t>
-      </w:r>
-      <w:proofErr w:type="spellStart"/>
-      <w:r>
-        <w:rPr>
-          <w:rFonts w:ascii="JetBrains Mono" w:hAnsi="JetBrains Mono" w:cs="JetBrains Mono"/>
-          <w:sz w:val="14"/>
-          <w:szCs w:val="14"/>
-          <w:lang w:val="hu-HU"/>
-        </w:rPr>
-        <w:t>currency</w:t>
-      </w:r>
-      <w:proofErr w:type="spellEnd"/>
-      <w:r>
-        <w:rPr>
-          <w:rFonts w:ascii="JetBrains Mono" w:hAnsi="JetBrains Mono" w:cs="JetBrains Mono"/>
-          <w:sz w:val="14"/>
-          <w:szCs w:val="14"/>
-          <w:lang w:val="hu-HU"/>
-        </w:rPr>
-        <w:t>": "HUF" },</w:t>
+        <w:t>        "lessonPrice": { "amount": 0, "currency": "HUF" },</w:t>
       </w:r>
     </w:p>
     <w:p>
@@ -9871,247 +7984,7 @@
           <w:szCs w:val="14"/>
           <w:lang w:val="hu-HU"/>
         </w:rPr>
-        <w:t>        "</w:t>
-      </w:r>
-      <w:proofErr w:type="spellStart"/>
-      <w:r>
-        <w:rPr>
-          <w:rFonts w:ascii="JetBrains Mono" w:hAnsi="JetBrains Mono" w:cs="JetBrains Mono"/>
-          <w:sz w:val="14"/>
-          <w:szCs w:val="14"/>
-          <w:lang w:val="hu-HU"/>
-        </w:rPr>
-        <w:t>description</w:t>
-      </w:r>
-      <w:proofErr w:type="spellEnd"/>
-      <w:r>
-        <w:rPr>
-          <w:rFonts w:ascii="JetBrains Mono" w:hAnsi="JetBrains Mono" w:cs="JetBrains Mono"/>
-          <w:sz w:val="14"/>
-          <w:szCs w:val="14"/>
-          <w:lang w:val="hu-HU"/>
-        </w:rPr>
-        <w:t>": "</w:t>
-      </w:r>
-      <w:proofErr w:type="spellStart"/>
-      <w:r>
-        <w:rPr>
-          <w:rFonts w:ascii="JetBrains Mono" w:hAnsi="JetBrains Mono" w:cs="JetBrains Mono"/>
-          <w:sz w:val="14"/>
-          <w:szCs w:val="14"/>
-          <w:lang w:val="hu-HU"/>
-        </w:rPr>
-        <w:t>You</w:t>
-      </w:r>
-      <w:proofErr w:type="spellEnd"/>
-      <w:r>
-        <w:rPr>
-          <w:rFonts w:ascii="JetBrains Mono" w:hAnsi="JetBrains Mono" w:cs="JetBrains Mono"/>
-          <w:sz w:val="14"/>
-          <w:szCs w:val="14"/>
-          <w:lang w:val="hu-HU"/>
-        </w:rPr>
-        <w:t xml:space="preserve"> </w:t>
-      </w:r>
-      <w:proofErr w:type="spellStart"/>
-      <w:r>
-        <w:rPr>
-          <w:rFonts w:ascii="JetBrains Mono" w:hAnsi="JetBrains Mono" w:cs="JetBrains Mono"/>
-          <w:sz w:val="14"/>
-          <w:szCs w:val="14"/>
-          <w:lang w:val="hu-HU"/>
-        </w:rPr>
-        <w:t>will</w:t>
-      </w:r>
-      <w:proofErr w:type="spellEnd"/>
-      <w:r>
-        <w:rPr>
-          <w:rFonts w:ascii="JetBrains Mono" w:hAnsi="JetBrains Mono" w:cs="JetBrains Mono"/>
-          <w:sz w:val="14"/>
-          <w:szCs w:val="14"/>
-          <w:lang w:val="hu-HU"/>
-        </w:rPr>
-        <w:t xml:space="preserve"> </w:t>
-      </w:r>
-      <w:proofErr w:type="spellStart"/>
-      <w:r>
-        <w:rPr>
-          <w:rFonts w:ascii="JetBrains Mono" w:hAnsi="JetBrains Mono" w:cs="JetBrains Mono"/>
-          <w:sz w:val="14"/>
-          <w:szCs w:val="14"/>
-          <w:lang w:val="hu-HU"/>
-        </w:rPr>
-        <w:t>learn</w:t>
-      </w:r>
-      <w:proofErr w:type="spellEnd"/>
-      <w:r>
-        <w:rPr>
-          <w:rFonts w:ascii="JetBrains Mono" w:hAnsi="JetBrains Mono" w:cs="JetBrains Mono"/>
-          <w:sz w:val="14"/>
-          <w:szCs w:val="14"/>
-          <w:lang w:val="hu-HU"/>
-        </w:rPr>
-        <w:t xml:space="preserve"> </w:t>
-      </w:r>
-      <w:proofErr w:type="spellStart"/>
-      <w:r>
-        <w:rPr>
-          <w:rFonts w:ascii="JetBrains Mono" w:hAnsi="JetBrains Mono" w:cs="JetBrains Mono"/>
-          <w:sz w:val="14"/>
-          <w:szCs w:val="14"/>
-          <w:lang w:val="hu-HU"/>
-        </w:rPr>
-        <w:t>the</w:t>
-      </w:r>
-      <w:proofErr w:type="spellEnd"/>
-      <w:r>
-        <w:rPr>
-          <w:rFonts w:ascii="JetBrains Mono" w:hAnsi="JetBrains Mono" w:cs="JetBrains Mono"/>
-          <w:sz w:val="14"/>
-          <w:szCs w:val="14"/>
-          <w:lang w:val="hu-HU"/>
-        </w:rPr>
-        <w:t xml:space="preserve"> </w:t>
-      </w:r>
-      <w:proofErr w:type="spellStart"/>
-      <w:r>
-        <w:rPr>
-          <w:rFonts w:ascii="JetBrains Mono" w:hAnsi="JetBrains Mono" w:cs="JetBrains Mono"/>
-          <w:sz w:val="14"/>
-          <w:szCs w:val="14"/>
-          <w:lang w:val="hu-HU"/>
-        </w:rPr>
-        <w:t>basics</w:t>
-      </w:r>
-      <w:proofErr w:type="spellEnd"/>
-      <w:r>
-        <w:rPr>
-          <w:rFonts w:ascii="JetBrains Mono" w:hAnsi="JetBrains Mono" w:cs="JetBrains Mono"/>
-          <w:sz w:val="14"/>
-          <w:szCs w:val="14"/>
-          <w:lang w:val="hu-HU"/>
-        </w:rPr>
-        <w:t xml:space="preserve"> of English, </w:t>
-      </w:r>
-      <w:proofErr w:type="spellStart"/>
-      <w:r>
-        <w:rPr>
-          <w:rFonts w:ascii="JetBrains Mono" w:hAnsi="JetBrains Mono" w:cs="JetBrains Mono"/>
-          <w:sz w:val="14"/>
-          <w:szCs w:val="14"/>
-          <w:lang w:val="hu-HU"/>
-        </w:rPr>
-        <w:t>to</w:t>
-      </w:r>
-      <w:proofErr w:type="spellEnd"/>
-      <w:r>
-        <w:rPr>
-          <w:rFonts w:ascii="JetBrains Mono" w:hAnsi="JetBrains Mono" w:cs="JetBrains Mono"/>
-          <w:sz w:val="14"/>
-          <w:szCs w:val="14"/>
-          <w:lang w:val="hu-HU"/>
-        </w:rPr>
-        <w:t xml:space="preserve"> be </w:t>
-      </w:r>
-      <w:proofErr w:type="spellStart"/>
-      <w:r>
-        <w:rPr>
-          <w:rFonts w:ascii="JetBrains Mono" w:hAnsi="JetBrains Mono" w:cs="JetBrains Mono"/>
-          <w:sz w:val="14"/>
-          <w:szCs w:val="14"/>
-          <w:lang w:val="hu-HU"/>
-        </w:rPr>
-        <w:t>able</w:t>
-      </w:r>
-      <w:proofErr w:type="spellEnd"/>
-      <w:r>
-        <w:rPr>
-          <w:rFonts w:ascii="JetBrains Mono" w:hAnsi="JetBrains Mono" w:cs="JetBrains Mono"/>
-          <w:sz w:val="14"/>
-          <w:szCs w:val="14"/>
-          <w:lang w:val="hu-HU"/>
-        </w:rPr>
-        <w:t xml:space="preserve"> </w:t>
-      </w:r>
-      <w:proofErr w:type="spellStart"/>
-      <w:r>
-        <w:rPr>
-          <w:rFonts w:ascii="JetBrains Mono" w:hAnsi="JetBrains Mono" w:cs="JetBrains Mono"/>
-          <w:sz w:val="14"/>
-          <w:szCs w:val="14"/>
-          <w:lang w:val="hu-HU"/>
-        </w:rPr>
-        <w:t>to</w:t>
-      </w:r>
-      <w:proofErr w:type="spellEnd"/>
-      <w:r>
-        <w:rPr>
-          <w:rFonts w:ascii="JetBrains Mono" w:hAnsi="JetBrains Mono" w:cs="JetBrains Mono"/>
-          <w:sz w:val="14"/>
-          <w:szCs w:val="14"/>
-          <w:lang w:val="hu-HU"/>
-        </w:rPr>
-        <w:t xml:space="preserve"> </w:t>
-      </w:r>
-      <w:proofErr w:type="spellStart"/>
-      <w:r>
-        <w:rPr>
-          <w:rFonts w:ascii="JetBrains Mono" w:hAnsi="JetBrains Mono" w:cs="JetBrains Mono"/>
-          <w:sz w:val="14"/>
-          <w:szCs w:val="14"/>
-          <w:lang w:val="hu-HU"/>
-        </w:rPr>
-        <w:t>pass</w:t>
-      </w:r>
-      <w:proofErr w:type="spellEnd"/>
-      <w:r>
-        <w:rPr>
-          <w:rFonts w:ascii="JetBrains Mono" w:hAnsi="JetBrains Mono" w:cs="JetBrains Mono"/>
-          <w:sz w:val="14"/>
-          <w:szCs w:val="14"/>
-          <w:lang w:val="hu-HU"/>
-        </w:rPr>
-        <w:t xml:space="preserve"> </w:t>
-      </w:r>
-      <w:proofErr w:type="spellStart"/>
-      <w:r>
-        <w:rPr>
-          <w:rFonts w:ascii="JetBrains Mono" w:hAnsi="JetBrains Mono" w:cs="JetBrains Mono"/>
-          <w:sz w:val="14"/>
-          <w:szCs w:val="14"/>
-          <w:lang w:val="hu-HU"/>
-        </w:rPr>
-        <w:t>the</w:t>
-      </w:r>
-      <w:proofErr w:type="spellEnd"/>
-      <w:r>
-        <w:rPr>
-          <w:rFonts w:ascii="JetBrains Mono" w:hAnsi="JetBrains Mono" w:cs="JetBrains Mono"/>
-          <w:sz w:val="14"/>
-          <w:szCs w:val="14"/>
-          <w:lang w:val="hu-HU"/>
-        </w:rPr>
-        <w:t xml:space="preserve"> B2 </w:t>
-      </w:r>
-      <w:proofErr w:type="spellStart"/>
-      <w:r>
-        <w:rPr>
-          <w:rFonts w:ascii="JetBrains Mono" w:hAnsi="JetBrains Mono" w:cs="JetBrains Mono"/>
-          <w:sz w:val="14"/>
-          <w:szCs w:val="14"/>
-          <w:lang w:val="hu-HU"/>
-        </w:rPr>
-        <w:t>exam</w:t>
-      </w:r>
-      <w:proofErr w:type="spellEnd"/>
-      <w:r>
-        <w:rPr>
-          <w:rFonts w:ascii="JetBrains Mono" w:hAnsi="JetBrains Mono" w:cs="JetBrains Mono"/>
-          <w:sz w:val="14"/>
-          <w:szCs w:val="14"/>
-          <w:lang w:val="hu-HU"/>
-        </w:rPr>
-        <w:t>",</w:t>
+        <w:t>        "description": "You will learn the basics of English, to be able to pass the B2 exam",</w:t>
       </w:r>
     </w:p>
     <w:p>
@@ -10131,47 +8004,7 @@
           <w:szCs w:val="14"/>
           <w:lang w:val="hu-HU"/>
         </w:rPr>
-        <w:t>        "</w:t>
-      </w:r>
-      <w:proofErr w:type="spellStart"/>
-      <w:r>
-        <w:rPr>
-          <w:rFonts w:ascii="JetBrains Mono" w:hAnsi="JetBrains Mono" w:cs="JetBrains Mono"/>
-          <w:sz w:val="14"/>
-          <w:szCs w:val="14"/>
-          <w:lang w:val="hu-HU"/>
-        </w:rPr>
-        <w:t>courseType</w:t>
-      </w:r>
-      <w:proofErr w:type="spellEnd"/>
-      <w:r>
-        <w:rPr>
-          <w:rFonts w:ascii="JetBrains Mono" w:hAnsi="JetBrains Mono" w:cs="JetBrains Mono"/>
-          <w:sz w:val="14"/>
-          <w:szCs w:val="14"/>
-          <w:lang w:val="hu-HU"/>
-        </w:rPr>
-        <w:t>": "</w:t>
-      </w:r>
-      <w:proofErr w:type="spellStart"/>
-      <w:r>
-        <w:rPr>
-          <w:rFonts w:ascii="JetBrains Mono" w:hAnsi="JetBrains Mono" w:cs="JetBrains Mono"/>
-          <w:sz w:val="14"/>
-          <w:szCs w:val="14"/>
-          <w:lang w:val="hu-HU"/>
-        </w:rPr>
-        <w:t>tutoring</w:t>
-      </w:r>
-      <w:proofErr w:type="spellEnd"/>
-      <w:r>
-        <w:rPr>
-          <w:rFonts w:ascii="JetBrains Mono" w:hAnsi="JetBrains Mono" w:cs="JetBrains Mono"/>
-          <w:sz w:val="14"/>
-          <w:szCs w:val="14"/>
-          <w:lang w:val="hu-HU"/>
-        </w:rPr>
-        <w:t>"</w:t>
+        <w:t>        "courseType": "tutoring"</w:t>
       </w:r>
     </w:p>
     <w:p>
@@ -10231,27 +8064,7 @@
           <w:szCs w:val="14"/>
           <w:lang w:val="hu-HU"/>
         </w:rPr>
-        <w:t>    "</w:t>
-      </w:r>
-      <w:proofErr w:type="spellStart"/>
-      <w:r>
-        <w:rPr>
-          <w:rFonts w:ascii="JetBrains Mono" w:hAnsi="JetBrains Mono" w:cs="JetBrains Mono"/>
-          <w:sz w:val="14"/>
-          <w:szCs w:val="14"/>
-          <w:lang w:val="hu-HU"/>
-        </w:rPr>
-        <w:t>notifications</w:t>
-      </w:r>
-      <w:proofErr w:type="spellEnd"/>
-      <w:r>
-        <w:rPr>
-          <w:rFonts w:ascii="JetBrains Mono" w:hAnsi="JetBrains Mono" w:cs="JetBrains Mono"/>
-          <w:sz w:val="14"/>
-          <w:szCs w:val="14"/>
-          <w:lang w:val="hu-HU"/>
-        </w:rPr>
-        <w:t>": {</w:t>
+        <w:t>    "notifications": {</w:t>
       </w:r>
     </w:p>
     <w:p>
@@ -10271,27 +8084,7 @@
           <w:szCs w:val="14"/>
           <w:lang w:val="hu-HU"/>
         </w:rPr>
-        <w:t>      "</w:t>
-      </w:r>
-      <w:proofErr w:type="spellStart"/>
-      <w:r>
-        <w:rPr>
-          <w:rFonts w:ascii="JetBrains Mono" w:hAnsi="JetBrains Mono" w:cs="JetBrains Mono"/>
-          <w:sz w:val="14"/>
-          <w:szCs w:val="14"/>
-          <w:lang w:val="hu-HU"/>
-        </w:rPr>
-        <w:t>unreadNotificationNumber</w:t>
-      </w:r>
-      <w:proofErr w:type="spellEnd"/>
-      <w:r>
-        <w:rPr>
-          <w:rFonts w:ascii="JetBrains Mono" w:hAnsi="JetBrains Mono" w:cs="JetBrains Mono"/>
-          <w:sz w:val="14"/>
-          <w:szCs w:val="14"/>
-          <w:lang w:val="hu-HU"/>
-        </w:rPr>
-        <w:t>": 5,</w:t>
+        <w:t>      "unreadNotificationNumber": 5,</w:t>
       </w:r>
     </w:p>
     <w:p>
@@ -10311,27 +8104,7 @@
           <w:szCs w:val="14"/>
           <w:lang w:val="hu-HU"/>
         </w:rPr>
-        <w:t>      "</w:t>
-      </w:r>
-      <w:proofErr w:type="spellStart"/>
-      <w:r>
-        <w:rPr>
-          <w:rFonts w:ascii="JetBrains Mono" w:hAnsi="JetBrains Mono" w:cs="JetBrains Mono"/>
-          <w:sz w:val="14"/>
-          <w:szCs w:val="14"/>
-          <w:lang w:val="hu-HU"/>
-        </w:rPr>
-        <w:t>lastUnread</w:t>
-      </w:r>
-      <w:proofErr w:type="spellEnd"/>
-      <w:r>
-        <w:rPr>
-          <w:rFonts w:ascii="JetBrains Mono" w:hAnsi="JetBrains Mono" w:cs="JetBrains Mono"/>
-          <w:sz w:val="14"/>
-          <w:szCs w:val="14"/>
-          <w:lang w:val="hu-HU"/>
-        </w:rPr>
-        <w:t>": {</w:t>
+        <w:t>      "lastUnread": {</w:t>
       </w:r>
     </w:p>
     <w:p>
@@ -10351,47 +8124,7 @@
           <w:szCs w:val="14"/>
           <w:lang w:val="hu-HU"/>
         </w:rPr>
-        <w:t>        "</w:t>
-      </w:r>
-      <w:proofErr w:type="spellStart"/>
-      <w:r>
-        <w:rPr>
-          <w:rFonts w:ascii="JetBrains Mono" w:hAnsi="JetBrains Mono" w:cs="JetBrains Mono"/>
-          <w:sz w:val="14"/>
-          <w:szCs w:val="14"/>
-          <w:lang w:val="hu-HU"/>
-        </w:rPr>
-        <w:t>notificationId</w:t>
-      </w:r>
-      <w:proofErr w:type="spellEnd"/>
-      <w:r>
-        <w:rPr>
-          <w:rFonts w:ascii="JetBrains Mono" w:hAnsi="JetBrains Mono" w:cs="JetBrains Mono"/>
-          <w:sz w:val="14"/>
-          <w:szCs w:val="14"/>
-          <w:lang w:val="hu-HU"/>
-        </w:rPr>
-        <w:t>": "</w:t>
-      </w:r>
-      <w:proofErr w:type="spellStart"/>
-      <w:r>
-        <w:rPr>
-          <w:rFonts w:ascii="JetBrains Mono" w:hAnsi="JetBrains Mono" w:cs="JetBrains Mono"/>
-          <w:sz w:val="14"/>
-          <w:szCs w:val="14"/>
-          <w:lang w:val="hu-HU"/>
-        </w:rPr>
-        <w:t>uuid</w:t>
-      </w:r>
-      <w:proofErr w:type="spellEnd"/>
-      <w:r>
-        <w:rPr>
-          <w:rFonts w:ascii="JetBrains Mono" w:hAnsi="JetBrains Mono" w:cs="JetBrains Mono"/>
-          <w:sz w:val="14"/>
-          <w:szCs w:val="14"/>
-          <w:lang w:val="hu-HU"/>
-        </w:rPr>
-        <w:t>",</w:t>
+        <w:t>        "notificationId": "uuid",</w:t>
       </w:r>
     </w:p>
     <w:p>
@@ -10411,47 +8144,7 @@
           <w:szCs w:val="14"/>
           <w:lang w:val="hu-HU"/>
         </w:rPr>
-        <w:t>        "</w:t>
-      </w:r>
-      <w:proofErr w:type="spellStart"/>
-      <w:r>
-        <w:rPr>
-          <w:rFonts w:ascii="JetBrains Mono" w:hAnsi="JetBrains Mono" w:cs="JetBrains Mono"/>
-          <w:sz w:val="14"/>
-          <w:szCs w:val="14"/>
-          <w:lang w:val="hu-HU"/>
-        </w:rPr>
-        <w:t>courseName</w:t>
-      </w:r>
-      <w:proofErr w:type="spellEnd"/>
-      <w:r>
-        <w:rPr>
-          <w:rFonts w:ascii="JetBrains Mono" w:hAnsi="JetBrains Mono" w:cs="JetBrains Mono"/>
-          <w:sz w:val="14"/>
-          <w:szCs w:val="14"/>
-          <w:lang w:val="hu-HU"/>
-        </w:rPr>
-        <w:t>": "</w:t>
-      </w:r>
-      <w:proofErr w:type="spellStart"/>
-      <w:r>
-        <w:rPr>
-          <w:rFonts w:ascii="JetBrains Mono" w:hAnsi="JetBrains Mono" w:cs="JetBrains Mono"/>
-          <w:sz w:val="14"/>
-          <w:szCs w:val="14"/>
-          <w:lang w:val="hu-HU"/>
-        </w:rPr>
-        <w:t>Calculus</w:t>
-      </w:r>
-      <w:proofErr w:type="spellEnd"/>
-      <w:r>
-        <w:rPr>
-          <w:rFonts w:ascii="JetBrains Mono" w:hAnsi="JetBrains Mono" w:cs="JetBrains Mono"/>
-          <w:sz w:val="14"/>
-          <w:szCs w:val="14"/>
-          <w:lang w:val="hu-HU"/>
-        </w:rPr>
-        <w:t>",</w:t>
+        <w:t>        "eventUrl": "#",</w:t>
       </w:r>
     </w:p>
     <w:p>
@@ -10471,47 +8164,27 @@
           <w:szCs w:val="14"/>
           <w:lang w:val="hu-HU"/>
         </w:rPr>
-        <w:t>        "text": "</w:t>
-      </w:r>
-      <w:proofErr w:type="spellStart"/>
-      <w:r>
-        <w:rPr>
-          <w:rFonts w:ascii="JetBrains Mono" w:hAnsi="JetBrains Mono" w:cs="JetBrains Mono"/>
-          <w:sz w:val="14"/>
-          <w:szCs w:val="14"/>
-          <w:lang w:val="hu-HU"/>
-        </w:rPr>
-        <w:t>Submission</w:t>
-      </w:r>
-      <w:proofErr w:type="spellEnd"/>
-      <w:r>
-        <w:rPr>
-          <w:rFonts w:ascii="JetBrains Mono" w:hAnsi="JetBrains Mono" w:cs="JetBrains Mono"/>
-          <w:sz w:val="14"/>
-          <w:szCs w:val="14"/>
-          <w:lang w:val="hu-HU"/>
-        </w:rPr>
-        <w:t xml:space="preserve"> </w:t>
-      </w:r>
-      <w:proofErr w:type="spellStart"/>
-      <w:r>
-        <w:rPr>
-          <w:rFonts w:ascii="JetBrains Mono" w:hAnsi="JetBrains Mono" w:cs="JetBrains Mono"/>
-          <w:sz w:val="14"/>
-          <w:szCs w:val="14"/>
-          <w:lang w:val="hu-HU"/>
-        </w:rPr>
-        <w:t>graded</w:t>
-      </w:r>
-      <w:proofErr w:type="spellEnd"/>
-      <w:r>
-        <w:rPr>
-          <w:rFonts w:ascii="JetBrains Mono" w:hAnsi="JetBrains Mono" w:cs="JetBrains Mono"/>
-          <w:sz w:val="14"/>
-          <w:szCs w:val="14"/>
-          <w:lang w:val="hu-HU"/>
-        </w:rPr>
-        <w:t>"</w:t>
+        <w:t>        "courseName": "Calculus",</w:t>
+      </w:r>
+    </w:p>
+    <w:p>
+      <w:pPr>
+        <w:spacing w:after="0"/>
+        <w:rPr>
+          <w:rFonts w:ascii="JetBrains Mono" w:hAnsi="JetBrains Mono" w:cs="JetBrains Mono"/>
+          <w:sz w:val="14"/>
+          <w:szCs w:val="14"/>
+          <w:lang w:val="hu-HU"/>
+        </w:rPr>
+      </w:pPr>
+      <w:r>
+        <w:rPr>
+          <w:rFonts w:ascii="JetBrains Mono" w:hAnsi="JetBrains Mono" w:cs="JetBrains Mono"/>
+          <w:sz w:val="14"/>
+          <w:szCs w:val="14"/>
+          <w:lang w:val="hu-HU"/>
+        </w:rPr>
+        <w:t>        "text": "Submission graded"</w:t>
       </w:r>
     </w:p>
     <w:p>
@@ -10910,25 +8583,7 @@
           <w:sz w:val="22"/>
           <w:szCs w:val="22"/>
         </w:rPr>
-        <w:t xml:space="preserve">GET </w:t>
-      </w:r>
-      <w:proofErr w:type="spellStart"/>
-      <w:r>
-        <w:rPr>
-          <w:rFonts w:ascii="JetBrains Mono" w:hAnsi="JetBrains Mono" w:cs="JetBrains Mono"/>
-          <w:sz w:val="22"/>
-          <w:szCs w:val="22"/>
-        </w:rPr>
-        <w:t>api</w:t>
-      </w:r>
-      <w:proofErr w:type="spellEnd"/>
-      <w:r>
-        <w:rPr>
-          <w:rFonts w:ascii="JetBrains Mono" w:hAnsi="JetBrains Mono" w:cs="JetBrains Mono"/>
-          <w:sz w:val="22"/>
-          <w:szCs w:val="22"/>
-        </w:rPr>
-        <w:t>/student/</w:t>
+        <w:t>GET api/student/</w:t>
       </w:r>
       <w:r>
         <w:rPr>
@@ -10982,7 +8637,7 @@
     <w:p>
       <w:pPr>
         <w:spacing w:after="0"/>
-        <w:ind w:left="1587"/>
+        <w:ind w:left="1417"/>
         <w:rPr>
           <w:rFonts w:ascii="JetBrains Mono" w:hAnsi="JetBrains Mono" w:cs="JetBrains Mono"/>
           <w:sz w:val="14"/>
@@ -11003,1266 +8658,490 @@
     <w:p>
       <w:pPr>
         <w:spacing w:after="0"/>
-        <w:ind w:left="1587"/>
-        <w:rPr>
-          <w:rFonts w:ascii="JetBrains Mono" w:hAnsi="JetBrains Mono" w:cs="JetBrains Mono"/>
-          <w:sz w:val="14"/>
-          <w:szCs w:val="14"/>
-          <w:lang w:val="hu-HU"/>
-        </w:rPr>
-      </w:pPr>
-      <w:r>
-        <w:rPr>
-          <w:rFonts w:ascii="JetBrains Mono" w:hAnsi="JetBrains Mono" w:cs="JetBrains Mono"/>
-          <w:sz w:val="14"/>
-          <w:szCs w:val="14"/>
-          <w:lang w:val="hu-HU"/>
-        </w:rPr>
-        <w:t>    "</w:t>
-      </w:r>
-      <w:proofErr w:type="spellStart"/>
-      <w:r>
-        <w:rPr>
-          <w:rFonts w:ascii="JetBrains Mono" w:hAnsi="JetBrains Mono" w:cs="JetBrains Mono"/>
-          <w:sz w:val="14"/>
-          <w:szCs w:val="14"/>
-          <w:lang w:val="hu-HU"/>
-        </w:rPr>
-        <w:t>profile</w:t>
-      </w:r>
-      <w:proofErr w:type="spellEnd"/>
-      <w:r>
-        <w:rPr>
-          <w:rFonts w:ascii="JetBrains Mono" w:hAnsi="JetBrains Mono" w:cs="JetBrains Mono"/>
-          <w:sz w:val="14"/>
-          <w:szCs w:val="14"/>
-          <w:lang w:val="hu-HU"/>
-        </w:rPr>
-        <w:t>": {</w:t>
+        <w:ind w:left="1417"/>
+        <w:rPr>
+          <w:rFonts w:ascii="JetBrains Mono" w:hAnsi="JetBrains Mono" w:cs="JetBrains Mono"/>
+          <w:sz w:val="14"/>
+          <w:szCs w:val="14"/>
+          <w:lang w:val="hu-HU"/>
+        </w:rPr>
+      </w:pPr>
+      <w:r>
+        <w:rPr>
+          <w:rFonts w:ascii="JetBrains Mono" w:hAnsi="JetBrains Mono" w:cs="JetBrains Mono"/>
+          <w:sz w:val="14"/>
+          <w:szCs w:val="14"/>
+          <w:lang w:val="hu-HU"/>
+        </w:rPr>
+        <w:t xml:space="preserve">    "profile": {</w:t>
       </w:r>
     </w:p>
     <w:p>
       <w:pPr>
         <w:spacing w:after="0"/>
-        <w:ind w:left="1587"/>
-        <w:rPr>
-          <w:rFonts w:ascii="JetBrains Mono" w:hAnsi="JetBrains Mono" w:cs="JetBrains Mono"/>
-          <w:sz w:val="14"/>
-          <w:szCs w:val="14"/>
-          <w:lang w:val="hu-HU"/>
-        </w:rPr>
-      </w:pPr>
-      <w:r>
-        <w:rPr>
-          <w:rFonts w:ascii="JetBrains Mono" w:hAnsi="JetBrains Mono" w:cs="JetBrains Mono"/>
-          <w:sz w:val="14"/>
-          <w:szCs w:val="14"/>
-          <w:lang w:val="hu-HU"/>
-        </w:rPr>
-        <w:t>      "</w:t>
-      </w:r>
-      <w:proofErr w:type="spellStart"/>
-      <w:r>
-        <w:rPr>
-          <w:rFonts w:ascii="JetBrains Mono" w:hAnsi="JetBrains Mono" w:cs="JetBrains Mono"/>
-          <w:sz w:val="14"/>
-          <w:szCs w:val="14"/>
-          <w:lang w:val="hu-HU"/>
-        </w:rPr>
-        <w:t>id</w:t>
-      </w:r>
-      <w:proofErr w:type="spellEnd"/>
-      <w:r>
-        <w:rPr>
-          <w:rFonts w:ascii="JetBrains Mono" w:hAnsi="JetBrains Mono" w:cs="JetBrains Mono"/>
-          <w:sz w:val="14"/>
-          <w:szCs w:val="14"/>
-          <w:lang w:val="hu-HU"/>
-        </w:rPr>
-        <w:t>": "</w:t>
-      </w:r>
-      <w:proofErr w:type="spellStart"/>
-      <w:r>
-        <w:rPr>
-          <w:rFonts w:ascii="JetBrains Mono" w:hAnsi="JetBrains Mono" w:cs="JetBrains Mono"/>
-          <w:sz w:val="14"/>
-          <w:szCs w:val="14"/>
-          <w:lang w:val="hu-HU"/>
-        </w:rPr>
-        <w:t>uuid</w:t>
-      </w:r>
-      <w:proofErr w:type="spellEnd"/>
-      <w:r>
-        <w:rPr>
-          <w:rFonts w:ascii="JetBrains Mono" w:hAnsi="JetBrains Mono" w:cs="JetBrains Mono"/>
-          <w:sz w:val="14"/>
-          <w:szCs w:val="14"/>
-          <w:lang w:val="hu-HU"/>
-        </w:rPr>
-        <w:t>",</w:t>
+        <w:ind w:left="1417"/>
+        <w:rPr>
+          <w:rFonts w:ascii="JetBrains Mono" w:hAnsi="JetBrains Mono" w:cs="JetBrains Mono"/>
+          <w:sz w:val="14"/>
+          <w:szCs w:val="14"/>
+          <w:lang w:val="hu-HU"/>
+        </w:rPr>
+      </w:pPr>
+      <w:r>
+        <w:rPr>
+          <w:rFonts w:ascii="JetBrains Mono" w:hAnsi="JetBrains Mono" w:cs="JetBrains Mono"/>
+          <w:sz w:val="14"/>
+          <w:szCs w:val="14"/>
+          <w:lang w:val="hu-HU"/>
+        </w:rPr>
+        <w:t xml:space="preserve">      "userId": "uuid",</w:t>
       </w:r>
     </w:p>
     <w:p>
       <w:pPr>
         <w:spacing w:after="0"/>
-        <w:ind w:left="1587"/>
-        <w:rPr>
-          <w:rFonts w:ascii="JetBrains Mono" w:hAnsi="JetBrains Mono" w:cs="JetBrains Mono"/>
-          <w:sz w:val="14"/>
-          <w:szCs w:val="14"/>
-          <w:lang w:val="hu-HU"/>
-        </w:rPr>
-      </w:pPr>
-      <w:r>
-        <w:rPr>
-          <w:rFonts w:ascii="JetBrains Mono" w:hAnsi="JetBrains Mono" w:cs="JetBrains Mono"/>
-          <w:sz w:val="14"/>
-          <w:szCs w:val="14"/>
-          <w:lang w:val="hu-HU"/>
-        </w:rPr>
-        <w:t>      "</w:t>
-      </w:r>
-      <w:proofErr w:type="spellStart"/>
-      <w:r>
-        <w:rPr>
-          <w:rFonts w:ascii="JetBrains Mono" w:hAnsi="JetBrains Mono" w:cs="JetBrains Mono"/>
-          <w:sz w:val="14"/>
-          <w:szCs w:val="14"/>
-          <w:lang w:val="hu-HU"/>
-        </w:rPr>
-        <w:t>fullName</w:t>
-      </w:r>
-      <w:proofErr w:type="spellEnd"/>
-      <w:r>
-        <w:rPr>
-          <w:rFonts w:ascii="JetBrains Mono" w:hAnsi="JetBrains Mono" w:cs="JetBrains Mono"/>
-          <w:sz w:val="14"/>
-          <w:szCs w:val="14"/>
-          <w:lang w:val="hu-HU"/>
-        </w:rPr>
-        <w:t>": "Szakács Máté",</w:t>
+        <w:ind w:left="1417"/>
+        <w:rPr>
+          <w:rFonts w:ascii="JetBrains Mono" w:hAnsi="JetBrains Mono" w:cs="JetBrains Mono"/>
+          <w:sz w:val="14"/>
+          <w:szCs w:val="14"/>
+          <w:lang w:val="hu-HU"/>
+        </w:rPr>
+      </w:pPr>
+      <w:r>
+        <w:rPr>
+          <w:rFonts w:ascii="JetBrains Mono" w:hAnsi="JetBrains Mono" w:cs="JetBrains Mono"/>
+          <w:sz w:val="14"/>
+          <w:szCs w:val="14"/>
+          <w:lang w:val="hu-HU"/>
+        </w:rPr>
+        <w:t xml:space="preserve">      "fullName": "Szakács Máté",</w:t>
       </w:r>
     </w:p>
     <w:p>
       <w:pPr>
         <w:spacing w:after="0"/>
-        <w:ind w:left="1587"/>
-        <w:rPr>
-          <w:rFonts w:ascii="JetBrains Mono" w:hAnsi="JetBrains Mono" w:cs="JetBrains Mono"/>
-          <w:sz w:val="14"/>
-          <w:szCs w:val="14"/>
-          <w:lang w:val="hu-HU"/>
-        </w:rPr>
-      </w:pPr>
-      <w:r>
-        <w:rPr>
-          <w:rFonts w:ascii="JetBrains Mono" w:hAnsi="JetBrains Mono" w:cs="JetBrains Mono"/>
-          <w:sz w:val="14"/>
-          <w:szCs w:val="14"/>
-          <w:lang w:val="hu-HU"/>
-        </w:rPr>
-        <w:t>      "</w:t>
-      </w:r>
-      <w:proofErr w:type="spellStart"/>
-      <w:r>
-        <w:rPr>
-          <w:rFonts w:ascii="JetBrains Mono" w:hAnsi="JetBrains Mono" w:cs="JetBrains Mono"/>
-          <w:sz w:val="14"/>
-          <w:szCs w:val="14"/>
-          <w:lang w:val="hu-HU"/>
-        </w:rPr>
-        <w:t>nickName</w:t>
-      </w:r>
-      <w:proofErr w:type="spellEnd"/>
-      <w:r>
-        <w:rPr>
-          <w:rFonts w:ascii="JetBrains Mono" w:hAnsi="JetBrains Mono" w:cs="JetBrains Mono"/>
-          <w:sz w:val="14"/>
-          <w:szCs w:val="14"/>
-          <w:lang w:val="hu-HU"/>
-        </w:rPr>
-        <w:t>": "Matthias",</w:t>
+        <w:ind w:left="1417"/>
+        <w:rPr>
+          <w:rFonts w:ascii="JetBrains Mono" w:hAnsi="JetBrains Mono" w:cs="JetBrains Mono"/>
+          <w:sz w:val="14"/>
+          <w:szCs w:val="14"/>
+          <w:lang w:val="hu-HU"/>
+        </w:rPr>
+      </w:pPr>
+      <w:r>
+        <w:rPr>
+          <w:rFonts w:ascii="JetBrains Mono" w:hAnsi="JetBrains Mono" w:cs="JetBrains Mono"/>
+          <w:sz w:val="14"/>
+          <w:szCs w:val="14"/>
+          <w:lang w:val="hu-HU"/>
+        </w:rPr>
+        <w:t xml:space="preserve">      "nickName": "Matthias",</w:t>
       </w:r>
     </w:p>
     <w:p>
       <w:pPr>
         <w:spacing w:after="0"/>
-        <w:ind w:left="1587"/>
-        <w:rPr>
-          <w:rFonts w:ascii="JetBrains Mono" w:hAnsi="JetBrains Mono" w:cs="JetBrains Mono"/>
-          <w:sz w:val="14"/>
-          <w:szCs w:val="14"/>
-          <w:lang w:val="hu-HU"/>
-        </w:rPr>
-      </w:pPr>
-      <w:r>
-        <w:rPr>
-          <w:rFonts w:ascii="JetBrains Mono" w:hAnsi="JetBrains Mono" w:cs="JetBrains Mono"/>
-          <w:sz w:val="14"/>
-          <w:szCs w:val="14"/>
-          <w:lang w:val="hu-HU"/>
-        </w:rPr>
-        <w:t>      "email": "szak@gmail.com",</w:t>
+        <w:ind w:left="1417"/>
+        <w:rPr>
+          <w:rFonts w:ascii="JetBrains Mono" w:hAnsi="JetBrains Mono" w:cs="JetBrains Mono"/>
+          <w:sz w:val="14"/>
+          <w:szCs w:val="14"/>
+          <w:lang w:val="hu-HU"/>
+        </w:rPr>
+      </w:pPr>
+      <w:r>
+        <w:rPr>
+          <w:rFonts w:ascii="JetBrains Mono" w:hAnsi="JetBrains Mono" w:cs="JetBrains Mono"/>
+          <w:sz w:val="14"/>
+          <w:szCs w:val="14"/>
+          <w:lang w:val="hu-HU"/>
+        </w:rPr>
+        <w:t xml:space="preserve">      "email": "szak@gmail.com",</w:t>
       </w:r>
     </w:p>
     <w:p>
       <w:pPr>
         <w:spacing w:after="0"/>
-        <w:ind w:left="1587"/>
-        <w:rPr>
-          <w:rFonts w:ascii="JetBrains Mono" w:hAnsi="JetBrains Mono" w:cs="JetBrains Mono"/>
-          <w:sz w:val="14"/>
-          <w:szCs w:val="14"/>
-          <w:lang w:val="hu-HU"/>
-        </w:rPr>
-      </w:pPr>
-      <w:r>
-        <w:rPr>
-          <w:rFonts w:ascii="JetBrains Mono" w:hAnsi="JetBrains Mono" w:cs="JetBrains Mono"/>
-          <w:sz w:val="14"/>
-          <w:szCs w:val="14"/>
-          <w:lang w:val="hu-HU"/>
-        </w:rPr>
-        <w:t>      "</w:t>
-      </w:r>
-      <w:proofErr w:type="spellStart"/>
-      <w:r>
-        <w:rPr>
-          <w:rFonts w:ascii="JetBrains Mono" w:hAnsi="JetBrains Mono" w:cs="JetBrains Mono"/>
-          <w:sz w:val="14"/>
-          <w:szCs w:val="14"/>
-          <w:lang w:val="hu-HU"/>
-        </w:rPr>
-        <w:t>phoneNumber</w:t>
-      </w:r>
-      <w:proofErr w:type="spellEnd"/>
-      <w:r>
-        <w:rPr>
-          <w:rFonts w:ascii="JetBrains Mono" w:hAnsi="JetBrains Mono" w:cs="JetBrains Mono"/>
-          <w:sz w:val="14"/>
-          <w:szCs w:val="14"/>
-          <w:lang w:val="hu-HU"/>
-        </w:rPr>
-        <w:t>": "123456789",</w:t>
+        <w:ind w:left="1417"/>
+        <w:rPr>
+          <w:rFonts w:ascii="JetBrains Mono" w:hAnsi="JetBrains Mono" w:cs="JetBrains Mono"/>
+          <w:sz w:val="14"/>
+          <w:szCs w:val="14"/>
+          <w:lang w:val="hu-HU"/>
+        </w:rPr>
+      </w:pPr>
+      <w:r>
+        <w:rPr>
+          <w:rFonts w:ascii="JetBrains Mono" w:hAnsi="JetBrains Mono" w:cs="JetBrains Mono"/>
+          <w:sz w:val="14"/>
+          <w:szCs w:val="14"/>
+          <w:lang w:val="hu-HU"/>
+        </w:rPr>
+        <w:t xml:space="preserve">      "phoneNumber": "123456789",</w:t>
       </w:r>
     </w:p>
     <w:p>
       <w:pPr>
         <w:spacing w:after="0"/>
-        <w:ind w:left="1587"/>
-        <w:rPr>
-          <w:rFonts w:ascii="JetBrains Mono" w:hAnsi="JetBrains Mono" w:cs="JetBrains Mono"/>
-          <w:sz w:val="14"/>
-          <w:szCs w:val="14"/>
-          <w:lang w:val="hu-HU"/>
-        </w:rPr>
-      </w:pPr>
-      <w:r>
-        <w:rPr>
-          <w:rFonts w:ascii="JetBrains Mono" w:hAnsi="JetBrains Mono" w:cs="JetBrains Mono"/>
-          <w:sz w:val="14"/>
-          <w:szCs w:val="14"/>
-          <w:lang w:val="hu-HU"/>
-        </w:rPr>
-        <w:t>      "</w:t>
-      </w:r>
-      <w:proofErr w:type="spellStart"/>
-      <w:r>
-        <w:rPr>
-          <w:rFonts w:ascii="JetBrains Mono" w:hAnsi="JetBrains Mono" w:cs="JetBrains Mono"/>
-          <w:sz w:val="14"/>
-          <w:szCs w:val="14"/>
-          <w:lang w:val="hu-HU"/>
-        </w:rPr>
-        <w:t>address</w:t>
-      </w:r>
-      <w:proofErr w:type="spellEnd"/>
-      <w:r>
-        <w:rPr>
-          <w:rFonts w:ascii="JetBrains Mono" w:hAnsi="JetBrains Mono" w:cs="JetBrains Mono"/>
-          <w:sz w:val="14"/>
-          <w:szCs w:val="14"/>
-          <w:lang w:val="hu-HU"/>
-        </w:rPr>
-        <w:t>": "Erzsébet utca 10.",</w:t>
+        <w:ind w:left="1417"/>
+        <w:rPr>
+          <w:rFonts w:ascii="JetBrains Mono" w:hAnsi="JetBrains Mono" w:cs="JetBrains Mono"/>
+          <w:sz w:val="14"/>
+          <w:szCs w:val="14"/>
+          <w:lang w:val="hu-HU"/>
+        </w:rPr>
+      </w:pPr>
+      <w:r>
+        <w:rPr>
+          <w:rFonts w:ascii="JetBrains Mono" w:hAnsi="JetBrains Mono" w:cs="JetBrains Mono"/>
+          <w:sz w:val="14"/>
+          <w:szCs w:val="14"/>
+          <w:lang w:val="hu-HU"/>
+        </w:rPr>
+        <w:t xml:space="preserve">      "address": "Erzsébet utca 10.",</w:t>
       </w:r>
     </w:p>
     <w:p>
       <w:pPr>
         <w:spacing w:after="0"/>
-        <w:ind w:left="1587"/>
-        <w:rPr>
-          <w:rFonts w:ascii="JetBrains Mono" w:hAnsi="JetBrains Mono" w:cs="JetBrains Mono"/>
-          <w:sz w:val="14"/>
-          <w:szCs w:val="14"/>
-          <w:lang w:val="hu-HU"/>
-        </w:rPr>
-      </w:pPr>
-      <w:r>
-        <w:rPr>
-          <w:rFonts w:ascii="JetBrains Mono" w:hAnsi="JetBrains Mono" w:cs="JetBrains Mono"/>
-          <w:sz w:val="14"/>
-          <w:szCs w:val="14"/>
-          <w:lang w:val="hu-HU"/>
-        </w:rPr>
-        <w:t>      "city": "Budapest",</w:t>
+        <w:ind w:left="1417"/>
+        <w:rPr>
+          <w:rFonts w:ascii="JetBrains Mono" w:hAnsi="JetBrains Mono" w:cs="JetBrains Mono"/>
+          <w:sz w:val="14"/>
+          <w:szCs w:val="14"/>
+          <w:lang w:val="hu-HU"/>
+        </w:rPr>
+      </w:pPr>
+      <w:r>
+        <w:rPr>
+          <w:rFonts w:ascii="JetBrains Mono" w:hAnsi="JetBrains Mono" w:cs="JetBrains Mono"/>
+          <w:sz w:val="14"/>
+          <w:szCs w:val="14"/>
+          <w:lang w:val="hu-HU"/>
+        </w:rPr>
+        <w:t xml:space="preserve">      "city": "Budapest",</w:t>
       </w:r>
     </w:p>
     <w:p>
       <w:pPr>
         <w:spacing w:after="0"/>
-        <w:ind w:left="1587"/>
-        <w:rPr>
-          <w:rFonts w:ascii="JetBrains Mono" w:hAnsi="JetBrains Mono" w:cs="JetBrains Mono"/>
-          <w:sz w:val="14"/>
-          <w:szCs w:val="14"/>
-          <w:lang w:val="hu-HU"/>
-        </w:rPr>
-      </w:pPr>
-      <w:r>
-        <w:rPr>
-          <w:rFonts w:ascii="JetBrains Mono" w:hAnsi="JetBrains Mono" w:cs="JetBrains Mono"/>
-          <w:sz w:val="14"/>
-          <w:szCs w:val="14"/>
-          <w:lang w:val="hu-HU"/>
-        </w:rPr>
-        <w:t>      "country": "Hungary",</w:t>
+        <w:ind w:left="1417"/>
+        <w:rPr>
+          <w:rFonts w:ascii="JetBrains Mono" w:hAnsi="JetBrains Mono" w:cs="JetBrains Mono"/>
+          <w:sz w:val="14"/>
+          <w:szCs w:val="14"/>
+          <w:lang w:val="hu-HU"/>
+        </w:rPr>
+      </w:pPr>
+      <w:r>
+        <w:rPr>
+          <w:rFonts w:ascii="JetBrains Mono" w:hAnsi="JetBrains Mono" w:cs="JetBrains Mono"/>
+          <w:sz w:val="14"/>
+          <w:szCs w:val="14"/>
+          <w:lang w:val="hu-HU"/>
+        </w:rPr>
+        <w:t xml:space="preserve">      "country": "Hungary",</w:t>
       </w:r>
     </w:p>
     <w:p>
       <w:pPr>
         <w:spacing w:after="0"/>
-        <w:ind w:left="1587"/>
-        <w:rPr>
-          <w:rFonts w:ascii="JetBrains Mono" w:hAnsi="JetBrains Mono" w:cs="JetBrains Mono"/>
-          <w:sz w:val="14"/>
-          <w:szCs w:val="14"/>
-          <w:lang w:val="hu-HU"/>
-        </w:rPr>
-      </w:pPr>
-      <w:r>
-        <w:rPr>
-          <w:rFonts w:ascii="JetBrains Mono" w:hAnsi="JetBrains Mono" w:cs="JetBrains Mono"/>
-          <w:sz w:val="14"/>
-          <w:szCs w:val="14"/>
-          <w:lang w:val="hu-HU"/>
-        </w:rPr>
-        <w:t>      "</w:t>
-      </w:r>
-      <w:proofErr w:type="spellStart"/>
-      <w:r>
-        <w:rPr>
-          <w:rFonts w:ascii="JetBrains Mono" w:hAnsi="JetBrains Mono" w:cs="JetBrains Mono"/>
-          <w:sz w:val="14"/>
-          <w:szCs w:val="14"/>
-          <w:lang w:val="hu-HU"/>
-        </w:rPr>
-        <w:t>postalCode</w:t>
-      </w:r>
-      <w:proofErr w:type="spellEnd"/>
-      <w:r>
-        <w:rPr>
-          <w:rFonts w:ascii="JetBrains Mono" w:hAnsi="JetBrains Mono" w:cs="JetBrains Mono"/>
-          <w:sz w:val="14"/>
-          <w:szCs w:val="14"/>
-          <w:lang w:val="hu-HU"/>
-        </w:rPr>
-        <w:t>": "1024",</w:t>
+        <w:ind w:left="1417"/>
+        <w:rPr>
+          <w:rFonts w:ascii="JetBrains Mono" w:hAnsi="JetBrains Mono" w:cs="JetBrains Mono"/>
+          <w:sz w:val="14"/>
+          <w:szCs w:val="14"/>
+          <w:lang w:val="hu-HU"/>
+        </w:rPr>
+      </w:pPr>
+      <w:r>
+        <w:rPr>
+          <w:rFonts w:ascii="JetBrains Mono" w:hAnsi="JetBrains Mono" w:cs="JetBrains Mono"/>
+          <w:sz w:val="14"/>
+          <w:szCs w:val="14"/>
+          <w:lang w:val="hu-HU"/>
+        </w:rPr>
+        <w:t xml:space="preserve">      "postalCode": "1024",</w:t>
       </w:r>
     </w:p>
     <w:p>
       <w:pPr>
         <w:spacing w:after="0"/>
-        <w:ind w:left="1587"/>
-        <w:rPr>
-          <w:rFonts w:ascii="JetBrains Mono" w:hAnsi="JetBrains Mono" w:cs="JetBrains Mono"/>
-          <w:sz w:val="14"/>
-          <w:szCs w:val="14"/>
-          <w:lang w:val="hu-HU"/>
-        </w:rPr>
-      </w:pPr>
-      <w:r>
-        <w:rPr>
-          <w:rFonts w:ascii="JetBrains Mono" w:hAnsi="JetBrains Mono" w:cs="JetBrains Mono"/>
-          <w:sz w:val="14"/>
-          <w:szCs w:val="14"/>
-          <w:lang w:val="hu-HU"/>
-        </w:rPr>
-        <w:t>      "</w:t>
-      </w:r>
-      <w:proofErr w:type="spellStart"/>
-      <w:r>
-        <w:rPr>
-          <w:rFonts w:ascii="JetBrains Mono" w:hAnsi="JetBrains Mono" w:cs="JetBrains Mono"/>
-          <w:sz w:val="14"/>
-          <w:szCs w:val="14"/>
-          <w:lang w:val="hu-HU"/>
-        </w:rPr>
-        <w:t>profilePictureUrl</w:t>
-      </w:r>
-      <w:proofErr w:type="spellEnd"/>
-      <w:r>
-        <w:rPr>
-          <w:rFonts w:ascii="JetBrains Mono" w:hAnsi="JetBrains Mono" w:cs="JetBrains Mono"/>
-          <w:sz w:val="14"/>
-          <w:szCs w:val="14"/>
-          <w:lang w:val="hu-HU"/>
-        </w:rPr>
-        <w:t>": "",</w:t>
+        <w:ind w:left="1417"/>
+        <w:rPr>
+          <w:rFonts w:ascii="JetBrains Mono" w:hAnsi="JetBrains Mono" w:cs="JetBrains Mono"/>
+          <w:sz w:val="14"/>
+          <w:szCs w:val="14"/>
+          <w:lang w:val="hu-HU"/>
+        </w:rPr>
+      </w:pPr>
+      <w:r>
+        <w:rPr>
+          <w:rFonts w:ascii="JetBrains Mono" w:hAnsi="JetBrains Mono" w:cs="JetBrains Mono"/>
+          <w:sz w:val="14"/>
+          <w:szCs w:val="14"/>
+          <w:lang w:val="hu-HU"/>
+        </w:rPr>
+        <w:t xml:space="preserve">      "profilePictureUrl": "",</w:t>
       </w:r>
     </w:p>
     <w:p>
       <w:pPr>
         <w:spacing w:after="0"/>
-        <w:ind w:left="1587"/>
-        <w:rPr>
-          <w:rFonts w:ascii="JetBrains Mono" w:hAnsi="JetBrains Mono" w:cs="JetBrains Mono"/>
-          <w:sz w:val="14"/>
-          <w:szCs w:val="14"/>
-          <w:lang w:val="hu-HU"/>
-        </w:rPr>
-      </w:pPr>
-      <w:r>
-        <w:rPr>
-          <w:rFonts w:ascii="JetBrains Mono" w:hAnsi="JetBrains Mono" w:cs="JetBrains Mono"/>
-          <w:sz w:val="14"/>
-          <w:szCs w:val="14"/>
-          <w:lang w:val="hu-HU"/>
-        </w:rPr>
-        <w:t>      "</w:t>
-      </w:r>
-      <w:proofErr w:type="spellStart"/>
-      <w:r>
-        <w:rPr>
-          <w:rFonts w:ascii="JetBrains Mono" w:hAnsi="JetBrains Mono" w:cs="JetBrains Mono"/>
-          <w:sz w:val="14"/>
-          <w:szCs w:val="14"/>
-          <w:lang w:val="hu-HU"/>
-        </w:rPr>
-        <w:t>introduction</w:t>
-      </w:r>
-      <w:proofErr w:type="spellEnd"/>
-      <w:r>
-        <w:rPr>
-          <w:rFonts w:ascii="JetBrains Mono" w:hAnsi="JetBrains Mono" w:cs="JetBrains Mono"/>
-          <w:sz w:val="14"/>
-          <w:szCs w:val="14"/>
-          <w:lang w:val="hu-HU"/>
-        </w:rPr>
-        <w:t xml:space="preserve">": "I am a </w:t>
-      </w:r>
-      <w:proofErr w:type="spellStart"/>
-      <w:r>
-        <w:rPr>
-          <w:rFonts w:ascii="JetBrains Mono" w:hAnsi="JetBrains Mono" w:cs="JetBrains Mono"/>
-          <w:sz w:val="14"/>
-          <w:szCs w:val="14"/>
-          <w:lang w:val="hu-HU"/>
-        </w:rPr>
-        <w:t>student</w:t>
-      </w:r>
-      <w:proofErr w:type="spellEnd"/>
-      <w:r>
-        <w:rPr>
-          <w:rFonts w:ascii="JetBrains Mono" w:hAnsi="JetBrains Mono" w:cs="JetBrains Mono"/>
-          <w:sz w:val="14"/>
-          <w:szCs w:val="14"/>
-          <w:lang w:val="hu-HU"/>
-        </w:rPr>
-        <w:t xml:space="preserve"> </w:t>
-      </w:r>
-      <w:proofErr w:type="spellStart"/>
-      <w:r>
-        <w:rPr>
-          <w:rFonts w:ascii="JetBrains Mono" w:hAnsi="JetBrains Mono" w:cs="JetBrains Mono"/>
-          <w:sz w:val="14"/>
-          <w:szCs w:val="14"/>
-          <w:lang w:val="hu-HU"/>
-        </w:rPr>
-        <w:t>at</w:t>
-      </w:r>
-      <w:proofErr w:type="spellEnd"/>
-      <w:r>
-        <w:rPr>
-          <w:rFonts w:ascii="JetBrains Mono" w:hAnsi="JetBrains Mono" w:cs="JetBrains Mono"/>
-          <w:sz w:val="14"/>
-          <w:szCs w:val="14"/>
-          <w:lang w:val="hu-HU"/>
-        </w:rPr>
-        <w:t xml:space="preserve"> </w:t>
-      </w:r>
-      <w:proofErr w:type="spellStart"/>
-      <w:r>
-        <w:rPr>
-          <w:rFonts w:ascii="JetBrains Mono" w:hAnsi="JetBrains Mono" w:cs="JetBrains Mono"/>
-          <w:sz w:val="14"/>
-          <w:szCs w:val="14"/>
-          <w:lang w:val="hu-HU"/>
-        </w:rPr>
-        <w:t>the</w:t>
-      </w:r>
-      <w:proofErr w:type="spellEnd"/>
-      <w:r>
-        <w:rPr>
-          <w:rFonts w:ascii="JetBrains Mono" w:hAnsi="JetBrains Mono" w:cs="JetBrains Mono"/>
-          <w:sz w:val="14"/>
-          <w:szCs w:val="14"/>
-          <w:lang w:val="hu-HU"/>
-        </w:rPr>
-        <w:t xml:space="preserve"> University of Budapest. I am </w:t>
-      </w:r>
-      <w:proofErr w:type="spellStart"/>
-      <w:r>
-        <w:rPr>
-          <w:rFonts w:ascii="JetBrains Mono" w:hAnsi="JetBrains Mono" w:cs="JetBrains Mono"/>
-          <w:sz w:val="14"/>
-          <w:szCs w:val="14"/>
-          <w:lang w:val="hu-HU"/>
-        </w:rPr>
-        <w:t>studying</w:t>
-      </w:r>
-      <w:proofErr w:type="spellEnd"/>
-      <w:r>
-        <w:rPr>
-          <w:rFonts w:ascii="JetBrains Mono" w:hAnsi="JetBrains Mono" w:cs="JetBrains Mono"/>
-          <w:sz w:val="14"/>
-          <w:szCs w:val="14"/>
-          <w:lang w:val="hu-HU"/>
-        </w:rPr>
-        <w:t xml:space="preserve"> Computer Science. I like </w:t>
-      </w:r>
-      <w:proofErr w:type="spellStart"/>
-      <w:r>
-        <w:rPr>
-          <w:rFonts w:ascii="JetBrains Mono" w:hAnsi="JetBrains Mono" w:cs="JetBrains Mono"/>
-          <w:sz w:val="14"/>
-          <w:szCs w:val="14"/>
-          <w:lang w:val="hu-HU"/>
-        </w:rPr>
-        <w:t>to</w:t>
-      </w:r>
-      <w:proofErr w:type="spellEnd"/>
-      <w:r>
-        <w:rPr>
-          <w:rFonts w:ascii="JetBrains Mono" w:hAnsi="JetBrains Mono" w:cs="JetBrains Mono"/>
-          <w:sz w:val="14"/>
-          <w:szCs w:val="14"/>
-          <w:lang w:val="hu-HU"/>
-        </w:rPr>
-        <w:t xml:space="preserve"> play video </w:t>
-      </w:r>
-      <w:proofErr w:type="spellStart"/>
-      <w:r>
-        <w:rPr>
-          <w:rFonts w:ascii="JetBrains Mono" w:hAnsi="JetBrains Mono" w:cs="JetBrains Mono"/>
-          <w:sz w:val="14"/>
-          <w:szCs w:val="14"/>
-          <w:lang w:val="hu-HU"/>
-        </w:rPr>
-        <w:t>games</w:t>
-      </w:r>
-      <w:proofErr w:type="spellEnd"/>
-      <w:r>
-        <w:rPr>
-          <w:rFonts w:ascii="JetBrains Mono" w:hAnsi="JetBrains Mono" w:cs="JetBrains Mono"/>
-          <w:sz w:val="14"/>
-          <w:szCs w:val="14"/>
-          <w:lang w:val="hu-HU"/>
-        </w:rPr>
-        <w:t xml:space="preserve"> and I </w:t>
-      </w:r>
-      <w:proofErr w:type="spellStart"/>
-      <w:r>
-        <w:rPr>
-          <w:rFonts w:ascii="JetBrains Mono" w:hAnsi="JetBrains Mono" w:cs="JetBrains Mono"/>
-          <w:sz w:val="14"/>
-          <w:szCs w:val="14"/>
-          <w:lang w:val="hu-HU"/>
-        </w:rPr>
-        <w:t>also</w:t>
-      </w:r>
-      <w:proofErr w:type="spellEnd"/>
-      <w:r>
-        <w:rPr>
-          <w:rFonts w:ascii="JetBrains Mono" w:hAnsi="JetBrains Mono" w:cs="JetBrains Mono"/>
-          <w:sz w:val="14"/>
-          <w:szCs w:val="14"/>
-          <w:lang w:val="hu-HU"/>
-        </w:rPr>
-        <w:t xml:space="preserve"> like </w:t>
-      </w:r>
-      <w:proofErr w:type="spellStart"/>
-      <w:r>
-        <w:rPr>
-          <w:rFonts w:ascii="JetBrains Mono" w:hAnsi="JetBrains Mono" w:cs="JetBrains Mono"/>
-          <w:sz w:val="14"/>
-          <w:szCs w:val="14"/>
-          <w:lang w:val="hu-HU"/>
-        </w:rPr>
-        <w:t>to</w:t>
-      </w:r>
-      <w:proofErr w:type="spellEnd"/>
-      <w:r>
-        <w:rPr>
-          <w:rFonts w:ascii="JetBrains Mono" w:hAnsi="JetBrains Mono" w:cs="JetBrains Mono"/>
-          <w:sz w:val="14"/>
-          <w:szCs w:val="14"/>
-          <w:lang w:val="hu-HU"/>
-        </w:rPr>
-        <w:t xml:space="preserve"> </w:t>
-      </w:r>
-      <w:proofErr w:type="spellStart"/>
-      <w:r>
-        <w:rPr>
-          <w:rFonts w:ascii="JetBrains Mono" w:hAnsi="JetBrains Mono" w:cs="JetBrains Mono"/>
-          <w:sz w:val="14"/>
-          <w:szCs w:val="14"/>
-          <w:lang w:val="hu-HU"/>
-        </w:rPr>
-        <w:t>read</w:t>
-      </w:r>
-      <w:proofErr w:type="spellEnd"/>
-      <w:r>
-        <w:rPr>
-          <w:rFonts w:ascii="JetBrains Mono" w:hAnsi="JetBrains Mono" w:cs="JetBrains Mono"/>
-          <w:sz w:val="14"/>
-          <w:szCs w:val="14"/>
-          <w:lang w:val="hu-HU"/>
-        </w:rPr>
-        <w:t xml:space="preserve"> </w:t>
-      </w:r>
-      <w:proofErr w:type="spellStart"/>
-      <w:r>
-        <w:rPr>
-          <w:rFonts w:ascii="JetBrains Mono" w:hAnsi="JetBrains Mono" w:cs="JetBrains Mono"/>
-          <w:sz w:val="14"/>
-          <w:szCs w:val="14"/>
-          <w:lang w:val="hu-HU"/>
-        </w:rPr>
-        <w:t>books</w:t>
-      </w:r>
-      <w:proofErr w:type="spellEnd"/>
-      <w:r>
-        <w:rPr>
-          <w:rFonts w:ascii="JetBrains Mono" w:hAnsi="JetBrains Mono" w:cs="JetBrains Mono"/>
-          <w:sz w:val="14"/>
-          <w:szCs w:val="14"/>
-          <w:lang w:val="hu-HU"/>
-        </w:rPr>
-        <w:t>.",</w:t>
+        <w:ind w:left="1417"/>
+        <w:rPr>
+          <w:rFonts w:ascii="JetBrains Mono" w:hAnsi="JetBrains Mono" w:cs="JetBrains Mono"/>
+          <w:sz w:val="14"/>
+          <w:szCs w:val="14"/>
+          <w:lang w:val="hu-HU"/>
+        </w:rPr>
+      </w:pPr>
+      <w:r>
+        <w:rPr>
+          <w:rFonts w:ascii="JetBrains Mono" w:hAnsi="JetBrains Mono" w:cs="JetBrains Mono"/>
+          <w:sz w:val="14"/>
+          <w:szCs w:val="14"/>
+          <w:lang w:val="hu-HU"/>
+        </w:rPr>
+        <w:t xml:space="preserve">      "introduction": "I am a student at the University of Budapest. I am studying Computer Science. I like to play video games and I also like to read books.",</w:t>
       </w:r>
     </w:p>
     <w:p>
       <w:pPr>
         <w:spacing w:after="0"/>
-        <w:ind w:left="1587"/>
-        <w:rPr>
-          <w:rFonts w:ascii="JetBrains Mono" w:hAnsi="JetBrains Mono" w:cs="JetBrains Mono"/>
-          <w:sz w:val="14"/>
-          <w:szCs w:val="14"/>
-          <w:lang w:val="hu-HU"/>
-        </w:rPr>
-      </w:pPr>
-      <w:r>
-        <w:rPr>
-          <w:rFonts w:ascii="JetBrains Mono" w:hAnsi="JetBrains Mono" w:cs="JetBrains Mono"/>
-          <w:sz w:val="14"/>
-          <w:szCs w:val="14"/>
-          <w:lang w:val="hu-HU"/>
-        </w:rPr>
-        <w:t>      "</w:t>
-      </w:r>
-      <w:proofErr w:type="spellStart"/>
-      <w:r>
-        <w:rPr>
-          <w:rFonts w:ascii="JetBrains Mono" w:hAnsi="JetBrains Mono" w:cs="JetBrains Mono"/>
-          <w:sz w:val="14"/>
-          <w:szCs w:val="14"/>
-          <w:lang w:val="hu-HU"/>
-        </w:rPr>
-        <w:t>coursePreferences</w:t>
-      </w:r>
-      <w:proofErr w:type="spellEnd"/>
-      <w:r>
-        <w:rPr>
-          <w:rFonts w:ascii="JetBrains Mono" w:hAnsi="JetBrains Mono" w:cs="JetBrains Mono"/>
-          <w:sz w:val="14"/>
-          <w:szCs w:val="14"/>
-          <w:lang w:val="hu-HU"/>
-        </w:rPr>
-        <w:t xml:space="preserve">": ["Visual </w:t>
-      </w:r>
-      <w:proofErr w:type="spellStart"/>
-      <w:r>
-        <w:rPr>
-          <w:rFonts w:ascii="JetBrains Mono" w:hAnsi="JetBrains Mono" w:cs="JetBrains Mono"/>
-          <w:sz w:val="14"/>
-          <w:szCs w:val="14"/>
-          <w:lang w:val="hu-HU"/>
-        </w:rPr>
-        <w:t>Learning</w:t>
-      </w:r>
-      <w:proofErr w:type="spellEnd"/>
-      <w:r>
-        <w:rPr>
-          <w:rFonts w:ascii="JetBrains Mono" w:hAnsi="JetBrains Mono" w:cs="JetBrains Mono"/>
-          <w:sz w:val="14"/>
-          <w:szCs w:val="14"/>
-          <w:lang w:val="hu-HU"/>
-        </w:rPr>
-        <w:t xml:space="preserve">", "No </w:t>
-      </w:r>
-      <w:proofErr w:type="spellStart"/>
-      <w:r>
-        <w:rPr>
-          <w:rFonts w:ascii="JetBrains Mono" w:hAnsi="JetBrains Mono" w:cs="JetBrains Mono"/>
-          <w:sz w:val="14"/>
-          <w:szCs w:val="14"/>
-          <w:lang w:val="hu-HU"/>
-        </w:rPr>
-        <w:t>homework</w:t>
-      </w:r>
-      <w:proofErr w:type="spellEnd"/>
-      <w:r>
-        <w:rPr>
-          <w:rFonts w:ascii="JetBrains Mono" w:hAnsi="JetBrains Mono" w:cs="JetBrains Mono"/>
-          <w:sz w:val="14"/>
-          <w:szCs w:val="14"/>
-          <w:lang w:val="hu-HU"/>
-        </w:rPr>
-        <w:t>", "</w:t>
-      </w:r>
-      <w:proofErr w:type="spellStart"/>
-      <w:r>
-        <w:rPr>
-          <w:rFonts w:ascii="JetBrains Mono" w:hAnsi="JetBrains Mono" w:cs="JetBrains Mono"/>
-          <w:sz w:val="14"/>
-          <w:szCs w:val="14"/>
-          <w:lang w:val="hu-HU"/>
-        </w:rPr>
-        <w:t>Flashcards</w:t>
-      </w:r>
-      <w:proofErr w:type="spellEnd"/>
-      <w:r>
-        <w:rPr>
-          <w:rFonts w:ascii="JetBrains Mono" w:hAnsi="JetBrains Mono" w:cs="JetBrains Mono"/>
-          <w:sz w:val="14"/>
-          <w:szCs w:val="14"/>
-          <w:lang w:val="hu-HU"/>
-        </w:rPr>
-        <w:t>"],</w:t>
+        <w:ind w:left="1417"/>
+        <w:rPr>
+          <w:rFonts w:ascii="JetBrains Mono" w:hAnsi="JetBrains Mono" w:cs="JetBrains Mono"/>
+          <w:sz w:val="14"/>
+          <w:szCs w:val="14"/>
+          <w:lang w:val="hu-HU"/>
+        </w:rPr>
+      </w:pPr>
+      <w:r>
+        <w:rPr>
+          <w:rFonts w:ascii="JetBrains Mono" w:hAnsi="JetBrains Mono" w:cs="JetBrains Mono"/>
+          <w:sz w:val="14"/>
+          <w:szCs w:val="14"/>
+          <w:lang w:val="hu-HU"/>
+        </w:rPr>
+        <w:t xml:space="preserve">      "coursePreferences": ["Visual Learning", "No homework", "Flashcards"],</w:t>
       </w:r>
     </w:p>
     <w:p>
       <w:pPr>
         <w:spacing w:after="0"/>
-        <w:ind w:left="1587"/>
-        <w:rPr>
-          <w:rFonts w:ascii="JetBrains Mono" w:hAnsi="JetBrains Mono" w:cs="JetBrains Mono"/>
-          <w:sz w:val="14"/>
-          <w:szCs w:val="14"/>
-          <w:lang w:val="hu-HU"/>
-        </w:rPr>
-      </w:pPr>
-      <w:r>
-        <w:rPr>
-          <w:rFonts w:ascii="JetBrains Mono" w:hAnsi="JetBrains Mono" w:cs="JetBrains Mono"/>
-          <w:sz w:val="14"/>
-          <w:szCs w:val="14"/>
-          <w:lang w:val="hu-HU"/>
-        </w:rPr>
-        <w:t>      "</w:t>
-      </w:r>
-      <w:proofErr w:type="spellStart"/>
-      <w:r>
-        <w:rPr>
-          <w:rFonts w:ascii="JetBrains Mono" w:hAnsi="JetBrains Mono" w:cs="JetBrains Mono"/>
-          <w:sz w:val="14"/>
-          <w:szCs w:val="14"/>
-          <w:lang w:val="hu-HU"/>
-        </w:rPr>
-        <w:t>spokenLanguages</w:t>
-      </w:r>
-      <w:proofErr w:type="spellEnd"/>
-      <w:r>
-        <w:rPr>
-          <w:rFonts w:ascii="JetBrains Mono" w:hAnsi="JetBrains Mono" w:cs="JetBrains Mono"/>
-          <w:sz w:val="14"/>
-          <w:szCs w:val="14"/>
-          <w:lang w:val="hu-HU"/>
-        </w:rPr>
-        <w:t>": ["English", "</w:t>
-      </w:r>
-      <w:proofErr w:type="spellStart"/>
-      <w:r>
-        <w:rPr>
-          <w:rFonts w:ascii="JetBrains Mono" w:hAnsi="JetBrains Mono" w:cs="JetBrains Mono"/>
-          <w:sz w:val="14"/>
-          <w:szCs w:val="14"/>
-          <w:lang w:val="hu-HU"/>
-        </w:rPr>
-        <w:t>Hungarian</w:t>
-      </w:r>
-      <w:proofErr w:type="spellEnd"/>
-      <w:r>
-        <w:rPr>
-          <w:rFonts w:ascii="JetBrains Mono" w:hAnsi="JetBrains Mono" w:cs="JetBrains Mono"/>
-          <w:sz w:val="14"/>
-          <w:szCs w:val="14"/>
-          <w:lang w:val="hu-HU"/>
-        </w:rPr>
-        <w:t>"]</w:t>
+        <w:ind w:left="1417"/>
+        <w:rPr>
+          <w:rFonts w:ascii="JetBrains Mono" w:hAnsi="JetBrains Mono" w:cs="JetBrains Mono"/>
+          <w:sz w:val="14"/>
+          <w:szCs w:val="14"/>
+          <w:lang w:val="hu-HU"/>
+        </w:rPr>
+      </w:pPr>
+      <w:r>
+        <w:rPr>
+          <w:rFonts w:ascii="JetBrains Mono" w:hAnsi="JetBrains Mono" w:cs="JetBrains Mono"/>
+          <w:sz w:val="14"/>
+          <w:szCs w:val="14"/>
+          <w:lang w:val="hu-HU"/>
+        </w:rPr>
+        <w:t xml:space="preserve">      "spokenLanguages": ["English", "Hungarian"]</w:t>
       </w:r>
     </w:p>
     <w:p>
       <w:pPr>
         <w:spacing w:after="0"/>
-        <w:ind w:left="1587"/>
-        <w:rPr>
-          <w:rFonts w:ascii="JetBrains Mono" w:hAnsi="JetBrains Mono" w:cs="JetBrains Mono"/>
-          <w:sz w:val="14"/>
-          <w:szCs w:val="14"/>
-          <w:lang w:val="hu-HU"/>
-        </w:rPr>
-      </w:pPr>
-      <w:r>
-        <w:rPr>
-          <w:rFonts w:ascii="JetBrains Mono" w:hAnsi="JetBrains Mono" w:cs="JetBrains Mono"/>
-          <w:sz w:val="14"/>
-          <w:szCs w:val="14"/>
-          <w:lang w:val="hu-HU"/>
-        </w:rPr>
-        <w:t>    },</w:t>
+        <w:ind w:left="1417"/>
+        <w:rPr>
+          <w:rFonts w:ascii="JetBrains Mono" w:hAnsi="JetBrains Mono" w:cs="JetBrains Mono"/>
+          <w:sz w:val="14"/>
+          <w:szCs w:val="14"/>
+          <w:lang w:val="hu-HU"/>
+        </w:rPr>
+      </w:pPr>
+      <w:r>
+        <w:rPr>
+          <w:rFonts w:ascii="JetBrains Mono" w:hAnsi="JetBrains Mono" w:cs="JetBrains Mono"/>
+          <w:sz w:val="14"/>
+          <w:szCs w:val="14"/>
+          <w:lang w:val="hu-HU"/>
+        </w:rPr>
+        <w:t xml:space="preserve">    },</w:t>
       </w:r>
     </w:p>
     <w:p>
       <w:pPr>
         <w:spacing w:after="0"/>
-        <w:ind w:left="1587"/>
-        <w:rPr>
-          <w:rFonts w:ascii="JetBrains Mono" w:hAnsi="JetBrains Mono" w:cs="JetBrains Mono"/>
-          <w:sz w:val="14"/>
-          <w:szCs w:val="14"/>
-          <w:lang w:val="hu-HU"/>
-        </w:rPr>
-      </w:pPr>
-      <w:r>
-        <w:rPr>
-          <w:rFonts w:ascii="JetBrains Mono" w:hAnsi="JetBrains Mono" w:cs="JetBrains Mono"/>
-          <w:sz w:val="14"/>
-          <w:szCs w:val="14"/>
-          <w:lang w:val="hu-HU"/>
-        </w:rPr>
-        <w:t>    "</w:t>
-      </w:r>
-      <w:proofErr w:type="spellStart"/>
-      <w:r>
-        <w:rPr>
-          <w:rFonts w:ascii="JetBrains Mono" w:hAnsi="JetBrains Mono" w:cs="JetBrains Mono"/>
-          <w:sz w:val="14"/>
-          <w:szCs w:val="14"/>
-          <w:lang w:val="hu-HU"/>
-        </w:rPr>
-        <w:t>appSettings</w:t>
-      </w:r>
-      <w:proofErr w:type="spellEnd"/>
-      <w:r>
-        <w:rPr>
-          <w:rFonts w:ascii="JetBrains Mono" w:hAnsi="JetBrains Mono" w:cs="JetBrains Mono"/>
-          <w:sz w:val="14"/>
-          <w:szCs w:val="14"/>
-          <w:lang w:val="hu-HU"/>
-        </w:rPr>
-        <w:t>": {</w:t>
+        <w:ind w:left="1417"/>
+        <w:rPr>
+          <w:rFonts w:ascii="JetBrains Mono" w:hAnsi="JetBrains Mono" w:cs="JetBrains Mono"/>
+          <w:sz w:val="14"/>
+          <w:szCs w:val="14"/>
+          <w:lang w:val="hu-HU"/>
+        </w:rPr>
+      </w:pPr>
+      <w:r>
+        <w:rPr>
+          <w:rFonts w:ascii="JetBrains Mono" w:hAnsi="JetBrains Mono" w:cs="JetBrains Mono"/>
+          <w:sz w:val="14"/>
+          <w:szCs w:val="14"/>
+          <w:lang w:val="hu-HU"/>
+        </w:rPr>
+        <w:t xml:space="preserve">    "appSettings": {</w:t>
       </w:r>
     </w:p>
     <w:p>
       <w:pPr>
         <w:spacing w:after="0"/>
-        <w:ind w:left="1587"/>
-        <w:rPr>
-          <w:rFonts w:ascii="JetBrains Mono" w:hAnsi="JetBrains Mono" w:cs="JetBrains Mono"/>
-          <w:sz w:val="14"/>
-          <w:szCs w:val="14"/>
-          <w:lang w:val="hu-HU"/>
-        </w:rPr>
-      </w:pPr>
-      <w:r>
-        <w:rPr>
-          <w:rFonts w:ascii="JetBrains Mono" w:hAnsi="JetBrains Mono" w:cs="JetBrains Mono"/>
-          <w:sz w:val="14"/>
-          <w:szCs w:val="14"/>
-          <w:lang w:val="hu-HU"/>
-        </w:rPr>
-        <w:t>      "</w:t>
-      </w:r>
-      <w:proofErr w:type="spellStart"/>
-      <w:r>
-        <w:rPr>
-          <w:rFonts w:ascii="JetBrains Mono" w:hAnsi="JetBrains Mono" w:cs="JetBrains Mono"/>
-          <w:sz w:val="14"/>
-          <w:szCs w:val="14"/>
-          <w:lang w:val="hu-HU"/>
-        </w:rPr>
-        <w:t>notifications</w:t>
-      </w:r>
-      <w:proofErr w:type="spellEnd"/>
-      <w:r>
-        <w:rPr>
-          <w:rFonts w:ascii="JetBrains Mono" w:hAnsi="JetBrains Mono" w:cs="JetBrains Mono"/>
-          <w:sz w:val="14"/>
-          <w:szCs w:val="14"/>
-          <w:lang w:val="hu-HU"/>
-        </w:rPr>
-        <w:t>": {</w:t>
+        <w:ind w:left="1417"/>
+        <w:rPr>
+          <w:rFonts w:ascii="JetBrains Mono" w:hAnsi="JetBrains Mono" w:cs="JetBrains Mono"/>
+          <w:sz w:val="14"/>
+          <w:szCs w:val="14"/>
+          <w:lang w:val="hu-HU"/>
+        </w:rPr>
+      </w:pPr>
+      <w:r>
+        <w:rPr>
+          <w:rFonts w:ascii="JetBrains Mono" w:hAnsi="JetBrains Mono" w:cs="JetBrains Mono"/>
+          <w:sz w:val="14"/>
+          <w:szCs w:val="14"/>
+          <w:lang w:val="hu-HU"/>
+        </w:rPr>
+        <w:t xml:space="preserve">      "notifications": {</w:t>
       </w:r>
     </w:p>
     <w:p>
       <w:pPr>
         <w:spacing w:after="0"/>
-        <w:ind w:left="1587"/>
-        <w:rPr>
-          <w:rFonts w:ascii="JetBrains Mono" w:hAnsi="JetBrains Mono" w:cs="JetBrains Mono"/>
-          <w:sz w:val="14"/>
-          <w:szCs w:val="14"/>
-          <w:lang w:val="hu-HU"/>
-        </w:rPr>
-      </w:pPr>
-      <w:r>
-        <w:rPr>
-          <w:rFonts w:ascii="JetBrains Mono" w:hAnsi="JetBrains Mono" w:cs="JetBrains Mono"/>
-          <w:sz w:val="14"/>
-          <w:szCs w:val="14"/>
-          <w:lang w:val="hu-HU"/>
-        </w:rPr>
-        <w:t>        "</w:t>
-      </w:r>
-      <w:proofErr w:type="spellStart"/>
-      <w:r>
-        <w:rPr>
-          <w:rFonts w:ascii="JetBrains Mono" w:hAnsi="JetBrains Mono" w:cs="JetBrains Mono"/>
-          <w:sz w:val="14"/>
-          <w:szCs w:val="14"/>
-          <w:lang w:val="hu-HU"/>
-        </w:rPr>
-        <w:t>notificationsEnabled</w:t>
-      </w:r>
-      <w:proofErr w:type="spellEnd"/>
-      <w:r>
-        <w:rPr>
-          <w:rFonts w:ascii="JetBrains Mono" w:hAnsi="JetBrains Mono" w:cs="JetBrains Mono"/>
-          <w:sz w:val="14"/>
-          <w:szCs w:val="14"/>
-          <w:lang w:val="hu-HU"/>
-        </w:rPr>
-        <w:t xml:space="preserve">": </w:t>
-      </w:r>
-      <w:proofErr w:type="spellStart"/>
-      <w:r>
-        <w:rPr>
-          <w:rFonts w:ascii="JetBrains Mono" w:hAnsi="JetBrains Mono" w:cs="JetBrains Mono"/>
-          <w:sz w:val="14"/>
-          <w:szCs w:val="14"/>
-          <w:lang w:val="hu-HU"/>
-        </w:rPr>
-        <w:t>true</w:t>
-      </w:r>
-      <w:proofErr w:type="spellEnd"/>
+        <w:ind w:left="1417"/>
+        <w:rPr>
+          <w:rFonts w:ascii="JetBrains Mono" w:hAnsi="JetBrains Mono" w:cs="JetBrains Mono"/>
+          <w:sz w:val="14"/>
+          <w:szCs w:val="14"/>
+          <w:lang w:val="hu-HU"/>
+        </w:rPr>
+      </w:pPr>
+      <w:r>
+        <w:rPr>
+          <w:rFonts w:ascii="JetBrains Mono" w:hAnsi="JetBrains Mono" w:cs="JetBrains Mono"/>
+          <w:sz w:val="14"/>
+          <w:szCs w:val="14"/>
+          <w:lang w:val="hu-HU"/>
+        </w:rPr>
+        <w:t xml:space="preserve">        "notificationsEnabled": true</w:t>
+      </w:r>
     </w:p>
     <w:p>
       <w:pPr>
         <w:spacing w:after="0"/>
-        <w:ind w:left="1587"/>
-        <w:rPr>
-          <w:rFonts w:ascii="JetBrains Mono" w:hAnsi="JetBrains Mono" w:cs="JetBrains Mono"/>
-          <w:sz w:val="14"/>
-          <w:szCs w:val="14"/>
-          <w:lang w:val="hu-HU"/>
-        </w:rPr>
-      </w:pPr>
-      <w:r>
-        <w:rPr>
-          <w:rFonts w:ascii="JetBrains Mono" w:hAnsi="JetBrains Mono" w:cs="JetBrains Mono"/>
-          <w:sz w:val="14"/>
-          <w:szCs w:val="14"/>
-          <w:lang w:val="hu-HU"/>
-        </w:rPr>
-        <w:t>      },</w:t>
+        <w:ind w:left="1417"/>
+        <w:rPr>
+          <w:rFonts w:ascii="JetBrains Mono" w:hAnsi="JetBrains Mono" w:cs="JetBrains Mono"/>
+          <w:sz w:val="14"/>
+          <w:szCs w:val="14"/>
+          <w:lang w:val="hu-HU"/>
+        </w:rPr>
+      </w:pPr>
+      <w:r>
+        <w:rPr>
+          <w:rFonts w:ascii="JetBrains Mono" w:hAnsi="JetBrains Mono" w:cs="JetBrains Mono"/>
+          <w:sz w:val="14"/>
+          <w:szCs w:val="14"/>
+          <w:lang w:val="hu-HU"/>
+        </w:rPr>
+        <w:t xml:space="preserve">      },</w:t>
       </w:r>
     </w:p>
     <w:p>
       <w:pPr>
         <w:spacing w:after="0"/>
-        <w:ind w:left="1587"/>
-        <w:rPr>
-          <w:rFonts w:ascii="JetBrains Mono" w:hAnsi="JetBrains Mono" w:cs="JetBrains Mono"/>
-          <w:sz w:val="14"/>
-          <w:szCs w:val="14"/>
-          <w:lang w:val="hu-HU"/>
-        </w:rPr>
-      </w:pPr>
-      <w:r>
-        <w:rPr>
-          <w:rFonts w:ascii="JetBrains Mono" w:hAnsi="JetBrains Mono" w:cs="JetBrains Mono"/>
-          <w:sz w:val="14"/>
-          <w:szCs w:val="14"/>
-          <w:lang w:val="hu-HU"/>
-        </w:rPr>
-        <w:t>      "</w:t>
-      </w:r>
-      <w:proofErr w:type="spellStart"/>
-      <w:r>
-        <w:rPr>
-          <w:rFonts w:ascii="JetBrains Mono" w:hAnsi="JetBrains Mono" w:cs="JetBrains Mono"/>
-          <w:sz w:val="14"/>
-          <w:szCs w:val="14"/>
-          <w:lang w:val="hu-HU"/>
-        </w:rPr>
-        <w:t>appLanguage</w:t>
-      </w:r>
-      <w:proofErr w:type="spellEnd"/>
-      <w:r>
-        <w:rPr>
-          <w:rFonts w:ascii="JetBrains Mono" w:hAnsi="JetBrains Mono" w:cs="JetBrains Mono"/>
-          <w:sz w:val="14"/>
-          <w:szCs w:val="14"/>
-          <w:lang w:val="hu-HU"/>
-        </w:rPr>
-        <w:t>": "</w:t>
-      </w:r>
-      <w:proofErr w:type="spellStart"/>
-      <w:r>
-        <w:rPr>
-          <w:rFonts w:ascii="JetBrains Mono" w:hAnsi="JetBrains Mono" w:cs="JetBrains Mono"/>
-          <w:sz w:val="14"/>
-          <w:szCs w:val="14"/>
-          <w:lang w:val="hu-HU"/>
-        </w:rPr>
-        <w:t>en</w:t>
-      </w:r>
-      <w:proofErr w:type="spellEnd"/>
-      <w:r>
-        <w:rPr>
-          <w:rFonts w:ascii="JetBrains Mono" w:hAnsi="JetBrains Mono" w:cs="JetBrains Mono"/>
-          <w:sz w:val="14"/>
-          <w:szCs w:val="14"/>
-          <w:lang w:val="hu-HU"/>
-        </w:rPr>
-        <w:t>",</w:t>
+        <w:ind w:left="1417"/>
+        <w:rPr>
+          <w:rFonts w:ascii="JetBrains Mono" w:hAnsi="JetBrains Mono" w:cs="JetBrains Mono"/>
+          <w:sz w:val="14"/>
+          <w:szCs w:val="14"/>
+          <w:lang w:val="hu-HU"/>
+        </w:rPr>
+      </w:pPr>
+      <w:r>
+        <w:rPr>
+          <w:rFonts w:ascii="JetBrains Mono" w:hAnsi="JetBrains Mono" w:cs="JetBrains Mono"/>
+          <w:sz w:val="14"/>
+          <w:szCs w:val="14"/>
+          <w:lang w:val="hu-HU"/>
+        </w:rPr>
+        <w:t xml:space="preserve">      "appLanguage": "en",</w:t>
       </w:r>
     </w:p>
     <w:p>
       <w:pPr>
         <w:spacing w:after="0"/>
-        <w:ind w:left="1587"/>
-        <w:rPr>
-          <w:rFonts w:ascii="JetBrains Mono" w:hAnsi="JetBrains Mono" w:cs="JetBrains Mono"/>
-          <w:sz w:val="14"/>
-          <w:szCs w:val="14"/>
-          <w:lang w:val="hu-HU"/>
-        </w:rPr>
-      </w:pPr>
-      <w:r>
-        <w:rPr>
-          <w:rFonts w:ascii="JetBrains Mono" w:hAnsi="JetBrains Mono" w:cs="JetBrains Mono"/>
-          <w:sz w:val="14"/>
-          <w:szCs w:val="14"/>
-          <w:lang w:val="hu-HU"/>
-        </w:rPr>
-        <w:t>      "</w:t>
-      </w:r>
-      <w:proofErr w:type="spellStart"/>
-      <w:r>
-        <w:rPr>
-          <w:rFonts w:ascii="JetBrains Mono" w:hAnsi="JetBrains Mono" w:cs="JetBrains Mono"/>
-          <w:sz w:val="14"/>
-          <w:szCs w:val="14"/>
-          <w:lang w:val="hu-HU"/>
-        </w:rPr>
-        <w:t>darkMode</w:t>
-      </w:r>
-      <w:proofErr w:type="spellEnd"/>
-      <w:r>
-        <w:rPr>
-          <w:rFonts w:ascii="JetBrains Mono" w:hAnsi="JetBrains Mono" w:cs="JetBrains Mono"/>
-          <w:sz w:val="14"/>
-          <w:szCs w:val="14"/>
-          <w:lang w:val="hu-HU"/>
-        </w:rPr>
-        <w:t xml:space="preserve">": </w:t>
-      </w:r>
-      <w:proofErr w:type="spellStart"/>
-      <w:r>
-        <w:rPr>
-          <w:rFonts w:ascii="JetBrains Mono" w:hAnsi="JetBrains Mono" w:cs="JetBrains Mono"/>
-          <w:sz w:val="14"/>
-          <w:szCs w:val="14"/>
-          <w:lang w:val="hu-HU"/>
-        </w:rPr>
-        <w:t>false</w:t>
-      </w:r>
-      <w:proofErr w:type="spellEnd"/>
-      <w:r>
-        <w:rPr>
-          <w:rFonts w:ascii="JetBrains Mono" w:hAnsi="JetBrains Mono" w:cs="JetBrains Mono"/>
-          <w:sz w:val="14"/>
-          <w:szCs w:val="14"/>
-          <w:lang w:val="hu-HU"/>
-        </w:rPr>
-        <w:t>,</w:t>
+        <w:ind w:left="1417"/>
+        <w:rPr>
+          <w:rFonts w:ascii="JetBrains Mono" w:hAnsi="JetBrains Mono" w:cs="JetBrains Mono"/>
+          <w:sz w:val="14"/>
+          <w:szCs w:val="14"/>
+          <w:lang w:val="hu-HU"/>
+        </w:rPr>
+      </w:pPr>
+      <w:r>
+        <w:rPr>
+          <w:rFonts w:ascii="JetBrains Mono" w:hAnsi="JetBrains Mono" w:cs="JetBrains Mono"/>
+          <w:sz w:val="14"/>
+          <w:szCs w:val="14"/>
+          <w:lang w:val="hu-HU"/>
+        </w:rPr>
+        <w:t xml:space="preserve">      "darkMode": false,</w:t>
       </w:r>
     </w:p>
     <w:p>
       <w:pPr>
         <w:spacing w:after="0"/>
-        <w:ind w:left="1587"/>
-        <w:rPr>
-          <w:rFonts w:ascii="JetBrains Mono" w:hAnsi="JetBrains Mono" w:cs="JetBrains Mono"/>
-          <w:sz w:val="14"/>
-          <w:szCs w:val="14"/>
-          <w:lang w:val="hu-HU"/>
-        </w:rPr>
-      </w:pPr>
-      <w:r>
-        <w:rPr>
-          <w:rFonts w:ascii="JetBrains Mono" w:hAnsi="JetBrains Mono" w:cs="JetBrains Mono"/>
-          <w:sz w:val="14"/>
-          <w:szCs w:val="14"/>
-          <w:lang w:val="hu-HU"/>
-        </w:rPr>
-        <w:t>      "</w:t>
-      </w:r>
-      <w:proofErr w:type="spellStart"/>
-      <w:r>
-        <w:rPr>
-          <w:rFonts w:ascii="JetBrains Mono" w:hAnsi="JetBrains Mono" w:cs="JetBrains Mono"/>
-          <w:sz w:val="14"/>
-          <w:szCs w:val="14"/>
-          <w:lang w:val="hu-HU"/>
-        </w:rPr>
-        <w:t>linkedToGoogleCalendar</w:t>
-      </w:r>
-      <w:proofErr w:type="spellEnd"/>
-      <w:r>
-        <w:rPr>
-          <w:rFonts w:ascii="JetBrains Mono" w:hAnsi="JetBrains Mono" w:cs="JetBrains Mono"/>
-          <w:sz w:val="14"/>
-          <w:szCs w:val="14"/>
-          <w:lang w:val="hu-HU"/>
-        </w:rPr>
-        <w:t xml:space="preserve">": </w:t>
-      </w:r>
-      <w:proofErr w:type="spellStart"/>
-      <w:r>
-        <w:rPr>
-          <w:rFonts w:ascii="JetBrains Mono" w:hAnsi="JetBrains Mono" w:cs="JetBrains Mono"/>
-          <w:sz w:val="14"/>
-          <w:szCs w:val="14"/>
-          <w:lang w:val="hu-HU"/>
-        </w:rPr>
-        <w:t>false</w:t>
-      </w:r>
-      <w:proofErr w:type="spellEnd"/>
+        <w:ind w:left="1417"/>
+        <w:rPr>
+          <w:rFonts w:ascii="JetBrains Mono" w:hAnsi="JetBrains Mono" w:cs="JetBrains Mono"/>
+          <w:sz w:val="14"/>
+          <w:szCs w:val="14"/>
+          <w:lang w:val="hu-HU"/>
+        </w:rPr>
+      </w:pPr>
+      <w:r>
+        <w:rPr>
+          <w:rFonts w:ascii="JetBrains Mono" w:hAnsi="JetBrains Mono" w:cs="JetBrains Mono"/>
+          <w:sz w:val="14"/>
+          <w:szCs w:val="14"/>
+          <w:lang w:val="hu-HU"/>
+        </w:rPr>
+        <w:t xml:space="preserve">      "linkedToGoogleCalendar": false</w:t>
+      </w:r>
     </w:p>
     <w:p>
       <w:pPr>
         <w:spacing w:after="0"/>
-        <w:ind w:left="1587"/>
-        <w:rPr>
-          <w:rFonts w:ascii="JetBrains Mono" w:hAnsi="JetBrains Mono" w:cs="JetBrains Mono"/>
-          <w:sz w:val="14"/>
-          <w:szCs w:val="14"/>
-          <w:lang w:val="hu-HU"/>
-        </w:rPr>
-      </w:pPr>
-      <w:r>
-        <w:rPr>
-          <w:rFonts w:ascii="JetBrains Mono" w:hAnsi="JetBrains Mono" w:cs="JetBrains Mono"/>
-          <w:sz w:val="14"/>
-          <w:szCs w:val="14"/>
-          <w:lang w:val="hu-HU"/>
-        </w:rPr>
-        <w:t>    }</w:t>
+        <w:ind w:left="1417"/>
+        <w:rPr>
+          <w:rFonts w:ascii="JetBrains Mono" w:hAnsi="JetBrains Mono" w:cs="JetBrains Mono"/>
+          <w:sz w:val="14"/>
+          <w:szCs w:val="14"/>
+          <w:lang w:val="hu-HU"/>
+        </w:rPr>
+      </w:pPr>
+      <w:r>
+        <w:rPr>
+          <w:rFonts w:ascii="JetBrains Mono" w:hAnsi="JetBrains Mono" w:cs="JetBrains Mono"/>
+          <w:sz w:val="14"/>
+          <w:szCs w:val="14"/>
+          <w:lang w:val="hu-HU"/>
+        </w:rPr>
+        <w:t xml:space="preserve">    }</w:t>
       </w:r>
     </w:p>
     <w:p>
       <w:pPr>
         <w:spacing w:after="0"/>
-        <w:ind w:left="1587"/>
-        <w:rPr>
-          <w:rFonts w:ascii="JetBrains Mono" w:hAnsi="JetBrains Mono" w:cs="JetBrains Mono"/>
-          <w:sz w:val="14"/>
-          <w:szCs w:val="14"/>
-          <w:lang w:val="hu-HU"/>
-        </w:rPr>
-      </w:pPr>
-      <w:r>
-        <w:rPr>
-          <w:rFonts w:ascii="JetBrains Mono" w:hAnsi="JetBrains Mono" w:cs="JetBrains Mono"/>
-          <w:sz w:val="14"/>
-          <w:szCs w:val="14"/>
-          <w:lang w:val="hu-HU"/>
-        </w:rPr>
-        <w:t>  }</w:t>
-      </w:r>
-    </w:p>
-    <w:p>
-      <w:pPr>
-        <w:spacing w:after="0"/>
-        <w:ind w:left="1587"/>
-        <w:rPr>
-          <w:rFonts w:ascii="JetBrains Mono" w:hAnsi="JetBrains Mono" w:cs="JetBrains Mono"/>
-          <w:sz w:val="14"/>
-          <w:szCs w:val="14"/>
-          <w:lang w:val="hu-HU"/>
-        </w:rPr>
-      </w:pPr>
-    </w:p>
-    <w:p>
-      <w:pPr>
-        <w:spacing w:after="0"/>
-        <w:ind w:left="1587"/>
-        <w:rPr>
-          <w:rFonts w:ascii="JetBrains Mono" w:hAnsi="JetBrains Mono" w:cs="JetBrains Mono"/>
-          <w:sz w:val="14"/>
-          <w:szCs w:val="14"/>
-          <w:lang w:val="hu-HU"/>
-        </w:rPr>
-      </w:pPr>
-      <w:r>
-        <w:rPr>
-          <w:rFonts w:ascii="JetBrains Mono" w:hAnsi="JetBrains Mono" w:cs="JetBrains Mono"/>
-          <w:sz w:val="14"/>
-          <w:szCs w:val="14"/>
-          <w:lang w:val="hu-HU"/>
-        </w:rPr>
-        <w:t>  }</w:t>
-      </w:r>
-    </w:p>
-    <w:p>
-      <w:pPr>
-        <w:spacing w:after="0"/>
-        <w:ind w:left="1587"/>
-        <w:rPr>
-          <w:rFonts w:ascii="JetBrains Mono" w:hAnsi="JetBrains Mono" w:cs="JetBrains Mono"/>
-          <w:sz w:val="14"/>
-          <w:szCs w:val="14"/>
-          <w:lang w:val="hu-HU"/>
-        </w:rPr>
-      </w:pPr>
-      <w:r>
-        <w:rPr>
-          <w:rFonts w:ascii="JetBrains Mono" w:hAnsi="JetBrains Mono" w:cs="JetBrains Mono"/>
-          <w:sz w:val="14"/>
-          <w:szCs w:val="14"/>
-          <w:lang w:val="hu-HU"/>
-        </w:rPr>
-        <w:t>}</w:t>
-      </w:r>
-    </w:p>
-    <w:p>
-      <w:pPr>
-        <w:spacing w:after="0"/>
+        <w:ind w:left="1417"/>
         <w:rPr>
           <w:rFonts w:ascii="JetBrains Mono" w:hAnsi="JetBrains Mono" w:cs="JetBrains Mono"/>
           <w:sz w:val="16"/>
@@ -12276,6 +9155,15 @@
           <w:docGrid w:linePitch="360"/>
         </w:sectPr>
       </w:pPr>
+      <w:r>
+        <w:rPr>
+          <w:rFonts w:ascii="JetBrains Mono" w:hAnsi="JetBrains Mono" w:cs="JetBrains Mono"/>
+          <w:sz w:val="14"/>
+          <w:szCs w:val="14"/>
+          <w:lang w:val="hu-HU"/>
+        </w:rPr>
+        <w:t xml:space="preserve">  }</w:t>
+      </w:r>
     </w:p>
     <w:p>
       <w:pPr>

</xml_diff>

<commit_message>
Backend - added course enrollment and enrollment management services and endpoints
</commit_message>
<xml_diff>
--- a/Dev docs/Software_Architecture_Document.docx
+++ b/Dev docs/Software_Architecture_Document.docx
@@ -7765,27 +7765,7 @@
           <w:szCs w:val="14"/>
           <w:lang w:val="hu-HU"/>
         </w:rPr>
-        <w:t xml:space="preserve">        "lessonPrice": </w:t>
-      </w:r>
-      <w:proofErr w:type="gramStart"/>
-      <w:r>
-        <w:rPr>
-          <w:rFonts w:ascii="JetBrains Mono" w:hAnsi="JetBrains Mono" w:cs="JetBrains Mono"/>
-          <w:sz w:val="14"/>
-          <w:szCs w:val="14"/>
-          <w:lang w:val="hu-HU"/>
-        </w:rPr>
-        <w:t>{ "</w:t>
-      </w:r>
-      <w:proofErr w:type="gramEnd"/>
-      <w:r>
-        <w:rPr>
-          <w:rFonts w:ascii="JetBrains Mono" w:hAnsi="JetBrains Mono" w:cs="JetBrains Mono"/>
-          <w:sz w:val="14"/>
-          <w:szCs w:val="14"/>
-          <w:lang w:val="hu-HU"/>
-        </w:rPr>
-        <w:t>amount": 0, "currency": "HUF" },</w:t>
+        <w:t>        "lessonPrice": { "amount": 0, "currency": "HUF" },</w:t>
       </w:r>
     </w:p>
     <w:p>
@@ -7985,27 +7965,7 @@
           <w:szCs w:val="14"/>
           <w:lang w:val="hu-HU"/>
         </w:rPr>
-        <w:t xml:space="preserve">        "lessonPrice": </w:t>
-      </w:r>
-      <w:proofErr w:type="gramStart"/>
-      <w:r>
-        <w:rPr>
-          <w:rFonts w:ascii="JetBrains Mono" w:hAnsi="JetBrains Mono" w:cs="JetBrains Mono"/>
-          <w:sz w:val="14"/>
-          <w:szCs w:val="14"/>
-          <w:lang w:val="hu-HU"/>
-        </w:rPr>
-        <w:t>{ "</w:t>
-      </w:r>
-      <w:proofErr w:type="gramEnd"/>
-      <w:r>
-        <w:rPr>
-          <w:rFonts w:ascii="JetBrains Mono" w:hAnsi="JetBrains Mono" w:cs="JetBrains Mono"/>
-          <w:sz w:val="14"/>
-          <w:szCs w:val="14"/>
-          <w:lang w:val="hu-HU"/>
-        </w:rPr>
-        <w:t>amount": 0, "currency": "HUF" },</w:t>
+        <w:t>        "lessonPrice": { "amount": 0, "currency": "HUF" },</w:t>
       </w:r>
     </w:p>
     <w:p>
@@ -9221,7 +9181,27 @@
           <w:sz w:val="28"/>
           <w:szCs w:val="28"/>
         </w:rPr>
-        <w:t>Teacher -&gt; Home:</w:t>
+        <w:t xml:space="preserve">Teacher -&gt; </w:t>
+      </w:r>
+      <w:r>
+        <w:rPr>
+          <w:rFonts w:ascii="Lexend" w:hAnsi="Lexend"/>
+          <w:b/>
+          <w:bCs/>
+          <w:sz w:val="28"/>
+          <w:szCs w:val="28"/>
+        </w:rPr>
+        <w:t>Course exploere</w:t>
+      </w:r>
+      <w:r>
+        <w:rPr>
+          <w:rFonts w:ascii="Lexend" w:hAnsi="Lexend"/>
+          <w:b/>
+          <w:bCs/>
+          <w:sz w:val="28"/>
+          <w:szCs w:val="28"/>
+        </w:rPr>
+        <w:t>:</w:t>
       </w:r>
     </w:p>
     <w:p>
@@ -9269,122 +9249,7 @@
           <w:sz w:val="22"/>
           <w:szCs w:val="22"/>
         </w:rPr>
-        <w:t>Active courses (max. 15)</w:t>
-      </w:r>
-    </w:p>
-    <w:p>
-      <w:pPr>
-        <w:pStyle w:val="Listaszerbekezds"/>
-        <w:numPr>
-          <w:ilvl w:val="2"/>
-          <w:numId w:val="10"/>
-        </w:numPr>
-        <w:spacing w:before="480" w:after="240"/>
-        <w:rPr>
-          <w:rFonts w:ascii="Lexend" w:hAnsi="Lexend"/>
-          <w:sz w:val="22"/>
-          <w:szCs w:val="22"/>
-        </w:rPr>
-      </w:pPr>
-      <w:r>
-        <w:rPr>
-          <w:rFonts w:ascii="Lexend" w:hAnsi="Lexend"/>
-          <w:sz w:val="22"/>
-          <w:szCs w:val="22"/>
-        </w:rPr>
-        <w:t>Next 5 events (depends on view)</w:t>
-      </w:r>
-    </w:p>
-    <w:p>
-      <w:pPr>
-        <w:pStyle w:val="Listaszerbekezds"/>
-        <w:numPr>
-          <w:ilvl w:val="2"/>
-          <w:numId w:val="10"/>
-        </w:numPr>
-        <w:spacing w:before="480" w:after="240"/>
-        <w:rPr>
-          <w:rFonts w:ascii="Lexend" w:hAnsi="Lexend"/>
-          <w:sz w:val="22"/>
-          <w:szCs w:val="22"/>
-        </w:rPr>
-      </w:pPr>
-      <w:r>
-        <w:rPr>
-          <w:rFonts w:ascii="Lexend" w:hAnsi="Lexend"/>
-          <w:sz w:val="22"/>
-          <w:szCs w:val="22"/>
-        </w:rPr>
-        <w:t>Grading queue (the oldest 5)</w:t>
-      </w:r>
-    </w:p>
-    <w:p>
-      <w:pPr>
-        <w:pStyle w:val="Listaszerbekezds"/>
-        <w:numPr>
-          <w:ilvl w:val="2"/>
-          <w:numId w:val="10"/>
-        </w:numPr>
-        <w:spacing w:before="480" w:after="240"/>
-        <w:rPr>
-          <w:rFonts w:ascii="Lexend" w:hAnsi="Lexend"/>
-          <w:sz w:val="22"/>
-          <w:szCs w:val="22"/>
-        </w:rPr>
-      </w:pPr>
-      <w:r>
-        <w:rPr>
-          <w:rFonts w:ascii="Lexend" w:hAnsi="Lexend"/>
-          <w:sz w:val="22"/>
-          <w:szCs w:val="22"/>
-        </w:rPr>
-        <w:t>New enrollments to be accepted (5)</w:t>
-      </w:r>
-    </w:p>
-    <w:p>
-      <w:pPr>
-        <w:pStyle w:val="Listaszerbekezds"/>
-        <w:numPr>
-          <w:ilvl w:val="2"/>
-          <w:numId w:val="10"/>
-        </w:numPr>
-        <w:spacing w:before="480" w:after="240"/>
-        <w:rPr>
-          <w:rFonts w:ascii="Lexend" w:hAnsi="Lexend"/>
-          <w:sz w:val="22"/>
-          <w:szCs w:val="22"/>
-        </w:rPr>
-      </w:pPr>
-      <w:r>
-        <w:rPr>
-          <w:rFonts w:ascii="Lexend" w:hAnsi="Lexend"/>
-          <w:sz w:val="22"/>
-          <w:szCs w:val="22"/>
-        </w:rPr>
-        <w:t>New payments to be accepted (5)</w:t>
-      </w:r>
-    </w:p>
-    <w:p>
-      <w:pPr>
-        <w:pStyle w:val="Listaszerbekezds"/>
-        <w:numPr>
-          <w:ilvl w:val="2"/>
-          <w:numId w:val="10"/>
-        </w:numPr>
-        <w:spacing w:before="480" w:after="240"/>
-        <w:rPr>
-          <w:rFonts w:ascii="Lexend" w:hAnsi="Lexend"/>
-          <w:sz w:val="22"/>
-          <w:szCs w:val="22"/>
-        </w:rPr>
-      </w:pPr>
-      <w:r>
-        <w:rPr>
-          <w:rFonts w:ascii="Lexend" w:hAnsi="Lexend"/>
-          <w:sz w:val="22"/>
-          <w:szCs w:val="22"/>
-        </w:rPr>
-        <w:t>Notifications</w:t>
+        <w:t>Active courses</w:t>
       </w:r>
     </w:p>
     <w:p>
@@ -9753,6 +9618,7 @@
           <w:szCs w:val="14"/>
           <w:lang w:val="hu-HU"/>
         </w:rPr>
+        <w:lastRenderedPageBreak/>
         <w:t>    "upcomingEvents": [</w:t>
       </w:r>
     </w:p>
@@ -11467,154 +11333,154 @@
           <w:szCs w:val="14"/>
           <w:lang w:val="hu-HU"/>
         </w:rPr>
+        <w:t>      "userId": "uuid",</w:t>
+      </w:r>
+    </w:p>
+    <w:p>
+      <w:pPr>
+        <w:spacing w:after="0"/>
+        <w:ind w:left="1417"/>
+        <w:rPr>
+          <w:rFonts w:ascii="JetBrains Mono" w:hAnsi="JetBrains Mono" w:cs="JetBrains Mono"/>
+          <w:sz w:val="14"/>
+          <w:szCs w:val="14"/>
+          <w:lang w:val="hu-HU"/>
+        </w:rPr>
+      </w:pPr>
+      <w:r>
+        <w:rPr>
+          <w:rFonts w:ascii="JetBrains Mono" w:hAnsi="JetBrains Mono" w:cs="JetBrains Mono"/>
+          <w:sz w:val="14"/>
+          <w:szCs w:val="14"/>
+          <w:lang w:val="hu-HU"/>
+        </w:rPr>
+        <w:t>      "fullName": "Szakács Máté",</w:t>
+      </w:r>
+    </w:p>
+    <w:p>
+      <w:pPr>
+        <w:spacing w:after="0"/>
+        <w:ind w:left="1417"/>
+        <w:rPr>
+          <w:rFonts w:ascii="JetBrains Mono" w:hAnsi="JetBrains Mono" w:cs="JetBrains Mono"/>
+          <w:sz w:val="14"/>
+          <w:szCs w:val="14"/>
+          <w:lang w:val="hu-HU"/>
+        </w:rPr>
+      </w:pPr>
+      <w:r>
+        <w:rPr>
+          <w:rFonts w:ascii="JetBrains Mono" w:hAnsi="JetBrains Mono" w:cs="JetBrains Mono"/>
+          <w:sz w:val="14"/>
+          <w:szCs w:val="14"/>
+          <w:lang w:val="hu-HU"/>
+        </w:rPr>
+        <w:t>      "nickName": "Matthias",</w:t>
+      </w:r>
+    </w:p>
+    <w:p>
+      <w:pPr>
+        <w:spacing w:after="0"/>
+        <w:ind w:left="1417"/>
+        <w:rPr>
+          <w:rFonts w:ascii="JetBrains Mono" w:hAnsi="JetBrains Mono" w:cs="JetBrains Mono"/>
+          <w:sz w:val="14"/>
+          <w:szCs w:val="14"/>
+          <w:lang w:val="hu-HU"/>
+        </w:rPr>
+      </w:pPr>
+      <w:r>
+        <w:rPr>
+          <w:rFonts w:ascii="JetBrains Mono" w:hAnsi="JetBrains Mono" w:cs="JetBrains Mono"/>
+          <w:sz w:val="14"/>
+          <w:szCs w:val="14"/>
+          <w:lang w:val="hu-HU"/>
+        </w:rPr>
+        <w:t>      "email": "szak@gmail.com",</w:t>
+      </w:r>
+    </w:p>
+    <w:p>
+      <w:pPr>
+        <w:spacing w:after="0"/>
+        <w:ind w:left="1417"/>
+        <w:rPr>
+          <w:rFonts w:ascii="JetBrains Mono" w:hAnsi="JetBrains Mono" w:cs="JetBrains Mono"/>
+          <w:sz w:val="14"/>
+          <w:szCs w:val="14"/>
+          <w:lang w:val="hu-HU"/>
+        </w:rPr>
+      </w:pPr>
+      <w:r>
+        <w:rPr>
+          <w:rFonts w:ascii="JetBrains Mono" w:hAnsi="JetBrains Mono" w:cs="JetBrains Mono"/>
+          <w:sz w:val="14"/>
+          <w:szCs w:val="14"/>
+          <w:lang w:val="hu-HU"/>
+        </w:rPr>
+        <w:t>      "phoneNumber": "123456789",</w:t>
+      </w:r>
+    </w:p>
+    <w:p>
+      <w:pPr>
+        <w:spacing w:after="0"/>
+        <w:ind w:left="1417"/>
+        <w:rPr>
+          <w:rFonts w:ascii="JetBrains Mono" w:hAnsi="JetBrains Mono" w:cs="JetBrains Mono"/>
+          <w:sz w:val="14"/>
+          <w:szCs w:val="14"/>
+          <w:lang w:val="hu-HU"/>
+        </w:rPr>
+      </w:pPr>
+      <w:r>
+        <w:rPr>
+          <w:rFonts w:ascii="JetBrains Mono" w:hAnsi="JetBrains Mono" w:cs="JetBrains Mono"/>
+          <w:sz w:val="14"/>
+          <w:szCs w:val="14"/>
+          <w:lang w:val="hu-HU"/>
+        </w:rPr>
+        <w:t>      "address": "Erzsébet utca 10.",</w:t>
+      </w:r>
+    </w:p>
+    <w:p>
+      <w:pPr>
+        <w:spacing w:after="0"/>
+        <w:ind w:left="1417"/>
+        <w:rPr>
+          <w:rFonts w:ascii="JetBrains Mono" w:hAnsi="JetBrains Mono" w:cs="JetBrains Mono"/>
+          <w:sz w:val="14"/>
+          <w:szCs w:val="14"/>
+          <w:lang w:val="hu-HU"/>
+        </w:rPr>
+      </w:pPr>
+      <w:r>
+        <w:rPr>
+          <w:rFonts w:ascii="JetBrains Mono" w:hAnsi="JetBrains Mono" w:cs="JetBrains Mono"/>
+          <w:sz w:val="14"/>
+          <w:szCs w:val="14"/>
+          <w:lang w:val="hu-HU"/>
+        </w:rPr>
+        <w:t>      "city": "Budapest",</w:t>
+      </w:r>
+    </w:p>
+    <w:p>
+      <w:pPr>
+        <w:spacing w:after="0"/>
+        <w:ind w:left="1417"/>
+        <w:rPr>
+          <w:rFonts w:ascii="JetBrains Mono" w:hAnsi="JetBrains Mono" w:cs="JetBrains Mono"/>
+          <w:sz w:val="14"/>
+          <w:szCs w:val="14"/>
+          <w:lang w:val="hu-HU"/>
+        </w:rPr>
+      </w:pPr>
+      <w:r>
+        <w:rPr>
+          <w:rFonts w:ascii="JetBrains Mono" w:hAnsi="JetBrains Mono" w:cs="JetBrains Mono"/>
+          <w:sz w:val="14"/>
+          <w:szCs w:val="14"/>
+          <w:lang w:val="hu-HU"/>
+        </w:rPr>
         <w:lastRenderedPageBreak/>
-        <w:t>      "userId": "uuid",</w:t>
-      </w:r>
-    </w:p>
-    <w:p>
-      <w:pPr>
-        <w:spacing w:after="0"/>
-        <w:ind w:left="1417"/>
-        <w:rPr>
-          <w:rFonts w:ascii="JetBrains Mono" w:hAnsi="JetBrains Mono" w:cs="JetBrains Mono"/>
-          <w:sz w:val="14"/>
-          <w:szCs w:val="14"/>
-          <w:lang w:val="hu-HU"/>
-        </w:rPr>
-      </w:pPr>
-      <w:r>
-        <w:rPr>
-          <w:rFonts w:ascii="JetBrains Mono" w:hAnsi="JetBrains Mono" w:cs="JetBrains Mono"/>
-          <w:sz w:val="14"/>
-          <w:szCs w:val="14"/>
-          <w:lang w:val="hu-HU"/>
-        </w:rPr>
-        <w:t>      "fullName": "Szakács Máté",</w:t>
-      </w:r>
-    </w:p>
-    <w:p>
-      <w:pPr>
-        <w:spacing w:after="0"/>
-        <w:ind w:left="1417"/>
-        <w:rPr>
-          <w:rFonts w:ascii="JetBrains Mono" w:hAnsi="JetBrains Mono" w:cs="JetBrains Mono"/>
-          <w:sz w:val="14"/>
-          <w:szCs w:val="14"/>
-          <w:lang w:val="hu-HU"/>
-        </w:rPr>
-      </w:pPr>
-      <w:r>
-        <w:rPr>
-          <w:rFonts w:ascii="JetBrains Mono" w:hAnsi="JetBrains Mono" w:cs="JetBrains Mono"/>
-          <w:sz w:val="14"/>
-          <w:szCs w:val="14"/>
-          <w:lang w:val="hu-HU"/>
-        </w:rPr>
-        <w:t>      "nickName": "Matthias",</w:t>
-      </w:r>
-    </w:p>
-    <w:p>
-      <w:pPr>
-        <w:spacing w:after="0"/>
-        <w:ind w:left="1417"/>
-        <w:rPr>
-          <w:rFonts w:ascii="JetBrains Mono" w:hAnsi="JetBrains Mono" w:cs="JetBrains Mono"/>
-          <w:sz w:val="14"/>
-          <w:szCs w:val="14"/>
-          <w:lang w:val="hu-HU"/>
-        </w:rPr>
-      </w:pPr>
-      <w:r>
-        <w:rPr>
-          <w:rFonts w:ascii="JetBrains Mono" w:hAnsi="JetBrains Mono" w:cs="JetBrains Mono"/>
-          <w:sz w:val="14"/>
-          <w:szCs w:val="14"/>
-          <w:lang w:val="hu-HU"/>
-        </w:rPr>
-        <w:t>      "email": "szak@gmail.com",</w:t>
-      </w:r>
-    </w:p>
-    <w:p>
-      <w:pPr>
-        <w:spacing w:after="0"/>
-        <w:ind w:left="1417"/>
-        <w:rPr>
-          <w:rFonts w:ascii="JetBrains Mono" w:hAnsi="JetBrains Mono" w:cs="JetBrains Mono"/>
-          <w:sz w:val="14"/>
-          <w:szCs w:val="14"/>
-          <w:lang w:val="hu-HU"/>
-        </w:rPr>
-      </w:pPr>
-      <w:r>
-        <w:rPr>
-          <w:rFonts w:ascii="JetBrains Mono" w:hAnsi="JetBrains Mono" w:cs="JetBrains Mono"/>
-          <w:sz w:val="14"/>
-          <w:szCs w:val="14"/>
-          <w:lang w:val="hu-HU"/>
-        </w:rPr>
-        <w:t>      "phoneNumber": "123456789",</w:t>
-      </w:r>
-    </w:p>
-    <w:p>
-      <w:pPr>
-        <w:spacing w:after="0"/>
-        <w:ind w:left="1417"/>
-        <w:rPr>
-          <w:rFonts w:ascii="JetBrains Mono" w:hAnsi="JetBrains Mono" w:cs="JetBrains Mono"/>
-          <w:sz w:val="14"/>
-          <w:szCs w:val="14"/>
-          <w:lang w:val="hu-HU"/>
-        </w:rPr>
-      </w:pPr>
-      <w:r>
-        <w:rPr>
-          <w:rFonts w:ascii="JetBrains Mono" w:hAnsi="JetBrains Mono" w:cs="JetBrains Mono"/>
-          <w:sz w:val="14"/>
-          <w:szCs w:val="14"/>
-          <w:lang w:val="hu-HU"/>
-        </w:rPr>
-        <w:t>      "address": "Erzsébet utca 10.",</w:t>
-      </w:r>
-    </w:p>
-    <w:p>
-      <w:pPr>
-        <w:spacing w:after="0"/>
-        <w:ind w:left="1417"/>
-        <w:rPr>
-          <w:rFonts w:ascii="JetBrains Mono" w:hAnsi="JetBrains Mono" w:cs="JetBrains Mono"/>
-          <w:sz w:val="14"/>
-          <w:szCs w:val="14"/>
-          <w:lang w:val="hu-HU"/>
-        </w:rPr>
-      </w:pPr>
-      <w:r>
-        <w:rPr>
-          <w:rFonts w:ascii="JetBrains Mono" w:hAnsi="JetBrains Mono" w:cs="JetBrains Mono"/>
-          <w:sz w:val="14"/>
-          <w:szCs w:val="14"/>
-          <w:lang w:val="hu-HU"/>
-        </w:rPr>
-        <w:t>      "city": "Budapest",</w:t>
-      </w:r>
-    </w:p>
-    <w:p>
-      <w:pPr>
-        <w:spacing w:after="0"/>
-        <w:ind w:left="1417"/>
-        <w:rPr>
-          <w:rFonts w:ascii="JetBrains Mono" w:hAnsi="JetBrains Mono" w:cs="JetBrains Mono"/>
-          <w:sz w:val="14"/>
-          <w:szCs w:val="14"/>
-          <w:lang w:val="hu-HU"/>
-        </w:rPr>
-      </w:pPr>
-      <w:r>
-        <w:rPr>
-          <w:rFonts w:ascii="JetBrains Mono" w:hAnsi="JetBrains Mono" w:cs="JetBrains Mono"/>
-          <w:sz w:val="14"/>
-          <w:szCs w:val="14"/>
-          <w:lang w:val="hu-HU"/>
-        </w:rPr>
         <w:t>      "country": "Hungary",</w:t>
       </w:r>
     </w:p>
@@ -11961,6 +11827,1840 @@
           <w:lang w:val="hu-HU"/>
         </w:rPr>
       </w:pPr>
+    </w:p>
+    <w:p>
+      <w:pPr>
+        <w:pStyle w:val="Listaszerbekezds"/>
+        <w:numPr>
+          <w:ilvl w:val="0"/>
+          <w:numId w:val="10"/>
+        </w:numPr>
+        <w:spacing w:before="480" w:after="240"/>
+        <w:rPr>
+          <w:rFonts w:ascii="Lexend" w:hAnsi="Lexend"/>
+          <w:sz w:val="22"/>
+          <w:szCs w:val="22"/>
+        </w:rPr>
+      </w:pPr>
+      <w:r>
+        <w:rPr>
+          <w:rFonts w:ascii="Lexend" w:hAnsi="Lexend"/>
+          <w:b/>
+          <w:bCs/>
+          <w:sz w:val="28"/>
+          <w:szCs w:val="28"/>
+        </w:rPr>
+        <w:t>Student -&gt; Home:</w:t>
+      </w:r>
+    </w:p>
+    <w:p>
+      <w:pPr>
+        <w:pStyle w:val="Listaszerbekezds"/>
+        <w:numPr>
+          <w:ilvl w:val="1"/>
+          <w:numId w:val="10"/>
+        </w:numPr>
+        <w:spacing w:before="480" w:after="240"/>
+        <w:rPr>
+          <w:rFonts w:ascii="Lexend" w:hAnsi="Lexend"/>
+          <w:sz w:val="22"/>
+          <w:szCs w:val="22"/>
+        </w:rPr>
+      </w:pPr>
+      <w:r>
+        <w:rPr>
+          <w:rFonts w:ascii="Lexend" w:hAnsi="Lexend"/>
+          <w:b/>
+          <w:bCs/>
+          <w:sz w:val="22"/>
+          <w:szCs w:val="22"/>
+        </w:rPr>
+        <w:t>Data needed:</w:t>
+      </w:r>
+    </w:p>
+    <w:p>
+      <w:pPr>
+        <w:pStyle w:val="Listaszerbekezds"/>
+        <w:numPr>
+          <w:ilvl w:val="2"/>
+          <w:numId w:val="10"/>
+        </w:numPr>
+        <w:spacing w:before="480" w:after="240"/>
+        <w:rPr>
+          <w:rFonts w:ascii="Lexend" w:hAnsi="Lexend"/>
+          <w:sz w:val="22"/>
+          <w:szCs w:val="22"/>
+        </w:rPr>
+      </w:pPr>
+      <w:r>
+        <w:rPr>
+          <w:rFonts w:ascii="Lexend" w:hAnsi="Lexend"/>
+          <w:sz w:val="22"/>
+          <w:szCs w:val="22"/>
+        </w:rPr>
+        <w:t>Active and completed courses (5-5)</w:t>
+      </w:r>
+    </w:p>
+    <w:p>
+      <w:pPr>
+        <w:pStyle w:val="Listaszerbekezds"/>
+        <w:numPr>
+          <w:ilvl w:val="2"/>
+          <w:numId w:val="10"/>
+        </w:numPr>
+        <w:spacing w:before="480" w:after="240"/>
+        <w:rPr>
+          <w:rFonts w:ascii="Lexend" w:hAnsi="Lexend"/>
+          <w:sz w:val="22"/>
+          <w:szCs w:val="22"/>
+        </w:rPr>
+      </w:pPr>
+      <w:r>
+        <w:rPr>
+          <w:rFonts w:ascii="Lexend" w:hAnsi="Lexend"/>
+          <w:sz w:val="22"/>
+          <w:szCs w:val="22"/>
+        </w:rPr>
+        <w:t>Next 5 events</w:t>
+      </w:r>
+    </w:p>
+    <w:p>
+      <w:pPr>
+        <w:pStyle w:val="Listaszerbekezds"/>
+        <w:numPr>
+          <w:ilvl w:val="2"/>
+          <w:numId w:val="10"/>
+        </w:numPr>
+        <w:spacing w:before="480" w:after="240"/>
+        <w:rPr>
+          <w:rFonts w:ascii="Lexend" w:hAnsi="Lexend"/>
+          <w:sz w:val="22"/>
+          <w:szCs w:val="22"/>
+        </w:rPr>
+      </w:pPr>
+      <w:r>
+        <w:rPr>
+          <w:rFonts w:ascii="Lexend" w:hAnsi="Lexend"/>
+          <w:sz w:val="22"/>
+          <w:szCs w:val="22"/>
+        </w:rPr>
+        <w:t>Recommended Paths and Teachers (8-8)</w:t>
+      </w:r>
+    </w:p>
+    <w:p>
+      <w:pPr>
+        <w:pStyle w:val="Listaszerbekezds"/>
+        <w:numPr>
+          <w:ilvl w:val="2"/>
+          <w:numId w:val="10"/>
+        </w:numPr>
+        <w:spacing w:before="480" w:after="240"/>
+        <w:rPr>
+          <w:rFonts w:ascii="Lexend" w:hAnsi="Lexend"/>
+          <w:sz w:val="22"/>
+          <w:szCs w:val="22"/>
+        </w:rPr>
+      </w:pPr>
+      <w:r>
+        <w:rPr>
+          <w:rFonts w:ascii="Lexend" w:hAnsi="Lexend"/>
+          <w:sz w:val="22"/>
+          <w:szCs w:val="22"/>
+        </w:rPr>
+        <w:t>Notifications</w:t>
+      </w:r>
+    </w:p>
+    <w:p>
+      <w:pPr>
+        <w:pStyle w:val="Listaszerbekezds"/>
+        <w:numPr>
+          <w:ilvl w:val="1"/>
+          <w:numId w:val="10"/>
+        </w:numPr>
+        <w:spacing w:before="480" w:after="240"/>
+        <w:rPr>
+          <w:rFonts w:ascii="Lexend" w:hAnsi="Lexend"/>
+          <w:sz w:val="22"/>
+          <w:szCs w:val="22"/>
+        </w:rPr>
+      </w:pPr>
+      <w:r>
+        <w:rPr>
+          <w:rFonts w:ascii="Lexend" w:hAnsi="Lexend"/>
+          <w:sz w:val="22"/>
+          <w:szCs w:val="22"/>
+        </w:rPr>
+        <w:t xml:space="preserve">Endpoint: </w:t>
+      </w:r>
+      <w:r>
+        <w:rPr>
+          <w:rFonts w:ascii="JetBrains Mono" w:hAnsi="JetBrains Mono" w:cs="JetBrains Mono"/>
+          <w:sz w:val="22"/>
+          <w:szCs w:val="22"/>
+        </w:rPr>
+        <w:t>GET api/student/home</w:t>
+      </w:r>
+    </w:p>
+    <w:p>
+      <w:pPr>
+        <w:pStyle w:val="Listaszerbekezds"/>
+        <w:numPr>
+          <w:ilvl w:val="1"/>
+          <w:numId w:val="10"/>
+        </w:numPr>
+        <w:spacing w:before="480" w:after="240"/>
+        <w:rPr>
+          <w:rFonts w:ascii="Lexend" w:hAnsi="Lexend"/>
+          <w:sz w:val="20"/>
+          <w:szCs w:val="20"/>
+        </w:rPr>
+      </w:pPr>
+      <w:r>
+        <w:rPr>
+          <w:rFonts w:ascii="Lexend" w:hAnsi="Lexend"/>
+          <w:sz w:val="20"/>
+          <w:szCs w:val="20"/>
+        </w:rPr>
+        <w:t>Schema:</w:t>
+      </w:r>
+    </w:p>
+    <w:p>
+      <w:pPr>
+        <w:spacing w:after="0"/>
+        <w:rPr>
+          <w:rFonts w:ascii="JetBrains Mono" w:hAnsi="JetBrains Mono" w:cs="JetBrains Mono"/>
+          <w:sz w:val="14"/>
+          <w:szCs w:val="14"/>
+        </w:rPr>
+        <w:sectPr>
+          <w:type w:val="continuous"/>
+          <w:pgSz w:w="11906" w:h="16838"/>
+          <w:pgMar w:top="1417" w:right="1417" w:bottom="1417" w:left="1417" w:header="708" w:footer="708" w:gutter="0"/>
+          <w:cols w:space="708"/>
+          <w:docGrid w:linePitch="360"/>
+        </w:sectPr>
+      </w:pPr>
+    </w:p>
+    <w:p>
+      <w:pPr>
+        <w:spacing w:after="0"/>
+        <w:rPr>
+          <w:rFonts w:ascii="JetBrains Mono" w:hAnsi="JetBrains Mono" w:cs="JetBrains Mono"/>
+          <w:sz w:val="14"/>
+          <w:szCs w:val="14"/>
+          <w:lang w:val="hu-HU"/>
+        </w:rPr>
+      </w:pPr>
+      <w:r>
+        <w:rPr>
+          <w:rFonts w:ascii="JetBrains Mono" w:hAnsi="JetBrains Mono" w:cs="JetBrains Mono"/>
+          <w:sz w:val="14"/>
+          <w:szCs w:val="14"/>
+          <w:lang w:val="hu-HU"/>
+        </w:rPr>
+        <w:t>{</w:t>
+      </w:r>
+    </w:p>
+    <w:p>
+      <w:pPr>
+        <w:spacing w:after="0"/>
+        <w:rPr>
+          <w:rFonts w:ascii="JetBrains Mono" w:hAnsi="JetBrains Mono" w:cs="JetBrains Mono"/>
+          <w:sz w:val="14"/>
+          <w:szCs w:val="14"/>
+          <w:lang w:val="hu-HU"/>
+        </w:rPr>
+      </w:pPr>
+      <w:r>
+        <w:rPr>
+          <w:rFonts w:ascii="JetBrains Mono" w:hAnsi="JetBrains Mono" w:cs="JetBrains Mono"/>
+          <w:sz w:val="14"/>
+          <w:szCs w:val="14"/>
+          <w:lang w:val="hu-HU"/>
+        </w:rPr>
+        <w:t>    "attendedCourses": {</w:t>
+      </w:r>
+    </w:p>
+    <w:p>
+      <w:pPr>
+        <w:spacing w:after="0"/>
+        <w:rPr>
+          <w:rFonts w:ascii="JetBrains Mono" w:hAnsi="JetBrains Mono" w:cs="JetBrains Mono"/>
+          <w:sz w:val="14"/>
+          <w:szCs w:val="14"/>
+          <w:lang w:val="hu-HU"/>
+        </w:rPr>
+      </w:pPr>
+      <w:r>
+        <w:rPr>
+          <w:rFonts w:ascii="JetBrains Mono" w:hAnsi="JetBrains Mono" w:cs="JetBrains Mono"/>
+          <w:sz w:val="14"/>
+          <w:szCs w:val="14"/>
+          <w:lang w:val="hu-HU"/>
+        </w:rPr>
+        <w:t>      "active": [</w:t>
+      </w:r>
+    </w:p>
+    <w:p>
+      <w:pPr>
+        <w:spacing w:after="0"/>
+        <w:rPr>
+          <w:rFonts w:ascii="JetBrains Mono" w:hAnsi="JetBrains Mono" w:cs="JetBrains Mono"/>
+          <w:sz w:val="14"/>
+          <w:szCs w:val="14"/>
+          <w:lang w:val="hu-HU"/>
+        </w:rPr>
+      </w:pPr>
+      <w:r>
+        <w:rPr>
+          <w:rFonts w:ascii="JetBrains Mono" w:hAnsi="JetBrains Mono" w:cs="JetBrains Mono"/>
+          <w:sz w:val="14"/>
+          <w:szCs w:val="14"/>
+          <w:lang w:val="hu-HU"/>
+        </w:rPr>
+        <w:t>        {</w:t>
+      </w:r>
+    </w:p>
+    <w:p>
+      <w:pPr>
+        <w:spacing w:after="0"/>
+        <w:rPr>
+          <w:rFonts w:ascii="JetBrains Mono" w:hAnsi="JetBrains Mono" w:cs="JetBrains Mono"/>
+          <w:sz w:val="14"/>
+          <w:szCs w:val="14"/>
+          <w:lang w:val="hu-HU"/>
+        </w:rPr>
+      </w:pPr>
+      <w:r>
+        <w:rPr>
+          <w:rFonts w:ascii="JetBrains Mono" w:hAnsi="JetBrains Mono" w:cs="JetBrains Mono"/>
+          <w:sz w:val="14"/>
+          <w:szCs w:val="14"/>
+          <w:lang w:val="hu-HU"/>
+        </w:rPr>
+        <w:t>          "courseId": "uuid",</w:t>
+      </w:r>
+    </w:p>
+    <w:p>
+      <w:pPr>
+        <w:spacing w:after="0"/>
+        <w:rPr>
+          <w:rFonts w:ascii="JetBrains Mono" w:hAnsi="JetBrains Mono" w:cs="JetBrains Mono"/>
+          <w:sz w:val="14"/>
+          <w:szCs w:val="14"/>
+          <w:lang w:val="hu-HU"/>
+        </w:rPr>
+      </w:pPr>
+      <w:r>
+        <w:rPr>
+          <w:rFonts w:ascii="JetBrains Mono" w:hAnsi="JetBrains Mono" w:cs="JetBrains Mono"/>
+          <w:sz w:val="14"/>
+          <w:szCs w:val="14"/>
+          <w:lang w:val="hu-HU"/>
+        </w:rPr>
+        <w:t>          "instanceId": "uuid",</w:t>
+      </w:r>
+    </w:p>
+    <w:p>
+      <w:pPr>
+        <w:spacing w:after="0"/>
+        <w:rPr>
+          <w:rFonts w:ascii="JetBrains Mono" w:hAnsi="JetBrains Mono" w:cs="JetBrains Mono"/>
+          <w:sz w:val="14"/>
+          <w:szCs w:val="14"/>
+          <w:lang w:val="hu-HU"/>
+        </w:rPr>
+      </w:pPr>
+      <w:r>
+        <w:rPr>
+          <w:rFonts w:ascii="JetBrains Mono" w:hAnsi="JetBrains Mono" w:cs="JetBrains Mono"/>
+          <w:sz w:val="14"/>
+          <w:szCs w:val="14"/>
+          <w:lang w:val="hu-HU"/>
+        </w:rPr>
+        <w:t>          "courseName": "Calculus",</w:t>
+      </w:r>
+    </w:p>
+    <w:p>
+      <w:pPr>
+        <w:spacing w:after="0"/>
+        <w:rPr>
+          <w:rFonts w:ascii="JetBrains Mono" w:hAnsi="JetBrains Mono" w:cs="JetBrains Mono"/>
+          <w:sz w:val="14"/>
+          <w:szCs w:val="14"/>
+          <w:lang w:val="hu-HU"/>
+        </w:rPr>
+      </w:pPr>
+      <w:r>
+        <w:rPr>
+          <w:rFonts w:ascii="JetBrains Mono" w:hAnsi="JetBrains Mono" w:cs="JetBrains Mono"/>
+          <w:sz w:val="14"/>
+          <w:szCs w:val="14"/>
+          <w:lang w:val="hu-HU"/>
+        </w:rPr>
+        <w:t>          "imageUrl": "",</w:t>
+      </w:r>
+    </w:p>
+    <w:p>
+      <w:pPr>
+        <w:spacing w:after="0"/>
+        <w:rPr>
+          <w:rFonts w:ascii="JetBrains Mono" w:hAnsi="JetBrains Mono" w:cs="JetBrains Mono"/>
+          <w:sz w:val="14"/>
+          <w:szCs w:val="14"/>
+          <w:lang w:val="hu-HU"/>
+        </w:rPr>
+      </w:pPr>
+      <w:r>
+        <w:rPr>
+          <w:rFonts w:ascii="JetBrains Mono" w:hAnsi="JetBrains Mono" w:cs="JetBrains Mono"/>
+          <w:sz w:val="14"/>
+          <w:szCs w:val="14"/>
+          <w:lang w:val="hu-HU"/>
+        </w:rPr>
+        <w:t>          "teacherName": "Dr. John Doe",</w:t>
+      </w:r>
+    </w:p>
+    <w:p>
+      <w:pPr>
+        <w:spacing w:after="0"/>
+        <w:rPr>
+          <w:rFonts w:ascii="JetBrains Mono" w:hAnsi="JetBrains Mono" w:cs="JetBrains Mono"/>
+          <w:sz w:val="14"/>
+          <w:szCs w:val="14"/>
+          <w:lang w:val="hu-HU"/>
+        </w:rPr>
+      </w:pPr>
+      <w:r>
+        <w:rPr>
+          <w:rFonts w:ascii="JetBrains Mono" w:hAnsi="JetBrains Mono" w:cs="JetBrains Mono"/>
+          <w:sz w:val="14"/>
+          <w:szCs w:val="14"/>
+          <w:lang w:val="hu-HU"/>
+        </w:rPr>
+        <w:t>          "courseType": "tutoring",</w:t>
+      </w:r>
+    </w:p>
+    <w:p>
+      <w:pPr>
+        <w:spacing w:after="0"/>
+        <w:rPr>
+          <w:rFonts w:ascii="JetBrains Mono" w:hAnsi="JetBrains Mono" w:cs="JetBrains Mono"/>
+          <w:sz w:val="14"/>
+          <w:szCs w:val="14"/>
+          <w:lang w:val="hu-HU"/>
+        </w:rPr>
+      </w:pPr>
+      <w:r>
+        <w:rPr>
+          <w:rFonts w:ascii="JetBrains Mono" w:hAnsi="JetBrains Mono" w:cs="JetBrains Mono"/>
+          <w:sz w:val="14"/>
+          <w:szCs w:val="14"/>
+          <w:lang w:val="hu-HU"/>
+        </w:rPr>
+        <w:t>          "progress": 15,</w:t>
+      </w:r>
+    </w:p>
+    <w:p>
+      <w:pPr>
+        <w:spacing w:after="0"/>
+        <w:rPr>
+          <w:rFonts w:ascii="JetBrains Mono" w:hAnsi="JetBrains Mono" w:cs="JetBrains Mono"/>
+          <w:sz w:val="14"/>
+          <w:szCs w:val="14"/>
+          <w:lang w:val="hu-HU"/>
+        </w:rPr>
+      </w:pPr>
+      <w:r>
+        <w:rPr>
+          <w:rFonts w:ascii="JetBrains Mono" w:hAnsi="JetBrains Mono" w:cs="JetBrains Mono"/>
+          <w:sz w:val="14"/>
+          <w:szCs w:val="14"/>
+          <w:lang w:val="hu-HU"/>
+        </w:rPr>
+        <w:t>          "upcomingEvents": [</w:t>
+      </w:r>
+    </w:p>
+    <w:p>
+      <w:pPr>
+        <w:spacing w:after="0"/>
+        <w:rPr>
+          <w:rFonts w:ascii="JetBrains Mono" w:hAnsi="JetBrains Mono" w:cs="JetBrains Mono"/>
+          <w:sz w:val="14"/>
+          <w:szCs w:val="14"/>
+          <w:lang w:val="hu-HU"/>
+        </w:rPr>
+      </w:pPr>
+      <w:r>
+        <w:rPr>
+          <w:rFonts w:ascii="JetBrains Mono" w:hAnsi="JetBrains Mono" w:cs="JetBrains Mono"/>
+          <w:sz w:val="14"/>
+          <w:szCs w:val="14"/>
+          <w:lang w:val="hu-HU"/>
+        </w:rPr>
+        <w:t>            {</w:t>
+      </w:r>
+    </w:p>
+    <w:p>
+      <w:pPr>
+        <w:spacing w:after="0"/>
+        <w:rPr>
+          <w:rFonts w:ascii="JetBrains Mono" w:hAnsi="JetBrains Mono" w:cs="JetBrains Mono"/>
+          <w:sz w:val="14"/>
+          <w:szCs w:val="14"/>
+          <w:lang w:val="hu-HU"/>
+        </w:rPr>
+      </w:pPr>
+      <w:r>
+        <w:rPr>
+          <w:rFonts w:ascii="JetBrains Mono" w:hAnsi="JetBrains Mono" w:cs="JetBrains Mono"/>
+          <w:sz w:val="14"/>
+          <w:szCs w:val="14"/>
+          <w:lang w:val="hu-HU"/>
+        </w:rPr>
+        <w:t>              "eventId": "uuid",</w:t>
+      </w:r>
+    </w:p>
+    <w:p>
+      <w:pPr>
+        <w:spacing w:after="0"/>
+        <w:rPr>
+          <w:rFonts w:ascii="JetBrains Mono" w:hAnsi="JetBrains Mono" w:cs="JetBrains Mono"/>
+          <w:sz w:val="14"/>
+          <w:szCs w:val="14"/>
+          <w:lang w:val="hu-HU"/>
+        </w:rPr>
+      </w:pPr>
+      <w:r>
+        <w:rPr>
+          <w:rFonts w:ascii="JetBrains Mono" w:hAnsi="JetBrains Mono" w:cs="JetBrains Mono"/>
+          <w:sz w:val="14"/>
+          <w:szCs w:val="14"/>
+          <w:lang w:val="hu-HU"/>
+        </w:rPr>
+        <w:t>              "eventUrl": "#",</w:t>
+      </w:r>
+    </w:p>
+    <w:p>
+      <w:pPr>
+        <w:spacing w:after="0"/>
+        <w:rPr>
+          <w:rFonts w:ascii="JetBrains Mono" w:hAnsi="JetBrains Mono" w:cs="JetBrains Mono"/>
+          <w:sz w:val="14"/>
+          <w:szCs w:val="14"/>
+          <w:lang w:val="hu-HU"/>
+        </w:rPr>
+      </w:pPr>
+      <w:r>
+        <w:rPr>
+          <w:rFonts w:ascii="JetBrains Mono" w:hAnsi="JetBrains Mono" w:cs="JetBrains Mono"/>
+          <w:sz w:val="14"/>
+          <w:szCs w:val="14"/>
+          <w:lang w:val="hu-HU"/>
+        </w:rPr>
+        <w:t>              "title": "Calculus hand-in",</w:t>
+      </w:r>
+    </w:p>
+    <w:p>
+      <w:pPr>
+        <w:spacing w:after="0"/>
+        <w:rPr>
+          <w:rFonts w:ascii="JetBrains Mono" w:hAnsi="JetBrains Mono" w:cs="JetBrains Mono"/>
+          <w:sz w:val="14"/>
+          <w:szCs w:val="14"/>
+          <w:lang w:val="hu-HU"/>
+        </w:rPr>
+      </w:pPr>
+      <w:r>
+        <w:rPr>
+          <w:rFonts w:ascii="JetBrains Mono" w:hAnsi="JetBrains Mono" w:cs="JetBrains Mono"/>
+          <w:sz w:val="14"/>
+          <w:szCs w:val="14"/>
+          <w:lang w:val="hu-HU"/>
+        </w:rPr>
+        <w:t>              "startDate": "01-12",</w:t>
+      </w:r>
+    </w:p>
+    <w:p>
+      <w:pPr>
+        <w:spacing w:after="0"/>
+        <w:rPr>
+          <w:rFonts w:ascii="JetBrains Mono" w:hAnsi="JetBrains Mono" w:cs="JetBrains Mono"/>
+          <w:sz w:val="14"/>
+          <w:szCs w:val="14"/>
+          <w:lang w:val="hu-HU"/>
+        </w:rPr>
+      </w:pPr>
+      <w:r>
+        <w:rPr>
+          <w:rFonts w:ascii="JetBrains Mono" w:hAnsi="JetBrains Mono" w:cs="JetBrains Mono"/>
+          <w:sz w:val="14"/>
+          <w:szCs w:val="14"/>
+          <w:lang w:val="hu-HU"/>
+        </w:rPr>
+        <w:t>              "startTime": "12:00",</w:t>
+      </w:r>
+    </w:p>
+    <w:p>
+      <w:pPr>
+        <w:spacing w:after="0"/>
+        <w:rPr>
+          <w:rFonts w:ascii="JetBrains Mono" w:hAnsi="JetBrains Mono" w:cs="JetBrains Mono"/>
+          <w:sz w:val="14"/>
+          <w:szCs w:val="14"/>
+          <w:lang w:val="hu-HU"/>
+        </w:rPr>
+      </w:pPr>
+      <w:r>
+        <w:rPr>
+          <w:rFonts w:ascii="JetBrains Mono" w:hAnsi="JetBrains Mono" w:cs="JetBrains Mono"/>
+          <w:sz w:val="14"/>
+          <w:szCs w:val="14"/>
+          <w:lang w:val="hu-HU"/>
+        </w:rPr>
+        <w:t>              "eventType": "deadline",</w:t>
+      </w:r>
+    </w:p>
+    <w:p>
+      <w:pPr>
+        <w:spacing w:after="0"/>
+        <w:rPr>
+          <w:rFonts w:ascii="JetBrains Mono" w:hAnsi="JetBrains Mono" w:cs="JetBrains Mono"/>
+          <w:sz w:val="14"/>
+          <w:szCs w:val="14"/>
+          <w:lang w:val="hu-HU"/>
+        </w:rPr>
+      </w:pPr>
+      <w:r>
+        <w:rPr>
+          <w:rFonts w:ascii="JetBrains Mono" w:hAnsi="JetBrains Mono" w:cs="JetBrains Mono"/>
+          <w:sz w:val="14"/>
+          <w:szCs w:val="14"/>
+          <w:lang w:val="hu-HU"/>
+        </w:rPr>
+        <w:t>              "description": "Hand-in deadline"</w:t>
+      </w:r>
+    </w:p>
+    <w:p>
+      <w:pPr>
+        <w:spacing w:after="0"/>
+        <w:rPr>
+          <w:rFonts w:ascii="JetBrains Mono" w:hAnsi="JetBrains Mono" w:cs="JetBrains Mono"/>
+          <w:sz w:val="14"/>
+          <w:szCs w:val="14"/>
+          <w:lang w:val="hu-HU"/>
+        </w:rPr>
+      </w:pPr>
+      <w:r>
+        <w:rPr>
+          <w:rFonts w:ascii="JetBrains Mono" w:hAnsi="JetBrains Mono" w:cs="JetBrains Mono"/>
+          <w:sz w:val="14"/>
+          <w:szCs w:val="14"/>
+          <w:lang w:val="hu-HU"/>
+        </w:rPr>
+        <w:t>            }</w:t>
+      </w:r>
+    </w:p>
+    <w:p>
+      <w:pPr>
+        <w:spacing w:after="0"/>
+        <w:rPr>
+          <w:rFonts w:ascii="JetBrains Mono" w:hAnsi="JetBrains Mono" w:cs="JetBrains Mono"/>
+          <w:sz w:val="14"/>
+          <w:szCs w:val="14"/>
+          <w:lang w:val="hu-HU"/>
+        </w:rPr>
+      </w:pPr>
+      <w:r>
+        <w:rPr>
+          <w:rFonts w:ascii="JetBrains Mono" w:hAnsi="JetBrains Mono" w:cs="JetBrains Mono"/>
+          <w:sz w:val="14"/>
+          <w:szCs w:val="14"/>
+          <w:lang w:val="hu-HU"/>
+        </w:rPr>
+        <w:t>          ]</w:t>
+      </w:r>
+    </w:p>
+    <w:p>
+      <w:pPr>
+        <w:spacing w:after="0"/>
+        <w:rPr>
+          <w:rFonts w:ascii="JetBrains Mono" w:hAnsi="JetBrains Mono" w:cs="JetBrains Mono"/>
+          <w:sz w:val="14"/>
+          <w:szCs w:val="14"/>
+          <w:lang w:val="hu-HU"/>
+        </w:rPr>
+      </w:pPr>
+      <w:r>
+        <w:rPr>
+          <w:rFonts w:ascii="JetBrains Mono" w:hAnsi="JetBrains Mono" w:cs="JetBrains Mono"/>
+          <w:sz w:val="14"/>
+          <w:szCs w:val="14"/>
+          <w:lang w:val="hu-HU"/>
+        </w:rPr>
+        <w:t>        }</w:t>
+      </w:r>
+    </w:p>
+    <w:p>
+      <w:pPr>
+        <w:spacing w:after="0"/>
+        <w:rPr>
+          <w:rFonts w:ascii="JetBrains Mono" w:hAnsi="JetBrains Mono" w:cs="JetBrains Mono"/>
+          <w:sz w:val="14"/>
+          <w:szCs w:val="14"/>
+          <w:lang w:val="hu-HU"/>
+        </w:rPr>
+      </w:pPr>
+      <w:r>
+        <w:rPr>
+          <w:rFonts w:ascii="JetBrains Mono" w:hAnsi="JetBrains Mono" w:cs="JetBrains Mono"/>
+          <w:sz w:val="14"/>
+          <w:szCs w:val="14"/>
+          <w:lang w:val="hu-HU"/>
+        </w:rPr>
+        <w:t>      ],</w:t>
+      </w:r>
+    </w:p>
+    <w:p>
+      <w:pPr>
+        <w:spacing w:after="0"/>
+        <w:rPr>
+          <w:rFonts w:ascii="JetBrains Mono" w:hAnsi="JetBrains Mono" w:cs="JetBrains Mono"/>
+          <w:sz w:val="14"/>
+          <w:szCs w:val="14"/>
+          <w:lang w:val="hu-HU"/>
+        </w:rPr>
+      </w:pPr>
+      <w:r>
+        <w:rPr>
+          <w:rFonts w:ascii="JetBrains Mono" w:hAnsi="JetBrains Mono" w:cs="JetBrains Mono"/>
+          <w:sz w:val="14"/>
+          <w:szCs w:val="14"/>
+          <w:lang w:val="hu-HU"/>
+        </w:rPr>
+        <w:t>      "inactive": [</w:t>
+      </w:r>
+    </w:p>
+    <w:p>
+      <w:pPr>
+        <w:spacing w:after="0"/>
+        <w:rPr>
+          <w:rFonts w:ascii="JetBrains Mono" w:hAnsi="JetBrains Mono" w:cs="JetBrains Mono"/>
+          <w:sz w:val="14"/>
+          <w:szCs w:val="14"/>
+          <w:lang w:val="hu-HU"/>
+        </w:rPr>
+      </w:pPr>
+      <w:r>
+        <w:rPr>
+          <w:rFonts w:ascii="JetBrains Mono" w:hAnsi="JetBrains Mono" w:cs="JetBrains Mono"/>
+          <w:sz w:val="14"/>
+          <w:szCs w:val="14"/>
+          <w:lang w:val="hu-HU"/>
+        </w:rPr>
+        <w:t>        {</w:t>
+      </w:r>
+    </w:p>
+    <w:p>
+      <w:pPr>
+        <w:spacing w:after="0"/>
+        <w:rPr>
+          <w:rFonts w:ascii="JetBrains Mono" w:hAnsi="JetBrains Mono" w:cs="JetBrains Mono"/>
+          <w:sz w:val="14"/>
+          <w:szCs w:val="14"/>
+          <w:lang w:val="hu-HU"/>
+        </w:rPr>
+      </w:pPr>
+      <w:r>
+        <w:rPr>
+          <w:rFonts w:ascii="JetBrains Mono" w:hAnsi="JetBrains Mono" w:cs="JetBrains Mono"/>
+          <w:sz w:val="14"/>
+          <w:szCs w:val="14"/>
+          <w:lang w:val="hu-HU"/>
+        </w:rPr>
+        <w:t>          "courseId": "uuid",</w:t>
+      </w:r>
+    </w:p>
+    <w:p>
+      <w:pPr>
+        <w:spacing w:after="0"/>
+        <w:rPr>
+          <w:rFonts w:ascii="JetBrains Mono" w:hAnsi="JetBrains Mono" w:cs="JetBrains Mono"/>
+          <w:sz w:val="14"/>
+          <w:szCs w:val="14"/>
+          <w:lang w:val="hu-HU"/>
+        </w:rPr>
+      </w:pPr>
+      <w:r>
+        <w:rPr>
+          <w:rFonts w:ascii="JetBrains Mono" w:hAnsi="JetBrains Mono" w:cs="JetBrains Mono"/>
+          <w:sz w:val="14"/>
+          <w:szCs w:val="14"/>
+          <w:lang w:val="hu-HU"/>
+        </w:rPr>
+        <w:t>          "instanceId": "uuid",</w:t>
+      </w:r>
+    </w:p>
+    <w:p>
+      <w:pPr>
+        <w:spacing w:after="0"/>
+        <w:rPr>
+          <w:rFonts w:ascii="JetBrains Mono" w:hAnsi="JetBrains Mono" w:cs="JetBrains Mono"/>
+          <w:sz w:val="14"/>
+          <w:szCs w:val="14"/>
+          <w:lang w:val="hu-HU"/>
+        </w:rPr>
+      </w:pPr>
+      <w:r>
+        <w:rPr>
+          <w:rFonts w:ascii="JetBrains Mono" w:hAnsi="JetBrains Mono" w:cs="JetBrains Mono"/>
+          <w:sz w:val="14"/>
+          <w:szCs w:val="14"/>
+          <w:lang w:val="hu-HU"/>
+        </w:rPr>
+        <w:t>          "courseName": "HTML5 Baics",</w:t>
+      </w:r>
+    </w:p>
+    <w:p>
+      <w:pPr>
+        <w:spacing w:after="0"/>
+        <w:rPr>
+          <w:rFonts w:ascii="JetBrains Mono" w:hAnsi="JetBrains Mono" w:cs="JetBrains Mono"/>
+          <w:sz w:val="14"/>
+          <w:szCs w:val="14"/>
+          <w:lang w:val="hu-HU"/>
+        </w:rPr>
+      </w:pPr>
+      <w:r>
+        <w:rPr>
+          <w:rFonts w:ascii="JetBrains Mono" w:hAnsi="JetBrains Mono" w:cs="JetBrains Mono"/>
+          <w:sz w:val="14"/>
+          <w:szCs w:val="14"/>
+          <w:lang w:val="hu-HU"/>
+        </w:rPr>
+        <w:t>          "imageUrl": "",</w:t>
+      </w:r>
+    </w:p>
+    <w:p>
+      <w:pPr>
+        <w:spacing w:after="0"/>
+        <w:rPr>
+          <w:rFonts w:ascii="JetBrains Mono" w:hAnsi="JetBrains Mono" w:cs="JetBrains Mono"/>
+          <w:sz w:val="14"/>
+          <w:szCs w:val="14"/>
+          <w:lang w:val="hu-HU"/>
+        </w:rPr>
+      </w:pPr>
+      <w:r>
+        <w:rPr>
+          <w:rFonts w:ascii="JetBrains Mono" w:hAnsi="JetBrains Mono" w:cs="JetBrains Mono"/>
+          <w:sz w:val="14"/>
+          <w:szCs w:val="14"/>
+          <w:lang w:val="hu-HU"/>
+        </w:rPr>
+        <w:t>          "teacherName": "Mr. John Smith",</w:t>
+      </w:r>
+    </w:p>
+    <w:p>
+      <w:pPr>
+        <w:spacing w:after="0"/>
+        <w:rPr>
+          <w:rFonts w:ascii="JetBrains Mono" w:hAnsi="JetBrains Mono" w:cs="JetBrains Mono"/>
+          <w:sz w:val="14"/>
+          <w:szCs w:val="14"/>
+          <w:lang w:val="hu-HU"/>
+        </w:rPr>
+      </w:pPr>
+      <w:r>
+        <w:rPr>
+          <w:rFonts w:ascii="JetBrains Mono" w:hAnsi="JetBrains Mono" w:cs="JetBrains Mono"/>
+          <w:sz w:val="14"/>
+          <w:szCs w:val="14"/>
+          <w:lang w:val="hu-HU"/>
+        </w:rPr>
+        <w:t>          "courseType": "learningPath",</w:t>
+      </w:r>
+    </w:p>
+    <w:p>
+      <w:pPr>
+        <w:spacing w:after="0"/>
+        <w:rPr>
+          <w:rFonts w:ascii="JetBrains Mono" w:hAnsi="JetBrains Mono" w:cs="JetBrains Mono"/>
+          <w:sz w:val="14"/>
+          <w:szCs w:val="14"/>
+          <w:lang w:val="hu-HU"/>
+        </w:rPr>
+      </w:pPr>
+      <w:r>
+        <w:rPr>
+          <w:rFonts w:ascii="JetBrains Mono" w:hAnsi="JetBrains Mono" w:cs="JetBrains Mono"/>
+          <w:sz w:val="14"/>
+          <w:szCs w:val="14"/>
+          <w:lang w:val="hu-HU"/>
+        </w:rPr>
+        <w:t>          "progress": 100</w:t>
+      </w:r>
+    </w:p>
+    <w:p>
+      <w:pPr>
+        <w:spacing w:after="0"/>
+        <w:rPr>
+          <w:rFonts w:ascii="JetBrains Mono" w:hAnsi="JetBrains Mono" w:cs="JetBrains Mono"/>
+          <w:sz w:val="14"/>
+          <w:szCs w:val="14"/>
+          <w:lang w:val="hu-HU"/>
+        </w:rPr>
+      </w:pPr>
+      <w:r>
+        <w:rPr>
+          <w:rFonts w:ascii="JetBrains Mono" w:hAnsi="JetBrains Mono" w:cs="JetBrains Mono"/>
+          <w:sz w:val="14"/>
+          <w:szCs w:val="14"/>
+          <w:lang w:val="hu-HU"/>
+        </w:rPr>
+        <w:t>        }</w:t>
+      </w:r>
+    </w:p>
+    <w:p>
+      <w:pPr>
+        <w:spacing w:after="0"/>
+        <w:rPr>
+          <w:rFonts w:ascii="JetBrains Mono" w:hAnsi="JetBrains Mono" w:cs="JetBrains Mono"/>
+          <w:sz w:val="14"/>
+          <w:szCs w:val="14"/>
+          <w:lang w:val="hu-HU"/>
+        </w:rPr>
+      </w:pPr>
+      <w:r>
+        <w:rPr>
+          <w:rFonts w:ascii="JetBrains Mono" w:hAnsi="JetBrains Mono" w:cs="JetBrains Mono"/>
+          <w:sz w:val="14"/>
+          <w:szCs w:val="14"/>
+          <w:lang w:val="hu-HU"/>
+        </w:rPr>
+        <w:t>      ]</w:t>
+      </w:r>
+    </w:p>
+    <w:p>
+      <w:pPr>
+        <w:spacing w:after="0"/>
+        <w:rPr>
+          <w:rFonts w:ascii="JetBrains Mono" w:hAnsi="JetBrains Mono" w:cs="JetBrains Mono"/>
+          <w:sz w:val="14"/>
+          <w:szCs w:val="14"/>
+          <w:lang w:val="hu-HU"/>
+        </w:rPr>
+      </w:pPr>
+      <w:r>
+        <w:rPr>
+          <w:rFonts w:ascii="JetBrains Mono" w:hAnsi="JetBrains Mono" w:cs="JetBrains Mono"/>
+          <w:sz w:val="14"/>
+          <w:szCs w:val="14"/>
+          <w:lang w:val="hu-HU"/>
+        </w:rPr>
+        <w:t>    },</w:t>
+      </w:r>
+    </w:p>
+    <w:p>
+      <w:pPr>
+        <w:spacing w:after="0"/>
+        <w:rPr>
+          <w:rFonts w:ascii="JetBrains Mono" w:hAnsi="JetBrains Mono" w:cs="JetBrains Mono"/>
+          <w:sz w:val="14"/>
+          <w:szCs w:val="14"/>
+          <w:lang w:val="hu-HU"/>
+        </w:rPr>
+      </w:pPr>
+      <w:r>
+        <w:rPr>
+          <w:rFonts w:ascii="JetBrains Mono" w:hAnsi="JetBrains Mono" w:cs="JetBrains Mono"/>
+          <w:sz w:val="14"/>
+          <w:szCs w:val="14"/>
+          <w:lang w:val="hu-HU"/>
+        </w:rPr>
+        <w:t>    "upcomingEvents": [</w:t>
+      </w:r>
+    </w:p>
+    <w:p>
+      <w:pPr>
+        <w:spacing w:after="0"/>
+        <w:rPr>
+          <w:rFonts w:ascii="JetBrains Mono" w:hAnsi="JetBrains Mono" w:cs="JetBrains Mono"/>
+          <w:sz w:val="14"/>
+          <w:szCs w:val="14"/>
+          <w:lang w:val="hu-HU"/>
+        </w:rPr>
+      </w:pPr>
+      <w:r>
+        <w:rPr>
+          <w:rFonts w:ascii="JetBrains Mono" w:hAnsi="JetBrains Mono" w:cs="JetBrains Mono"/>
+          <w:sz w:val="14"/>
+          <w:szCs w:val="14"/>
+          <w:lang w:val="hu-HU"/>
+        </w:rPr>
+        <w:t>      {</w:t>
+      </w:r>
+    </w:p>
+    <w:p>
+      <w:pPr>
+        <w:spacing w:after="0"/>
+        <w:rPr>
+          <w:rFonts w:ascii="JetBrains Mono" w:hAnsi="JetBrains Mono" w:cs="JetBrains Mono"/>
+          <w:sz w:val="14"/>
+          <w:szCs w:val="14"/>
+          <w:lang w:val="hu-HU"/>
+        </w:rPr>
+      </w:pPr>
+      <w:r>
+        <w:rPr>
+          <w:rFonts w:ascii="JetBrains Mono" w:hAnsi="JetBrains Mono" w:cs="JetBrains Mono"/>
+          <w:sz w:val="14"/>
+          <w:szCs w:val="14"/>
+          <w:lang w:val="hu-HU"/>
+        </w:rPr>
+        <w:t>        "eventId": "uuid",</w:t>
+      </w:r>
+    </w:p>
+    <w:p>
+      <w:pPr>
+        <w:spacing w:after="0"/>
+        <w:rPr>
+          <w:rFonts w:ascii="JetBrains Mono" w:hAnsi="JetBrains Mono" w:cs="JetBrains Mono"/>
+          <w:sz w:val="14"/>
+          <w:szCs w:val="14"/>
+          <w:lang w:val="hu-HU"/>
+        </w:rPr>
+      </w:pPr>
+      <w:r>
+        <w:rPr>
+          <w:rFonts w:ascii="JetBrains Mono" w:hAnsi="JetBrains Mono" w:cs="JetBrains Mono"/>
+          <w:sz w:val="14"/>
+          <w:szCs w:val="14"/>
+          <w:lang w:val="hu-HU"/>
+        </w:rPr>
+        <w:t>        "eventUrl": "#",</w:t>
+      </w:r>
+    </w:p>
+    <w:p>
+      <w:pPr>
+        <w:spacing w:after="0"/>
+        <w:rPr>
+          <w:rFonts w:ascii="JetBrains Mono" w:hAnsi="JetBrains Mono" w:cs="JetBrains Mono"/>
+          <w:sz w:val="14"/>
+          <w:szCs w:val="14"/>
+          <w:lang w:val="hu-HU"/>
+        </w:rPr>
+      </w:pPr>
+      <w:r>
+        <w:rPr>
+          <w:rFonts w:ascii="JetBrains Mono" w:hAnsi="JetBrains Mono" w:cs="JetBrains Mono"/>
+          <w:sz w:val="14"/>
+          <w:szCs w:val="14"/>
+          <w:lang w:val="hu-HU"/>
+        </w:rPr>
+        <w:t>        "title": "Calculus lesson",</w:t>
+      </w:r>
+    </w:p>
+    <w:p>
+      <w:pPr>
+        <w:spacing w:after="0"/>
+        <w:rPr>
+          <w:rFonts w:ascii="JetBrains Mono" w:hAnsi="JetBrains Mono" w:cs="JetBrains Mono"/>
+          <w:sz w:val="14"/>
+          <w:szCs w:val="14"/>
+          <w:lang w:val="hu-HU"/>
+        </w:rPr>
+      </w:pPr>
+      <w:r>
+        <w:rPr>
+          <w:rFonts w:ascii="JetBrains Mono" w:hAnsi="JetBrains Mono" w:cs="JetBrains Mono"/>
+          <w:sz w:val="14"/>
+          <w:szCs w:val="14"/>
+          <w:lang w:val="hu-HU"/>
+        </w:rPr>
+        <w:t>        "startDate": "01-12",</w:t>
+      </w:r>
+    </w:p>
+    <w:p>
+      <w:pPr>
+        <w:spacing w:after="0"/>
+        <w:rPr>
+          <w:rFonts w:ascii="JetBrains Mono" w:hAnsi="JetBrains Mono" w:cs="JetBrains Mono"/>
+          <w:sz w:val="14"/>
+          <w:szCs w:val="14"/>
+          <w:lang w:val="hu-HU"/>
+        </w:rPr>
+      </w:pPr>
+      <w:r>
+        <w:rPr>
+          <w:rFonts w:ascii="JetBrains Mono" w:hAnsi="JetBrains Mono" w:cs="JetBrains Mono"/>
+          <w:sz w:val="14"/>
+          <w:szCs w:val="14"/>
+          <w:lang w:val="hu-HU"/>
+        </w:rPr>
+        <w:t>        "startTime": "12:00",</w:t>
+      </w:r>
+    </w:p>
+    <w:p>
+      <w:pPr>
+        <w:spacing w:after="0"/>
+        <w:rPr>
+          <w:rFonts w:ascii="JetBrains Mono" w:hAnsi="JetBrains Mono" w:cs="JetBrains Mono"/>
+          <w:sz w:val="14"/>
+          <w:szCs w:val="14"/>
+          <w:lang w:val="hu-HU"/>
+        </w:rPr>
+      </w:pPr>
+      <w:r>
+        <w:rPr>
+          <w:rFonts w:ascii="JetBrains Mono" w:hAnsi="JetBrains Mono" w:cs="JetBrains Mono"/>
+          <w:sz w:val="14"/>
+          <w:szCs w:val="14"/>
+          <w:lang w:val="hu-HU"/>
+        </w:rPr>
+        <w:t>        "courseName": "Calculus",</w:t>
+      </w:r>
+    </w:p>
+    <w:p>
+      <w:pPr>
+        <w:spacing w:after="0"/>
+        <w:rPr>
+          <w:rFonts w:ascii="JetBrains Mono" w:hAnsi="JetBrains Mono" w:cs="JetBrains Mono"/>
+          <w:sz w:val="14"/>
+          <w:szCs w:val="14"/>
+          <w:lang w:val="hu-HU"/>
+        </w:rPr>
+      </w:pPr>
+      <w:r>
+        <w:rPr>
+          <w:rFonts w:ascii="JetBrains Mono" w:hAnsi="JetBrains Mono" w:cs="JetBrains Mono"/>
+          <w:sz w:val="14"/>
+          <w:szCs w:val="14"/>
+          <w:lang w:val="hu-HU"/>
+        </w:rPr>
+        <w:t>        "teacherName": "Dr. John Doe",</w:t>
+      </w:r>
+    </w:p>
+    <w:p>
+      <w:pPr>
+        <w:spacing w:after="0"/>
+        <w:rPr>
+          <w:rFonts w:ascii="JetBrains Mono" w:hAnsi="JetBrains Mono" w:cs="JetBrains Mono"/>
+          <w:sz w:val="14"/>
+          <w:szCs w:val="14"/>
+          <w:lang w:val="hu-HU"/>
+        </w:rPr>
+      </w:pPr>
+      <w:r>
+        <w:rPr>
+          <w:rFonts w:ascii="JetBrains Mono" w:hAnsi="JetBrains Mono" w:cs="JetBrains Mono"/>
+          <w:sz w:val="14"/>
+          <w:szCs w:val="14"/>
+          <w:lang w:val="hu-HU"/>
+        </w:rPr>
+        <w:t>        "eventType": "lesson",</w:t>
+      </w:r>
+    </w:p>
+    <w:p>
+      <w:pPr>
+        <w:spacing w:after="0"/>
+        <w:rPr>
+          <w:rFonts w:ascii="JetBrains Mono" w:hAnsi="JetBrains Mono" w:cs="JetBrains Mono"/>
+          <w:sz w:val="14"/>
+          <w:szCs w:val="14"/>
+          <w:lang w:val="hu-HU"/>
+        </w:rPr>
+      </w:pPr>
+      <w:r>
+        <w:rPr>
+          <w:rFonts w:ascii="JetBrains Mono" w:hAnsi="JetBrains Mono" w:cs="JetBrains Mono"/>
+          <w:sz w:val="14"/>
+          <w:szCs w:val="14"/>
+          <w:lang w:val="hu-HU"/>
+        </w:rPr>
+        <w:t>        "description": "The next lesson of Calculus"</w:t>
+      </w:r>
+    </w:p>
+    <w:p>
+      <w:pPr>
+        <w:spacing w:after="0"/>
+        <w:rPr>
+          <w:rFonts w:ascii="JetBrains Mono" w:hAnsi="JetBrains Mono" w:cs="JetBrains Mono"/>
+          <w:sz w:val="14"/>
+          <w:szCs w:val="14"/>
+          <w:lang w:val="hu-HU"/>
+        </w:rPr>
+      </w:pPr>
+      <w:r>
+        <w:rPr>
+          <w:rFonts w:ascii="JetBrains Mono" w:hAnsi="JetBrains Mono" w:cs="JetBrains Mono"/>
+          <w:sz w:val="14"/>
+          <w:szCs w:val="14"/>
+          <w:lang w:val="hu-HU"/>
+        </w:rPr>
+        <w:t>      }</w:t>
+      </w:r>
+    </w:p>
+    <w:p>
+      <w:pPr>
+        <w:spacing w:after="0"/>
+        <w:rPr>
+          <w:rFonts w:ascii="JetBrains Mono" w:hAnsi="JetBrains Mono" w:cs="JetBrains Mono"/>
+          <w:sz w:val="14"/>
+          <w:szCs w:val="14"/>
+          <w:lang w:val="hu-HU"/>
+        </w:rPr>
+      </w:pPr>
+      <w:r>
+        <w:rPr>
+          <w:rFonts w:ascii="JetBrains Mono" w:hAnsi="JetBrains Mono" w:cs="JetBrains Mono"/>
+          <w:sz w:val="14"/>
+          <w:szCs w:val="14"/>
+          <w:lang w:val="hu-HU"/>
+        </w:rPr>
+        <w:t>    ],</w:t>
+      </w:r>
+    </w:p>
+    <w:p>
+      <w:pPr>
+        <w:spacing w:after="0"/>
+        <w:rPr>
+          <w:rFonts w:ascii="JetBrains Mono" w:hAnsi="JetBrains Mono" w:cs="JetBrains Mono"/>
+          <w:sz w:val="14"/>
+          <w:szCs w:val="14"/>
+          <w:lang w:val="hu-HU"/>
+        </w:rPr>
+      </w:pPr>
+      <w:r>
+        <w:rPr>
+          <w:rFonts w:ascii="JetBrains Mono" w:hAnsi="JetBrains Mono" w:cs="JetBrains Mono"/>
+          <w:sz w:val="14"/>
+          <w:szCs w:val="14"/>
+          <w:lang w:val="hu-HU"/>
+        </w:rPr>
+        <w:t>    "popularCourses": [</w:t>
+      </w:r>
+    </w:p>
+    <w:p>
+      <w:pPr>
+        <w:spacing w:after="0"/>
+        <w:rPr>
+          <w:rFonts w:ascii="JetBrains Mono" w:hAnsi="JetBrains Mono" w:cs="JetBrains Mono"/>
+          <w:sz w:val="14"/>
+          <w:szCs w:val="14"/>
+          <w:lang w:val="hu-HU"/>
+        </w:rPr>
+      </w:pPr>
+      <w:r>
+        <w:rPr>
+          <w:rFonts w:ascii="JetBrains Mono" w:hAnsi="JetBrains Mono" w:cs="JetBrains Mono"/>
+          <w:sz w:val="14"/>
+          <w:szCs w:val="14"/>
+          <w:lang w:val="hu-HU"/>
+        </w:rPr>
+        <w:t>      {</w:t>
+      </w:r>
+    </w:p>
+    <w:p>
+      <w:pPr>
+        <w:spacing w:after="0"/>
+        <w:rPr>
+          <w:rFonts w:ascii="JetBrains Mono" w:hAnsi="JetBrains Mono" w:cs="JetBrains Mono"/>
+          <w:sz w:val="14"/>
+          <w:szCs w:val="14"/>
+          <w:lang w:val="hu-HU"/>
+        </w:rPr>
+      </w:pPr>
+      <w:r>
+        <w:rPr>
+          <w:rFonts w:ascii="JetBrains Mono" w:hAnsi="JetBrains Mono" w:cs="JetBrains Mono"/>
+          <w:sz w:val="14"/>
+          <w:szCs w:val="14"/>
+          <w:lang w:val="hu-HU"/>
+        </w:rPr>
+        <w:t>        "courseId": "uuid",</w:t>
+      </w:r>
+    </w:p>
+    <w:p>
+      <w:pPr>
+        <w:spacing w:after="0"/>
+        <w:rPr>
+          <w:rFonts w:ascii="JetBrains Mono" w:hAnsi="JetBrains Mono" w:cs="JetBrains Mono"/>
+          <w:sz w:val="14"/>
+          <w:szCs w:val="14"/>
+          <w:lang w:val="hu-HU"/>
+        </w:rPr>
+      </w:pPr>
+      <w:r>
+        <w:rPr>
+          <w:rFonts w:ascii="JetBrains Mono" w:hAnsi="JetBrains Mono" w:cs="JetBrains Mono"/>
+          <w:sz w:val="14"/>
+          <w:szCs w:val="14"/>
+          <w:lang w:val="hu-HU"/>
+        </w:rPr>
+        <w:t>        "instanceId": "uuid",</w:t>
+      </w:r>
+    </w:p>
+    <w:p>
+      <w:pPr>
+        <w:spacing w:after="0"/>
+        <w:rPr>
+          <w:rFonts w:ascii="JetBrains Mono" w:hAnsi="JetBrains Mono" w:cs="JetBrains Mono"/>
+          <w:sz w:val="14"/>
+          <w:szCs w:val="14"/>
+          <w:lang w:val="hu-HU"/>
+        </w:rPr>
+      </w:pPr>
+      <w:r>
+        <w:rPr>
+          <w:rFonts w:ascii="JetBrains Mono" w:hAnsi="JetBrains Mono" w:cs="JetBrains Mono"/>
+          <w:sz w:val="14"/>
+          <w:szCs w:val="14"/>
+          <w:lang w:val="hu-HU"/>
+        </w:rPr>
+        <w:t>        "courseName": "Unity Engine basics",</w:t>
+      </w:r>
+    </w:p>
+    <w:p>
+      <w:pPr>
+        <w:spacing w:after="0"/>
+        <w:rPr>
+          <w:rFonts w:ascii="JetBrains Mono" w:hAnsi="JetBrains Mono" w:cs="JetBrains Mono"/>
+          <w:sz w:val="14"/>
+          <w:szCs w:val="14"/>
+          <w:lang w:val="hu-HU"/>
+        </w:rPr>
+      </w:pPr>
+      <w:r>
+        <w:rPr>
+          <w:rFonts w:ascii="JetBrains Mono" w:hAnsi="JetBrains Mono" w:cs="JetBrains Mono"/>
+          <w:sz w:val="14"/>
+          <w:szCs w:val="14"/>
+          <w:lang w:val="hu-HU"/>
+        </w:rPr>
+        <w:t>        "imageUrl": "",</w:t>
+      </w:r>
+    </w:p>
+    <w:p>
+      <w:pPr>
+        <w:spacing w:after="0"/>
+        <w:rPr>
+          <w:rFonts w:ascii="JetBrains Mono" w:hAnsi="JetBrains Mono" w:cs="JetBrains Mono"/>
+          <w:sz w:val="14"/>
+          <w:szCs w:val="14"/>
+          <w:lang w:val="hu-HU"/>
+        </w:rPr>
+      </w:pPr>
+      <w:r>
+        <w:rPr>
+          <w:rFonts w:ascii="JetBrains Mono" w:hAnsi="JetBrains Mono" w:cs="JetBrains Mono"/>
+          <w:sz w:val="14"/>
+          <w:szCs w:val="14"/>
+          <w:lang w:val="hu-HU"/>
+        </w:rPr>
+        <w:t>        "teacherName": "Huan Antonio",</w:t>
+      </w:r>
+    </w:p>
+    <w:p>
+      <w:pPr>
+        <w:spacing w:after="0"/>
+        <w:rPr>
+          <w:rFonts w:ascii="JetBrains Mono" w:hAnsi="JetBrains Mono" w:cs="JetBrains Mono"/>
+          <w:sz w:val="14"/>
+          <w:szCs w:val="14"/>
+          <w:lang w:val="hu-HU"/>
+        </w:rPr>
+      </w:pPr>
+      <w:r>
+        <w:rPr>
+          <w:rFonts w:ascii="JetBrains Mono" w:hAnsi="JetBrains Mono" w:cs="JetBrains Mono"/>
+          <w:sz w:val="14"/>
+          <w:szCs w:val="14"/>
+          <w:lang w:val="hu-HU"/>
+        </w:rPr>
+        <w:t>        "lessonPrice": { "amount": 0, "currency": "HUF" },</w:t>
+      </w:r>
+    </w:p>
+    <w:p>
+      <w:pPr>
+        <w:spacing w:after="0"/>
+        <w:rPr>
+          <w:rFonts w:ascii="JetBrains Mono" w:hAnsi="JetBrains Mono" w:cs="JetBrains Mono"/>
+          <w:sz w:val="14"/>
+          <w:szCs w:val="14"/>
+          <w:lang w:val="hu-HU"/>
+        </w:rPr>
+      </w:pPr>
+      <w:r>
+        <w:rPr>
+          <w:rFonts w:ascii="JetBrains Mono" w:hAnsi="JetBrains Mono" w:cs="JetBrains Mono"/>
+          <w:sz w:val="14"/>
+          <w:szCs w:val="14"/>
+          <w:lang w:val="hu-HU"/>
+        </w:rPr>
+        <w:t>        "description": "Learn the basics of the Unity Engine",</w:t>
+      </w:r>
+    </w:p>
+    <w:p>
+      <w:pPr>
+        <w:spacing w:after="0"/>
+        <w:rPr>
+          <w:rFonts w:ascii="JetBrains Mono" w:hAnsi="JetBrains Mono" w:cs="JetBrains Mono"/>
+          <w:sz w:val="14"/>
+          <w:szCs w:val="14"/>
+          <w:lang w:val="hu-HU"/>
+        </w:rPr>
+      </w:pPr>
+      <w:r>
+        <w:rPr>
+          <w:rFonts w:ascii="JetBrains Mono" w:hAnsi="JetBrains Mono" w:cs="JetBrains Mono"/>
+          <w:sz w:val="14"/>
+          <w:szCs w:val="14"/>
+          <w:lang w:val="hu-HU"/>
+        </w:rPr>
+        <w:t>        "courseType": "learningPath"</w:t>
+      </w:r>
+    </w:p>
+    <w:p>
+      <w:pPr>
+        <w:spacing w:after="0"/>
+        <w:rPr>
+          <w:rFonts w:ascii="JetBrains Mono" w:hAnsi="JetBrains Mono" w:cs="JetBrains Mono"/>
+          <w:sz w:val="14"/>
+          <w:szCs w:val="14"/>
+          <w:lang w:val="hu-HU"/>
+        </w:rPr>
+      </w:pPr>
+      <w:r>
+        <w:rPr>
+          <w:rFonts w:ascii="JetBrains Mono" w:hAnsi="JetBrains Mono" w:cs="JetBrains Mono"/>
+          <w:sz w:val="14"/>
+          <w:szCs w:val="14"/>
+          <w:lang w:val="hu-HU"/>
+        </w:rPr>
+        <w:lastRenderedPageBreak/>
+        <w:t>      },</w:t>
+      </w:r>
+    </w:p>
+    <w:p>
+      <w:pPr>
+        <w:spacing w:after="0"/>
+        <w:rPr>
+          <w:rFonts w:ascii="JetBrains Mono" w:hAnsi="JetBrains Mono" w:cs="JetBrains Mono"/>
+          <w:sz w:val="14"/>
+          <w:szCs w:val="14"/>
+          <w:lang w:val="hu-HU"/>
+        </w:rPr>
+      </w:pPr>
+      <w:r>
+        <w:rPr>
+          <w:rFonts w:ascii="JetBrains Mono" w:hAnsi="JetBrains Mono" w:cs="JetBrains Mono"/>
+          <w:sz w:val="14"/>
+          <w:szCs w:val="14"/>
+          <w:lang w:val="hu-HU"/>
+        </w:rPr>
+        <w:t>      {</w:t>
+      </w:r>
+    </w:p>
+    <w:p>
+      <w:pPr>
+        <w:spacing w:after="0"/>
+        <w:rPr>
+          <w:rFonts w:ascii="JetBrains Mono" w:hAnsi="JetBrains Mono" w:cs="JetBrains Mono"/>
+          <w:sz w:val="14"/>
+          <w:szCs w:val="14"/>
+          <w:lang w:val="hu-HU"/>
+        </w:rPr>
+      </w:pPr>
+      <w:r>
+        <w:rPr>
+          <w:rFonts w:ascii="JetBrains Mono" w:hAnsi="JetBrains Mono" w:cs="JetBrains Mono"/>
+          <w:sz w:val="14"/>
+          <w:szCs w:val="14"/>
+          <w:lang w:val="hu-HU"/>
+        </w:rPr>
+        <w:t>        "courseId": "uuid",</w:t>
+      </w:r>
+    </w:p>
+    <w:p>
+      <w:pPr>
+        <w:spacing w:after="0"/>
+        <w:rPr>
+          <w:rFonts w:ascii="JetBrains Mono" w:hAnsi="JetBrains Mono" w:cs="JetBrains Mono"/>
+          <w:sz w:val="14"/>
+          <w:szCs w:val="14"/>
+          <w:lang w:val="hu-HU"/>
+        </w:rPr>
+      </w:pPr>
+      <w:r>
+        <w:rPr>
+          <w:rFonts w:ascii="JetBrains Mono" w:hAnsi="JetBrains Mono" w:cs="JetBrains Mono"/>
+          <w:sz w:val="14"/>
+          <w:szCs w:val="14"/>
+          <w:lang w:val="hu-HU"/>
+        </w:rPr>
+        <w:t>        "instanceId": "uuid",</w:t>
+      </w:r>
+    </w:p>
+    <w:p>
+      <w:pPr>
+        <w:spacing w:after="0"/>
+        <w:rPr>
+          <w:rFonts w:ascii="JetBrains Mono" w:hAnsi="JetBrains Mono" w:cs="JetBrains Mono"/>
+          <w:sz w:val="14"/>
+          <w:szCs w:val="14"/>
+          <w:lang w:val="hu-HU"/>
+        </w:rPr>
+      </w:pPr>
+      <w:r>
+        <w:rPr>
+          <w:rFonts w:ascii="JetBrains Mono" w:hAnsi="JetBrains Mono" w:cs="JetBrains Mono"/>
+          <w:sz w:val="14"/>
+          <w:szCs w:val="14"/>
+          <w:lang w:val="hu-HU"/>
+        </w:rPr>
+        <w:t>        "courseName": "B2 english",</w:t>
+      </w:r>
+    </w:p>
+    <w:p>
+      <w:pPr>
+        <w:spacing w:after="0"/>
+        <w:rPr>
+          <w:rFonts w:ascii="JetBrains Mono" w:hAnsi="JetBrains Mono" w:cs="JetBrains Mono"/>
+          <w:sz w:val="14"/>
+          <w:szCs w:val="14"/>
+          <w:lang w:val="hu-HU"/>
+        </w:rPr>
+      </w:pPr>
+      <w:r>
+        <w:rPr>
+          <w:rFonts w:ascii="JetBrains Mono" w:hAnsi="JetBrains Mono" w:cs="JetBrains Mono"/>
+          <w:sz w:val="14"/>
+          <w:szCs w:val="14"/>
+          <w:lang w:val="hu-HU"/>
+        </w:rPr>
+        <w:t>        "imageUrl": "",</w:t>
+      </w:r>
+    </w:p>
+    <w:p>
+      <w:pPr>
+        <w:spacing w:after="0"/>
+        <w:rPr>
+          <w:rFonts w:ascii="JetBrains Mono" w:hAnsi="JetBrains Mono" w:cs="JetBrains Mono"/>
+          <w:sz w:val="14"/>
+          <w:szCs w:val="14"/>
+          <w:lang w:val="hu-HU"/>
+        </w:rPr>
+      </w:pPr>
+      <w:r>
+        <w:rPr>
+          <w:rFonts w:ascii="JetBrains Mono" w:hAnsi="JetBrains Mono" w:cs="JetBrains Mono"/>
+          <w:sz w:val="14"/>
+          <w:szCs w:val="14"/>
+          <w:lang w:val="hu-HU"/>
+        </w:rPr>
+        <w:t>        "teacherName": "El-Jahari",</w:t>
+      </w:r>
+    </w:p>
+    <w:p>
+      <w:pPr>
+        <w:spacing w:after="0"/>
+        <w:rPr>
+          <w:rFonts w:ascii="JetBrains Mono" w:hAnsi="JetBrains Mono" w:cs="JetBrains Mono"/>
+          <w:sz w:val="14"/>
+          <w:szCs w:val="14"/>
+          <w:lang w:val="hu-HU"/>
+        </w:rPr>
+      </w:pPr>
+      <w:r>
+        <w:rPr>
+          <w:rFonts w:ascii="JetBrains Mono" w:hAnsi="JetBrains Mono" w:cs="JetBrains Mono"/>
+          <w:sz w:val="14"/>
+          <w:szCs w:val="14"/>
+          <w:lang w:val="hu-HU"/>
+        </w:rPr>
+        <w:t>        "lessonPrice": { "amount": 0, "currency": "HUF" },</w:t>
+      </w:r>
+    </w:p>
+    <w:p>
+      <w:pPr>
+        <w:spacing w:after="0"/>
+        <w:rPr>
+          <w:rFonts w:ascii="JetBrains Mono" w:hAnsi="JetBrains Mono" w:cs="JetBrains Mono"/>
+          <w:sz w:val="14"/>
+          <w:szCs w:val="14"/>
+          <w:lang w:val="hu-HU"/>
+        </w:rPr>
+      </w:pPr>
+      <w:r>
+        <w:rPr>
+          <w:rFonts w:ascii="JetBrains Mono" w:hAnsi="JetBrains Mono" w:cs="JetBrains Mono"/>
+          <w:sz w:val="14"/>
+          <w:szCs w:val="14"/>
+          <w:lang w:val="hu-HU"/>
+        </w:rPr>
+        <w:t>        "description": "You will learn the basics of English, to be able to pass the B2 exam",</w:t>
+      </w:r>
+    </w:p>
+    <w:p>
+      <w:pPr>
+        <w:spacing w:after="0"/>
+        <w:rPr>
+          <w:rFonts w:ascii="JetBrains Mono" w:hAnsi="JetBrains Mono" w:cs="JetBrains Mono"/>
+          <w:sz w:val="14"/>
+          <w:szCs w:val="14"/>
+          <w:lang w:val="hu-HU"/>
+        </w:rPr>
+      </w:pPr>
+      <w:r>
+        <w:rPr>
+          <w:rFonts w:ascii="JetBrains Mono" w:hAnsi="JetBrains Mono" w:cs="JetBrains Mono"/>
+          <w:sz w:val="14"/>
+          <w:szCs w:val="14"/>
+          <w:lang w:val="hu-HU"/>
+        </w:rPr>
+        <w:t>        "courseType": "tutoring"</w:t>
+      </w:r>
+    </w:p>
+    <w:p>
+      <w:pPr>
+        <w:spacing w:after="0"/>
+        <w:rPr>
+          <w:rFonts w:ascii="JetBrains Mono" w:hAnsi="JetBrains Mono" w:cs="JetBrains Mono"/>
+          <w:sz w:val="14"/>
+          <w:szCs w:val="14"/>
+          <w:lang w:val="hu-HU"/>
+        </w:rPr>
+      </w:pPr>
+      <w:r>
+        <w:rPr>
+          <w:rFonts w:ascii="JetBrains Mono" w:hAnsi="JetBrains Mono" w:cs="JetBrains Mono"/>
+          <w:sz w:val="14"/>
+          <w:szCs w:val="14"/>
+          <w:lang w:val="hu-HU"/>
+        </w:rPr>
+        <w:t>      }</w:t>
+      </w:r>
+    </w:p>
+    <w:p>
+      <w:pPr>
+        <w:spacing w:after="0"/>
+        <w:rPr>
+          <w:rFonts w:ascii="JetBrains Mono" w:hAnsi="JetBrains Mono" w:cs="JetBrains Mono"/>
+          <w:sz w:val="14"/>
+          <w:szCs w:val="14"/>
+          <w:lang w:val="hu-HU"/>
+        </w:rPr>
+      </w:pPr>
+      <w:r>
+        <w:rPr>
+          <w:rFonts w:ascii="JetBrains Mono" w:hAnsi="JetBrains Mono" w:cs="JetBrains Mono"/>
+          <w:sz w:val="14"/>
+          <w:szCs w:val="14"/>
+          <w:lang w:val="hu-HU"/>
+        </w:rPr>
+        <w:t>    ],</w:t>
+      </w:r>
+    </w:p>
+    <w:p>
+      <w:pPr>
+        <w:spacing w:after="0"/>
+        <w:rPr>
+          <w:rFonts w:ascii="JetBrains Mono" w:hAnsi="JetBrains Mono" w:cs="JetBrains Mono"/>
+          <w:sz w:val="14"/>
+          <w:szCs w:val="14"/>
+          <w:lang w:val="hu-HU"/>
+        </w:rPr>
+      </w:pPr>
+      <w:r>
+        <w:rPr>
+          <w:rFonts w:ascii="JetBrains Mono" w:hAnsi="JetBrains Mono" w:cs="JetBrains Mono"/>
+          <w:sz w:val="14"/>
+          <w:szCs w:val="14"/>
+          <w:lang w:val="hu-HU"/>
+        </w:rPr>
+        <w:t>    "notifications": {</w:t>
+      </w:r>
+    </w:p>
+    <w:p>
+      <w:pPr>
+        <w:spacing w:after="0"/>
+        <w:rPr>
+          <w:rFonts w:ascii="JetBrains Mono" w:hAnsi="JetBrains Mono" w:cs="JetBrains Mono"/>
+          <w:sz w:val="14"/>
+          <w:szCs w:val="14"/>
+          <w:lang w:val="hu-HU"/>
+        </w:rPr>
+      </w:pPr>
+      <w:r>
+        <w:rPr>
+          <w:rFonts w:ascii="JetBrains Mono" w:hAnsi="JetBrains Mono" w:cs="JetBrains Mono"/>
+          <w:sz w:val="14"/>
+          <w:szCs w:val="14"/>
+          <w:lang w:val="hu-HU"/>
+        </w:rPr>
+        <w:t>      "unreadNotificationNumber": 5,</w:t>
+      </w:r>
+    </w:p>
+    <w:p>
+      <w:pPr>
+        <w:spacing w:after="0"/>
+        <w:rPr>
+          <w:rFonts w:ascii="JetBrains Mono" w:hAnsi="JetBrains Mono" w:cs="JetBrains Mono"/>
+          <w:sz w:val="14"/>
+          <w:szCs w:val="14"/>
+          <w:lang w:val="hu-HU"/>
+        </w:rPr>
+      </w:pPr>
+      <w:r>
+        <w:rPr>
+          <w:rFonts w:ascii="JetBrains Mono" w:hAnsi="JetBrains Mono" w:cs="JetBrains Mono"/>
+          <w:sz w:val="14"/>
+          <w:szCs w:val="14"/>
+          <w:lang w:val="hu-HU"/>
+        </w:rPr>
+        <w:t>      "lastUnread": {</w:t>
+      </w:r>
+    </w:p>
+    <w:p>
+      <w:pPr>
+        <w:spacing w:after="0"/>
+        <w:rPr>
+          <w:rFonts w:ascii="JetBrains Mono" w:hAnsi="JetBrains Mono" w:cs="JetBrains Mono"/>
+          <w:sz w:val="14"/>
+          <w:szCs w:val="14"/>
+          <w:lang w:val="hu-HU"/>
+        </w:rPr>
+      </w:pPr>
+      <w:r>
+        <w:rPr>
+          <w:rFonts w:ascii="JetBrains Mono" w:hAnsi="JetBrains Mono" w:cs="JetBrains Mono"/>
+          <w:sz w:val="14"/>
+          <w:szCs w:val="14"/>
+          <w:lang w:val="hu-HU"/>
+        </w:rPr>
+        <w:t>        "notificationId": "uuid",</w:t>
+      </w:r>
+    </w:p>
+    <w:p>
+      <w:pPr>
+        <w:spacing w:after="0"/>
+        <w:rPr>
+          <w:rFonts w:ascii="JetBrains Mono" w:hAnsi="JetBrains Mono" w:cs="JetBrains Mono"/>
+          <w:sz w:val="14"/>
+          <w:szCs w:val="14"/>
+          <w:lang w:val="hu-HU"/>
+        </w:rPr>
+      </w:pPr>
+      <w:r>
+        <w:rPr>
+          <w:rFonts w:ascii="JetBrains Mono" w:hAnsi="JetBrains Mono" w:cs="JetBrains Mono"/>
+          <w:sz w:val="14"/>
+          <w:szCs w:val="14"/>
+          <w:lang w:val="hu-HU"/>
+        </w:rPr>
+        <w:t>        "eventUrl": "#",</w:t>
+      </w:r>
+    </w:p>
+    <w:p>
+      <w:pPr>
+        <w:spacing w:after="0"/>
+        <w:rPr>
+          <w:rFonts w:ascii="JetBrains Mono" w:hAnsi="JetBrains Mono" w:cs="JetBrains Mono"/>
+          <w:sz w:val="14"/>
+          <w:szCs w:val="14"/>
+          <w:lang w:val="hu-HU"/>
+        </w:rPr>
+      </w:pPr>
+      <w:r>
+        <w:rPr>
+          <w:rFonts w:ascii="JetBrains Mono" w:hAnsi="JetBrains Mono" w:cs="JetBrains Mono"/>
+          <w:sz w:val="14"/>
+          <w:szCs w:val="14"/>
+          <w:lang w:val="hu-HU"/>
+        </w:rPr>
+        <w:t>        "courseName": "Calculus",</w:t>
+      </w:r>
+    </w:p>
+    <w:p>
+      <w:pPr>
+        <w:spacing w:after="0"/>
+        <w:rPr>
+          <w:rFonts w:ascii="JetBrains Mono" w:hAnsi="JetBrains Mono" w:cs="JetBrains Mono"/>
+          <w:sz w:val="14"/>
+          <w:szCs w:val="14"/>
+          <w:lang w:val="hu-HU"/>
+        </w:rPr>
+      </w:pPr>
+      <w:r>
+        <w:rPr>
+          <w:rFonts w:ascii="JetBrains Mono" w:hAnsi="JetBrains Mono" w:cs="JetBrains Mono"/>
+          <w:sz w:val="14"/>
+          <w:szCs w:val="14"/>
+          <w:lang w:val="hu-HU"/>
+        </w:rPr>
+        <w:t>        "text": "Submission graded"</w:t>
+      </w:r>
+    </w:p>
+    <w:p>
+      <w:pPr>
+        <w:spacing w:after="0"/>
+        <w:rPr>
+          <w:rFonts w:ascii="JetBrains Mono" w:hAnsi="JetBrains Mono" w:cs="JetBrains Mono"/>
+          <w:sz w:val="14"/>
+          <w:szCs w:val="14"/>
+          <w:lang w:val="hu-HU"/>
+        </w:rPr>
+      </w:pPr>
+      <w:r>
+        <w:rPr>
+          <w:rFonts w:ascii="JetBrains Mono" w:hAnsi="JetBrains Mono" w:cs="JetBrains Mono"/>
+          <w:sz w:val="14"/>
+          <w:szCs w:val="14"/>
+          <w:lang w:val="hu-HU"/>
+        </w:rPr>
+        <w:t>      }</w:t>
+      </w:r>
+    </w:p>
+    <w:p>
+      <w:pPr>
+        <w:spacing w:after="0"/>
+        <w:rPr>
+          <w:rFonts w:ascii="JetBrains Mono" w:hAnsi="JetBrains Mono" w:cs="JetBrains Mono"/>
+          <w:sz w:val="14"/>
+          <w:szCs w:val="14"/>
+          <w:lang w:val="hu-HU"/>
+        </w:rPr>
+      </w:pPr>
+      <w:r>
+        <w:rPr>
+          <w:rFonts w:ascii="JetBrains Mono" w:hAnsi="JetBrains Mono" w:cs="JetBrains Mono"/>
+          <w:sz w:val="14"/>
+          <w:szCs w:val="14"/>
+          <w:lang w:val="hu-HU"/>
+        </w:rPr>
+        <w:t>    }</w:t>
+      </w:r>
+    </w:p>
+    <w:p>
+      <w:pPr>
+        <w:spacing w:after="0"/>
+        <w:rPr>
+          <w:rFonts w:ascii="JetBrains Mono" w:hAnsi="JetBrains Mono" w:cs="JetBrains Mono"/>
+          <w:sz w:val="14"/>
+          <w:szCs w:val="14"/>
+          <w:lang w:val="hu-HU"/>
+        </w:rPr>
+      </w:pPr>
+      <w:r>
+        <w:rPr>
+          <w:rFonts w:ascii="JetBrains Mono" w:hAnsi="JetBrains Mono" w:cs="JetBrains Mono"/>
+          <w:sz w:val="14"/>
+          <w:szCs w:val="14"/>
+          <w:lang w:val="hu-HU"/>
+        </w:rPr>
+        <w:t>  }</w:t>
+      </w:r>
     </w:p>
     <w:p>
       <w:pPr>
@@ -13921,7 +15621,7 @@
   <w:style w:type="paragraph" w:default="1" w:styleId="Norml">
     <w:name w:val="Normal"/>
     <w:qFormat/>
-    <w:rsid w:val="00BD1260"/>
+    <w:rsid w:val="00B44BCC"/>
     <w:rPr>
       <w:lang w:val="en-US"/>
     </w:rPr>
@@ -14128,6 +15828,7 @@
   <w:style w:type="character" w:default="1" w:styleId="Bekezdsalapbettpusa">
     <w:name w:val="Default Paragraph Font"/>
     <w:uiPriority w:val="1"/>
+    <w:semiHidden/>
     <w:unhideWhenUsed/>
   </w:style>
   <w:style w:type="table" w:default="1" w:styleId="Normltblzat">

</xml_diff>

<commit_message>
Backend, Docs - updated docs, and adjusted api endpoints for auth
</commit_message>
<xml_diff>
--- a/Dev docs/Software_Architecture_Document.docx
+++ b/Dev docs/Software_Architecture_Document.docx
@@ -7585,6 +7585,206 @@
           <w:szCs w:val="14"/>
           <w:lang w:val="hu-HU"/>
         </w:rPr>
+        <w:t xml:space="preserve">": "Hand-in </w:t>
+      </w:r>
+      <w:proofErr w:type="spellStart"/>
+      <w:r>
+        <w:rPr>
+          <w:rFonts w:ascii="JetBrains Mono" w:hAnsi="JetBrains Mono" w:cs="JetBrains Mono"/>
+          <w:sz w:val="14"/>
+          <w:szCs w:val="14"/>
+          <w:lang w:val="hu-HU"/>
+        </w:rPr>
+        <w:t>deadline</w:t>
+      </w:r>
+      <w:proofErr w:type="spellEnd"/>
+      <w:r>
+        <w:rPr>
+          <w:rFonts w:ascii="JetBrains Mono" w:hAnsi="JetBrains Mono" w:cs="JetBrains Mono"/>
+          <w:sz w:val="14"/>
+          <w:szCs w:val="14"/>
+          <w:lang w:val="hu-HU"/>
+        </w:rPr>
+        <w:t>"</w:t>
+      </w:r>
+    </w:p>
+    <w:p>
+      <w:pPr>
+        <w:spacing w:after="0"/>
+        <w:rPr>
+          <w:rFonts w:ascii="JetBrains Mono" w:hAnsi="JetBrains Mono" w:cs="JetBrains Mono"/>
+          <w:sz w:val="14"/>
+          <w:szCs w:val="14"/>
+          <w:lang w:val="hu-HU"/>
+        </w:rPr>
+      </w:pPr>
+      <w:r>
+        <w:rPr>
+          <w:rFonts w:ascii="JetBrains Mono" w:hAnsi="JetBrains Mono" w:cs="JetBrains Mono"/>
+          <w:sz w:val="14"/>
+          <w:szCs w:val="14"/>
+          <w:lang w:val="hu-HU"/>
+        </w:rPr>
+        <w:t>            }</w:t>
+      </w:r>
+    </w:p>
+    <w:p>
+      <w:pPr>
+        <w:spacing w:after="0"/>
+        <w:rPr>
+          <w:rFonts w:ascii="JetBrains Mono" w:hAnsi="JetBrains Mono" w:cs="JetBrains Mono"/>
+          <w:sz w:val="14"/>
+          <w:szCs w:val="14"/>
+          <w:lang w:val="hu-HU"/>
+        </w:rPr>
+      </w:pPr>
+      <w:r>
+        <w:rPr>
+          <w:rFonts w:ascii="JetBrains Mono" w:hAnsi="JetBrains Mono" w:cs="JetBrains Mono"/>
+          <w:sz w:val="14"/>
+          <w:szCs w:val="14"/>
+          <w:lang w:val="hu-HU"/>
+        </w:rPr>
+        <w:t>          ]</w:t>
+      </w:r>
+    </w:p>
+    <w:p>
+      <w:pPr>
+        <w:spacing w:after="0"/>
+        <w:rPr>
+          <w:rFonts w:ascii="JetBrains Mono" w:hAnsi="JetBrains Mono" w:cs="JetBrains Mono"/>
+          <w:sz w:val="14"/>
+          <w:szCs w:val="14"/>
+          <w:lang w:val="hu-HU"/>
+        </w:rPr>
+      </w:pPr>
+      <w:r>
+        <w:rPr>
+          <w:rFonts w:ascii="JetBrains Mono" w:hAnsi="JetBrains Mono" w:cs="JetBrains Mono"/>
+          <w:sz w:val="14"/>
+          <w:szCs w:val="14"/>
+          <w:lang w:val="hu-HU"/>
+        </w:rPr>
+        <w:t>        }</w:t>
+      </w:r>
+    </w:p>
+    <w:p>
+      <w:pPr>
+        <w:spacing w:after="0"/>
+        <w:rPr>
+          <w:rFonts w:ascii="JetBrains Mono" w:hAnsi="JetBrains Mono" w:cs="JetBrains Mono"/>
+          <w:sz w:val="14"/>
+          <w:szCs w:val="14"/>
+          <w:lang w:val="hu-HU"/>
+        </w:rPr>
+      </w:pPr>
+      <w:r>
+        <w:rPr>
+          <w:rFonts w:ascii="JetBrains Mono" w:hAnsi="JetBrains Mono" w:cs="JetBrains Mono"/>
+          <w:sz w:val="14"/>
+          <w:szCs w:val="14"/>
+          <w:lang w:val="hu-HU"/>
+        </w:rPr>
+        <w:t>      ],</w:t>
+      </w:r>
+    </w:p>
+    <w:p>
+      <w:pPr>
+        <w:spacing w:after="0"/>
+        <w:rPr>
+          <w:rFonts w:ascii="JetBrains Mono" w:hAnsi="JetBrains Mono" w:cs="JetBrains Mono"/>
+          <w:sz w:val="14"/>
+          <w:szCs w:val="14"/>
+          <w:lang w:val="hu-HU"/>
+        </w:rPr>
+      </w:pPr>
+      <w:r>
+        <w:rPr>
+          <w:rFonts w:ascii="JetBrains Mono" w:hAnsi="JetBrains Mono" w:cs="JetBrains Mono"/>
+          <w:sz w:val="14"/>
+          <w:szCs w:val="14"/>
+          <w:lang w:val="hu-HU"/>
+        </w:rPr>
+        <w:t>      "</w:t>
+      </w:r>
+      <w:proofErr w:type="spellStart"/>
+      <w:r>
+        <w:rPr>
+          <w:rFonts w:ascii="JetBrains Mono" w:hAnsi="JetBrains Mono" w:cs="JetBrains Mono"/>
+          <w:sz w:val="14"/>
+          <w:szCs w:val="14"/>
+          <w:lang w:val="hu-HU"/>
+        </w:rPr>
+        <w:t>inactive</w:t>
+      </w:r>
+      <w:proofErr w:type="spellEnd"/>
+      <w:r>
+        <w:rPr>
+          <w:rFonts w:ascii="JetBrains Mono" w:hAnsi="JetBrains Mono" w:cs="JetBrains Mono"/>
+          <w:sz w:val="14"/>
+          <w:szCs w:val="14"/>
+          <w:lang w:val="hu-HU"/>
+        </w:rPr>
+        <w:t>": [</w:t>
+      </w:r>
+    </w:p>
+    <w:p>
+      <w:pPr>
+        <w:spacing w:after="0"/>
+        <w:rPr>
+          <w:rFonts w:ascii="JetBrains Mono" w:hAnsi="JetBrains Mono" w:cs="JetBrains Mono"/>
+          <w:sz w:val="14"/>
+          <w:szCs w:val="14"/>
+          <w:lang w:val="hu-HU"/>
+        </w:rPr>
+      </w:pPr>
+      <w:r>
+        <w:rPr>
+          <w:rFonts w:ascii="JetBrains Mono" w:hAnsi="JetBrains Mono" w:cs="JetBrains Mono"/>
+          <w:sz w:val="14"/>
+          <w:szCs w:val="14"/>
+          <w:lang w:val="hu-HU"/>
+        </w:rPr>
+        <w:t>        {</w:t>
+      </w:r>
+    </w:p>
+    <w:p>
+      <w:pPr>
+        <w:spacing w:after="0"/>
+        <w:rPr>
+          <w:rFonts w:ascii="JetBrains Mono" w:hAnsi="JetBrains Mono" w:cs="JetBrains Mono"/>
+          <w:sz w:val="14"/>
+          <w:szCs w:val="14"/>
+          <w:lang w:val="hu-HU"/>
+        </w:rPr>
+      </w:pPr>
+      <w:r>
+        <w:rPr>
+          <w:rFonts w:ascii="JetBrains Mono" w:hAnsi="JetBrains Mono" w:cs="JetBrains Mono"/>
+          <w:sz w:val="14"/>
+          <w:szCs w:val="14"/>
+          <w:lang w:val="hu-HU"/>
+        </w:rPr>
+        <w:t>          "</w:t>
+      </w:r>
+      <w:proofErr w:type="spellStart"/>
+      <w:r>
+        <w:rPr>
+          <w:rFonts w:ascii="JetBrains Mono" w:hAnsi="JetBrains Mono" w:cs="JetBrains Mono"/>
+          <w:sz w:val="14"/>
+          <w:szCs w:val="14"/>
+          <w:lang w:val="hu-HU"/>
+        </w:rPr>
+        <w:t>courseId</w:t>
+      </w:r>
+      <w:proofErr w:type="spellEnd"/>
+      <w:r>
+        <w:rPr>
+          <w:rFonts w:ascii="JetBrains Mono" w:hAnsi="JetBrains Mono" w:cs="JetBrains Mono"/>
+          <w:sz w:val="14"/>
+          <w:szCs w:val="14"/>
+          <w:lang w:val="hu-HU"/>
+        </w:rPr>
         <w:t>": "</w:t>
       </w:r>
       <w:proofErr w:type="spellStart"/>
@@ -7595,27 +7795,967 @@
           <w:szCs w:val="14"/>
           <w:lang w:val="hu-HU"/>
         </w:rPr>
-        <w:t>Hand</w:t>
-      </w:r>
-      <w:proofErr w:type="spellEnd"/>
-      <w:r>
-        <w:rPr>
-          <w:rFonts w:ascii="JetBrains Mono" w:hAnsi="JetBrains Mono" w:cs="JetBrains Mono"/>
-          <w:sz w:val="14"/>
-          <w:szCs w:val="14"/>
-          <w:lang w:val="hu-HU"/>
-        </w:rPr>
-        <w:t xml:space="preserve">-in </w:t>
-      </w:r>
-      <w:proofErr w:type="spellStart"/>
-      <w:r>
-        <w:rPr>
-          <w:rFonts w:ascii="JetBrains Mono" w:hAnsi="JetBrains Mono" w:cs="JetBrains Mono"/>
-          <w:sz w:val="14"/>
-          <w:szCs w:val="14"/>
-          <w:lang w:val="hu-HU"/>
-        </w:rPr>
-        <w:t>deadline</w:t>
+        <w:t>uuid</w:t>
+      </w:r>
+      <w:proofErr w:type="spellEnd"/>
+      <w:r>
+        <w:rPr>
+          <w:rFonts w:ascii="JetBrains Mono" w:hAnsi="JetBrains Mono" w:cs="JetBrains Mono"/>
+          <w:sz w:val="14"/>
+          <w:szCs w:val="14"/>
+          <w:lang w:val="hu-HU"/>
+        </w:rPr>
+        <w:t>",</w:t>
+      </w:r>
+    </w:p>
+    <w:p>
+      <w:pPr>
+        <w:spacing w:after="0"/>
+        <w:rPr>
+          <w:rFonts w:ascii="JetBrains Mono" w:hAnsi="JetBrains Mono" w:cs="JetBrains Mono"/>
+          <w:sz w:val="14"/>
+          <w:szCs w:val="14"/>
+          <w:lang w:val="hu-HU"/>
+        </w:rPr>
+      </w:pPr>
+      <w:r>
+        <w:rPr>
+          <w:rFonts w:ascii="JetBrains Mono" w:hAnsi="JetBrains Mono" w:cs="JetBrains Mono"/>
+          <w:sz w:val="14"/>
+          <w:szCs w:val="14"/>
+          <w:lang w:val="hu-HU"/>
+        </w:rPr>
+        <w:t>          "</w:t>
+      </w:r>
+      <w:proofErr w:type="spellStart"/>
+      <w:r>
+        <w:rPr>
+          <w:rFonts w:ascii="JetBrains Mono" w:hAnsi="JetBrains Mono" w:cs="JetBrains Mono"/>
+          <w:sz w:val="14"/>
+          <w:szCs w:val="14"/>
+          <w:lang w:val="hu-HU"/>
+        </w:rPr>
+        <w:t>instanceId</w:t>
+      </w:r>
+      <w:proofErr w:type="spellEnd"/>
+      <w:r>
+        <w:rPr>
+          <w:rFonts w:ascii="JetBrains Mono" w:hAnsi="JetBrains Mono" w:cs="JetBrains Mono"/>
+          <w:sz w:val="14"/>
+          <w:szCs w:val="14"/>
+          <w:lang w:val="hu-HU"/>
+        </w:rPr>
+        <w:t>": "</w:t>
+      </w:r>
+      <w:proofErr w:type="spellStart"/>
+      <w:r>
+        <w:rPr>
+          <w:rFonts w:ascii="JetBrains Mono" w:hAnsi="JetBrains Mono" w:cs="JetBrains Mono"/>
+          <w:sz w:val="14"/>
+          <w:szCs w:val="14"/>
+          <w:lang w:val="hu-HU"/>
+        </w:rPr>
+        <w:t>uuid</w:t>
+      </w:r>
+      <w:proofErr w:type="spellEnd"/>
+      <w:r>
+        <w:rPr>
+          <w:rFonts w:ascii="JetBrains Mono" w:hAnsi="JetBrains Mono" w:cs="JetBrains Mono"/>
+          <w:sz w:val="14"/>
+          <w:szCs w:val="14"/>
+          <w:lang w:val="hu-HU"/>
+        </w:rPr>
+        <w:t>",</w:t>
+      </w:r>
+    </w:p>
+    <w:p>
+      <w:pPr>
+        <w:spacing w:after="0"/>
+        <w:rPr>
+          <w:rFonts w:ascii="JetBrains Mono" w:hAnsi="JetBrains Mono" w:cs="JetBrains Mono"/>
+          <w:sz w:val="14"/>
+          <w:szCs w:val="14"/>
+          <w:lang w:val="hu-HU"/>
+        </w:rPr>
+      </w:pPr>
+      <w:r>
+        <w:rPr>
+          <w:rFonts w:ascii="JetBrains Mono" w:hAnsi="JetBrains Mono" w:cs="JetBrains Mono"/>
+          <w:sz w:val="14"/>
+          <w:szCs w:val="14"/>
+          <w:lang w:val="hu-HU"/>
+        </w:rPr>
+        <w:t>          "</w:t>
+      </w:r>
+      <w:proofErr w:type="spellStart"/>
+      <w:r>
+        <w:rPr>
+          <w:rFonts w:ascii="JetBrains Mono" w:hAnsi="JetBrains Mono" w:cs="JetBrains Mono"/>
+          <w:sz w:val="14"/>
+          <w:szCs w:val="14"/>
+          <w:lang w:val="hu-HU"/>
+        </w:rPr>
+        <w:t>courseName</w:t>
+      </w:r>
+      <w:proofErr w:type="spellEnd"/>
+      <w:r>
+        <w:rPr>
+          <w:rFonts w:ascii="JetBrains Mono" w:hAnsi="JetBrains Mono" w:cs="JetBrains Mono"/>
+          <w:sz w:val="14"/>
+          <w:szCs w:val="14"/>
+          <w:lang w:val="hu-HU"/>
+        </w:rPr>
+        <w:t xml:space="preserve">": "HTML5 </w:t>
+      </w:r>
+      <w:proofErr w:type="spellStart"/>
+      <w:r>
+        <w:rPr>
+          <w:rFonts w:ascii="JetBrains Mono" w:hAnsi="JetBrains Mono" w:cs="JetBrains Mono"/>
+          <w:sz w:val="14"/>
+          <w:szCs w:val="14"/>
+          <w:lang w:val="hu-HU"/>
+        </w:rPr>
+        <w:t>Baics</w:t>
+      </w:r>
+      <w:proofErr w:type="spellEnd"/>
+      <w:r>
+        <w:rPr>
+          <w:rFonts w:ascii="JetBrains Mono" w:hAnsi="JetBrains Mono" w:cs="JetBrains Mono"/>
+          <w:sz w:val="14"/>
+          <w:szCs w:val="14"/>
+          <w:lang w:val="hu-HU"/>
+        </w:rPr>
+        <w:t>",</w:t>
+      </w:r>
+    </w:p>
+    <w:p>
+      <w:pPr>
+        <w:spacing w:after="0"/>
+        <w:rPr>
+          <w:rFonts w:ascii="JetBrains Mono" w:hAnsi="JetBrains Mono" w:cs="JetBrains Mono"/>
+          <w:sz w:val="14"/>
+          <w:szCs w:val="14"/>
+          <w:lang w:val="hu-HU"/>
+        </w:rPr>
+      </w:pPr>
+      <w:r>
+        <w:rPr>
+          <w:rFonts w:ascii="JetBrains Mono" w:hAnsi="JetBrains Mono" w:cs="JetBrains Mono"/>
+          <w:sz w:val="14"/>
+          <w:szCs w:val="14"/>
+          <w:lang w:val="hu-HU"/>
+        </w:rPr>
+        <w:t>          "</w:t>
+      </w:r>
+      <w:proofErr w:type="spellStart"/>
+      <w:r>
+        <w:rPr>
+          <w:rFonts w:ascii="JetBrains Mono" w:hAnsi="JetBrains Mono" w:cs="JetBrains Mono"/>
+          <w:sz w:val="14"/>
+          <w:szCs w:val="14"/>
+          <w:lang w:val="hu-HU"/>
+        </w:rPr>
+        <w:t>imageUrl</w:t>
+      </w:r>
+      <w:proofErr w:type="spellEnd"/>
+      <w:r>
+        <w:rPr>
+          <w:rFonts w:ascii="JetBrains Mono" w:hAnsi="JetBrains Mono" w:cs="JetBrains Mono"/>
+          <w:sz w:val="14"/>
+          <w:szCs w:val="14"/>
+          <w:lang w:val="hu-HU"/>
+        </w:rPr>
+        <w:t>": "",</w:t>
+      </w:r>
+    </w:p>
+    <w:p>
+      <w:pPr>
+        <w:spacing w:after="0"/>
+        <w:rPr>
+          <w:rFonts w:ascii="JetBrains Mono" w:hAnsi="JetBrains Mono" w:cs="JetBrains Mono"/>
+          <w:sz w:val="14"/>
+          <w:szCs w:val="14"/>
+          <w:lang w:val="hu-HU"/>
+        </w:rPr>
+      </w:pPr>
+      <w:r>
+        <w:rPr>
+          <w:rFonts w:ascii="JetBrains Mono" w:hAnsi="JetBrains Mono" w:cs="JetBrains Mono"/>
+          <w:sz w:val="14"/>
+          <w:szCs w:val="14"/>
+          <w:lang w:val="hu-HU"/>
+        </w:rPr>
+        <w:t>          "</w:t>
+      </w:r>
+      <w:proofErr w:type="spellStart"/>
+      <w:r>
+        <w:rPr>
+          <w:rFonts w:ascii="JetBrains Mono" w:hAnsi="JetBrains Mono" w:cs="JetBrains Mono"/>
+          <w:sz w:val="14"/>
+          <w:szCs w:val="14"/>
+          <w:lang w:val="hu-HU"/>
+        </w:rPr>
+        <w:t>teacherName</w:t>
+      </w:r>
+      <w:proofErr w:type="spellEnd"/>
+      <w:r>
+        <w:rPr>
+          <w:rFonts w:ascii="JetBrains Mono" w:hAnsi="JetBrains Mono" w:cs="JetBrains Mono"/>
+          <w:sz w:val="14"/>
+          <w:szCs w:val="14"/>
+          <w:lang w:val="hu-HU"/>
+        </w:rPr>
+        <w:t>": "Mr. John Smith",</w:t>
+      </w:r>
+    </w:p>
+    <w:p>
+      <w:pPr>
+        <w:spacing w:after="0"/>
+        <w:rPr>
+          <w:rFonts w:ascii="JetBrains Mono" w:hAnsi="JetBrains Mono" w:cs="JetBrains Mono"/>
+          <w:sz w:val="14"/>
+          <w:szCs w:val="14"/>
+          <w:lang w:val="hu-HU"/>
+        </w:rPr>
+      </w:pPr>
+      <w:r>
+        <w:rPr>
+          <w:rFonts w:ascii="JetBrains Mono" w:hAnsi="JetBrains Mono" w:cs="JetBrains Mono"/>
+          <w:sz w:val="14"/>
+          <w:szCs w:val="14"/>
+          <w:lang w:val="hu-HU"/>
+        </w:rPr>
+        <w:t>          "</w:t>
+      </w:r>
+      <w:proofErr w:type="spellStart"/>
+      <w:r>
+        <w:rPr>
+          <w:rFonts w:ascii="JetBrains Mono" w:hAnsi="JetBrains Mono" w:cs="JetBrains Mono"/>
+          <w:sz w:val="14"/>
+          <w:szCs w:val="14"/>
+          <w:lang w:val="hu-HU"/>
+        </w:rPr>
+        <w:t>courseType</w:t>
+      </w:r>
+      <w:proofErr w:type="spellEnd"/>
+      <w:r>
+        <w:rPr>
+          <w:rFonts w:ascii="JetBrains Mono" w:hAnsi="JetBrains Mono" w:cs="JetBrains Mono"/>
+          <w:sz w:val="14"/>
+          <w:szCs w:val="14"/>
+          <w:lang w:val="hu-HU"/>
+        </w:rPr>
+        <w:t>": "</w:t>
+      </w:r>
+      <w:proofErr w:type="spellStart"/>
+      <w:r>
+        <w:rPr>
+          <w:rFonts w:ascii="JetBrains Mono" w:hAnsi="JetBrains Mono" w:cs="JetBrains Mono"/>
+          <w:sz w:val="14"/>
+          <w:szCs w:val="14"/>
+          <w:lang w:val="hu-HU"/>
+        </w:rPr>
+        <w:t>learningPath</w:t>
+      </w:r>
+      <w:proofErr w:type="spellEnd"/>
+      <w:r>
+        <w:rPr>
+          <w:rFonts w:ascii="JetBrains Mono" w:hAnsi="JetBrains Mono" w:cs="JetBrains Mono"/>
+          <w:sz w:val="14"/>
+          <w:szCs w:val="14"/>
+          <w:lang w:val="hu-HU"/>
+        </w:rPr>
+        <w:t>",</w:t>
+      </w:r>
+    </w:p>
+    <w:p>
+      <w:pPr>
+        <w:spacing w:after="0"/>
+        <w:rPr>
+          <w:rFonts w:ascii="JetBrains Mono" w:hAnsi="JetBrains Mono" w:cs="JetBrains Mono"/>
+          <w:sz w:val="14"/>
+          <w:szCs w:val="14"/>
+          <w:lang w:val="hu-HU"/>
+        </w:rPr>
+      </w:pPr>
+      <w:r>
+        <w:rPr>
+          <w:rFonts w:ascii="JetBrains Mono" w:hAnsi="JetBrains Mono" w:cs="JetBrains Mono"/>
+          <w:sz w:val="14"/>
+          <w:szCs w:val="14"/>
+          <w:lang w:val="hu-HU"/>
+        </w:rPr>
+        <w:t>          "</w:t>
+      </w:r>
+      <w:proofErr w:type="spellStart"/>
+      <w:r>
+        <w:rPr>
+          <w:rFonts w:ascii="JetBrains Mono" w:hAnsi="JetBrains Mono" w:cs="JetBrains Mono"/>
+          <w:sz w:val="14"/>
+          <w:szCs w:val="14"/>
+          <w:lang w:val="hu-HU"/>
+        </w:rPr>
+        <w:t>progress</w:t>
+      </w:r>
+      <w:proofErr w:type="spellEnd"/>
+      <w:r>
+        <w:rPr>
+          <w:rFonts w:ascii="JetBrains Mono" w:hAnsi="JetBrains Mono" w:cs="JetBrains Mono"/>
+          <w:sz w:val="14"/>
+          <w:szCs w:val="14"/>
+          <w:lang w:val="hu-HU"/>
+        </w:rPr>
+        <w:t>": 100</w:t>
+      </w:r>
+    </w:p>
+    <w:p>
+      <w:pPr>
+        <w:spacing w:after="0"/>
+        <w:rPr>
+          <w:rFonts w:ascii="JetBrains Mono" w:hAnsi="JetBrains Mono" w:cs="JetBrains Mono"/>
+          <w:sz w:val="14"/>
+          <w:szCs w:val="14"/>
+          <w:lang w:val="hu-HU"/>
+        </w:rPr>
+      </w:pPr>
+      <w:r>
+        <w:rPr>
+          <w:rFonts w:ascii="JetBrains Mono" w:hAnsi="JetBrains Mono" w:cs="JetBrains Mono"/>
+          <w:sz w:val="14"/>
+          <w:szCs w:val="14"/>
+          <w:lang w:val="hu-HU"/>
+        </w:rPr>
+        <w:t>        }</w:t>
+      </w:r>
+    </w:p>
+    <w:p>
+      <w:pPr>
+        <w:spacing w:after="0"/>
+        <w:rPr>
+          <w:rFonts w:ascii="JetBrains Mono" w:hAnsi="JetBrains Mono" w:cs="JetBrains Mono"/>
+          <w:sz w:val="14"/>
+          <w:szCs w:val="14"/>
+          <w:lang w:val="hu-HU"/>
+        </w:rPr>
+      </w:pPr>
+      <w:r>
+        <w:rPr>
+          <w:rFonts w:ascii="JetBrains Mono" w:hAnsi="JetBrains Mono" w:cs="JetBrains Mono"/>
+          <w:sz w:val="14"/>
+          <w:szCs w:val="14"/>
+          <w:lang w:val="hu-HU"/>
+        </w:rPr>
+        <w:t>      ]</w:t>
+      </w:r>
+    </w:p>
+    <w:p>
+      <w:pPr>
+        <w:spacing w:after="0"/>
+        <w:rPr>
+          <w:rFonts w:ascii="JetBrains Mono" w:hAnsi="JetBrains Mono" w:cs="JetBrains Mono"/>
+          <w:sz w:val="14"/>
+          <w:szCs w:val="14"/>
+          <w:lang w:val="hu-HU"/>
+        </w:rPr>
+      </w:pPr>
+      <w:r>
+        <w:rPr>
+          <w:rFonts w:ascii="JetBrains Mono" w:hAnsi="JetBrains Mono" w:cs="JetBrains Mono"/>
+          <w:sz w:val="14"/>
+          <w:szCs w:val="14"/>
+          <w:lang w:val="hu-HU"/>
+        </w:rPr>
+        <w:t>    },</w:t>
+      </w:r>
+    </w:p>
+    <w:p>
+      <w:pPr>
+        <w:spacing w:after="0"/>
+        <w:rPr>
+          <w:rFonts w:ascii="JetBrains Mono" w:hAnsi="JetBrains Mono" w:cs="JetBrains Mono"/>
+          <w:sz w:val="14"/>
+          <w:szCs w:val="14"/>
+          <w:lang w:val="hu-HU"/>
+        </w:rPr>
+      </w:pPr>
+      <w:r>
+        <w:rPr>
+          <w:rFonts w:ascii="JetBrains Mono" w:hAnsi="JetBrains Mono" w:cs="JetBrains Mono"/>
+          <w:sz w:val="14"/>
+          <w:szCs w:val="14"/>
+          <w:lang w:val="hu-HU"/>
+        </w:rPr>
+        <w:t>    "</w:t>
+      </w:r>
+      <w:proofErr w:type="spellStart"/>
+      <w:r>
+        <w:rPr>
+          <w:rFonts w:ascii="JetBrains Mono" w:hAnsi="JetBrains Mono" w:cs="JetBrains Mono"/>
+          <w:sz w:val="14"/>
+          <w:szCs w:val="14"/>
+          <w:lang w:val="hu-HU"/>
+        </w:rPr>
+        <w:t>upcomingEvents</w:t>
+      </w:r>
+      <w:proofErr w:type="spellEnd"/>
+      <w:r>
+        <w:rPr>
+          <w:rFonts w:ascii="JetBrains Mono" w:hAnsi="JetBrains Mono" w:cs="JetBrains Mono"/>
+          <w:sz w:val="14"/>
+          <w:szCs w:val="14"/>
+          <w:lang w:val="hu-HU"/>
+        </w:rPr>
+        <w:t>": [</w:t>
+      </w:r>
+    </w:p>
+    <w:p>
+      <w:pPr>
+        <w:spacing w:after="0"/>
+        <w:rPr>
+          <w:rFonts w:ascii="JetBrains Mono" w:hAnsi="JetBrains Mono" w:cs="JetBrains Mono"/>
+          <w:sz w:val="14"/>
+          <w:szCs w:val="14"/>
+          <w:lang w:val="hu-HU"/>
+        </w:rPr>
+      </w:pPr>
+      <w:r>
+        <w:rPr>
+          <w:rFonts w:ascii="JetBrains Mono" w:hAnsi="JetBrains Mono" w:cs="JetBrains Mono"/>
+          <w:sz w:val="14"/>
+          <w:szCs w:val="14"/>
+          <w:lang w:val="hu-HU"/>
+        </w:rPr>
+        <w:t>      {</w:t>
+      </w:r>
+    </w:p>
+    <w:p>
+      <w:pPr>
+        <w:spacing w:after="0"/>
+        <w:rPr>
+          <w:rFonts w:ascii="JetBrains Mono" w:hAnsi="JetBrains Mono" w:cs="JetBrains Mono"/>
+          <w:sz w:val="14"/>
+          <w:szCs w:val="14"/>
+          <w:lang w:val="hu-HU"/>
+        </w:rPr>
+      </w:pPr>
+      <w:r>
+        <w:rPr>
+          <w:rFonts w:ascii="JetBrains Mono" w:hAnsi="JetBrains Mono" w:cs="JetBrains Mono"/>
+          <w:sz w:val="14"/>
+          <w:szCs w:val="14"/>
+          <w:lang w:val="hu-HU"/>
+        </w:rPr>
+        <w:t>        "</w:t>
+      </w:r>
+      <w:proofErr w:type="spellStart"/>
+      <w:r>
+        <w:rPr>
+          <w:rFonts w:ascii="JetBrains Mono" w:hAnsi="JetBrains Mono" w:cs="JetBrains Mono"/>
+          <w:sz w:val="14"/>
+          <w:szCs w:val="14"/>
+          <w:lang w:val="hu-HU"/>
+        </w:rPr>
+        <w:t>eventId</w:t>
+      </w:r>
+      <w:proofErr w:type="spellEnd"/>
+      <w:r>
+        <w:rPr>
+          <w:rFonts w:ascii="JetBrains Mono" w:hAnsi="JetBrains Mono" w:cs="JetBrains Mono"/>
+          <w:sz w:val="14"/>
+          <w:szCs w:val="14"/>
+          <w:lang w:val="hu-HU"/>
+        </w:rPr>
+        <w:t>": "</w:t>
+      </w:r>
+      <w:proofErr w:type="spellStart"/>
+      <w:r>
+        <w:rPr>
+          <w:rFonts w:ascii="JetBrains Mono" w:hAnsi="JetBrains Mono" w:cs="JetBrains Mono"/>
+          <w:sz w:val="14"/>
+          <w:szCs w:val="14"/>
+          <w:lang w:val="hu-HU"/>
+        </w:rPr>
+        <w:t>uuid</w:t>
+      </w:r>
+      <w:proofErr w:type="spellEnd"/>
+      <w:r>
+        <w:rPr>
+          <w:rFonts w:ascii="JetBrains Mono" w:hAnsi="JetBrains Mono" w:cs="JetBrains Mono"/>
+          <w:sz w:val="14"/>
+          <w:szCs w:val="14"/>
+          <w:lang w:val="hu-HU"/>
+        </w:rPr>
+        <w:t>",</w:t>
+      </w:r>
+    </w:p>
+    <w:p>
+      <w:pPr>
+        <w:spacing w:after="0"/>
+        <w:rPr>
+          <w:rFonts w:ascii="JetBrains Mono" w:hAnsi="JetBrains Mono" w:cs="JetBrains Mono"/>
+          <w:sz w:val="14"/>
+          <w:szCs w:val="14"/>
+          <w:lang w:val="hu-HU"/>
+        </w:rPr>
+      </w:pPr>
+      <w:r>
+        <w:rPr>
+          <w:rFonts w:ascii="JetBrains Mono" w:hAnsi="JetBrains Mono" w:cs="JetBrains Mono"/>
+          <w:sz w:val="14"/>
+          <w:szCs w:val="14"/>
+          <w:lang w:val="hu-HU"/>
+        </w:rPr>
+        <w:t>        "</w:t>
+      </w:r>
+      <w:proofErr w:type="spellStart"/>
+      <w:r>
+        <w:rPr>
+          <w:rFonts w:ascii="JetBrains Mono" w:hAnsi="JetBrains Mono" w:cs="JetBrains Mono"/>
+          <w:sz w:val="14"/>
+          <w:szCs w:val="14"/>
+          <w:lang w:val="hu-HU"/>
+        </w:rPr>
+        <w:t>eventUrl</w:t>
+      </w:r>
+      <w:proofErr w:type="spellEnd"/>
+      <w:r>
+        <w:rPr>
+          <w:rFonts w:ascii="JetBrains Mono" w:hAnsi="JetBrains Mono" w:cs="JetBrains Mono"/>
+          <w:sz w:val="14"/>
+          <w:szCs w:val="14"/>
+          <w:lang w:val="hu-HU"/>
+        </w:rPr>
+        <w:t>": "#",</w:t>
+      </w:r>
+    </w:p>
+    <w:p>
+      <w:pPr>
+        <w:spacing w:after="0"/>
+        <w:rPr>
+          <w:rFonts w:ascii="JetBrains Mono" w:hAnsi="JetBrains Mono" w:cs="JetBrains Mono"/>
+          <w:sz w:val="14"/>
+          <w:szCs w:val="14"/>
+          <w:lang w:val="hu-HU"/>
+        </w:rPr>
+      </w:pPr>
+      <w:r>
+        <w:rPr>
+          <w:rFonts w:ascii="JetBrains Mono" w:hAnsi="JetBrains Mono" w:cs="JetBrains Mono"/>
+          <w:sz w:val="14"/>
+          <w:szCs w:val="14"/>
+          <w:lang w:val="hu-HU"/>
+        </w:rPr>
+        <w:t>        "</w:t>
+      </w:r>
+      <w:proofErr w:type="spellStart"/>
+      <w:r>
+        <w:rPr>
+          <w:rFonts w:ascii="JetBrains Mono" w:hAnsi="JetBrains Mono" w:cs="JetBrains Mono"/>
+          <w:sz w:val="14"/>
+          <w:szCs w:val="14"/>
+          <w:lang w:val="hu-HU"/>
+        </w:rPr>
+        <w:t>title</w:t>
+      </w:r>
+      <w:proofErr w:type="spellEnd"/>
+      <w:r>
+        <w:rPr>
+          <w:rFonts w:ascii="JetBrains Mono" w:hAnsi="JetBrains Mono" w:cs="JetBrains Mono"/>
+          <w:sz w:val="14"/>
+          <w:szCs w:val="14"/>
+          <w:lang w:val="hu-HU"/>
+        </w:rPr>
+        <w:t>": "</w:t>
+      </w:r>
+      <w:proofErr w:type="spellStart"/>
+      <w:r>
+        <w:rPr>
+          <w:rFonts w:ascii="JetBrains Mono" w:hAnsi="JetBrains Mono" w:cs="JetBrains Mono"/>
+          <w:sz w:val="14"/>
+          <w:szCs w:val="14"/>
+          <w:lang w:val="hu-HU"/>
+        </w:rPr>
+        <w:t>Calculus</w:t>
+      </w:r>
+      <w:proofErr w:type="spellEnd"/>
+      <w:r>
+        <w:rPr>
+          <w:rFonts w:ascii="JetBrains Mono" w:hAnsi="JetBrains Mono" w:cs="JetBrains Mono"/>
+          <w:sz w:val="14"/>
+          <w:szCs w:val="14"/>
+          <w:lang w:val="hu-HU"/>
+        </w:rPr>
+        <w:t xml:space="preserve"> </w:t>
+      </w:r>
+      <w:proofErr w:type="spellStart"/>
+      <w:r>
+        <w:rPr>
+          <w:rFonts w:ascii="JetBrains Mono" w:hAnsi="JetBrains Mono" w:cs="JetBrains Mono"/>
+          <w:sz w:val="14"/>
+          <w:szCs w:val="14"/>
+          <w:lang w:val="hu-HU"/>
+        </w:rPr>
+        <w:t>lesson</w:t>
+      </w:r>
+      <w:proofErr w:type="spellEnd"/>
+      <w:r>
+        <w:rPr>
+          <w:rFonts w:ascii="JetBrains Mono" w:hAnsi="JetBrains Mono" w:cs="JetBrains Mono"/>
+          <w:sz w:val="14"/>
+          <w:szCs w:val="14"/>
+          <w:lang w:val="hu-HU"/>
+        </w:rPr>
+        <w:t>",</w:t>
+      </w:r>
+    </w:p>
+    <w:p>
+      <w:pPr>
+        <w:spacing w:after="0"/>
+        <w:rPr>
+          <w:rFonts w:ascii="JetBrains Mono" w:hAnsi="JetBrains Mono" w:cs="JetBrains Mono"/>
+          <w:sz w:val="14"/>
+          <w:szCs w:val="14"/>
+          <w:lang w:val="hu-HU"/>
+        </w:rPr>
+      </w:pPr>
+      <w:r>
+        <w:rPr>
+          <w:rFonts w:ascii="JetBrains Mono" w:hAnsi="JetBrains Mono" w:cs="JetBrains Mono"/>
+          <w:sz w:val="14"/>
+          <w:szCs w:val="14"/>
+          <w:lang w:val="hu-HU"/>
+        </w:rPr>
+        <w:t>        "</w:t>
+      </w:r>
+      <w:proofErr w:type="spellStart"/>
+      <w:r>
+        <w:rPr>
+          <w:rFonts w:ascii="JetBrains Mono" w:hAnsi="JetBrains Mono" w:cs="JetBrains Mono"/>
+          <w:sz w:val="14"/>
+          <w:szCs w:val="14"/>
+          <w:lang w:val="hu-HU"/>
+        </w:rPr>
+        <w:t>startDate</w:t>
+      </w:r>
+      <w:proofErr w:type="spellEnd"/>
+      <w:r>
+        <w:rPr>
+          <w:rFonts w:ascii="JetBrains Mono" w:hAnsi="JetBrains Mono" w:cs="JetBrains Mono"/>
+          <w:sz w:val="14"/>
+          <w:szCs w:val="14"/>
+          <w:lang w:val="hu-HU"/>
+        </w:rPr>
+        <w:t>": "01-12",</w:t>
+      </w:r>
+    </w:p>
+    <w:p>
+      <w:pPr>
+        <w:spacing w:after="0"/>
+        <w:rPr>
+          <w:rFonts w:ascii="JetBrains Mono" w:hAnsi="JetBrains Mono" w:cs="JetBrains Mono"/>
+          <w:sz w:val="14"/>
+          <w:szCs w:val="14"/>
+          <w:lang w:val="hu-HU"/>
+        </w:rPr>
+      </w:pPr>
+      <w:r>
+        <w:rPr>
+          <w:rFonts w:ascii="JetBrains Mono" w:hAnsi="JetBrains Mono" w:cs="JetBrains Mono"/>
+          <w:sz w:val="14"/>
+          <w:szCs w:val="14"/>
+          <w:lang w:val="hu-HU"/>
+        </w:rPr>
+        <w:t>        "</w:t>
+      </w:r>
+      <w:proofErr w:type="spellStart"/>
+      <w:r>
+        <w:rPr>
+          <w:rFonts w:ascii="JetBrains Mono" w:hAnsi="JetBrains Mono" w:cs="JetBrains Mono"/>
+          <w:sz w:val="14"/>
+          <w:szCs w:val="14"/>
+          <w:lang w:val="hu-HU"/>
+        </w:rPr>
+        <w:t>startTime</w:t>
+      </w:r>
+      <w:proofErr w:type="spellEnd"/>
+      <w:r>
+        <w:rPr>
+          <w:rFonts w:ascii="JetBrains Mono" w:hAnsi="JetBrains Mono" w:cs="JetBrains Mono"/>
+          <w:sz w:val="14"/>
+          <w:szCs w:val="14"/>
+          <w:lang w:val="hu-HU"/>
+        </w:rPr>
+        <w:t>": "12:00",</w:t>
+      </w:r>
+    </w:p>
+    <w:p>
+      <w:pPr>
+        <w:spacing w:after="0"/>
+        <w:rPr>
+          <w:rFonts w:ascii="JetBrains Mono" w:hAnsi="JetBrains Mono" w:cs="JetBrains Mono"/>
+          <w:sz w:val="14"/>
+          <w:szCs w:val="14"/>
+          <w:lang w:val="hu-HU"/>
+        </w:rPr>
+      </w:pPr>
+      <w:r>
+        <w:rPr>
+          <w:rFonts w:ascii="JetBrains Mono" w:hAnsi="JetBrains Mono" w:cs="JetBrains Mono"/>
+          <w:sz w:val="14"/>
+          <w:szCs w:val="14"/>
+          <w:lang w:val="hu-HU"/>
+        </w:rPr>
+        <w:t>        "</w:t>
+      </w:r>
+      <w:proofErr w:type="spellStart"/>
+      <w:r>
+        <w:rPr>
+          <w:rFonts w:ascii="JetBrains Mono" w:hAnsi="JetBrains Mono" w:cs="JetBrains Mono"/>
+          <w:sz w:val="14"/>
+          <w:szCs w:val="14"/>
+          <w:lang w:val="hu-HU"/>
+        </w:rPr>
+        <w:t>courseName</w:t>
+      </w:r>
+      <w:proofErr w:type="spellEnd"/>
+      <w:r>
+        <w:rPr>
+          <w:rFonts w:ascii="JetBrains Mono" w:hAnsi="JetBrains Mono" w:cs="JetBrains Mono"/>
+          <w:sz w:val="14"/>
+          <w:szCs w:val="14"/>
+          <w:lang w:val="hu-HU"/>
+        </w:rPr>
+        <w:t>": "</w:t>
+      </w:r>
+      <w:proofErr w:type="spellStart"/>
+      <w:r>
+        <w:rPr>
+          <w:rFonts w:ascii="JetBrains Mono" w:hAnsi="JetBrains Mono" w:cs="JetBrains Mono"/>
+          <w:sz w:val="14"/>
+          <w:szCs w:val="14"/>
+          <w:lang w:val="hu-HU"/>
+        </w:rPr>
+        <w:t>Calculus</w:t>
+      </w:r>
+      <w:proofErr w:type="spellEnd"/>
+      <w:r>
+        <w:rPr>
+          <w:rFonts w:ascii="JetBrains Mono" w:hAnsi="JetBrains Mono" w:cs="JetBrains Mono"/>
+          <w:sz w:val="14"/>
+          <w:szCs w:val="14"/>
+          <w:lang w:val="hu-HU"/>
+        </w:rPr>
+        <w:t>",</w:t>
+      </w:r>
+    </w:p>
+    <w:p>
+      <w:pPr>
+        <w:spacing w:after="0"/>
+        <w:rPr>
+          <w:rFonts w:ascii="JetBrains Mono" w:hAnsi="JetBrains Mono" w:cs="JetBrains Mono"/>
+          <w:sz w:val="14"/>
+          <w:szCs w:val="14"/>
+          <w:lang w:val="hu-HU"/>
+        </w:rPr>
+      </w:pPr>
+      <w:r>
+        <w:rPr>
+          <w:rFonts w:ascii="JetBrains Mono" w:hAnsi="JetBrains Mono" w:cs="JetBrains Mono"/>
+          <w:sz w:val="14"/>
+          <w:szCs w:val="14"/>
+          <w:lang w:val="hu-HU"/>
+        </w:rPr>
+        <w:t>        "</w:t>
+      </w:r>
+      <w:proofErr w:type="spellStart"/>
+      <w:r>
+        <w:rPr>
+          <w:rFonts w:ascii="JetBrains Mono" w:hAnsi="JetBrains Mono" w:cs="JetBrains Mono"/>
+          <w:sz w:val="14"/>
+          <w:szCs w:val="14"/>
+          <w:lang w:val="hu-HU"/>
+        </w:rPr>
+        <w:t>teacherName</w:t>
+      </w:r>
+      <w:proofErr w:type="spellEnd"/>
+      <w:r>
+        <w:rPr>
+          <w:rFonts w:ascii="JetBrains Mono" w:hAnsi="JetBrains Mono" w:cs="JetBrains Mono"/>
+          <w:sz w:val="14"/>
+          <w:szCs w:val="14"/>
+          <w:lang w:val="hu-HU"/>
+        </w:rPr>
+        <w:t xml:space="preserve">": "Dr. John </w:t>
+      </w:r>
+      <w:proofErr w:type="spellStart"/>
+      <w:r>
+        <w:rPr>
+          <w:rFonts w:ascii="JetBrains Mono" w:hAnsi="JetBrains Mono" w:cs="JetBrains Mono"/>
+          <w:sz w:val="14"/>
+          <w:szCs w:val="14"/>
+          <w:lang w:val="hu-HU"/>
+        </w:rPr>
+        <w:t>Doe</w:t>
+      </w:r>
+      <w:proofErr w:type="spellEnd"/>
+      <w:r>
+        <w:rPr>
+          <w:rFonts w:ascii="JetBrains Mono" w:hAnsi="JetBrains Mono" w:cs="JetBrains Mono"/>
+          <w:sz w:val="14"/>
+          <w:szCs w:val="14"/>
+          <w:lang w:val="hu-HU"/>
+        </w:rPr>
+        <w:t>",</w:t>
+      </w:r>
+    </w:p>
+    <w:p>
+      <w:pPr>
+        <w:spacing w:after="0"/>
+        <w:rPr>
+          <w:rFonts w:ascii="JetBrains Mono" w:hAnsi="JetBrains Mono" w:cs="JetBrains Mono"/>
+          <w:sz w:val="14"/>
+          <w:szCs w:val="14"/>
+          <w:lang w:val="hu-HU"/>
+        </w:rPr>
+      </w:pPr>
+      <w:r>
+        <w:rPr>
+          <w:rFonts w:ascii="JetBrains Mono" w:hAnsi="JetBrains Mono" w:cs="JetBrains Mono"/>
+          <w:sz w:val="14"/>
+          <w:szCs w:val="14"/>
+          <w:lang w:val="hu-HU"/>
+        </w:rPr>
+        <w:t>        "</w:t>
+      </w:r>
+      <w:proofErr w:type="spellStart"/>
+      <w:r>
+        <w:rPr>
+          <w:rFonts w:ascii="JetBrains Mono" w:hAnsi="JetBrains Mono" w:cs="JetBrains Mono"/>
+          <w:sz w:val="14"/>
+          <w:szCs w:val="14"/>
+          <w:lang w:val="hu-HU"/>
+        </w:rPr>
+        <w:t>eventType</w:t>
+      </w:r>
+      <w:proofErr w:type="spellEnd"/>
+      <w:r>
+        <w:rPr>
+          <w:rFonts w:ascii="JetBrains Mono" w:hAnsi="JetBrains Mono" w:cs="JetBrains Mono"/>
+          <w:sz w:val="14"/>
+          <w:szCs w:val="14"/>
+          <w:lang w:val="hu-HU"/>
+        </w:rPr>
+        <w:t>": "</w:t>
+      </w:r>
+      <w:proofErr w:type="spellStart"/>
+      <w:r>
+        <w:rPr>
+          <w:rFonts w:ascii="JetBrains Mono" w:hAnsi="JetBrains Mono" w:cs="JetBrains Mono"/>
+          <w:sz w:val="14"/>
+          <w:szCs w:val="14"/>
+          <w:lang w:val="hu-HU"/>
+        </w:rPr>
+        <w:t>lesson</w:t>
+      </w:r>
+      <w:proofErr w:type="spellEnd"/>
+      <w:r>
+        <w:rPr>
+          <w:rFonts w:ascii="JetBrains Mono" w:hAnsi="JetBrains Mono" w:cs="JetBrains Mono"/>
+          <w:sz w:val="14"/>
+          <w:szCs w:val="14"/>
+          <w:lang w:val="hu-HU"/>
+        </w:rPr>
+        <w:t>",</w:t>
+      </w:r>
+    </w:p>
+    <w:p>
+      <w:pPr>
+        <w:spacing w:after="0"/>
+        <w:rPr>
+          <w:rFonts w:ascii="JetBrains Mono" w:hAnsi="JetBrains Mono" w:cs="JetBrains Mono"/>
+          <w:sz w:val="14"/>
+          <w:szCs w:val="14"/>
+          <w:lang w:val="hu-HU"/>
+        </w:rPr>
+      </w:pPr>
+      <w:r>
+        <w:rPr>
+          <w:rFonts w:ascii="JetBrains Mono" w:hAnsi="JetBrains Mono" w:cs="JetBrains Mono"/>
+          <w:sz w:val="14"/>
+          <w:szCs w:val="14"/>
+          <w:lang w:val="hu-HU"/>
+        </w:rPr>
+        <w:t>        "</w:t>
+      </w:r>
+      <w:proofErr w:type="spellStart"/>
+      <w:r>
+        <w:rPr>
+          <w:rFonts w:ascii="JetBrains Mono" w:hAnsi="JetBrains Mono" w:cs="JetBrains Mono"/>
+          <w:sz w:val="14"/>
+          <w:szCs w:val="14"/>
+          <w:lang w:val="hu-HU"/>
+        </w:rPr>
+        <w:t>description</w:t>
+      </w:r>
+      <w:proofErr w:type="spellEnd"/>
+      <w:r>
+        <w:rPr>
+          <w:rFonts w:ascii="JetBrains Mono" w:hAnsi="JetBrains Mono" w:cs="JetBrains Mono"/>
+          <w:sz w:val="14"/>
+          <w:szCs w:val="14"/>
+          <w:lang w:val="hu-HU"/>
+        </w:rPr>
+        <w:t xml:space="preserve">": "The </w:t>
+      </w:r>
+      <w:proofErr w:type="spellStart"/>
+      <w:r>
+        <w:rPr>
+          <w:rFonts w:ascii="JetBrains Mono" w:hAnsi="JetBrains Mono" w:cs="JetBrains Mono"/>
+          <w:sz w:val="14"/>
+          <w:szCs w:val="14"/>
+          <w:lang w:val="hu-HU"/>
+        </w:rPr>
+        <w:t>next</w:t>
+      </w:r>
+      <w:proofErr w:type="spellEnd"/>
+      <w:r>
+        <w:rPr>
+          <w:rFonts w:ascii="JetBrains Mono" w:hAnsi="JetBrains Mono" w:cs="JetBrains Mono"/>
+          <w:sz w:val="14"/>
+          <w:szCs w:val="14"/>
+          <w:lang w:val="hu-HU"/>
+        </w:rPr>
+        <w:t xml:space="preserve"> </w:t>
+      </w:r>
+      <w:proofErr w:type="spellStart"/>
+      <w:r>
+        <w:rPr>
+          <w:rFonts w:ascii="JetBrains Mono" w:hAnsi="JetBrains Mono" w:cs="JetBrains Mono"/>
+          <w:sz w:val="14"/>
+          <w:szCs w:val="14"/>
+          <w:lang w:val="hu-HU"/>
+        </w:rPr>
+        <w:t>lesson</w:t>
+      </w:r>
+      <w:proofErr w:type="spellEnd"/>
+      <w:r>
+        <w:rPr>
+          <w:rFonts w:ascii="JetBrains Mono" w:hAnsi="JetBrains Mono" w:cs="JetBrains Mono"/>
+          <w:sz w:val="14"/>
+          <w:szCs w:val="14"/>
+          <w:lang w:val="hu-HU"/>
+        </w:rPr>
+        <w:t xml:space="preserve"> of </w:t>
+      </w:r>
+      <w:proofErr w:type="spellStart"/>
+      <w:r>
+        <w:rPr>
+          <w:rFonts w:ascii="JetBrains Mono" w:hAnsi="JetBrains Mono" w:cs="JetBrains Mono"/>
+          <w:sz w:val="14"/>
+          <w:szCs w:val="14"/>
+          <w:lang w:val="hu-HU"/>
+        </w:rPr>
+        <w:t>Calculus</w:t>
       </w:r>
       <w:proofErr w:type="spellEnd"/>
       <w:r>
@@ -7645,97 +8785,57 @@
           <w:szCs w:val="14"/>
           <w:lang w:val="hu-HU"/>
         </w:rPr>
-        <w:t>            }</w:t>
-      </w:r>
-    </w:p>
-    <w:p>
-      <w:pPr>
-        <w:spacing w:after="0"/>
-        <w:rPr>
-          <w:rFonts w:ascii="JetBrains Mono" w:hAnsi="JetBrains Mono" w:cs="JetBrains Mono"/>
-          <w:sz w:val="14"/>
-          <w:szCs w:val="14"/>
-          <w:lang w:val="hu-HU"/>
-        </w:rPr>
-      </w:pPr>
-      <w:r>
-        <w:rPr>
-          <w:rFonts w:ascii="JetBrains Mono" w:hAnsi="JetBrains Mono" w:cs="JetBrains Mono"/>
-          <w:sz w:val="14"/>
-          <w:szCs w:val="14"/>
-          <w:lang w:val="hu-HU"/>
-        </w:rPr>
-        <w:t>          ]</w:t>
-      </w:r>
-    </w:p>
-    <w:p>
-      <w:pPr>
-        <w:spacing w:after="0"/>
-        <w:rPr>
-          <w:rFonts w:ascii="JetBrains Mono" w:hAnsi="JetBrains Mono" w:cs="JetBrains Mono"/>
-          <w:sz w:val="14"/>
-          <w:szCs w:val="14"/>
-          <w:lang w:val="hu-HU"/>
-        </w:rPr>
-      </w:pPr>
-      <w:r>
-        <w:rPr>
-          <w:rFonts w:ascii="JetBrains Mono" w:hAnsi="JetBrains Mono" w:cs="JetBrains Mono"/>
-          <w:sz w:val="14"/>
-          <w:szCs w:val="14"/>
-          <w:lang w:val="hu-HU"/>
-        </w:rPr>
-        <w:t>        }</w:t>
-      </w:r>
-    </w:p>
-    <w:p>
-      <w:pPr>
-        <w:spacing w:after="0"/>
-        <w:rPr>
-          <w:rFonts w:ascii="JetBrains Mono" w:hAnsi="JetBrains Mono" w:cs="JetBrains Mono"/>
-          <w:sz w:val="14"/>
-          <w:szCs w:val="14"/>
-          <w:lang w:val="hu-HU"/>
-        </w:rPr>
-      </w:pPr>
-      <w:r>
-        <w:rPr>
-          <w:rFonts w:ascii="JetBrains Mono" w:hAnsi="JetBrains Mono" w:cs="JetBrains Mono"/>
-          <w:sz w:val="14"/>
-          <w:szCs w:val="14"/>
-          <w:lang w:val="hu-HU"/>
-        </w:rPr>
-        <w:t>      ],</w:t>
-      </w:r>
-    </w:p>
-    <w:p>
-      <w:pPr>
-        <w:spacing w:after="0"/>
-        <w:rPr>
-          <w:rFonts w:ascii="JetBrains Mono" w:hAnsi="JetBrains Mono" w:cs="JetBrains Mono"/>
-          <w:sz w:val="14"/>
-          <w:szCs w:val="14"/>
-          <w:lang w:val="hu-HU"/>
-        </w:rPr>
-      </w:pPr>
-      <w:r>
-        <w:rPr>
-          <w:rFonts w:ascii="JetBrains Mono" w:hAnsi="JetBrains Mono" w:cs="JetBrains Mono"/>
-          <w:sz w:val="14"/>
-          <w:szCs w:val="14"/>
-          <w:lang w:val="hu-HU"/>
-        </w:rPr>
-        <w:t>      "</w:t>
-      </w:r>
-      <w:proofErr w:type="spellStart"/>
-      <w:r>
-        <w:rPr>
-          <w:rFonts w:ascii="JetBrains Mono" w:hAnsi="JetBrains Mono" w:cs="JetBrains Mono"/>
-          <w:sz w:val="14"/>
-          <w:szCs w:val="14"/>
-          <w:lang w:val="hu-HU"/>
-        </w:rPr>
-        <w:t>inactive</w:t>
+        <w:t>      }</w:t>
+      </w:r>
+    </w:p>
+    <w:p>
+      <w:pPr>
+        <w:spacing w:after="0"/>
+        <w:rPr>
+          <w:rFonts w:ascii="JetBrains Mono" w:hAnsi="JetBrains Mono" w:cs="JetBrains Mono"/>
+          <w:sz w:val="14"/>
+          <w:szCs w:val="14"/>
+          <w:lang w:val="hu-HU"/>
+        </w:rPr>
+      </w:pPr>
+      <w:r>
+        <w:rPr>
+          <w:rFonts w:ascii="JetBrains Mono" w:hAnsi="JetBrains Mono" w:cs="JetBrains Mono"/>
+          <w:sz w:val="14"/>
+          <w:szCs w:val="14"/>
+          <w:lang w:val="hu-HU"/>
+        </w:rPr>
+        <w:t>    ],</w:t>
+      </w:r>
+    </w:p>
+    <w:p>
+      <w:pPr>
+        <w:spacing w:after="0"/>
+        <w:rPr>
+          <w:rFonts w:ascii="JetBrains Mono" w:hAnsi="JetBrains Mono" w:cs="JetBrains Mono"/>
+          <w:sz w:val="14"/>
+          <w:szCs w:val="14"/>
+          <w:lang w:val="hu-HU"/>
+        </w:rPr>
+      </w:pPr>
+      <w:r>
+        <w:rPr>
+          <w:rFonts w:ascii="JetBrains Mono" w:hAnsi="JetBrains Mono" w:cs="JetBrains Mono"/>
+          <w:sz w:val="14"/>
+          <w:szCs w:val="14"/>
+          <w:lang w:val="hu-HU"/>
+        </w:rPr>
+        <w:t>    "</w:t>
+      </w:r>
+      <w:proofErr w:type="spellStart"/>
+      <w:r>
+        <w:rPr>
+          <w:rFonts w:ascii="JetBrains Mono" w:hAnsi="JetBrains Mono" w:cs="JetBrains Mono"/>
+          <w:sz w:val="14"/>
+          <w:szCs w:val="14"/>
+          <w:lang w:val="hu-HU"/>
+        </w:rPr>
+        <w:t>popularCourses</w:t>
       </w:r>
       <w:proofErr w:type="spellEnd"/>
       <w:r>
@@ -7765,27 +8865,27 @@
           <w:szCs w:val="14"/>
           <w:lang w:val="hu-HU"/>
         </w:rPr>
-        <w:t>        {</w:t>
-      </w:r>
-    </w:p>
-    <w:p>
-      <w:pPr>
-        <w:spacing w:after="0"/>
-        <w:rPr>
-          <w:rFonts w:ascii="JetBrains Mono" w:hAnsi="JetBrains Mono" w:cs="JetBrains Mono"/>
-          <w:sz w:val="14"/>
-          <w:szCs w:val="14"/>
-          <w:lang w:val="hu-HU"/>
-        </w:rPr>
-      </w:pPr>
-      <w:r>
-        <w:rPr>
-          <w:rFonts w:ascii="JetBrains Mono" w:hAnsi="JetBrains Mono" w:cs="JetBrains Mono"/>
-          <w:sz w:val="14"/>
-          <w:szCs w:val="14"/>
-          <w:lang w:val="hu-HU"/>
-        </w:rPr>
-        <w:t>          "</w:t>
+        <w:t>      {</w:t>
+      </w:r>
+    </w:p>
+    <w:p>
+      <w:pPr>
+        <w:spacing w:after="0"/>
+        <w:rPr>
+          <w:rFonts w:ascii="JetBrains Mono" w:hAnsi="JetBrains Mono" w:cs="JetBrains Mono"/>
+          <w:sz w:val="14"/>
+          <w:szCs w:val="14"/>
+          <w:lang w:val="hu-HU"/>
+        </w:rPr>
+      </w:pPr>
+      <w:r>
+        <w:rPr>
+          <w:rFonts w:ascii="JetBrains Mono" w:hAnsi="JetBrains Mono" w:cs="JetBrains Mono"/>
+          <w:sz w:val="14"/>
+          <w:szCs w:val="14"/>
+          <w:lang w:val="hu-HU"/>
+        </w:rPr>
+        <w:t>        "</w:t>
       </w:r>
       <w:proofErr w:type="spellStart"/>
       <w:r>
@@ -7845,7 +8945,7 @@
           <w:szCs w:val="14"/>
           <w:lang w:val="hu-HU"/>
         </w:rPr>
-        <w:t>          "</w:t>
+        <w:t>        "</w:t>
       </w:r>
       <w:proofErr w:type="spellStart"/>
       <w:r>
@@ -7905,7 +9005,7 @@
           <w:szCs w:val="14"/>
           <w:lang w:val="hu-HU"/>
         </w:rPr>
-        <w:t>          "</w:t>
+        <w:t>        "</w:t>
       </w:r>
       <w:proofErr w:type="spellStart"/>
       <w:r>
@@ -7925,17 +9025,57 @@
           <w:szCs w:val="14"/>
           <w:lang w:val="hu-HU"/>
         </w:rPr>
-        <w:t xml:space="preserve">": "HTML5 </w:t>
-      </w:r>
-      <w:proofErr w:type="spellStart"/>
-      <w:r>
-        <w:rPr>
-          <w:rFonts w:ascii="JetBrains Mono" w:hAnsi="JetBrains Mono" w:cs="JetBrains Mono"/>
-          <w:sz w:val="14"/>
-          <w:szCs w:val="14"/>
-          <w:lang w:val="hu-HU"/>
-        </w:rPr>
-        <w:t>Baics</w:t>
+        <w:t>": "</w:t>
+      </w:r>
+      <w:proofErr w:type="spellStart"/>
+      <w:r>
+        <w:rPr>
+          <w:rFonts w:ascii="JetBrains Mono" w:hAnsi="JetBrains Mono" w:cs="JetBrains Mono"/>
+          <w:sz w:val="14"/>
+          <w:szCs w:val="14"/>
+          <w:lang w:val="hu-HU"/>
+        </w:rPr>
+        <w:t>Unity</w:t>
+      </w:r>
+      <w:proofErr w:type="spellEnd"/>
+      <w:r>
+        <w:rPr>
+          <w:rFonts w:ascii="JetBrains Mono" w:hAnsi="JetBrains Mono" w:cs="JetBrains Mono"/>
+          <w:sz w:val="14"/>
+          <w:szCs w:val="14"/>
+          <w:lang w:val="hu-HU"/>
+        </w:rPr>
+        <w:t xml:space="preserve"> </w:t>
+      </w:r>
+      <w:proofErr w:type="spellStart"/>
+      <w:r>
+        <w:rPr>
+          <w:rFonts w:ascii="JetBrains Mono" w:hAnsi="JetBrains Mono" w:cs="JetBrains Mono"/>
+          <w:sz w:val="14"/>
+          <w:szCs w:val="14"/>
+          <w:lang w:val="hu-HU"/>
+        </w:rPr>
+        <w:t>Engine</w:t>
+      </w:r>
+      <w:proofErr w:type="spellEnd"/>
+      <w:r>
+        <w:rPr>
+          <w:rFonts w:ascii="JetBrains Mono" w:hAnsi="JetBrains Mono" w:cs="JetBrains Mono"/>
+          <w:sz w:val="14"/>
+          <w:szCs w:val="14"/>
+          <w:lang w:val="hu-HU"/>
+        </w:rPr>
+        <w:t xml:space="preserve"> </w:t>
+      </w:r>
+      <w:proofErr w:type="spellStart"/>
+      <w:r>
+        <w:rPr>
+          <w:rFonts w:ascii="JetBrains Mono" w:hAnsi="JetBrains Mono" w:cs="JetBrains Mono"/>
+          <w:sz w:val="14"/>
+          <w:szCs w:val="14"/>
+          <w:lang w:val="hu-HU"/>
+        </w:rPr>
+        <w:t>basics</w:t>
       </w:r>
       <w:proofErr w:type="spellEnd"/>
       <w:r>
@@ -7965,7 +9105,7 @@
           <w:szCs w:val="14"/>
           <w:lang w:val="hu-HU"/>
         </w:rPr>
-        <w:t>          "</w:t>
+        <w:t>        "</w:t>
       </w:r>
       <w:proofErr w:type="spellStart"/>
       <w:r>
@@ -8005,7 +9145,7 @@
           <w:szCs w:val="14"/>
           <w:lang w:val="hu-HU"/>
         </w:rPr>
-        <w:t>          "</w:t>
+        <w:t>        "</w:t>
       </w:r>
       <w:proofErr w:type="spellStart"/>
       <w:r>
@@ -8025,27 +9165,278 @@
           <w:szCs w:val="14"/>
           <w:lang w:val="hu-HU"/>
         </w:rPr>
-        <w:t>": "Mr. John Smith",</w:t>
-      </w:r>
-    </w:p>
-    <w:p>
-      <w:pPr>
-        <w:spacing w:after="0"/>
-        <w:rPr>
-          <w:rFonts w:ascii="JetBrains Mono" w:hAnsi="JetBrains Mono" w:cs="JetBrains Mono"/>
-          <w:sz w:val="14"/>
-          <w:szCs w:val="14"/>
-          <w:lang w:val="hu-HU"/>
-        </w:rPr>
-      </w:pPr>
-      <w:r>
-        <w:rPr>
-          <w:rFonts w:ascii="JetBrains Mono" w:hAnsi="JetBrains Mono" w:cs="JetBrains Mono"/>
-          <w:sz w:val="14"/>
-          <w:szCs w:val="14"/>
-          <w:lang w:val="hu-HU"/>
-        </w:rPr>
-        <w:t>          "</w:t>
+        <w:t>": "</w:t>
+      </w:r>
+      <w:proofErr w:type="spellStart"/>
+      <w:r>
+        <w:rPr>
+          <w:rFonts w:ascii="JetBrains Mono" w:hAnsi="JetBrains Mono" w:cs="JetBrains Mono"/>
+          <w:sz w:val="14"/>
+          <w:szCs w:val="14"/>
+          <w:lang w:val="hu-HU"/>
+        </w:rPr>
+        <w:t>Huan</w:t>
+      </w:r>
+      <w:proofErr w:type="spellEnd"/>
+      <w:r>
+        <w:rPr>
+          <w:rFonts w:ascii="JetBrains Mono" w:hAnsi="JetBrains Mono" w:cs="JetBrains Mono"/>
+          <w:sz w:val="14"/>
+          <w:szCs w:val="14"/>
+          <w:lang w:val="hu-HU"/>
+        </w:rPr>
+        <w:t xml:space="preserve"> Antonio",</w:t>
+      </w:r>
+    </w:p>
+    <w:p>
+      <w:pPr>
+        <w:spacing w:after="0"/>
+        <w:rPr>
+          <w:rFonts w:ascii="JetBrains Mono" w:hAnsi="JetBrains Mono" w:cs="JetBrains Mono"/>
+          <w:sz w:val="14"/>
+          <w:szCs w:val="14"/>
+          <w:lang w:val="hu-HU"/>
+        </w:rPr>
+      </w:pPr>
+      <w:r>
+        <w:rPr>
+          <w:rFonts w:ascii="JetBrains Mono" w:hAnsi="JetBrains Mono" w:cs="JetBrains Mono"/>
+          <w:sz w:val="14"/>
+          <w:szCs w:val="14"/>
+          <w:lang w:val="hu-HU"/>
+        </w:rPr>
+        <w:t>        "</w:t>
+      </w:r>
+      <w:proofErr w:type="spellStart"/>
+      <w:r>
+        <w:rPr>
+          <w:rFonts w:ascii="JetBrains Mono" w:hAnsi="JetBrains Mono" w:cs="JetBrains Mono"/>
+          <w:sz w:val="14"/>
+          <w:szCs w:val="14"/>
+          <w:lang w:val="hu-HU"/>
+        </w:rPr>
+        <w:t>lessonPrice</w:t>
+      </w:r>
+      <w:proofErr w:type="spellEnd"/>
+      <w:r>
+        <w:rPr>
+          <w:rFonts w:ascii="JetBrains Mono" w:hAnsi="JetBrains Mono" w:cs="JetBrains Mono"/>
+          <w:sz w:val="14"/>
+          <w:szCs w:val="14"/>
+          <w:lang w:val="hu-HU"/>
+        </w:rPr>
+        <w:t xml:space="preserve">": </w:t>
+      </w:r>
+      <w:proofErr w:type="gramStart"/>
+      <w:r>
+        <w:rPr>
+          <w:rFonts w:ascii="JetBrains Mono" w:hAnsi="JetBrains Mono" w:cs="JetBrains Mono"/>
+          <w:sz w:val="14"/>
+          <w:szCs w:val="14"/>
+          <w:lang w:val="hu-HU"/>
+        </w:rPr>
+        <w:t>{ "</w:t>
+      </w:r>
+      <w:proofErr w:type="spellStart"/>
+      <w:proofErr w:type="gramEnd"/>
+      <w:r>
+        <w:rPr>
+          <w:rFonts w:ascii="JetBrains Mono" w:hAnsi="JetBrains Mono" w:cs="JetBrains Mono"/>
+          <w:sz w:val="14"/>
+          <w:szCs w:val="14"/>
+          <w:lang w:val="hu-HU"/>
+        </w:rPr>
+        <w:t>amount</w:t>
+      </w:r>
+      <w:proofErr w:type="spellEnd"/>
+      <w:r>
+        <w:rPr>
+          <w:rFonts w:ascii="JetBrains Mono" w:hAnsi="JetBrains Mono" w:cs="JetBrains Mono"/>
+          <w:sz w:val="14"/>
+          <w:szCs w:val="14"/>
+          <w:lang w:val="hu-HU"/>
+        </w:rPr>
+        <w:t>": 0, "</w:t>
+      </w:r>
+      <w:proofErr w:type="spellStart"/>
+      <w:r>
+        <w:rPr>
+          <w:rFonts w:ascii="JetBrains Mono" w:hAnsi="JetBrains Mono" w:cs="JetBrains Mono"/>
+          <w:sz w:val="14"/>
+          <w:szCs w:val="14"/>
+          <w:lang w:val="hu-HU"/>
+        </w:rPr>
+        <w:t>currency</w:t>
+      </w:r>
+      <w:proofErr w:type="spellEnd"/>
+      <w:r>
+        <w:rPr>
+          <w:rFonts w:ascii="JetBrains Mono" w:hAnsi="JetBrains Mono" w:cs="JetBrains Mono"/>
+          <w:sz w:val="14"/>
+          <w:szCs w:val="14"/>
+          <w:lang w:val="hu-HU"/>
+        </w:rPr>
+        <w:t>": "HUF" },</w:t>
+      </w:r>
+    </w:p>
+    <w:p>
+      <w:pPr>
+        <w:spacing w:after="0"/>
+        <w:rPr>
+          <w:rFonts w:ascii="JetBrains Mono" w:hAnsi="JetBrains Mono" w:cs="JetBrains Mono"/>
+          <w:sz w:val="14"/>
+          <w:szCs w:val="14"/>
+          <w:lang w:val="hu-HU"/>
+        </w:rPr>
+      </w:pPr>
+      <w:r>
+        <w:rPr>
+          <w:rFonts w:ascii="JetBrains Mono" w:hAnsi="JetBrains Mono" w:cs="JetBrains Mono"/>
+          <w:sz w:val="14"/>
+          <w:szCs w:val="14"/>
+          <w:lang w:val="hu-HU"/>
+        </w:rPr>
+        <w:t>        "</w:t>
+      </w:r>
+      <w:proofErr w:type="spellStart"/>
+      <w:r>
+        <w:rPr>
+          <w:rFonts w:ascii="JetBrains Mono" w:hAnsi="JetBrains Mono" w:cs="JetBrains Mono"/>
+          <w:sz w:val="14"/>
+          <w:szCs w:val="14"/>
+          <w:lang w:val="hu-HU"/>
+        </w:rPr>
+        <w:t>description</w:t>
+      </w:r>
+      <w:proofErr w:type="spellEnd"/>
+      <w:r>
+        <w:rPr>
+          <w:rFonts w:ascii="JetBrains Mono" w:hAnsi="JetBrains Mono" w:cs="JetBrains Mono"/>
+          <w:sz w:val="14"/>
+          <w:szCs w:val="14"/>
+          <w:lang w:val="hu-HU"/>
+        </w:rPr>
+        <w:t>": "</w:t>
+      </w:r>
+      <w:proofErr w:type="spellStart"/>
+      <w:r>
+        <w:rPr>
+          <w:rFonts w:ascii="JetBrains Mono" w:hAnsi="JetBrains Mono" w:cs="JetBrains Mono"/>
+          <w:sz w:val="14"/>
+          <w:szCs w:val="14"/>
+          <w:lang w:val="hu-HU"/>
+        </w:rPr>
+        <w:t>Learn</w:t>
+      </w:r>
+      <w:proofErr w:type="spellEnd"/>
+      <w:r>
+        <w:rPr>
+          <w:rFonts w:ascii="JetBrains Mono" w:hAnsi="JetBrains Mono" w:cs="JetBrains Mono"/>
+          <w:sz w:val="14"/>
+          <w:szCs w:val="14"/>
+          <w:lang w:val="hu-HU"/>
+        </w:rPr>
+        <w:t xml:space="preserve"> </w:t>
+      </w:r>
+      <w:proofErr w:type="spellStart"/>
+      <w:r>
+        <w:rPr>
+          <w:rFonts w:ascii="JetBrains Mono" w:hAnsi="JetBrains Mono" w:cs="JetBrains Mono"/>
+          <w:sz w:val="14"/>
+          <w:szCs w:val="14"/>
+          <w:lang w:val="hu-HU"/>
+        </w:rPr>
+        <w:t>the</w:t>
+      </w:r>
+      <w:proofErr w:type="spellEnd"/>
+      <w:r>
+        <w:rPr>
+          <w:rFonts w:ascii="JetBrains Mono" w:hAnsi="JetBrains Mono" w:cs="JetBrains Mono"/>
+          <w:sz w:val="14"/>
+          <w:szCs w:val="14"/>
+          <w:lang w:val="hu-HU"/>
+        </w:rPr>
+        <w:t xml:space="preserve"> </w:t>
+      </w:r>
+      <w:proofErr w:type="spellStart"/>
+      <w:r>
+        <w:rPr>
+          <w:rFonts w:ascii="JetBrains Mono" w:hAnsi="JetBrains Mono" w:cs="JetBrains Mono"/>
+          <w:sz w:val="14"/>
+          <w:szCs w:val="14"/>
+          <w:lang w:val="hu-HU"/>
+        </w:rPr>
+        <w:t>basics</w:t>
+      </w:r>
+      <w:proofErr w:type="spellEnd"/>
+      <w:r>
+        <w:rPr>
+          <w:rFonts w:ascii="JetBrains Mono" w:hAnsi="JetBrains Mono" w:cs="JetBrains Mono"/>
+          <w:sz w:val="14"/>
+          <w:szCs w:val="14"/>
+          <w:lang w:val="hu-HU"/>
+        </w:rPr>
+        <w:t xml:space="preserve"> of </w:t>
+      </w:r>
+      <w:proofErr w:type="spellStart"/>
+      <w:r>
+        <w:rPr>
+          <w:rFonts w:ascii="JetBrains Mono" w:hAnsi="JetBrains Mono" w:cs="JetBrains Mono"/>
+          <w:sz w:val="14"/>
+          <w:szCs w:val="14"/>
+          <w:lang w:val="hu-HU"/>
+        </w:rPr>
+        <w:t>the</w:t>
+      </w:r>
+      <w:proofErr w:type="spellEnd"/>
+      <w:r>
+        <w:rPr>
+          <w:rFonts w:ascii="JetBrains Mono" w:hAnsi="JetBrains Mono" w:cs="JetBrains Mono"/>
+          <w:sz w:val="14"/>
+          <w:szCs w:val="14"/>
+          <w:lang w:val="hu-HU"/>
+        </w:rPr>
+        <w:t xml:space="preserve"> Unity </w:t>
+      </w:r>
+      <w:proofErr w:type="spellStart"/>
+      <w:r>
+        <w:rPr>
+          <w:rFonts w:ascii="JetBrains Mono" w:hAnsi="JetBrains Mono" w:cs="JetBrains Mono"/>
+          <w:sz w:val="14"/>
+          <w:szCs w:val="14"/>
+          <w:lang w:val="hu-HU"/>
+        </w:rPr>
+        <w:t>Engine</w:t>
+      </w:r>
+      <w:proofErr w:type="spellEnd"/>
+      <w:r>
+        <w:rPr>
+          <w:rFonts w:ascii="JetBrains Mono" w:hAnsi="JetBrains Mono" w:cs="JetBrains Mono"/>
+          <w:sz w:val="14"/>
+          <w:szCs w:val="14"/>
+          <w:lang w:val="hu-HU"/>
+        </w:rPr>
+        <w:t>",</w:t>
+      </w:r>
+    </w:p>
+    <w:p>
+      <w:pPr>
+        <w:spacing w:after="0"/>
+        <w:rPr>
+          <w:rFonts w:ascii="JetBrains Mono" w:hAnsi="JetBrains Mono" w:cs="JetBrains Mono"/>
+          <w:sz w:val="14"/>
+          <w:szCs w:val="14"/>
+          <w:lang w:val="hu-HU"/>
+        </w:rPr>
+      </w:pPr>
+      <w:r>
+        <w:rPr>
+          <w:rFonts w:ascii="JetBrains Mono" w:hAnsi="JetBrains Mono" w:cs="JetBrains Mono"/>
+          <w:sz w:val="14"/>
+          <w:szCs w:val="14"/>
+          <w:lang w:val="hu-HU"/>
+        </w:rPr>
+        <w:t>        "</w:t>
       </w:r>
       <w:proofErr w:type="spellStart"/>
       <w:r>
@@ -8085,6 +9476,106 @@
           <w:szCs w:val="14"/>
           <w:lang w:val="hu-HU"/>
         </w:rPr>
+        <w:t>"</w:t>
+      </w:r>
+    </w:p>
+    <w:p>
+      <w:pPr>
+        <w:spacing w:after="0"/>
+        <w:rPr>
+          <w:rFonts w:ascii="JetBrains Mono" w:hAnsi="JetBrains Mono" w:cs="JetBrains Mono"/>
+          <w:sz w:val="14"/>
+          <w:szCs w:val="14"/>
+          <w:lang w:val="hu-HU"/>
+        </w:rPr>
+      </w:pPr>
+      <w:r>
+        <w:rPr>
+          <w:rFonts w:ascii="JetBrains Mono" w:hAnsi="JetBrains Mono" w:cs="JetBrains Mono"/>
+          <w:sz w:val="14"/>
+          <w:szCs w:val="14"/>
+          <w:lang w:val="hu-HU"/>
+        </w:rPr>
+        <w:t>      },</w:t>
+      </w:r>
+    </w:p>
+    <w:p>
+      <w:pPr>
+        <w:spacing w:after="0"/>
+        <w:rPr>
+          <w:rFonts w:ascii="JetBrains Mono" w:hAnsi="JetBrains Mono" w:cs="JetBrains Mono"/>
+          <w:sz w:val="14"/>
+          <w:szCs w:val="14"/>
+          <w:lang w:val="hu-HU"/>
+        </w:rPr>
+      </w:pPr>
+      <w:r>
+        <w:rPr>
+          <w:rFonts w:ascii="JetBrains Mono" w:hAnsi="JetBrains Mono" w:cs="JetBrains Mono"/>
+          <w:sz w:val="14"/>
+          <w:szCs w:val="14"/>
+          <w:lang w:val="hu-HU"/>
+        </w:rPr>
+        <w:t>      {</w:t>
+      </w:r>
+    </w:p>
+    <w:p>
+      <w:pPr>
+        <w:spacing w:after="0"/>
+        <w:rPr>
+          <w:rFonts w:ascii="JetBrains Mono" w:hAnsi="JetBrains Mono" w:cs="JetBrains Mono"/>
+          <w:sz w:val="14"/>
+          <w:szCs w:val="14"/>
+          <w:lang w:val="hu-HU"/>
+        </w:rPr>
+      </w:pPr>
+      <w:r>
+        <w:rPr>
+          <w:rFonts w:ascii="JetBrains Mono" w:hAnsi="JetBrains Mono" w:cs="JetBrains Mono"/>
+          <w:sz w:val="14"/>
+          <w:szCs w:val="14"/>
+          <w:lang w:val="hu-HU"/>
+        </w:rPr>
+        <w:t>        "</w:t>
+      </w:r>
+      <w:proofErr w:type="spellStart"/>
+      <w:r>
+        <w:rPr>
+          <w:rFonts w:ascii="JetBrains Mono" w:hAnsi="JetBrains Mono" w:cs="JetBrains Mono"/>
+          <w:sz w:val="14"/>
+          <w:szCs w:val="14"/>
+          <w:lang w:val="hu-HU"/>
+        </w:rPr>
+        <w:t>courseId</w:t>
+      </w:r>
+      <w:proofErr w:type="spellEnd"/>
+      <w:r>
+        <w:rPr>
+          <w:rFonts w:ascii="JetBrains Mono" w:hAnsi="JetBrains Mono" w:cs="JetBrains Mono"/>
+          <w:sz w:val="14"/>
+          <w:szCs w:val="14"/>
+          <w:lang w:val="hu-HU"/>
+        </w:rPr>
+        <w:t>": "</w:t>
+      </w:r>
+      <w:proofErr w:type="spellStart"/>
+      <w:r>
+        <w:rPr>
+          <w:rFonts w:ascii="JetBrains Mono" w:hAnsi="JetBrains Mono" w:cs="JetBrains Mono"/>
+          <w:sz w:val="14"/>
+          <w:szCs w:val="14"/>
+          <w:lang w:val="hu-HU"/>
+        </w:rPr>
+        <w:t>uuid</w:t>
+      </w:r>
+      <w:proofErr w:type="spellEnd"/>
+      <w:r>
+        <w:rPr>
+          <w:rFonts w:ascii="JetBrains Mono" w:hAnsi="JetBrains Mono" w:cs="JetBrains Mono"/>
+          <w:sz w:val="14"/>
+          <w:szCs w:val="14"/>
+          <w:lang w:val="hu-HU"/>
+        </w:rPr>
         <w:t>",</w:t>
       </w:r>
     </w:p>
@@ -8105,166 +9596,6 @@
           <w:szCs w:val="14"/>
           <w:lang w:val="hu-HU"/>
         </w:rPr>
-        <w:t>          "</w:t>
-      </w:r>
-      <w:proofErr w:type="spellStart"/>
-      <w:r>
-        <w:rPr>
-          <w:rFonts w:ascii="JetBrains Mono" w:hAnsi="JetBrains Mono" w:cs="JetBrains Mono"/>
-          <w:sz w:val="14"/>
-          <w:szCs w:val="14"/>
-          <w:lang w:val="hu-HU"/>
-        </w:rPr>
-        <w:t>progress</w:t>
-      </w:r>
-      <w:proofErr w:type="spellEnd"/>
-      <w:r>
-        <w:rPr>
-          <w:rFonts w:ascii="JetBrains Mono" w:hAnsi="JetBrains Mono" w:cs="JetBrains Mono"/>
-          <w:sz w:val="14"/>
-          <w:szCs w:val="14"/>
-          <w:lang w:val="hu-HU"/>
-        </w:rPr>
-        <w:t>": 100</w:t>
-      </w:r>
-    </w:p>
-    <w:p>
-      <w:pPr>
-        <w:spacing w:after="0"/>
-        <w:rPr>
-          <w:rFonts w:ascii="JetBrains Mono" w:hAnsi="JetBrains Mono" w:cs="JetBrains Mono"/>
-          <w:sz w:val="14"/>
-          <w:szCs w:val="14"/>
-          <w:lang w:val="hu-HU"/>
-        </w:rPr>
-      </w:pPr>
-      <w:r>
-        <w:rPr>
-          <w:rFonts w:ascii="JetBrains Mono" w:hAnsi="JetBrains Mono" w:cs="JetBrains Mono"/>
-          <w:sz w:val="14"/>
-          <w:szCs w:val="14"/>
-          <w:lang w:val="hu-HU"/>
-        </w:rPr>
-        <w:t>        }</w:t>
-      </w:r>
-    </w:p>
-    <w:p>
-      <w:pPr>
-        <w:spacing w:after="0"/>
-        <w:rPr>
-          <w:rFonts w:ascii="JetBrains Mono" w:hAnsi="JetBrains Mono" w:cs="JetBrains Mono"/>
-          <w:sz w:val="14"/>
-          <w:szCs w:val="14"/>
-          <w:lang w:val="hu-HU"/>
-        </w:rPr>
-      </w:pPr>
-      <w:r>
-        <w:rPr>
-          <w:rFonts w:ascii="JetBrains Mono" w:hAnsi="JetBrains Mono" w:cs="JetBrains Mono"/>
-          <w:sz w:val="14"/>
-          <w:szCs w:val="14"/>
-          <w:lang w:val="hu-HU"/>
-        </w:rPr>
-        <w:t>      ]</w:t>
-      </w:r>
-    </w:p>
-    <w:p>
-      <w:pPr>
-        <w:spacing w:after="0"/>
-        <w:rPr>
-          <w:rFonts w:ascii="JetBrains Mono" w:hAnsi="JetBrains Mono" w:cs="JetBrains Mono"/>
-          <w:sz w:val="14"/>
-          <w:szCs w:val="14"/>
-          <w:lang w:val="hu-HU"/>
-        </w:rPr>
-      </w:pPr>
-      <w:r>
-        <w:rPr>
-          <w:rFonts w:ascii="JetBrains Mono" w:hAnsi="JetBrains Mono" w:cs="JetBrains Mono"/>
-          <w:sz w:val="14"/>
-          <w:szCs w:val="14"/>
-          <w:lang w:val="hu-HU"/>
-        </w:rPr>
-        <w:t>    },</w:t>
-      </w:r>
-    </w:p>
-    <w:p>
-      <w:pPr>
-        <w:spacing w:after="0"/>
-        <w:rPr>
-          <w:rFonts w:ascii="JetBrains Mono" w:hAnsi="JetBrains Mono" w:cs="JetBrains Mono"/>
-          <w:sz w:val="14"/>
-          <w:szCs w:val="14"/>
-          <w:lang w:val="hu-HU"/>
-        </w:rPr>
-      </w:pPr>
-      <w:r>
-        <w:rPr>
-          <w:rFonts w:ascii="JetBrains Mono" w:hAnsi="JetBrains Mono" w:cs="JetBrains Mono"/>
-          <w:sz w:val="14"/>
-          <w:szCs w:val="14"/>
-          <w:lang w:val="hu-HU"/>
-        </w:rPr>
-        <w:t>    "</w:t>
-      </w:r>
-      <w:proofErr w:type="spellStart"/>
-      <w:r>
-        <w:rPr>
-          <w:rFonts w:ascii="JetBrains Mono" w:hAnsi="JetBrains Mono" w:cs="JetBrains Mono"/>
-          <w:sz w:val="14"/>
-          <w:szCs w:val="14"/>
-          <w:lang w:val="hu-HU"/>
-        </w:rPr>
-        <w:t>upcomingEvents</w:t>
-      </w:r>
-      <w:proofErr w:type="spellEnd"/>
-      <w:r>
-        <w:rPr>
-          <w:rFonts w:ascii="JetBrains Mono" w:hAnsi="JetBrains Mono" w:cs="JetBrains Mono"/>
-          <w:sz w:val="14"/>
-          <w:szCs w:val="14"/>
-          <w:lang w:val="hu-HU"/>
-        </w:rPr>
-        <w:t>": [</w:t>
-      </w:r>
-    </w:p>
-    <w:p>
-      <w:pPr>
-        <w:spacing w:after="0"/>
-        <w:rPr>
-          <w:rFonts w:ascii="JetBrains Mono" w:hAnsi="JetBrains Mono" w:cs="JetBrains Mono"/>
-          <w:sz w:val="14"/>
-          <w:szCs w:val="14"/>
-          <w:lang w:val="hu-HU"/>
-        </w:rPr>
-      </w:pPr>
-      <w:r>
-        <w:rPr>
-          <w:rFonts w:ascii="JetBrains Mono" w:hAnsi="JetBrains Mono" w:cs="JetBrains Mono"/>
-          <w:sz w:val="14"/>
-          <w:szCs w:val="14"/>
-          <w:lang w:val="hu-HU"/>
-        </w:rPr>
-        <w:t>      {</w:t>
-      </w:r>
-    </w:p>
-    <w:p>
-      <w:pPr>
-        <w:spacing w:after="0"/>
-        <w:rPr>
-          <w:rFonts w:ascii="JetBrains Mono" w:hAnsi="JetBrains Mono" w:cs="JetBrains Mono"/>
-          <w:sz w:val="14"/>
-          <w:szCs w:val="14"/>
-          <w:lang w:val="hu-HU"/>
-        </w:rPr>
-      </w:pPr>
-      <w:r>
-        <w:rPr>
-          <w:rFonts w:ascii="JetBrains Mono" w:hAnsi="JetBrains Mono" w:cs="JetBrains Mono"/>
-          <w:sz w:val="14"/>
-          <w:szCs w:val="14"/>
-          <w:lang w:val="hu-HU"/>
-        </w:rPr>
         <w:t>        "</w:t>
       </w:r>
       <w:proofErr w:type="spellStart"/>
@@ -8275,7 +9606,7 @@
           <w:szCs w:val="14"/>
           <w:lang w:val="hu-HU"/>
         </w:rPr>
-        <w:t>eventId</w:t>
+        <w:t>instanceId</w:t>
       </w:r>
       <w:proofErr w:type="spellEnd"/>
       <w:r>
@@ -8335,17 +9666,37 @@
           <w:szCs w:val="14"/>
           <w:lang w:val="hu-HU"/>
         </w:rPr>
-        <w:t>eventUrl</w:t>
-      </w:r>
-      <w:proofErr w:type="spellEnd"/>
-      <w:r>
-        <w:rPr>
-          <w:rFonts w:ascii="JetBrains Mono" w:hAnsi="JetBrains Mono" w:cs="JetBrains Mono"/>
-          <w:sz w:val="14"/>
-          <w:szCs w:val="14"/>
-          <w:lang w:val="hu-HU"/>
-        </w:rPr>
-        <w:t>": "#",</w:t>
+        <w:t>courseName</w:t>
+      </w:r>
+      <w:proofErr w:type="spellEnd"/>
+      <w:r>
+        <w:rPr>
+          <w:rFonts w:ascii="JetBrains Mono" w:hAnsi="JetBrains Mono" w:cs="JetBrains Mono"/>
+          <w:sz w:val="14"/>
+          <w:szCs w:val="14"/>
+          <w:lang w:val="hu-HU"/>
+        </w:rPr>
+        <w:t xml:space="preserve">": "B2 </w:t>
+      </w:r>
+      <w:proofErr w:type="spellStart"/>
+      <w:r>
+        <w:rPr>
+          <w:rFonts w:ascii="JetBrains Mono" w:hAnsi="JetBrains Mono" w:cs="JetBrains Mono"/>
+          <w:sz w:val="14"/>
+          <w:szCs w:val="14"/>
+          <w:lang w:val="hu-HU"/>
+        </w:rPr>
+        <w:t>english</w:t>
+      </w:r>
+      <w:proofErr w:type="spellEnd"/>
+      <w:r>
+        <w:rPr>
+          <w:rFonts w:ascii="JetBrains Mono" w:hAnsi="JetBrains Mono" w:cs="JetBrains Mono"/>
+          <w:sz w:val="14"/>
+          <w:szCs w:val="14"/>
+          <w:lang w:val="hu-HU"/>
+        </w:rPr>
+        <w:t>",</w:t>
       </w:r>
     </w:p>
     <w:p>
@@ -8375,7 +9726,198 @@
           <w:szCs w:val="14"/>
           <w:lang w:val="hu-HU"/>
         </w:rPr>
-        <w:t>title</w:t>
+        <w:t>imageUrl</w:t>
+      </w:r>
+      <w:proofErr w:type="spellEnd"/>
+      <w:r>
+        <w:rPr>
+          <w:rFonts w:ascii="JetBrains Mono" w:hAnsi="JetBrains Mono" w:cs="JetBrains Mono"/>
+          <w:sz w:val="14"/>
+          <w:szCs w:val="14"/>
+          <w:lang w:val="hu-HU"/>
+        </w:rPr>
+        <w:t>": "",</w:t>
+      </w:r>
+    </w:p>
+    <w:p>
+      <w:pPr>
+        <w:spacing w:after="0"/>
+        <w:rPr>
+          <w:rFonts w:ascii="JetBrains Mono" w:hAnsi="JetBrains Mono" w:cs="JetBrains Mono"/>
+          <w:sz w:val="14"/>
+          <w:szCs w:val="14"/>
+          <w:lang w:val="hu-HU"/>
+        </w:rPr>
+      </w:pPr>
+      <w:r>
+        <w:rPr>
+          <w:rFonts w:ascii="JetBrains Mono" w:hAnsi="JetBrains Mono" w:cs="JetBrains Mono"/>
+          <w:sz w:val="14"/>
+          <w:szCs w:val="14"/>
+          <w:lang w:val="hu-HU"/>
+        </w:rPr>
+        <w:t>        "</w:t>
+      </w:r>
+      <w:proofErr w:type="spellStart"/>
+      <w:r>
+        <w:rPr>
+          <w:rFonts w:ascii="JetBrains Mono" w:hAnsi="JetBrains Mono" w:cs="JetBrains Mono"/>
+          <w:sz w:val="14"/>
+          <w:szCs w:val="14"/>
+          <w:lang w:val="hu-HU"/>
+        </w:rPr>
+        <w:t>teacherName</w:t>
+      </w:r>
+      <w:proofErr w:type="spellEnd"/>
+      <w:r>
+        <w:rPr>
+          <w:rFonts w:ascii="JetBrains Mono" w:hAnsi="JetBrains Mono" w:cs="JetBrains Mono"/>
+          <w:sz w:val="14"/>
+          <w:szCs w:val="14"/>
+          <w:lang w:val="hu-HU"/>
+        </w:rPr>
+        <w:t>": "El-</w:t>
+      </w:r>
+      <w:proofErr w:type="spellStart"/>
+      <w:r>
+        <w:rPr>
+          <w:rFonts w:ascii="JetBrains Mono" w:hAnsi="JetBrains Mono" w:cs="JetBrains Mono"/>
+          <w:sz w:val="14"/>
+          <w:szCs w:val="14"/>
+          <w:lang w:val="hu-HU"/>
+        </w:rPr>
+        <w:t>Jahari</w:t>
+      </w:r>
+      <w:proofErr w:type="spellEnd"/>
+      <w:r>
+        <w:rPr>
+          <w:rFonts w:ascii="JetBrains Mono" w:hAnsi="JetBrains Mono" w:cs="JetBrains Mono"/>
+          <w:sz w:val="14"/>
+          <w:szCs w:val="14"/>
+          <w:lang w:val="hu-HU"/>
+        </w:rPr>
+        <w:t>",</w:t>
+      </w:r>
+    </w:p>
+    <w:p>
+      <w:pPr>
+        <w:spacing w:after="0"/>
+        <w:rPr>
+          <w:rFonts w:ascii="JetBrains Mono" w:hAnsi="JetBrains Mono" w:cs="JetBrains Mono"/>
+          <w:sz w:val="14"/>
+          <w:szCs w:val="14"/>
+          <w:lang w:val="hu-HU"/>
+        </w:rPr>
+      </w:pPr>
+      <w:r>
+        <w:rPr>
+          <w:rFonts w:ascii="JetBrains Mono" w:hAnsi="JetBrains Mono" w:cs="JetBrains Mono"/>
+          <w:sz w:val="14"/>
+          <w:szCs w:val="14"/>
+          <w:lang w:val="hu-HU"/>
+        </w:rPr>
+        <w:t>        "</w:t>
+      </w:r>
+      <w:proofErr w:type="spellStart"/>
+      <w:r>
+        <w:rPr>
+          <w:rFonts w:ascii="JetBrains Mono" w:hAnsi="JetBrains Mono" w:cs="JetBrains Mono"/>
+          <w:sz w:val="14"/>
+          <w:szCs w:val="14"/>
+          <w:lang w:val="hu-HU"/>
+        </w:rPr>
+        <w:t>lessonPrice</w:t>
+      </w:r>
+      <w:proofErr w:type="spellEnd"/>
+      <w:r>
+        <w:rPr>
+          <w:rFonts w:ascii="JetBrains Mono" w:hAnsi="JetBrains Mono" w:cs="JetBrains Mono"/>
+          <w:sz w:val="14"/>
+          <w:szCs w:val="14"/>
+          <w:lang w:val="hu-HU"/>
+        </w:rPr>
+        <w:t xml:space="preserve">": </w:t>
+      </w:r>
+      <w:proofErr w:type="gramStart"/>
+      <w:r>
+        <w:rPr>
+          <w:rFonts w:ascii="JetBrains Mono" w:hAnsi="JetBrains Mono" w:cs="JetBrains Mono"/>
+          <w:sz w:val="14"/>
+          <w:szCs w:val="14"/>
+          <w:lang w:val="hu-HU"/>
+        </w:rPr>
+        <w:t>{ "</w:t>
+      </w:r>
+      <w:proofErr w:type="spellStart"/>
+      <w:proofErr w:type="gramEnd"/>
+      <w:r>
+        <w:rPr>
+          <w:rFonts w:ascii="JetBrains Mono" w:hAnsi="JetBrains Mono" w:cs="JetBrains Mono"/>
+          <w:sz w:val="14"/>
+          <w:szCs w:val="14"/>
+          <w:lang w:val="hu-HU"/>
+        </w:rPr>
+        <w:t>amount</w:t>
+      </w:r>
+      <w:proofErr w:type="spellEnd"/>
+      <w:r>
+        <w:rPr>
+          <w:rFonts w:ascii="JetBrains Mono" w:hAnsi="JetBrains Mono" w:cs="JetBrains Mono"/>
+          <w:sz w:val="14"/>
+          <w:szCs w:val="14"/>
+          <w:lang w:val="hu-HU"/>
+        </w:rPr>
+        <w:t>": 0, "</w:t>
+      </w:r>
+      <w:proofErr w:type="spellStart"/>
+      <w:r>
+        <w:rPr>
+          <w:rFonts w:ascii="JetBrains Mono" w:hAnsi="JetBrains Mono" w:cs="JetBrains Mono"/>
+          <w:sz w:val="14"/>
+          <w:szCs w:val="14"/>
+          <w:lang w:val="hu-HU"/>
+        </w:rPr>
+        <w:t>currency</w:t>
+      </w:r>
+      <w:proofErr w:type="spellEnd"/>
+      <w:r>
+        <w:rPr>
+          <w:rFonts w:ascii="JetBrains Mono" w:hAnsi="JetBrains Mono" w:cs="JetBrains Mono"/>
+          <w:sz w:val="14"/>
+          <w:szCs w:val="14"/>
+          <w:lang w:val="hu-HU"/>
+        </w:rPr>
+        <w:t>": "HUF" },</w:t>
+      </w:r>
+    </w:p>
+    <w:p>
+      <w:pPr>
+        <w:spacing w:after="0"/>
+        <w:rPr>
+          <w:rFonts w:ascii="JetBrains Mono" w:hAnsi="JetBrains Mono" w:cs="JetBrains Mono"/>
+          <w:sz w:val="14"/>
+          <w:szCs w:val="14"/>
+          <w:lang w:val="hu-HU"/>
+        </w:rPr>
+      </w:pPr>
+      <w:r>
+        <w:rPr>
+          <w:rFonts w:ascii="JetBrains Mono" w:hAnsi="JetBrains Mono" w:cs="JetBrains Mono"/>
+          <w:sz w:val="14"/>
+          <w:szCs w:val="14"/>
+          <w:lang w:val="hu-HU"/>
+        </w:rPr>
+        <w:t>        "</w:t>
+      </w:r>
+      <w:proofErr w:type="spellStart"/>
+      <w:r>
+        <w:rPr>
+          <w:rFonts w:ascii="JetBrains Mono" w:hAnsi="JetBrains Mono" w:cs="JetBrains Mono"/>
+          <w:sz w:val="14"/>
+          <w:szCs w:val="14"/>
+          <w:lang w:val="hu-HU"/>
+        </w:rPr>
+        <w:t>description</w:t>
       </w:r>
       <w:proofErr w:type="spellEnd"/>
       <w:r>
@@ -8395,7 +9937,7 @@
           <w:szCs w:val="14"/>
           <w:lang w:val="hu-HU"/>
         </w:rPr>
-        <w:t>Calculus</w:t>
+        <w:t>You</w:t>
       </w:r>
       <w:proofErr w:type="spellEnd"/>
       <w:r>
@@ -8415,327 +9957,7 @@
           <w:szCs w:val="14"/>
           <w:lang w:val="hu-HU"/>
         </w:rPr>
-        <w:t>lesson</w:t>
-      </w:r>
-      <w:proofErr w:type="spellEnd"/>
-      <w:r>
-        <w:rPr>
-          <w:rFonts w:ascii="JetBrains Mono" w:hAnsi="JetBrains Mono" w:cs="JetBrains Mono"/>
-          <w:sz w:val="14"/>
-          <w:szCs w:val="14"/>
-          <w:lang w:val="hu-HU"/>
-        </w:rPr>
-        <w:t>",</w:t>
-      </w:r>
-    </w:p>
-    <w:p>
-      <w:pPr>
-        <w:spacing w:after="0"/>
-        <w:rPr>
-          <w:rFonts w:ascii="JetBrains Mono" w:hAnsi="JetBrains Mono" w:cs="JetBrains Mono"/>
-          <w:sz w:val="14"/>
-          <w:szCs w:val="14"/>
-          <w:lang w:val="hu-HU"/>
-        </w:rPr>
-      </w:pPr>
-      <w:r>
-        <w:rPr>
-          <w:rFonts w:ascii="JetBrains Mono" w:hAnsi="JetBrains Mono" w:cs="JetBrains Mono"/>
-          <w:sz w:val="14"/>
-          <w:szCs w:val="14"/>
-          <w:lang w:val="hu-HU"/>
-        </w:rPr>
-        <w:t>        "</w:t>
-      </w:r>
-      <w:proofErr w:type="spellStart"/>
-      <w:r>
-        <w:rPr>
-          <w:rFonts w:ascii="JetBrains Mono" w:hAnsi="JetBrains Mono" w:cs="JetBrains Mono"/>
-          <w:sz w:val="14"/>
-          <w:szCs w:val="14"/>
-          <w:lang w:val="hu-HU"/>
-        </w:rPr>
-        <w:t>startDate</w:t>
-      </w:r>
-      <w:proofErr w:type="spellEnd"/>
-      <w:r>
-        <w:rPr>
-          <w:rFonts w:ascii="JetBrains Mono" w:hAnsi="JetBrains Mono" w:cs="JetBrains Mono"/>
-          <w:sz w:val="14"/>
-          <w:szCs w:val="14"/>
-          <w:lang w:val="hu-HU"/>
-        </w:rPr>
-        <w:t>": "01-12",</w:t>
-      </w:r>
-    </w:p>
-    <w:p>
-      <w:pPr>
-        <w:spacing w:after="0"/>
-        <w:rPr>
-          <w:rFonts w:ascii="JetBrains Mono" w:hAnsi="JetBrains Mono" w:cs="JetBrains Mono"/>
-          <w:sz w:val="14"/>
-          <w:szCs w:val="14"/>
-          <w:lang w:val="hu-HU"/>
-        </w:rPr>
-      </w:pPr>
-      <w:r>
-        <w:rPr>
-          <w:rFonts w:ascii="JetBrains Mono" w:hAnsi="JetBrains Mono" w:cs="JetBrains Mono"/>
-          <w:sz w:val="14"/>
-          <w:szCs w:val="14"/>
-          <w:lang w:val="hu-HU"/>
-        </w:rPr>
-        <w:t>        "</w:t>
-      </w:r>
-      <w:proofErr w:type="spellStart"/>
-      <w:r>
-        <w:rPr>
-          <w:rFonts w:ascii="JetBrains Mono" w:hAnsi="JetBrains Mono" w:cs="JetBrains Mono"/>
-          <w:sz w:val="14"/>
-          <w:szCs w:val="14"/>
-          <w:lang w:val="hu-HU"/>
-        </w:rPr>
-        <w:t>startTime</w:t>
-      </w:r>
-      <w:proofErr w:type="spellEnd"/>
-      <w:r>
-        <w:rPr>
-          <w:rFonts w:ascii="JetBrains Mono" w:hAnsi="JetBrains Mono" w:cs="JetBrains Mono"/>
-          <w:sz w:val="14"/>
-          <w:szCs w:val="14"/>
-          <w:lang w:val="hu-HU"/>
-        </w:rPr>
-        <w:t>": "12:00",</w:t>
-      </w:r>
-    </w:p>
-    <w:p>
-      <w:pPr>
-        <w:spacing w:after="0"/>
-        <w:rPr>
-          <w:rFonts w:ascii="JetBrains Mono" w:hAnsi="JetBrains Mono" w:cs="JetBrains Mono"/>
-          <w:sz w:val="14"/>
-          <w:szCs w:val="14"/>
-          <w:lang w:val="hu-HU"/>
-        </w:rPr>
-      </w:pPr>
-      <w:r>
-        <w:rPr>
-          <w:rFonts w:ascii="JetBrains Mono" w:hAnsi="JetBrains Mono" w:cs="JetBrains Mono"/>
-          <w:sz w:val="14"/>
-          <w:szCs w:val="14"/>
-          <w:lang w:val="hu-HU"/>
-        </w:rPr>
-        <w:t>        "</w:t>
-      </w:r>
-      <w:proofErr w:type="spellStart"/>
-      <w:r>
-        <w:rPr>
-          <w:rFonts w:ascii="JetBrains Mono" w:hAnsi="JetBrains Mono" w:cs="JetBrains Mono"/>
-          <w:sz w:val="14"/>
-          <w:szCs w:val="14"/>
-          <w:lang w:val="hu-HU"/>
-        </w:rPr>
-        <w:t>courseName</w:t>
-      </w:r>
-      <w:proofErr w:type="spellEnd"/>
-      <w:r>
-        <w:rPr>
-          <w:rFonts w:ascii="JetBrains Mono" w:hAnsi="JetBrains Mono" w:cs="JetBrains Mono"/>
-          <w:sz w:val="14"/>
-          <w:szCs w:val="14"/>
-          <w:lang w:val="hu-HU"/>
-        </w:rPr>
-        <w:t>": "</w:t>
-      </w:r>
-      <w:proofErr w:type="spellStart"/>
-      <w:r>
-        <w:rPr>
-          <w:rFonts w:ascii="JetBrains Mono" w:hAnsi="JetBrains Mono" w:cs="JetBrains Mono"/>
-          <w:sz w:val="14"/>
-          <w:szCs w:val="14"/>
-          <w:lang w:val="hu-HU"/>
-        </w:rPr>
-        <w:t>Calculus</w:t>
-      </w:r>
-      <w:proofErr w:type="spellEnd"/>
-      <w:r>
-        <w:rPr>
-          <w:rFonts w:ascii="JetBrains Mono" w:hAnsi="JetBrains Mono" w:cs="JetBrains Mono"/>
-          <w:sz w:val="14"/>
-          <w:szCs w:val="14"/>
-          <w:lang w:val="hu-HU"/>
-        </w:rPr>
-        <w:t>",</w:t>
-      </w:r>
-    </w:p>
-    <w:p>
-      <w:pPr>
-        <w:spacing w:after="0"/>
-        <w:rPr>
-          <w:rFonts w:ascii="JetBrains Mono" w:hAnsi="JetBrains Mono" w:cs="JetBrains Mono"/>
-          <w:sz w:val="14"/>
-          <w:szCs w:val="14"/>
-          <w:lang w:val="hu-HU"/>
-        </w:rPr>
-      </w:pPr>
-      <w:r>
-        <w:rPr>
-          <w:rFonts w:ascii="JetBrains Mono" w:hAnsi="JetBrains Mono" w:cs="JetBrains Mono"/>
-          <w:sz w:val="14"/>
-          <w:szCs w:val="14"/>
-          <w:lang w:val="hu-HU"/>
-        </w:rPr>
-        <w:t>        "</w:t>
-      </w:r>
-      <w:proofErr w:type="spellStart"/>
-      <w:r>
-        <w:rPr>
-          <w:rFonts w:ascii="JetBrains Mono" w:hAnsi="JetBrains Mono" w:cs="JetBrains Mono"/>
-          <w:sz w:val="14"/>
-          <w:szCs w:val="14"/>
-          <w:lang w:val="hu-HU"/>
-        </w:rPr>
-        <w:t>teacherName</w:t>
-      </w:r>
-      <w:proofErr w:type="spellEnd"/>
-      <w:r>
-        <w:rPr>
-          <w:rFonts w:ascii="JetBrains Mono" w:hAnsi="JetBrains Mono" w:cs="JetBrains Mono"/>
-          <w:sz w:val="14"/>
-          <w:szCs w:val="14"/>
-          <w:lang w:val="hu-HU"/>
-        </w:rPr>
-        <w:t xml:space="preserve">": "Dr. John </w:t>
-      </w:r>
-      <w:proofErr w:type="spellStart"/>
-      <w:r>
-        <w:rPr>
-          <w:rFonts w:ascii="JetBrains Mono" w:hAnsi="JetBrains Mono" w:cs="JetBrains Mono"/>
-          <w:sz w:val="14"/>
-          <w:szCs w:val="14"/>
-          <w:lang w:val="hu-HU"/>
-        </w:rPr>
-        <w:t>Doe</w:t>
-      </w:r>
-      <w:proofErr w:type="spellEnd"/>
-      <w:r>
-        <w:rPr>
-          <w:rFonts w:ascii="JetBrains Mono" w:hAnsi="JetBrains Mono" w:cs="JetBrains Mono"/>
-          <w:sz w:val="14"/>
-          <w:szCs w:val="14"/>
-          <w:lang w:val="hu-HU"/>
-        </w:rPr>
-        <w:t>",</w:t>
-      </w:r>
-    </w:p>
-    <w:p>
-      <w:pPr>
-        <w:spacing w:after="0"/>
-        <w:rPr>
-          <w:rFonts w:ascii="JetBrains Mono" w:hAnsi="JetBrains Mono" w:cs="JetBrains Mono"/>
-          <w:sz w:val="14"/>
-          <w:szCs w:val="14"/>
-          <w:lang w:val="hu-HU"/>
-        </w:rPr>
-      </w:pPr>
-      <w:r>
-        <w:rPr>
-          <w:rFonts w:ascii="JetBrains Mono" w:hAnsi="JetBrains Mono" w:cs="JetBrains Mono"/>
-          <w:sz w:val="14"/>
-          <w:szCs w:val="14"/>
-          <w:lang w:val="hu-HU"/>
-        </w:rPr>
-        <w:t>        "</w:t>
-      </w:r>
-      <w:proofErr w:type="spellStart"/>
-      <w:r>
-        <w:rPr>
-          <w:rFonts w:ascii="JetBrains Mono" w:hAnsi="JetBrains Mono" w:cs="JetBrains Mono"/>
-          <w:sz w:val="14"/>
-          <w:szCs w:val="14"/>
-          <w:lang w:val="hu-HU"/>
-        </w:rPr>
-        <w:t>eventType</w:t>
-      </w:r>
-      <w:proofErr w:type="spellEnd"/>
-      <w:r>
-        <w:rPr>
-          <w:rFonts w:ascii="JetBrains Mono" w:hAnsi="JetBrains Mono" w:cs="JetBrains Mono"/>
-          <w:sz w:val="14"/>
-          <w:szCs w:val="14"/>
-          <w:lang w:val="hu-HU"/>
-        </w:rPr>
-        <w:t>": "</w:t>
-      </w:r>
-      <w:proofErr w:type="spellStart"/>
-      <w:r>
-        <w:rPr>
-          <w:rFonts w:ascii="JetBrains Mono" w:hAnsi="JetBrains Mono" w:cs="JetBrains Mono"/>
-          <w:sz w:val="14"/>
-          <w:szCs w:val="14"/>
-          <w:lang w:val="hu-HU"/>
-        </w:rPr>
-        <w:t>lesson</w:t>
-      </w:r>
-      <w:proofErr w:type="spellEnd"/>
-      <w:r>
-        <w:rPr>
-          <w:rFonts w:ascii="JetBrains Mono" w:hAnsi="JetBrains Mono" w:cs="JetBrains Mono"/>
-          <w:sz w:val="14"/>
-          <w:szCs w:val="14"/>
-          <w:lang w:val="hu-HU"/>
-        </w:rPr>
-        <w:t>",</w:t>
-      </w:r>
-    </w:p>
-    <w:p>
-      <w:pPr>
-        <w:spacing w:after="0"/>
-        <w:rPr>
-          <w:rFonts w:ascii="JetBrains Mono" w:hAnsi="JetBrains Mono" w:cs="JetBrains Mono"/>
-          <w:sz w:val="14"/>
-          <w:szCs w:val="14"/>
-          <w:lang w:val="hu-HU"/>
-        </w:rPr>
-      </w:pPr>
-      <w:r>
-        <w:rPr>
-          <w:rFonts w:ascii="JetBrains Mono" w:hAnsi="JetBrains Mono" w:cs="JetBrains Mono"/>
-          <w:sz w:val="14"/>
-          <w:szCs w:val="14"/>
-          <w:lang w:val="hu-HU"/>
-        </w:rPr>
-        <w:t>        "</w:t>
-      </w:r>
-      <w:proofErr w:type="spellStart"/>
-      <w:r>
-        <w:rPr>
-          <w:rFonts w:ascii="JetBrains Mono" w:hAnsi="JetBrains Mono" w:cs="JetBrains Mono"/>
-          <w:sz w:val="14"/>
-          <w:szCs w:val="14"/>
-          <w:lang w:val="hu-HU"/>
-        </w:rPr>
-        <w:t>description</w:t>
-      </w:r>
-      <w:proofErr w:type="spellEnd"/>
-      <w:r>
-        <w:rPr>
-          <w:rFonts w:ascii="JetBrains Mono" w:hAnsi="JetBrains Mono" w:cs="JetBrains Mono"/>
-          <w:sz w:val="14"/>
-          <w:szCs w:val="14"/>
-          <w:lang w:val="hu-HU"/>
-        </w:rPr>
-        <w:t xml:space="preserve">": "The </w:t>
-      </w:r>
-      <w:proofErr w:type="spellStart"/>
-      <w:r>
-        <w:rPr>
-          <w:rFonts w:ascii="JetBrains Mono" w:hAnsi="JetBrains Mono" w:cs="JetBrains Mono"/>
-          <w:sz w:val="14"/>
-          <w:szCs w:val="14"/>
-          <w:lang w:val="hu-HU"/>
-        </w:rPr>
-        <w:t>next</w:t>
+        <w:t>will</w:t>
       </w:r>
       <w:proofErr w:type="spellEnd"/>
       <w:r>
@@ -8755,307 +9977,7 @@
           <w:szCs w:val="14"/>
           <w:lang w:val="hu-HU"/>
         </w:rPr>
-        <w:t>lesson</w:t>
-      </w:r>
-      <w:proofErr w:type="spellEnd"/>
-      <w:r>
-        <w:rPr>
-          <w:rFonts w:ascii="JetBrains Mono" w:hAnsi="JetBrains Mono" w:cs="JetBrains Mono"/>
-          <w:sz w:val="14"/>
-          <w:szCs w:val="14"/>
-          <w:lang w:val="hu-HU"/>
-        </w:rPr>
-        <w:t xml:space="preserve"> of </w:t>
-      </w:r>
-      <w:proofErr w:type="spellStart"/>
-      <w:r>
-        <w:rPr>
-          <w:rFonts w:ascii="JetBrains Mono" w:hAnsi="JetBrains Mono" w:cs="JetBrains Mono"/>
-          <w:sz w:val="14"/>
-          <w:szCs w:val="14"/>
-          <w:lang w:val="hu-HU"/>
-        </w:rPr>
-        <w:t>Calculus</w:t>
-      </w:r>
-      <w:proofErr w:type="spellEnd"/>
-      <w:r>
-        <w:rPr>
-          <w:rFonts w:ascii="JetBrains Mono" w:hAnsi="JetBrains Mono" w:cs="JetBrains Mono"/>
-          <w:sz w:val="14"/>
-          <w:szCs w:val="14"/>
-          <w:lang w:val="hu-HU"/>
-        </w:rPr>
-        <w:t>"</w:t>
-      </w:r>
-    </w:p>
-    <w:p>
-      <w:pPr>
-        <w:spacing w:after="0"/>
-        <w:rPr>
-          <w:rFonts w:ascii="JetBrains Mono" w:hAnsi="JetBrains Mono" w:cs="JetBrains Mono"/>
-          <w:sz w:val="14"/>
-          <w:szCs w:val="14"/>
-          <w:lang w:val="hu-HU"/>
-        </w:rPr>
-      </w:pPr>
-      <w:r>
-        <w:rPr>
-          <w:rFonts w:ascii="JetBrains Mono" w:hAnsi="JetBrains Mono" w:cs="JetBrains Mono"/>
-          <w:sz w:val="14"/>
-          <w:szCs w:val="14"/>
-          <w:lang w:val="hu-HU"/>
-        </w:rPr>
-        <w:t>      }</w:t>
-      </w:r>
-    </w:p>
-    <w:p>
-      <w:pPr>
-        <w:spacing w:after="0"/>
-        <w:rPr>
-          <w:rFonts w:ascii="JetBrains Mono" w:hAnsi="JetBrains Mono" w:cs="JetBrains Mono"/>
-          <w:sz w:val="14"/>
-          <w:szCs w:val="14"/>
-          <w:lang w:val="hu-HU"/>
-        </w:rPr>
-      </w:pPr>
-      <w:r>
-        <w:rPr>
-          <w:rFonts w:ascii="JetBrains Mono" w:hAnsi="JetBrains Mono" w:cs="JetBrains Mono"/>
-          <w:sz w:val="14"/>
-          <w:szCs w:val="14"/>
-          <w:lang w:val="hu-HU"/>
-        </w:rPr>
-        <w:t>    ],</w:t>
-      </w:r>
-    </w:p>
-    <w:p>
-      <w:pPr>
-        <w:spacing w:after="0"/>
-        <w:rPr>
-          <w:rFonts w:ascii="JetBrains Mono" w:hAnsi="JetBrains Mono" w:cs="JetBrains Mono"/>
-          <w:sz w:val="14"/>
-          <w:szCs w:val="14"/>
-          <w:lang w:val="hu-HU"/>
-        </w:rPr>
-      </w:pPr>
-      <w:r>
-        <w:rPr>
-          <w:rFonts w:ascii="JetBrains Mono" w:hAnsi="JetBrains Mono" w:cs="JetBrains Mono"/>
-          <w:sz w:val="14"/>
-          <w:szCs w:val="14"/>
-          <w:lang w:val="hu-HU"/>
-        </w:rPr>
-        <w:t>    "</w:t>
-      </w:r>
-      <w:proofErr w:type="spellStart"/>
-      <w:r>
-        <w:rPr>
-          <w:rFonts w:ascii="JetBrains Mono" w:hAnsi="JetBrains Mono" w:cs="JetBrains Mono"/>
-          <w:sz w:val="14"/>
-          <w:szCs w:val="14"/>
-          <w:lang w:val="hu-HU"/>
-        </w:rPr>
-        <w:t>popularCourses</w:t>
-      </w:r>
-      <w:proofErr w:type="spellEnd"/>
-      <w:r>
-        <w:rPr>
-          <w:rFonts w:ascii="JetBrains Mono" w:hAnsi="JetBrains Mono" w:cs="JetBrains Mono"/>
-          <w:sz w:val="14"/>
-          <w:szCs w:val="14"/>
-          <w:lang w:val="hu-HU"/>
-        </w:rPr>
-        <w:t>": [</w:t>
-      </w:r>
-    </w:p>
-    <w:p>
-      <w:pPr>
-        <w:spacing w:after="0"/>
-        <w:rPr>
-          <w:rFonts w:ascii="JetBrains Mono" w:hAnsi="JetBrains Mono" w:cs="JetBrains Mono"/>
-          <w:sz w:val="14"/>
-          <w:szCs w:val="14"/>
-          <w:lang w:val="hu-HU"/>
-        </w:rPr>
-      </w:pPr>
-      <w:r>
-        <w:rPr>
-          <w:rFonts w:ascii="JetBrains Mono" w:hAnsi="JetBrains Mono" w:cs="JetBrains Mono"/>
-          <w:sz w:val="14"/>
-          <w:szCs w:val="14"/>
-          <w:lang w:val="hu-HU"/>
-        </w:rPr>
-        <w:t>      {</w:t>
-      </w:r>
-    </w:p>
-    <w:p>
-      <w:pPr>
-        <w:spacing w:after="0"/>
-        <w:rPr>
-          <w:rFonts w:ascii="JetBrains Mono" w:hAnsi="JetBrains Mono" w:cs="JetBrains Mono"/>
-          <w:sz w:val="14"/>
-          <w:szCs w:val="14"/>
-          <w:lang w:val="hu-HU"/>
-        </w:rPr>
-      </w:pPr>
-      <w:r>
-        <w:rPr>
-          <w:rFonts w:ascii="JetBrains Mono" w:hAnsi="JetBrains Mono" w:cs="JetBrains Mono"/>
-          <w:sz w:val="14"/>
-          <w:szCs w:val="14"/>
-          <w:lang w:val="hu-HU"/>
-        </w:rPr>
-        <w:t>        "</w:t>
-      </w:r>
-      <w:proofErr w:type="spellStart"/>
-      <w:r>
-        <w:rPr>
-          <w:rFonts w:ascii="JetBrains Mono" w:hAnsi="JetBrains Mono" w:cs="JetBrains Mono"/>
-          <w:sz w:val="14"/>
-          <w:szCs w:val="14"/>
-          <w:lang w:val="hu-HU"/>
-        </w:rPr>
-        <w:t>courseId</w:t>
-      </w:r>
-      <w:proofErr w:type="spellEnd"/>
-      <w:r>
-        <w:rPr>
-          <w:rFonts w:ascii="JetBrains Mono" w:hAnsi="JetBrains Mono" w:cs="JetBrains Mono"/>
-          <w:sz w:val="14"/>
-          <w:szCs w:val="14"/>
-          <w:lang w:val="hu-HU"/>
-        </w:rPr>
-        <w:t>": "</w:t>
-      </w:r>
-      <w:proofErr w:type="spellStart"/>
-      <w:r>
-        <w:rPr>
-          <w:rFonts w:ascii="JetBrains Mono" w:hAnsi="JetBrains Mono" w:cs="JetBrains Mono"/>
-          <w:sz w:val="14"/>
-          <w:szCs w:val="14"/>
-          <w:lang w:val="hu-HU"/>
-        </w:rPr>
-        <w:t>uuid</w:t>
-      </w:r>
-      <w:proofErr w:type="spellEnd"/>
-      <w:r>
-        <w:rPr>
-          <w:rFonts w:ascii="JetBrains Mono" w:hAnsi="JetBrains Mono" w:cs="JetBrains Mono"/>
-          <w:sz w:val="14"/>
-          <w:szCs w:val="14"/>
-          <w:lang w:val="hu-HU"/>
-        </w:rPr>
-        <w:t>",</w:t>
-      </w:r>
-    </w:p>
-    <w:p>
-      <w:pPr>
-        <w:spacing w:after="0"/>
-        <w:rPr>
-          <w:rFonts w:ascii="JetBrains Mono" w:hAnsi="JetBrains Mono" w:cs="JetBrains Mono"/>
-          <w:sz w:val="14"/>
-          <w:szCs w:val="14"/>
-          <w:lang w:val="hu-HU"/>
-        </w:rPr>
-      </w:pPr>
-      <w:r>
-        <w:rPr>
-          <w:rFonts w:ascii="JetBrains Mono" w:hAnsi="JetBrains Mono" w:cs="JetBrains Mono"/>
-          <w:sz w:val="14"/>
-          <w:szCs w:val="14"/>
-          <w:lang w:val="hu-HU"/>
-        </w:rPr>
-        <w:t>        "</w:t>
-      </w:r>
-      <w:proofErr w:type="spellStart"/>
-      <w:r>
-        <w:rPr>
-          <w:rFonts w:ascii="JetBrains Mono" w:hAnsi="JetBrains Mono" w:cs="JetBrains Mono"/>
-          <w:sz w:val="14"/>
-          <w:szCs w:val="14"/>
-          <w:lang w:val="hu-HU"/>
-        </w:rPr>
-        <w:t>instanceId</w:t>
-      </w:r>
-      <w:proofErr w:type="spellEnd"/>
-      <w:r>
-        <w:rPr>
-          <w:rFonts w:ascii="JetBrains Mono" w:hAnsi="JetBrains Mono" w:cs="JetBrains Mono"/>
-          <w:sz w:val="14"/>
-          <w:szCs w:val="14"/>
-          <w:lang w:val="hu-HU"/>
-        </w:rPr>
-        <w:t>": "</w:t>
-      </w:r>
-      <w:proofErr w:type="spellStart"/>
-      <w:r>
-        <w:rPr>
-          <w:rFonts w:ascii="JetBrains Mono" w:hAnsi="JetBrains Mono" w:cs="JetBrains Mono"/>
-          <w:sz w:val="14"/>
-          <w:szCs w:val="14"/>
-          <w:lang w:val="hu-HU"/>
-        </w:rPr>
-        <w:t>uuid</w:t>
-      </w:r>
-      <w:proofErr w:type="spellEnd"/>
-      <w:r>
-        <w:rPr>
-          <w:rFonts w:ascii="JetBrains Mono" w:hAnsi="JetBrains Mono" w:cs="JetBrains Mono"/>
-          <w:sz w:val="14"/>
-          <w:szCs w:val="14"/>
-          <w:lang w:val="hu-HU"/>
-        </w:rPr>
-        <w:t>",</w:t>
-      </w:r>
-    </w:p>
-    <w:p>
-      <w:pPr>
-        <w:spacing w:after="0"/>
-        <w:rPr>
-          <w:rFonts w:ascii="JetBrains Mono" w:hAnsi="JetBrains Mono" w:cs="JetBrains Mono"/>
-          <w:sz w:val="14"/>
-          <w:szCs w:val="14"/>
-          <w:lang w:val="hu-HU"/>
-        </w:rPr>
-      </w:pPr>
-      <w:r>
-        <w:rPr>
-          <w:rFonts w:ascii="JetBrains Mono" w:hAnsi="JetBrains Mono" w:cs="JetBrains Mono"/>
-          <w:sz w:val="14"/>
-          <w:szCs w:val="14"/>
-          <w:lang w:val="hu-HU"/>
-        </w:rPr>
-        <w:t>        "</w:t>
-      </w:r>
-      <w:proofErr w:type="spellStart"/>
-      <w:r>
-        <w:rPr>
-          <w:rFonts w:ascii="JetBrains Mono" w:hAnsi="JetBrains Mono" w:cs="JetBrains Mono"/>
-          <w:sz w:val="14"/>
-          <w:szCs w:val="14"/>
-          <w:lang w:val="hu-HU"/>
-        </w:rPr>
-        <w:t>courseName</w:t>
-      </w:r>
-      <w:proofErr w:type="spellEnd"/>
-      <w:r>
-        <w:rPr>
-          <w:rFonts w:ascii="JetBrains Mono" w:hAnsi="JetBrains Mono" w:cs="JetBrains Mono"/>
-          <w:sz w:val="14"/>
-          <w:szCs w:val="14"/>
-          <w:lang w:val="hu-HU"/>
-        </w:rPr>
-        <w:t>": "</w:t>
-      </w:r>
-      <w:proofErr w:type="spellStart"/>
-      <w:r>
-        <w:rPr>
-          <w:rFonts w:ascii="JetBrains Mono" w:hAnsi="JetBrains Mono" w:cs="JetBrains Mono"/>
-          <w:sz w:val="14"/>
-          <w:szCs w:val="14"/>
-          <w:lang w:val="hu-HU"/>
-        </w:rPr>
-        <w:t>Unity</w:t>
+        <w:t>learn</w:t>
       </w:r>
       <w:proofErr w:type="spellEnd"/>
       <w:r>
@@ -9075,7 +9997,7 @@
           <w:szCs w:val="14"/>
           <w:lang w:val="hu-HU"/>
         </w:rPr>
-        <w:t>Engine</w:t>
+        <w:t>the</w:t>
       </w:r>
       <w:proofErr w:type="spellEnd"/>
       <w:r>
@@ -9105,237 +10027,37 @@
           <w:szCs w:val="14"/>
           <w:lang w:val="hu-HU"/>
         </w:rPr>
-        <w:t>",</w:t>
-      </w:r>
-    </w:p>
-    <w:p>
-      <w:pPr>
-        <w:spacing w:after="0"/>
-        <w:rPr>
-          <w:rFonts w:ascii="JetBrains Mono" w:hAnsi="JetBrains Mono" w:cs="JetBrains Mono"/>
-          <w:sz w:val="14"/>
-          <w:szCs w:val="14"/>
-          <w:lang w:val="hu-HU"/>
-        </w:rPr>
-      </w:pPr>
-      <w:r>
-        <w:rPr>
-          <w:rFonts w:ascii="JetBrains Mono" w:hAnsi="JetBrains Mono" w:cs="JetBrains Mono"/>
-          <w:sz w:val="14"/>
-          <w:szCs w:val="14"/>
-          <w:lang w:val="hu-HU"/>
-        </w:rPr>
-        <w:t>        "</w:t>
-      </w:r>
-      <w:proofErr w:type="spellStart"/>
-      <w:r>
-        <w:rPr>
-          <w:rFonts w:ascii="JetBrains Mono" w:hAnsi="JetBrains Mono" w:cs="JetBrains Mono"/>
-          <w:sz w:val="14"/>
-          <w:szCs w:val="14"/>
-          <w:lang w:val="hu-HU"/>
-        </w:rPr>
-        <w:t>imageUrl</w:t>
-      </w:r>
-      <w:proofErr w:type="spellEnd"/>
-      <w:r>
-        <w:rPr>
-          <w:rFonts w:ascii="JetBrains Mono" w:hAnsi="JetBrains Mono" w:cs="JetBrains Mono"/>
-          <w:sz w:val="14"/>
-          <w:szCs w:val="14"/>
-          <w:lang w:val="hu-HU"/>
-        </w:rPr>
-        <w:t>": "",</w:t>
-      </w:r>
-    </w:p>
-    <w:p>
-      <w:pPr>
-        <w:spacing w:after="0"/>
-        <w:rPr>
-          <w:rFonts w:ascii="JetBrains Mono" w:hAnsi="JetBrains Mono" w:cs="JetBrains Mono"/>
-          <w:sz w:val="14"/>
-          <w:szCs w:val="14"/>
-          <w:lang w:val="hu-HU"/>
-        </w:rPr>
-      </w:pPr>
-      <w:r>
-        <w:rPr>
-          <w:rFonts w:ascii="JetBrains Mono" w:hAnsi="JetBrains Mono" w:cs="JetBrains Mono"/>
-          <w:sz w:val="14"/>
-          <w:szCs w:val="14"/>
-          <w:lang w:val="hu-HU"/>
-        </w:rPr>
-        <w:t>        "</w:t>
-      </w:r>
-      <w:proofErr w:type="spellStart"/>
-      <w:r>
-        <w:rPr>
-          <w:rFonts w:ascii="JetBrains Mono" w:hAnsi="JetBrains Mono" w:cs="JetBrains Mono"/>
-          <w:sz w:val="14"/>
-          <w:szCs w:val="14"/>
-          <w:lang w:val="hu-HU"/>
-        </w:rPr>
-        <w:t>teacherName</w:t>
-      </w:r>
-      <w:proofErr w:type="spellEnd"/>
-      <w:r>
-        <w:rPr>
-          <w:rFonts w:ascii="JetBrains Mono" w:hAnsi="JetBrains Mono" w:cs="JetBrains Mono"/>
-          <w:sz w:val="14"/>
-          <w:szCs w:val="14"/>
-          <w:lang w:val="hu-HU"/>
-        </w:rPr>
-        <w:t>": "</w:t>
-      </w:r>
-      <w:proofErr w:type="spellStart"/>
-      <w:r>
-        <w:rPr>
-          <w:rFonts w:ascii="JetBrains Mono" w:hAnsi="JetBrains Mono" w:cs="JetBrains Mono"/>
-          <w:sz w:val="14"/>
-          <w:szCs w:val="14"/>
-          <w:lang w:val="hu-HU"/>
-        </w:rPr>
-        <w:t>Huan</w:t>
-      </w:r>
-      <w:proofErr w:type="spellEnd"/>
-      <w:r>
-        <w:rPr>
-          <w:rFonts w:ascii="JetBrains Mono" w:hAnsi="JetBrains Mono" w:cs="JetBrains Mono"/>
-          <w:sz w:val="14"/>
-          <w:szCs w:val="14"/>
-          <w:lang w:val="hu-HU"/>
-        </w:rPr>
-        <w:t xml:space="preserve"> Antonio",</w:t>
-      </w:r>
-    </w:p>
-    <w:p>
-      <w:pPr>
-        <w:spacing w:after="0"/>
-        <w:rPr>
-          <w:rFonts w:ascii="JetBrains Mono" w:hAnsi="JetBrains Mono" w:cs="JetBrains Mono"/>
-          <w:sz w:val="14"/>
-          <w:szCs w:val="14"/>
-          <w:lang w:val="hu-HU"/>
-        </w:rPr>
-      </w:pPr>
-      <w:r>
-        <w:rPr>
-          <w:rFonts w:ascii="JetBrains Mono" w:hAnsi="JetBrains Mono" w:cs="JetBrains Mono"/>
-          <w:sz w:val="14"/>
-          <w:szCs w:val="14"/>
-          <w:lang w:val="hu-HU"/>
-        </w:rPr>
-        <w:t>        "</w:t>
-      </w:r>
-      <w:proofErr w:type="spellStart"/>
-      <w:r>
-        <w:rPr>
-          <w:rFonts w:ascii="JetBrains Mono" w:hAnsi="JetBrains Mono" w:cs="JetBrains Mono"/>
-          <w:sz w:val="14"/>
-          <w:szCs w:val="14"/>
-          <w:lang w:val="hu-HU"/>
-        </w:rPr>
-        <w:t>lessonPrice</w:t>
-      </w:r>
-      <w:proofErr w:type="spellEnd"/>
-      <w:r>
-        <w:rPr>
-          <w:rFonts w:ascii="JetBrains Mono" w:hAnsi="JetBrains Mono" w:cs="JetBrains Mono"/>
-          <w:sz w:val="14"/>
-          <w:szCs w:val="14"/>
-          <w:lang w:val="hu-HU"/>
-        </w:rPr>
-        <w:t>": { "</w:t>
-      </w:r>
-      <w:proofErr w:type="spellStart"/>
-      <w:r>
-        <w:rPr>
-          <w:rFonts w:ascii="JetBrains Mono" w:hAnsi="JetBrains Mono" w:cs="JetBrains Mono"/>
-          <w:sz w:val="14"/>
-          <w:szCs w:val="14"/>
-          <w:lang w:val="hu-HU"/>
-        </w:rPr>
-        <w:t>amount</w:t>
-      </w:r>
-      <w:proofErr w:type="spellEnd"/>
-      <w:r>
-        <w:rPr>
-          <w:rFonts w:ascii="JetBrains Mono" w:hAnsi="JetBrains Mono" w:cs="JetBrains Mono"/>
-          <w:sz w:val="14"/>
-          <w:szCs w:val="14"/>
-          <w:lang w:val="hu-HU"/>
-        </w:rPr>
-        <w:t>": 0, "</w:t>
-      </w:r>
-      <w:proofErr w:type="spellStart"/>
-      <w:r>
-        <w:rPr>
-          <w:rFonts w:ascii="JetBrains Mono" w:hAnsi="JetBrains Mono" w:cs="JetBrains Mono"/>
-          <w:sz w:val="14"/>
-          <w:szCs w:val="14"/>
-          <w:lang w:val="hu-HU"/>
-        </w:rPr>
-        <w:t>currency</w:t>
-      </w:r>
-      <w:proofErr w:type="spellEnd"/>
-      <w:r>
-        <w:rPr>
-          <w:rFonts w:ascii="JetBrains Mono" w:hAnsi="JetBrains Mono" w:cs="JetBrains Mono"/>
-          <w:sz w:val="14"/>
-          <w:szCs w:val="14"/>
-          <w:lang w:val="hu-HU"/>
-        </w:rPr>
-        <w:t>": "HUF" },</w:t>
-      </w:r>
-    </w:p>
-    <w:p>
-      <w:pPr>
-        <w:spacing w:after="0"/>
-        <w:rPr>
-          <w:rFonts w:ascii="JetBrains Mono" w:hAnsi="JetBrains Mono" w:cs="JetBrains Mono"/>
-          <w:sz w:val="14"/>
-          <w:szCs w:val="14"/>
-          <w:lang w:val="hu-HU"/>
-        </w:rPr>
-      </w:pPr>
-      <w:r>
-        <w:rPr>
-          <w:rFonts w:ascii="JetBrains Mono" w:hAnsi="JetBrains Mono" w:cs="JetBrains Mono"/>
-          <w:sz w:val="14"/>
-          <w:szCs w:val="14"/>
-          <w:lang w:val="hu-HU"/>
-        </w:rPr>
-        <w:t>        "</w:t>
-      </w:r>
-      <w:proofErr w:type="spellStart"/>
-      <w:r>
-        <w:rPr>
-          <w:rFonts w:ascii="JetBrains Mono" w:hAnsi="JetBrains Mono" w:cs="JetBrains Mono"/>
-          <w:sz w:val="14"/>
-          <w:szCs w:val="14"/>
-          <w:lang w:val="hu-HU"/>
-        </w:rPr>
-        <w:t>description</w:t>
-      </w:r>
-      <w:proofErr w:type="spellEnd"/>
-      <w:r>
-        <w:rPr>
-          <w:rFonts w:ascii="JetBrains Mono" w:hAnsi="JetBrains Mono" w:cs="JetBrains Mono"/>
-          <w:sz w:val="14"/>
-          <w:szCs w:val="14"/>
-          <w:lang w:val="hu-HU"/>
-        </w:rPr>
-        <w:t>": "</w:t>
-      </w:r>
-      <w:proofErr w:type="spellStart"/>
-      <w:r>
-        <w:rPr>
-          <w:rFonts w:ascii="JetBrains Mono" w:hAnsi="JetBrains Mono" w:cs="JetBrains Mono"/>
-          <w:sz w:val="14"/>
-          <w:szCs w:val="14"/>
-          <w:lang w:val="hu-HU"/>
-        </w:rPr>
-        <w:t>Learn</w:t>
+        <w:t xml:space="preserve"> of English, </w:t>
+      </w:r>
+      <w:proofErr w:type="spellStart"/>
+      <w:r>
+        <w:rPr>
+          <w:rFonts w:ascii="JetBrains Mono" w:hAnsi="JetBrains Mono" w:cs="JetBrains Mono"/>
+          <w:sz w:val="14"/>
+          <w:szCs w:val="14"/>
+          <w:lang w:val="hu-HU"/>
+        </w:rPr>
+        <w:t>to</w:t>
+      </w:r>
+      <w:proofErr w:type="spellEnd"/>
+      <w:r>
+        <w:rPr>
+          <w:rFonts w:ascii="JetBrains Mono" w:hAnsi="JetBrains Mono" w:cs="JetBrains Mono"/>
+          <w:sz w:val="14"/>
+          <w:szCs w:val="14"/>
+          <w:lang w:val="hu-HU"/>
+        </w:rPr>
+        <w:t xml:space="preserve"> be </w:t>
+      </w:r>
+      <w:proofErr w:type="spellStart"/>
+      <w:r>
+        <w:rPr>
+          <w:rFonts w:ascii="JetBrains Mono" w:hAnsi="JetBrains Mono" w:cs="JetBrains Mono"/>
+          <w:sz w:val="14"/>
+          <w:szCs w:val="14"/>
+          <w:lang w:val="hu-HU"/>
+        </w:rPr>
+        <w:t>able</w:t>
       </w:r>
       <w:proofErr w:type="spellEnd"/>
       <w:r>
@@ -9355,7 +10077,7 @@
           <w:szCs w:val="14"/>
           <w:lang w:val="hu-HU"/>
         </w:rPr>
-        <w:t>the</w:t>
+        <w:t>to</w:t>
       </w:r>
       <w:proofErr w:type="spellEnd"/>
       <w:r>
@@ -9375,746 +10097,6 @@
           <w:szCs w:val="14"/>
           <w:lang w:val="hu-HU"/>
         </w:rPr>
-        <w:t>basics</w:t>
-      </w:r>
-      <w:proofErr w:type="spellEnd"/>
-      <w:r>
-        <w:rPr>
-          <w:rFonts w:ascii="JetBrains Mono" w:hAnsi="JetBrains Mono" w:cs="JetBrains Mono"/>
-          <w:sz w:val="14"/>
-          <w:szCs w:val="14"/>
-          <w:lang w:val="hu-HU"/>
-        </w:rPr>
-        <w:t xml:space="preserve"> of </w:t>
-      </w:r>
-      <w:proofErr w:type="spellStart"/>
-      <w:r>
-        <w:rPr>
-          <w:rFonts w:ascii="JetBrains Mono" w:hAnsi="JetBrains Mono" w:cs="JetBrains Mono"/>
-          <w:sz w:val="14"/>
-          <w:szCs w:val="14"/>
-          <w:lang w:val="hu-HU"/>
-        </w:rPr>
-        <w:t>the</w:t>
-      </w:r>
-      <w:proofErr w:type="spellEnd"/>
-      <w:r>
-        <w:rPr>
-          <w:rFonts w:ascii="JetBrains Mono" w:hAnsi="JetBrains Mono" w:cs="JetBrains Mono"/>
-          <w:sz w:val="14"/>
-          <w:szCs w:val="14"/>
-          <w:lang w:val="hu-HU"/>
-        </w:rPr>
-        <w:t xml:space="preserve"> </w:t>
-      </w:r>
-      <w:proofErr w:type="spellStart"/>
-      <w:r>
-        <w:rPr>
-          <w:rFonts w:ascii="JetBrains Mono" w:hAnsi="JetBrains Mono" w:cs="JetBrains Mono"/>
-          <w:sz w:val="14"/>
-          <w:szCs w:val="14"/>
-          <w:lang w:val="hu-HU"/>
-        </w:rPr>
-        <w:t>Unity</w:t>
-      </w:r>
-      <w:proofErr w:type="spellEnd"/>
-      <w:r>
-        <w:rPr>
-          <w:rFonts w:ascii="JetBrains Mono" w:hAnsi="JetBrains Mono" w:cs="JetBrains Mono"/>
-          <w:sz w:val="14"/>
-          <w:szCs w:val="14"/>
-          <w:lang w:val="hu-HU"/>
-        </w:rPr>
-        <w:t xml:space="preserve"> </w:t>
-      </w:r>
-      <w:proofErr w:type="spellStart"/>
-      <w:r>
-        <w:rPr>
-          <w:rFonts w:ascii="JetBrains Mono" w:hAnsi="JetBrains Mono" w:cs="JetBrains Mono"/>
-          <w:sz w:val="14"/>
-          <w:szCs w:val="14"/>
-          <w:lang w:val="hu-HU"/>
-        </w:rPr>
-        <w:t>Engine</w:t>
-      </w:r>
-      <w:proofErr w:type="spellEnd"/>
-      <w:r>
-        <w:rPr>
-          <w:rFonts w:ascii="JetBrains Mono" w:hAnsi="JetBrains Mono" w:cs="JetBrains Mono"/>
-          <w:sz w:val="14"/>
-          <w:szCs w:val="14"/>
-          <w:lang w:val="hu-HU"/>
-        </w:rPr>
-        <w:t>",</w:t>
-      </w:r>
-    </w:p>
-    <w:p>
-      <w:pPr>
-        <w:spacing w:after="0"/>
-        <w:rPr>
-          <w:rFonts w:ascii="JetBrains Mono" w:hAnsi="JetBrains Mono" w:cs="JetBrains Mono"/>
-          <w:sz w:val="14"/>
-          <w:szCs w:val="14"/>
-          <w:lang w:val="hu-HU"/>
-        </w:rPr>
-      </w:pPr>
-      <w:r>
-        <w:rPr>
-          <w:rFonts w:ascii="JetBrains Mono" w:hAnsi="JetBrains Mono" w:cs="JetBrains Mono"/>
-          <w:sz w:val="14"/>
-          <w:szCs w:val="14"/>
-          <w:lang w:val="hu-HU"/>
-        </w:rPr>
-        <w:t>        "</w:t>
-      </w:r>
-      <w:proofErr w:type="spellStart"/>
-      <w:r>
-        <w:rPr>
-          <w:rFonts w:ascii="JetBrains Mono" w:hAnsi="JetBrains Mono" w:cs="JetBrains Mono"/>
-          <w:sz w:val="14"/>
-          <w:szCs w:val="14"/>
-          <w:lang w:val="hu-HU"/>
-        </w:rPr>
-        <w:t>courseType</w:t>
-      </w:r>
-      <w:proofErr w:type="spellEnd"/>
-      <w:r>
-        <w:rPr>
-          <w:rFonts w:ascii="JetBrains Mono" w:hAnsi="JetBrains Mono" w:cs="JetBrains Mono"/>
-          <w:sz w:val="14"/>
-          <w:szCs w:val="14"/>
-          <w:lang w:val="hu-HU"/>
-        </w:rPr>
-        <w:t>": "</w:t>
-      </w:r>
-      <w:proofErr w:type="spellStart"/>
-      <w:r>
-        <w:rPr>
-          <w:rFonts w:ascii="JetBrains Mono" w:hAnsi="JetBrains Mono" w:cs="JetBrains Mono"/>
-          <w:sz w:val="14"/>
-          <w:szCs w:val="14"/>
-          <w:lang w:val="hu-HU"/>
-        </w:rPr>
-        <w:t>learningPath</w:t>
-      </w:r>
-      <w:proofErr w:type="spellEnd"/>
-      <w:r>
-        <w:rPr>
-          <w:rFonts w:ascii="JetBrains Mono" w:hAnsi="JetBrains Mono" w:cs="JetBrains Mono"/>
-          <w:sz w:val="14"/>
-          <w:szCs w:val="14"/>
-          <w:lang w:val="hu-HU"/>
-        </w:rPr>
-        <w:t>"</w:t>
-      </w:r>
-    </w:p>
-    <w:p>
-      <w:pPr>
-        <w:spacing w:after="0"/>
-        <w:rPr>
-          <w:rFonts w:ascii="JetBrains Mono" w:hAnsi="JetBrains Mono" w:cs="JetBrains Mono"/>
-          <w:sz w:val="14"/>
-          <w:szCs w:val="14"/>
-          <w:lang w:val="hu-HU"/>
-        </w:rPr>
-      </w:pPr>
-      <w:r>
-        <w:rPr>
-          <w:rFonts w:ascii="JetBrains Mono" w:hAnsi="JetBrains Mono" w:cs="JetBrains Mono"/>
-          <w:sz w:val="14"/>
-          <w:szCs w:val="14"/>
-          <w:lang w:val="hu-HU"/>
-        </w:rPr>
-        <w:t>      },</w:t>
-      </w:r>
-    </w:p>
-    <w:p>
-      <w:pPr>
-        <w:spacing w:after="0"/>
-        <w:rPr>
-          <w:rFonts w:ascii="JetBrains Mono" w:hAnsi="JetBrains Mono" w:cs="JetBrains Mono"/>
-          <w:sz w:val="14"/>
-          <w:szCs w:val="14"/>
-          <w:lang w:val="hu-HU"/>
-        </w:rPr>
-      </w:pPr>
-      <w:r>
-        <w:rPr>
-          <w:rFonts w:ascii="JetBrains Mono" w:hAnsi="JetBrains Mono" w:cs="JetBrains Mono"/>
-          <w:sz w:val="14"/>
-          <w:szCs w:val="14"/>
-          <w:lang w:val="hu-HU"/>
-        </w:rPr>
-        <w:t>      {</w:t>
-      </w:r>
-    </w:p>
-    <w:p>
-      <w:pPr>
-        <w:spacing w:after="0"/>
-        <w:rPr>
-          <w:rFonts w:ascii="JetBrains Mono" w:hAnsi="JetBrains Mono" w:cs="JetBrains Mono"/>
-          <w:sz w:val="14"/>
-          <w:szCs w:val="14"/>
-          <w:lang w:val="hu-HU"/>
-        </w:rPr>
-      </w:pPr>
-      <w:r>
-        <w:rPr>
-          <w:rFonts w:ascii="JetBrains Mono" w:hAnsi="JetBrains Mono" w:cs="JetBrains Mono"/>
-          <w:sz w:val="14"/>
-          <w:szCs w:val="14"/>
-          <w:lang w:val="hu-HU"/>
-        </w:rPr>
-        <w:t>        "</w:t>
-      </w:r>
-      <w:proofErr w:type="spellStart"/>
-      <w:r>
-        <w:rPr>
-          <w:rFonts w:ascii="JetBrains Mono" w:hAnsi="JetBrains Mono" w:cs="JetBrains Mono"/>
-          <w:sz w:val="14"/>
-          <w:szCs w:val="14"/>
-          <w:lang w:val="hu-HU"/>
-        </w:rPr>
-        <w:t>courseId</w:t>
-      </w:r>
-      <w:proofErr w:type="spellEnd"/>
-      <w:r>
-        <w:rPr>
-          <w:rFonts w:ascii="JetBrains Mono" w:hAnsi="JetBrains Mono" w:cs="JetBrains Mono"/>
-          <w:sz w:val="14"/>
-          <w:szCs w:val="14"/>
-          <w:lang w:val="hu-HU"/>
-        </w:rPr>
-        <w:t>": "</w:t>
-      </w:r>
-      <w:proofErr w:type="spellStart"/>
-      <w:r>
-        <w:rPr>
-          <w:rFonts w:ascii="JetBrains Mono" w:hAnsi="JetBrains Mono" w:cs="JetBrains Mono"/>
-          <w:sz w:val="14"/>
-          <w:szCs w:val="14"/>
-          <w:lang w:val="hu-HU"/>
-        </w:rPr>
-        <w:t>uuid</w:t>
-      </w:r>
-      <w:proofErr w:type="spellEnd"/>
-      <w:r>
-        <w:rPr>
-          <w:rFonts w:ascii="JetBrains Mono" w:hAnsi="JetBrains Mono" w:cs="JetBrains Mono"/>
-          <w:sz w:val="14"/>
-          <w:szCs w:val="14"/>
-          <w:lang w:val="hu-HU"/>
-        </w:rPr>
-        <w:t>",</w:t>
-      </w:r>
-    </w:p>
-    <w:p>
-      <w:pPr>
-        <w:spacing w:after="0"/>
-        <w:rPr>
-          <w:rFonts w:ascii="JetBrains Mono" w:hAnsi="JetBrains Mono" w:cs="JetBrains Mono"/>
-          <w:sz w:val="14"/>
-          <w:szCs w:val="14"/>
-          <w:lang w:val="hu-HU"/>
-        </w:rPr>
-      </w:pPr>
-      <w:r>
-        <w:rPr>
-          <w:rFonts w:ascii="JetBrains Mono" w:hAnsi="JetBrains Mono" w:cs="JetBrains Mono"/>
-          <w:sz w:val="14"/>
-          <w:szCs w:val="14"/>
-          <w:lang w:val="hu-HU"/>
-        </w:rPr>
-        <w:t>        "</w:t>
-      </w:r>
-      <w:proofErr w:type="spellStart"/>
-      <w:r>
-        <w:rPr>
-          <w:rFonts w:ascii="JetBrains Mono" w:hAnsi="JetBrains Mono" w:cs="JetBrains Mono"/>
-          <w:sz w:val="14"/>
-          <w:szCs w:val="14"/>
-          <w:lang w:val="hu-HU"/>
-        </w:rPr>
-        <w:t>instanceId</w:t>
-      </w:r>
-      <w:proofErr w:type="spellEnd"/>
-      <w:r>
-        <w:rPr>
-          <w:rFonts w:ascii="JetBrains Mono" w:hAnsi="JetBrains Mono" w:cs="JetBrains Mono"/>
-          <w:sz w:val="14"/>
-          <w:szCs w:val="14"/>
-          <w:lang w:val="hu-HU"/>
-        </w:rPr>
-        <w:t>": "</w:t>
-      </w:r>
-      <w:proofErr w:type="spellStart"/>
-      <w:r>
-        <w:rPr>
-          <w:rFonts w:ascii="JetBrains Mono" w:hAnsi="JetBrains Mono" w:cs="JetBrains Mono"/>
-          <w:sz w:val="14"/>
-          <w:szCs w:val="14"/>
-          <w:lang w:val="hu-HU"/>
-        </w:rPr>
-        <w:t>uuid</w:t>
-      </w:r>
-      <w:proofErr w:type="spellEnd"/>
-      <w:r>
-        <w:rPr>
-          <w:rFonts w:ascii="JetBrains Mono" w:hAnsi="JetBrains Mono" w:cs="JetBrains Mono"/>
-          <w:sz w:val="14"/>
-          <w:szCs w:val="14"/>
-          <w:lang w:val="hu-HU"/>
-        </w:rPr>
-        <w:t>",</w:t>
-      </w:r>
-    </w:p>
-    <w:p>
-      <w:pPr>
-        <w:spacing w:after="0"/>
-        <w:rPr>
-          <w:rFonts w:ascii="JetBrains Mono" w:hAnsi="JetBrains Mono" w:cs="JetBrains Mono"/>
-          <w:sz w:val="14"/>
-          <w:szCs w:val="14"/>
-          <w:lang w:val="hu-HU"/>
-        </w:rPr>
-      </w:pPr>
-      <w:r>
-        <w:rPr>
-          <w:rFonts w:ascii="JetBrains Mono" w:hAnsi="JetBrains Mono" w:cs="JetBrains Mono"/>
-          <w:sz w:val="14"/>
-          <w:szCs w:val="14"/>
-          <w:lang w:val="hu-HU"/>
-        </w:rPr>
-        <w:t>        "</w:t>
-      </w:r>
-      <w:proofErr w:type="spellStart"/>
-      <w:r>
-        <w:rPr>
-          <w:rFonts w:ascii="JetBrains Mono" w:hAnsi="JetBrains Mono" w:cs="JetBrains Mono"/>
-          <w:sz w:val="14"/>
-          <w:szCs w:val="14"/>
-          <w:lang w:val="hu-HU"/>
-        </w:rPr>
-        <w:t>courseName</w:t>
-      </w:r>
-      <w:proofErr w:type="spellEnd"/>
-      <w:r>
-        <w:rPr>
-          <w:rFonts w:ascii="JetBrains Mono" w:hAnsi="JetBrains Mono" w:cs="JetBrains Mono"/>
-          <w:sz w:val="14"/>
-          <w:szCs w:val="14"/>
-          <w:lang w:val="hu-HU"/>
-        </w:rPr>
-        <w:t xml:space="preserve">": "B2 </w:t>
-      </w:r>
-      <w:proofErr w:type="spellStart"/>
-      <w:r>
-        <w:rPr>
-          <w:rFonts w:ascii="JetBrains Mono" w:hAnsi="JetBrains Mono" w:cs="JetBrains Mono"/>
-          <w:sz w:val="14"/>
-          <w:szCs w:val="14"/>
-          <w:lang w:val="hu-HU"/>
-        </w:rPr>
-        <w:t>english</w:t>
-      </w:r>
-      <w:proofErr w:type="spellEnd"/>
-      <w:r>
-        <w:rPr>
-          <w:rFonts w:ascii="JetBrains Mono" w:hAnsi="JetBrains Mono" w:cs="JetBrains Mono"/>
-          <w:sz w:val="14"/>
-          <w:szCs w:val="14"/>
-          <w:lang w:val="hu-HU"/>
-        </w:rPr>
-        <w:t>",</w:t>
-      </w:r>
-    </w:p>
-    <w:p>
-      <w:pPr>
-        <w:spacing w:after="0"/>
-        <w:rPr>
-          <w:rFonts w:ascii="JetBrains Mono" w:hAnsi="JetBrains Mono" w:cs="JetBrains Mono"/>
-          <w:sz w:val="14"/>
-          <w:szCs w:val="14"/>
-          <w:lang w:val="hu-HU"/>
-        </w:rPr>
-      </w:pPr>
-      <w:r>
-        <w:rPr>
-          <w:rFonts w:ascii="JetBrains Mono" w:hAnsi="JetBrains Mono" w:cs="JetBrains Mono"/>
-          <w:sz w:val="14"/>
-          <w:szCs w:val="14"/>
-          <w:lang w:val="hu-HU"/>
-        </w:rPr>
-        <w:t>        "</w:t>
-      </w:r>
-      <w:proofErr w:type="spellStart"/>
-      <w:r>
-        <w:rPr>
-          <w:rFonts w:ascii="JetBrains Mono" w:hAnsi="JetBrains Mono" w:cs="JetBrains Mono"/>
-          <w:sz w:val="14"/>
-          <w:szCs w:val="14"/>
-          <w:lang w:val="hu-HU"/>
-        </w:rPr>
-        <w:t>imageUrl</w:t>
-      </w:r>
-      <w:proofErr w:type="spellEnd"/>
-      <w:r>
-        <w:rPr>
-          <w:rFonts w:ascii="JetBrains Mono" w:hAnsi="JetBrains Mono" w:cs="JetBrains Mono"/>
-          <w:sz w:val="14"/>
-          <w:szCs w:val="14"/>
-          <w:lang w:val="hu-HU"/>
-        </w:rPr>
-        <w:t>": "",</w:t>
-      </w:r>
-    </w:p>
-    <w:p>
-      <w:pPr>
-        <w:spacing w:after="0"/>
-        <w:rPr>
-          <w:rFonts w:ascii="JetBrains Mono" w:hAnsi="JetBrains Mono" w:cs="JetBrains Mono"/>
-          <w:sz w:val="14"/>
-          <w:szCs w:val="14"/>
-          <w:lang w:val="hu-HU"/>
-        </w:rPr>
-      </w:pPr>
-      <w:r>
-        <w:rPr>
-          <w:rFonts w:ascii="JetBrains Mono" w:hAnsi="JetBrains Mono" w:cs="JetBrains Mono"/>
-          <w:sz w:val="14"/>
-          <w:szCs w:val="14"/>
-          <w:lang w:val="hu-HU"/>
-        </w:rPr>
-        <w:t>        "</w:t>
-      </w:r>
-      <w:proofErr w:type="spellStart"/>
-      <w:r>
-        <w:rPr>
-          <w:rFonts w:ascii="JetBrains Mono" w:hAnsi="JetBrains Mono" w:cs="JetBrains Mono"/>
-          <w:sz w:val="14"/>
-          <w:szCs w:val="14"/>
-          <w:lang w:val="hu-HU"/>
-        </w:rPr>
-        <w:t>teacherName</w:t>
-      </w:r>
-      <w:proofErr w:type="spellEnd"/>
-      <w:r>
-        <w:rPr>
-          <w:rFonts w:ascii="JetBrains Mono" w:hAnsi="JetBrains Mono" w:cs="JetBrains Mono"/>
-          <w:sz w:val="14"/>
-          <w:szCs w:val="14"/>
-          <w:lang w:val="hu-HU"/>
-        </w:rPr>
-        <w:t>": "El-</w:t>
-      </w:r>
-      <w:proofErr w:type="spellStart"/>
-      <w:r>
-        <w:rPr>
-          <w:rFonts w:ascii="JetBrains Mono" w:hAnsi="JetBrains Mono" w:cs="JetBrains Mono"/>
-          <w:sz w:val="14"/>
-          <w:szCs w:val="14"/>
-          <w:lang w:val="hu-HU"/>
-        </w:rPr>
-        <w:t>Jahari</w:t>
-      </w:r>
-      <w:proofErr w:type="spellEnd"/>
-      <w:r>
-        <w:rPr>
-          <w:rFonts w:ascii="JetBrains Mono" w:hAnsi="JetBrains Mono" w:cs="JetBrains Mono"/>
-          <w:sz w:val="14"/>
-          <w:szCs w:val="14"/>
-          <w:lang w:val="hu-HU"/>
-        </w:rPr>
-        <w:t>",</w:t>
-      </w:r>
-    </w:p>
-    <w:p>
-      <w:pPr>
-        <w:spacing w:after="0"/>
-        <w:rPr>
-          <w:rFonts w:ascii="JetBrains Mono" w:hAnsi="JetBrains Mono" w:cs="JetBrains Mono"/>
-          <w:sz w:val="14"/>
-          <w:szCs w:val="14"/>
-          <w:lang w:val="hu-HU"/>
-        </w:rPr>
-      </w:pPr>
-      <w:r>
-        <w:rPr>
-          <w:rFonts w:ascii="JetBrains Mono" w:hAnsi="JetBrains Mono" w:cs="JetBrains Mono"/>
-          <w:sz w:val="14"/>
-          <w:szCs w:val="14"/>
-          <w:lang w:val="hu-HU"/>
-        </w:rPr>
-        <w:t>        "</w:t>
-      </w:r>
-      <w:proofErr w:type="spellStart"/>
-      <w:r>
-        <w:rPr>
-          <w:rFonts w:ascii="JetBrains Mono" w:hAnsi="JetBrains Mono" w:cs="JetBrains Mono"/>
-          <w:sz w:val="14"/>
-          <w:szCs w:val="14"/>
-          <w:lang w:val="hu-HU"/>
-        </w:rPr>
-        <w:t>lessonPrice</w:t>
-      </w:r>
-      <w:proofErr w:type="spellEnd"/>
-      <w:r>
-        <w:rPr>
-          <w:rFonts w:ascii="JetBrains Mono" w:hAnsi="JetBrains Mono" w:cs="JetBrains Mono"/>
-          <w:sz w:val="14"/>
-          <w:szCs w:val="14"/>
-          <w:lang w:val="hu-HU"/>
-        </w:rPr>
-        <w:t>": { "</w:t>
-      </w:r>
-      <w:proofErr w:type="spellStart"/>
-      <w:r>
-        <w:rPr>
-          <w:rFonts w:ascii="JetBrains Mono" w:hAnsi="JetBrains Mono" w:cs="JetBrains Mono"/>
-          <w:sz w:val="14"/>
-          <w:szCs w:val="14"/>
-          <w:lang w:val="hu-HU"/>
-        </w:rPr>
-        <w:t>amount</w:t>
-      </w:r>
-      <w:proofErr w:type="spellEnd"/>
-      <w:r>
-        <w:rPr>
-          <w:rFonts w:ascii="JetBrains Mono" w:hAnsi="JetBrains Mono" w:cs="JetBrains Mono"/>
-          <w:sz w:val="14"/>
-          <w:szCs w:val="14"/>
-          <w:lang w:val="hu-HU"/>
-        </w:rPr>
-        <w:t>": 0, "</w:t>
-      </w:r>
-      <w:proofErr w:type="spellStart"/>
-      <w:r>
-        <w:rPr>
-          <w:rFonts w:ascii="JetBrains Mono" w:hAnsi="JetBrains Mono" w:cs="JetBrains Mono"/>
-          <w:sz w:val="14"/>
-          <w:szCs w:val="14"/>
-          <w:lang w:val="hu-HU"/>
-        </w:rPr>
-        <w:t>currency</w:t>
-      </w:r>
-      <w:proofErr w:type="spellEnd"/>
-      <w:r>
-        <w:rPr>
-          <w:rFonts w:ascii="JetBrains Mono" w:hAnsi="JetBrains Mono" w:cs="JetBrains Mono"/>
-          <w:sz w:val="14"/>
-          <w:szCs w:val="14"/>
-          <w:lang w:val="hu-HU"/>
-        </w:rPr>
-        <w:t>": "HUF" },</w:t>
-      </w:r>
-    </w:p>
-    <w:p>
-      <w:pPr>
-        <w:spacing w:after="0"/>
-        <w:rPr>
-          <w:rFonts w:ascii="JetBrains Mono" w:hAnsi="JetBrains Mono" w:cs="JetBrains Mono"/>
-          <w:sz w:val="14"/>
-          <w:szCs w:val="14"/>
-          <w:lang w:val="hu-HU"/>
-        </w:rPr>
-      </w:pPr>
-      <w:r>
-        <w:rPr>
-          <w:rFonts w:ascii="JetBrains Mono" w:hAnsi="JetBrains Mono" w:cs="JetBrains Mono"/>
-          <w:sz w:val="14"/>
-          <w:szCs w:val="14"/>
-          <w:lang w:val="hu-HU"/>
-        </w:rPr>
-        <w:t>        "</w:t>
-      </w:r>
-      <w:proofErr w:type="spellStart"/>
-      <w:r>
-        <w:rPr>
-          <w:rFonts w:ascii="JetBrains Mono" w:hAnsi="JetBrains Mono" w:cs="JetBrains Mono"/>
-          <w:sz w:val="14"/>
-          <w:szCs w:val="14"/>
-          <w:lang w:val="hu-HU"/>
-        </w:rPr>
-        <w:t>description</w:t>
-      </w:r>
-      <w:proofErr w:type="spellEnd"/>
-      <w:r>
-        <w:rPr>
-          <w:rFonts w:ascii="JetBrains Mono" w:hAnsi="JetBrains Mono" w:cs="JetBrains Mono"/>
-          <w:sz w:val="14"/>
-          <w:szCs w:val="14"/>
-          <w:lang w:val="hu-HU"/>
-        </w:rPr>
-        <w:t>": "</w:t>
-      </w:r>
-      <w:proofErr w:type="spellStart"/>
-      <w:r>
-        <w:rPr>
-          <w:rFonts w:ascii="JetBrains Mono" w:hAnsi="JetBrains Mono" w:cs="JetBrains Mono"/>
-          <w:sz w:val="14"/>
-          <w:szCs w:val="14"/>
-          <w:lang w:val="hu-HU"/>
-        </w:rPr>
-        <w:t>You</w:t>
-      </w:r>
-      <w:proofErr w:type="spellEnd"/>
-      <w:r>
-        <w:rPr>
-          <w:rFonts w:ascii="JetBrains Mono" w:hAnsi="JetBrains Mono" w:cs="JetBrains Mono"/>
-          <w:sz w:val="14"/>
-          <w:szCs w:val="14"/>
-          <w:lang w:val="hu-HU"/>
-        </w:rPr>
-        <w:t xml:space="preserve"> </w:t>
-      </w:r>
-      <w:proofErr w:type="spellStart"/>
-      <w:r>
-        <w:rPr>
-          <w:rFonts w:ascii="JetBrains Mono" w:hAnsi="JetBrains Mono" w:cs="JetBrains Mono"/>
-          <w:sz w:val="14"/>
-          <w:szCs w:val="14"/>
-          <w:lang w:val="hu-HU"/>
-        </w:rPr>
-        <w:t>will</w:t>
-      </w:r>
-      <w:proofErr w:type="spellEnd"/>
-      <w:r>
-        <w:rPr>
-          <w:rFonts w:ascii="JetBrains Mono" w:hAnsi="JetBrains Mono" w:cs="JetBrains Mono"/>
-          <w:sz w:val="14"/>
-          <w:szCs w:val="14"/>
-          <w:lang w:val="hu-HU"/>
-        </w:rPr>
-        <w:t xml:space="preserve"> </w:t>
-      </w:r>
-      <w:proofErr w:type="spellStart"/>
-      <w:r>
-        <w:rPr>
-          <w:rFonts w:ascii="JetBrains Mono" w:hAnsi="JetBrains Mono" w:cs="JetBrains Mono"/>
-          <w:sz w:val="14"/>
-          <w:szCs w:val="14"/>
-          <w:lang w:val="hu-HU"/>
-        </w:rPr>
-        <w:t>learn</w:t>
-      </w:r>
-      <w:proofErr w:type="spellEnd"/>
-      <w:r>
-        <w:rPr>
-          <w:rFonts w:ascii="JetBrains Mono" w:hAnsi="JetBrains Mono" w:cs="JetBrains Mono"/>
-          <w:sz w:val="14"/>
-          <w:szCs w:val="14"/>
-          <w:lang w:val="hu-HU"/>
-        </w:rPr>
-        <w:t xml:space="preserve"> </w:t>
-      </w:r>
-      <w:proofErr w:type="spellStart"/>
-      <w:r>
-        <w:rPr>
-          <w:rFonts w:ascii="JetBrains Mono" w:hAnsi="JetBrains Mono" w:cs="JetBrains Mono"/>
-          <w:sz w:val="14"/>
-          <w:szCs w:val="14"/>
-          <w:lang w:val="hu-HU"/>
-        </w:rPr>
-        <w:t>the</w:t>
-      </w:r>
-      <w:proofErr w:type="spellEnd"/>
-      <w:r>
-        <w:rPr>
-          <w:rFonts w:ascii="JetBrains Mono" w:hAnsi="JetBrains Mono" w:cs="JetBrains Mono"/>
-          <w:sz w:val="14"/>
-          <w:szCs w:val="14"/>
-          <w:lang w:val="hu-HU"/>
-        </w:rPr>
-        <w:t xml:space="preserve"> </w:t>
-      </w:r>
-      <w:proofErr w:type="spellStart"/>
-      <w:r>
-        <w:rPr>
-          <w:rFonts w:ascii="JetBrains Mono" w:hAnsi="JetBrains Mono" w:cs="JetBrains Mono"/>
-          <w:sz w:val="14"/>
-          <w:szCs w:val="14"/>
-          <w:lang w:val="hu-HU"/>
-        </w:rPr>
-        <w:t>basics</w:t>
-      </w:r>
-      <w:proofErr w:type="spellEnd"/>
-      <w:r>
-        <w:rPr>
-          <w:rFonts w:ascii="JetBrains Mono" w:hAnsi="JetBrains Mono" w:cs="JetBrains Mono"/>
-          <w:sz w:val="14"/>
-          <w:szCs w:val="14"/>
-          <w:lang w:val="hu-HU"/>
-        </w:rPr>
-        <w:t xml:space="preserve"> of English, </w:t>
-      </w:r>
-      <w:proofErr w:type="spellStart"/>
-      <w:r>
-        <w:rPr>
-          <w:rFonts w:ascii="JetBrains Mono" w:hAnsi="JetBrains Mono" w:cs="JetBrains Mono"/>
-          <w:sz w:val="14"/>
-          <w:szCs w:val="14"/>
-          <w:lang w:val="hu-HU"/>
-        </w:rPr>
-        <w:t>to</w:t>
-      </w:r>
-      <w:proofErr w:type="spellEnd"/>
-      <w:r>
-        <w:rPr>
-          <w:rFonts w:ascii="JetBrains Mono" w:hAnsi="JetBrains Mono" w:cs="JetBrains Mono"/>
-          <w:sz w:val="14"/>
-          <w:szCs w:val="14"/>
-          <w:lang w:val="hu-HU"/>
-        </w:rPr>
-        <w:t xml:space="preserve"> be </w:t>
-      </w:r>
-      <w:proofErr w:type="spellStart"/>
-      <w:r>
-        <w:rPr>
-          <w:rFonts w:ascii="JetBrains Mono" w:hAnsi="JetBrains Mono" w:cs="JetBrains Mono"/>
-          <w:sz w:val="14"/>
-          <w:szCs w:val="14"/>
-          <w:lang w:val="hu-HU"/>
-        </w:rPr>
-        <w:t>able</w:t>
-      </w:r>
-      <w:proofErr w:type="spellEnd"/>
-      <w:r>
-        <w:rPr>
-          <w:rFonts w:ascii="JetBrains Mono" w:hAnsi="JetBrains Mono" w:cs="JetBrains Mono"/>
-          <w:sz w:val="14"/>
-          <w:szCs w:val="14"/>
-          <w:lang w:val="hu-HU"/>
-        </w:rPr>
-        <w:t xml:space="preserve"> </w:t>
-      </w:r>
-      <w:proofErr w:type="spellStart"/>
-      <w:r>
-        <w:rPr>
-          <w:rFonts w:ascii="JetBrains Mono" w:hAnsi="JetBrains Mono" w:cs="JetBrains Mono"/>
-          <w:sz w:val="14"/>
-          <w:szCs w:val="14"/>
-          <w:lang w:val="hu-HU"/>
-        </w:rPr>
-        <w:t>to</w:t>
-      </w:r>
-      <w:proofErr w:type="spellEnd"/>
-      <w:r>
-        <w:rPr>
-          <w:rFonts w:ascii="JetBrains Mono" w:hAnsi="JetBrains Mono" w:cs="JetBrains Mono"/>
-          <w:sz w:val="14"/>
-          <w:szCs w:val="14"/>
-          <w:lang w:val="hu-HU"/>
-        </w:rPr>
-        <w:t xml:space="preserve"> </w:t>
-      </w:r>
-      <w:proofErr w:type="spellStart"/>
-      <w:r>
-        <w:rPr>
-          <w:rFonts w:ascii="JetBrains Mono" w:hAnsi="JetBrains Mono" w:cs="JetBrains Mono"/>
-          <w:sz w:val="14"/>
-          <w:szCs w:val="14"/>
-          <w:lang w:val="hu-HU"/>
-        </w:rPr>
         <w:t>pass</w:t>
       </w:r>
       <w:proofErr w:type="spellEnd"/>
@@ -10125,27 +10107,7 @@
           <w:szCs w:val="14"/>
           <w:lang w:val="hu-HU"/>
         </w:rPr>
-        <w:t xml:space="preserve"> </w:t>
-      </w:r>
-      <w:proofErr w:type="spellStart"/>
-      <w:r>
-        <w:rPr>
-          <w:rFonts w:ascii="JetBrains Mono" w:hAnsi="JetBrains Mono" w:cs="JetBrains Mono"/>
-          <w:sz w:val="14"/>
-          <w:szCs w:val="14"/>
-          <w:lang w:val="hu-HU"/>
-        </w:rPr>
-        <w:t>the</w:t>
-      </w:r>
-      <w:proofErr w:type="spellEnd"/>
-      <w:r>
-        <w:rPr>
-          <w:rFonts w:ascii="JetBrains Mono" w:hAnsi="JetBrains Mono" w:cs="JetBrains Mono"/>
-          <w:sz w:val="14"/>
-          <w:szCs w:val="14"/>
-          <w:lang w:val="hu-HU"/>
-        </w:rPr>
-        <w:t xml:space="preserve"> B2 </w:t>
+        <w:t xml:space="preserve"> the B2 </w:t>
       </w:r>
       <w:proofErr w:type="spellStart"/>
       <w:r>
@@ -17647,6 +17609,351 @@
     <w:p>
       <w:pPr>
         <w:pStyle w:val="Listaszerbekezds"/>
+        <w:numPr>
+          <w:ilvl w:val="1"/>
+          <w:numId w:val="10"/>
+        </w:numPr>
+        <w:rPr>
+          <w:rFonts w:ascii="Lexend" w:hAnsi="Lexend"/>
+          <w:sz w:val="22"/>
+          <w:szCs w:val="22"/>
+        </w:rPr>
+      </w:pPr>
+      <w:r>
+        <w:rPr>
+          <w:rFonts w:ascii="Lexend" w:hAnsi="Lexend"/>
+          <w:sz w:val="22"/>
+          <w:szCs w:val="22"/>
+        </w:rPr>
+        <w:t>Query:</w:t>
+      </w:r>
+      <w:r>
+        <w:rPr>
+          <w:rFonts w:ascii="Lexend" w:hAnsi="Lexend"/>
+          <w:sz w:val="22"/>
+          <w:szCs w:val="22"/>
+        </w:rPr>
+        <w:t xml:space="preserve"> </w:t>
+      </w:r>
+    </w:p>
+    <w:p>
+      <w:pPr>
+        <w:pStyle w:val="Listaszerbekezds"/>
+        <w:ind w:left="1440"/>
+        <w:rPr>
+          <w:rFonts w:ascii="Lexend" w:hAnsi="Lexend"/>
+          <w:sz w:val="22"/>
+          <w:szCs w:val="22"/>
+        </w:rPr>
+      </w:pPr>
+      <w:proofErr w:type="gramStart"/>
+      <w:r>
+        <w:rPr>
+          <w:rFonts w:ascii="JetBrains Mono" w:hAnsi="JetBrains Mono" w:cs="JetBrains Mono"/>
+          <w:sz w:val="22"/>
+          <w:szCs w:val="22"/>
+        </w:rPr>
+        <w:t>{ "</w:t>
+      </w:r>
+      <w:proofErr w:type="spellStart"/>
+      <w:proofErr w:type="gramEnd"/>
+      <w:r>
+        <w:rPr>
+          <w:rFonts w:ascii="JetBrains Mono" w:hAnsi="JetBrains Mono" w:cs="JetBrains Mono"/>
+          <w:sz w:val="22"/>
+          <w:szCs w:val="22"/>
+        </w:rPr>
+        <w:t>coursesPerPage</w:t>
+      </w:r>
+      <w:proofErr w:type="spellEnd"/>
+      <w:r>
+        <w:rPr>
+          <w:rFonts w:ascii="JetBrains Mono" w:hAnsi="JetBrains Mono" w:cs="JetBrains Mono"/>
+          <w:sz w:val="22"/>
+          <w:szCs w:val="22"/>
+        </w:rPr>
+        <w:t>": 12, "</w:t>
+      </w:r>
+      <w:proofErr w:type="spellStart"/>
+      <w:r>
+        <w:rPr>
+          <w:rFonts w:ascii="JetBrains Mono" w:hAnsi="JetBrains Mono" w:cs="JetBrains Mono"/>
+          <w:sz w:val="22"/>
+          <w:szCs w:val="22"/>
+        </w:rPr>
+        <w:t>pageNum</w:t>
+      </w:r>
+      <w:proofErr w:type="spellEnd"/>
+      <w:r>
+        <w:rPr>
+          <w:rFonts w:ascii="JetBrains Mono" w:hAnsi="JetBrains Mono" w:cs="JetBrains Mono"/>
+          <w:sz w:val="22"/>
+          <w:szCs w:val="22"/>
+        </w:rPr>
+        <w:t>": 1, "keyword": null, "</w:t>
+      </w:r>
+      <w:proofErr w:type="spellStart"/>
+      <w:r>
+        <w:rPr>
+          <w:rFonts w:ascii="JetBrains Mono" w:hAnsi="JetBrains Mono" w:cs="JetBrains Mono"/>
+          <w:sz w:val="22"/>
+          <w:szCs w:val="22"/>
+        </w:rPr>
+        <w:t>orderBy</w:t>
+      </w:r>
+      <w:proofErr w:type="spellEnd"/>
+      <w:r>
+        <w:rPr>
+          <w:rFonts w:ascii="JetBrains Mono" w:hAnsi="JetBrains Mono" w:cs="JetBrains Mono"/>
+          <w:sz w:val="22"/>
+          <w:szCs w:val="22"/>
+        </w:rPr>
+        <w:t>": "Popularity", "domains": [], "tags": [], "levels": [], "languages": [], "</w:t>
+      </w:r>
+      <w:proofErr w:type="spellStart"/>
+      <w:r>
+        <w:rPr>
+          <w:rFonts w:ascii="JetBrains Mono" w:hAnsi="JetBrains Mono" w:cs="JetBrains Mono"/>
+          <w:sz w:val="22"/>
+          <w:szCs w:val="22"/>
+        </w:rPr>
+        <w:t>minPrice</w:t>
+      </w:r>
+      <w:proofErr w:type="spellEnd"/>
+      <w:r>
+        <w:rPr>
+          <w:rFonts w:ascii="JetBrains Mono" w:hAnsi="JetBrains Mono" w:cs="JetBrains Mono"/>
+          <w:sz w:val="22"/>
+          <w:szCs w:val="22"/>
+        </w:rPr>
+        <w:t>": null, "</w:t>
+      </w:r>
+      <w:proofErr w:type="spellStart"/>
+      <w:r>
+        <w:rPr>
+          <w:rFonts w:ascii="JetBrains Mono" w:hAnsi="JetBrains Mono" w:cs="JetBrains Mono"/>
+          <w:sz w:val="22"/>
+          <w:szCs w:val="22"/>
+        </w:rPr>
+        <w:t>maxPrice</w:t>
+      </w:r>
+      <w:proofErr w:type="spellEnd"/>
+      <w:r>
+        <w:rPr>
+          <w:rFonts w:ascii="JetBrains Mono" w:hAnsi="JetBrains Mono" w:cs="JetBrains Mono"/>
+          <w:sz w:val="22"/>
+          <w:szCs w:val="22"/>
+        </w:rPr>
+        <w:t>": null, "</w:t>
+      </w:r>
+      <w:proofErr w:type="spellStart"/>
+      <w:r>
+        <w:rPr>
+          <w:rFonts w:ascii="JetBrains Mono" w:hAnsi="JetBrains Mono" w:cs="JetBrains Mono"/>
+          <w:sz w:val="22"/>
+          <w:szCs w:val="22"/>
+        </w:rPr>
+        <w:t>teacherId</w:t>
+      </w:r>
+      <w:proofErr w:type="spellEnd"/>
+      <w:r>
+        <w:rPr>
+          <w:rFonts w:ascii="JetBrains Mono" w:hAnsi="JetBrains Mono" w:cs="JetBrains Mono"/>
+          <w:sz w:val="22"/>
+          <w:szCs w:val="22"/>
+        </w:rPr>
+        <w:t>": null }</w:t>
+      </w:r>
+    </w:p>
+    <w:p>
+      <w:pPr>
+        <w:pStyle w:val="Listaszerbekezds"/>
+        <w:numPr>
+          <w:ilvl w:val="1"/>
+          <w:numId w:val="10"/>
+        </w:numPr>
+        <w:rPr>
+          <w:rFonts w:ascii="Lexend" w:hAnsi="Lexend"/>
+          <w:sz w:val="22"/>
+          <w:szCs w:val="22"/>
+        </w:rPr>
+      </w:pPr>
+      <w:proofErr w:type="spellStart"/>
+      <w:r>
+        <w:rPr>
+          <w:rFonts w:ascii="Lexend" w:hAnsi="Lexend"/>
+          <w:sz w:val="22"/>
+          <w:szCs w:val="22"/>
+        </w:rPr>
+        <w:t>OrderBy</w:t>
+      </w:r>
+      <w:proofErr w:type="spellEnd"/>
+      <w:r>
+        <w:rPr>
+          <w:rFonts w:ascii="Lexend" w:hAnsi="Lexend"/>
+          <w:sz w:val="22"/>
+          <w:szCs w:val="22"/>
+        </w:rPr>
+        <w:t xml:space="preserve"> options:</w:t>
+      </w:r>
+      <w:r>
+        <w:rPr>
+          <w:rFonts w:ascii="Lexend" w:hAnsi="Lexend"/>
+          <w:sz w:val="22"/>
+          <w:szCs w:val="22"/>
+        </w:rPr>
+        <w:t xml:space="preserve"> </w:t>
+      </w:r>
+    </w:p>
+    <w:p>
+      <w:pPr>
+        <w:pStyle w:val="Listaszerbekezds"/>
+        <w:numPr>
+          <w:ilvl w:val="2"/>
+          <w:numId w:val="10"/>
+        </w:numPr>
+        <w:rPr>
+          <w:rFonts w:ascii="Lexend" w:hAnsi="Lexend"/>
+          <w:sz w:val="22"/>
+          <w:szCs w:val="22"/>
+        </w:rPr>
+      </w:pPr>
+      <w:r>
+        <w:rPr>
+          <w:rFonts w:ascii="Lexend" w:hAnsi="Lexend"/>
+          <w:sz w:val="22"/>
+          <w:szCs w:val="22"/>
+        </w:rPr>
+        <w:t>"Popularity"</w:t>
+      </w:r>
+    </w:p>
+    <w:p>
+      <w:pPr>
+        <w:pStyle w:val="Listaszerbekezds"/>
+        <w:numPr>
+          <w:ilvl w:val="2"/>
+          <w:numId w:val="10"/>
+        </w:numPr>
+        <w:rPr>
+          <w:rFonts w:ascii="Lexend" w:hAnsi="Lexend"/>
+          <w:sz w:val="22"/>
+          <w:szCs w:val="22"/>
+        </w:rPr>
+      </w:pPr>
+      <w:r>
+        <w:rPr>
+          <w:rFonts w:ascii="Lexend" w:hAnsi="Lexend"/>
+          <w:sz w:val="22"/>
+          <w:szCs w:val="22"/>
+        </w:rPr>
+        <w:t>"Recent"</w:t>
+      </w:r>
+    </w:p>
+    <w:p>
+      <w:pPr>
+        <w:pStyle w:val="Listaszerbekezds"/>
+        <w:numPr>
+          <w:ilvl w:val="2"/>
+          <w:numId w:val="10"/>
+        </w:numPr>
+        <w:rPr>
+          <w:rFonts w:ascii="Lexend" w:hAnsi="Lexend"/>
+          <w:sz w:val="22"/>
+          <w:szCs w:val="22"/>
+        </w:rPr>
+      </w:pPr>
+      <w:r>
+        <w:rPr>
+          <w:rFonts w:ascii="Lexend" w:hAnsi="Lexend"/>
+          <w:sz w:val="22"/>
+          <w:szCs w:val="22"/>
+        </w:rPr>
+        <w:t>"Review"</w:t>
+      </w:r>
+    </w:p>
+    <w:p>
+      <w:pPr>
+        <w:pStyle w:val="Listaszerbekezds"/>
+        <w:numPr>
+          <w:ilvl w:val="2"/>
+          <w:numId w:val="10"/>
+        </w:numPr>
+        <w:rPr>
+          <w:rFonts w:ascii="Lexend" w:hAnsi="Lexend"/>
+          <w:sz w:val="22"/>
+          <w:szCs w:val="22"/>
+        </w:rPr>
+      </w:pPr>
+      <w:r>
+        <w:rPr>
+          <w:rFonts w:ascii="Lexend" w:hAnsi="Lexend"/>
+          <w:sz w:val="22"/>
+          <w:szCs w:val="22"/>
+        </w:rPr>
+        <w:t>"</w:t>
+      </w:r>
+      <w:proofErr w:type="spellStart"/>
+      <w:r>
+        <w:rPr>
+          <w:rFonts w:ascii="Lexend" w:hAnsi="Lexend"/>
+          <w:sz w:val="22"/>
+          <w:szCs w:val="22"/>
+        </w:rPr>
+        <w:t>PriceAscending</w:t>
+      </w:r>
+      <w:proofErr w:type="spellEnd"/>
+      <w:r>
+        <w:rPr>
+          <w:rFonts w:ascii="Lexend" w:hAnsi="Lexend"/>
+          <w:sz w:val="22"/>
+          <w:szCs w:val="22"/>
+        </w:rPr>
+        <w:t>"</w:t>
+      </w:r>
+    </w:p>
+    <w:p>
+      <w:pPr>
+        <w:pStyle w:val="Listaszerbekezds"/>
+        <w:numPr>
+          <w:ilvl w:val="2"/>
+          <w:numId w:val="10"/>
+        </w:numPr>
+        <w:rPr>
+          <w:rFonts w:ascii="Lexend" w:hAnsi="Lexend"/>
+          <w:sz w:val="22"/>
+          <w:szCs w:val="22"/>
+        </w:rPr>
+      </w:pPr>
+      <w:r>
+        <w:rPr>
+          <w:rFonts w:ascii="Lexend" w:hAnsi="Lexend"/>
+          <w:sz w:val="22"/>
+          <w:szCs w:val="22"/>
+        </w:rPr>
+        <w:t>"</w:t>
+      </w:r>
+      <w:proofErr w:type="spellStart"/>
+      <w:r>
+        <w:rPr>
+          <w:rFonts w:ascii="Lexend" w:hAnsi="Lexend"/>
+          <w:sz w:val="22"/>
+          <w:szCs w:val="22"/>
+        </w:rPr>
+        <w:t>PriceDescending</w:t>
+      </w:r>
+      <w:proofErr w:type="spellEnd"/>
+      <w:r>
+        <w:rPr>
+          <w:rFonts w:ascii="Lexend" w:hAnsi="Lexend"/>
+          <w:sz w:val="22"/>
+          <w:szCs w:val="22"/>
+        </w:rPr>
+        <w:t>"</w:t>
+      </w:r>
+    </w:p>
+    <w:p>
+      <w:pPr>
+        <w:pStyle w:val="Listaszerbekezds"/>
         <w:spacing w:before="480" w:after="240"/>
         <w:rPr>
           <w:rFonts w:ascii="Lexend" w:hAnsi="Lexend"/>
@@ -17677,37 +17984,7 @@
           <w:sz w:val="28"/>
           <w:szCs w:val="28"/>
         </w:rPr>
-        <w:t>Student</w:t>
-      </w:r>
-      <w:r>
-        <w:rPr>
-          <w:rFonts w:ascii="Lexend" w:hAnsi="Lexend"/>
-          <w:b/>
-          <w:bCs/>
-          <w:sz w:val="28"/>
-          <w:szCs w:val="28"/>
-        </w:rPr>
-        <w:t xml:space="preserve"> -&gt; </w:t>
-      </w:r>
-      <w:r>
-        <w:rPr>
-          <w:rFonts w:ascii="Lexend" w:hAnsi="Lexend"/>
-          <w:b/>
-          <w:bCs/>
-          <w:sz w:val="28"/>
-          <w:szCs w:val="28"/>
-        </w:rPr>
-        <w:t>My courses</w:t>
-      </w:r>
-      <w:r>
-        <w:rPr>
-          <w:rFonts w:ascii="Lexend" w:hAnsi="Lexend"/>
-          <w:b/>
-          <w:bCs/>
-          <w:sz w:val="28"/>
-          <w:szCs w:val="28"/>
-        </w:rPr>
-        <w:t>:</w:t>
+        <w:t>Student -&gt; My courses:</w:t>
       </w:r>
     </w:p>
     <w:p>
@@ -20053,6 +20330,7 @@
   <w:style w:type="character" w:default="1" w:styleId="Bekezdsalapbettpusa">
     <w:name w:val="Default Paragraph Font"/>
     <w:uiPriority w:val="1"/>
+    <w:semiHidden/>
     <w:unhideWhenUsed/>
   </w:style>
   <w:style w:type="table" w:default="1" w:styleId="Normltblzat">

</xml_diff>

<commit_message>
Backend - endpoint done for getting one course
</commit_message>
<xml_diff>
--- a/Dev docs/Software_Architecture_Document.docx
+++ b/Dev docs/Software_Architecture_Document.docx
@@ -7781,6 +7781,90 @@
         <w:t>courses</w:t>
       </w:r>
       <w:proofErr w:type="spellEnd"/>
+      <w:r>
+        <w:rPr>
+          <w:rFonts w:ascii="JetBrains Mono" w:hAnsi="JetBrains Mono" w:cs="JetBrains Mono"/>
+          <w:sz w:val="22"/>
+          <w:szCs w:val="22"/>
+          <w:lang w:val="hu-HU"/>
+        </w:rPr>
+        <w:t>/{</w:t>
+      </w:r>
+      <w:proofErr w:type="spellStart"/>
+      <w:r>
+        <w:rPr>
+          <w:rFonts w:ascii="JetBrains Mono" w:hAnsi="JetBrains Mono" w:cs="JetBrains Mono"/>
+          <w:sz w:val="22"/>
+          <w:szCs w:val="22"/>
+          <w:lang w:val="hu-HU"/>
+        </w:rPr>
+        <w:t>courseId</w:t>
+      </w:r>
+      <w:proofErr w:type="spellEnd"/>
+      <w:r>
+        <w:rPr>
+          <w:rFonts w:ascii="JetBrains Mono" w:hAnsi="JetBrains Mono" w:cs="JetBrains Mono"/>
+          <w:sz w:val="22"/>
+          <w:szCs w:val="22"/>
+          <w:lang w:val="hu-HU"/>
+        </w:rPr>
+        <w:t>}</w:t>
+      </w:r>
+    </w:p>
+    <w:p>
+      <w:pPr>
+        <w:pStyle w:val="Listaszerbekezds"/>
+        <w:numPr>
+          <w:ilvl w:val="1"/>
+          <w:numId w:val="10"/>
+        </w:numPr>
+        <w:rPr>
+          <w:rFonts w:ascii="JetBrains Mono" w:hAnsi="JetBrains Mono" w:cs="JetBrains Mono"/>
+          <w:sz w:val="22"/>
+          <w:szCs w:val="22"/>
+          <w:lang w:val="hu-HU"/>
+        </w:rPr>
+      </w:pPr>
+      <w:r>
+        <w:rPr>
+          <w:rFonts w:ascii="JetBrains Mono" w:hAnsi="JetBrains Mono" w:cs="JetBrains Mono"/>
+          <w:sz w:val="22"/>
+          <w:szCs w:val="22"/>
+          <w:lang w:val="hu-HU"/>
+        </w:rPr>
+        <w:t>GET /</w:t>
+      </w:r>
+      <w:proofErr w:type="spellStart"/>
+      <w:r>
+        <w:rPr>
+          <w:rFonts w:ascii="JetBrains Mono" w:hAnsi="JetBrains Mono" w:cs="JetBrains Mono"/>
+          <w:sz w:val="22"/>
+          <w:szCs w:val="22"/>
+          <w:lang w:val="hu-HU"/>
+        </w:rPr>
+        <w:t>api</w:t>
+      </w:r>
+      <w:proofErr w:type="spellEnd"/>
+      <w:r>
+        <w:rPr>
+          <w:rFonts w:ascii="JetBrains Mono" w:hAnsi="JetBrains Mono" w:cs="JetBrains Mono"/>
+          <w:sz w:val="22"/>
+          <w:szCs w:val="22"/>
+          <w:lang w:val="hu-HU"/>
+        </w:rPr>
+        <w:t>/</w:t>
+      </w:r>
+      <w:proofErr w:type="spellStart"/>
+      <w:r>
+        <w:rPr>
+          <w:rFonts w:ascii="JetBrains Mono" w:hAnsi="JetBrains Mono" w:cs="JetBrains Mono"/>
+          <w:sz w:val="22"/>
+          <w:szCs w:val="22"/>
+          <w:lang w:val="hu-HU"/>
+        </w:rPr>
+        <w:t>courses</w:t>
+      </w:r>
+      <w:proofErr w:type="spellEnd"/>
     </w:p>
     <w:p>
       <w:pPr>
@@ -8383,6 +8467,16 @@
           <w:sz w:val="28"/>
           <w:szCs w:val="28"/>
         </w:rPr>
+        <w:t>/Teacher</w:t>
+      </w:r>
+      <w:r>
+        <w:rPr>
+          <w:rFonts w:ascii="Lexend" w:hAnsi="Lexend"/>
+          <w:b/>
+          <w:bCs/>
+          <w:sz w:val="28"/>
+          <w:szCs w:val="28"/>
+        </w:rPr>
         <w:t xml:space="preserve"> -&gt; </w:t>
       </w:r>
       <w:r>
@@ -8734,6 +8828,128 @@
           <w:szCs w:val="22"/>
         </w:rPr>
         <w:t>": "00000000-0000-0000-0000-000000000000", "text": "" }</w:t>
+      </w:r>
+    </w:p>
+    <w:p>
+      <w:pPr>
+        <w:pStyle w:val="Listaszerbekezds"/>
+        <w:numPr>
+          <w:ilvl w:val="2"/>
+          <w:numId w:val="10"/>
+        </w:numPr>
+        <w:spacing w:before="480" w:after="240"/>
+        <w:rPr>
+          <w:rFonts w:ascii="JetBrains Mono" w:hAnsi="JetBrains Mono" w:cs="JetBrains Mono"/>
+          <w:sz w:val="22"/>
+          <w:szCs w:val="22"/>
+          <w:lang w:val="hu-HU"/>
+        </w:rPr>
+      </w:pPr>
+      <w:r>
+        <w:rPr>
+          <w:rFonts w:ascii="JetBrains Mono" w:hAnsi="JetBrains Mono" w:cs="JetBrains Mono"/>
+          <w:b/>
+          <w:bCs/>
+          <w:sz w:val="22"/>
+          <w:szCs w:val="22"/>
+        </w:rPr>
+        <w:t xml:space="preserve">Posting </w:t>
+      </w:r>
+      <w:r>
+        <w:rPr>
+          <w:rFonts w:ascii="Lexend" w:hAnsi="Lexend"/>
+          <w:sz w:val="22"/>
+          <w:szCs w:val="22"/>
+        </w:rPr>
+        <w:t>(Teacher)</w:t>
+      </w:r>
+      <w:r>
+        <w:rPr>
+          <w:rFonts w:ascii="JetBrains Mono" w:hAnsi="JetBrains Mono" w:cs="JetBrains Mono"/>
+          <w:sz w:val="22"/>
+          <w:szCs w:val="22"/>
+        </w:rPr>
+        <w:t xml:space="preserve">: POST </w:t>
+      </w:r>
+      <w:proofErr w:type="spellStart"/>
+      <w:r>
+        <w:rPr>
+          <w:rFonts w:ascii="JetBrains Mono" w:hAnsi="JetBrains Mono" w:cs="JetBrains Mono"/>
+          <w:sz w:val="22"/>
+          <w:szCs w:val="22"/>
+        </w:rPr>
+        <w:t>api</w:t>
+      </w:r>
+      <w:proofErr w:type="spellEnd"/>
+      <w:r>
+        <w:rPr>
+          <w:rFonts w:ascii="JetBrains Mono" w:hAnsi="JetBrains Mono" w:cs="JetBrains Mono"/>
+          <w:sz w:val="22"/>
+          <w:szCs w:val="22"/>
+        </w:rPr>
+        <w:t>/</w:t>
+      </w:r>
+      <w:proofErr w:type="spellStart"/>
+      <w:r>
+        <w:rPr>
+          <w:rFonts w:ascii="JetBrains Mono" w:hAnsi="JetBrains Mono" w:cs="JetBrains Mono"/>
+          <w:sz w:val="22"/>
+          <w:szCs w:val="22"/>
+          <w:lang w:val="hu-HU"/>
+        </w:rPr>
+        <w:t>wall</w:t>
+      </w:r>
+      <w:proofErr w:type="spellEnd"/>
+      <w:r>
+        <w:rPr>
+          <w:rFonts w:ascii="JetBrains Mono" w:hAnsi="JetBrains Mono" w:cs="JetBrains Mono"/>
+          <w:sz w:val="22"/>
+          <w:szCs w:val="22"/>
+          <w:lang w:val="hu-HU"/>
+        </w:rPr>
+        <w:t>/post</w:t>
+      </w:r>
+    </w:p>
+    <w:p>
+      <w:pPr>
+        <w:pStyle w:val="Listaszerbekezds"/>
+        <w:numPr>
+          <w:ilvl w:val="3"/>
+          <w:numId w:val="10"/>
+        </w:numPr>
+        <w:spacing w:before="480" w:after="240"/>
+        <w:rPr>
+          <w:rFonts w:ascii="JetBrains Mono" w:hAnsi="JetBrains Mono" w:cs="JetBrains Mono"/>
+          <w:sz w:val="22"/>
+          <w:szCs w:val="22"/>
+          <w:lang w:val="hu-HU"/>
+        </w:rPr>
+      </w:pPr>
+      <w:r>
+        <w:rPr>
+          <w:rFonts w:ascii="JetBrains Mono" w:hAnsi="JetBrains Mono" w:cs="JetBrains Mono"/>
+          <w:sz w:val="22"/>
+          <w:szCs w:val="22"/>
+        </w:rPr>
+        <w:t>{ "</w:t>
+      </w:r>
+      <w:proofErr w:type="spellStart"/>
+      <w:r>
+        <w:rPr>
+          <w:rFonts w:ascii="JetBrains Mono" w:hAnsi="JetBrains Mono" w:cs="JetBrains Mono"/>
+          <w:sz w:val="22"/>
+          <w:szCs w:val="22"/>
+        </w:rPr>
+        <w:t>wallId</w:t>
+      </w:r>
+      <w:proofErr w:type="spellEnd"/>
+      <w:r>
+        <w:rPr>
+          <w:rFonts w:ascii="JetBrains Mono" w:hAnsi="JetBrains Mono" w:cs="JetBrains Mono"/>
+          <w:sz w:val="22"/>
+          <w:szCs w:val="22"/>
+        </w:rPr>
+        <w:t>": "a1b2c3d4-e5f6-4a5b-8c9d-0e1f2a3b4c5d", "text": "Check out this new update on the wall!" }</w:t>
       </w:r>
     </w:p>
     <w:p>

</xml_diff>

<commit_message>
Docs - added review creation endpoint documentation
</commit_message>
<xml_diff>
--- a/Dev docs/Software_Architecture_Document.docx
+++ b/Dev docs/Software_Architecture_Document.docx
@@ -8692,8 +8692,19 @@
           <w:szCs w:val="22"/>
           <w:lang w:val="hu-HU"/>
         </w:rPr>
-        <w:t>}/posts</w:t>
-      </w:r>
+        <w:t>}/</w:t>
+      </w:r>
+      <w:proofErr w:type="spellStart"/>
+      <w:r>
+        <w:rPr>
+          <w:rFonts w:ascii="JetBrains Mono" w:hAnsi="JetBrains Mono" w:cs="JetBrains Mono"/>
+          <w:sz w:val="22"/>
+          <w:szCs w:val="22"/>
+          <w:lang w:val="hu-HU"/>
+        </w:rPr>
+        <w:t>posts</w:t>
+      </w:r>
+      <w:proofErr w:type="spellEnd"/>
     </w:p>
     <w:p>
       <w:pPr>
@@ -8954,13 +8965,296 @@
     </w:p>
     <w:p>
       <w:pPr>
-        <w:spacing w:before="480" w:after="240"/>
-        <w:rPr>
-          <w:rFonts w:ascii="JetBrains Mono" w:hAnsi="JetBrains Mono" w:cs="JetBrains Mono"/>
-          <w:sz w:val="16"/>
-          <w:szCs w:val="16"/>
-        </w:rPr>
-      </w:pPr>
+        <w:pStyle w:val="Listaszerbekezds"/>
+        <w:numPr>
+          <w:ilvl w:val="2"/>
+          <w:numId w:val="10"/>
+        </w:numPr>
+        <w:spacing w:before="480" w:after="240"/>
+        <w:rPr>
+          <w:rFonts w:ascii="JetBrains Mono" w:hAnsi="JetBrains Mono" w:cs="JetBrains Mono"/>
+          <w:sz w:val="22"/>
+          <w:szCs w:val="22"/>
+          <w:lang w:val="hu-HU"/>
+        </w:rPr>
+      </w:pPr>
+      <w:r>
+        <w:rPr>
+          <w:rFonts w:ascii="JetBrains Mono" w:hAnsi="JetBrains Mono" w:cs="JetBrains Mono"/>
+          <w:sz w:val="22"/>
+          <w:szCs w:val="22"/>
+        </w:rPr>
+        <w:t xml:space="preserve">Review writing (Student): POST </w:t>
+      </w:r>
+      <w:r>
+        <w:rPr>
+          <w:rFonts w:ascii="JetBrains Mono" w:hAnsi="JetBrains Mono" w:cs="JetBrains Mono"/>
+          <w:sz w:val="22"/>
+          <w:szCs w:val="22"/>
+        </w:rPr>
+        <w:t>/</w:t>
+      </w:r>
+      <w:proofErr w:type="spellStart"/>
+      <w:r>
+        <w:rPr>
+          <w:rFonts w:ascii="JetBrains Mono" w:hAnsi="JetBrains Mono" w:cs="JetBrains Mono"/>
+          <w:sz w:val="22"/>
+          <w:szCs w:val="22"/>
+        </w:rPr>
+        <w:t>api</w:t>
+      </w:r>
+      <w:proofErr w:type="spellEnd"/>
+      <w:r>
+        <w:rPr>
+          <w:rFonts w:ascii="JetBrains Mono" w:hAnsi="JetBrains Mono" w:cs="JetBrains Mono"/>
+          <w:sz w:val="22"/>
+          <w:szCs w:val="22"/>
+        </w:rPr>
+        <w:t>/communication/</w:t>
+      </w:r>
+      <w:proofErr w:type="spellStart"/>
+      <w:r>
+        <w:rPr>
+          <w:rFonts w:ascii="JetBrains Mono" w:hAnsi="JetBrains Mono" w:cs="JetBrains Mono"/>
+          <w:sz w:val="22"/>
+          <w:szCs w:val="22"/>
+        </w:rPr>
+        <w:t>write_review</w:t>
+      </w:r>
+      <w:proofErr w:type="spellEnd"/>
+    </w:p>
+    <w:p>
+      <w:pPr>
+        <w:pStyle w:val="Listaszerbekezds"/>
+        <w:numPr>
+          <w:ilvl w:val="3"/>
+          <w:numId w:val="10"/>
+        </w:numPr>
+        <w:spacing w:before="480" w:after="240"/>
+        <w:rPr>
+          <w:rFonts w:ascii="JetBrains Mono" w:hAnsi="JetBrains Mono" w:cs="JetBrains Mono"/>
+          <w:sz w:val="22"/>
+          <w:szCs w:val="22"/>
+          <w:lang w:val="hu-HU"/>
+        </w:rPr>
+      </w:pPr>
+      <w:r>
+        <w:rPr>
+          <w:rFonts w:ascii="JetBrains Mono" w:hAnsi="JetBrains Mono" w:cs="JetBrains Mono"/>
+          <w:sz w:val="22"/>
+          <w:szCs w:val="22"/>
+          <w:lang w:val="hu-HU"/>
+        </w:rPr>
+        <w:t>{</w:t>
+      </w:r>
+      <w:r>
+        <w:rPr>
+          <w:rFonts w:ascii="JetBrains Mono" w:hAnsi="JetBrains Mono" w:cs="JetBrains Mono"/>
+          <w:sz w:val="22"/>
+          <w:szCs w:val="22"/>
+          <w:lang w:val="hu-HU"/>
+        </w:rPr>
+        <w:t xml:space="preserve"> </w:t>
+      </w:r>
+      <w:r>
+        <w:rPr>
+          <w:rFonts w:ascii="JetBrains Mono" w:hAnsi="JetBrains Mono" w:cs="JetBrains Mono"/>
+          <w:sz w:val="22"/>
+          <w:szCs w:val="22"/>
+          <w:lang w:val="hu-HU"/>
+        </w:rPr>
+        <w:t>"</w:t>
+      </w:r>
+      <w:proofErr w:type="spellStart"/>
+      <w:r>
+        <w:rPr>
+          <w:rFonts w:ascii="JetBrains Mono" w:hAnsi="JetBrains Mono" w:cs="JetBrains Mono"/>
+          <w:sz w:val="22"/>
+          <w:szCs w:val="22"/>
+          <w:lang w:val="hu-HU"/>
+        </w:rPr>
+        <w:t>courseId</w:t>
+      </w:r>
+      <w:proofErr w:type="spellEnd"/>
+      <w:r>
+        <w:rPr>
+          <w:rFonts w:ascii="JetBrains Mono" w:hAnsi="JetBrains Mono" w:cs="JetBrains Mono"/>
+          <w:sz w:val="22"/>
+          <w:szCs w:val="22"/>
+          <w:lang w:val="hu-HU"/>
+        </w:rPr>
+        <w:t>": "",</w:t>
+      </w:r>
+      <w:r>
+        <w:rPr>
+          <w:rFonts w:ascii="JetBrains Mono" w:hAnsi="JetBrains Mono" w:cs="JetBrains Mono"/>
+          <w:sz w:val="22"/>
+          <w:szCs w:val="22"/>
+          <w:lang w:val="hu-HU"/>
+        </w:rPr>
+        <w:t xml:space="preserve"> </w:t>
+      </w:r>
+      <w:r>
+        <w:rPr>
+          <w:rFonts w:ascii="JetBrains Mono" w:hAnsi="JetBrains Mono" w:cs="JetBrains Mono"/>
+          <w:sz w:val="22"/>
+          <w:szCs w:val="22"/>
+          <w:lang w:val="hu-HU"/>
+        </w:rPr>
+        <w:t>"</w:t>
+      </w:r>
+      <w:proofErr w:type="spellStart"/>
+      <w:r>
+        <w:rPr>
+          <w:rFonts w:ascii="JetBrains Mono" w:hAnsi="JetBrains Mono" w:cs="JetBrains Mono"/>
+          <w:sz w:val="22"/>
+          <w:szCs w:val="22"/>
+          <w:lang w:val="hu-HU"/>
+        </w:rPr>
+        <w:t>wallId</w:t>
+      </w:r>
+      <w:proofErr w:type="spellEnd"/>
+      <w:r>
+        <w:rPr>
+          <w:rFonts w:ascii="JetBrains Mono" w:hAnsi="JetBrains Mono" w:cs="JetBrains Mono"/>
+          <w:sz w:val="22"/>
+          <w:szCs w:val="22"/>
+          <w:lang w:val="hu-HU"/>
+        </w:rPr>
+        <w:t>": "",</w:t>
+      </w:r>
+      <w:r>
+        <w:rPr>
+          <w:rFonts w:ascii="JetBrains Mono" w:hAnsi="JetBrains Mono" w:cs="JetBrains Mono"/>
+          <w:sz w:val="22"/>
+          <w:szCs w:val="22"/>
+          <w:lang w:val="hu-HU"/>
+        </w:rPr>
+        <w:t xml:space="preserve"> </w:t>
+      </w:r>
+      <w:r>
+        <w:rPr>
+          <w:rFonts w:ascii="JetBrains Mono" w:hAnsi="JetBrains Mono" w:cs="JetBrains Mono"/>
+          <w:sz w:val="22"/>
+          <w:szCs w:val="22"/>
+          <w:lang w:val="hu-HU"/>
+        </w:rPr>
+        <w:t>"</w:t>
+      </w:r>
+      <w:proofErr w:type="spellStart"/>
+      <w:r>
+        <w:rPr>
+          <w:rFonts w:ascii="JetBrains Mono" w:hAnsi="JetBrains Mono" w:cs="JetBrains Mono"/>
+          <w:sz w:val="22"/>
+          <w:szCs w:val="22"/>
+          <w:lang w:val="hu-HU"/>
+        </w:rPr>
+        <w:t>recommended</w:t>
+      </w:r>
+      <w:proofErr w:type="spellEnd"/>
+      <w:r>
+        <w:rPr>
+          <w:rFonts w:ascii="JetBrains Mono" w:hAnsi="JetBrains Mono" w:cs="JetBrains Mono"/>
+          <w:sz w:val="22"/>
+          <w:szCs w:val="22"/>
+          <w:lang w:val="hu-HU"/>
+        </w:rPr>
+        <w:t xml:space="preserve">": </w:t>
+      </w:r>
+      <w:proofErr w:type="spellStart"/>
+      <w:r>
+        <w:rPr>
+          <w:rFonts w:ascii="JetBrains Mono" w:hAnsi="JetBrains Mono" w:cs="JetBrains Mono"/>
+          <w:sz w:val="22"/>
+          <w:szCs w:val="22"/>
+          <w:lang w:val="hu-HU"/>
+        </w:rPr>
+        <w:t>true</w:t>
+      </w:r>
+      <w:proofErr w:type="spellEnd"/>
+      <w:r>
+        <w:rPr>
+          <w:rFonts w:ascii="JetBrains Mono" w:hAnsi="JetBrains Mono" w:cs="JetBrains Mono"/>
+          <w:sz w:val="22"/>
+          <w:szCs w:val="22"/>
+          <w:lang w:val="hu-HU"/>
+        </w:rPr>
+        <w:t>,</w:t>
+      </w:r>
+      <w:r>
+        <w:rPr>
+          <w:rFonts w:ascii="JetBrains Mono" w:hAnsi="JetBrains Mono" w:cs="JetBrains Mono"/>
+          <w:sz w:val="22"/>
+          <w:szCs w:val="22"/>
+          <w:lang w:val="hu-HU"/>
+        </w:rPr>
+        <w:t xml:space="preserve"> </w:t>
+      </w:r>
+      <w:r>
+        <w:rPr>
+          <w:rFonts w:ascii="JetBrains Mono" w:hAnsi="JetBrains Mono" w:cs="JetBrains Mono"/>
+          <w:sz w:val="22"/>
+          <w:szCs w:val="22"/>
+          <w:lang w:val="hu-HU"/>
+        </w:rPr>
+        <w:t>"text": "",</w:t>
+      </w:r>
+      <w:r>
+        <w:rPr>
+          <w:rFonts w:ascii="JetBrains Mono" w:hAnsi="JetBrains Mono" w:cs="JetBrains Mono"/>
+          <w:sz w:val="22"/>
+          <w:szCs w:val="22"/>
+          <w:lang w:val="hu-HU"/>
+        </w:rPr>
+        <w:t xml:space="preserve"> </w:t>
+      </w:r>
+      <w:r>
+        <w:rPr>
+          <w:rFonts w:ascii="JetBrains Mono" w:hAnsi="JetBrains Mono" w:cs="JetBrains Mono"/>
+          <w:sz w:val="22"/>
+          <w:szCs w:val="22"/>
+          <w:lang w:val="hu-HU"/>
+        </w:rPr>
+        <w:t>"</w:t>
+      </w:r>
+      <w:proofErr w:type="spellStart"/>
+      <w:r>
+        <w:rPr>
+          <w:rFonts w:ascii="JetBrains Mono" w:hAnsi="JetBrains Mono" w:cs="JetBrains Mono"/>
+          <w:sz w:val="22"/>
+          <w:szCs w:val="22"/>
+          <w:lang w:val="hu-HU"/>
+        </w:rPr>
+        <w:t>reviewScore</w:t>
+      </w:r>
+      <w:proofErr w:type="spellEnd"/>
+      <w:r>
+        <w:rPr>
+          <w:rFonts w:ascii="JetBrains Mono" w:hAnsi="JetBrains Mono" w:cs="JetBrains Mono"/>
+          <w:sz w:val="22"/>
+          <w:szCs w:val="22"/>
+          <w:lang w:val="hu-HU"/>
+        </w:rPr>
+        <w:t>": 1</w:t>
+      </w:r>
+      <w:r>
+        <w:rPr>
+          <w:rFonts w:ascii="JetBrains Mono" w:hAnsi="JetBrains Mono" w:cs="JetBrains Mono"/>
+          <w:sz w:val="22"/>
+          <w:szCs w:val="22"/>
+          <w:lang w:val="hu-HU"/>
+        </w:rPr>
+        <w:t xml:space="preserve"> </w:t>
+      </w:r>
+      <w:r>
+        <w:rPr>
+          <w:rFonts w:ascii="JetBrains Mono" w:hAnsi="JetBrains Mono" w:cs="JetBrains Mono"/>
+          <w:sz w:val="22"/>
+          <w:szCs w:val="22"/>
+          <w:lang w:val="hu-HU"/>
+        </w:rPr>
+        <w:t>}</w:t>
+      </w:r>
     </w:p>
     <w:sectPr>
       <w:type w:val="continuous"/>

</xml_diff>

<commit_message>
Backend, Docs - fixed application endpoint, and added it to the docs
</commit_message>
<xml_diff>
--- a/Dev docs/Software_Architecture_Document.docx
+++ b/Dev docs/Software_Architecture_Document.docx
@@ -7909,6 +7909,7 @@
           <w:szCs w:val="22"/>
         </w:rPr>
       </w:pPr>
+      <w:proofErr w:type="gramStart"/>
       <w:r>
         <w:rPr>
           <w:rFonts w:ascii="JetBrains Mono" w:hAnsi="JetBrains Mono" w:cs="JetBrains Mono"/>
@@ -7918,6 +7919,7 @@
         <w:t>{ "</w:t>
       </w:r>
       <w:proofErr w:type="spellStart"/>
+      <w:proofErr w:type="gramEnd"/>
       <w:r>
         <w:rPr>
           <w:rFonts w:ascii="JetBrains Mono" w:hAnsi="JetBrains Mono" w:cs="JetBrains Mono"/>
@@ -8024,6 +8026,192 @@
           <w:szCs w:val="22"/>
         </w:rPr>
         <w:t>": null }</w:t>
+      </w:r>
+    </w:p>
+    <w:p>
+      <w:pPr>
+        <w:pStyle w:val="Listaszerbekezds"/>
+        <w:numPr>
+          <w:ilvl w:val="2"/>
+          <w:numId w:val="10"/>
+        </w:numPr>
+        <w:rPr>
+          <w:rFonts w:ascii="Lexend" w:hAnsi="Lexend"/>
+          <w:sz w:val="22"/>
+          <w:szCs w:val="22"/>
+        </w:rPr>
+      </w:pPr>
+      <w:proofErr w:type="spellStart"/>
+      <w:r>
+        <w:rPr>
+          <w:rFonts w:ascii="Lexend" w:hAnsi="Lexend"/>
+          <w:sz w:val="22"/>
+          <w:szCs w:val="22"/>
+        </w:rPr>
+        <w:t>OrderBy</w:t>
+      </w:r>
+      <w:proofErr w:type="spellEnd"/>
+      <w:r>
+        <w:rPr>
+          <w:rFonts w:ascii="Lexend" w:hAnsi="Lexend"/>
+          <w:sz w:val="22"/>
+          <w:szCs w:val="22"/>
+        </w:rPr>
+        <w:t xml:space="preserve"> options:</w:t>
+      </w:r>
+      <w:r>
+        <w:rPr>
+          <w:rFonts w:ascii="Lexend" w:hAnsi="Lexend"/>
+          <w:sz w:val="22"/>
+          <w:szCs w:val="22"/>
+        </w:rPr>
+        <w:t xml:space="preserve"> </w:t>
+      </w:r>
+    </w:p>
+    <w:p>
+      <w:pPr>
+        <w:pStyle w:val="Listaszerbekezds"/>
+        <w:numPr>
+          <w:ilvl w:val="3"/>
+          <w:numId w:val="10"/>
+        </w:numPr>
+        <w:rPr>
+          <w:rFonts w:ascii="Lexend" w:hAnsi="Lexend"/>
+          <w:sz w:val="22"/>
+          <w:szCs w:val="22"/>
+        </w:rPr>
+      </w:pPr>
+      <w:r>
+        <w:rPr>
+          <w:rFonts w:ascii="Lexend" w:hAnsi="Lexend"/>
+          <w:sz w:val="22"/>
+          <w:szCs w:val="22"/>
+        </w:rPr>
+        <w:t>"Popularity"</w:t>
+      </w:r>
+    </w:p>
+    <w:p>
+      <w:pPr>
+        <w:pStyle w:val="Listaszerbekezds"/>
+        <w:numPr>
+          <w:ilvl w:val="3"/>
+          <w:numId w:val="10"/>
+        </w:numPr>
+        <w:rPr>
+          <w:rFonts w:ascii="Lexend" w:hAnsi="Lexend"/>
+          <w:sz w:val="22"/>
+          <w:szCs w:val="22"/>
+        </w:rPr>
+      </w:pPr>
+      <w:r>
+        <w:rPr>
+          <w:rFonts w:ascii="Lexend" w:hAnsi="Lexend"/>
+          <w:sz w:val="22"/>
+          <w:szCs w:val="22"/>
+        </w:rPr>
+        <w:t>"Recent"</w:t>
+      </w:r>
+    </w:p>
+    <w:p>
+      <w:pPr>
+        <w:pStyle w:val="Listaszerbekezds"/>
+        <w:numPr>
+          <w:ilvl w:val="3"/>
+          <w:numId w:val="10"/>
+        </w:numPr>
+        <w:rPr>
+          <w:rFonts w:ascii="Lexend" w:hAnsi="Lexend"/>
+          <w:sz w:val="22"/>
+          <w:szCs w:val="22"/>
+        </w:rPr>
+      </w:pPr>
+      <w:r>
+        <w:rPr>
+          <w:rFonts w:ascii="Lexend" w:hAnsi="Lexend"/>
+          <w:sz w:val="22"/>
+          <w:szCs w:val="22"/>
+        </w:rPr>
+        <w:t>"Review"</w:t>
+      </w:r>
+    </w:p>
+    <w:p>
+      <w:pPr>
+        <w:pStyle w:val="Listaszerbekezds"/>
+        <w:numPr>
+          <w:ilvl w:val="3"/>
+          <w:numId w:val="10"/>
+        </w:numPr>
+        <w:rPr>
+          <w:rFonts w:ascii="Lexend" w:hAnsi="Lexend"/>
+          <w:sz w:val="22"/>
+          <w:szCs w:val="22"/>
+        </w:rPr>
+      </w:pPr>
+      <w:r>
+        <w:rPr>
+          <w:rFonts w:ascii="Lexend" w:hAnsi="Lexend"/>
+          <w:sz w:val="22"/>
+          <w:szCs w:val="22"/>
+        </w:rPr>
+        <w:t>"</w:t>
+      </w:r>
+      <w:proofErr w:type="spellStart"/>
+      <w:r>
+        <w:rPr>
+          <w:rFonts w:ascii="Lexend" w:hAnsi="Lexend"/>
+          <w:sz w:val="22"/>
+          <w:szCs w:val="22"/>
+        </w:rPr>
+        <w:t>PriceAscending</w:t>
+      </w:r>
+      <w:proofErr w:type="spellEnd"/>
+      <w:r>
+        <w:rPr>
+          <w:rFonts w:ascii="Lexend" w:hAnsi="Lexend"/>
+          <w:sz w:val="22"/>
+          <w:szCs w:val="22"/>
+        </w:rPr>
+        <w:t>"</w:t>
+      </w:r>
+    </w:p>
+    <w:p>
+      <w:pPr>
+        <w:pStyle w:val="Listaszerbekezds"/>
+        <w:numPr>
+          <w:ilvl w:val="3"/>
+          <w:numId w:val="10"/>
+        </w:numPr>
+        <w:rPr>
+          <w:rFonts w:ascii="Lexend" w:hAnsi="Lexend"/>
+          <w:sz w:val="22"/>
+          <w:szCs w:val="22"/>
+        </w:rPr>
+      </w:pPr>
+      <w:r>
+        <w:rPr>
+          <w:rFonts w:ascii="Lexend" w:hAnsi="Lexend"/>
+          <w:sz w:val="22"/>
+          <w:szCs w:val="22"/>
+        </w:rPr>
+        <w:t>"</w:t>
+      </w:r>
+      <w:proofErr w:type="spellStart"/>
+      <w:r>
+        <w:rPr>
+          <w:rFonts w:ascii="Lexend" w:hAnsi="Lexend"/>
+          <w:sz w:val="22"/>
+          <w:szCs w:val="22"/>
+        </w:rPr>
+        <w:t>PriceDescending</w:t>
+      </w:r>
+      <w:proofErr w:type="spellEnd"/>
+      <w:r>
+        <w:rPr>
+          <w:rFonts w:ascii="Lexend" w:hAnsi="Lexend"/>
+          <w:sz w:val="22"/>
+          <w:szCs w:val="22"/>
+        </w:rPr>
+        <w:t>"</w:t>
       </w:r>
     </w:p>
     <w:p>
@@ -8039,31 +8227,47 @@
           <w:szCs w:val="22"/>
         </w:rPr>
       </w:pPr>
+      <w:r>
+        <w:rPr>
+          <w:rFonts w:ascii="Lexend" w:hAnsi="Lexend"/>
+          <w:sz w:val="22"/>
+          <w:szCs w:val="22"/>
+        </w:rPr>
+        <w:t xml:space="preserve">Apply to tutoring course (Student): </w:t>
+      </w:r>
+      <w:r>
+        <w:rPr>
+          <w:rFonts w:ascii="JetBrains Mono" w:hAnsi="JetBrains Mono" w:cs="JetBrains Mono"/>
+          <w:sz w:val="22"/>
+          <w:szCs w:val="22"/>
+        </w:rPr>
+        <w:t xml:space="preserve">GET </w:t>
+      </w:r>
+      <w:r>
+        <w:rPr>
+          <w:rFonts w:ascii="JetBrains Mono" w:hAnsi="JetBrains Mono" w:cs="JetBrains Mono"/>
+          <w:sz w:val="22"/>
+          <w:szCs w:val="22"/>
+        </w:rPr>
+        <w:t>/</w:t>
+      </w:r>
       <w:proofErr w:type="spellStart"/>
       <w:r>
         <w:rPr>
-          <w:rFonts w:ascii="Lexend" w:hAnsi="Lexend"/>
-          <w:sz w:val="22"/>
-          <w:szCs w:val="22"/>
-        </w:rPr>
-        <w:t>OrderBy</w:t>
+          <w:rFonts w:ascii="JetBrains Mono" w:hAnsi="JetBrains Mono" w:cs="JetBrains Mono"/>
+          <w:sz w:val="22"/>
+          <w:szCs w:val="22"/>
+        </w:rPr>
+        <w:t>api</w:t>
       </w:r>
       <w:proofErr w:type="spellEnd"/>
       <w:r>
         <w:rPr>
-          <w:rFonts w:ascii="Lexend" w:hAnsi="Lexend"/>
-          <w:sz w:val="22"/>
-          <w:szCs w:val="22"/>
-        </w:rPr>
-        <w:t xml:space="preserve"> options:</w:t>
-      </w:r>
-      <w:r>
-        <w:rPr>
-          <w:rFonts w:ascii="Lexend" w:hAnsi="Lexend"/>
-          <w:sz w:val="22"/>
-          <w:szCs w:val="22"/>
-        </w:rPr>
-        <w:t xml:space="preserve"> </w:t>
+          <w:rFonts w:ascii="JetBrains Mono" w:hAnsi="JetBrains Mono" w:cs="JetBrains Mono"/>
+          <w:sz w:val="22"/>
+          <w:szCs w:val="22"/>
+        </w:rPr>
+        <w:t>/tutoring/enrollment</w:t>
       </w:r>
     </w:p>
     <w:p>
@@ -8079,72 +8283,23 @@
           <w:szCs w:val="22"/>
         </w:rPr>
       </w:pPr>
-      <w:r>
-        <w:rPr>
-          <w:rFonts w:ascii="Lexend" w:hAnsi="Lexend"/>
-          <w:sz w:val="22"/>
-          <w:szCs w:val="22"/>
-        </w:rPr>
-        <w:t>"Popularity"</w:t>
-      </w:r>
-    </w:p>
-    <w:p>
-      <w:pPr>
-        <w:pStyle w:val="Listaszerbekezds"/>
-        <w:numPr>
-          <w:ilvl w:val="2"/>
-          <w:numId w:val="10"/>
-        </w:numPr>
-        <w:rPr>
-          <w:rFonts w:ascii="Lexend" w:hAnsi="Lexend"/>
-          <w:sz w:val="22"/>
-          <w:szCs w:val="22"/>
-        </w:rPr>
-      </w:pPr>
-      <w:r>
-        <w:rPr>
-          <w:rFonts w:ascii="Lexend" w:hAnsi="Lexend"/>
-          <w:sz w:val="22"/>
-          <w:szCs w:val="22"/>
-        </w:rPr>
-        <w:t>"Recent"</w:t>
-      </w:r>
-    </w:p>
-    <w:p>
-      <w:pPr>
-        <w:pStyle w:val="Listaszerbekezds"/>
-        <w:numPr>
-          <w:ilvl w:val="2"/>
-          <w:numId w:val="10"/>
-        </w:numPr>
-        <w:rPr>
-          <w:rFonts w:ascii="Lexend" w:hAnsi="Lexend"/>
-          <w:sz w:val="22"/>
-          <w:szCs w:val="22"/>
-        </w:rPr>
-      </w:pPr>
-      <w:r>
-        <w:rPr>
-          <w:rFonts w:ascii="Lexend" w:hAnsi="Lexend"/>
-          <w:sz w:val="22"/>
-          <w:szCs w:val="22"/>
-        </w:rPr>
-        <w:t>"Review"</w:t>
-      </w:r>
-    </w:p>
-    <w:p>
-      <w:pPr>
-        <w:pStyle w:val="Listaszerbekezds"/>
-        <w:numPr>
-          <w:ilvl w:val="2"/>
-          <w:numId w:val="10"/>
-        </w:numPr>
-        <w:rPr>
-          <w:rFonts w:ascii="Lexend" w:hAnsi="Lexend"/>
-          <w:sz w:val="22"/>
-          <w:szCs w:val="22"/>
-        </w:rPr>
-      </w:pPr>
+      <w:proofErr w:type="gramStart"/>
+      <w:r>
+        <w:rPr>
+          <w:rFonts w:ascii="Lexend" w:hAnsi="Lexend"/>
+          <w:sz w:val="22"/>
+          <w:szCs w:val="22"/>
+        </w:rPr>
+        <w:t>{</w:t>
+      </w:r>
+      <w:r>
+        <w:rPr>
+          <w:rFonts w:ascii="Lexend" w:hAnsi="Lexend"/>
+          <w:sz w:val="22"/>
+          <w:szCs w:val="22"/>
+        </w:rPr>
+        <w:t xml:space="preserve"> </w:t>
+      </w:r>
       <w:r>
         <w:rPr>
           <w:rFonts w:ascii="Lexend" w:hAnsi="Lexend"/>
@@ -8154,13 +8309,14 @@
         <w:t>"</w:t>
       </w:r>
       <w:proofErr w:type="spellStart"/>
-      <w:r>
-        <w:rPr>
-          <w:rFonts w:ascii="Lexend" w:hAnsi="Lexend"/>
-          <w:sz w:val="22"/>
-          <w:szCs w:val="22"/>
-        </w:rPr>
-        <w:t>PriceAscending</w:t>
+      <w:proofErr w:type="gramEnd"/>
+      <w:r>
+        <w:rPr>
+          <w:rFonts w:ascii="Lexend" w:hAnsi="Lexend"/>
+          <w:sz w:val="22"/>
+          <w:szCs w:val="22"/>
+        </w:rPr>
+        <w:t>courseId</w:t>
       </w:r>
       <w:proofErr w:type="spellEnd"/>
       <w:r>
@@ -8169,30 +8325,56 @@
           <w:sz w:val="22"/>
           <w:szCs w:val="22"/>
         </w:rPr>
+        <w:t>": "",</w:t>
+      </w:r>
+      <w:r>
+        <w:rPr>
+          <w:rFonts w:ascii="Lexend" w:hAnsi="Lexend"/>
+          <w:sz w:val="22"/>
+          <w:szCs w:val="22"/>
+        </w:rPr>
+        <w:t xml:space="preserve"> </w:t>
+      </w:r>
+      <w:r>
+        <w:rPr>
+          <w:rFonts w:ascii="Lexend" w:hAnsi="Lexend"/>
+          <w:sz w:val="22"/>
+          <w:szCs w:val="22"/>
+        </w:rPr>
+        <w:t xml:space="preserve">"status": </w:t>
+      </w:r>
+      <w:r>
+        <w:rPr>
+          <w:rFonts w:ascii="Lexend" w:hAnsi="Lexend"/>
+          <w:sz w:val="22"/>
+          <w:szCs w:val="22"/>
+        </w:rPr>
+        <w:t>0</w:t>
+      </w:r>
+      <w:r>
+        <w:rPr>
+          <w:rFonts w:ascii="Lexend" w:hAnsi="Lexend"/>
+          <w:sz w:val="22"/>
+          <w:szCs w:val="22"/>
+        </w:rPr>
+        <w:t>,</w:t>
+      </w:r>
+      <w:r>
+        <w:rPr>
+          <w:rFonts w:ascii="Lexend" w:hAnsi="Lexend"/>
+          <w:sz w:val="22"/>
+          <w:szCs w:val="22"/>
+        </w:rPr>
+        <w:t xml:space="preserve"> </w:t>
+      </w:r>
+      <w:r>
+        <w:rPr>
+          <w:rFonts w:ascii="Lexend" w:hAnsi="Lexend"/>
+          <w:sz w:val="22"/>
+          <w:szCs w:val="22"/>
+        </w:rPr>
         <w:t>"</w:t>
       </w:r>
-    </w:p>
-    <w:p>
-      <w:pPr>
-        <w:pStyle w:val="Listaszerbekezds"/>
-        <w:numPr>
-          <w:ilvl w:val="2"/>
-          <w:numId w:val="10"/>
-        </w:numPr>
-        <w:rPr>
-          <w:rFonts w:ascii="Lexend" w:hAnsi="Lexend"/>
-          <w:sz w:val="22"/>
-          <w:szCs w:val="22"/>
-        </w:rPr>
-      </w:pPr>
-      <w:r>
-        <w:rPr>
-          <w:rFonts w:ascii="Lexend" w:hAnsi="Lexend"/>
-          <w:sz w:val="22"/>
-          <w:szCs w:val="22"/>
-        </w:rPr>
-        <w:t>"</w:t>
-      </w:r>
       <w:proofErr w:type="spellStart"/>
       <w:r>
         <w:rPr>
@@ -8200,7 +8382,7 @@
           <w:sz w:val="22"/>
           <w:szCs w:val="22"/>
         </w:rPr>
-        <w:t>PriceDescending</w:t>
+        <w:t>tokenCount</w:t>
       </w:r>
       <w:proofErr w:type="spellEnd"/>
       <w:r>
@@ -8209,7 +8391,23 @@
           <w:sz w:val="22"/>
           <w:szCs w:val="22"/>
         </w:rPr>
-        <w:t>"</w:t>
+        <w:t xml:space="preserve">": </w:t>
+      </w:r>
+      <w:r>
+        <w:rPr>
+          <w:rFonts w:ascii="Lexend" w:hAnsi="Lexend"/>
+          <w:sz w:val="22"/>
+          <w:szCs w:val="22"/>
+        </w:rPr>
+        <w:t xml:space="preserve">0 </w:t>
+      </w:r>
+      <w:r>
+        <w:rPr>
+          <w:rFonts w:ascii="Lexend" w:hAnsi="Lexend"/>
+          <w:sz w:val="22"/>
+          <w:szCs w:val="22"/>
+        </w:rPr>
+        <w:t>}</w:t>
       </w:r>
     </w:p>
     <w:p>
@@ -8796,6 +8994,7 @@
           <w:lang w:val="hu-HU"/>
         </w:rPr>
       </w:pPr>
+      <w:proofErr w:type="gramStart"/>
       <w:r>
         <w:rPr>
           <w:rFonts w:ascii="JetBrains Mono" w:hAnsi="JetBrains Mono" w:cs="JetBrains Mono"/>
@@ -8805,6 +9004,7 @@
         <w:t>{ "</w:t>
       </w:r>
       <w:proofErr w:type="spellStart"/>
+      <w:proofErr w:type="gramEnd"/>
       <w:r>
         <w:rPr>
           <w:rFonts w:ascii="JetBrains Mono" w:hAnsi="JetBrains Mono" w:cs="JetBrains Mono"/>
@@ -8936,6 +9136,7 @@
           <w:lang w:val="hu-HU"/>
         </w:rPr>
       </w:pPr>
+      <w:proofErr w:type="gramStart"/>
       <w:r>
         <w:rPr>
           <w:rFonts w:ascii="JetBrains Mono" w:hAnsi="JetBrains Mono" w:cs="JetBrains Mono"/>
@@ -8945,6 +9146,7 @@
         <w:t>{ "</w:t>
       </w:r>
       <w:proofErr w:type="spellStart"/>
+      <w:proofErr w:type="gramEnd"/>
       <w:r>
         <w:rPr>
           <w:rFonts w:ascii="JetBrains Mono" w:hAnsi="JetBrains Mono" w:cs="JetBrains Mono"/>
@@ -8981,10 +9183,36 @@
       <w:r>
         <w:rPr>
           <w:rFonts w:ascii="JetBrains Mono" w:hAnsi="JetBrains Mono" w:cs="JetBrains Mono"/>
-          <w:sz w:val="22"/>
-          <w:szCs w:val="22"/>
-        </w:rPr>
-        <w:t xml:space="preserve">Review writing (Student): POST </w:t>
+          <w:b/>
+          <w:bCs/>
+          <w:sz w:val="22"/>
+          <w:szCs w:val="22"/>
+        </w:rPr>
+        <w:t>Review writing</w:t>
+      </w:r>
+      <w:r>
+        <w:rPr>
+          <w:rFonts w:ascii="JetBrains Mono" w:hAnsi="JetBrains Mono" w:cs="JetBrains Mono"/>
+          <w:sz w:val="22"/>
+          <w:szCs w:val="22"/>
+        </w:rPr>
+        <w:t xml:space="preserve"> </w:t>
+      </w:r>
+      <w:r>
+        <w:rPr>
+          <w:rFonts w:ascii="Lexend" w:hAnsi="Lexend"/>
+          <w:sz w:val="22"/>
+          <w:szCs w:val="22"/>
+        </w:rPr>
+        <w:t>(Student):</w:t>
+      </w:r>
+      <w:r>
+        <w:rPr>
+          <w:rFonts w:ascii="JetBrains Mono" w:hAnsi="JetBrains Mono" w:cs="JetBrains Mono"/>
+          <w:sz w:val="22"/>
+          <w:szCs w:val="22"/>
+        </w:rPr>
+        <w:t xml:space="preserve"> POST </w:t>
       </w:r>
       <w:r>
         <w:rPr>
@@ -9038,6 +9266,7 @@
           <w:lang w:val="hu-HU"/>
         </w:rPr>
       </w:pPr>
+      <w:proofErr w:type="gramStart"/>
       <w:r>
         <w:rPr>
           <w:rFonts w:ascii="JetBrains Mono" w:hAnsi="JetBrains Mono" w:cs="JetBrains Mono"/>
@@ -9066,6 +9295,7 @@
         <w:t>"</w:t>
       </w:r>
       <w:proofErr w:type="spellStart"/>
+      <w:proofErr w:type="gramEnd"/>
       <w:r>
         <w:rPr>
           <w:rFonts w:ascii="JetBrains Mono" w:hAnsi="JetBrains Mono" w:cs="JetBrains Mono"/>

</xml_diff>

<commit_message>
Backend - teacher course creation page endpoint and service
</commit_message>
<xml_diff>
--- a/Dev docs/Software_Architecture_Document.docx
+++ b/Dev docs/Software_Architecture_Document.docx
@@ -8241,15 +8241,7 @@
           <w:sz w:val="22"/>
           <w:szCs w:val="22"/>
         </w:rPr>
-        <w:t xml:space="preserve">GET </w:t>
-      </w:r>
-      <w:r>
-        <w:rPr>
-          <w:rFonts w:ascii="JetBrains Mono" w:hAnsi="JetBrains Mono" w:cs="JetBrains Mono"/>
-          <w:sz w:val="22"/>
-          <w:szCs w:val="22"/>
-        </w:rPr>
-        <w:t>/</w:t>
+        <w:t>GET /</w:t>
       </w:r>
       <w:proofErr w:type="spellStart"/>
       <w:r>
@@ -8325,23 +8317,7 @@
           <w:sz w:val="22"/>
           <w:szCs w:val="22"/>
         </w:rPr>
-        <w:t>": "",</w:t>
-      </w:r>
-      <w:r>
-        <w:rPr>
-          <w:rFonts w:ascii="Lexend" w:hAnsi="Lexend"/>
-          <w:sz w:val="22"/>
-          <w:szCs w:val="22"/>
-        </w:rPr>
-        <w:t xml:space="preserve"> </w:t>
-      </w:r>
-      <w:r>
-        <w:rPr>
-          <w:rFonts w:ascii="Lexend" w:hAnsi="Lexend"/>
-          <w:sz w:val="22"/>
-          <w:szCs w:val="22"/>
-        </w:rPr>
-        <w:t xml:space="preserve">"status": </w:t>
+        <w:t xml:space="preserve">": "", "status": </w:t>
       </w:r>
       <w:r>
         <w:rPr>
@@ -8357,23 +8333,7 @@
           <w:sz w:val="22"/>
           <w:szCs w:val="22"/>
         </w:rPr>
-        <w:t>,</w:t>
-      </w:r>
-      <w:r>
-        <w:rPr>
-          <w:rFonts w:ascii="Lexend" w:hAnsi="Lexend"/>
-          <w:sz w:val="22"/>
-          <w:szCs w:val="22"/>
-        </w:rPr>
-        <w:t xml:space="preserve"> </w:t>
-      </w:r>
-      <w:r>
-        <w:rPr>
-          <w:rFonts w:ascii="Lexend" w:hAnsi="Lexend"/>
-          <w:sz w:val="22"/>
-          <w:szCs w:val="22"/>
-        </w:rPr>
-        <w:t>"</w:t>
+        <w:t>, "</w:t>
       </w:r>
       <w:proofErr w:type="spellStart"/>
       <w:r>
@@ -9484,6 +9444,1079 @@
           <w:lang w:val="hu-HU"/>
         </w:rPr>
         <w:t>}</w:t>
+      </w:r>
+    </w:p>
+    <w:p>
+      <w:pPr>
+        <w:pStyle w:val="Listaszerbekezds"/>
+        <w:numPr>
+          <w:ilvl w:val="0"/>
+          <w:numId w:val="10"/>
+        </w:numPr>
+        <w:spacing w:before="480" w:after="240"/>
+        <w:rPr>
+          <w:rFonts w:ascii="Lexend" w:hAnsi="Lexend"/>
+          <w:sz w:val="22"/>
+          <w:szCs w:val="22"/>
+        </w:rPr>
+      </w:pPr>
+      <w:r>
+        <w:rPr>
+          <w:rFonts w:ascii="Lexend" w:hAnsi="Lexend"/>
+          <w:b/>
+          <w:bCs/>
+          <w:sz w:val="28"/>
+          <w:szCs w:val="28"/>
+        </w:rPr>
+        <w:lastRenderedPageBreak/>
+        <w:t xml:space="preserve">Teacher -&gt; </w:t>
+      </w:r>
+      <w:r>
+        <w:rPr>
+          <w:rFonts w:ascii="Lexend" w:hAnsi="Lexend"/>
+          <w:b/>
+          <w:bCs/>
+          <w:sz w:val="28"/>
+          <w:szCs w:val="28"/>
+        </w:rPr>
+        <w:t>Course Creator</w:t>
+      </w:r>
+      <w:r>
+        <w:rPr>
+          <w:rFonts w:ascii="Lexend" w:hAnsi="Lexend"/>
+          <w:b/>
+          <w:bCs/>
+          <w:sz w:val="28"/>
+          <w:szCs w:val="28"/>
+        </w:rPr>
+        <w:t>:</w:t>
+      </w:r>
+    </w:p>
+    <w:p>
+      <w:pPr>
+        <w:pStyle w:val="Listaszerbekezds"/>
+        <w:numPr>
+          <w:ilvl w:val="1"/>
+          <w:numId w:val="10"/>
+        </w:numPr>
+        <w:spacing w:before="480" w:after="240"/>
+        <w:rPr>
+          <w:rFonts w:ascii="Lexend" w:hAnsi="Lexend"/>
+          <w:b/>
+          <w:bCs/>
+          <w:sz w:val="22"/>
+          <w:szCs w:val="22"/>
+        </w:rPr>
+        <w:sectPr>
+          <w:type w:val="continuous"/>
+          <w:pgSz w:w="11906" w:h="16838"/>
+          <w:pgMar w:top="1417" w:right="1417" w:bottom="1417" w:left="1417" w:header="708" w:footer="708" w:gutter="0"/>
+          <w:cols w:space="709"/>
+          <w:docGrid w:linePitch="360"/>
+        </w:sectPr>
+      </w:pPr>
+    </w:p>
+    <w:p>
+      <w:pPr>
+        <w:pStyle w:val="Listaszerbekezds"/>
+        <w:numPr>
+          <w:ilvl w:val="1"/>
+          <w:numId w:val="10"/>
+        </w:numPr>
+        <w:spacing w:before="480" w:after="240"/>
+        <w:rPr>
+          <w:rFonts w:ascii="Lexend" w:hAnsi="Lexend"/>
+          <w:sz w:val="22"/>
+          <w:szCs w:val="22"/>
+        </w:rPr>
+      </w:pPr>
+      <w:r>
+        <w:rPr>
+          <w:rFonts w:ascii="Lexend" w:hAnsi="Lexend"/>
+          <w:b/>
+          <w:bCs/>
+          <w:sz w:val="22"/>
+          <w:szCs w:val="22"/>
+        </w:rPr>
+        <w:t>Parts:</w:t>
+      </w:r>
+    </w:p>
+    <w:p>
+      <w:pPr>
+        <w:pStyle w:val="Listaszerbekezds"/>
+        <w:numPr>
+          <w:ilvl w:val="2"/>
+          <w:numId w:val="10"/>
+        </w:numPr>
+        <w:spacing w:before="480" w:after="240"/>
+        <w:rPr>
+          <w:rFonts w:ascii="Lexend" w:hAnsi="Lexend"/>
+          <w:sz w:val="22"/>
+          <w:szCs w:val="22"/>
+        </w:rPr>
+      </w:pPr>
+      <w:r>
+        <w:rPr>
+          <w:rFonts w:ascii="Lexend" w:hAnsi="Lexend"/>
+          <w:sz w:val="22"/>
+          <w:szCs w:val="22"/>
+        </w:rPr>
+        <w:t>Inputting all the necessary information: course name, type, description, course icon and banner, tags, languages, domain, place, price and currency</w:t>
+      </w:r>
+    </w:p>
+    <w:p>
+      <w:pPr>
+        <w:pStyle w:val="Listaszerbekezds"/>
+        <w:numPr>
+          <w:ilvl w:val="1"/>
+          <w:numId w:val="10"/>
+        </w:numPr>
+        <w:spacing w:before="480" w:after="240"/>
+        <w:rPr>
+          <w:rFonts w:ascii="JetBrains Mono" w:hAnsi="JetBrains Mono" w:cs="JetBrains Mono"/>
+          <w:sz w:val="16"/>
+          <w:szCs w:val="16"/>
+        </w:rPr>
+      </w:pPr>
+      <w:r>
+        <w:rPr>
+          <w:rFonts w:ascii="Lexend" w:hAnsi="Lexend"/>
+          <w:b/>
+          <w:bCs/>
+          <w:sz w:val="22"/>
+          <w:szCs w:val="22"/>
+        </w:rPr>
+        <w:t xml:space="preserve">Endpoints: </w:t>
+      </w:r>
+    </w:p>
+    <w:p>
+      <w:pPr>
+        <w:pStyle w:val="Listaszerbekezds"/>
+        <w:numPr>
+          <w:ilvl w:val="2"/>
+          <w:numId w:val="10"/>
+        </w:numPr>
+        <w:spacing w:before="480" w:after="240"/>
+        <w:rPr>
+          <w:rFonts w:ascii="JetBrains Mono" w:hAnsi="JetBrains Mono" w:cs="JetBrains Mono"/>
+          <w:sz w:val="22"/>
+          <w:szCs w:val="22"/>
+          <w:lang w:val="hu-HU"/>
+        </w:rPr>
+      </w:pPr>
+      <w:r>
+        <w:rPr>
+          <w:rFonts w:ascii="Lexend" w:hAnsi="Lexend"/>
+          <w:b/>
+          <w:bCs/>
+          <w:sz w:val="22"/>
+          <w:szCs w:val="22"/>
+        </w:rPr>
+        <w:t xml:space="preserve">Page data </w:t>
+      </w:r>
+      <w:r>
+        <w:rPr>
+          <w:rFonts w:ascii="Lexend" w:hAnsi="Lexend"/>
+          <w:sz w:val="22"/>
+          <w:szCs w:val="22"/>
+        </w:rPr>
+        <w:t>(</w:t>
+      </w:r>
+      <w:r>
+        <w:rPr>
+          <w:rFonts w:ascii="Lexend" w:hAnsi="Lexend"/>
+          <w:sz w:val="22"/>
+          <w:szCs w:val="22"/>
+        </w:rPr>
+        <w:t>languages, currencies, domains, levels</w:t>
+      </w:r>
+      <w:r>
+        <w:rPr>
+          <w:rFonts w:ascii="Lexend" w:hAnsi="Lexend"/>
+          <w:sz w:val="22"/>
+          <w:szCs w:val="22"/>
+        </w:rPr>
+        <w:t>)</w:t>
+      </w:r>
+      <w:r>
+        <w:rPr>
+          <w:rFonts w:ascii="Lexend" w:hAnsi="Lexend"/>
+          <w:b/>
+          <w:bCs/>
+          <w:sz w:val="22"/>
+          <w:szCs w:val="22"/>
+        </w:rPr>
+        <w:t xml:space="preserve">: </w:t>
+      </w:r>
+      <w:r>
+        <w:rPr>
+          <w:rFonts w:ascii="Lexend" w:hAnsi="Lexend"/>
+          <w:b/>
+          <w:bCs/>
+          <w:sz w:val="22"/>
+          <w:szCs w:val="22"/>
+        </w:rPr>
+        <w:br/>
+      </w:r>
+      <w:r>
+        <w:rPr>
+          <w:rFonts w:ascii="JetBrains Mono" w:hAnsi="JetBrains Mono" w:cs="JetBrains Mono"/>
+          <w:sz w:val="22"/>
+          <w:szCs w:val="22"/>
+          <w:lang w:val="hu-HU"/>
+        </w:rPr>
+        <w:t>GET /</w:t>
+      </w:r>
+      <w:proofErr w:type="spellStart"/>
+      <w:r>
+        <w:rPr>
+          <w:rFonts w:ascii="JetBrains Mono" w:hAnsi="JetBrains Mono" w:cs="JetBrains Mono"/>
+          <w:sz w:val="22"/>
+          <w:szCs w:val="22"/>
+          <w:lang w:val="hu-HU"/>
+        </w:rPr>
+        <w:t>api</w:t>
+      </w:r>
+      <w:proofErr w:type="spellEnd"/>
+      <w:r>
+        <w:rPr>
+          <w:rFonts w:ascii="JetBrains Mono" w:hAnsi="JetBrains Mono" w:cs="JetBrains Mono"/>
+          <w:sz w:val="22"/>
+          <w:szCs w:val="22"/>
+          <w:lang w:val="hu-HU"/>
+        </w:rPr>
+        <w:t>/</w:t>
+      </w:r>
+      <w:proofErr w:type="spellStart"/>
+      <w:r>
+        <w:rPr>
+          <w:rFonts w:ascii="JetBrains Mono" w:hAnsi="JetBrains Mono" w:cs="JetBrains Mono"/>
+          <w:sz w:val="22"/>
+          <w:szCs w:val="22"/>
+          <w:lang w:val="hu-HU"/>
+        </w:rPr>
+        <w:t>pages</w:t>
+      </w:r>
+      <w:proofErr w:type="spellEnd"/>
+      <w:r>
+        <w:rPr>
+          <w:rFonts w:ascii="JetBrains Mono" w:hAnsi="JetBrains Mono" w:cs="JetBrains Mono"/>
+          <w:sz w:val="22"/>
+          <w:szCs w:val="22"/>
+          <w:lang w:val="hu-HU"/>
+        </w:rPr>
+        <w:t>/</w:t>
+      </w:r>
+      <w:proofErr w:type="spellStart"/>
+      <w:r>
+        <w:rPr>
+          <w:rFonts w:ascii="JetBrains Mono" w:hAnsi="JetBrains Mono" w:cs="JetBrains Mono"/>
+          <w:sz w:val="22"/>
+          <w:szCs w:val="22"/>
+          <w:lang w:val="hu-HU"/>
+        </w:rPr>
+        <w:t>teacher</w:t>
+      </w:r>
+      <w:proofErr w:type="spellEnd"/>
+      <w:r>
+        <w:rPr>
+          <w:rFonts w:ascii="JetBrains Mono" w:hAnsi="JetBrains Mono" w:cs="JetBrains Mono"/>
+          <w:sz w:val="22"/>
+          <w:szCs w:val="22"/>
+          <w:lang w:val="hu-HU"/>
+        </w:rPr>
+        <w:t>/</w:t>
+      </w:r>
+      <w:proofErr w:type="spellStart"/>
+      <w:r>
+        <w:rPr>
+          <w:rFonts w:ascii="JetBrains Mono" w:hAnsi="JetBrains Mono" w:cs="JetBrains Mono"/>
+          <w:sz w:val="22"/>
+          <w:szCs w:val="22"/>
+          <w:lang w:val="hu-HU"/>
+        </w:rPr>
+        <w:t>course-creator</w:t>
+      </w:r>
+      <w:proofErr w:type="spellEnd"/>
+    </w:p>
+    <w:p>
+      <w:pPr>
+        <w:pStyle w:val="Listaszerbekezds"/>
+        <w:numPr>
+          <w:ilvl w:val="2"/>
+          <w:numId w:val="10"/>
+        </w:numPr>
+        <w:spacing w:before="480" w:after="240"/>
+        <w:rPr>
+          <w:rFonts w:ascii="JetBrains Mono" w:hAnsi="JetBrains Mono" w:cs="JetBrains Mono"/>
+          <w:sz w:val="22"/>
+          <w:szCs w:val="22"/>
+          <w:lang w:val="hu-HU"/>
+        </w:rPr>
+      </w:pPr>
+      <w:r>
+        <w:rPr>
+          <w:rFonts w:ascii="Lexend" w:hAnsi="Lexend"/>
+          <w:b/>
+          <w:bCs/>
+          <w:sz w:val="22"/>
+          <w:szCs w:val="22"/>
+        </w:rPr>
+        <w:t>Tags</w:t>
+      </w:r>
+      <w:r>
+        <w:rPr>
+          <w:rFonts w:ascii="Lexend" w:hAnsi="Lexend"/>
+          <w:b/>
+          <w:bCs/>
+          <w:sz w:val="22"/>
+          <w:szCs w:val="22"/>
+        </w:rPr>
+        <w:t xml:space="preserve"> </w:t>
+      </w:r>
+      <w:r>
+        <w:rPr>
+          <w:rFonts w:ascii="Lexend" w:hAnsi="Lexend"/>
+          <w:sz w:val="22"/>
+          <w:szCs w:val="22"/>
+        </w:rPr>
+        <w:t>(</w:t>
+      </w:r>
+      <w:r>
+        <w:rPr>
+          <w:rFonts w:ascii="Lexend" w:hAnsi="Lexend"/>
+          <w:sz w:val="22"/>
+          <w:szCs w:val="22"/>
+        </w:rPr>
+        <w:t>call after first 2 letters</w:t>
+      </w:r>
+      <w:r>
+        <w:rPr>
+          <w:rFonts w:ascii="Lexend" w:hAnsi="Lexend"/>
+          <w:sz w:val="22"/>
+          <w:szCs w:val="22"/>
+        </w:rPr>
+        <w:t>)</w:t>
+      </w:r>
+      <w:r>
+        <w:rPr>
+          <w:rFonts w:ascii="Lexend" w:hAnsi="Lexend"/>
+          <w:b/>
+          <w:bCs/>
+          <w:sz w:val="22"/>
+          <w:szCs w:val="22"/>
+        </w:rPr>
+        <w:t xml:space="preserve">: </w:t>
+      </w:r>
+      <w:r>
+        <w:rPr>
+          <w:rFonts w:ascii="Lexend" w:hAnsi="Lexend"/>
+          <w:b/>
+          <w:bCs/>
+          <w:sz w:val="22"/>
+          <w:szCs w:val="22"/>
+        </w:rPr>
+        <w:br/>
+      </w:r>
+      <w:r>
+        <w:rPr>
+          <w:rFonts w:ascii="JetBrains Mono" w:hAnsi="JetBrains Mono" w:cs="JetBrains Mono"/>
+          <w:sz w:val="22"/>
+          <w:szCs w:val="22"/>
+          <w:lang w:val="hu-HU"/>
+        </w:rPr>
+        <w:t>GET /</w:t>
+      </w:r>
+      <w:proofErr w:type="spellStart"/>
+      <w:r>
+        <w:rPr>
+          <w:rFonts w:ascii="JetBrains Mono" w:hAnsi="JetBrains Mono" w:cs="JetBrains Mono"/>
+          <w:sz w:val="22"/>
+          <w:szCs w:val="22"/>
+          <w:lang w:val="hu-HU"/>
+        </w:rPr>
+        <w:t>api</w:t>
+      </w:r>
+      <w:proofErr w:type="spellEnd"/>
+      <w:r>
+        <w:rPr>
+          <w:rFonts w:ascii="JetBrains Mono" w:hAnsi="JetBrains Mono" w:cs="JetBrains Mono"/>
+          <w:sz w:val="22"/>
+          <w:szCs w:val="22"/>
+          <w:lang w:val="hu-HU"/>
+        </w:rPr>
+        <w:t>/</w:t>
+      </w:r>
+      <w:proofErr w:type="spellStart"/>
+      <w:r>
+        <w:rPr>
+          <w:rFonts w:ascii="JetBrains Mono" w:hAnsi="JetBrains Mono" w:cs="JetBrains Mono"/>
+          <w:sz w:val="22"/>
+          <w:szCs w:val="22"/>
+          <w:lang w:val="hu-HU"/>
+        </w:rPr>
+        <w:t>courses</w:t>
+      </w:r>
+      <w:proofErr w:type="spellEnd"/>
+      <w:r>
+        <w:rPr>
+          <w:rFonts w:ascii="JetBrains Mono" w:hAnsi="JetBrains Mono" w:cs="JetBrains Mono"/>
+          <w:sz w:val="22"/>
+          <w:szCs w:val="22"/>
+        </w:rPr>
+        <w:t>/metadata/tags/{keyword}</w:t>
+      </w:r>
+    </w:p>
+    <w:p>
+      <w:pPr>
+        <w:pStyle w:val="Listaszerbekezds"/>
+        <w:numPr>
+          <w:ilvl w:val="2"/>
+          <w:numId w:val="10"/>
+        </w:numPr>
+        <w:spacing w:before="480" w:after="240"/>
+        <w:rPr>
+          <w:rFonts w:ascii="JetBrains Mono" w:hAnsi="JetBrains Mono" w:cs="JetBrains Mono"/>
+          <w:sz w:val="22"/>
+          <w:szCs w:val="22"/>
+          <w:lang w:val="hu-HU"/>
+        </w:rPr>
+      </w:pPr>
+      <w:r>
+        <w:rPr>
+          <w:rFonts w:ascii="Lexend" w:hAnsi="Lexend"/>
+          <w:b/>
+          <w:bCs/>
+          <w:sz w:val="22"/>
+          <w:szCs w:val="22"/>
+        </w:rPr>
+        <w:t>Sending the course:</w:t>
+      </w:r>
+      <w:r>
+        <w:rPr>
+          <w:rFonts w:ascii="JetBrains Mono" w:hAnsi="JetBrains Mono" w:cs="JetBrains Mono"/>
+          <w:sz w:val="22"/>
+          <w:szCs w:val="22"/>
+          <w:lang w:val="hu-HU"/>
+        </w:rPr>
+        <w:t xml:space="preserve"> POST /</w:t>
+      </w:r>
+      <w:proofErr w:type="spellStart"/>
+      <w:r>
+        <w:rPr>
+          <w:rFonts w:ascii="JetBrains Mono" w:hAnsi="JetBrains Mono" w:cs="JetBrains Mono"/>
+          <w:sz w:val="22"/>
+          <w:szCs w:val="22"/>
+          <w:lang w:val="hu-HU"/>
+        </w:rPr>
+        <w:t>api</w:t>
+      </w:r>
+      <w:proofErr w:type="spellEnd"/>
+      <w:r>
+        <w:rPr>
+          <w:rFonts w:ascii="JetBrains Mono" w:hAnsi="JetBrains Mono" w:cs="JetBrains Mono"/>
+          <w:sz w:val="22"/>
+          <w:szCs w:val="22"/>
+          <w:lang w:val="hu-HU"/>
+        </w:rPr>
+        <w:t>/</w:t>
+      </w:r>
+      <w:proofErr w:type="spellStart"/>
+      <w:r>
+        <w:rPr>
+          <w:rFonts w:ascii="JetBrains Mono" w:hAnsi="JetBrains Mono" w:cs="JetBrains Mono"/>
+          <w:sz w:val="22"/>
+          <w:szCs w:val="22"/>
+          <w:lang w:val="hu-HU"/>
+        </w:rPr>
+        <w:t>courses</w:t>
+      </w:r>
+      <w:proofErr w:type="spellEnd"/>
+      <w:r>
+        <w:rPr>
+          <w:rFonts w:ascii="JetBrains Mono" w:hAnsi="JetBrains Mono" w:cs="JetBrains Mono"/>
+          <w:sz w:val="22"/>
+          <w:szCs w:val="22"/>
+          <w:lang w:val="hu-HU"/>
+        </w:rPr>
+        <w:t>/add</w:t>
+      </w:r>
+    </w:p>
+    <w:p>
+      <w:pPr>
+        <w:pStyle w:val="Listaszerbekezds"/>
+        <w:numPr>
+          <w:ilvl w:val="3"/>
+          <w:numId w:val="10"/>
+        </w:numPr>
+        <w:spacing w:before="480" w:after="240"/>
+        <w:rPr>
+          <w:rFonts w:ascii="JetBrains Mono" w:hAnsi="JetBrains Mono" w:cs="JetBrains Mono"/>
+          <w:sz w:val="22"/>
+          <w:szCs w:val="22"/>
+          <w:lang w:val="hu-HU"/>
+        </w:rPr>
+      </w:pPr>
+      <w:r>
+        <w:rPr>
+          <w:rFonts w:ascii="JetBrains Mono" w:hAnsi="JetBrains Mono" w:cs="JetBrains Mono"/>
+          <w:sz w:val="22"/>
+          <w:szCs w:val="22"/>
+          <w:lang w:val="hu-HU"/>
+        </w:rPr>
+        <w:t>{"</w:t>
+      </w:r>
+      <w:proofErr w:type="spellStart"/>
+      <w:r>
+        <w:rPr>
+          <w:rFonts w:ascii="JetBrains Mono" w:hAnsi="JetBrains Mono" w:cs="JetBrains Mono"/>
+          <w:sz w:val="22"/>
+          <w:szCs w:val="22"/>
+          <w:lang w:val="hu-HU"/>
+        </w:rPr>
+        <w:t>id</w:t>
+      </w:r>
+      <w:proofErr w:type="spellEnd"/>
+      <w:r>
+        <w:rPr>
+          <w:rFonts w:ascii="JetBrains Mono" w:hAnsi="JetBrains Mono" w:cs="JetBrains Mono"/>
+          <w:sz w:val="22"/>
+          <w:szCs w:val="22"/>
+          <w:lang w:val="hu-HU"/>
+        </w:rPr>
+        <w:t>": null,</w:t>
+      </w:r>
+      <w:r>
+        <w:rPr>
+          <w:rFonts w:ascii="JetBrains Mono" w:hAnsi="JetBrains Mono" w:cs="JetBrains Mono"/>
+          <w:sz w:val="22"/>
+          <w:szCs w:val="22"/>
+          <w:lang w:val="hu-HU"/>
+        </w:rPr>
+        <w:t xml:space="preserve"> </w:t>
+      </w:r>
+      <w:r>
+        <w:rPr>
+          <w:rFonts w:ascii="JetBrains Mono" w:hAnsi="JetBrains Mono" w:cs="JetBrains Mono"/>
+          <w:sz w:val="22"/>
+          <w:szCs w:val="22"/>
+          <w:lang w:val="hu-HU"/>
+        </w:rPr>
+        <w:t>"</w:t>
+      </w:r>
+      <w:proofErr w:type="spellStart"/>
+      <w:r>
+        <w:rPr>
+          <w:rFonts w:ascii="JetBrains Mono" w:hAnsi="JetBrains Mono" w:cs="JetBrains Mono"/>
+          <w:sz w:val="22"/>
+          <w:szCs w:val="22"/>
+          <w:lang w:val="hu-HU"/>
+        </w:rPr>
+        <w:t>teacherId</w:t>
+      </w:r>
+      <w:proofErr w:type="spellEnd"/>
+      <w:r>
+        <w:rPr>
+          <w:rFonts w:ascii="JetBrains Mono" w:hAnsi="JetBrains Mono" w:cs="JetBrains Mono"/>
+          <w:sz w:val="22"/>
+          <w:szCs w:val="22"/>
+          <w:lang w:val="hu-HU"/>
+        </w:rPr>
+        <w:t>": "",</w:t>
+      </w:r>
+      <w:r>
+        <w:rPr>
+          <w:rFonts w:ascii="JetBrains Mono" w:hAnsi="JetBrains Mono" w:cs="JetBrains Mono"/>
+          <w:sz w:val="22"/>
+          <w:szCs w:val="22"/>
+          <w:lang w:val="hu-HU"/>
+        </w:rPr>
+        <w:t xml:space="preserve"> </w:t>
+      </w:r>
+      <w:r>
+        <w:rPr>
+          <w:rFonts w:ascii="JetBrains Mono" w:hAnsi="JetBrains Mono" w:cs="JetBrains Mono"/>
+          <w:sz w:val="22"/>
+          <w:szCs w:val="22"/>
+          <w:lang w:val="hu-HU"/>
+        </w:rPr>
+        <w:t>"</w:t>
+      </w:r>
+      <w:proofErr w:type="spellStart"/>
+      <w:r>
+        <w:rPr>
+          <w:rFonts w:ascii="JetBrains Mono" w:hAnsi="JetBrains Mono" w:cs="JetBrains Mono"/>
+          <w:sz w:val="22"/>
+          <w:szCs w:val="22"/>
+          <w:lang w:val="hu-HU"/>
+        </w:rPr>
+        <w:t>courseName</w:t>
+      </w:r>
+      <w:proofErr w:type="spellEnd"/>
+      <w:r>
+        <w:rPr>
+          <w:rFonts w:ascii="JetBrains Mono" w:hAnsi="JetBrains Mono" w:cs="JetBrains Mono"/>
+          <w:sz w:val="22"/>
+          <w:szCs w:val="22"/>
+          <w:lang w:val="hu-HU"/>
+        </w:rPr>
+        <w:t>": "",</w:t>
+      </w:r>
+      <w:r>
+        <w:rPr>
+          <w:rFonts w:ascii="JetBrains Mono" w:hAnsi="JetBrains Mono" w:cs="JetBrains Mono"/>
+          <w:sz w:val="22"/>
+          <w:szCs w:val="22"/>
+          <w:lang w:val="hu-HU"/>
+        </w:rPr>
+        <w:t xml:space="preserve"> </w:t>
+      </w:r>
+      <w:r>
+        <w:rPr>
+          <w:rFonts w:ascii="JetBrains Mono" w:hAnsi="JetBrains Mono" w:cs="JetBrains Mono"/>
+          <w:sz w:val="22"/>
+          <w:szCs w:val="22"/>
+          <w:lang w:val="hu-HU"/>
+        </w:rPr>
+        <w:t>"</w:t>
+      </w:r>
+      <w:proofErr w:type="spellStart"/>
+      <w:r>
+        <w:rPr>
+          <w:rFonts w:ascii="JetBrains Mono" w:hAnsi="JetBrains Mono" w:cs="JetBrains Mono"/>
+          <w:sz w:val="22"/>
+          <w:szCs w:val="22"/>
+          <w:lang w:val="hu-HU"/>
+        </w:rPr>
+        <w:t>description</w:t>
+      </w:r>
+      <w:proofErr w:type="spellEnd"/>
+      <w:r>
+        <w:rPr>
+          <w:rFonts w:ascii="JetBrains Mono" w:hAnsi="JetBrains Mono" w:cs="JetBrains Mono"/>
+          <w:sz w:val="22"/>
+          <w:szCs w:val="22"/>
+          <w:lang w:val="hu-HU"/>
+        </w:rPr>
+        <w:t>": "",</w:t>
+      </w:r>
+      <w:r>
+        <w:rPr>
+          <w:rFonts w:ascii="JetBrains Mono" w:hAnsi="JetBrains Mono" w:cs="JetBrains Mono"/>
+          <w:sz w:val="22"/>
+          <w:szCs w:val="22"/>
+          <w:lang w:val="hu-HU"/>
+        </w:rPr>
+        <w:t xml:space="preserve"> </w:t>
+      </w:r>
+      <w:r>
+        <w:rPr>
+          <w:rFonts w:ascii="JetBrains Mono" w:hAnsi="JetBrains Mono" w:cs="JetBrains Mono"/>
+          <w:sz w:val="22"/>
+          <w:szCs w:val="22"/>
+          <w:lang w:val="hu-HU"/>
+        </w:rPr>
+        <w:t>"</w:t>
+      </w:r>
+      <w:proofErr w:type="spellStart"/>
+      <w:r>
+        <w:rPr>
+          <w:rFonts w:ascii="JetBrains Mono" w:hAnsi="JetBrains Mono" w:cs="JetBrains Mono"/>
+          <w:sz w:val="22"/>
+          <w:szCs w:val="22"/>
+          <w:lang w:val="hu-HU"/>
+        </w:rPr>
+        <w:t>type</w:t>
+      </w:r>
+      <w:proofErr w:type="spellEnd"/>
+      <w:r>
+        <w:rPr>
+          <w:rFonts w:ascii="JetBrains Mono" w:hAnsi="JetBrains Mono" w:cs="JetBrains Mono"/>
+          <w:sz w:val="22"/>
+          <w:szCs w:val="22"/>
+          <w:lang w:val="hu-HU"/>
+        </w:rPr>
+        <w:t>": 1,</w:t>
+      </w:r>
+      <w:r>
+        <w:rPr>
+          <w:rFonts w:ascii="JetBrains Mono" w:hAnsi="JetBrains Mono" w:cs="JetBrains Mono"/>
+          <w:sz w:val="22"/>
+          <w:szCs w:val="22"/>
+          <w:lang w:val="hu-HU"/>
+        </w:rPr>
+        <w:t xml:space="preserve"> </w:t>
+      </w:r>
+      <w:r>
+        <w:rPr>
+          <w:rFonts w:ascii="JetBrains Mono" w:hAnsi="JetBrains Mono" w:cs="JetBrains Mono"/>
+          <w:sz w:val="22"/>
+          <w:szCs w:val="22"/>
+          <w:lang w:val="hu-HU"/>
+        </w:rPr>
+        <w:t>"</w:t>
+      </w:r>
+      <w:proofErr w:type="spellStart"/>
+      <w:r>
+        <w:rPr>
+          <w:rFonts w:ascii="JetBrains Mono" w:hAnsi="JetBrains Mono" w:cs="JetBrains Mono"/>
+          <w:sz w:val="22"/>
+          <w:szCs w:val="22"/>
+          <w:lang w:val="hu-HU"/>
+        </w:rPr>
+        <w:t>courseDomainId</w:t>
+      </w:r>
+      <w:proofErr w:type="spellEnd"/>
+      <w:r>
+        <w:rPr>
+          <w:rFonts w:ascii="JetBrains Mono" w:hAnsi="JetBrains Mono" w:cs="JetBrains Mono"/>
+          <w:sz w:val="22"/>
+          <w:szCs w:val="22"/>
+          <w:lang w:val="hu-HU"/>
+        </w:rPr>
+        <w:t>": "",</w:t>
+      </w:r>
+      <w:r>
+        <w:rPr>
+          <w:rFonts w:ascii="JetBrains Mono" w:hAnsi="JetBrains Mono" w:cs="JetBrains Mono"/>
+          <w:sz w:val="22"/>
+          <w:szCs w:val="22"/>
+          <w:lang w:val="hu-HU"/>
+        </w:rPr>
+        <w:t xml:space="preserve"> </w:t>
+      </w:r>
+      <w:r>
+        <w:rPr>
+          <w:rFonts w:ascii="JetBrains Mono" w:hAnsi="JetBrains Mono" w:cs="JetBrains Mono"/>
+          <w:sz w:val="22"/>
+          <w:szCs w:val="22"/>
+          <w:lang w:val="hu-HU"/>
+        </w:rPr>
+        <w:t>"</w:t>
+      </w:r>
+      <w:proofErr w:type="spellStart"/>
+      <w:r>
+        <w:rPr>
+          <w:rFonts w:ascii="JetBrains Mono" w:hAnsi="JetBrains Mono" w:cs="JetBrains Mono"/>
+          <w:sz w:val="22"/>
+          <w:szCs w:val="22"/>
+          <w:lang w:val="hu-HU"/>
+        </w:rPr>
+        <w:t>courseLevelId</w:t>
+      </w:r>
+      <w:proofErr w:type="spellEnd"/>
+      <w:r>
+        <w:rPr>
+          <w:rFonts w:ascii="JetBrains Mono" w:hAnsi="JetBrains Mono" w:cs="JetBrains Mono"/>
+          <w:sz w:val="22"/>
+          <w:szCs w:val="22"/>
+          <w:lang w:val="hu-HU"/>
+        </w:rPr>
+        <w:t>": "",</w:t>
+      </w:r>
+      <w:r>
+        <w:rPr>
+          <w:rFonts w:ascii="JetBrains Mono" w:hAnsi="JetBrains Mono" w:cs="JetBrains Mono"/>
+          <w:sz w:val="22"/>
+          <w:szCs w:val="22"/>
+          <w:lang w:val="hu-HU"/>
+        </w:rPr>
+        <w:t xml:space="preserve"> </w:t>
+      </w:r>
+      <w:r>
+        <w:rPr>
+          <w:rFonts w:ascii="JetBrains Mono" w:hAnsi="JetBrains Mono" w:cs="JetBrains Mono"/>
+          <w:sz w:val="22"/>
+          <w:szCs w:val="22"/>
+          <w:lang w:val="hu-HU"/>
+        </w:rPr>
+        <w:t>"</w:t>
+      </w:r>
+      <w:proofErr w:type="spellStart"/>
+      <w:r>
+        <w:rPr>
+          <w:rFonts w:ascii="JetBrains Mono" w:hAnsi="JetBrains Mono" w:cs="JetBrains Mono"/>
+          <w:sz w:val="22"/>
+          <w:szCs w:val="22"/>
+          <w:lang w:val="hu-HU"/>
+        </w:rPr>
+        <w:t>price</w:t>
+      </w:r>
+      <w:proofErr w:type="spellEnd"/>
+      <w:r>
+        <w:rPr>
+          <w:rFonts w:ascii="JetBrains Mono" w:hAnsi="JetBrains Mono" w:cs="JetBrains Mono"/>
+          <w:sz w:val="22"/>
+          <w:szCs w:val="22"/>
+          <w:lang w:val="hu-HU"/>
+        </w:rPr>
+        <w:t>": 1,</w:t>
+      </w:r>
+      <w:r>
+        <w:rPr>
+          <w:rFonts w:ascii="JetBrains Mono" w:hAnsi="JetBrains Mono" w:cs="JetBrains Mono"/>
+          <w:sz w:val="22"/>
+          <w:szCs w:val="22"/>
+          <w:lang w:val="hu-HU"/>
+        </w:rPr>
+        <w:t xml:space="preserve"> </w:t>
+      </w:r>
+      <w:r>
+        <w:rPr>
+          <w:rFonts w:ascii="JetBrains Mono" w:hAnsi="JetBrains Mono" w:cs="JetBrains Mono"/>
+          <w:sz w:val="22"/>
+          <w:szCs w:val="22"/>
+          <w:lang w:val="hu-HU"/>
+        </w:rPr>
+        <w:t>"</w:t>
+      </w:r>
+      <w:proofErr w:type="spellStart"/>
+      <w:r>
+        <w:rPr>
+          <w:rFonts w:ascii="JetBrains Mono" w:hAnsi="JetBrains Mono" w:cs="JetBrains Mono"/>
+          <w:sz w:val="22"/>
+          <w:szCs w:val="22"/>
+          <w:lang w:val="hu-HU"/>
+        </w:rPr>
+        <w:t>firstConsultationFree</w:t>
+      </w:r>
+      <w:proofErr w:type="spellEnd"/>
+      <w:r>
+        <w:rPr>
+          <w:rFonts w:ascii="JetBrains Mono" w:hAnsi="JetBrains Mono" w:cs="JetBrains Mono"/>
+          <w:sz w:val="22"/>
+          <w:szCs w:val="22"/>
+          <w:lang w:val="hu-HU"/>
+        </w:rPr>
+        <w:t xml:space="preserve">": </w:t>
+      </w:r>
+      <w:proofErr w:type="spellStart"/>
+      <w:r>
+        <w:rPr>
+          <w:rFonts w:ascii="JetBrains Mono" w:hAnsi="JetBrains Mono" w:cs="JetBrains Mono"/>
+          <w:sz w:val="22"/>
+          <w:szCs w:val="22"/>
+          <w:lang w:val="hu-HU"/>
+        </w:rPr>
+        <w:t>true</w:t>
+      </w:r>
+      <w:proofErr w:type="spellEnd"/>
+      <w:r>
+        <w:rPr>
+          <w:rFonts w:ascii="JetBrains Mono" w:hAnsi="JetBrains Mono" w:cs="JetBrains Mono"/>
+          <w:sz w:val="22"/>
+          <w:szCs w:val="22"/>
+          <w:lang w:val="hu-HU"/>
+        </w:rPr>
+        <w:t>,</w:t>
+      </w:r>
+      <w:r>
+        <w:rPr>
+          <w:rFonts w:ascii="JetBrains Mono" w:hAnsi="JetBrains Mono" w:cs="JetBrains Mono"/>
+          <w:sz w:val="22"/>
+          <w:szCs w:val="22"/>
+          <w:lang w:val="hu-HU"/>
+        </w:rPr>
+        <w:t xml:space="preserve"> </w:t>
+      </w:r>
+      <w:r>
+        <w:rPr>
+          <w:rFonts w:ascii="JetBrains Mono" w:hAnsi="JetBrains Mono" w:cs="JetBrains Mono"/>
+          <w:sz w:val="22"/>
+          <w:szCs w:val="22"/>
+          <w:lang w:val="hu-HU"/>
+        </w:rPr>
+        <w:t>"</w:t>
+      </w:r>
+      <w:proofErr w:type="spellStart"/>
+      <w:r>
+        <w:rPr>
+          <w:rFonts w:ascii="JetBrains Mono" w:hAnsi="JetBrains Mono" w:cs="JetBrains Mono"/>
+          <w:sz w:val="22"/>
+          <w:szCs w:val="22"/>
+          <w:lang w:val="hu-HU"/>
+        </w:rPr>
+        <w:t>priceCurrencyId</w:t>
+      </w:r>
+      <w:proofErr w:type="spellEnd"/>
+      <w:r>
+        <w:rPr>
+          <w:rFonts w:ascii="JetBrains Mono" w:hAnsi="JetBrains Mono" w:cs="JetBrains Mono"/>
+          <w:sz w:val="22"/>
+          <w:szCs w:val="22"/>
+          <w:lang w:val="hu-HU"/>
+        </w:rPr>
+        <w:t>": "",</w:t>
+      </w:r>
+      <w:r>
+        <w:rPr>
+          <w:rFonts w:ascii="JetBrains Mono" w:hAnsi="JetBrains Mono" w:cs="JetBrains Mono"/>
+          <w:sz w:val="22"/>
+          <w:szCs w:val="22"/>
+          <w:lang w:val="hu-HU"/>
+        </w:rPr>
+        <w:t xml:space="preserve"> </w:t>
+      </w:r>
+      <w:r>
+        <w:rPr>
+          <w:rFonts w:ascii="JetBrains Mono" w:hAnsi="JetBrains Mono" w:cs="JetBrains Mono"/>
+          <w:sz w:val="22"/>
+          <w:szCs w:val="22"/>
+          <w:lang w:val="hu-HU"/>
+        </w:rPr>
+        <w:t>"status": 1,</w:t>
+      </w:r>
+      <w:r>
+        <w:rPr>
+          <w:rFonts w:ascii="JetBrains Mono" w:hAnsi="JetBrains Mono" w:cs="JetBrains Mono"/>
+          <w:sz w:val="22"/>
+          <w:szCs w:val="22"/>
+          <w:lang w:val="hu-HU"/>
+        </w:rPr>
+        <w:t xml:space="preserve"> </w:t>
+      </w:r>
+      <w:r>
+        <w:rPr>
+          <w:rFonts w:ascii="JetBrains Mono" w:hAnsi="JetBrains Mono" w:cs="JetBrains Mono"/>
+          <w:sz w:val="22"/>
+          <w:szCs w:val="22"/>
+          <w:lang w:val="hu-HU"/>
+        </w:rPr>
+        <w:t>"</w:t>
+      </w:r>
+      <w:proofErr w:type="spellStart"/>
+      <w:r>
+        <w:rPr>
+          <w:rFonts w:ascii="JetBrains Mono" w:hAnsi="JetBrains Mono" w:cs="JetBrains Mono"/>
+          <w:sz w:val="22"/>
+          <w:szCs w:val="22"/>
+          <w:lang w:val="hu-HU"/>
+        </w:rPr>
+        <w:t>iconImageId</w:t>
+      </w:r>
+      <w:proofErr w:type="spellEnd"/>
+      <w:r>
+        <w:rPr>
+          <w:rFonts w:ascii="JetBrains Mono" w:hAnsi="JetBrains Mono" w:cs="JetBrains Mono"/>
+          <w:sz w:val="22"/>
+          <w:szCs w:val="22"/>
+          <w:lang w:val="hu-HU"/>
+        </w:rPr>
+        <w:t>": null,</w:t>
+      </w:r>
+      <w:r>
+        <w:rPr>
+          <w:rFonts w:ascii="JetBrains Mono" w:hAnsi="JetBrains Mono" w:cs="JetBrains Mono"/>
+          <w:sz w:val="22"/>
+          <w:szCs w:val="22"/>
+          <w:lang w:val="hu-HU"/>
+        </w:rPr>
+        <w:t xml:space="preserve"> </w:t>
+      </w:r>
+      <w:r>
+        <w:rPr>
+          <w:rFonts w:ascii="JetBrains Mono" w:hAnsi="JetBrains Mono" w:cs="JetBrains Mono"/>
+          <w:sz w:val="22"/>
+          <w:szCs w:val="22"/>
+          <w:lang w:val="hu-HU"/>
+        </w:rPr>
+        <w:t>"</w:t>
+      </w:r>
+      <w:proofErr w:type="spellStart"/>
+      <w:r>
+        <w:rPr>
+          <w:rFonts w:ascii="JetBrains Mono" w:hAnsi="JetBrains Mono" w:cs="JetBrains Mono"/>
+          <w:sz w:val="22"/>
+          <w:szCs w:val="22"/>
+          <w:lang w:val="hu-HU"/>
+        </w:rPr>
+        <w:t>bannerImageId</w:t>
+      </w:r>
+      <w:proofErr w:type="spellEnd"/>
+      <w:r>
+        <w:rPr>
+          <w:rFonts w:ascii="JetBrains Mono" w:hAnsi="JetBrains Mono" w:cs="JetBrains Mono"/>
+          <w:sz w:val="22"/>
+          <w:szCs w:val="22"/>
+          <w:lang w:val="hu-HU"/>
+        </w:rPr>
+        <w:t>": null,</w:t>
+      </w:r>
+      <w:r>
+        <w:rPr>
+          <w:rFonts w:ascii="JetBrains Mono" w:hAnsi="JetBrains Mono" w:cs="JetBrains Mono"/>
+          <w:sz w:val="22"/>
+          <w:szCs w:val="22"/>
+          <w:lang w:val="hu-HU"/>
+        </w:rPr>
+        <w:t xml:space="preserve"> </w:t>
+      </w:r>
+      <w:r>
+        <w:rPr>
+          <w:rFonts w:ascii="JetBrains Mono" w:hAnsi="JetBrains Mono" w:cs="JetBrains Mono"/>
+          <w:sz w:val="22"/>
+          <w:szCs w:val="22"/>
+          <w:lang w:val="hu-HU"/>
+        </w:rPr>
+        <w:t>"</w:t>
+      </w:r>
+      <w:proofErr w:type="spellStart"/>
+      <w:r>
+        <w:rPr>
+          <w:rFonts w:ascii="JetBrains Mono" w:hAnsi="JetBrains Mono" w:cs="JetBrains Mono"/>
+          <w:sz w:val="22"/>
+          <w:szCs w:val="22"/>
+          <w:lang w:val="hu-HU"/>
+        </w:rPr>
+        <w:t>tags</w:t>
+      </w:r>
+      <w:proofErr w:type="spellEnd"/>
+      <w:r>
+        <w:rPr>
+          <w:rFonts w:ascii="JetBrains Mono" w:hAnsi="JetBrains Mono" w:cs="JetBrains Mono"/>
+          <w:sz w:val="22"/>
+          <w:szCs w:val="22"/>
+          <w:lang w:val="hu-HU"/>
+        </w:rPr>
+        <w:t>": [""],</w:t>
+      </w:r>
+      <w:r>
+        <w:rPr>
+          <w:rFonts w:ascii="JetBrains Mono" w:hAnsi="JetBrains Mono" w:cs="JetBrains Mono"/>
+          <w:sz w:val="22"/>
+          <w:szCs w:val="22"/>
+          <w:lang w:val="hu-HU"/>
+        </w:rPr>
+        <w:t xml:space="preserve"> </w:t>
+      </w:r>
+      <w:r>
+        <w:rPr>
+          <w:rFonts w:ascii="JetBrains Mono" w:hAnsi="JetBrains Mono" w:cs="JetBrains Mono"/>
+          <w:sz w:val="22"/>
+          <w:szCs w:val="22"/>
+          <w:lang w:val="hu-HU"/>
+        </w:rPr>
+        <w:t>"</w:t>
+      </w:r>
+      <w:proofErr w:type="spellStart"/>
+      <w:r>
+        <w:rPr>
+          <w:rFonts w:ascii="JetBrains Mono" w:hAnsi="JetBrains Mono" w:cs="JetBrains Mono"/>
+          <w:sz w:val="22"/>
+          <w:szCs w:val="22"/>
+          <w:lang w:val="hu-HU"/>
+        </w:rPr>
+        <w:t>languageIds</w:t>
+      </w:r>
+      <w:proofErr w:type="spellEnd"/>
+      <w:r>
+        <w:rPr>
+          <w:rFonts w:ascii="JetBrains Mono" w:hAnsi="JetBrains Mono" w:cs="JetBrains Mono"/>
+          <w:sz w:val="22"/>
+          <w:szCs w:val="22"/>
+          <w:lang w:val="hu-HU"/>
+        </w:rPr>
+        <w:t>": [""]}</w:t>
       </w:r>
     </w:p>
     <w:sectPr>
@@ -10544,7 +11577,7 @@
   <w:abstractNum w:abstractNumId="9" w15:restartNumberingAfterBreak="0">
     <w:nsid w:val="43F30B99"/>
     <w:multiLevelType w:val="hybridMultilevel"/>
-    <w:tmpl w:val="4C968CF6"/>
+    <w:tmpl w:val="EC76EFC4"/>
     <w:lvl w:ilvl="0" w:tplc="040E0001">
       <w:start w:val="1"/>
       <w:numFmt w:val="bullet"/>

</xml_diff>

<commit_message>
Backend - profile endpoint done, CourseCreatin works with language names not IDs
</commit_message>
<xml_diff>
--- a/Dev docs/Software_Architecture_Document.docx
+++ b/Dev docs/Software_Architecture_Document.docx
@@ -7909,7 +7909,6 @@
           <w:szCs w:val="22"/>
         </w:rPr>
       </w:pPr>
-      <w:proofErr w:type="gramStart"/>
       <w:r>
         <w:rPr>
           <w:rFonts w:ascii="JetBrains Mono" w:hAnsi="JetBrains Mono" w:cs="JetBrains Mono"/>
@@ -7919,7 +7918,6 @@
         <w:t>{ "</w:t>
       </w:r>
       <w:proofErr w:type="spellStart"/>
-      <w:proofErr w:type="gramEnd"/>
       <w:r>
         <w:rPr>
           <w:rFonts w:ascii="JetBrains Mono" w:hAnsi="JetBrains Mono" w:cs="JetBrains Mono"/>
@@ -8275,7 +8273,6 @@
           <w:szCs w:val="22"/>
         </w:rPr>
       </w:pPr>
-      <w:proofErr w:type="gramStart"/>
       <w:r>
         <w:rPr>
           <w:rFonts w:ascii="Lexend" w:hAnsi="Lexend"/>
@@ -8301,7 +8298,6 @@
         <w:t>"</w:t>
       </w:r>
       <w:proofErr w:type="spellStart"/>
-      <w:proofErr w:type="gramEnd"/>
       <w:r>
         <w:rPr>
           <w:rFonts w:ascii="Lexend" w:hAnsi="Lexend"/>
@@ -8954,7 +8950,6 @@
           <w:lang w:val="hu-HU"/>
         </w:rPr>
       </w:pPr>
-      <w:proofErr w:type="gramStart"/>
       <w:r>
         <w:rPr>
           <w:rFonts w:ascii="JetBrains Mono" w:hAnsi="JetBrains Mono" w:cs="JetBrains Mono"/>
@@ -8964,7 +8959,6 @@
         <w:t>{ "</w:t>
       </w:r>
       <w:proofErr w:type="spellStart"/>
-      <w:proofErr w:type="gramEnd"/>
       <w:r>
         <w:rPr>
           <w:rFonts w:ascii="JetBrains Mono" w:hAnsi="JetBrains Mono" w:cs="JetBrains Mono"/>
@@ -9096,7 +9090,6 @@
           <w:lang w:val="hu-HU"/>
         </w:rPr>
       </w:pPr>
-      <w:proofErr w:type="gramStart"/>
       <w:r>
         <w:rPr>
           <w:rFonts w:ascii="JetBrains Mono" w:hAnsi="JetBrains Mono" w:cs="JetBrains Mono"/>
@@ -9106,7 +9099,6 @@
         <w:t>{ "</w:t>
       </w:r>
       <w:proofErr w:type="spellStart"/>
-      <w:proofErr w:type="gramEnd"/>
       <w:r>
         <w:rPr>
           <w:rFonts w:ascii="JetBrains Mono" w:hAnsi="JetBrains Mono" w:cs="JetBrains Mono"/>
@@ -9226,7 +9218,6 @@
           <w:lang w:val="hu-HU"/>
         </w:rPr>
       </w:pPr>
-      <w:proofErr w:type="gramStart"/>
       <w:r>
         <w:rPr>
           <w:rFonts w:ascii="JetBrains Mono" w:hAnsi="JetBrains Mono" w:cs="JetBrains Mono"/>
@@ -9255,7 +9246,6 @@
         <w:t>"</w:t>
       </w:r>
       <w:proofErr w:type="spellStart"/>
-      <w:proofErr w:type="gramEnd"/>
       <w:r>
         <w:rPr>
           <w:rFonts w:ascii="JetBrains Mono" w:hAnsi="JetBrains Mono" w:cs="JetBrains Mono"/>
@@ -9469,27 +9459,7 @@
           <w:szCs w:val="28"/>
         </w:rPr>
         <w:lastRenderedPageBreak/>
-        <w:t xml:space="preserve">Teacher -&gt; </w:t>
-      </w:r>
-      <w:r>
-        <w:rPr>
-          <w:rFonts w:ascii="Lexend" w:hAnsi="Lexend"/>
-          <w:b/>
-          <w:bCs/>
-          <w:sz w:val="28"/>
-          <w:szCs w:val="28"/>
-        </w:rPr>
-        <w:t>Course Creator</w:t>
-      </w:r>
-      <w:r>
-        <w:rPr>
-          <w:rFonts w:ascii="Lexend" w:hAnsi="Lexend"/>
-          <w:b/>
-          <w:bCs/>
-          <w:sz w:val="28"/>
-          <w:szCs w:val="28"/>
-        </w:rPr>
-        <w:t>:</w:t>
+        <w:t>Teacher -&gt; Course Creator:</w:t>
       </w:r>
     </w:p>
     <w:p>
@@ -9762,17 +9732,7 @@
           <w:sz w:val="22"/>
           <w:szCs w:val="22"/>
         </w:rPr>
-        <w:t>Tags</w:t>
-      </w:r>
-      <w:r>
-        <w:rPr>
-          <w:rFonts w:ascii="Lexend" w:hAnsi="Lexend"/>
-          <w:b/>
-          <w:bCs/>
-          <w:sz w:val="22"/>
-          <w:szCs w:val="22"/>
-        </w:rPr>
-        <w:t xml:space="preserve"> </w:t>
+        <w:t xml:space="preserve">Tags </w:t>
       </w:r>
       <w:r>
         <w:rPr>
@@ -9984,8 +9944,9 @@
           <w:szCs w:val="22"/>
           <w:lang w:val="hu-HU"/>
         </w:rPr>
-        <w:t>": null,</w:t>
-      </w:r>
+        <w:t>": null, "</w:t>
+      </w:r>
+      <w:proofErr w:type="spellStart"/>
       <w:r>
         <w:rPr>
           <w:rFonts w:ascii="JetBrains Mono" w:hAnsi="JetBrains Mono" w:cs="JetBrains Mono"/>
@@ -9993,16 +9954,580 @@
           <w:szCs w:val="22"/>
           <w:lang w:val="hu-HU"/>
         </w:rPr>
+        <w:t>teacherId</w:t>
+      </w:r>
+      <w:proofErr w:type="spellEnd"/>
+      <w:r>
+        <w:rPr>
+          <w:rFonts w:ascii="JetBrains Mono" w:hAnsi="JetBrains Mono" w:cs="JetBrains Mono"/>
+          <w:sz w:val="22"/>
+          <w:szCs w:val="22"/>
+          <w:lang w:val="hu-HU"/>
+        </w:rPr>
+        <w:t>": "", "</w:t>
+      </w:r>
+      <w:proofErr w:type="spellStart"/>
+      <w:r>
+        <w:rPr>
+          <w:rFonts w:ascii="JetBrains Mono" w:hAnsi="JetBrains Mono" w:cs="JetBrains Mono"/>
+          <w:sz w:val="22"/>
+          <w:szCs w:val="22"/>
+          <w:lang w:val="hu-HU"/>
+        </w:rPr>
+        <w:t>courseName</w:t>
+      </w:r>
+      <w:proofErr w:type="spellEnd"/>
+      <w:r>
+        <w:rPr>
+          <w:rFonts w:ascii="JetBrains Mono" w:hAnsi="JetBrains Mono" w:cs="JetBrains Mono"/>
+          <w:sz w:val="22"/>
+          <w:szCs w:val="22"/>
+          <w:lang w:val="hu-HU"/>
+        </w:rPr>
+        <w:t>": "", "</w:t>
+      </w:r>
+      <w:proofErr w:type="spellStart"/>
+      <w:r>
+        <w:rPr>
+          <w:rFonts w:ascii="JetBrains Mono" w:hAnsi="JetBrains Mono" w:cs="JetBrains Mono"/>
+          <w:sz w:val="22"/>
+          <w:szCs w:val="22"/>
+          <w:lang w:val="hu-HU"/>
+        </w:rPr>
+        <w:t>description</w:t>
+      </w:r>
+      <w:proofErr w:type="spellEnd"/>
+      <w:r>
+        <w:rPr>
+          <w:rFonts w:ascii="JetBrains Mono" w:hAnsi="JetBrains Mono" w:cs="JetBrains Mono"/>
+          <w:sz w:val="22"/>
+          <w:szCs w:val="22"/>
+          <w:lang w:val="hu-HU"/>
+        </w:rPr>
+        <w:t>": "", "</w:t>
+      </w:r>
+      <w:proofErr w:type="spellStart"/>
+      <w:r>
+        <w:rPr>
+          <w:rFonts w:ascii="JetBrains Mono" w:hAnsi="JetBrains Mono" w:cs="JetBrains Mono"/>
+          <w:sz w:val="22"/>
+          <w:szCs w:val="22"/>
+          <w:lang w:val="hu-HU"/>
+        </w:rPr>
+        <w:t>type</w:t>
+      </w:r>
+      <w:proofErr w:type="spellEnd"/>
+      <w:r>
+        <w:rPr>
+          <w:rFonts w:ascii="JetBrains Mono" w:hAnsi="JetBrains Mono" w:cs="JetBrains Mono"/>
+          <w:sz w:val="22"/>
+          <w:szCs w:val="22"/>
+          <w:lang w:val="hu-HU"/>
+        </w:rPr>
+        <w:t>": 1, "</w:t>
+      </w:r>
+      <w:proofErr w:type="spellStart"/>
+      <w:r>
+        <w:rPr>
+          <w:rFonts w:ascii="JetBrains Mono" w:hAnsi="JetBrains Mono" w:cs="JetBrains Mono"/>
+          <w:sz w:val="22"/>
+          <w:szCs w:val="22"/>
+          <w:lang w:val="hu-HU"/>
+        </w:rPr>
+        <w:t>courseDomainId</w:t>
+      </w:r>
+      <w:proofErr w:type="spellEnd"/>
+      <w:r>
+        <w:rPr>
+          <w:rFonts w:ascii="JetBrains Mono" w:hAnsi="JetBrains Mono" w:cs="JetBrains Mono"/>
+          <w:sz w:val="22"/>
+          <w:szCs w:val="22"/>
+          <w:lang w:val="hu-HU"/>
+        </w:rPr>
+        <w:t>": "", "</w:t>
+      </w:r>
+      <w:proofErr w:type="spellStart"/>
+      <w:r>
+        <w:rPr>
+          <w:rFonts w:ascii="JetBrains Mono" w:hAnsi="JetBrains Mono" w:cs="JetBrains Mono"/>
+          <w:sz w:val="22"/>
+          <w:szCs w:val="22"/>
+          <w:lang w:val="hu-HU"/>
+        </w:rPr>
+        <w:t>courseLevelId</w:t>
+      </w:r>
+      <w:proofErr w:type="spellEnd"/>
+      <w:r>
+        <w:rPr>
+          <w:rFonts w:ascii="JetBrains Mono" w:hAnsi="JetBrains Mono" w:cs="JetBrains Mono"/>
+          <w:sz w:val="22"/>
+          <w:szCs w:val="22"/>
+          <w:lang w:val="hu-HU"/>
+        </w:rPr>
+        <w:t>": "", "</w:t>
+      </w:r>
+      <w:proofErr w:type="spellStart"/>
+      <w:r>
+        <w:rPr>
+          <w:rFonts w:ascii="JetBrains Mono" w:hAnsi="JetBrains Mono" w:cs="JetBrains Mono"/>
+          <w:sz w:val="22"/>
+          <w:szCs w:val="22"/>
+          <w:lang w:val="hu-HU"/>
+        </w:rPr>
+        <w:t>price</w:t>
+      </w:r>
+      <w:proofErr w:type="spellEnd"/>
+      <w:r>
+        <w:rPr>
+          <w:rFonts w:ascii="JetBrains Mono" w:hAnsi="JetBrains Mono" w:cs="JetBrains Mono"/>
+          <w:sz w:val="22"/>
+          <w:szCs w:val="22"/>
+          <w:lang w:val="hu-HU"/>
+        </w:rPr>
+        <w:t>": 1, "</w:t>
+      </w:r>
+      <w:proofErr w:type="spellStart"/>
+      <w:r>
+        <w:rPr>
+          <w:rFonts w:ascii="JetBrains Mono" w:hAnsi="JetBrains Mono" w:cs="JetBrains Mono"/>
+          <w:sz w:val="22"/>
+          <w:szCs w:val="22"/>
+          <w:lang w:val="hu-HU"/>
+        </w:rPr>
+        <w:t>firstConsultationFree</w:t>
+      </w:r>
+      <w:proofErr w:type="spellEnd"/>
+      <w:r>
+        <w:rPr>
+          <w:rFonts w:ascii="JetBrains Mono" w:hAnsi="JetBrains Mono" w:cs="JetBrains Mono"/>
+          <w:sz w:val="22"/>
+          <w:szCs w:val="22"/>
+          <w:lang w:val="hu-HU"/>
+        </w:rPr>
+        <w:t xml:space="preserve">": </w:t>
+      </w:r>
+      <w:proofErr w:type="spellStart"/>
+      <w:r>
+        <w:rPr>
+          <w:rFonts w:ascii="JetBrains Mono" w:hAnsi="JetBrains Mono" w:cs="JetBrains Mono"/>
+          <w:sz w:val="22"/>
+          <w:szCs w:val="22"/>
+          <w:lang w:val="hu-HU"/>
+        </w:rPr>
+        <w:t>true</w:t>
+      </w:r>
+      <w:proofErr w:type="spellEnd"/>
+      <w:r>
+        <w:rPr>
+          <w:rFonts w:ascii="JetBrains Mono" w:hAnsi="JetBrains Mono" w:cs="JetBrains Mono"/>
+          <w:sz w:val="22"/>
+          <w:szCs w:val="22"/>
+          <w:lang w:val="hu-HU"/>
+        </w:rPr>
+        <w:t>, "</w:t>
+      </w:r>
+      <w:proofErr w:type="spellStart"/>
+      <w:r>
+        <w:rPr>
+          <w:rFonts w:ascii="JetBrains Mono" w:hAnsi="JetBrains Mono" w:cs="JetBrains Mono"/>
+          <w:sz w:val="22"/>
+          <w:szCs w:val="22"/>
+          <w:lang w:val="hu-HU"/>
+        </w:rPr>
+        <w:t>priceCurrencyId</w:t>
+      </w:r>
+      <w:proofErr w:type="spellEnd"/>
+      <w:r>
+        <w:rPr>
+          <w:rFonts w:ascii="JetBrains Mono" w:hAnsi="JetBrains Mono" w:cs="JetBrains Mono"/>
+          <w:sz w:val="22"/>
+          <w:szCs w:val="22"/>
+          <w:lang w:val="hu-HU"/>
+        </w:rPr>
+        <w:t>": "", "status": 1, "</w:t>
+      </w:r>
+      <w:proofErr w:type="spellStart"/>
+      <w:r>
+        <w:rPr>
+          <w:rFonts w:ascii="JetBrains Mono" w:hAnsi="JetBrains Mono" w:cs="JetBrains Mono"/>
+          <w:sz w:val="22"/>
+          <w:szCs w:val="22"/>
+          <w:lang w:val="hu-HU"/>
+        </w:rPr>
+        <w:t>iconImageId</w:t>
+      </w:r>
+      <w:proofErr w:type="spellEnd"/>
+      <w:r>
+        <w:rPr>
+          <w:rFonts w:ascii="JetBrains Mono" w:hAnsi="JetBrains Mono" w:cs="JetBrains Mono"/>
+          <w:sz w:val="22"/>
+          <w:szCs w:val="22"/>
+          <w:lang w:val="hu-HU"/>
+        </w:rPr>
+        <w:t>": null, "</w:t>
+      </w:r>
+      <w:proofErr w:type="spellStart"/>
+      <w:r>
+        <w:rPr>
+          <w:rFonts w:ascii="JetBrains Mono" w:hAnsi="JetBrains Mono" w:cs="JetBrains Mono"/>
+          <w:sz w:val="22"/>
+          <w:szCs w:val="22"/>
+          <w:lang w:val="hu-HU"/>
+        </w:rPr>
+        <w:t>bannerImageId</w:t>
+      </w:r>
+      <w:proofErr w:type="spellEnd"/>
+      <w:r>
+        <w:rPr>
+          <w:rFonts w:ascii="JetBrains Mono" w:hAnsi="JetBrains Mono" w:cs="JetBrains Mono"/>
+          <w:sz w:val="22"/>
+          <w:szCs w:val="22"/>
+          <w:lang w:val="hu-HU"/>
+        </w:rPr>
+        <w:t>": null, "</w:t>
+      </w:r>
+      <w:proofErr w:type="spellStart"/>
+      <w:r>
+        <w:rPr>
+          <w:rFonts w:ascii="JetBrains Mono" w:hAnsi="JetBrains Mono" w:cs="JetBrains Mono"/>
+          <w:sz w:val="22"/>
+          <w:szCs w:val="22"/>
+          <w:lang w:val="hu-HU"/>
+        </w:rPr>
+        <w:t>tags</w:t>
+      </w:r>
+      <w:proofErr w:type="spellEnd"/>
+      <w:r>
+        <w:rPr>
+          <w:rFonts w:ascii="JetBrains Mono" w:hAnsi="JetBrains Mono" w:cs="JetBrains Mono"/>
+          <w:sz w:val="22"/>
+          <w:szCs w:val="22"/>
+          <w:lang w:val="hu-HU"/>
+        </w:rPr>
+        <w:t>": [""], "</w:t>
+      </w:r>
+      <w:proofErr w:type="spellStart"/>
+      <w:r>
+        <w:rPr>
+          <w:rFonts w:ascii="JetBrains Mono" w:hAnsi="JetBrains Mono" w:cs="JetBrains Mono"/>
+          <w:sz w:val="22"/>
+          <w:szCs w:val="22"/>
+          <w:lang w:val="hu-HU"/>
+        </w:rPr>
+        <w:t>language</w:t>
+      </w:r>
+      <w:r>
+        <w:rPr>
+          <w:rFonts w:ascii="JetBrains Mono" w:hAnsi="JetBrains Mono" w:cs="JetBrains Mono"/>
+          <w:sz w:val="22"/>
+          <w:szCs w:val="22"/>
+          <w:lang w:val="hu-HU"/>
+        </w:rPr>
+        <w:t>s</w:t>
+      </w:r>
+      <w:proofErr w:type="spellEnd"/>
+      <w:r>
+        <w:rPr>
+          <w:rFonts w:ascii="JetBrains Mono" w:hAnsi="JetBrains Mono" w:cs="JetBrains Mono"/>
+          <w:sz w:val="22"/>
+          <w:szCs w:val="22"/>
+          <w:lang w:val="hu-HU"/>
+        </w:rPr>
+        <w:t>": [""]}</w:t>
+      </w:r>
+    </w:p>
+    <w:p>
+      <w:pPr>
+        <w:pStyle w:val="Listaszerbekezds"/>
+        <w:numPr>
+          <w:ilvl w:val="0"/>
+          <w:numId w:val="10"/>
+        </w:numPr>
+        <w:spacing w:before="480" w:after="240"/>
+        <w:rPr>
+          <w:rFonts w:ascii="Lexend" w:hAnsi="Lexend"/>
+          <w:sz w:val="22"/>
+          <w:szCs w:val="22"/>
+        </w:rPr>
+      </w:pPr>
+      <w:r>
+        <w:rPr>
+          <w:rFonts w:ascii="Lexend" w:hAnsi="Lexend"/>
+          <w:b/>
+          <w:bCs/>
+          <w:sz w:val="28"/>
+          <w:szCs w:val="28"/>
+        </w:rPr>
+        <w:t>Shared</w:t>
+      </w:r>
+      <w:r>
+        <w:rPr>
+          <w:rFonts w:ascii="Lexend" w:hAnsi="Lexend"/>
+          <w:b/>
+          <w:bCs/>
+          <w:sz w:val="28"/>
+          <w:szCs w:val="28"/>
+        </w:rPr>
+        <w:t xml:space="preserve"> -&gt; </w:t>
+      </w:r>
+      <w:r>
+        <w:rPr>
+          <w:rFonts w:ascii="Lexend" w:hAnsi="Lexend"/>
+          <w:b/>
+          <w:bCs/>
+          <w:sz w:val="28"/>
+          <w:szCs w:val="28"/>
+        </w:rPr>
+        <w:t>Profile</w:t>
+      </w:r>
+      <w:r>
+        <w:rPr>
+          <w:rFonts w:ascii="Lexend" w:hAnsi="Lexend"/>
+          <w:b/>
+          <w:bCs/>
+          <w:sz w:val="28"/>
+          <w:szCs w:val="28"/>
+        </w:rPr>
+        <w:t>:</w:t>
+      </w:r>
+    </w:p>
+    <w:p>
+      <w:pPr>
+        <w:pStyle w:val="Listaszerbekezds"/>
+        <w:numPr>
+          <w:ilvl w:val="1"/>
+          <w:numId w:val="10"/>
+        </w:numPr>
+        <w:spacing w:before="480" w:after="240"/>
+        <w:rPr>
+          <w:rFonts w:ascii="Lexend" w:hAnsi="Lexend"/>
+          <w:sz w:val="22"/>
+          <w:szCs w:val="22"/>
+        </w:rPr>
+      </w:pPr>
+      <w:r>
+        <w:rPr>
+          <w:rFonts w:ascii="Lexend" w:hAnsi="Lexend"/>
+          <w:b/>
+          <w:bCs/>
+          <w:sz w:val="22"/>
+          <w:szCs w:val="22"/>
+        </w:rPr>
+        <w:t>Data needed:</w:t>
+      </w:r>
+      <w:r>
+        <w:rPr>
+          <w:rFonts w:ascii="Lexend" w:hAnsi="Lexend"/>
+          <w:b/>
+          <w:bCs/>
+          <w:sz w:val="22"/>
+          <w:szCs w:val="22"/>
+        </w:rPr>
         <w:t xml:space="preserve"> </w:t>
       </w:r>
       <w:r>
         <w:rPr>
+          <w:rFonts w:ascii="Lexend" w:hAnsi="Lexend"/>
+          <w:sz w:val="22"/>
+          <w:szCs w:val="22"/>
+        </w:rPr>
+        <w:t>user ID</w:t>
+      </w:r>
+    </w:p>
+    <w:p>
+      <w:pPr>
+        <w:pStyle w:val="Listaszerbekezds"/>
+        <w:numPr>
+          <w:ilvl w:val="1"/>
+          <w:numId w:val="10"/>
+        </w:numPr>
+        <w:spacing w:before="480" w:after="240"/>
+        <w:rPr>
+          <w:rFonts w:ascii="Lexend" w:hAnsi="Lexend"/>
+          <w:sz w:val="22"/>
+          <w:szCs w:val="22"/>
+        </w:rPr>
+      </w:pPr>
+      <w:r>
+        <w:rPr>
+          <w:rFonts w:ascii="Lexend" w:hAnsi="Lexend"/>
+          <w:b/>
+          <w:bCs/>
+          <w:sz w:val="22"/>
+          <w:szCs w:val="22"/>
+        </w:rPr>
+        <w:t>Parts:</w:t>
+      </w:r>
+    </w:p>
+    <w:p>
+      <w:pPr>
+        <w:pStyle w:val="Listaszerbekezds"/>
+        <w:numPr>
+          <w:ilvl w:val="2"/>
+          <w:numId w:val="10"/>
+        </w:numPr>
+        <w:spacing w:before="480" w:after="240"/>
+        <w:rPr>
+          <w:rFonts w:ascii="Lexend" w:hAnsi="Lexend"/>
+          <w:sz w:val="22"/>
+          <w:szCs w:val="22"/>
+        </w:rPr>
+      </w:pPr>
+      <w:r>
+        <w:rPr>
+          <w:rFonts w:ascii="Lexend" w:hAnsi="Lexend"/>
+          <w:b/>
+          <w:bCs/>
+          <w:sz w:val="22"/>
+          <w:szCs w:val="22"/>
+        </w:rPr>
+        <w:t>Student:</w:t>
+      </w:r>
+      <w:r>
+        <w:rPr>
+          <w:rFonts w:ascii="Lexend" w:hAnsi="Lexend"/>
+          <w:sz w:val="22"/>
+          <w:szCs w:val="22"/>
+        </w:rPr>
+        <w:t xml:space="preserve"> basic info, age, name, nickname, introduction, profile picture</w:t>
+      </w:r>
+    </w:p>
+    <w:p>
+      <w:pPr>
+        <w:pStyle w:val="Listaszerbekezds"/>
+        <w:numPr>
+          <w:ilvl w:val="2"/>
+          <w:numId w:val="10"/>
+        </w:numPr>
+        <w:spacing w:before="480" w:after="240"/>
+        <w:rPr>
+          <w:rFonts w:ascii="Lexend" w:hAnsi="Lexend"/>
+          <w:sz w:val="22"/>
+          <w:szCs w:val="22"/>
+        </w:rPr>
+      </w:pPr>
+      <w:r>
+        <w:rPr>
+          <w:rFonts w:ascii="Lexend" w:hAnsi="Lexend"/>
+          <w:b/>
+          <w:bCs/>
+          <w:sz w:val="22"/>
+          <w:szCs w:val="22"/>
+        </w:rPr>
+        <w:t>Teacher:</w:t>
+      </w:r>
+      <w:r>
+        <w:rPr>
+          <w:rFonts w:ascii="Lexend" w:hAnsi="Lexend"/>
+          <w:sz w:val="22"/>
+          <w:szCs w:val="22"/>
+        </w:rPr>
+        <w:t xml:space="preserve"> </w:t>
+      </w:r>
+      <w:r>
+        <w:rPr>
+          <w:rFonts w:ascii="Lexend" w:hAnsi="Lexend"/>
+          <w:sz w:val="22"/>
+          <w:szCs w:val="22"/>
+        </w:rPr>
+        <w:t>age, name, introduction</w:t>
+      </w:r>
+      <w:r>
+        <w:rPr>
+          <w:rFonts w:ascii="Lexend" w:hAnsi="Lexend"/>
+          <w:sz w:val="22"/>
+          <w:szCs w:val="22"/>
+        </w:rPr>
+        <w:t>, teaching locations, qualifications, courses, average rating, total students</w:t>
+      </w:r>
+    </w:p>
+    <w:p>
+      <w:pPr>
+        <w:pStyle w:val="Listaszerbekezds"/>
+        <w:numPr>
+          <w:ilvl w:val="1"/>
+          <w:numId w:val="10"/>
+        </w:numPr>
+        <w:spacing w:before="480" w:after="240"/>
+        <w:rPr>
+          <w:rFonts w:ascii="Lexend" w:hAnsi="Lexend"/>
+          <w:sz w:val="22"/>
+          <w:szCs w:val="22"/>
+        </w:rPr>
+      </w:pPr>
+      <w:r>
+        <w:rPr>
+          <w:rFonts w:ascii="Lexend" w:hAnsi="Lexend"/>
+          <w:sz w:val="22"/>
+          <w:szCs w:val="22"/>
+        </w:rPr>
+        <w:t xml:space="preserve">Endpoint: </w:t>
+      </w:r>
+      <w:r>
+        <w:rPr>
+          <w:rFonts w:ascii="JetBrains Mono" w:hAnsi="JetBrains Mono" w:cs="JetBrains Mono"/>
+          <w:sz w:val="22"/>
+          <w:szCs w:val="22"/>
+        </w:rPr>
+        <w:t xml:space="preserve">GET </w:t>
+      </w:r>
+      <w:proofErr w:type="spellStart"/>
+      <w:r>
+        <w:rPr>
+          <w:rFonts w:ascii="JetBrains Mono" w:hAnsi="JetBrains Mono" w:cs="JetBrains Mono"/>
+          <w:sz w:val="22"/>
+          <w:szCs w:val="22"/>
+        </w:rPr>
+        <w:t>api</w:t>
+      </w:r>
+      <w:proofErr w:type="spellEnd"/>
+      <w:r>
+        <w:rPr>
+          <w:rFonts w:ascii="JetBrains Mono" w:hAnsi="JetBrains Mono" w:cs="JetBrains Mono"/>
+          <w:sz w:val="22"/>
+          <w:szCs w:val="22"/>
+        </w:rPr>
+        <w:t>/</w:t>
+      </w:r>
+      <w:r>
+        <w:rPr>
+          <w:rFonts w:ascii="JetBrains Mono" w:hAnsi="JetBrains Mono" w:cs="JetBrains Mono"/>
+          <w:sz w:val="22"/>
+          <w:szCs w:val="22"/>
+        </w:rPr>
+        <w:t>identity/profile/{Id}</w:t>
+      </w:r>
+    </w:p>
+    <w:p>
+      <w:pPr>
+        <w:pStyle w:val="Listaszerbekezds"/>
+        <w:numPr>
+          <w:ilvl w:val="1"/>
+          <w:numId w:val="10"/>
+        </w:numPr>
+        <w:rPr>
           <w:rFonts w:ascii="JetBrains Mono" w:hAnsi="JetBrains Mono" w:cs="JetBrains Mono"/>
           <w:sz w:val="22"/>
           <w:szCs w:val="22"/>
           <w:lang w:val="hu-HU"/>
         </w:rPr>
-        <w:t>"</w:t>
+      </w:pPr>
+      <w:r>
+        <w:rPr>
+          <w:rFonts w:ascii="JetBrains Mono" w:hAnsi="JetBrains Mono" w:cs="JetBrains Mono"/>
+          <w:sz w:val="22"/>
+          <w:szCs w:val="22"/>
+        </w:rPr>
+        <w:t xml:space="preserve">Teacher courses: </w:t>
+      </w:r>
+      <w:r>
+        <w:rPr>
+          <w:rFonts w:ascii="JetBrains Mono" w:hAnsi="JetBrains Mono" w:cs="JetBrains Mono"/>
+          <w:sz w:val="22"/>
+          <w:szCs w:val="22"/>
+          <w:lang w:val="hu-HU"/>
+        </w:rPr>
+        <w:t>/</w:t>
       </w:r>
       <w:proofErr w:type="spellStart"/>
       <w:r>
@@ -10012,6 +10537,110 @@
           <w:szCs w:val="22"/>
           <w:lang w:val="hu-HU"/>
         </w:rPr>
+        <w:t>api</w:t>
+      </w:r>
+      <w:proofErr w:type="spellEnd"/>
+      <w:r>
+        <w:rPr>
+          <w:rFonts w:ascii="JetBrains Mono" w:hAnsi="JetBrains Mono" w:cs="JetBrains Mono"/>
+          <w:sz w:val="22"/>
+          <w:szCs w:val="22"/>
+          <w:lang w:val="hu-HU"/>
+        </w:rPr>
+        <w:t>/</w:t>
+      </w:r>
+      <w:proofErr w:type="spellStart"/>
+      <w:r>
+        <w:rPr>
+          <w:rFonts w:ascii="JetBrains Mono" w:hAnsi="JetBrains Mono" w:cs="JetBrains Mono"/>
+          <w:sz w:val="22"/>
+          <w:szCs w:val="22"/>
+          <w:lang w:val="hu-HU"/>
+        </w:rPr>
+        <w:t>courses</w:t>
+      </w:r>
+      <w:proofErr w:type="spellEnd"/>
+    </w:p>
+    <w:p>
+      <w:pPr>
+        <w:pStyle w:val="Listaszerbekezds"/>
+        <w:numPr>
+          <w:ilvl w:val="2"/>
+          <w:numId w:val="10"/>
+        </w:numPr>
+        <w:rPr>
+          <w:rFonts w:ascii="Lexend" w:hAnsi="Lexend"/>
+          <w:sz w:val="22"/>
+          <w:szCs w:val="22"/>
+        </w:rPr>
+      </w:pPr>
+      <w:r>
+        <w:rPr>
+          <w:rFonts w:ascii="Lexend" w:hAnsi="Lexend"/>
+          <w:sz w:val="22"/>
+          <w:szCs w:val="22"/>
+        </w:rPr>
+        <w:t>Query:</w:t>
+      </w:r>
+      <w:r>
+        <w:rPr>
+          <w:rFonts w:ascii="Lexend" w:hAnsi="Lexend"/>
+          <w:sz w:val="22"/>
+          <w:szCs w:val="22"/>
+        </w:rPr>
+        <w:t xml:space="preserve"> </w:t>
+      </w:r>
+      <w:r>
+        <w:rPr>
+          <w:rFonts w:ascii="JetBrains Mono" w:hAnsi="JetBrains Mono" w:cs="JetBrains Mono"/>
+          <w:sz w:val="22"/>
+          <w:szCs w:val="22"/>
+        </w:rPr>
+        <w:t>{ "</w:t>
+      </w:r>
+      <w:proofErr w:type="spellStart"/>
+      <w:r>
+        <w:rPr>
+          <w:rFonts w:ascii="JetBrains Mono" w:hAnsi="JetBrains Mono" w:cs="JetBrains Mono"/>
+          <w:sz w:val="22"/>
+          <w:szCs w:val="22"/>
+        </w:rPr>
+        <w:t>coursesPerPage</w:t>
+      </w:r>
+      <w:proofErr w:type="spellEnd"/>
+      <w:r>
+        <w:rPr>
+          <w:rFonts w:ascii="JetBrains Mono" w:hAnsi="JetBrains Mono" w:cs="JetBrains Mono"/>
+          <w:sz w:val="22"/>
+          <w:szCs w:val="22"/>
+        </w:rPr>
+        <w:t>": 12, "</w:t>
+      </w:r>
+      <w:proofErr w:type="spellStart"/>
+      <w:r>
+        <w:rPr>
+          <w:rFonts w:ascii="JetBrains Mono" w:hAnsi="JetBrains Mono" w:cs="JetBrains Mono"/>
+          <w:sz w:val="22"/>
+          <w:szCs w:val="22"/>
+        </w:rPr>
+        <w:t>pageNum</w:t>
+      </w:r>
+      <w:proofErr w:type="spellEnd"/>
+      <w:r>
+        <w:rPr>
+          <w:rFonts w:ascii="JetBrains Mono" w:hAnsi="JetBrains Mono" w:cs="JetBrains Mono"/>
+          <w:sz w:val="22"/>
+          <w:szCs w:val="22"/>
+        </w:rPr>
+        <w:t>": 1, "</w:t>
+      </w:r>
+      <w:proofErr w:type="spellStart"/>
+      <w:r>
+        <w:rPr>
+          <w:rFonts w:ascii="JetBrains Mono" w:hAnsi="JetBrains Mono" w:cs="JetBrains Mono"/>
+          <w:sz w:val="22"/>
+          <w:szCs w:val="22"/>
+        </w:rPr>
         <w:t>teacherId</w:t>
       </w:r>
       <w:proofErr w:type="spellEnd"/>
@@ -10020,504 +10649,20 @@
           <w:rFonts w:ascii="JetBrains Mono" w:hAnsi="JetBrains Mono" w:cs="JetBrains Mono"/>
           <w:sz w:val="22"/>
           <w:szCs w:val="22"/>
+        </w:rPr>
+        <w:t>": null }</w:t>
+      </w:r>
+    </w:p>
+    <w:p>
+      <w:pPr>
+        <w:spacing w:before="480" w:after="240"/>
+        <w:rPr>
+          <w:rFonts w:ascii="JetBrains Mono" w:hAnsi="JetBrains Mono" w:cs="JetBrains Mono"/>
+          <w:sz w:val="22"/>
+          <w:szCs w:val="22"/>
           <w:lang w:val="hu-HU"/>
         </w:rPr>
-        <w:t>": "",</w:t>
-      </w:r>
-      <w:r>
-        <w:rPr>
-          <w:rFonts w:ascii="JetBrains Mono" w:hAnsi="JetBrains Mono" w:cs="JetBrains Mono"/>
-          <w:sz w:val="22"/>
-          <w:szCs w:val="22"/>
-          <w:lang w:val="hu-HU"/>
-        </w:rPr>
-        <w:t xml:space="preserve"> </w:t>
-      </w:r>
-      <w:r>
-        <w:rPr>
-          <w:rFonts w:ascii="JetBrains Mono" w:hAnsi="JetBrains Mono" w:cs="JetBrains Mono"/>
-          <w:sz w:val="22"/>
-          <w:szCs w:val="22"/>
-          <w:lang w:val="hu-HU"/>
-        </w:rPr>
-        <w:t>"</w:t>
-      </w:r>
-      <w:proofErr w:type="spellStart"/>
-      <w:r>
-        <w:rPr>
-          <w:rFonts w:ascii="JetBrains Mono" w:hAnsi="JetBrains Mono" w:cs="JetBrains Mono"/>
-          <w:sz w:val="22"/>
-          <w:szCs w:val="22"/>
-          <w:lang w:val="hu-HU"/>
-        </w:rPr>
-        <w:t>courseName</w:t>
-      </w:r>
-      <w:proofErr w:type="spellEnd"/>
-      <w:r>
-        <w:rPr>
-          <w:rFonts w:ascii="JetBrains Mono" w:hAnsi="JetBrains Mono" w:cs="JetBrains Mono"/>
-          <w:sz w:val="22"/>
-          <w:szCs w:val="22"/>
-          <w:lang w:val="hu-HU"/>
-        </w:rPr>
-        <w:t>": "",</w:t>
-      </w:r>
-      <w:r>
-        <w:rPr>
-          <w:rFonts w:ascii="JetBrains Mono" w:hAnsi="JetBrains Mono" w:cs="JetBrains Mono"/>
-          <w:sz w:val="22"/>
-          <w:szCs w:val="22"/>
-          <w:lang w:val="hu-HU"/>
-        </w:rPr>
-        <w:t xml:space="preserve"> </w:t>
-      </w:r>
-      <w:r>
-        <w:rPr>
-          <w:rFonts w:ascii="JetBrains Mono" w:hAnsi="JetBrains Mono" w:cs="JetBrains Mono"/>
-          <w:sz w:val="22"/>
-          <w:szCs w:val="22"/>
-          <w:lang w:val="hu-HU"/>
-        </w:rPr>
-        <w:t>"</w:t>
-      </w:r>
-      <w:proofErr w:type="spellStart"/>
-      <w:r>
-        <w:rPr>
-          <w:rFonts w:ascii="JetBrains Mono" w:hAnsi="JetBrains Mono" w:cs="JetBrains Mono"/>
-          <w:sz w:val="22"/>
-          <w:szCs w:val="22"/>
-          <w:lang w:val="hu-HU"/>
-        </w:rPr>
-        <w:t>description</w:t>
-      </w:r>
-      <w:proofErr w:type="spellEnd"/>
-      <w:r>
-        <w:rPr>
-          <w:rFonts w:ascii="JetBrains Mono" w:hAnsi="JetBrains Mono" w:cs="JetBrains Mono"/>
-          <w:sz w:val="22"/>
-          <w:szCs w:val="22"/>
-          <w:lang w:val="hu-HU"/>
-        </w:rPr>
-        <w:t>": "",</w:t>
-      </w:r>
-      <w:r>
-        <w:rPr>
-          <w:rFonts w:ascii="JetBrains Mono" w:hAnsi="JetBrains Mono" w:cs="JetBrains Mono"/>
-          <w:sz w:val="22"/>
-          <w:szCs w:val="22"/>
-          <w:lang w:val="hu-HU"/>
-        </w:rPr>
-        <w:t xml:space="preserve"> </w:t>
-      </w:r>
-      <w:r>
-        <w:rPr>
-          <w:rFonts w:ascii="JetBrains Mono" w:hAnsi="JetBrains Mono" w:cs="JetBrains Mono"/>
-          <w:sz w:val="22"/>
-          <w:szCs w:val="22"/>
-          <w:lang w:val="hu-HU"/>
-        </w:rPr>
-        <w:t>"</w:t>
-      </w:r>
-      <w:proofErr w:type="spellStart"/>
-      <w:r>
-        <w:rPr>
-          <w:rFonts w:ascii="JetBrains Mono" w:hAnsi="JetBrains Mono" w:cs="JetBrains Mono"/>
-          <w:sz w:val="22"/>
-          <w:szCs w:val="22"/>
-          <w:lang w:val="hu-HU"/>
-        </w:rPr>
-        <w:t>type</w:t>
-      </w:r>
-      <w:proofErr w:type="spellEnd"/>
-      <w:r>
-        <w:rPr>
-          <w:rFonts w:ascii="JetBrains Mono" w:hAnsi="JetBrains Mono" w:cs="JetBrains Mono"/>
-          <w:sz w:val="22"/>
-          <w:szCs w:val="22"/>
-          <w:lang w:val="hu-HU"/>
-        </w:rPr>
-        <w:t>": 1,</w:t>
-      </w:r>
-      <w:r>
-        <w:rPr>
-          <w:rFonts w:ascii="JetBrains Mono" w:hAnsi="JetBrains Mono" w:cs="JetBrains Mono"/>
-          <w:sz w:val="22"/>
-          <w:szCs w:val="22"/>
-          <w:lang w:val="hu-HU"/>
-        </w:rPr>
-        <w:t xml:space="preserve"> </w:t>
-      </w:r>
-      <w:r>
-        <w:rPr>
-          <w:rFonts w:ascii="JetBrains Mono" w:hAnsi="JetBrains Mono" w:cs="JetBrains Mono"/>
-          <w:sz w:val="22"/>
-          <w:szCs w:val="22"/>
-          <w:lang w:val="hu-HU"/>
-        </w:rPr>
-        <w:t>"</w:t>
-      </w:r>
-      <w:proofErr w:type="spellStart"/>
-      <w:r>
-        <w:rPr>
-          <w:rFonts w:ascii="JetBrains Mono" w:hAnsi="JetBrains Mono" w:cs="JetBrains Mono"/>
-          <w:sz w:val="22"/>
-          <w:szCs w:val="22"/>
-          <w:lang w:val="hu-HU"/>
-        </w:rPr>
-        <w:t>courseDomainId</w:t>
-      </w:r>
-      <w:proofErr w:type="spellEnd"/>
-      <w:r>
-        <w:rPr>
-          <w:rFonts w:ascii="JetBrains Mono" w:hAnsi="JetBrains Mono" w:cs="JetBrains Mono"/>
-          <w:sz w:val="22"/>
-          <w:szCs w:val="22"/>
-          <w:lang w:val="hu-HU"/>
-        </w:rPr>
-        <w:t>": "",</w:t>
-      </w:r>
-      <w:r>
-        <w:rPr>
-          <w:rFonts w:ascii="JetBrains Mono" w:hAnsi="JetBrains Mono" w:cs="JetBrains Mono"/>
-          <w:sz w:val="22"/>
-          <w:szCs w:val="22"/>
-          <w:lang w:val="hu-HU"/>
-        </w:rPr>
-        <w:t xml:space="preserve"> </w:t>
-      </w:r>
-      <w:r>
-        <w:rPr>
-          <w:rFonts w:ascii="JetBrains Mono" w:hAnsi="JetBrains Mono" w:cs="JetBrains Mono"/>
-          <w:sz w:val="22"/>
-          <w:szCs w:val="22"/>
-          <w:lang w:val="hu-HU"/>
-        </w:rPr>
-        <w:t>"</w:t>
-      </w:r>
-      <w:proofErr w:type="spellStart"/>
-      <w:r>
-        <w:rPr>
-          <w:rFonts w:ascii="JetBrains Mono" w:hAnsi="JetBrains Mono" w:cs="JetBrains Mono"/>
-          <w:sz w:val="22"/>
-          <w:szCs w:val="22"/>
-          <w:lang w:val="hu-HU"/>
-        </w:rPr>
-        <w:t>courseLevelId</w:t>
-      </w:r>
-      <w:proofErr w:type="spellEnd"/>
-      <w:r>
-        <w:rPr>
-          <w:rFonts w:ascii="JetBrains Mono" w:hAnsi="JetBrains Mono" w:cs="JetBrains Mono"/>
-          <w:sz w:val="22"/>
-          <w:szCs w:val="22"/>
-          <w:lang w:val="hu-HU"/>
-        </w:rPr>
-        <w:t>": "",</w:t>
-      </w:r>
-      <w:r>
-        <w:rPr>
-          <w:rFonts w:ascii="JetBrains Mono" w:hAnsi="JetBrains Mono" w:cs="JetBrains Mono"/>
-          <w:sz w:val="22"/>
-          <w:szCs w:val="22"/>
-          <w:lang w:val="hu-HU"/>
-        </w:rPr>
-        <w:t xml:space="preserve"> </w:t>
-      </w:r>
-      <w:r>
-        <w:rPr>
-          <w:rFonts w:ascii="JetBrains Mono" w:hAnsi="JetBrains Mono" w:cs="JetBrains Mono"/>
-          <w:sz w:val="22"/>
-          <w:szCs w:val="22"/>
-          <w:lang w:val="hu-HU"/>
-        </w:rPr>
-        <w:t>"</w:t>
-      </w:r>
-      <w:proofErr w:type="spellStart"/>
-      <w:r>
-        <w:rPr>
-          <w:rFonts w:ascii="JetBrains Mono" w:hAnsi="JetBrains Mono" w:cs="JetBrains Mono"/>
-          <w:sz w:val="22"/>
-          <w:szCs w:val="22"/>
-          <w:lang w:val="hu-HU"/>
-        </w:rPr>
-        <w:t>price</w:t>
-      </w:r>
-      <w:proofErr w:type="spellEnd"/>
-      <w:r>
-        <w:rPr>
-          <w:rFonts w:ascii="JetBrains Mono" w:hAnsi="JetBrains Mono" w:cs="JetBrains Mono"/>
-          <w:sz w:val="22"/>
-          <w:szCs w:val="22"/>
-          <w:lang w:val="hu-HU"/>
-        </w:rPr>
-        <w:t>": 1,</w:t>
-      </w:r>
-      <w:r>
-        <w:rPr>
-          <w:rFonts w:ascii="JetBrains Mono" w:hAnsi="JetBrains Mono" w:cs="JetBrains Mono"/>
-          <w:sz w:val="22"/>
-          <w:szCs w:val="22"/>
-          <w:lang w:val="hu-HU"/>
-        </w:rPr>
-        <w:t xml:space="preserve"> </w:t>
-      </w:r>
-      <w:r>
-        <w:rPr>
-          <w:rFonts w:ascii="JetBrains Mono" w:hAnsi="JetBrains Mono" w:cs="JetBrains Mono"/>
-          <w:sz w:val="22"/>
-          <w:szCs w:val="22"/>
-          <w:lang w:val="hu-HU"/>
-        </w:rPr>
-        <w:t>"</w:t>
-      </w:r>
-      <w:proofErr w:type="spellStart"/>
-      <w:r>
-        <w:rPr>
-          <w:rFonts w:ascii="JetBrains Mono" w:hAnsi="JetBrains Mono" w:cs="JetBrains Mono"/>
-          <w:sz w:val="22"/>
-          <w:szCs w:val="22"/>
-          <w:lang w:val="hu-HU"/>
-        </w:rPr>
-        <w:t>firstConsultationFree</w:t>
-      </w:r>
-      <w:proofErr w:type="spellEnd"/>
-      <w:r>
-        <w:rPr>
-          <w:rFonts w:ascii="JetBrains Mono" w:hAnsi="JetBrains Mono" w:cs="JetBrains Mono"/>
-          <w:sz w:val="22"/>
-          <w:szCs w:val="22"/>
-          <w:lang w:val="hu-HU"/>
-        </w:rPr>
-        <w:t xml:space="preserve">": </w:t>
-      </w:r>
-      <w:proofErr w:type="spellStart"/>
-      <w:r>
-        <w:rPr>
-          <w:rFonts w:ascii="JetBrains Mono" w:hAnsi="JetBrains Mono" w:cs="JetBrains Mono"/>
-          <w:sz w:val="22"/>
-          <w:szCs w:val="22"/>
-          <w:lang w:val="hu-HU"/>
-        </w:rPr>
-        <w:t>true</w:t>
-      </w:r>
-      <w:proofErr w:type="spellEnd"/>
-      <w:r>
-        <w:rPr>
-          <w:rFonts w:ascii="JetBrains Mono" w:hAnsi="JetBrains Mono" w:cs="JetBrains Mono"/>
-          <w:sz w:val="22"/>
-          <w:szCs w:val="22"/>
-          <w:lang w:val="hu-HU"/>
-        </w:rPr>
-        <w:t>,</w:t>
-      </w:r>
-      <w:r>
-        <w:rPr>
-          <w:rFonts w:ascii="JetBrains Mono" w:hAnsi="JetBrains Mono" w:cs="JetBrains Mono"/>
-          <w:sz w:val="22"/>
-          <w:szCs w:val="22"/>
-          <w:lang w:val="hu-HU"/>
-        </w:rPr>
-        <w:t xml:space="preserve"> </w:t>
-      </w:r>
-      <w:r>
-        <w:rPr>
-          <w:rFonts w:ascii="JetBrains Mono" w:hAnsi="JetBrains Mono" w:cs="JetBrains Mono"/>
-          <w:sz w:val="22"/>
-          <w:szCs w:val="22"/>
-          <w:lang w:val="hu-HU"/>
-        </w:rPr>
-        <w:t>"</w:t>
-      </w:r>
-      <w:proofErr w:type="spellStart"/>
-      <w:r>
-        <w:rPr>
-          <w:rFonts w:ascii="JetBrains Mono" w:hAnsi="JetBrains Mono" w:cs="JetBrains Mono"/>
-          <w:sz w:val="22"/>
-          <w:szCs w:val="22"/>
-          <w:lang w:val="hu-HU"/>
-        </w:rPr>
-        <w:t>priceCurrencyId</w:t>
-      </w:r>
-      <w:proofErr w:type="spellEnd"/>
-      <w:r>
-        <w:rPr>
-          <w:rFonts w:ascii="JetBrains Mono" w:hAnsi="JetBrains Mono" w:cs="JetBrains Mono"/>
-          <w:sz w:val="22"/>
-          <w:szCs w:val="22"/>
-          <w:lang w:val="hu-HU"/>
-        </w:rPr>
-        <w:t>": "",</w:t>
-      </w:r>
-      <w:r>
-        <w:rPr>
-          <w:rFonts w:ascii="JetBrains Mono" w:hAnsi="JetBrains Mono" w:cs="JetBrains Mono"/>
-          <w:sz w:val="22"/>
-          <w:szCs w:val="22"/>
-          <w:lang w:val="hu-HU"/>
-        </w:rPr>
-        <w:t xml:space="preserve"> </w:t>
-      </w:r>
-      <w:r>
-        <w:rPr>
-          <w:rFonts w:ascii="JetBrains Mono" w:hAnsi="JetBrains Mono" w:cs="JetBrains Mono"/>
-          <w:sz w:val="22"/>
-          <w:szCs w:val="22"/>
-          <w:lang w:val="hu-HU"/>
-        </w:rPr>
-        <w:t>"status": 1,</w:t>
-      </w:r>
-      <w:r>
-        <w:rPr>
-          <w:rFonts w:ascii="JetBrains Mono" w:hAnsi="JetBrains Mono" w:cs="JetBrains Mono"/>
-          <w:sz w:val="22"/>
-          <w:szCs w:val="22"/>
-          <w:lang w:val="hu-HU"/>
-        </w:rPr>
-        <w:t xml:space="preserve"> </w:t>
-      </w:r>
-      <w:r>
-        <w:rPr>
-          <w:rFonts w:ascii="JetBrains Mono" w:hAnsi="JetBrains Mono" w:cs="JetBrains Mono"/>
-          <w:sz w:val="22"/>
-          <w:szCs w:val="22"/>
-          <w:lang w:val="hu-HU"/>
-        </w:rPr>
-        <w:t>"</w:t>
-      </w:r>
-      <w:proofErr w:type="spellStart"/>
-      <w:r>
-        <w:rPr>
-          <w:rFonts w:ascii="JetBrains Mono" w:hAnsi="JetBrains Mono" w:cs="JetBrains Mono"/>
-          <w:sz w:val="22"/>
-          <w:szCs w:val="22"/>
-          <w:lang w:val="hu-HU"/>
-        </w:rPr>
-        <w:t>iconImageId</w:t>
-      </w:r>
-      <w:proofErr w:type="spellEnd"/>
-      <w:r>
-        <w:rPr>
-          <w:rFonts w:ascii="JetBrains Mono" w:hAnsi="JetBrains Mono" w:cs="JetBrains Mono"/>
-          <w:sz w:val="22"/>
-          <w:szCs w:val="22"/>
-          <w:lang w:val="hu-HU"/>
-        </w:rPr>
-        <w:t>": null,</w:t>
-      </w:r>
-      <w:r>
-        <w:rPr>
-          <w:rFonts w:ascii="JetBrains Mono" w:hAnsi="JetBrains Mono" w:cs="JetBrains Mono"/>
-          <w:sz w:val="22"/>
-          <w:szCs w:val="22"/>
-          <w:lang w:val="hu-HU"/>
-        </w:rPr>
-        <w:t xml:space="preserve"> </w:t>
-      </w:r>
-      <w:r>
-        <w:rPr>
-          <w:rFonts w:ascii="JetBrains Mono" w:hAnsi="JetBrains Mono" w:cs="JetBrains Mono"/>
-          <w:sz w:val="22"/>
-          <w:szCs w:val="22"/>
-          <w:lang w:val="hu-HU"/>
-        </w:rPr>
-        <w:t>"</w:t>
-      </w:r>
-      <w:proofErr w:type="spellStart"/>
-      <w:r>
-        <w:rPr>
-          <w:rFonts w:ascii="JetBrains Mono" w:hAnsi="JetBrains Mono" w:cs="JetBrains Mono"/>
-          <w:sz w:val="22"/>
-          <w:szCs w:val="22"/>
-          <w:lang w:val="hu-HU"/>
-        </w:rPr>
-        <w:t>bannerImageId</w:t>
-      </w:r>
-      <w:proofErr w:type="spellEnd"/>
-      <w:r>
-        <w:rPr>
-          <w:rFonts w:ascii="JetBrains Mono" w:hAnsi="JetBrains Mono" w:cs="JetBrains Mono"/>
-          <w:sz w:val="22"/>
-          <w:szCs w:val="22"/>
-          <w:lang w:val="hu-HU"/>
-        </w:rPr>
-        <w:t>": null,</w:t>
-      </w:r>
-      <w:r>
-        <w:rPr>
-          <w:rFonts w:ascii="JetBrains Mono" w:hAnsi="JetBrains Mono" w:cs="JetBrains Mono"/>
-          <w:sz w:val="22"/>
-          <w:szCs w:val="22"/>
-          <w:lang w:val="hu-HU"/>
-        </w:rPr>
-        <w:t xml:space="preserve"> </w:t>
-      </w:r>
-      <w:r>
-        <w:rPr>
-          <w:rFonts w:ascii="JetBrains Mono" w:hAnsi="JetBrains Mono" w:cs="JetBrains Mono"/>
-          <w:sz w:val="22"/>
-          <w:szCs w:val="22"/>
-          <w:lang w:val="hu-HU"/>
-        </w:rPr>
-        <w:t>"</w:t>
-      </w:r>
-      <w:proofErr w:type="spellStart"/>
-      <w:r>
-        <w:rPr>
-          <w:rFonts w:ascii="JetBrains Mono" w:hAnsi="JetBrains Mono" w:cs="JetBrains Mono"/>
-          <w:sz w:val="22"/>
-          <w:szCs w:val="22"/>
-          <w:lang w:val="hu-HU"/>
-        </w:rPr>
-        <w:t>tags</w:t>
-      </w:r>
-      <w:proofErr w:type="spellEnd"/>
-      <w:r>
-        <w:rPr>
-          <w:rFonts w:ascii="JetBrains Mono" w:hAnsi="JetBrains Mono" w:cs="JetBrains Mono"/>
-          <w:sz w:val="22"/>
-          <w:szCs w:val="22"/>
-          <w:lang w:val="hu-HU"/>
-        </w:rPr>
-        <w:t>": [""],</w:t>
-      </w:r>
-      <w:r>
-        <w:rPr>
-          <w:rFonts w:ascii="JetBrains Mono" w:hAnsi="JetBrains Mono" w:cs="JetBrains Mono"/>
-          <w:sz w:val="22"/>
-          <w:szCs w:val="22"/>
-          <w:lang w:val="hu-HU"/>
-        </w:rPr>
-        <w:t xml:space="preserve"> </w:t>
-      </w:r>
-      <w:r>
-        <w:rPr>
-          <w:rFonts w:ascii="JetBrains Mono" w:hAnsi="JetBrains Mono" w:cs="JetBrains Mono"/>
-          <w:sz w:val="22"/>
-          <w:szCs w:val="22"/>
-          <w:lang w:val="hu-HU"/>
-        </w:rPr>
-        <w:t>"</w:t>
-      </w:r>
-      <w:proofErr w:type="spellStart"/>
-      <w:r>
-        <w:rPr>
-          <w:rFonts w:ascii="JetBrains Mono" w:hAnsi="JetBrains Mono" w:cs="JetBrains Mono"/>
-          <w:sz w:val="22"/>
-          <w:szCs w:val="22"/>
-          <w:lang w:val="hu-HU"/>
-        </w:rPr>
-        <w:t>languageIds</w:t>
-      </w:r>
-      <w:proofErr w:type="spellEnd"/>
-      <w:r>
-        <w:rPr>
-          <w:rFonts w:ascii="JetBrains Mono" w:hAnsi="JetBrains Mono" w:cs="JetBrains Mono"/>
-          <w:sz w:val="22"/>
-          <w:szCs w:val="22"/>
-          <w:lang w:val="hu-HU"/>
-        </w:rPr>
-        <w:t>": [""]}</w:t>
-      </w:r>
+      </w:pPr>
     </w:p>
     <w:sectPr>
       <w:type w:val="continuous"/>

</xml_diff>

<commit_message>
Backend - status is ommitable at course creation, added single wallpost endpoint
</commit_message>
<xml_diff>
--- a/Dev docs/Software_Architecture_Document.docx
+++ b/Dev docs/Software_Architecture_Document.docx
@@ -7909,6 +7909,7 @@
           <w:szCs w:val="22"/>
         </w:rPr>
       </w:pPr>
+      <w:proofErr w:type="gramStart"/>
       <w:r>
         <w:rPr>
           <w:rFonts w:ascii="JetBrains Mono" w:hAnsi="JetBrains Mono" w:cs="JetBrains Mono"/>
@@ -7918,6 +7919,7 @@
         <w:t>{ "</w:t>
       </w:r>
       <w:proofErr w:type="spellStart"/>
+      <w:proofErr w:type="gramEnd"/>
       <w:r>
         <w:rPr>
           <w:rFonts w:ascii="JetBrains Mono" w:hAnsi="JetBrains Mono" w:cs="JetBrains Mono"/>
@@ -8273,6 +8275,7 @@
           <w:szCs w:val="22"/>
         </w:rPr>
       </w:pPr>
+      <w:proofErr w:type="gramStart"/>
       <w:r>
         <w:rPr>
           <w:rFonts w:ascii="Lexend" w:hAnsi="Lexend"/>
@@ -8298,6 +8301,7 @@
         <w:t>"</w:t>
       </w:r>
       <w:proofErr w:type="spellStart"/>
+      <w:proofErr w:type="gramEnd"/>
       <w:r>
         <w:rPr>
           <w:rFonts w:ascii="Lexend" w:hAnsi="Lexend"/>
@@ -8826,7 +8830,36 @@
           <w:szCs w:val="22"/>
           <w:lang w:val="hu-HU"/>
         </w:rPr>
-        <w:t>/{</w:t>
+        <w:t>/</w:t>
+      </w:r>
+      <w:proofErr w:type="spellStart"/>
+      <w:r>
+        <w:rPr>
+          <w:rFonts w:ascii="JetBrains Mono" w:hAnsi="JetBrains Mono" w:cs="JetBrains Mono"/>
+          <w:sz w:val="22"/>
+          <w:szCs w:val="22"/>
+          <w:lang w:val="hu-HU"/>
+        </w:rPr>
+        <w:t>tutoring</w:t>
+      </w:r>
+      <w:proofErr w:type="spellEnd"/>
+      <w:r>
+        <w:rPr>
+          <w:rFonts w:ascii="JetBrains Mono" w:hAnsi="JetBrains Mono" w:cs="JetBrains Mono"/>
+          <w:sz w:val="22"/>
+          <w:szCs w:val="22"/>
+          <w:lang w:val="hu-HU"/>
+        </w:rPr>
+        <w:t>/</w:t>
+      </w:r>
+      <w:r>
+        <w:rPr>
+          <w:rFonts w:ascii="JetBrains Mono" w:hAnsi="JetBrains Mono" w:cs="JetBrains Mono"/>
+          <w:sz w:val="22"/>
+          <w:szCs w:val="22"/>
+          <w:lang w:val="hu-HU"/>
+        </w:rPr>
+        <w:t>{</w:t>
       </w:r>
       <w:proofErr w:type="spellStart"/>
       <w:r>
@@ -8883,6 +8916,121 @@
           <w:sz w:val="22"/>
           <w:szCs w:val="22"/>
         </w:rPr>
+        <w:t>One post:</w:t>
+      </w:r>
+      <w:r>
+        <w:rPr>
+          <w:rFonts w:ascii="JetBrains Mono" w:hAnsi="JetBrains Mono" w:cs="JetBrains Mono"/>
+          <w:sz w:val="22"/>
+          <w:szCs w:val="22"/>
+          <w:lang w:val="hu-HU"/>
+        </w:rPr>
+        <w:t xml:space="preserve"> /</w:t>
+      </w:r>
+      <w:proofErr w:type="spellStart"/>
+      <w:r>
+        <w:rPr>
+          <w:rFonts w:ascii="JetBrains Mono" w:hAnsi="JetBrains Mono" w:cs="JetBrains Mono"/>
+          <w:sz w:val="22"/>
+          <w:szCs w:val="22"/>
+          <w:lang w:val="hu-HU"/>
+        </w:rPr>
+        <w:t>api</w:t>
+      </w:r>
+      <w:proofErr w:type="spellEnd"/>
+      <w:r>
+        <w:rPr>
+          <w:rFonts w:ascii="JetBrains Mono" w:hAnsi="JetBrains Mono" w:cs="JetBrains Mono"/>
+          <w:sz w:val="22"/>
+          <w:szCs w:val="22"/>
+          <w:lang w:val="hu-HU"/>
+        </w:rPr>
+        <w:t>/</w:t>
+      </w:r>
+      <w:proofErr w:type="spellStart"/>
+      <w:r>
+        <w:rPr>
+          <w:rFonts w:ascii="JetBrains Mono" w:hAnsi="JetBrains Mono" w:cs="JetBrains Mono"/>
+          <w:sz w:val="22"/>
+          <w:szCs w:val="22"/>
+          <w:lang w:val="hu-HU"/>
+        </w:rPr>
+        <w:t>tutoring</w:t>
+      </w:r>
+      <w:proofErr w:type="spellEnd"/>
+      <w:r>
+        <w:rPr>
+          <w:rFonts w:ascii="JetBrains Mono" w:hAnsi="JetBrains Mono" w:cs="JetBrains Mono"/>
+          <w:sz w:val="22"/>
+          <w:szCs w:val="22"/>
+          <w:lang w:val="hu-HU"/>
+        </w:rPr>
+        <w:t>/{</w:t>
+      </w:r>
+      <w:proofErr w:type="spellStart"/>
+      <w:r>
+        <w:rPr>
+          <w:rFonts w:ascii="JetBrains Mono" w:hAnsi="JetBrains Mono" w:cs="JetBrains Mono"/>
+          <w:sz w:val="22"/>
+          <w:szCs w:val="22"/>
+          <w:lang w:val="hu-HU"/>
+        </w:rPr>
+        <w:t>wallId</w:t>
+      </w:r>
+      <w:proofErr w:type="spellEnd"/>
+      <w:r>
+        <w:rPr>
+          <w:rFonts w:ascii="JetBrains Mono" w:hAnsi="JetBrains Mono" w:cs="JetBrains Mono"/>
+          <w:sz w:val="22"/>
+          <w:szCs w:val="22"/>
+          <w:lang w:val="hu-HU"/>
+        </w:rPr>
+        <w:t>}/{</w:t>
+      </w:r>
+      <w:proofErr w:type="spellStart"/>
+      <w:r>
+        <w:rPr>
+          <w:rFonts w:ascii="JetBrains Mono" w:hAnsi="JetBrains Mono" w:cs="JetBrains Mono"/>
+          <w:sz w:val="22"/>
+          <w:szCs w:val="22"/>
+          <w:lang w:val="hu-HU"/>
+        </w:rPr>
+        <w:t>postId</w:t>
+      </w:r>
+      <w:proofErr w:type="spellEnd"/>
+      <w:r>
+        <w:rPr>
+          <w:rFonts w:ascii="JetBrains Mono" w:hAnsi="JetBrains Mono" w:cs="JetBrains Mono"/>
+          <w:sz w:val="22"/>
+          <w:szCs w:val="22"/>
+          <w:lang w:val="hu-HU"/>
+        </w:rPr>
+        <w:t>}</w:t>
+      </w:r>
+    </w:p>
+    <w:p>
+      <w:pPr>
+        <w:pStyle w:val="Listaszerbekezds"/>
+        <w:numPr>
+          <w:ilvl w:val="2"/>
+          <w:numId w:val="10"/>
+        </w:numPr>
+        <w:spacing w:before="480" w:after="240"/>
+        <w:rPr>
+          <w:rFonts w:ascii="JetBrains Mono" w:hAnsi="JetBrains Mono" w:cs="JetBrains Mono"/>
+          <w:sz w:val="22"/>
+          <w:szCs w:val="22"/>
+          <w:lang w:val="hu-HU"/>
+        </w:rPr>
+      </w:pPr>
+      <w:r>
+        <w:rPr>
+          <w:rFonts w:ascii="Lexend" w:hAnsi="Lexend"/>
+          <w:b/>
+          <w:bCs/>
+          <w:sz w:val="22"/>
+          <w:szCs w:val="22"/>
+        </w:rPr>
         <w:t xml:space="preserve">Commenting: </w:t>
       </w:r>
       <w:r>
@@ -8950,6 +9098,7 @@
           <w:lang w:val="hu-HU"/>
         </w:rPr>
       </w:pPr>
+      <w:proofErr w:type="gramStart"/>
       <w:r>
         <w:rPr>
           <w:rFonts w:ascii="JetBrains Mono" w:hAnsi="JetBrains Mono" w:cs="JetBrains Mono"/>
@@ -8959,6 +9108,7 @@
         <w:t>{ "</w:t>
       </w:r>
       <w:proofErr w:type="spellStart"/>
+      <w:proofErr w:type="gramEnd"/>
       <w:r>
         <w:rPr>
           <w:rFonts w:ascii="JetBrains Mono" w:hAnsi="JetBrains Mono" w:cs="JetBrains Mono"/>
@@ -9012,7 +9162,7 @@
       </w:pPr>
       <w:r>
         <w:rPr>
-          <w:rFonts w:ascii="JetBrains Mono" w:hAnsi="JetBrains Mono" w:cs="JetBrains Mono"/>
+          <w:rFonts w:ascii="Lexend" w:hAnsi="Lexend"/>
           <w:b/>
           <w:bCs/>
           <w:sz w:val="22"/>
@@ -9026,15 +9176,15 @@
           <w:sz w:val="22"/>
           <w:szCs w:val="22"/>
         </w:rPr>
-        <w:t>(Teacher)</w:t>
-      </w:r>
-      <w:r>
-        <w:rPr>
-          <w:rFonts w:ascii="JetBrains Mono" w:hAnsi="JetBrains Mono" w:cs="JetBrains Mono"/>
-          <w:sz w:val="22"/>
-          <w:szCs w:val="22"/>
-        </w:rPr>
-        <w:t xml:space="preserve">: POST </w:t>
+        <w:t>(Teacher):</w:t>
+      </w:r>
+      <w:r>
+        <w:rPr>
+          <w:rFonts w:ascii="JetBrains Mono" w:hAnsi="JetBrains Mono" w:cs="JetBrains Mono"/>
+          <w:sz w:val="22"/>
+          <w:szCs w:val="22"/>
+        </w:rPr>
+        <w:t xml:space="preserve"> POST </w:t>
       </w:r>
       <w:proofErr w:type="spellStart"/>
       <w:r>
@@ -9090,6 +9240,7 @@
           <w:lang w:val="hu-HU"/>
         </w:rPr>
       </w:pPr>
+      <w:proofErr w:type="gramStart"/>
       <w:r>
         <w:rPr>
           <w:rFonts w:ascii="JetBrains Mono" w:hAnsi="JetBrains Mono" w:cs="JetBrains Mono"/>
@@ -9099,6 +9250,7 @@
         <w:t>{ "</w:t>
       </w:r>
       <w:proofErr w:type="spellStart"/>
+      <w:proofErr w:type="gramEnd"/>
       <w:r>
         <w:rPr>
           <w:rFonts w:ascii="JetBrains Mono" w:hAnsi="JetBrains Mono" w:cs="JetBrains Mono"/>
@@ -9134,21 +9286,13 @@
       </w:pPr>
       <w:r>
         <w:rPr>
-          <w:rFonts w:ascii="JetBrains Mono" w:hAnsi="JetBrains Mono" w:cs="JetBrains Mono"/>
-          <w:b/>
-          <w:bCs/>
-          <w:sz w:val="22"/>
-          <w:szCs w:val="22"/>
-        </w:rPr>
-        <w:t>Review writing</w:t>
-      </w:r>
-      <w:r>
-        <w:rPr>
-          <w:rFonts w:ascii="JetBrains Mono" w:hAnsi="JetBrains Mono" w:cs="JetBrains Mono"/>
-          <w:sz w:val="22"/>
-          <w:szCs w:val="22"/>
-        </w:rPr>
-        <w:t xml:space="preserve"> </w:t>
+          <w:rFonts w:ascii="Lexend" w:hAnsi="Lexend"/>
+          <w:b/>
+          <w:bCs/>
+          <w:sz w:val="22"/>
+          <w:szCs w:val="22"/>
+        </w:rPr>
+        <w:t xml:space="preserve">Review writing </w:t>
       </w:r>
       <w:r>
         <w:rPr>
@@ -9218,13 +9362,15 @@
           <w:lang w:val="hu-HU"/>
         </w:rPr>
       </w:pPr>
-      <w:r>
-        <w:rPr>
-          <w:rFonts w:ascii="JetBrains Mono" w:hAnsi="JetBrains Mono" w:cs="JetBrains Mono"/>
-          <w:sz w:val="22"/>
-          <w:szCs w:val="22"/>
-          <w:lang w:val="hu-HU"/>
-        </w:rPr>
+      <w:proofErr w:type="gramStart"/>
+      <w:r>
+        <w:rPr>
+          <w:rFonts w:ascii="JetBrains Mono" w:hAnsi="JetBrains Mono" w:cs="JetBrains Mono"/>
+          <w:sz w:val="22"/>
+          <w:szCs w:val="22"/>
+          <w:lang w:val="hu-HU"/>
+        </w:rPr>
+        <w:lastRenderedPageBreak/>
         <w:t>{</w:t>
       </w:r>
       <w:r>
@@ -9246,6 +9392,7 @@
         <w:t>"</w:t>
       </w:r>
       <w:proofErr w:type="spellStart"/>
+      <w:proofErr w:type="gramEnd"/>
       <w:r>
         <w:rPr>
           <w:rFonts w:ascii="JetBrains Mono" w:hAnsi="JetBrains Mono" w:cs="JetBrains Mono"/>
@@ -9458,7 +9605,6 @@
           <w:sz w:val="28"/>
           <w:szCs w:val="28"/>
         </w:rPr>
-        <w:lastRenderedPageBreak/>
         <w:t>Teacher -&gt; Course Creator:</w:t>
       </w:r>
     </w:p>
@@ -9954,26 +10100,6 @@
           <w:szCs w:val="22"/>
           <w:lang w:val="hu-HU"/>
         </w:rPr>
-        <w:t>teacherId</w:t>
-      </w:r>
-      <w:proofErr w:type="spellEnd"/>
-      <w:r>
-        <w:rPr>
-          <w:rFonts w:ascii="JetBrains Mono" w:hAnsi="JetBrains Mono" w:cs="JetBrains Mono"/>
-          <w:sz w:val="22"/>
-          <w:szCs w:val="22"/>
-          <w:lang w:val="hu-HU"/>
-        </w:rPr>
-        <w:t>": "", "</w:t>
-      </w:r>
-      <w:proofErr w:type="spellStart"/>
-      <w:r>
-        <w:rPr>
-          <w:rFonts w:ascii="JetBrains Mono" w:hAnsi="JetBrains Mono" w:cs="JetBrains Mono"/>
-          <w:sz w:val="22"/>
-          <w:szCs w:val="22"/>
-          <w:lang w:val="hu-HU"/>
-        </w:rPr>
         <w:t>courseName</w:t>
       </w:r>
       <w:proofErr w:type="spellEnd"/>
@@ -10258,37 +10384,7 @@
           <w:sz w:val="28"/>
           <w:szCs w:val="28"/>
         </w:rPr>
-        <w:t>Shared</w:t>
-      </w:r>
-      <w:r>
-        <w:rPr>
-          <w:rFonts w:ascii="Lexend" w:hAnsi="Lexend"/>
-          <w:b/>
-          <w:bCs/>
-          <w:sz w:val="28"/>
-          <w:szCs w:val="28"/>
-        </w:rPr>
-        <w:t xml:space="preserve"> -&gt; </w:t>
-      </w:r>
-      <w:r>
-        <w:rPr>
-          <w:rFonts w:ascii="Lexend" w:hAnsi="Lexend"/>
-          <w:b/>
-          <w:bCs/>
-          <w:sz w:val="28"/>
-          <w:szCs w:val="28"/>
-        </w:rPr>
-        <w:t>Profile</w:t>
-      </w:r>
-      <w:r>
-        <w:rPr>
-          <w:rFonts w:ascii="Lexend" w:hAnsi="Lexend"/>
-          <w:b/>
-          <w:bCs/>
-          <w:sz w:val="28"/>
-          <w:szCs w:val="28"/>
-        </w:rPr>
-        <w:t>:</w:t>
+        <w:t>Shared -&gt; Profile:</w:t>
       </w:r>
     </w:p>
     <w:p>
@@ -10313,17 +10409,7 @@
           <w:sz w:val="22"/>
           <w:szCs w:val="22"/>
         </w:rPr>
-        <w:t>Data needed:</w:t>
-      </w:r>
-      <w:r>
-        <w:rPr>
-          <w:rFonts w:ascii="Lexend" w:hAnsi="Lexend"/>
-          <w:b/>
-          <w:bCs/>
-          <w:sz w:val="22"/>
-          <w:szCs w:val="22"/>
-        </w:rPr>
-        <w:t xml:space="preserve"> </w:t>
+        <w:t xml:space="preserve">Data needed: </w:t>
       </w:r>
       <w:r>
         <w:rPr>
@@ -10422,23 +10508,7 @@
           <w:sz w:val="22"/>
           <w:szCs w:val="22"/>
         </w:rPr>
-        <w:t xml:space="preserve"> </w:t>
-      </w:r>
-      <w:r>
-        <w:rPr>
-          <w:rFonts w:ascii="Lexend" w:hAnsi="Lexend"/>
-          <w:sz w:val="22"/>
-          <w:szCs w:val="22"/>
-        </w:rPr>
-        <w:t>age, name, introduction</w:t>
-      </w:r>
-      <w:r>
-        <w:rPr>
-          <w:rFonts w:ascii="Lexend" w:hAnsi="Lexend"/>
-          <w:sz w:val="22"/>
-          <w:szCs w:val="22"/>
-        </w:rPr>
-        <w:t>, teaching locations, qualifications, courses, average rating, total students</w:t>
+        <w:t xml:space="preserve"> age, name, introduction, teaching locations, qualifications, courses, average rating, total students</w:t>
       </w:r>
     </w:p>
     <w:p>
@@ -10590,6 +10660,7 @@
         </w:rPr>
         <w:t xml:space="preserve"> </w:t>
       </w:r>
+      <w:proofErr w:type="gramStart"/>
       <w:r>
         <w:rPr>
           <w:rFonts w:ascii="JetBrains Mono" w:hAnsi="JetBrains Mono" w:cs="JetBrains Mono"/>
@@ -10599,6 +10670,7 @@
         <w:t>{ "</w:t>
       </w:r>
       <w:proofErr w:type="spellStart"/>
+      <w:proofErr w:type="gramEnd"/>
       <w:r>
         <w:rPr>
           <w:rFonts w:ascii="JetBrains Mono" w:hAnsi="JetBrains Mono" w:cs="JetBrains Mono"/>
@@ -12820,6 +12892,7 @@
   <w:style w:type="character" w:default="1" w:styleId="Bekezdsalapbettpusa">
     <w:name w:val="Default Paragraph Font"/>
     <w:uiPriority w:val="1"/>
+    <w:semiHidden/>
     <w:unhideWhenUsed/>
   </w:style>
   <w:style w:type="table" w:default="1" w:styleId="Normltblzat">

</xml_diff>